<commit_message>
Análisis del problema y diagrama de casos de uso
</commit_message>
<xml_diff>
--- a/Actividad-1.docx
+++ b/Actividad-1.docx
@@ -1,6 +1,6 @@
 
 <file path=word/document.xml><?xml version="1.0" encoding="utf-8"?>
-<w:document xmlns:wpc="http://schemas.microsoft.com/office/word/2010/wordprocessingCanvas" xmlns:cx="http://schemas.microsoft.com/office/drawing/2014/chartex" xmlns:cx1="http://schemas.microsoft.com/office/drawing/2015/9/8/chartex" xmlns:cx2="http://schemas.microsoft.com/office/drawing/2015/10/21/chartex" xmlns:cx3="http://schemas.microsoft.com/office/drawing/2016/5/9/chartex" xmlns:cx4="http://schemas.microsoft.com/office/drawing/2016/5/10/chartex" xmlns:cx5="http://schemas.microsoft.com/office/drawing/2016/5/11/chartex" xmlns:cx6="http://schemas.microsoft.com/office/drawing/2016/5/12/chartex" xmlns:cx7="http://schemas.microsoft.com/office/drawing/2016/5/13/chartex" xmlns:cx8="http://schemas.microsoft.com/office/drawing/2016/5/14/chartex" xmlns:mc="http://schemas.openxmlformats.org/markup-compatibility/2006" xmlns:aink="http://schemas.microsoft.com/office/drawing/2016/ink" xmlns:am3d="http://schemas.microsoft.com/office/drawing/2017/model3d" xmlns:o="urn:schemas-microsoft-com:office:office" xmlns:r="http://schemas.openxmlformats.org/officeDocument/2006/relationships" xmlns:m="http://schemas.openxmlformats.org/officeDocument/2006/math" xmlns:v="urn:schemas-microsoft-com:vml" xmlns:wp14="http://schemas.microsoft.com/office/word/2010/wordprocessingDrawing" xmlns:wp="http://schemas.openxmlformats.org/drawingml/2006/wordprocessingDrawing" xmlns:w10="urn:schemas-microsoft-com:office:word" xmlns:w="http://schemas.openxmlformats.org/wordprocessingml/2006/main" xmlns:w14="http://schemas.microsoft.com/office/word/2010/wordml" xmlns:w15="http://schemas.microsoft.com/office/word/2012/wordml" xmlns:w16cid="http://schemas.microsoft.com/office/word/2016/wordml/cid" xmlns:w16se="http://schemas.microsoft.com/office/word/2015/wordml/symex" xmlns:wpg="http://schemas.microsoft.com/office/word/2010/wordprocessingGroup" xmlns:wpi="http://schemas.microsoft.com/office/word/2010/wordprocessingInk" xmlns:wne="http://schemas.microsoft.com/office/word/2006/wordml" xmlns:wps="http://schemas.microsoft.com/office/word/2010/wordprocessingShape" mc:Ignorable="w14 w15 w16se w16cid wp14">
+<w:document xmlns:wpc="http://schemas.microsoft.com/office/word/2010/wordprocessingCanvas" xmlns:cx="http://schemas.microsoft.com/office/drawing/2014/chartex" xmlns:cx1="http://schemas.microsoft.com/office/drawing/2015/9/8/chartex" xmlns:cx2="http://schemas.microsoft.com/office/drawing/2015/10/21/chartex" xmlns:cx3="http://schemas.microsoft.com/office/drawing/2016/5/9/chartex" xmlns:cx4="http://schemas.microsoft.com/office/drawing/2016/5/10/chartex" xmlns:cx5="http://schemas.microsoft.com/office/drawing/2016/5/11/chartex" xmlns:cx6="http://schemas.microsoft.com/office/drawing/2016/5/12/chartex" xmlns:cx7="http://schemas.microsoft.com/office/drawing/2016/5/13/chartex" xmlns:cx8="http://schemas.microsoft.com/office/drawing/2016/5/14/chartex" xmlns:mc="http://schemas.openxmlformats.org/markup-compatibility/2006" xmlns:aink="http://schemas.microsoft.com/office/drawing/2016/ink" xmlns:am3d="http://schemas.microsoft.com/office/drawing/2017/model3d" xmlns:o="urn:schemas-microsoft-com:office:office" xmlns:oel="http://schemas.microsoft.com/office/2019/extlst" xmlns:r="http://schemas.openxmlformats.org/officeDocument/2006/relationships" xmlns:m="http://schemas.openxmlformats.org/officeDocument/2006/math" xmlns:v="urn:schemas-microsoft-com:vml" xmlns:wp14="http://schemas.microsoft.com/office/word/2010/wordprocessingDrawing" xmlns:wp="http://schemas.openxmlformats.org/drawingml/2006/wordprocessingDrawing" xmlns:w10="urn:schemas-microsoft-com:office:word" xmlns:w="http://schemas.openxmlformats.org/wordprocessingml/2006/main" xmlns:w14="http://schemas.microsoft.com/office/word/2010/wordml" xmlns:w15="http://schemas.microsoft.com/office/word/2012/wordml" xmlns:w16cex="http://schemas.microsoft.com/office/word/2018/wordml/cex" xmlns:w16cid="http://schemas.microsoft.com/office/word/2016/wordml/cid" xmlns:w16="http://schemas.microsoft.com/office/word/2018/wordml" xmlns:w16du="http://schemas.microsoft.com/office/word/2023/wordml/word16du" xmlns:w16sdtdh="http://schemas.microsoft.com/office/word/2020/wordml/sdtdatahash" xmlns:w16sdtfl="http://schemas.microsoft.com/office/word/2024/wordml/sdtformatlock" xmlns:w16se="http://schemas.microsoft.com/office/word/2015/wordml/symex" xmlns:wpg="http://schemas.microsoft.com/office/word/2010/wordprocessingGroup" xmlns:wpi="http://schemas.microsoft.com/office/word/2010/wordprocessingInk" xmlns:wne="http://schemas.microsoft.com/office/word/2006/wordml" xmlns:wps="http://schemas.microsoft.com/office/word/2010/wordprocessingShape" mc:Ignorable="w14 w15 w16se w16cid w16 w16cex w16sdtdh w16sdtfl w16du wp14">
   <w:body>
     <w:p>
       <w:pPr>
@@ -738,7 +738,7 @@
               </wp:anchor>
             </w:drawing>
           </mc:Choice>
-          <mc:Fallback xmlns:w16sdtdh="http://schemas.microsoft.com/office/word/2020/wordml/sdtdatahash" xmlns:w16="http://schemas.microsoft.com/office/word/2018/wordml" xmlns:w16cex="http://schemas.microsoft.com/office/word/2018/wordml/cex">
+          <mc:Fallback>
             <w:pict>
               <v:rect w14:anchorId="7B6493F3" id="Rectángulo 16" o:spid="_x0000_s1026" style="position:absolute;margin-left:374.05pt;margin-top:14.15pt;width:425.25pt;height:3.6pt;z-index:251661312;visibility:visible;mso-wrap-style:square;mso-width-percent:0;mso-height-percent:0;mso-wrap-distance-left:9pt;mso-wrap-distance-top:0;mso-wrap-distance-right:9pt;mso-wrap-distance-bottom:0;mso-position-horizontal:right;mso-position-horizontal-relative:margin;mso-position-vertical:absolute;mso-position-vertical-relative:text;mso-width-percent:0;mso-height-percent:0;mso-width-relative:margin;mso-height-relative:margin;v-text-anchor:middle" o:gfxdata="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" fillcolor="#009640" stroked="f" strokeweight="1pt">
                 <v:fill color2="#93cd9e" rotate="t" angle="270" focus="47%" type="gradient"/>
@@ -807,8 +807,6 @@
         </w:rPr>
         <w:t>SEPTIEMBRE</w:t>
       </w:r>
-      <w:bookmarkStart w:id="0" w:name="_GoBack"/>
-      <w:bookmarkEnd w:id="0"/>
       <w:r>
         <w:rPr>
           <w:rFonts w:ascii="Arial" w:hAnsi="Arial" w:cs="Arial"/>
@@ -1117,11 +1115,16 @@
     </w:p>
     <w:p>
       <w:pPr>
+        <w:pStyle w:val="Prrafodelista"/>
+        <w:numPr>
+          <w:ilvl w:val="1"/>
+          <w:numId w:val="22"/>
+        </w:numPr>
         <w:rPr>
           <w:rFonts w:ascii="Arial" w:hAnsi="Arial" w:cs="Arial"/>
           <w:b/>
           <w:bCs/>
-          <w:lang w:eastAsia="es-EC"/>
+          <w:lang w:val="es-ES"/>
         </w:rPr>
       </w:pPr>
       <w:r>
@@ -1129,13 +1132,701 @@
           <w:rFonts w:ascii="Arial" w:hAnsi="Arial" w:cs="Arial"/>
           <w:b/>
           <w:bCs/>
-          <w:lang w:eastAsia="es-EC"/>
-        </w:rPr>
-        <w:br w:type="page"/>
+          <w:lang w:val="es-ES"/>
+        </w:rPr>
+        <w:t>Actores del sistema</w:t>
       </w:r>
     </w:p>
     <w:p>
       <w:pPr>
+        <w:jc w:val="both"/>
+        <w:rPr>
+          <w:rFonts w:ascii="Arial" w:hAnsi="Arial" w:cs="Arial"/>
+          <w:b/>
+          <w:bCs/>
+          <w:lang w:val="es-ES"/>
+        </w:rPr>
+      </w:pPr>
+      <w:r>
+        <w:rPr>
+          <w:rFonts w:ascii="Arial" w:hAnsi="Arial" w:cs="Arial"/>
+        </w:rPr>
+        <w:t>El Sistema de Control de Rescate y Adopción Animal permite gestionar los casos de animales rescatados, desde su ingreso hasta su adopción. Los usuarios interactúan con el sistema según sus responsabilidades: los ciudadanos reportan animales, los voluntarios y veterinarios atienden los casos, y el administrador supervisa y asigna el personal</w:t>
+      </w:r>
+      <w:r>
+        <w:rPr>
+          <w:rFonts w:ascii="Arial" w:hAnsi="Arial" w:cs="Arial"/>
+          <w:b/>
+          <w:bCs/>
+        </w:rPr>
+        <w:t>.</w:t>
+      </w:r>
+    </w:p>
+    <w:tbl>
+      <w:tblPr>
+        <w:tblW w:w="9457" w:type="dxa"/>
+        <w:tblBorders>
+          <w:top w:val="single" w:sz="2" w:space="0" w:color="auto"/>
+          <w:left w:val="single" w:sz="2" w:space="0" w:color="auto"/>
+          <w:bottom w:val="single" w:sz="2" w:space="0" w:color="auto"/>
+          <w:right w:val="single" w:sz="2" w:space="0" w:color="auto"/>
+        </w:tblBorders>
+        <w:tblCellMar>
+          <w:left w:w="0" w:type="dxa"/>
+          <w:right w:w="0" w:type="dxa"/>
+        </w:tblCellMar>
+        <w:tblLook w:val="04A0" w:firstRow="1" w:lastRow="0" w:firstColumn="1" w:lastColumn="0" w:noHBand="0" w:noVBand="1"/>
+      </w:tblPr>
+      <w:tblGrid>
+        <w:gridCol w:w="2774"/>
+        <w:gridCol w:w="6683"/>
+      </w:tblGrid>
+      <w:tr>
+        <w:trPr>
+          <w:trHeight w:val="419"/>
+          <w:tblHeader/>
+        </w:trPr>
+        <w:tc>
+          <w:tcPr>
+            <w:tcW w:w="0" w:type="auto"/>
+            <w:tcBorders>
+              <w:top w:val="single" w:sz="2" w:space="0" w:color="auto"/>
+              <w:left w:val="single" w:sz="2" w:space="0" w:color="auto"/>
+              <w:bottom w:val="single" w:sz="4" w:space="0" w:color="auto"/>
+              <w:right w:val="single" w:sz="2" w:space="0" w:color="auto"/>
+            </w:tcBorders>
+            <w:shd w:val="clear" w:color="auto" w:fill="B4C6E7" w:themeFill="accent1" w:themeFillTint="66"/>
+            <w:tcMar>
+              <w:top w:w="180" w:type="dxa"/>
+              <w:left w:w="180" w:type="dxa"/>
+              <w:bottom w:w="180" w:type="dxa"/>
+              <w:right w:w="180" w:type="dxa"/>
+            </w:tcMar>
+            <w:hideMark/>
+          </w:tcPr>
+          <w:p>
+            <w:pPr>
+              <w:jc w:val="center"/>
+              <w:rPr>
+                <w:rFonts w:ascii="Arial" w:hAnsi="Arial" w:cs="Arial"/>
+                <w:b/>
+                <w:bCs/>
+                <w:lang w:val="es-ES"/>
+              </w:rPr>
+            </w:pPr>
+            <w:r>
+              <w:rPr>
+                <w:rFonts w:ascii="Arial" w:hAnsi="Arial" w:cs="Arial"/>
+                <w:b/>
+                <w:bCs/>
+                <w:lang w:val="es-ES"/>
+              </w:rPr>
+              <w:t>Actor</w:t>
+            </w:r>
+          </w:p>
+        </w:tc>
+        <w:tc>
+          <w:tcPr>
+            <w:tcW w:w="0" w:type="auto"/>
+            <w:tcBorders>
+              <w:top w:val="single" w:sz="2" w:space="0" w:color="auto"/>
+              <w:left w:val="single" w:sz="2" w:space="0" w:color="auto"/>
+              <w:bottom w:val="single" w:sz="4" w:space="0" w:color="auto"/>
+              <w:right w:val="single" w:sz="2" w:space="0" w:color="auto"/>
+            </w:tcBorders>
+            <w:shd w:val="clear" w:color="auto" w:fill="B4C6E7" w:themeFill="accent1" w:themeFillTint="66"/>
+            <w:tcMar>
+              <w:top w:w="180" w:type="dxa"/>
+              <w:left w:w="180" w:type="dxa"/>
+              <w:bottom w:w="180" w:type="dxa"/>
+              <w:right w:w="180" w:type="dxa"/>
+            </w:tcMar>
+            <w:hideMark/>
+          </w:tcPr>
+          <w:p>
+            <w:pPr>
+              <w:jc w:val="center"/>
+              <w:rPr>
+                <w:rFonts w:ascii="Arial" w:hAnsi="Arial" w:cs="Arial"/>
+                <w:b/>
+                <w:bCs/>
+                <w:lang w:val="es-ES"/>
+              </w:rPr>
+            </w:pPr>
+            <w:r>
+              <w:rPr>
+                <w:rFonts w:ascii="Arial" w:hAnsi="Arial" w:cs="Arial"/>
+                <w:b/>
+                <w:bCs/>
+                <w:lang w:val="es-ES"/>
+              </w:rPr>
+              <w:t>Descripción</w:t>
+            </w:r>
+          </w:p>
+        </w:tc>
+      </w:tr>
+      <w:tr>
+        <w:trPr>
+          <w:trHeight w:val="407"/>
+        </w:trPr>
+        <w:tc>
+          <w:tcPr>
+            <w:tcW w:w="0" w:type="auto"/>
+            <w:tcBorders>
+              <w:top w:val="single" w:sz="2" w:space="0" w:color="auto"/>
+              <w:left w:val="single" w:sz="2" w:space="0" w:color="auto"/>
+              <w:bottom w:val="single" w:sz="4" w:space="0" w:color="auto"/>
+              <w:right w:val="single" w:sz="2" w:space="0" w:color="auto"/>
+            </w:tcBorders>
+            <w:tcMar>
+              <w:top w:w="180" w:type="dxa"/>
+              <w:left w:w="180" w:type="dxa"/>
+              <w:bottom w:w="180" w:type="dxa"/>
+              <w:right w:w="180" w:type="dxa"/>
+            </w:tcMar>
+            <w:hideMark/>
+          </w:tcPr>
+          <w:p>
+            <w:pPr>
+              <w:jc w:val="center"/>
+              <w:rPr>
+                <w:rFonts w:ascii="Arial" w:hAnsi="Arial" w:cs="Arial"/>
+                <w:lang w:val="es-ES"/>
+              </w:rPr>
+            </w:pPr>
+            <w:r>
+              <w:rPr>
+                <w:rFonts w:ascii="Arial" w:hAnsi="Arial" w:cs="Arial"/>
+                <w:lang w:val="es-ES"/>
+              </w:rPr>
+              <w:t>Ciudadano/</w:t>
+            </w:r>
+            <w:proofErr w:type="spellStart"/>
+            <w:r>
+              <w:rPr>
+                <w:rFonts w:ascii="Arial" w:hAnsi="Arial" w:cs="Arial"/>
+                <w:lang w:val="es-ES"/>
+              </w:rPr>
+              <w:t>Reportante</w:t>
+            </w:r>
+            <w:proofErr w:type="spellEnd"/>
+          </w:p>
+        </w:tc>
+        <w:tc>
+          <w:tcPr>
+            <w:tcW w:w="0" w:type="auto"/>
+            <w:tcBorders>
+              <w:top w:val="single" w:sz="2" w:space="0" w:color="auto"/>
+              <w:left w:val="single" w:sz="2" w:space="0" w:color="auto"/>
+              <w:bottom w:val="single" w:sz="4" w:space="0" w:color="auto"/>
+              <w:right w:val="single" w:sz="2" w:space="0" w:color="auto"/>
+            </w:tcBorders>
+            <w:tcMar>
+              <w:top w:w="180" w:type="dxa"/>
+              <w:left w:w="180" w:type="dxa"/>
+              <w:bottom w:w="180" w:type="dxa"/>
+              <w:right w:w="180" w:type="dxa"/>
+            </w:tcMar>
+            <w:hideMark/>
+          </w:tcPr>
+          <w:p>
+            <w:pPr>
+              <w:jc w:val="center"/>
+              <w:rPr>
+                <w:rFonts w:ascii="Arial" w:hAnsi="Arial" w:cs="Arial"/>
+                <w:lang w:val="es-ES"/>
+              </w:rPr>
+            </w:pPr>
+            <w:r>
+              <w:rPr>
+                <w:rFonts w:ascii="Arial" w:hAnsi="Arial" w:cs="Arial"/>
+                <w:lang w:val="es-ES"/>
+              </w:rPr>
+              <w:t>Persona que reporta un animal rescatado a través del sistema.</w:t>
+            </w:r>
+          </w:p>
+        </w:tc>
+      </w:tr>
+      <w:tr>
+        <w:trPr>
+          <w:trHeight w:val="679"/>
+        </w:trPr>
+        <w:tc>
+          <w:tcPr>
+            <w:tcW w:w="0" w:type="auto"/>
+            <w:tcBorders>
+              <w:top w:val="single" w:sz="2" w:space="0" w:color="auto"/>
+              <w:left w:val="single" w:sz="2" w:space="0" w:color="auto"/>
+              <w:bottom w:val="single" w:sz="4" w:space="0" w:color="auto"/>
+              <w:right w:val="single" w:sz="2" w:space="0" w:color="auto"/>
+            </w:tcBorders>
+            <w:tcMar>
+              <w:top w:w="180" w:type="dxa"/>
+              <w:left w:w="180" w:type="dxa"/>
+              <w:bottom w:w="180" w:type="dxa"/>
+              <w:right w:w="180" w:type="dxa"/>
+            </w:tcMar>
+            <w:hideMark/>
+          </w:tcPr>
+          <w:p>
+            <w:pPr>
+              <w:jc w:val="center"/>
+              <w:rPr>
+                <w:rFonts w:ascii="Arial" w:hAnsi="Arial" w:cs="Arial"/>
+                <w:lang w:val="es-ES"/>
+              </w:rPr>
+            </w:pPr>
+            <w:r>
+              <w:rPr>
+                <w:rFonts w:ascii="Arial" w:hAnsi="Arial" w:cs="Arial"/>
+                <w:lang w:val="es-ES"/>
+              </w:rPr>
+              <w:t>Voluntario/Veterinario</w:t>
+            </w:r>
+          </w:p>
+        </w:tc>
+        <w:tc>
+          <w:tcPr>
+            <w:tcW w:w="0" w:type="auto"/>
+            <w:tcBorders>
+              <w:top w:val="single" w:sz="2" w:space="0" w:color="auto"/>
+              <w:left w:val="single" w:sz="2" w:space="0" w:color="auto"/>
+              <w:bottom w:val="single" w:sz="4" w:space="0" w:color="auto"/>
+              <w:right w:val="single" w:sz="2" w:space="0" w:color="auto"/>
+            </w:tcBorders>
+            <w:tcMar>
+              <w:top w:w="180" w:type="dxa"/>
+              <w:left w:w="180" w:type="dxa"/>
+              <w:bottom w:w="180" w:type="dxa"/>
+              <w:right w:w="180" w:type="dxa"/>
+            </w:tcMar>
+            <w:hideMark/>
+          </w:tcPr>
+          <w:p>
+            <w:pPr>
+              <w:jc w:val="center"/>
+              <w:rPr>
+                <w:rFonts w:ascii="Arial" w:hAnsi="Arial" w:cs="Arial"/>
+                <w:lang w:val="es-ES"/>
+              </w:rPr>
+            </w:pPr>
+            <w:r>
+              <w:rPr>
+                <w:rFonts w:ascii="Arial" w:hAnsi="Arial" w:cs="Arial"/>
+                <w:lang w:val="es-ES"/>
+              </w:rPr>
+              <w:t>Personal encargado de atender y dar seguimiento a los casos asignados.</w:t>
+            </w:r>
+          </w:p>
+        </w:tc>
+      </w:tr>
+      <w:tr>
+        <w:trPr>
+          <w:trHeight w:val="666"/>
+        </w:trPr>
+        <w:tc>
+          <w:tcPr>
+            <w:tcW w:w="0" w:type="auto"/>
+            <w:tcBorders>
+              <w:top w:val="single" w:sz="2" w:space="0" w:color="auto"/>
+              <w:left w:val="single" w:sz="2" w:space="0" w:color="auto"/>
+              <w:bottom w:val="single" w:sz="4" w:space="0" w:color="auto"/>
+              <w:right w:val="single" w:sz="2" w:space="0" w:color="auto"/>
+            </w:tcBorders>
+            <w:tcMar>
+              <w:top w:w="180" w:type="dxa"/>
+              <w:left w:w="180" w:type="dxa"/>
+              <w:bottom w:w="180" w:type="dxa"/>
+              <w:right w:w="180" w:type="dxa"/>
+            </w:tcMar>
+            <w:hideMark/>
+          </w:tcPr>
+          <w:p>
+            <w:pPr>
+              <w:jc w:val="center"/>
+              <w:rPr>
+                <w:rFonts w:ascii="Arial" w:hAnsi="Arial" w:cs="Arial"/>
+                <w:lang w:val="es-ES"/>
+              </w:rPr>
+            </w:pPr>
+            <w:r>
+              <w:rPr>
+                <w:rFonts w:ascii="Arial" w:hAnsi="Arial" w:cs="Arial"/>
+                <w:lang w:val="es-ES"/>
+              </w:rPr>
+              <w:t>Administrador del Refugio</w:t>
+            </w:r>
+          </w:p>
+        </w:tc>
+        <w:tc>
+          <w:tcPr>
+            <w:tcW w:w="0" w:type="auto"/>
+            <w:tcBorders>
+              <w:top w:val="single" w:sz="2" w:space="0" w:color="auto"/>
+              <w:left w:val="single" w:sz="2" w:space="0" w:color="auto"/>
+              <w:bottom w:val="single" w:sz="4" w:space="0" w:color="auto"/>
+              <w:right w:val="single" w:sz="2" w:space="0" w:color="auto"/>
+            </w:tcBorders>
+            <w:tcMar>
+              <w:top w:w="180" w:type="dxa"/>
+              <w:left w:w="180" w:type="dxa"/>
+              <w:bottom w:w="180" w:type="dxa"/>
+              <w:right w:w="180" w:type="dxa"/>
+            </w:tcMar>
+            <w:hideMark/>
+          </w:tcPr>
+          <w:p>
+            <w:pPr>
+              <w:jc w:val="center"/>
+              <w:rPr>
+                <w:rFonts w:ascii="Arial" w:hAnsi="Arial" w:cs="Arial"/>
+                <w:lang w:val="es-ES"/>
+              </w:rPr>
+            </w:pPr>
+            <w:r>
+              <w:rPr>
+                <w:rFonts w:ascii="Arial" w:hAnsi="Arial" w:cs="Arial"/>
+                <w:lang w:val="es-ES"/>
+              </w:rPr>
+              <w:t>Usuario con permisos para gestionar casos, asignar personal y supervisar el proceso completo.</w:t>
+            </w:r>
+          </w:p>
+        </w:tc>
+      </w:tr>
+    </w:tbl>
+    <w:p>
+      <w:pPr>
+        <w:rPr>
+          <w:rFonts w:ascii="Arial" w:hAnsi="Arial" w:cs="Arial"/>
+          <w:b/>
+          <w:bCs/>
+          <w:lang w:eastAsia="es-EC"/>
+        </w:rPr>
+      </w:pPr>
+      <w:r>
+        <w:rPr>
+          <w:rFonts w:ascii="Arial" w:hAnsi="Arial" w:cs="Arial"/>
+          <w:b/>
+          <w:bCs/>
+          <w:lang w:eastAsia="es-EC"/>
+        </w:rPr>
+        <w:t>`</w:t>
+      </w:r>
+    </w:p>
+    <w:p>
+      <w:pPr>
+        <w:jc w:val="center"/>
+        <w:rPr>
+          <w:rFonts w:ascii="Arial" w:hAnsi="Arial" w:cs="Arial"/>
+          <w:b/>
+          <w:bCs/>
+          <w:lang w:eastAsia="es-EC"/>
+        </w:rPr>
+      </w:pPr>
+      <w:r>
+        <w:rPr>
+          <w:rFonts w:ascii="Arial" w:hAnsi="Arial" w:cs="Arial"/>
+          <w:b/>
+          <w:bCs/>
+          <w:lang w:eastAsia="es-EC"/>
+        </w:rPr>
+        <w:t>Diagrama de Casos de Uso – Sistema de Rescate Animal</w:t>
+      </w:r>
+    </w:p>
+    <w:p>
+      <w:pPr>
+        <w:rPr>
+          <w:rFonts w:ascii="Arial" w:hAnsi="Arial" w:cs="Arial"/>
+          <w:b/>
+          <w:bCs/>
+          <w:lang w:eastAsia="es-EC"/>
+        </w:rPr>
+      </w:pPr>
+      <w:r>
+        <w:rPr>
+          <w:noProof/>
+        </w:rPr>
+        <w:drawing>
+          <wp:anchor distT="0" distB="0" distL="114300" distR="114300" simplePos="0" relativeHeight="251666432" behindDoc="1" locked="0" layoutInCell="1" allowOverlap="1" wp14:anchorId="3F4F3521" wp14:editId="4A1E3BDD">
+            <wp:simplePos x="0" y="0"/>
+            <wp:positionH relativeFrom="margin">
+              <wp:align>center</wp:align>
+            </wp:positionH>
+            <wp:positionV relativeFrom="paragraph">
+              <wp:posOffset>22993</wp:posOffset>
+            </wp:positionV>
+            <wp:extent cx="3733800" cy="3115310"/>
+            <wp:effectExtent l="0" t="0" r="0" b="8890"/>
+            <wp:wrapNone/>
+            <wp:docPr id="1858095306" name="Imagen 2"/>
+            <wp:cNvGraphicFramePr>
+              <a:graphicFrameLocks xmlns:a="http://schemas.openxmlformats.org/drawingml/2006/main" noChangeAspect="1"/>
+            </wp:cNvGraphicFramePr>
+            <a:graphic xmlns:a="http://schemas.openxmlformats.org/drawingml/2006/main">
+              <a:graphicData uri="http://schemas.openxmlformats.org/drawingml/2006/picture">
+                <pic:pic xmlns:pic="http://schemas.openxmlformats.org/drawingml/2006/picture">
+                  <pic:nvPicPr>
+                    <pic:cNvPr id="0" name="Picture 2"/>
+                    <pic:cNvPicPr>
+                      <a:picLocks noChangeAspect="1" noChangeArrowheads="1"/>
+                    </pic:cNvPicPr>
+                  </pic:nvPicPr>
+                  <pic:blipFill rotWithShape="1">
+                    <a:blip r:embed="rId14">
+                      <a:extLst>
+                        <a:ext uri="{28A0092B-C50C-407E-A947-70E740481C1C}">
+                          <a14:useLocalDpi xmlns:a14="http://schemas.microsoft.com/office/drawing/2010/main" val="0"/>
+                        </a:ext>
+                      </a:extLst>
+                    </a:blip>
+                    <a:srcRect l="-967" t="2102" r="967" b="7172"/>
+                    <a:stretch>
+                      <a:fillRect/>
+                    </a:stretch>
+                  </pic:blipFill>
+                  <pic:spPr bwMode="auto">
+                    <a:xfrm>
+                      <a:off x="0" y="0"/>
+                      <a:ext cx="3733800" cy="3115310"/>
+                    </a:xfrm>
+                    <a:prstGeom prst="rect">
+                      <a:avLst/>
+                    </a:prstGeom>
+                    <a:noFill/>
+                    <a:ln>
+                      <a:noFill/>
+                    </a:ln>
+                    <a:extLst>
+                      <a:ext uri="{53640926-AAD7-44D8-BBD7-CCE9431645EC}">
+                        <a14:shadowObscured xmlns:a14="http://schemas.microsoft.com/office/drawing/2010/main"/>
+                      </a:ext>
+                    </a:extLst>
+                  </pic:spPr>
+                </pic:pic>
+              </a:graphicData>
+            </a:graphic>
+            <wp14:sizeRelH relativeFrom="margin">
+              <wp14:pctWidth>0</wp14:pctWidth>
+            </wp14:sizeRelH>
+            <wp14:sizeRelV relativeFrom="margin">
+              <wp14:pctHeight>0</wp14:pctHeight>
+            </wp14:sizeRelV>
+          </wp:anchor>
+        </w:drawing>
+      </w:r>
+    </w:p>
+    <w:p>
+      <w:pPr>
+        <w:rPr>
+          <w:rFonts w:ascii="Arial" w:hAnsi="Arial" w:cs="Arial"/>
+          <w:b/>
+          <w:bCs/>
+          <w:lang w:eastAsia="es-EC"/>
+        </w:rPr>
+      </w:pPr>
+    </w:p>
+    <w:p>
+      <w:pPr>
+        <w:rPr>
+          <w:rFonts w:ascii="Arial" w:hAnsi="Arial" w:cs="Arial"/>
+          <w:b/>
+          <w:bCs/>
+          <w:lang w:eastAsia="es-EC"/>
+        </w:rPr>
+      </w:pPr>
+    </w:p>
+    <w:p>
+      <w:pPr>
+        <w:rPr>
+          <w:rFonts w:ascii="Arial" w:hAnsi="Arial" w:cs="Arial"/>
+          <w:b/>
+          <w:bCs/>
+          <w:lang w:eastAsia="es-EC"/>
+        </w:rPr>
+      </w:pPr>
+    </w:p>
+    <w:p>
+      <w:pPr>
+        <w:rPr>
+          <w:rFonts w:ascii="Arial" w:hAnsi="Arial" w:cs="Arial"/>
+          <w:b/>
+          <w:bCs/>
+          <w:lang w:eastAsia="es-EC"/>
+        </w:rPr>
+      </w:pPr>
+    </w:p>
+    <w:p>
+      <w:pPr>
+        <w:rPr>
+          <w:rFonts w:ascii="Arial" w:hAnsi="Arial" w:cs="Arial"/>
+          <w:b/>
+          <w:bCs/>
+          <w:lang w:eastAsia="es-EC"/>
+        </w:rPr>
+      </w:pPr>
+    </w:p>
+    <w:p>
+      <w:pPr>
+        <w:rPr>
+          <w:rFonts w:ascii="Arial" w:hAnsi="Arial" w:cs="Arial"/>
+          <w:b/>
+          <w:bCs/>
+          <w:lang w:eastAsia="es-EC"/>
+        </w:rPr>
+      </w:pPr>
+    </w:p>
+    <w:p>
+      <w:pPr>
+        <w:rPr>
+          <w:rFonts w:ascii="Arial" w:hAnsi="Arial" w:cs="Arial"/>
+          <w:b/>
+          <w:bCs/>
+          <w:lang w:eastAsia="es-EC"/>
+        </w:rPr>
+      </w:pPr>
+    </w:p>
+    <w:p>
+      <w:pPr>
+        <w:rPr>
+          <w:rFonts w:ascii="Arial" w:hAnsi="Arial" w:cs="Arial"/>
+          <w:b/>
+          <w:bCs/>
+          <w:lang w:eastAsia="es-EC"/>
+        </w:rPr>
+      </w:pPr>
+    </w:p>
+    <w:p>
+      <w:pPr>
+        <w:rPr>
+          <w:rFonts w:ascii="Arial" w:hAnsi="Arial" w:cs="Arial"/>
+          <w:b/>
+          <w:bCs/>
+          <w:lang w:eastAsia="es-EC"/>
+        </w:rPr>
+      </w:pPr>
+    </w:p>
+    <w:p>
+      <w:pPr>
+        <w:rPr>
+          <w:rFonts w:ascii="Arial" w:hAnsi="Arial" w:cs="Arial"/>
+          <w:b/>
+          <w:bCs/>
+          <w:lang w:eastAsia="es-EC"/>
+        </w:rPr>
+      </w:pPr>
+    </w:p>
+    <w:p>
+      <w:pPr>
+        <w:rPr>
+          <w:rFonts w:ascii="Arial" w:hAnsi="Arial" w:cs="Arial"/>
+          <w:b/>
+          <w:bCs/>
+          <w:lang w:eastAsia="es-EC"/>
+        </w:rPr>
+      </w:pPr>
+    </w:p>
+    <w:p>
+      <w:pPr>
+        <w:rPr>
+          <w:rFonts w:ascii="Arial" w:hAnsi="Arial" w:cs="Arial"/>
+          <w:b/>
+          <w:bCs/>
+          <w:lang w:eastAsia="es-EC"/>
+        </w:rPr>
+      </w:pPr>
+    </w:p>
+    <w:p>
+      <w:pPr>
+        <w:rPr>
+          <w:rFonts w:ascii="Arial" w:hAnsi="Arial" w:cs="Arial"/>
+          <w:b/>
+          <w:bCs/>
+          <w:lang w:eastAsia="es-EC"/>
+        </w:rPr>
+      </w:pPr>
+    </w:p>
+    <w:p>
+      <w:pPr>
+        <w:rPr>
+          <w:rFonts w:ascii="Arial" w:hAnsi="Arial" w:cs="Arial"/>
+          <w:b/>
+          <w:bCs/>
+          <w:lang w:eastAsia="es-EC"/>
+        </w:rPr>
+      </w:pPr>
+    </w:p>
+    <w:p>
+      <w:pPr>
+        <w:rPr>
+          <w:rFonts w:ascii="Arial" w:hAnsi="Arial" w:cs="Arial"/>
+          <w:b/>
+          <w:bCs/>
+          <w:lang w:eastAsia="es-EC"/>
+        </w:rPr>
+      </w:pPr>
+    </w:p>
+    <w:p>
+      <w:pPr>
+        <w:rPr>
+          <w:rFonts w:ascii="Arial" w:hAnsi="Arial" w:cs="Arial"/>
+          <w:b/>
+          <w:bCs/>
+          <w:lang w:eastAsia="es-EC"/>
+        </w:rPr>
+      </w:pPr>
+    </w:p>
+    <w:p>
+      <w:pPr>
+        <w:rPr>
+          <w:rFonts w:ascii="Arial" w:hAnsi="Arial" w:cs="Arial"/>
+          <w:b/>
+          <w:bCs/>
+          <w:lang w:eastAsia="es-EC"/>
+        </w:rPr>
+      </w:pPr>
+    </w:p>
+    <w:p>
+      <w:pPr>
+        <w:rPr>
+          <w:rFonts w:ascii="Arial" w:hAnsi="Arial" w:cs="Arial"/>
+          <w:b/>
+          <w:bCs/>
+          <w:lang w:eastAsia="es-EC"/>
+        </w:rPr>
+      </w:pPr>
+    </w:p>
+    <w:p>
+      <w:pPr>
+        <w:rPr>
+          <w:rFonts w:ascii="Arial" w:hAnsi="Arial" w:cs="Arial"/>
+          <w:b/>
+          <w:bCs/>
+          <w:lang w:eastAsia="es-EC"/>
+        </w:rPr>
+      </w:pPr>
+    </w:p>
+    <w:p>
+      <w:pPr>
+        <w:rPr>
+          <w:rFonts w:ascii="Arial" w:hAnsi="Arial" w:cs="Arial"/>
+          <w:b/>
+          <w:bCs/>
+          <w:lang w:eastAsia="es-EC"/>
+        </w:rPr>
+      </w:pPr>
+    </w:p>
+    <w:p>
+      <w:pPr>
+        <w:rPr>
+          <w:rFonts w:ascii="Arial" w:hAnsi="Arial" w:cs="Arial"/>
+          <w:b/>
+          <w:bCs/>
+          <w:lang w:eastAsia="es-EC"/>
+        </w:rPr>
+      </w:pPr>
+    </w:p>
+    <w:p>
+      <w:pPr>
         <w:pStyle w:val="Sinespaciado"/>
         <w:spacing w:line="360" w:lineRule="auto"/>
         <w:jc w:val="both"/>
@@ -1153,7 +1844,6 @@
           <w:bCs/>
           <w:lang w:eastAsia="es-EC"/>
         </w:rPr>
-        <w:lastRenderedPageBreak/>
         <w:t>Evidencias</w:t>
       </w:r>
     </w:p>
@@ -1294,7 +1984,7 @@
       </w:r>
     </w:p>
     <w:sectPr>
-      <w:headerReference w:type="first" r:id="rId14"/>
+      <w:headerReference w:type="first" r:id="rId15"/>
       <w:pgSz w:w="11906" w:h="16838"/>
       <w:pgMar w:top="1417" w:right="1701" w:bottom="1417" w:left="1701" w:header="708" w:footer="708" w:gutter="0"/>
       <w:pgNumType w:start="1"/>
@@ -1307,7 +1997,7 @@
 </file>
 
 <file path=word/endnotes.xml><?xml version="1.0" encoding="utf-8"?>
-<w:endnotes xmlns:wpc="http://schemas.microsoft.com/office/word/2010/wordprocessingCanvas" xmlns:cx="http://schemas.microsoft.com/office/drawing/2014/chartex" xmlns:cx1="http://schemas.microsoft.com/office/drawing/2015/9/8/chartex" xmlns:cx2="http://schemas.microsoft.com/office/drawing/2015/10/21/chartex" xmlns:cx3="http://schemas.microsoft.com/office/drawing/2016/5/9/chartex" xmlns:cx4="http://schemas.microsoft.com/office/drawing/2016/5/10/chartex" xmlns:cx5="http://schemas.microsoft.com/office/drawing/2016/5/11/chartex" xmlns:cx6="http://schemas.microsoft.com/office/drawing/2016/5/12/chartex" xmlns:cx7="http://schemas.microsoft.com/office/drawing/2016/5/13/chartex" xmlns:cx8="http://schemas.microsoft.com/office/drawing/2016/5/14/chartex" xmlns:mc="http://schemas.openxmlformats.org/markup-compatibility/2006" xmlns:aink="http://schemas.microsoft.com/office/drawing/2016/ink" xmlns:am3d="http://schemas.microsoft.com/office/drawing/2017/model3d" xmlns:o="urn:schemas-microsoft-com:office:office" xmlns:r="http://schemas.openxmlformats.org/officeDocument/2006/relationships" xmlns:m="http://schemas.openxmlformats.org/officeDocument/2006/math" xmlns:v="urn:schemas-microsoft-com:vml" xmlns:wp14="http://schemas.microsoft.com/office/word/2010/wordprocessingDrawing" xmlns:wp="http://schemas.openxmlformats.org/drawingml/2006/wordprocessingDrawing" xmlns:w10="urn:schemas-microsoft-com:office:word" xmlns:w="http://schemas.openxmlformats.org/wordprocessingml/2006/main" xmlns:w14="http://schemas.microsoft.com/office/word/2010/wordml" xmlns:w15="http://schemas.microsoft.com/office/word/2012/wordml" xmlns:w16cid="http://schemas.microsoft.com/office/word/2016/wordml/cid" xmlns:w16se="http://schemas.microsoft.com/office/word/2015/wordml/symex" xmlns:wpg="http://schemas.microsoft.com/office/word/2010/wordprocessingGroup" xmlns:wpi="http://schemas.microsoft.com/office/word/2010/wordprocessingInk" xmlns:wne="http://schemas.microsoft.com/office/word/2006/wordml" xmlns:wps="http://schemas.microsoft.com/office/word/2010/wordprocessingShape" mc:Ignorable="w14 w15 w16se w16cid wp14">
+<w:endnotes xmlns:wpc="http://schemas.microsoft.com/office/word/2010/wordprocessingCanvas" xmlns:cx="http://schemas.microsoft.com/office/drawing/2014/chartex" xmlns:cx1="http://schemas.microsoft.com/office/drawing/2015/9/8/chartex" xmlns:cx2="http://schemas.microsoft.com/office/drawing/2015/10/21/chartex" xmlns:cx3="http://schemas.microsoft.com/office/drawing/2016/5/9/chartex" xmlns:cx4="http://schemas.microsoft.com/office/drawing/2016/5/10/chartex" xmlns:cx5="http://schemas.microsoft.com/office/drawing/2016/5/11/chartex" xmlns:cx6="http://schemas.microsoft.com/office/drawing/2016/5/12/chartex" xmlns:cx7="http://schemas.microsoft.com/office/drawing/2016/5/13/chartex" xmlns:cx8="http://schemas.microsoft.com/office/drawing/2016/5/14/chartex" xmlns:mc="http://schemas.openxmlformats.org/markup-compatibility/2006" xmlns:aink="http://schemas.microsoft.com/office/drawing/2016/ink" xmlns:am3d="http://schemas.microsoft.com/office/drawing/2017/model3d" xmlns:o="urn:schemas-microsoft-com:office:office" xmlns:oel="http://schemas.microsoft.com/office/2019/extlst" xmlns:r="http://schemas.openxmlformats.org/officeDocument/2006/relationships" xmlns:m="http://schemas.openxmlformats.org/officeDocument/2006/math" xmlns:v="urn:schemas-microsoft-com:vml" xmlns:wp14="http://schemas.microsoft.com/office/word/2010/wordprocessingDrawing" xmlns:wp="http://schemas.openxmlformats.org/drawingml/2006/wordprocessingDrawing" xmlns:w10="urn:schemas-microsoft-com:office:word" xmlns:w="http://schemas.openxmlformats.org/wordprocessingml/2006/main" xmlns:w14="http://schemas.microsoft.com/office/word/2010/wordml" xmlns:w15="http://schemas.microsoft.com/office/word/2012/wordml" xmlns:w16cex="http://schemas.microsoft.com/office/word/2018/wordml/cex" xmlns:w16cid="http://schemas.microsoft.com/office/word/2016/wordml/cid" xmlns:w16="http://schemas.microsoft.com/office/word/2018/wordml" xmlns:w16du="http://schemas.microsoft.com/office/word/2023/wordml/word16du" xmlns:w16sdtdh="http://schemas.microsoft.com/office/word/2020/wordml/sdtdatahash" xmlns:w16sdtfl="http://schemas.microsoft.com/office/word/2024/wordml/sdtformatlock" xmlns:w16se="http://schemas.microsoft.com/office/word/2015/wordml/symex" xmlns:wpg="http://schemas.microsoft.com/office/word/2010/wordprocessingGroup" xmlns:wpi="http://schemas.microsoft.com/office/word/2010/wordprocessingInk" xmlns:wne="http://schemas.microsoft.com/office/word/2006/wordml" xmlns:wps="http://schemas.microsoft.com/office/word/2010/wordprocessingShape" mc:Ignorable="w14 w15 w16se w16cid w16 w16cex w16sdtdh w16sdtfl w16du wp14">
   <w:endnote w:type="separator" w:id="-1">
     <w:p>
       <w:pPr>
@@ -1332,7 +2022,7 @@
 </file>
 
 <file path=word/footer1.xml><?xml version="1.0" encoding="utf-8"?>
-<w:ftr xmlns:wpc="http://schemas.microsoft.com/office/word/2010/wordprocessingCanvas" xmlns:cx="http://schemas.microsoft.com/office/drawing/2014/chartex" xmlns:cx1="http://schemas.microsoft.com/office/drawing/2015/9/8/chartex" xmlns:cx2="http://schemas.microsoft.com/office/drawing/2015/10/21/chartex" xmlns:cx3="http://schemas.microsoft.com/office/drawing/2016/5/9/chartex" xmlns:cx4="http://schemas.microsoft.com/office/drawing/2016/5/10/chartex" xmlns:cx5="http://schemas.microsoft.com/office/drawing/2016/5/11/chartex" xmlns:cx6="http://schemas.microsoft.com/office/drawing/2016/5/12/chartex" xmlns:cx7="http://schemas.microsoft.com/office/drawing/2016/5/13/chartex" xmlns:cx8="http://schemas.microsoft.com/office/drawing/2016/5/14/chartex" xmlns:mc="http://schemas.openxmlformats.org/markup-compatibility/2006" xmlns:aink="http://schemas.microsoft.com/office/drawing/2016/ink" xmlns:am3d="http://schemas.microsoft.com/office/drawing/2017/model3d" xmlns:o="urn:schemas-microsoft-com:office:office" xmlns:r="http://schemas.openxmlformats.org/officeDocument/2006/relationships" xmlns:m="http://schemas.openxmlformats.org/officeDocument/2006/math" xmlns:v="urn:schemas-microsoft-com:vml" xmlns:wp14="http://schemas.microsoft.com/office/word/2010/wordprocessingDrawing" xmlns:wp="http://schemas.openxmlformats.org/drawingml/2006/wordprocessingDrawing" xmlns:w10="urn:schemas-microsoft-com:office:word" xmlns:w="http://schemas.openxmlformats.org/wordprocessingml/2006/main" xmlns:w14="http://schemas.microsoft.com/office/word/2010/wordml" xmlns:w15="http://schemas.microsoft.com/office/word/2012/wordml" xmlns:w16cid="http://schemas.microsoft.com/office/word/2016/wordml/cid" xmlns:w16se="http://schemas.microsoft.com/office/word/2015/wordml/symex" xmlns:wpg="http://schemas.microsoft.com/office/word/2010/wordprocessingGroup" xmlns:wpi="http://schemas.microsoft.com/office/word/2010/wordprocessingInk" xmlns:wne="http://schemas.microsoft.com/office/word/2006/wordml" xmlns:wps="http://schemas.microsoft.com/office/word/2010/wordprocessingShape" mc:Ignorable="w14 w15 w16se w16cid wp14">
+<w:ftr xmlns:wpc="http://schemas.microsoft.com/office/word/2010/wordprocessingCanvas" xmlns:cx="http://schemas.microsoft.com/office/drawing/2014/chartex" xmlns:cx1="http://schemas.microsoft.com/office/drawing/2015/9/8/chartex" xmlns:cx2="http://schemas.microsoft.com/office/drawing/2015/10/21/chartex" xmlns:cx3="http://schemas.microsoft.com/office/drawing/2016/5/9/chartex" xmlns:cx4="http://schemas.microsoft.com/office/drawing/2016/5/10/chartex" xmlns:cx5="http://schemas.microsoft.com/office/drawing/2016/5/11/chartex" xmlns:cx6="http://schemas.microsoft.com/office/drawing/2016/5/12/chartex" xmlns:cx7="http://schemas.microsoft.com/office/drawing/2016/5/13/chartex" xmlns:cx8="http://schemas.microsoft.com/office/drawing/2016/5/14/chartex" xmlns:mc="http://schemas.openxmlformats.org/markup-compatibility/2006" xmlns:aink="http://schemas.microsoft.com/office/drawing/2016/ink" xmlns:am3d="http://schemas.microsoft.com/office/drawing/2017/model3d" xmlns:o="urn:schemas-microsoft-com:office:office" xmlns:oel="http://schemas.microsoft.com/office/2019/extlst" xmlns:r="http://schemas.openxmlformats.org/officeDocument/2006/relationships" xmlns:m="http://schemas.openxmlformats.org/officeDocument/2006/math" xmlns:v="urn:schemas-microsoft-com:vml" xmlns:wp14="http://schemas.microsoft.com/office/word/2010/wordprocessingDrawing" xmlns:wp="http://schemas.openxmlformats.org/drawingml/2006/wordprocessingDrawing" xmlns:w10="urn:schemas-microsoft-com:office:word" xmlns:w="http://schemas.openxmlformats.org/wordprocessingml/2006/main" xmlns:w14="http://schemas.microsoft.com/office/word/2010/wordml" xmlns:w15="http://schemas.microsoft.com/office/word/2012/wordml" xmlns:w16cex="http://schemas.microsoft.com/office/word/2018/wordml/cex" xmlns:w16cid="http://schemas.microsoft.com/office/word/2016/wordml/cid" xmlns:w16="http://schemas.microsoft.com/office/word/2018/wordml" xmlns:w16du="http://schemas.microsoft.com/office/word/2023/wordml/word16du" xmlns:w16sdtdh="http://schemas.microsoft.com/office/word/2020/wordml/sdtdatahash" xmlns:w16sdtfl="http://schemas.microsoft.com/office/word/2024/wordml/sdtformatlock" xmlns:w16se="http://schemas.microsoft.com/office/word/2015/wordml/symex" xmlns:wpg="http://schemas.microsoft.com/office/word/2010/wordprocessingGroup" xmlns:wpi="http://schemas.microsoft.com/office/word/2010/wordprocessingInk" xmlns:wne="http://schemas.microsoft.com/office/word/2006/wordml" xmlns:wps="http://schemas.microsoft.com/office/word/2010/wordprocessingShape" mc:Ignorable="w14 w15 w16se w16cid w16 w16cex w16sdtdh w16sdtfl w16du wp14">
   <w:tbl>
     <w:tblPr>
       <w:tblW w:w="5000" w:type="pct"/>
@@ -1401,7 +2091,6 @@
       <w:tc>
         <w:tcPr>
           <w:tcW w:w="4686" w:type="dxa"/>
-          <w:shd w:val="clear" w:color="auto" w:fill="auto"/>
           <w:vAlign w:val="center"/>
         </w:tcPr>
         <w:p>
@@ -1419,7 +2108,6 @@
       <w:tc>
         <w:tcPr>
           <w:tcW w:w="4674" w:type="dxa"/>
-          <w:shd w:val="clear" w:color="auto" w:fill="auto"/>
           <w:vAlign w:val="center"/>
         </w:tcPr>
         <w:p>
@@ -1493,7 +2181,7 @@
 </file>
 
 <file path=word/footer2.xml><?xml version="1.0" encoding="utf-8"?>
-<w:ftr xmlns:wpc="http://schemas.microsoft.com/office/word/2010/wordprocessingCanvas" xmlns:cx="http://schemas.microsoft.com/office/drawing/2014/chartex" xmlns:cx1="http://schemas.microsoft.com/office/drawing/2015/9/8/chartex" xmlns:cx2="http://schemas.microsoft.com/office/drawing/2015/10/21/chartex" xmlns:cx3="http://schemas.microsoft.com/office/drawing/2016/5/9/chartex" xmlns:cx4="http://schemas.microsoft.com/office/drawing/2016/5/10/chartex" xmlns:cx5="http://schemas.microsoft.com/office/drawing/2016/5/11/chartex" xmlns:cx6="http://schemas.microsoft.com/office/drawing/2016/5/12/chartex" xmlns:cx7="http://schemas.microsoft.com/office/drawing/2016/5/13/chartex" xmlns:cx8="http://schemas.microsoft.com/office/drawing/2016/5/14/chartex" xmlns:mc="http://schemas.openxmlformats.org/markup-compatibility/2006" xmlns:aink="http://schemas.microsoft.com/office/drawing/2016/ink" xmlns:am3d="http://schemas.microsoft.com/office/drawing/2017/model3d" xmlns:o="urn:schemas-microsoft-com:office:office" xmlns:r="http://schemas.openxmlformats.org/officeDocument/2006/relationships" xmlns:m="http://schemas.openxmlformats.org/officeDocument/2006/math" xmlns:v="urn:schemas-microsoft-com:vml" xmlns:wp14="http://schemas.microsoft.com/office/word/2010/wordprocessingDrawing" xmlns:wp="http://schemas.openxmlformats.org/drawingml/2006/wordprocessingDrawing" xmlns:w10="urn:schemas-microsoft-com:office:word" xmlns:w="http://schemas.openxmlformats.org/wordprocessingml/2006/main" xmlns:w14="http://schemas.microsoft.com/office/word/2010/wordml" xmlns:w15="http://schemas.microsoft.com/office/word/2012/wordml" xmlns:w16cid="http://schemas.microsoft.com/office/word/2016/wordml/cid" xmlns:w16se="http://schemas.microsoft.com/office/word/2015/wordml/symex" xmlns:wpg="http://schemas.microsoft.com/office/word/2010/wordprocessingGroup" xmlns:wpi="http://schemas.microsoft.com/office/word/2010/wordprocessingInk" xmlns:wne="http://schemas.microsoft.com/office/word/2006/wordml" xmlns:wps="http://schemas.microsoft.com/office/word/2010/wordprocessingShape" mc:Ignorable="w14 w15 w16se w16cid wp14">
+<w:ftr xmlns:wpc="http://schemas.microsoft.com/office/word/2010/wordprocessingCanvas" xmlns:cx="http://schemas.microsoft.com/office/drawing/2014/chartex" xmlns:cx1="http://schemas.microsoft.com/office/drawing/2015/9/8/chartex" xmlns:cx2="http://schemas.microsoft.com/office/drawing/2015/10/21/chartex" xmlns:cx3="http://schemas.microsoft.com/office/drawing/2016/5/9/chartex" xmlns:cx4="http://schemas.microsoft.com/office/drawing/2016/5/10/chartex" xmlns:cx5="http://schemas.microsoft.com/office/drawing/2016/5/11/chartex" xmlns:cx6="http://schemas.microsoft.com/office/drawing/2016/5/12/chartex" xmlns:cx7="http://schemas.microsoft.com/office/drawing/2016/5/13/chartex" xmlns:cx8="http://schemas.microsoft.com/office/drawing/2016/5/14/chartex" xmlns:mc="http://schemas.openxmlformats.org/markup-compatibility/2006" xmlns:aink="http://schemas.microsoft.com/office/drawing/2016/ink" xmlns:am3d="http://schemas.microsoft.com/office/drawing/2017/model3d" xmlns:o="urn:schemas-microsoft-com:office:office" xmlns:oel="http://schemas.microsoft.com/office/2019/extlst" xmlns:r="http://schemas.openxmlformats.org/officeDocument/2006/relationships" xmlns:m="http://schemas.openxmlformats.org/officeDocument/2006/math" xmlns:v="urn:schemas-microsoft-com:vml" xmlns:wp14="http://schemas.microsoft.com/office/word/2010/wordprocessingDrawing" xmlns:wp="http://schemas.openxmlformats.org/drawingml/2006/wordprocessingDrawing" xmlns:w10="urn:schemas-microsoft-com:office:word" xmlns:w="http://schemas.openxmlformats.org/wordprocessingml/2006/main" xmlns:w14="http://schemas.microsoft.com/office/word/2010/wordml" xmlns:w15="http://schemas.microsoft.com/office/word/2012/wordml" xmlns:w16cex="http://schemas.microsoft.com/office/word/2018/wordml/cex" xmlns:w16cid="http://schemas.microsoft.com/office/word/2016/wordml/cid" xmlns:w16="http://schemas.microsoft.com/office/word/2018/wordml" xmlns:w16du="http://schemas.microsoft.com/office/word/2023/wordml/word16du" xmlns:w16sdtdh="http://schemas.microsoft.com/office/word/2020/wordml/sdtdatahash" xmlns:w16sdtfl="http://schemas.microsoft.com/office/word/2024/wordml/sdtformatlock" xmlns:w16se="http://schemas.microsoft.com/office/word/2015/wordml/symex" xmlns:wpg="http://schemas.microsoft.com/office/word/2010/wordprocessingGroup" xmlns:wpi="http://schemas.microsoft.com/office/word/2010/wordprocessingInk" xmlns:wne="http://schemas.microsoft.com/office/word/2006/wordml" xmlns:wps="http://schemas.microsoft.com/office/word/2010/wordprocessingShape" mc:Ignorable="w14 w15 w16se w16cid w16 w16cex w16sdtdh w16sdtfl w16du wp14">
   <w:tbl>
     <w:tblPr>
       <w:tblW w:w="5000" w:type="pct"/>
@@ -1562,7 +2250,6 @@
       <w:tc>
         <w:tcPr>
           <w:tcW w:w="4686" w:type="dxa"/>
-          <w:shd w:val="clear" w:color="auto" w:fill="auto"/>
           <w:vAlign w:val="center"/>
         </w:tcPr>
         <w:p>
@@ -1580,7 +2267,6 @@
       <w:tc>
         <w:tcPr>
           <w:tcW w:w="4674" w:type="dxa"/>
-          <w:shd w:val="clear" w:color="auto" w:fill="auto"/>
           <w:vAlign w:val="center"/>
         </w:tcPr>
         <w:p>
@@ -1654,7 +2340,7 @@
 </file>
 
 <file path=word/footnotes.xml><?xml version="1.0" encoding="utf-8"?>
-<w:footnotes xmlns:wpc="http://schemas.microsoft.com/office/word/2010/wordprocessingCanvas" xmlns:cx="http://schemas.microsoft.com/office/drawing/2014/chartex" xmlns:cx1="http://schemas.microsoft.com/office/drawing/2015/9/8/chartex" xmlns:cx2="http://schemas.microsoft.com/office/drawing/2015/10/21/chartex" xmlns:cx3="http://schemas.microsoft.com/office/drawing/2016/5/9/chartex" xmlns:cx4="http://schemas.microsoft.com/office/drawing/2016/5/10/chartex" xmlns:cx5="http://schemas.microsoft.com/office/drawing/2016/5/11/chartex" xmlns:cx6="http://schemas.microsoft.com/office/drawing/2016/5/12/chartex" xmlns:cx7="http://schemas.microsoft.com/office/drawing/2016/5/13/chartex" xmlns:cx8="http://schemas.microsoft.com/office/drawing/2016/5/14/chartex" xmlns:mc="http://schemas.openxmlformats.org/markup-compatibility/2006" xmlns:aink="http://schemas.microsoft.com/office/drawing/2016/ink" xmlns:am3d="http://schemas.microsoft.com/office/drawing/2017/model3d" xmlns:o="urn:schemas-microsoft-com:office:office" xmlns:r="http://schemas.openxmlformats.org/officeDocument/2006/relationships" xmlns:m="http://schemas.openxmlformats.org/officeDocument/2006/math" xmlns:v="urn:schemas-microsoft-com:vml" xmlns:wp14="http://schemas.microsoft.com/office/word/2010/wordprocessingDrawing" xmlns:wp="http://schemas.openxmlformats.org/drawingml/2006/wordprocessingDrawing" xmlns:w10="urn:schemas-microsoft-com:office:word" xmlns:w="http://schemas.openxmlformats.org/wordprocessingml/2006/main" xmlns:w14="http://schemas.microsoft.com/office/word/2010/wordml" xmlns:w15="http://schemas.microsoft.com/office/word/2012/wordml" xmlns:w16cid="http://schemas.microsoft.com/office/word/2016/wordml/cid" xmlns:w16se="http://schemas.microsoft.com/office/word/2015/wordml/symex" xmlns:wpg="http://schemas.microsoft.com/office/word/2010/wordprocessingGroup" xmlns:wpi="http://schemas.microsoft.com/office/word/2010/wordprocessingInk" xmlns:wne="http://schemas.microsoft.com/office/word/2006/wordml" xmlns:wps="http://schemas.microsoft.com/office/word/2010/wordprocessingShape" mc:Ignorable="w14 w15 w16se w16cid wp14">
+<w:footnotes xmlns:wpc="http://schemas.microsoft.com/office/word/2010/wordprocessingCanvas" xmlns:cx="http://schemas.microsoft.com/office/drawing/2014/chartex" xmlns:cx1="http://schemas.microsoft.com/office/drawing/2015/9/8/chartex" xmlns:cx2="http://schemas.microsoft.com/office/drawing/2015/10/21/chartex" xmlns:cx3="http://schemas.microsoft.com/office/drawing/2016/5/9/chartex" xmlns:cx4="http://schemas.microsoft.com/office/drawing/2016/5/10/chartex" xmlns:cx5="http://schemas.microsoft.com/office/drawing/2016/5/11/chartex" xmlns:cx6="http://schemas.microsoft.com/office/drawing/2016/5/12/chartex" xmlns:cx7="http://schemas.microsoft.com/office/drawing/2016/5/13/chartex" xmlns:cx8="http://schemas.microsoft.com/office/drawing/2016/5/14/chartex" xmlns:mc="http://schemas.openxmlformats.org/markup-compatibility/2006" xmlns:aink="http://schemas.microsoft.com/office/drawing/2016/ink" xmlns:am3d="http://schemas.microsoft.com/office/drawing/2017/model3d" xmlns:o="urn:schemas-microsoft-com:office:office" xmlns:oel="http://schemas.microsoft.com/office/2019/extlst" xmlns:r="http://schemas.openxmlformats.org/officeDocument/2006/relationships" xmlns:m="http://schemas.openxmlformats.org/officeDocument/2006/math" xmlns:v="urn:schemas-microsoft-com:vml" xmlns:wp14="http://schemas.microsoft.com/office/word/2010/wordprocessingDrawing" xmlns:wp="http://schemas.openxmlformats.org/drawingml/2006/wordprocessingDrawing" xmlns:w10="urn:schemas-microsoft-com:office:word" xmlns:w="http://schemas.openxmlformats.org/wordprocessingml/2006/main" xmlns:w14="http://schemas.microsoft.com/office/word/2010/wordml" xmlns:w15="http://schemas.microsoft.com/office/word/2012/wordml" xmlns:w16cex="http://schemas.microsoft.com/office/word/2018/wordml/cex" xmlns:w16cid="http://schemas.microsoft.com/office/word/2016/wordml/cid" xmlns:w16="http://schemas.microsoft.com/office/word/2018/wordml" xmlns:w16du="http://schemas.microsoft.com/office/word/2023/wordml/word16du" xmlns:w16sdtdh="http://schemas.microsoft.com/office/word/2020/wordml/sdtdatahash" xmlns:w16sdtfl="http://schemas.microsoft.com/office/word/2024/wordml/sdtformatlock" xmlns:w16se="http://schemas.microsoft.com/office/word/2015/wordml/symex" xmlns:wpg="http://schemas.microsoft.com/office/word/2010/wordprocessingGroup" xmlns:wpi="http://schemas.microsoft.com/office/word/2010/wordprocessingInk" xmlns:wne="http://schemas.microsoft.com/office/word/2006/wordml" xmlns:wps="http://schemas.microsoft.com/office/word/2010/wordprocessingShape" mc:Ignorable="w14 w15 w16se w16cid w16 w16cex w16sdtdh w16sdtfl w16du wp14">
   <w:footnote w:type="separator" w:id="-1">
     <w:p>
       <w:pPr>
@@ -1679,7 +2365,7 @@
 </file>
 
 <file path=word/header1.xml><?xml version="1.0" encoding="utf-8"?>
-<w:hdr xmlns:wpc="http://schemas.microsoft.com/office/word/2010/wordprocessingCanvas" xmlns:cx="http://schemas.microsoft.com/office/drawing/2014/chartex" xmlns:cx1="http://schemas.microsoft.com/office/drawing/2015/9/8/chartex" xmlns:cx2="http://schemas.microsoft.com/office/drawing/2015/10/21/chartex" xmlns:cx3="http://schemas.microsoft.com/office/drawing/2016/5/9/chartex" xmlns:cx4="http://schemas.microsoft.com/office/drawing/2016/5/10/chartex" xmlns:cx5="http://schemas.microsoft.com/office/drawing/2016/5/11/chartex" xmlns:cx6="http://schemas.microsoft.com/office/drawing/2016/5/12/chartex" xmlns:cx7="http://schemas.microsoft.com/office/drawing/2016/5/13/chartex" xmlns:cx8="http://schemas.microsoft.com/office/drawing/2016/5/14/chartex" xmlns:mc="http://schemas.openxmlformats.org/markup-compatibility/2006" xmlns:aink="http://schemas.microsoft.com/office/drawing/2016/ink" xmlns:am3d="http://schemas.microsoft.com/office/drawing/2017/model3d" xmlns:o="urn:schemas-microsoft-com:office:office" xmlns:r="http://schemas.openxmlformats.org/officeDocument/2006/relationships" xmlns:m="http://schemas.openxmlformats.org/officeDocument/2006/math" xmlns:v="urn:schemas-microsoft-com:vml" xmlns:wp14="http://schemas.microsoft.com/office/word/2010/wordprocessingDrawing" xmlns:wp="http://schemas.openxmlformats.org/drawingml/2006/wordprocessingDrawing" xmlns:w10="urn:schemas-microsoft-com:office:word" xmlns:w="http://schemas.openxmlformats.org/wordprocessingml/2006/main" xmlns:w14="http://schemas.microsoft.com/office/word/2010/wordml" xmlns:w15="http://schemas.microsoft.com/office/word/2012/wordml" xmlns:w16cid="http://schemas.microsoft.com/office/word/2016/wordml/cid" xmlns:w16se="http://schemas.microsoft.com/office/word/2015/wordml/symex" xmlns:wpg="http://schemas.microsoft.com/office/word/2010/wordprocessingGroup" xmlns:wpi="http://schemas.microsoft.com/office/word/2010/wordprocessingInk" xmlns:wne="http://schemas.microsoft.com/office/word/2006/wordml" xmlns:wps="http://schemas.microsoft.com/office/word/2010/wordprocessingShape" mc:Ignorable="w14 w15 w16se w16cid wp14">
+<w:hdr xmlns:wpc="http://schemas.microsoft.com/office/word/2010/wordprocessingCanvas" xmlns:cx="http://schemas.microsoft.com/office/drawing/2014/chartex" xmlns:cx1="http://schemas.microsoft.com/office/drawing/2015/9/8/chartex" xmlns:cx2="http://schemas.microsoft.com/office/drawing/2015/10/21/chartex" xmlns:cx3="http://schemas.microsoft.com/office/drawing/2016/5/9/chartex" xmlns:cx4="http://schemas.microsoft.com/office/drawing/2016/5/10/chartex" xmlns:cx5="http://schemas.microsoft.com/office/drawing/2016/5/11/chartex" xmlns:cx6="http://schemas.microsoft.com/office/drawing/2016/5/12/chartex" xmlns:cx7="http://schemas.microsoft.com/office/drawing/2016/5/13/chartex" xmlns:cx8="http://schemas.microsoft.com/office/drawing/2016/5/14/chartex" xmlns:mc="http://schemas.openxmlformats.org/markup-compatibility/2006" xmlns:aink="http://schemas.microsoft.com/office/drawing/2016/ink" xmlns:am3d="http://schemas.microsoft.com/office/drawing/2017/model3d" xmlns:o="urn:schemas-microsoft-com:office:office" xmlns:oel="http://schemas.microsoft.com/office/2019/extlst" xmlns:r="http://schemas.openxmlformats.org/officeDocument/2006/relationships" xmlns:m="http://schemas.openxmlformats.org/officeDocument/2006/math" xmlns:v="urn:schemas-microsoft-com:vml" xmlns:wp14="http://schemas.microsoft.com/office/word/2010/wordprocessingDrawing" xmlns:wp="http://schemas.openxmlformats.org/drawingml/2006/wordprocessingDrawing" xmlns:w10="urn:schemas-microsoft-com:office:word" xmlns:w="http://schemas.openxmlformats.org/wordprocessingml/2006/main" xmlns:w14="http://schemas.microsoft.com/office/word/2010/wordml" xmlns:w15="http://schemas.microsoft.com/office/word/2012/wordml" xmlns:w16cex="http://schemas.microsoft.com/office/word/2018/wordml/cex" xmlns:w16cid="http://schemas.microsoft.com/office/word/2016/wordml/cid" xmlns:w16="http://schemas.microsoft.com/office/word/2018/wordml" xmlns:w16du="http://schemas.microsoft.com/office/word/2023/wordml/word16du" xmlns:w16sdtdh="http://schemas.microsoft.com/office/word/2020/wordml/sdtdatahash" xmlns:w16sdtfl="http://schemas.microsoft.com/office/word/2024/wordml/sdtformatlock" xmlns:w16se="http://schemas.microsoft.com/office/word/2015/wordml/symex" xmlns:wpg="http://schemas.microsoft.com/office/word/2010/wordprocessingGroup" xmlns:wpi="http://schemas.microsoft.com/office/word/2010/wordprocessingInk" xmlns:wne="http://schemas.microsoft.com/office/word/2006/wordml" xmlns:wps="http://schemas.microsoft.com/office/word/2010/wordprocessingShape" mc:Ignorable="w14 w15 w16se w16cid w16 w16cex w16sdtdh w16sdtfl w16du wp14">
   <w:tbl>
     <w:tblPr>
       <w:tblStyle w:val="1"/>
@@ -1876,7 +2562,7 @@
 </file>
 
 <file path=word/header2.xml><?xml version="1.0" encoding="utf-8"?>
-<w:hdr xmlns:wpc="http://schemas.microsoft.com/office/word/2010/wordprocessingCanvas" xmlns:cx="http://schemas.microsoft.com/office/drawing/2014/chartex" xmlns:cx1="http://schemas.microsoft.com/office/drawing/2015/9/8/chartex" xmlns:cx2="http://schemas.microsoft.com/office/drawing/2015/10/21/chartex" xmlns:cx3="http://schemas.microsoft.com/office/drawing/2016/5/9/chartex" xmlns:cx4="http://schemas.microsoft.com/office/drawing/2016/5/10/chartex" xmlns:cx5="http://schemas.microsoft.com/office/drawing/2016/5/11/chartex" xmlns:cx6="http://schemas.microsoft.com/office/drawing/2016/5/12/chartex" xmlns:cx7="http://schemas.microsoft.com/office/drawing/2016/5/13/chartex" xmlns:cx8="http://schemas.microsoft.com/office/drawing/2016/5/14/chartex" xmlns:mc="http://schemas.openxmlformats.org/markup-compatibility/2006" xmlns:aink="http://schemas.microsoft.com/office/drawing/2016/ink" xmlns:am3d="http://schemas.microsoft.com/office/drawing/2017/model3d" xmlns:o="urn:schemas-microsoft-com:office:office" xmlns:r="http://schemas.openxmlformats.org/officeDocument/2006/relationships" xmlns:m="http://schemas.openxmlformats.org/officeDocument/2006/math" xmlns:v="urn:schemas-microsoft-com:vml" xmlns:wp14="http://schemas.microsoft.com/office/word/2010/wordprocessingDrawing" xmlns:wp="http://schemas.openxmlformats.org/drawingml/2006/wordprocessingDrawing" xmlns:w10="urn:schemas-microsoft-com:office:word" xmlns:w="http://schemas.openxmlformats.org/wordprocessingml/2006/main" xmlns:w14="http://schemas.microsoft.com/office/word/2010/wordml" xmlns:w15="http://schemas.microsoft.com/office/word/2012/wordml" xmlns:w16cid="http://schemas.microsoft.com/office/word/2016/wordml/cid" xmlns:w16se="http://schemas.microsoft.com/office/word/2015/wordml/symex" xmlns:wpg="http://schemas.microsoft.com/office/word/2010/wordprocessingGroup" xmlns:wpi="http://schemas.microsoft.com/office/word/2010/wordprocessingInk" xmlns:wne="http://schemas.microsoft.com/office/word/2006/wordml" xmlns:wps="http://schemas.microsoft.com/office/word/2010/wordprocessingShape" mc:Ignorable="w14 w15 w16se w16cid wp14">
+<w:hdr xmlns:wpc="http://schemas.microsoft.com/office/word/2010/wordprocessingCanvas" xmlns:cx="http://schemas.microsoft.com/office/drawing/2014/chartex" xmlns:cx1="http://schemas.microsoft.com/office/drawing/2015/9/8/chartex" xmlns:cx2="http://schemas.microsoft.com/office/drawing/2015/10/21/chartex" xmlns:cx3="http://schemas.microsoft.com/office/drawing/2016/5/9/chartex" xmlns:cx4="http://schemas.microsoft.com/office/drawing/2016/5/10/chartex" xmlns:cx5="http://schemas.microsoft.com/office/drawing/2016/5/11/chartex" xmlns:cx6="http://schemas.microsoft.com/office/drawing/2016/5/12/chartex" xmlns:cx7="http://schemas.microsoft.com/office/drawing/2016/5/13/chartex" xmlns:cx8="http://schemas.microsoft.com/office/drawing/2016/5/14/chartex" xmlns:mc="http://schemas.openxmlformats.org/markup-compatibility/2006" xmlns:aink="http://schemas.microsoft.com/office/drawing/2016/ink" xmlns:am3d="http://schemas.microsoft.com/office/drawing/2017/model3d" xmlns:o="urn:schemas-microsoft-com:office:office" xmlns:oel="http://schemas.microsoft.com/office/2019/extlst" xmlns:r="http://schemas.openxmlformats.org/officeDocument/2006/relationships" xmlns:m="http://schemas.openxmlformats.org/officeDocument/2006/math" xmlns:v="urn:schemas-microsoft-com:vml" xmlns:wp14="http://schemas.microsoft.com/office/word/2010/wordprocessingDrawing" xmlns:wp="http://schemas.openxmlformats.org/drawingml/2006/wordprocessingDrawing" xmlns:w10="urn:schemas-microsoft-com:office:word" xmlns:w="http://schemas.openxmlformats.org/wordprocessingml/2006/main" xmlns:w14="http://schemas.microsoft.com/office/word/2010/wordml" xmlns:w15="http://schemas.microsoft.com/office/word/2012/wordml" xmlns:w16cex="http://schemas.microsoft.com/office/word/2018/wordml/cex" xmlns:w16cid="http://schemas.microsoft.com/office/word/2016/wordml/cid" xmlns:w16="http://schemas.microsoft.com/office/word/2018/wordml" xmlns:w16du="http://schemas.microsoft.com/office/word/2023/wordml/word16du" xmlns:w16sdtdh="http://schemas.microsoft.com/office/word/2020/wordml/sdtdatahash" xmlns:w16sdtfl="http://schemas.microsoft.com/office/word/2024/wordml/sdtformatlock" xmlns:w16se="http://schemas.microsoft.com/office/word/2015/wordml/symex" xmlns:wpg="http://schemas.microsoft.com/office/word/2010/wordprocessingGroup" xmlns:wpi="http://schemas.microsoft.com/office/word/2010/wordprocessingInk" xmlns:wne="http://schemas.microsoft.com/office/word/2006/wordml" xmlns:wps="http://schemas.microsoft.com/office/word/2010/wordprocessingShape" mc:Ignorable="w14 w15 w16se w16cid w16 w16cex w16sdtdh w16sdtfl w16du wp14">
   <w:p>
     <w:pPr>
       <w:pStyle w:val="Encabezado"/>
@@ -1951,7 +2637,7 @@
 </file>
 
 <file path=word/header3.xml><?xml version="1.0" encoding="utf-8"?>
-<w:hdr xmlns:wpc="http://schemas.microsoft.com/office/word/2010/wordprocessingCanvas" xmlns:cx="http://schemas.microsoft.com/office/drawing/2014/chartex" xmlns:cx1="http://schemas.microsoft.com/office/drawing/2015/9/8/chartex" xmlns:cx2="http://schemas.microsoft.com/office/drawing/2015/10/21/chartex" xmlns:cx3="http://schemas.microsoft.com/office/drawing/2016/5/9/chartex" xmlns:cx4="http://schemas.microsoft.com/office/drawing/2016/5/10/chartex" xmlns:cx5="http://schemas.microsoft.com/office/drawing/2016/5/11/chartex" xmlns:cx6="http://schemas.microsoft.com/office/drawing/2016/5/12/chartex" xmlns:cx7="http://schemas.microsoft.com/office/drawing/2016/5/13/chartex" xmlns:cx8="http://schemas.microsoft.com/office/drawing/2016/5/14/chartex" xmlns:mc="http://schemas.openxmlformats.org/markup-compatibility/2006" xmlns:aink="http://schemas.microsoft.com/office/drawing/2016/ink" xmlns:am3d="http://schemas.microsoft.com/office/drawing/2017/model3d" xmlns:o="urn:schemas-microsoft-com:office:office" xmlns:r="http://schemas.openxmlformats.org/officeDocument/2006/relationships" xmlns:m="http://schemas.openxmlformats.org/officeDocument/2006/math" xmlns:v="urn:schemas-microsoft-com:vml" xmlns:wp14="http://schemas.microsoft.com/office/word/2010/wordprocessingDrawing" xmlns:wp="http://schemas.openxmlformats.org/drawingml/2006/wordprocessingDrawing" xmlns:w10="urn:schemas-microsoft-com:office:word" xmlns:w="http://schemas.openxmlformats.org/wordprocessingml/2006/main" xmlns:w14="http://schemas.microsoft.com/office/word/2010/wordml" xmlns:w15="http://schemas.microsoft.com/office/word/2012/wordml" xmlns:w16cid="http://schemas.microsoft.com/office/word/2016/wordml/cid" xmlns:w16se="http://schemas.microsoft.com/office/word/2015/wordml/symex" xmlns:wpg="http://schemas.microsoft.com/office/word/2010/wordprocessingGroup" xmlns:wpi="http://schemas.microsoft.com/office/word/2010/wordprocessingInk" xmlns:wne="http://schemas.microsoft.com/office/word/2006/wordml" xmlns:wps="http://schemas.microsoft.com/office/word/2010/wordprocessingShape" mc:Ignorable="w14 w15 w16se w16cid wp14">
+<w:hdr xmlns:wpc="http://schemas.microsoft.com/office/word/2010/wordprocessingCanvas" xmlns:cx="http://schemas.microsoft.com/office/drawing/2014/chartex" xmlns:cx1="http://schemas.microsoft.com/office/drawing/2015/9/8/chartex" xmlns:cx2="http://schemas.microsoft.com/office/drawing/2015/10/21/chartex" xmlns:cx3="http://schemas.microsoft.com/office/drawing/2016/5/9/chartex" xmlns:cx4="http://schemas.microsoft.com/office/drawing/2016/5/10/chartex" xmlns:cx5="http://schemas.microsoft.com/office/drawing/2016/5/11/chartex" xmlns:cx6="http://schemas.microsoft.com/office/drawing/2016/5/12/chartex" xmlns:cx7="http://schemas.microsoft.com/office/drawing/2016/5/13/chartex" xmlns:cx8="http://schemas.microsoft.com/office/drawing/2016/5/14/chartex" xmlns:mc="http://schemas.openxmlformats.org/markup-compatibility/2006" xmlns:aink="http://schemas.microsoft.com/office/drawing/2016/ink" xmlns:am3d="http://schemas.microsoft.com/office/drawing/2017/model3d" xmlns:o="urn:schemas-microsoft-com:office:office" xmlns:oel="http://schemas.microsoft.com/office/2019/extlst" xmlns:r="http://schemas.openxmlformats.org/officeDocument/2006/relationships" xmlns:m="http://schemas.openxmlformats.org/officeDocument/2006/math" xmlns:v="urn:schemas-microsoft-com:vml" xmlns:wp14="http://schemas.microsoft.com/office/word/2010/wordprocessingDrawing" xmlns:wp="http://schemas.openxmlformats.org/drawingml/2006/wordprocessingDrawing" xmlns:w10="urn:schemas-microsoft-com:office:word" xmlns:w="http://schemas.openxmlformats.org/wordprocessingml/2006/main" xmlns:w14="http://schemas.microsoft.com/office/word/2010/wordml" xmlns:w15="http://schemas.microsoft.com/office/word/2012/wordml" xmlns:w16cex="http://schemas.microsoft.com/office/word/2018/wordml/cex" xmlns:w16cid="http://schemas.microsoft.com/office/word/2016/wordml/cid" xmlns:w16="http://schemas.microsoft.com/office/word/2018/wordml" xmlns:w16du="http://schemas.microsoft.com/office/word/2023/wordml/word16du" xmlns:w16sdtdh="http://schemas.microsoft.com/office/word/2020/wordml/sdtdatahash" xmlns:w16sdtfl="http://schemas.microsoft.com/office/word/2024/wordml/sdtformatlock" xmlns:w16se="http://schemas.microsoft.com/office/word/2015/wordml/symex" xmlns:wpg="http://schemas.microsoft.com/office/word/2010/wordprocessingGroup" xmlns:wpi="http://schemas.microsoft.com/office/word/2010/wordprocessingInk" xmlns:wne="http://schemas.microsoft.com/office/word/2006/wordml" xmlns:wps="http://schemas.microsoft.com/office/word/2010/wordprocessingShape" mc:Ignorable="w14 w15 w16se w16cid w16 w16cex w16sdtdh w16sdtfl w16du wp14">
   <w:tbl>
     <w:tblPr>
       <w:tblStyle w:val="1"/>
@@ -2148,7 +2834,7 @@
 </file>
 
 <file path=word/numbering.xml><?xml version="1.0" encoding="utf-8"?>
-<w:numbering xmlns:wpc="http://schemas.microsoft.com/office/word/2010/wordprocessingCanvas" xmlns:cx="http://schemas.microsoft.com/office/drawing/2014/chartex" xmlns:cx1="http://schemas.microsoft.com/office/drawing/2015/9/8/chartex" xmlns:cx2="http://schemas.microsoft.com/office/drawing/2015/10/21/chartex" xmlns:cx3="http://schemas.microsoft.com/office/drawing/2016/5/9/chartex" xmlns:cx4="http://schemas.microsoft.com/office/drawing/2016/5/10/chartex" xmlns:cx5="http://schemas.microsoft.com/office/drawing/2016/5/11/chartex" xmlns:cx6="http://schemas.microsoft.com/office/drawing/2016/5/12/chartex" xmlns:cx7="http://schemas.microsoft.com/office/drawing/2016/5/13/chartex" xmlns:cx8="http://schemas.microsoft.com/office/drawing/2016/5/14/chartex" xmlns:mc="http://schemas.openxmlformats.org/markup-compatibility/2006" xmlns:aink="http://schemas.microsoft.com/office/drawing/2016/ink" xmlns:am3d="http://schemas.microsoft.com/office/drawing/2017/model3d" xmlns:o="urn:schemas-microsoft-com:office:office" xmlns:r="http://schemas.openxmlformats.org/officeDocument/2006/relationships" xmlns:m="http://schemas.openxmlformats.org/officeDocument/2006/math" xmlns:v="urn:schemas-microsoft-com:vml" xmlns:wp14="http://schemas.microsoft.com/office/word/2010/wordprocessingDrawing" xmlns:wp="http://schemas.openxmlformats.org/drawingml/2006/wordprocessingDrawing" xmlns:w10="urn:schemas-microsoft-com:office:word" xmlns:w="http://schemas.openxmlformats.org/wordprocessingml/2006/main" xmlns:w14="http://schemas.microsoft.com/office/word/2010/wordml" xmlns:w15="http://schemas.microsoft.com/office/word/2012/wordml" xmlns:w16cid="http://schemas.microsoft.com/office/word/2016/wordml/cid" xmlns:w16se="http://schemas.microsoft.com/office/word/2015/wordml/symex" xmlns:wpg="http://schemas.microsoft.com/office/word/2010/wordprocessingGroup" xmlns:wpi="http://schemas.microsoft.com/office/word/2010/wordprocessingInk" xmlns:wne="http://schemas.microsoft.com/office/word/2006/wordml" xmlns:wps="http://schemas.microsoft.com/office/word/2010/wordprocessingShape" mc:Ignorable="w14 w15 w16se w16cid wp14">
+<w:numbering xmlns:wpc="http://schemas.microsoft.com/office/word/2010/wordprocessingCanvas" xmlns:cx="http://schemas.microsoft.com/office/drawing/2014/chartex" xmlns:cx1="http://schemas.microsoft.com/office/drawing/2015/9/8/chartex" xmlns:cx2="http://schemas.microsoft.com/office/drawing/2015/10/21/chartex" xmlns:cx3="http://schemas.microsoft.com/office/drawing/2016/5/9/chartex" xmlns:cx4="http://schemas.microsoft.com/office/drawing/2016/5/10/chartex" xmlns:cx5="http://schemas.microsoft.com/office/drawing/2016/5/11/chartex" xmlns:cx6="http://schemas.microsoft.com/office/drawing/2016/5/12/chartex" xmlns:cx7="http://schemas.microsoft.com/office/drawing/2016/5/13/chartex" xmlns:cx8="http://schemas.microsoft.com/office/drawing/2016/5/14/chartex" xmlns:mc="http://schemas.openxmlformats.org/markup-compatibility/2006" xmlns:aink="http://schemas.microsoft.com/office/drawing/2016/ink" xmlns:am3d="http://schemas.microsoft.com/office/drawing/2017/model3d" xmlns:o="urn:schemas-microsoft-com:office:office" xmlns:oel="http://schemas.microsoft.com/office/2019/extlst" xmlns:r="http://schemas.openxmlformats.org/officeDocument/2006/relationships" xmlns:m="http://schemas.openxmlformats.org/officeDocument/2006/math" xmlns:v="urn:schemas-microsoft-com:vml" xmlns:wp14="http://schemas.microsoft.com/office/word/2010/wordprocessingDrawing" xmlns:wp="http://schemas.openxmlformats.org/drawingml/2006/wordprocessingDrawing" xmlns:w10="urn:schemas-microsoft-com:office:word" xmlns:w="http://schemas.openxmlformats.org/wordprocessingml/2006/main" xmlns:w14="http://schemas.microsoft.com/office/word/2010/wordml" xmlns:w15="http://schemas.microsoft.com/office/word/2012/wordml" xmlns:w16cex="http://schemas.microsoft.com/office/word/2018/wordml/cex" xmlns:w16cid="http://schemas.microsoft.com/office/word/2016/wordml/cid" xmlns:w16="http://schemas.microsoft.com/office/word/2018/wordml" xmlns:w16du="http://schemas.microsoft.com/office/word/2023/wordml/word16du" xmlns:w16sdtdh="http://schemas.microsoft.com/office/word/2020/wordml/sdtdatahash" xmlns:w16sdtfl="http://schemas.microsoft.com/office/word/2024/wordml/sdtformatlock" xmlns:w16se="http://schemas.microsoft.com/office/word/2015/wordml/symex" xmlns:wpg="http://schemas.microsoft.com/office/word/2010/wordprocessingGroup" xmlns:wpi="http://schemas.microsoft.com/office/word/2010/wordprocessingInk" xmlns:wne="http://schemas.microsoft.com/office/word/2006/wordml" xmlns:wps="http://schemas.microsoft.com/office/word/2010/wordprocessingShape" mc:Ignorable="w14 w15 w16se w16cid w16 w16cex w16sdtdh w16sdtfl w16du wp14">
   <w:numPicBullet w:numPicBulletId="0">
     <w:pict>
       <v:shapetype id="_x0000_t75" coordsize="21600,21600" o:spt="75" o:preferrelative="t" path="m@4@5l@4@11@9@11@9@5xe" filled="f" stroked="f">
@@ -2170,7 +2856,7 @@
         <v:path o:extrusionok="f" gradientshapeok="t" o:connecttype="rect"/>
         <o:lock v:ext="edit" aspectratio="t"/>
       </v:shapetype>
-      <v:shape id="_x0000_i1027" type="#_x0000_t75" style="width:11.25pt;height:11.25pt" o:bullet="t">
+      <v:shape id="_x0000_i1060" type="#_x0000_t75" style="width:11.35pt;height:11.35pt" o:bullet="t">
         <v:imagedata r:id="rId1" o:title="mso3E28"/>
       </v:shape>
     </w:pict>
@@ -4424,6 +5110,119 @@
     </w:lvl>
   </w:abstractNum>
   <w:abstractNum w:abstractNumId="19" w15:restartNumberingAfterBreak="0">
+    <w:nsid w:val="765D269F"/>
+    <w:multiLevelType w:val="multilevel"/>
+    <w:tmpl w:val="B25854B2"/>
+    <w:lvl w:ilvl="0">
+      <w:start w:val="1"/>
+      <w:numFmt w:val="decimal"/>
+      <w:lvlText w:val="%1"/>
+      <w:lvlJc w:val="left"/>
+      <w:pPr>
+        <w:ind w:left="372" w:hanging="372"/>
+      </w:pPr>
+      <w:rPr>
+        <w:rFonts w:hint="default"/>
+      </w:rPr>
+    </w:lvl>
+    <w:lvl w:ilvl="1">
+      <w:start w:val="1"/>
+      <w:numFmt w:val="decimal"/>
+      <w:lvlText w:val="%1.%2"/>
+      <w:lvlJc w:val="left"/>
+      <w:pPr>
+        <w:ind w:left="372" w:hanging="372"/>
+      </w:pPr>
+      <w:rPr>
+        <w:rFonts w:hint="default"/>
+      </w:rPr>
+    </w:lvl>
+    <w:lvl w:ilvl="2">
+      <w:start w:val="1"/>
+      <w:numFmt w:val="decimal"/>
+      <w:lvlText w:val="%1.%2.%3"/>
+      <w:lvlJc w:val="left"/>
+      <w:pPr>
+        <w:ind w:left="720" w:hanging="720"/>
+      </w:pPr>
+      <w:rPr>
+        <w:rFonts w:hint="default"/>
+      </w:rPr>
+    </w:lvl>
+    <w:lvl w:ilvl="3">
+      <w:start w:val="1"/>
+      <w:numFmt w:val="decimal"/>
+      <w:lvlText w:val="%1.%2.%3.%4"/>
+      <w:lvlJc w:val="left"/>
+      <w:pPr>
+        <w:ind w:left="720" w:hanging="720"/>
+      </w:pPr>
+      <w:rPr>
+        <w:rFonts w:hint="default"/>
+      </w:rPr>
+    </w:lvl>
+    <w:lvl w:ilvl="4">
+      <w:start w:val="1"/>
+      <w:numFmt w:val="decimal"/>
+      <w:lvlText w:val="%1.%2.%3.%4.%5"/>
+      <w:lvlJc w:val="left"/>
+      <w:pPr>
+        <w:ind w:left="1080" w:hanging="1080"/>
+      </w:pPr>
+      <w:rPr>
+        <w:rFonts w:hint="default"/>
+      </w:rPr>
+    </w:lvl>
+    <w:lvl w:ilvl="5">
+      <w:start w:val="1"/>
+      <w:numFmt w:val="decimal"/>
+      <w:lvlText w:val="%1.%2.%3.%4.%5.%6"/>
+      <w:lvlJc w:val="left"/>
+      <w:pPr>
+        <w:ind w:left="1080" w:hanging="1080"/>
+      </w:pPr>
+      <w:rPr>
+        <w:rFonts w:hint="default"/>
+      </w:rPr>
+    </w:lvl>
+    <w:lvl w:ilvl="6">
+      <w:start w:val="1"/>
+      <w:numFmt w:val="decimal"/>
+      <w:lvlText w:val="%1.%2.%3.%4.%5.%6.%7"/>
+      <w:lvlJc w:val="left"/>
+      <w:pPr>
+        <w:ind w:left="1440" w:hanging="1440"/>
+      </w:pPr>
+      <w:rPr>
+        <w:rFonts w:hint="default"/>
+      </w:rPr>
+    </w:lvl>
+    <w:lvl w:ilvl="7">
+      <w:start w:val="1"/>
+      <w:numFmt w:val="decimal"/>
+      <w:lvlText w:val="%1.%2.%3.%4.%5.%6.%7.%8"/>
+      <w:lvlJc w:val="left"/>
+      <w:pPr>
+        <w:ind w:left="1440" w:hanging="1440"/>
+      </w:pPr>
+      <w:rPr>
+        <w:rFonts w:hint="default"/>
+      </w:rPr>
+    </w:lvl>
+    <w:lvl w:ilvl="8">
+      <w:start w:val="1"/>
+      <w:numFmt w:val="decimal"/>
+      <w:lvlText w:val="%1.%2.%3.%4.%5.%6.%7.%8.%9"/>
+      <w:lvlJc w:val="left"/>
+      <w:pPr>
+        <w:ind w:left="1800" w:hanging="1800"/>
+      </w:pPr>
+      <w:rPr>
+        <w:rFonts w:hint="default"/>
+      </w:rPr>
+    </w:lvl>
+  </w:abstractNum>
+  <w:abstractNum w:abstractNumId="20" w15:restartNumberingAfterBreak="0">
     <w:nsid w:val="77694BC3"/>
     <w:multiLevelType w:val="hybridMultilevel"/>
     <w:tmpl w:val="8D0A3582"/>
@@ -4536,7 +5335,7 @@
       </w:rPr>
     </w:lvl>
   </w:abstractNum>
-  <w:abstractNum w:abstractNumId="20" w15:restartNumberingAfterBreak="0">
+  <w:abstractNum w:abstractNumId="21" w15:restartNumberingAfterBreak="0">
     <w:nsid w:val="7CE94054"/>
     <w:multiLevelType w:val="multilevel"/>
     <w:tmpl w:val="A4D4C1F2"/>
@@ -4650,74 +5449,77 @@
       </w:rPr>
     </w:lvl>
   </w:abstractNum>
-  <w:num w:numId="1">
+  <w:num w:numId="1" w16cid:durableId="1639728795">
     <w:abstractNumId w:val="6"/>
   </w:num>
-  <w:num w:numId="2">
+  <w:num w:numId="2" w16cid:durableId="1723866160">
     <w:abstractNumId w:val="16"/>
   </w:num>
-  <w:num w:numId="3">
+  <w:num w:numId="3" w16cid:durableId="1318801353">
     <w:abstractNumId w:val="15"/>
   </w:num>
-  <w:num w:numId="4">
+  <w:num w:numId="4" w16cid:durableId="1036586103">
     <w:abstractNumId w:val="13"/>
   </w:num>
-  <w:num w:numId="5">
+  <w:num w:numId="5" w16cid:durableId="21830215">
+    <w:abstractNumId w:val="21"/>
+  </w:num>
+  <w:num w:numId="6" w16cid:durableId="607932005">
+    <w:abstractNumId w:val="10"/>
+  </w:num>
+  <w:num w:numId="7" w16cid:durableId="1196039613">
+    <w:abstractNumId w:val="14"/>
+  </w:num>
+  <w:num w:numId="8" w16cid:durableId="797795467">
+    <w:abstractNumId w:val="18"/>
+  </w:num>
+  <w:num w:numId="9" w16cid:durableId="1185555067">
     <w:abstractNumId w:val="20"/>
   </w:num>
-  <w:num w:numId="6">
-    <w:abstractNumId w:val="10"/>
-  </w:num>
-  <w:num w:numId="7">
-    <w:abstractNumId w:val="14"/>
-  </w:num>
-  <w:num w:numId="8">
-    <w:abstractNumId w:val="18"/>
-  </w:num>
-  <w:num w:numId="9">
-    <w:abstractNumId w:val="19"/>
-  </w:num>
-  <w:num w:numId="10">
+  <w:num w:numId="10" w16cid:durableId="731150931">
     <w:abstractNumId w:val="1"/>
   </w:num>
-  <w:num w:numId="11">
+  <w:num w:numId="11" w16cid:durableId="97457085">
     <w:abstractNumId w:val="3"/>
   </w:num>
-  <w:num w:numId="12">
+  <w:num w:numId="12" w16cid:durableId="240261892">
     <w:abstractNumId w:val="11"/>
   </w:num>
-  <w:num w:numId="13">
+  <w:num w:numId="13" w16cid:durableId="936130915">
     <w:abstractNumId w:val="5"/>
   </w:num>
-  <w:num w:numId="14">
+  <w:num w:numId="14" w16cid:durableId="1846705042">
     <w:abstractNumId w:val="8"/>
   </w:num>
-  <w:num w:numId="15">
+  <w:num w:numId="15" w16cid:durableId="1824274691">
     <w:abstractNumId w:val="0"/>
   </w:num>
-  <w:num w:numId="16">
+  <w:num w:numId="16" w16cid:durableId="422992553">
     <w:abstractNumId w:val="17"/>
   </w:num>
-  <w:num w:numId="17">
+  <w:num w:numId="17" w16cid:durableId="533999065">
     <w:abstractNumId w:val="12"/>
   </w:num>
-  <w:num w:numId="18">
+  <w:num w:numId="18" w16cid:durableId="265382296">
     <w:abstractNumId w:val="2"/>
   </w:num>
-  <w:num w:numId="19">
+  <w:num w:numId="19" w16cid:durableId="836992758">
     <w:abstractNumId w:val="9"/>
   </w:num>
-  <w:num w:numId="20">
+  <w:num w:numId="20" w16cid:durableId="1591503562">
     <w:abstractNumId w:val="4"/>
   </w:num>
-  <w:num w:numId="21">
+  <w:num w:numId="21" w16cid:durableId="352726194">
     <w:abstractNumId w:val="7"/>
+  </w:num>
+  <w:num w:numId="22" w16cid:durableId="1404567713">
+    <w:abstractNumId w:val="19"/>
   </w:num>
 </w:numbering>
 </file>
 
 <file path=word/styles.xml><?xml version="1.0" encoding="utf-8"?>
-<w:styles xmlns:mc="http://schemas.openxmlformats.org/markup-compatibility/2006" xmlns:r="http://schemas.openxmlformats.org/officeDocument/2006/relationships" xmlns:w="http://schemas.openxmlformats.org/wordprocessingml/2006/main" xmlns:w14="http://schemas.microsoft.com/office/word/2010/wordml" xmlns:w15="http://schemas.microsoft.com/office/word/2012/wordml" xmlns:w16cid="http://schemas.microsoft.com/office/word/2016/wordml/cid" xmlns:w16se="http://schemas.microsoft.com/office/word/2015/wordml/symex" mc:Ignorable="w14 w15 w16se w16cid">
+<w:styles xmlns:mc="http://schemas.openxmlformats.org/markup-compatibility/2006" xmlns:r="http://schemas.openxmlformats.org/officeDocument/2006/relationships" xmlns:w="http://schemas.openxmlformats.org/wordprocessingml/2006/main" xmlns:w14="http://schemas.microsoft.com/office/word/2010/wordml" xmlns:w15="http://schemas.microsoft.com/office/word/2012/wordml" xmlns:w16cex="http://schemas.microsoft.com/office/word/2018/wordml/cex" xmlns:w16cid="http://schemas.microsoft.com/office/word/2016/wordml/cid" xmlns:w16="http://schemas.microsoft.com/office/word/2018/wordml" xmlns:w16du="http://schemas.microsoft.com/office/word/2023/wordml/word16du" xmlns:w16sdtdh="http://schemas.microsoft.com/office/word/2020/wordml/sdtdatahash" xmlns:w16sdtfl="http://schemas.microsoft.com/office/word/2024/wordml/sdtformatlock" xmlns:w16se="http://schemas.microsoft.com/office/word/2015/wordml/symex" mc:Ignorable="w14 w15 w16se w16cid w16 w16cex w16sdtdh w16sdtfl w16du">
   <w:docDefaults>
     <w:rPrDefault>
       <w:rPr>
@@ -4733,7 +5535,7 @@
       </w:pPr>
     </w:pPrDefault>
   </w:docDefaults>
-  <w:latentStyles w:defLockedState="0" w:defUIPriority="99" w:defSemiHidden="0" w:defUnhideWhenUsed="0" w:defQFormat="0" w:count="375">
+  <w:latentStyles w:defLockedState="0" w:defUIPriority="99" w:defSemiHidden="0" w:defUnhideWhenUsed="0" w:defQFormat="0" w:count="376">
     <w:lsdException w:name="Normal" w:uiPriority="0" w:qFormat="1"/>
     <w:lsdException w:name="heading 1" w:uiPriority="9" w:qFormat="1"/>
     <w:lsdException w:name="heading 2" w:semiHidden="1" w:uiPriority="9" w:unhideWhenUsed="1" w:qFormat="1"/>
@@ -5109,6 +5911,7 @@
     <w:lsdException w:name="Smart Hyperlink" w:semiHidden="1" w:unhideWhenUsed="1"/>
     <w:lsdException w:name="Hashtag" w:semiHidden="1" w:unhideWhenUsed="1"/>
     <w:lsdException w:name="Unresolved Mention" w:semiHidden="1" w:unhideWhenUsed="1"/>
+    <w:lsdException w:name="Smart Link" w:semiHidden="1" w:unhideWhenUsed="1"/>
   </w:latentStyles>
   <w:style w:type="paragraph" w:default="1" w:styleId="Normal">
     <w:name w:val="Normal"/>
@@ -5204,7 +6007,6 @@
   <w:style w:type="character" w:default="1" w:styleId="Fuentedeprrafopredeter">
     <w:name w:val="Default Paragraph Font"/>
     <w:uiPriority w:val="1"/>
-    <w:semiHidden/>
     <w:unhideWhenUsed/>
   </w:style>
   <w:style w:type="table" w:default="1" w:styleId="Tablanormal">

</xml_diff>

<commit_message>
Corrección de ortografía en diagrama de clases
</commit_message>
<xml_diff>
--- a/Actividad-1.docx
+++ b/Actividad-1.docx
@@ -1741,6 +1741,1581 @@
           <w:rFonts w:ascii="Arial" w:hAnsi="Arial" w:cs="Arial"/>
           <w:b/>
           <w:bCs/>
+          <w:lang w:val="es-ES" w:eastAsia="es-EC"/>
+        </w:rPr>
+      </w:pPr>
+      <w:r>
+        <w:rPr>
+          <w:rFonts w:ascii="Arial" w:hAnsi="Arial" w:cs="Arial"/>
+          <w:b/>
+          <w:bCs/>
+          <w:lang w:val="es-ES" w:eastAsia="es-EC"/>
+        </w:rPr>
+        <w:lastRenderedPageBreak/>
+        <w:drawing>
+          <wp:anchor distT="0" distB="0" distL="114300" distR="114300" simplePos="0" relativeHeight="251667456" behindDoc="0" locked="0" layoutInCell="1" allowOverlap="1" wp14:anchorId="6D2CC429" wp14:editId="0F8DDADE">
+            <wp:simplePos x="0" y="0"/>
+            <wp:positionH relativeFrom="column">
+              <wp:posOffset>173355</wp:posOffset>
+            </wp:positionH>
+            <wp:positionV relativeFrom="paragraph">
+              <wp:posOffset>382270</wp:posOffset>
+            </wp:positionV>
+            <wp:extent cx="5570855" cy="4993640"/>
+            <wp:effectExtent l="0" t="0" r="0" b="0"/>
+            <wp:wrapSquare wrapText="bothSides"/>
+            <wp:docPr id="1752137702" name="Imagen 1"/>
+            <wp:cNvGraphicFramePr>
+              <a:graphicFrameLocks xmlns:a="http://schemas.openxmlformats.org/drawingml/2006/main" noChangeAspect="1"/>
+            </wp:cNvGraphicFramePr>
+            <a:graphic xmlns:a="http://schemas.openxmlformats.org/drawingml/2006/main">
+              <a:graphicData uri="http://schemas.openxmlformats.org/drawingml/2006/picture">
+                <pic:pic xmlns:pic="http://schemas.openxmlformats.org/drawingml/2006/picture">
+                  <pic:nvPicPr>
+                    <pic:cNvPr id="1752137702" name=""/>
+                    <pic:cNvPicPr/>
+                  </pic:nvPicPr>
+                  <pic:blipFill rotWithShape="1">
+                    <a:blip r:embed="rId15">
+                      <a:extLst>
+                        <a:ext uri="{28A0092B-C50C-407E-A947-70E740481C1C}">
+                          <a14:useLocalDpi xmlns:a14="http://schemas.microsoft.com/office/drawing/2010/main" val="0"/>
+                        </a:ext>
+                      </a:extLst>
+                    </a:blip>
+                    <a:srcRect l="2968" t="2903" r="2761" b="3379"/>
+                    <a:stretch>
+                      <a:fillRect/>
+                    </a:stretch>
+                  </pic:blipFill>
+                  <pic:spPr bwMode="auto">
+                    <a:xfrm>
+                      <a:off x="0" y="0"/>
+                      <a:ext cx="5570855" cy="4993640"/>
+                    </a:xfrm>
+                    <a:prstGeom prst="rect">
+                      <a:avLst/>
+                    </a:prstGeom>
+                    <a:ln>
+                      <a:noFill/>
+                    </a:ln>
+                    <a:extLst>
+                      <a:ext uri="{53640926-AAD7-44D8-BBD7-CCE9431645EC}">
+                        <a14:shadowObscured xmlns:a14="http://schemas.microsoft.com/office/drawing/2010/main"/>
+                      </a:ext>
+                    </a:extLst>
+                  </pic:spPr>
+                </pic:pic>
+              </a:graphicData>
+            </a:graphic>
+            <wp14:sizeRelH relativeFrom="margin">
+              <wp14:pctWidth>0</wp14:pctWidth>
+            </wp14:sizeRelH>
+            <wp14:sizeRelV relativeFrom="margin">
+              <wp14:pctHeight>0</wp14:pctHeight>
+            </wp14:sizeRelV>
+          </wp:anchor>
+        </w:drawing>
+      </w:r>
+      <w:r>
+        <w:rPr>
+          <w:rFonts w:ascii="Arial" w:hAnsi="Arial" w:cs="Arial"/>
+          <w:b/>
+          <w:bCs/>
+          <w:lang w:val="es-ES" w:eastAsia="es-EC"/>
+        </w:rPr>
+        <w:t>2.3 Diagrama de clases UM</w:t>
+      </w:r>
+    </w:p>
+    <w:p>
+      <w:pPr>
+        <w:rPr>
+          <w:rFonts w:ascii="Arial" w:hAnsi="Arial" w:cs="Arial"/>
+          <w:b/>
+          <w:bCs/>
+          <w:lang w:val="es-ES" w:eastAsia="es-EC"/>
+        </w:rPr>
+      </w:pPr>
+      <w:r>
+        <w:rPr>
+          <w:rFonts w:ascii="Arial" w:hAnsi="Arial" w:cs="Arial"/>
+          <w:b/>
+          <w:bCs/>
+          <w:lang w:val="es-ES" w:eastAsia="es-EC"/>
+        </w:rPr>
+        <w:t>Descripción de clases:</w:t>
+      </w:r>
+    </w:p>
+    <w:tbl>
+      <w:tblPr>
+        <w:tblW w:w="9298" w:type="dxa"/>
+        <w:tblBorders>
+          <w:top w:val="single" w:sz="2" w:space="0" w:color="auto"/>
+          <w:left w:val="single" w:sz="2" w:space="0" w:color="auto"/>
+          <w:bottom w:val="single" w:sz="2" w:space="0" w:color="auto"/>
+          <w:right w:val="single" w:sz="2" w:space="0" w:color="auto"/>
+        </w:tblBorders>
+        <w:tblCellMar>
+          <w:left w:w="0" w:type="dxa"/>
+          <w:right w:w="0" w:type="dxa"/>
+        </w:tblCellMar>
+        <w:tblLook w:val="04A0" w:firstRow="1" w:lastRow="0" w:firstColumn="1" w:lastColumn="0" w:noHBand="0" w:noVBand="1"/>
+      </w:tblPr>
+      <w:tblGrid>
+        <w:gridCol w:w="1718"/>
+        <w:gridCol w:w="3572"/>
+        <w:gridCol w:w="4008"/>
+      </w:tblGrid>
+      <w:tr>
+        <w:trPr>
+          <w:trHeight w:val="27"/>
+          <w:tblHeader/>
+        </w:trPr>
+        <w:tc>
+          <w:tcPr>
+            <w:tcW w:w="0" w:type="auto"/>
+            <w:tcBorders>
+              <w:top w:val="single" w:sz="2" w:space="0" w:color="auto"/>
+              <w:left w:val="single" w:sz="2" w:space="0" w:color="auto"/>
+              <w:bottom w:val="single" w:sz="4" w:space="0" w:color="auto"/>
+              <w:right w:val="single" w:sz="2" w:space="0" w:color="auto"/>
+            </w:tcBorders>
+            <w:shd w:val="clear" w:color="auto" w:fill="A3DBFF"/>
+            <w:tcMar>
+              <w:top w:w="180" w:type="dxa"/>
+              <w:left w:w="180" w:type="dxa"/>
+              <w:bottom w:w="180" w:type="dxa"/>
+              <w:right w:w="180" w:type="dxa"/>
+            </w:tcMar>
+            <w:hideMark/>
+          </w:tcPr>
+          <w:p>
+            <w:pPr>
+              <w:rPr>
+                <w:rFonts w:ascii="Arial" w:hAnsi="Arial" w:cs="Arial"/>
+                <w:b/>
+                <w:bCs/>
+                <w:lang w:val="es-ES" w:eastAsia="es-EC"/>
+              </w:rPr>
+            </w:pPr>
+            <w:r>
+              <w:rPr>
+                <w:rFonts w:ascii="Arial" w:hAnsi="Arial" w:cs="Arial"/>
+                <w:b/>
+                <w:bCs/>
+                <w:lang w:val="es-ES" w:eastAsia="es-EC"/>
+              </w:rPr>
+              <w:t>Clase</w:t>
+            </w:r>
+          </w:p>
+        </w:tc>
+        <w:tc>
+          <w:tcPr>
+            <w:tcW w:w="0" w:type="auto"/>
+            <w:tcBorders>
+              <w:top w:val="single" w:sz="2" w:space="0" w:color="auto"/>
+              <w:left w:val="single" w:sz="2" w:space="0" w:color="auto"/>
+              <w:bottom w:val="single" w:sz="4" w:space="0" w:color="auto"/>
+              <w:right w:val="single" w:sz="2" w:space="0" w:color="auto"/>
+            </w:tcBorders>
+            <w:shd w:val="clear" w:color="auto" w:fill="A3DBFF"/>
+            <w:tcMar>
+              <w:top w:w="180" w:type="dxa"/>
+              <w:left w:w="180" w:type="dxa"/>
+              <w:bottom w:w="180" w:type="dxa"/>
+              <w:right w:w="180" w:type="dxa"/>
+            </w:tcMar>
+            <w:hideMark/>
+          </w:tcPr>
+          <w:p>
+            <w:pPr>
+              <w:rPr>
+                <w:rFonts w:ascii="Arial" w:hAnsi="Arial" w:cs="Arial"/>
+                <w:b/>
+                <w:bCs/>
+                <w:lang w:val="es-ES" w:eastAsia="es-EC"/>
+              </w:rPr>
+            </w:pPr>
+            <w:r>
+              <w:rPr>
+                <w:rFonts w:ascii="Arial" w:hAnsi="Arial" w:cs="Arial"/>
+                <w:b/>
+                <w:bCs/>
+                <w:lang w:val="es-ES" w:eastAsia="es-EC"/>
+              </w:rPr>
+              <w:t>Atributos</w:t>
+            </w:r>
+          </w:p>
+        </w:tc>
+        <w:tc>
+          <w:tcPr>
+            <w:tcW w:w="0" w:type="auto"/>
+            <w:tcBorders>
+              <w:top w:val="single" w:sz="2" w:space="0" w:color="auto"/>
+              <w:left w:val="single" w:sz="2" w:space="0" w:color="auto"/>
+              <w:bottom w:val="single" w:sz="4" w:space="0" w:color="auto"/>
+              <w:right w:val="single" w:sz="2" w:space="0" w:color="auto"/>
+            </w:tcBorders>
+            <w:shd w:val="clear" w:color="auto" w:fill="A3DBFF"/>
+            <w:tcMar>
+              <w:top w:w="180" w:type="dxa"/>
+              <w:left w:w="180" w:type="dxa"/>
+              <w:bottom w:w="180" w:type="dxa"/>
+              <w:right w:w="180" w:type="dxa"/>
+            </w:tcMar>
+            <w:hideMark/>
+          </w:tcPr>
+          <w:p>
+            <w:pPr>
+              <w:rPr>
+                <w:rFonts w:ascii="Arial" w:hAnsi="Arial" w:cs="Arial"/>
+                <w:b/>
+                <w:bCs/>
+                <w:lang w:val="es-ES" w:eastAsia="es-EC"/>
+              </w:rPr>
+            </w:pPr>
+            <w:r>
+              <w:rPr>
+                <w:rFonts w:ascii="Arial" w:hAnsi="Arial" w:cs="Arial"/>
+                <w:b/>
+                <w:bCs/>
+                <w:lang w:val="es-ES" w:eastAsia="es-EC"/>
+              </w:rPr>
+              <w:t>Métodos</w:t>
+            </w:r>
+          </w:p>
+        </w:tc>
+      </w:tr>
+      <w:tr>
+        <w:trPr>
+          <w:trHeight w:val="27"/>
+        </w:trPr>
+        <w:tc>
+          <w:tcPr>
+            <w:tcW w:w="0" w:type="auto"/>
+            <w:tcBorders>
+              <w:top w:val="single" w:sz="2" w:space="0" w:color="auto"/>
+              <w:left w:val="single" w:sz="2" w:space="0" w:color="auto"/>
+              <w:bottom w:val="single" w:sz="4" w:space="0" w:color="auto"/>
+              <w:right w:val="single" w:sz="2" w:space="0" w:color="auto"/>
+            </w:tcBorders>
+            <w:tcMar>
+              <w:top w:w="180" w:type="dxa"/>
+              <w:left w:w="180" w:type="dxa"/>
+              <w:bottom w:w="180" w:type="dxa"/>
+              <w:right w:w="180" w:type="dxa"/>
+            </w:tcMar>
+            <w:hideMark/>
+          </w:tcPr>
+          <w:p>
+            <w:pPr>
+              <w:jc w:val="center"/>
+              <w:rPr>
+                <w:rFonts w:ascii="Arial" w:hAnsi="Arial" w:cs="Arial"/>
+                <w:lang w:val="es-ES" w:eastAsia="es-EC"/>
+              </w:rPr>
+            </w:pPr>
+            <w:r>
+              <w:rPr>
+                <w:rFonts w:ascii="Arial" w:hAnsi="Arial" w:cs="Arial"/>
+                <w:lang w:val="es-ES" w:eastAsia="es-EC"/>
+              </w:rPr>
+              <w:t>Persona</w:t>
+            </w:r>
+          </w:p>
+        </w:tc>
+        <w:tc>
+          <w:tcPr>
+            <w:tcW w:w="0" w:type="auto"/>
+            <w:tcBorders>
+              <w:top w:val="single" w:sz="2" w:space="0" w:color="auto"/>
+              <w:left w:val="single" w:sz="2" w:space="0" w:color="auto"/>
+              <w:bottom w:val="single" w:sz="4" w:space="0" w:color="auto"/>
+              <w:right w:val="single" w:sz="2" w:space="0" w:color="auto"/>
+            </w:tcBorders>
+            <w:tcMar>
+              <w:top w:w="180" w:type="dxa"/>
+              <w:left w:w="180" w:type="dxa"/>
+              <w:bottom w:w="180" w:type="dxa"/>
+              <w:right w:w="180" w:type="dxa"/>
+            </w:tcMar>
+            <w:hideMark/>
+          </w:tcPr>
+          <w:p>
+            <w:pPr>
+              <w:jc w:val="center"/>
+              <w:rPr>
+                <w:rFonts w:ascii="Arial" w:hAnsi="Arial" w:cs="Arial"/>
+                <w:lang w:val="es-ES" w:eastAsia="es-EC"/>
+              </w:rPr>
+            </w:pPr>
+            <w:r>
+              <w:rPr>
+                <w:rFonts w:ascii="Arial" w:hAnsi="Arial" w:cs="Arial"/>
+                <w:lang w:val="es-ES" w:eastAsia="es-EC"/>
+              </w:rPr>
+              <w:t>id, nombre, email, rol</w:t>
+            </w:r>
+          </w:p>
+        </w:tc>
+        <w:tc>
+          <w:tcPr>
+            <w:tcW w:w="0" w:type="auto"/>
+            <w:tcBorders>
+              <w:top w:val="single" w:sz="2" w:space="0" w:color="auto"/>
+              <w:left w:val="single" w:sz="2" w:space="0" w:color="auto"/>
+              <w:bottom w:val="single" w:sz="4" w:space="0" w:color="auto"/>
+              <w:right w:val="single" w:sz="2" w:space="0" w:color="auto"/>
+            </w:tcBorders>
+            <w:tcMar>
+              <w:top w:w="180" w:type="dxa"/>
+              <w:left w:w="180" w:type="dxa"/>
+              <w:bottom w:w="180" w:type="dxa"/>
+              <w:right w:w="180" w:type="dxa"/>
+            </w:tcMar>
+            <w:hideMark/>
+          </w:tcPr>
+          <w:p>
+            <w:pPr>
+              <w:jc w:val="center"/>
+              <w:rPr>
+                <w:rFonts w:ascii="Arial" w:hAnsi="Arial" w:cs="Arial"/>
+                <w:lang w:val="es-ES" w:eastAsia="es-EC"/>
+              </w:rPr>
+            </w:pPr>
+            <w:proofErr w:type="gramStart"/>
+            <w:r>
+              <w:rPr>
+                <w:rFonts w:ascii="Arial" w:hAnsi="Arial" w:cs="Arial"/>
+                <w:lang w:val="es-ES" w:eastAsia="es-EC"/>
+              </w:rPr>
+              <w:t>notificar(</w:t>
+            </w:r>
+            <w:proofErr w:type="gramEnd"/>
+            <w:r>
+              <w:rPr>
+                <w:rFonts w:ascii="Arial" w:hAnsi="Arial" w:cs="Arial"/>
+                <w:lang w:val="es-ES" w:eastAsia="es-EC"/>
+              </w:rPr>
+              <w:t xml:space="preserve">), </w:t>
+            </w:r>
+            <w:proofErr w:type="spellStart"/>
+            <w:proofErr w:type="gramStart"/>
+            <w:r>
+              <w:rPr>
+                <w:rFonts w:ascii="Arial" w:hAnsi="Arial" w:cs="Arial"/>
+                <w:lang w:val="es-ES" w:eastAsia="es-EC"/>
+              </w:rPr>
+              <w:t>consultarCasos</w:t>
+            </w:r>
+            <w:proofErr w:type="spellEnd"/>
+            <w:r>
+              <w:rPr>
+                <w:rFonts w:ascii="Arial" w:hAnsi="Arial" w:cs="Arial"/>
+                <w:lang w:val="es-ES" w:eastAsia="es-EC"/>
+              </w:rPr>
+              <w:t>(</w:t>
+            </w:r>
+            <w:proofErr w:type="gramEnd"/>
+            <w:r>
+              <w:rPr>
+                <w:rFonts w:ascii="Arial" w:hAnsi="Arial" w:cs="Arial"/>
+                <w:lang w:val="es-ES" w:eastAsia="es-EC"/>
+              </w:rPr>
+              <w:t>)</w:t>
+            </w:r>
+          </w:p>
+        </w:tc>
+      </w:tr>
+      <w:tr>
+        <w:trPr>
+          <w:trHeight w:val="27"/>
+        </w:trPr>
+        <w:tc>
+          <w:tcPr>
+            <w:tcW w:w="0" w:type="auto"/>
+            <w:tcBorders>
+              <w:top w:val="single" w:sz="2" w:space="0" w:color="auto"/>
+              <w:left w:val="single" w:sz="2" w:space="0" w:color="auto"/>
+              <w:bottom w:val="single" w:sz="4" w:space="0" w:color="auto"/>
+              <w:right w:val="single" w:sz="2" w:space="0" w:color="auto"/>
+            </w:tcBorders>
+            <w:tcMar>
+              <w:top w:w="180" w:type="dxa"/>
+              <w:left w:w="180" w:type="dxa"/>
+              <w:bottom w:w="180" w:type="dxa"/>
+              <w:right w:w="180" w:type="dxa"/>
+            </w:tcMar>
+            <w:hideMark/>
+          </w:tcPr>
+          <w:p>
+            <w:pPr>
+              <w:jc w:val="center"/>
+              <w:rPr>
+                <w:rFonts w:ascii="Arial" w:hAnsi="Arial" w:cs="Arial"/>
+                <w:lang w:val="es-ES" w:eastAsia="es-EC"/>
+              </w:rPr>
+            </w:pPr>
+            <w:r>
+              <w:rPr>
+                <w:rFonts w:ascii="Arial" w:hAnsi="Arial" w:cs="Arial"/>
+                <w:lang w:val="es-ES" w:eastAsia="es-EC"/>
+              </w:rPr>
+              <w:t>Administrador</w:t>
+            </w:r>
+          </w:p>
+        </w:tc>
+        <w:tc>
+          <w:tcPr>
+            <w:tcW w:w="0" w:type="auto"/>
+            <w:tcBorders>
+              <w:top w:val="single" w:sz="2" w:space="0" w:color="auto"/>
+              <w:left w:val="single" w:sz="2" w:space="0" w:color="auto"/>
+              <w:bottom w:val="single" w:sz="4" w:space="0" w:color="auto"/>
+              <w:right w:val="single" w:sz="2" w:space="0" w:color="auto"/>
+            </w:tcBorders>
+            <w:tcMar>
+              <w:top w:w="180" w:type="dxa"/>
+              <w:left w:w="180" w:type="dxa"/>
+              <w:bottom w:w="180" w:type="dxa"/>
+              <w:right w:w="180" w:type="dxa"/>
+            </w:tcMar>
+            <w:hideMark/>
+          </w:tcPr>
+          <w:p>
+            <w:pPr>
+              <w:jc w:val="center"/>
+              <w:rPr>
+                <w:rFonts w:ascii="Arial" w:hAnsi="Arial" w:cs="Arial"/>
+                <w:lang w:val="es-ES" w:eastAsia="es-EC"/>
+              </w:rPr>
+            </w:pPr>
+            <w:r>
+              <w:rPr>
+                <w:rFonts w:ascii="Arial" w:hAnsi="Arial" w:cs="Arial"/>
+                <w:lang w:val="es-ES" w:eastAsia="es-EC"/>
+              </w:rPr>
+              <w:t>permisos</w:t>
+            </w:r>
+          </w:p>
+        </w:tc>
+        <w:tc>
+          <w:tcPr>
+            <w:tcW w:w="0" w:type="auto"/>
+            <w:tcBorders>
+              <w:top w:val="single" w:sz="2" w:space="0" w:color="auto"/>
+              <w:left w:val="single" w:sz="2" w:space="0" w:color="auto"/>
+              <w:bottom w:val="single" w:sz="4" w:space="0" w:color="auto"/>
+              <w:right w:val="single" w:sz="2" w:space="0" w:color="auto"/>
+            </w:tcBorders>
+            <w:tcMar>
+              <w:top w:w="180" w:type="dxa"/>
+              <w:left w:w="180" w:type="dxa"/>
+              <w:bottom w:w="180" w:type="dxa"/>
+              <w:right w:w="180" w:type="dxa"/>
+            </w:tcMar>
+            <w:hideMark/>
+          </w:tcPr>
+          <w:p>
+            <w:pPr>
+              <w:jc w:val="center"/>
+              <w:rPr>
+                <w:rFonts w:ascii="Arial" w:hAnsi="Arial" w:cs="Arial"/>
+                <w:lang w:val="es-ES" w:eastAsia="es-EC"/>
+              </w:rPr>
+            </w:pPr>
+            <w:proofErr w:type="spellStart"/>
+            <w:proofErr w:type="gramStart"/>
+            <w:r>
+              <w:rPr>
+                <w:rFonts w:ascii="Arial" w:hAnsi="Arial" w:cs="Arial"/>
+                <w:lang w:val="es-ES" w:eastAsia="es-EC"/>
+              </w:rPr>
+              <w:t>asignarPersonal</w:t>
+            </w:r>
+            <w:proofErr w:type="spellEnd"/>
+            <w:r>
+              <w:rPr>
+                <w:rFonts w:ascii="Arial" w:hAnsi="Arial" w:cs="Arial"/>
+                <w:lang w:val="es-ES" w:eastAsia="es-EC"/>
+              </w:rPr>
+              <w:t>(</w:t>
+            </w:r>
+            <w:proofErr w:type="gramEnd"/>
+            <w:r>
+              <w:rPr>
+                <w:rFonts w:ascii="Arial" w:hAnsi="Arial" w:cs="Arial"/>
+                <w:lang w:val="es-ES" w:eastAsia="es-EC"/>
+              </w:rPr>
+              <w:t xml:space="preserve">), </w:t>
+            </w:r>
+            <w:proofErr w:type="spellStart"/>
+            <w:proofErr w:type="gramStart"/>
+            <w:r>
+              <w:rPr>
+                <w:rFonts w:ascii="Arial" w:hAnsi="Arial" w:cs="Arial"/>
+                <w:lang w:val="es-ES" w:eastAsia="es-EC"/>
+              </w:rPr>
+              <w:t>supervisarCasos</w:t>
+            </w:r>
+            <w:proofErr w:type="spellEnd"/>
+            <w:r>
+              <w:rPr>
+                <w:rFonts w:ascii="Arial" w:hAnsi="Arial" w:cs="Arial"/>
+                <w:lang w:val="es-ES" w:eastAsia="es-EC"/>
+              </w:rPr>
+              <w:t>(</w:t>
+            </w:r>
+            <w:proofErr w:type="gramEnd"/>
+            <w:r>
+              <w:rPr>
+                <w:rFonts w:ascii="Arial" w:hAnsi="Arial" w:cs="Arial"/>
+                <w:lang w:val="es-ES" w:eastAsia="es-EC"/>
+              </w:rPr>
+              <w:t>)</w:t>
+            </w:r>
+          </w:p>
+        </w:tc>
+      </w:tr>
+      <w:tr>
+        <w:trPr>
+          <w:trHeight w:val="27"/>
+        </w:trPr>
+        <w:tc>
+          <w:tcPr>
+            <w:tcW w:w="0" w:type="auto"/>
+            <w:tcBorders>
+              <w:top w:val="single" w:sz="2" w:space="0" w:color="auto"/>
+              <w:left w:val="single" w:sz="2" w:space="0" w:color="auto"/>
+              <w:bottom w:val="single" w:sz="4" w:space="0" w:color="auto"/>
+              <w:right w:val="single" w:sz="2" w:space="0" w:color="auto"/>
+            </w:tcBorders>
+            <w:tcMar>
+              <w:top w:w="180" w:type="dxa"/>
+              <w:left w:w="180" w:type="dxa"/>
+              <w:bottom w:w="180" w:type="dxa"/>
+              <w:right w:w="180" w:type="dxa"/>
+            </w:tcMar>
+            <w:hideMark/>
+          </w:tcPr>
+          <w:p>
+            <w:pPr>
+              <w:jc w:val="center"/>
+              <w:rPr>
+                <w:rFonts w:ascii="Arial" w:hAnsi="Arial" w:cs="Arial"/>
+                <w:lang w:val="es-ES" w:eastAsia="es-EC"/>
+              </w:rPr>
+            </w:pPr>
+            <w:r>
+              <w:rPr>
+                <w:rFonts w:ascii="Arial" w:hAnsi="Arial" w:cs="Arial"/>
+                <w:lang w:val="es-ES" w:eastAsia="es-EC"/>
+              </w:rPr>
+              <w:t>Voluntario</w:t>
+            </w:r>
+          </w:p>
+        </w:tc>
+        <w:tc>
+          <w:tcPr>
+            <w:tcW w:w="0" w:type="auto"/>
+            <w:tcBorders>
+              <w:top w:val="single" w:sz="2" w:space="0" w:color="auto"/>
+              <w:left w:val="single" w:sz="2" w:space="0" w:color="auto"/>
+              <w:bottom w:val="single" w:sz="4" w:space="0" w:color="auto"/>
+              <w:right w:val="single" w:sz="2" w:space="0" w:color="auto"/>
+            </w:tcBorders>
+            <w:tcMar>
+              <w:top w:w="180" w:type="dxa"/>
+              <w:left w:w="180" w:type="dxa"/>
+              <w:bottom w:w="180" w:type="dxa"/>
+              <w:right w:w="180" w:type="dxa"/>
+            </w:tcMar>
+            <w:hideMark/>
+          </w:tcPr>
+          <w:p>
+            <w:pPr>
+              <w:jc w:val="center"/>
+              <w:rPr>
+                <w:rFonts w:ascii="Arial" w:hAnsi="Arial" w:cs="Arial"/>
+                <w:lang w:val="es-ES" w:eastAsia="es-EC"/>
+              </w:rPr>
+            </w:pPr>
+            <w:r>
+              <w:rPr>
+                <w:rFonts w:ascii="Arial" w:hAnsi="Arial" w:cs="Arial"/>
+                <w:lang w:val="es-ES" w:eastAsia="es-EC"/>
+              </w:rPr>
+              <w:t>especialidad</w:t>
+            </w:r>
+          </w:p>
+        </w:tc>
+        <w:tc>
+          <w:tcPr>
+            <w:tcW w:w="0" w:type="auto"/>
+            <w:tcBorders>
+              <w:top w:val="single" w:sz="2" w:space="0" w:color="auto"/>
+              <w:left w:val="single" w:sz="2" w:space="0" w:color="auto"/>
+              <w:bottom w:val="single" w:sz="4" w:space="0" w:color="auto"/>
+              <w:right w:val="single" w:sz="2" w:space="0" w:color="auto"/>
+            </w:tcBorders>
+            <w:tcMar>
+              <w:top w:w="180" w:type="dxa"/>
+              <w:left w:w="180" w:type="dxa"/>
+              <w:bottom w:w="180" w:type="dxa"/>
+              <w:right w:w="180" w:type="dxa"/>
+            </w:tcMar>
+            <w:hideMark/>
+          </w:tcPr>
+          <w:p>
+            <w:pPr>
+              <w:jc w:val="center"/>
+              <w:rPr>
+                <w:rFonts w:ascii="Arial" w:hAnsi="Arial" w:cs="Arial"/>
+                <w:lang w:val="es-ES" w:eastAsia="es-EC"/>
+              </w:rPr>
+            </w:pPr>
+            <w:proofErr w:type="spellStart"/>
+            <w:proofErr w:type="gramStart"/>
+            <w:r>
+              <w:rPr>
+                <w:rFonts w:ascii="Arial" w:hAnsi="Arial" w:cs="Arial"/>
+                <w:lang w:val="es-ES" w:eastAsia="es-EC"/>
+              </w:rPr>
+              <w:t>atenderCaso</w:t>
+            </w:r>
+            <w:proofErr w:type="spellEnd"/>
+            <w:r>
+              <w:rPr>
+                <w:rFonts w:ascii="Arial" w:hAnsi="Arial" w:cs="Arial"/>
+                <w:lang w:val="es-ES" w:eastAsia="es-EC"/>
+              </w:rPr>
+              <w:t>(</w:t>
+            </w:r>
+            <w:proofErr w:type="gramEnd"/>
+            <w:r>
+              <w:rPr>
+                <w:rFonts w:ascii="Arial" w:hAnsi="Arial" w:cs="Arial"/>
+                <w:lang w:val="es-ES" w:eastAsia="es-EC"/>
+              </w:rPr>
+              <w:t xml:space="preserve">), </w:t>
+            </w:r>
+            <w:proofErr w:type="spellStart"/>
+            <w:proofErr w:type="gramStart"/>
+            <w:r>
+              <w:rPr>
+                <w:rFonts w:ascii="Arial" w:hAnsi="Arial" w:cs="Arial"/>
+                <w:lang w:val="es-ES" w:eastAsia="es-EC"/>
+              </w:rPr>
+              <w:t>registrarAtencion</w:t>
+            </w:r>
+            <w:proofErr w:type="spellEnd"/>
+            <w:r>
+              <w:rPr>
+                <w:rFonts w:ascii="Arial" w:hAnsi="Arial" w:cs="Arial"/>
+                <w:lang w:val="es-ES" w:eastAsia="es-EC"/>
+              </w:rPr>
+              <w:t>(</w:t>
+            </w:r>
+            <w:proofErr w:type="gramEnd"/>
+            <w:r>
+              <w:rPr>
+                <w:rFonts w:ascii="Arial" w:hAnsi="Arial" w:cs="Arial"/>
+                <w:lang w:val="es-ES" w:eastAsia="es-EC"/>
+              </w:rPr>
+              <w:t>)</w:t>
+            </w:r>
+          </w:p>
+        </w:tc>
+      </w:tr>
+      <w:tr>
+        <w:trPr>
+          <w:trHeight w:val="27"/>
+        </w:trPr>
+        <w:tc>
+          <w:tcPr>
+            <w:tcW w:w="0" w:type="auto"/>
+            <w:tcBorders>
+              <w:top w:val="single" w:sz="2" w:space="0" w:color="auto"/>
+              <w:left w:val="single" w:sz="2" w:space="0" w:color="auto"/>
+              <w:bottom w:val="single" w:sz="4" w:space="0" w:color="auto"/>
+              <w:right w:val="single" w:sz="2" w:space="0" w:color="auto"/>
+            </w:tcBorders>
+            <w:tcMar>
+              <w:top w:w="180" w:type="dxa"/>
+              <w:left w:w="180" w:type="dxa"/>
+              <w:bottom w:w="180" w:type="dxa"/>
+              <w:right w:w="180" w:type="dxa"/>
+            </w:tcMar>
+            <w:hideMark/>
+          </w:tcPr>
+          <w:p>
+            <w:pPr>
+              <w:jc w:val="center"/>
+              <w:rPr>
+                <w:rFonts w:ascii="Arial" w:hAnsi="Arial" w:cs="Arial"/>
+                <w:lang w:val="es-ES" w:eastAsia="es-EC"/>
+              </w:rPr>
+            </w:pPr>
+            <w:r>
+              <w:rPr>
+                <w:rFonts w:ascii="Arial" w:hAnsi="Arial" w:cs="Arial"/>
+                <w:lang w:val="es-ES" w:eastAsia="es-EC"/>
+              </w:rPr>
+              <w:t>Ciudadano</w:t>
+            </w:r>
+          </w:p>
+        </w:tc>
+        <w:tc>
+          <w:tcPr>
+            <w:tcW w:w="0" w:type="auto"/>
+            <w:tcBorders>
+              <w:top w:val="single" w:sz="2" w:space="0" w:color="auto"/>
+              <w:left w:val="single" w:sz="2" w:space="0" w:color="auto"/>
+              <w:bottom w:val="single" w:sz="4" w:space="0" w:color="auto"/>
+              <w:right w:val="single" w:sz="2" w:space="0" w:color="auto"/>
+            </w:tcBorders>
+            <w:tcMar>
+              <w:top w:w="180" w:type="dxa"/>
+              <w:left w:w="180" w:type="dxa"/>
+              <w:bottom w:w="180" w:type="dxa"/>
+              <w:right w:w="180" w:type="dxa"/>
+            </w:tcMar>
+            <w:hideMark/>
+          </w:tcPr>
+          <w:p>
+            <w:pPr>
+              <w:jc w:val="center"/>
+              <w:rPr>
+                <w:rFonts w:ascii="Arial" w:hAnsi="Arial" w:cs="Arial"/>
+                <w:lang w:val="es-ES" w:eastAsia="es-EC"/>
+              </w:rPr>
+            </w:pPr>
+            <w:proofErr w:type="spellStart"/>
+            <w:r>
+              <w:rPr>
+                <w:rFonts w:ascii="Arial" w:hAnsi="Arial" w:cs="Arial"/>
+                <w:lang w:val="es-ES" w:eastAsia="es-EC"/>
+              </w:rPr>
+              <w:t>direccion</w:t>
+            </w:r>
+            <w:proofErr w:type="spellEnd"/>
+          </w:p>
+        </w:tc>
+        <w:tc>
+          <w:tcPr>
+            <w:tcW w:w="0" w:type="auto"/>
+            <w:tcBorders>
+              <w:top w:val="single" w:sz="2" w:space="0" w:color="auto"/>
+              <w:left w:val="single" w:sz="2" w:space="0" w:color="auto"/>
+              <w:bottom w:val="single" w:sz="4" w:space="0" w:color="auto"/>
+              <w:right w:val="single" w:sz="2" w:space="0" w:color="auto"/>
+            </w:tcBorders>
+            <w:tcMar>
+              <w:top w:w="180" w:type="dxa"/>
+              <w:left w:w="180" w:type="dxa"/>
+              <w:bottom w:w="180" w:type="dxa"/>
+              <w:right w:w="180" w:type="dxa"/>
+            </w:tcMar>
+            <w:hideMark/>
+          </w:tcPr>
+          <w:p>
+            <w:pPr>
+              <w:jc w:val="center"/>
+              <w:rPr>
+                <w:rFonts w:ascii="Arial" w:hAnsi="Arial" w:cs="Arial"/>
+                <w:lang w:val="es-ES" w:eastAsia="es-EC"/>
+              </w:rPr>
+            </w:pPr>
+            <w:proofErr w:type="spellStart"/>
+            <w:proofErr w:type="gramStart"/>
+            <w:r>
+              <w:rPr>
+                <w:rFonts w:ascii="Arial" w:hAnsi="Arial" w:cs="Arial"/>
+                <w:lang w:val="es-ES" w:eastAsia="es-EC"/>
+              </w:rPr>
+              <w:t>reportarRescate</w:t>
+            </w:r>
+            <w:proofErr w:type="spellEnd"/>
+            <w:r>
+              <w:rPr>
+                <w:rFonts w:ascii="Arial" w:hAnsi="Arial" w:cs="Arial"/>
+                <w:lang w:val="es-ES" w:eastAsia="es-EC"/>
+              </w:rPr>
+              <w:t>(</w:t>
+            </w:r>
+            <w:proofErr w:type="gramEnd"/>
+            <w:r>
+              <w:rPr>
+                <w:rFonts w:ascii="Arial" w:hAnsi="Arial" w:cs="Arial"/>
+                <w:lang w:val="es-ES" w:eastAsia="es-EC"/>
+              </w:rPr>
+              <w:t>)</w:t>
+            </w:r>
+          </w:p>
+        </w:tc>
+      </w:tr>
+      <w:tr>
+        <w:trPr>
+          <w:trHeight w:val="44"/>
+        </w:trPr>
+        <w:tc>
+          <w:tcPr>
+            <w:tcW w:w="0" w:type="auto"/>
+            <w:tcBorders>
+              <w:top w:val="single" w:sz="2" w:space="0" w:color="auto"/>
+              <w:left w:val="single" w:sz="2" w:space="0" w:color="auto"/>
+              <w:bottom w:val="single" w:sz="4" w:space="0" w:color="auto"/>
+              <w:right w:val="single" w:sz="2" w:space="0" w:color="auto"/>
+            </w:tcBorders>
+            <w:tcMar>
+              <w:top w:w="180" w:type="dxa"/>
+              <w:left w:w="180" w:type="dxa"/>
+              <w:bottom w:w="180" w:type="dxa"/>
+              <w:right w:w="180" w:type="dxa"/>
+            </w:tcMar>
+            <w:hideMark/>
+          </w:tcPr>
+          <w:p>
+            <w:pPr>
+              <w:jc w:val="center"/>
+              <w:rPr>
+                <w:rFonts w:ascii="Arial" w:hAnsi="Arial" w:cs="Arial"/>
+                <w:lang w:val="es-ES" w:eastAsia="es-EC"/>
+              </w:rPr>
+            </w:pPr>
+            <w:r>
+              <w:rPr>
+                <w:rFonts w:ascii="Arial" w:hAnsi="Arial" w:cs="Arial"/>
+                <w:lang w:val="es-ES" w:eastAsia="es-EC"/>
+              </w:rPr>
+              <w:lastRenderedPageBreak/>
+              <w:t>Animal</w:t>
+            </w:r>
+          </w:p>
+        </w:tc>
+        <w:tc>
+          <w:tcPr>
+            <w:tcW w:w="0" w:type="auto"/>
+            <w:tcBorders>
+              <w:top w:val="single" w:sz="2" w:space="0" w:color="auto"/>
+              <w:left w:val="single" w:sz="2" w:space="0" w:color="auto"/>
+              <w:bottom w:val="single" w:sz="4" w:space="0" w:color="auto"/>
+              <w:right w:val="single" w:sz="2" w:space="0" w:color="auto"/>
+            </w:tcBorders>
+            <w:tcMar>
+              <w:top w:w="180" w:type="dxa"/>
+              <w:left w:w="180" w:type="dxa"/>
+              <w:bottom w:w="180" w:type="dxa"/>
+              <w:right w:w="180" w:type="dxa"/>
+            </w:tcMar>
+            <w:hideMark/>
+          </w:tcPr>
+          <w:p>
+            <w:pPr>
+              <w:jc w:val="center"/>
+              <w:rPr>
+                <w:rFonts w:ascii="Arial" w:hAnsi="Arial" w:cs="Arial"/>
+                <w:lang w:val="es-ES" w:eastAsia="es-EC"/>
+              </w:rPr>
+            </w:pPr>
+            <w:r>
+              <w:rPr>
+                <w:rFonts w:ascii="Arial" w:hAnsi="Arial" w:cs="Arial"/>
+                <w:lang w:val="es-ES" w:eastAsia="es-EC"/>
+              </w:rPr>
+              <w:t xml:space="preserve">id, nombre, especie, estado, </w:t>
+            </w:r>
+            <w:proofErr w:type="spellStart"/>
+            <w:r>
+              <w:rPr>
+                <w:rFonts w:ascii="Arial" w:hAnsi="Arial" w:cs="Arial"/>
+                <w:lang w:val="es-ES" w:eastAsia="es-EC"/>
+              </w:rPr>
+              <w:t>fechaIngreso</w:t>
+            </w:r>
+            <w:proofErr w:type="spellEnd"/>
+          </w:p>
+        </w:tc>
+        <w:tc>
+          <w:tcPr>
+            <w:tcW w:w="0" w:type="auto"/>
+            <w:tcBorders>
+              <w:top w:val="single" w:sz="2" w:space="0" w:color="auto"/>
+              <w:left w:val="single" w:sz="2" w:space="0" w:color="auto"/>
+              <w:bottom w:val="single" w:sz="4" w:space="0" w:color="auto"/>
+              <w:right w:val="single" w:sz="2" w:space="0" w:color="auto"/>
+            </w:tcBorders>
+            <w:tcMar>
+              <w:top w:w="180" w:type="dxa"/>
+              <w:left w:w="180" w:type="dxa"/>
+              <w:bottom w:w="180" w:type="dxa"/>
+              <w:right w:w="180" w:type="dxa"/>
+            </w:tcMar>
+            <w:hideMark/>
+          </w:tcPr>
+          <w:p>
+            <w:pPr>
+              <w:jc w:val="center"/>
+              <w:rPr>
+                <w:rFonts w:ascii="Arial" w:hAnsi="Arial" w:cs="Arial"/>
+                <w:lang w:val="es-ES" w:eastAsia="es-EC"/>
+              </w:rPr>
+            </w:pPr>
+            <w:proofErr w:type="spellStart"/>
+            <w:proofErr w:type="gramStart"/>
+            <w:r>
+              <w:rPr>
+                <w:rFonts w:ascii="Arial" w:hAnsi="Arial" w:cs="Arial"/>
+                <w:lang w:val="es-ES" w:eastAsia="es-EC"/>
+              </w:rPr>
+              <w:t>actualizarEstado</w:t>
+            </w:r>
+            <w:proofErr w:type="spellEnd"/>
+            <w:r>
+              <w:rPr>
+                <w:rFonts w:ascii="Arial" w:hAnsi="Arial" w:cs="Arial"/>
+                <w:lang w:val="es-ES" w:eastAsia="es-EC"/>
+              </w:rPr>
+              <w:t>(</w:t>
+            </w:r>
+            <w:proofErr w:type="gramEnd"/>
+            <w:r>
+              <w:rPr>
+                <w:rFonts w:ascii="Arial" w:hAnsi="Arial" w:cs="Arial"/>
+                <w:lang w:val="es-ES" w:eastAsia="es-EC"/>
+              </w:rPr>
+              <w:t xml:space="preserve">), </w:t>
+            </w:r>
+            <w:proofErr w:type="spellStart"/>
+            <w:proofErr w:type="gramStart"/>
+            <w:r>
+              <w:rPr>
+                <w:rFonts w:ascii="Arial" w:hAnsi="Arial" w:cs="Arial"/>
+                <w:lang w:val="es-ES" w:eastAsia="es-EC"/>
+              </w:rPr>
+              <w:t>obtenerEspecie</w:t>
+            </w:r>
+            <w:proofErr w:type="spellEnd"/>
+            <w:r>
+              <w:rPr>
+                <w:rFonts w:ascii="Arial" w:hAnsi="Arial" w:cs="Arial"/>
+                <w:lang w:val="es-ES" w:eastAsia="es-EC"/>
+              </w:rPr>
+              <w:t>(</w:t>
+            </w:r>
+            <w:proofErr w:type="gramEnd"/>
+            <w:r>
+              <w:rPr>
+                <w:rFonts w:ascii="Arial" w:hAnsi="Arial" w:cs="Arial"/>
+                <w:lang w:val="es-ES" w:eastAsia="es-EC"/>
+              </w:rPr>
+              <w:t>)</w:t>
+            </w:r>
+          </w:p>
+        </w:tc>
+      </w:tr>
+      <w:tr>
+        <w:trPr>
+          <w:trHeight w:val="44"/>
+        </w:trPr>
+        <w:tc>
+          <w:tcPr>
+            <w:tcW w:w="0" w:type="auto"/>
+            <w:tcBorders>
+              <w:top w:val="single" w:sz="2" w:space="0" w:color="auto"/>
+              <w:left w:val="single" w:sz="2" w:space="0" w:color="auto"/>
+              <w:bottom w:val="single" w:sz="4" w:space="0" w:color="auto"/>
+              <w:right w:val="single" w:sz="2" w:space="0" w:color="auto"/>
+            </w:tcBorders>
+            <w:tcMar>
+              <w:top w:w="180" w:type="dxa"/>
+              <w:left w:w="180" w:type="dxa"/>
+              <w:bottom w:w="180" w:type="dxa"/>
+              <w:right w:w="180" w:type="dxa"/>
+            </w:tcMar>
+            <w:hideMark/>
+          </w:tcPr>
+          <w:p>
+            <w:pPr>
+              <w:jc w:val="center"/>
+              <w:rPr>
+                <w:rFonts w:ascii="Arial" w:hAnsi="Arial" w:cs="Arial"/>
+                <w:lang w:val="es-ES" w:eastAsia="es-EC"/>
+              </w:rPr>
+            </w:pPr>
+            <w:r>
+              <w:rPr>
+                <w:rFonts w:ascii="Arial" w:hAnsi="Arial" w:cs="Arial"/>
+                <w:lang w:val="es-ES" w:eastAsia="es-EC"/>
+              </w:rPr>
+              <w:t>Caso</w:t>
+            </w:r>
+          </w:p>
+        </w:tc>
+        <w:tc>
+          <w:tcPr>
+            <w:tcW w:w="0" w:type="auto"/>
+            <w:tcBorders>
+              <w:top w:val="single" w:sz="2" w:space="0" w:color="auto"/>
+              <w:left w:val="single" w:sz="2" w:space="0" w:color="auto"/>
+              <w:bottom w:val="single" w:sz="4" w:space="0" w:color="auto"/>
+              <w:right w:val="single" w:sz="2" w:space="0" w:color="auto"/>
+            </w:tcBorders>
+            <w:tcMar>
+              <w:top w:w="180" w:type="dxa"/>
+              <w:left w:w="180" w:type="dxa"/>
+              <w:bottom w:w="180" w:type="dxa"/>
+              <w:right w:w="180" w:type="dxa"/>
+            </w:tcMar>
+            <w:hideMark/>
+          </w:tcPr>
+          <w:p>
+            <w:pPr>
+              <w:jc w:val="center"/>
+              <w:rPr>
+                <w:rFonts w:ascii="Arial" w:hAnsi="Arial" w:cs="Arial"/>
+                <w:lang w:val="es-ES" w:eastAsia="es-EC"/>
+              </w:rPr>
+            </w:pPr>
+            <w:proofErr w:type="spellStart"/>
+            <w:r>
+              <w:rPr>
+                <w:rFonts w:ascii="Arial" w:hAnsi="Arial" w:cs="Arial"/>
+                <w:lang w:val="es-ES" w:eastAsia="es-EC"/>
+              </w:rPr>
+              <w:t>idCaso</w:t>
+            </w:r>
+            <w:proofErr w:type="spellEnd"/>
+            <w:r>
+              <w:rPr>
+                <w:rFonts w:ascii="Arial" w:hAnsi="Arial" w:cs="Arial"/>
+                <w:lang w:val="es-ES" w:eastAsia="es-EC"/>
+              </w:rPr>
+              <w:t xml:space="preserve">, </w:t>
+            </w:r>
+            <w:proofErr w:type="spellStart"/>
+            <w:r>
+              <w:rPr>
+                <w:rFonts w:ascii="Arial" w:hAnsi="Arial" w:cs="Arial"/>
+                <w:lang w:val="es-ES" w:eastAsia="es-EC"/>
+              </w:rPr>
+              <w:t>descripcion</w:t>
+            </w:r>
+            <w:proofErr w:type="spellEnd"/>
+            <w:r>
+              <w:rPr>
+                <w:rFonts w:ascii="Arial" w:hAnsi="Arial" w:cs="Arial"/>
+                <w:lang w:val="es-ES" w:eastAsia="es-EC"/>
+              </w:rPr>
+              <w:t xml:space="preserve">, </w:t>
+            </w:r>
+            <w:proofErr w:type="spellStart"/>
+            <w:r>
+              <w:rPr>
+                <w:rFonts w:ascii="Arial" w:hAnsi="Arial" w:cs="Arial"/>
+                <w:lang w:val="es-ES" w:eastAsia="es-EC"/>
+              </w:rPr>
+              <w:t>fechaCreacion</w:t>
+            </w:r>
+            <w:proofErr w:type="spellEnd"/>
+          </w:p>
+        </w:tc>
+        <w:tc>
+          <w:tcPr>
+            <w:tcW w:w="0" w:type="auto"/>
+            <w:tcBorders>
+              <w:top w:val="single" w:sz="2" w:space="0" w:color="auto"/>
+              <w:left w:val="single" w:sz="2" w:space="0" w:color="auto"/>
+              <w:bottom w:val="single" w:sz="4" w:space="0" w:color="auto"/>
+              <w:right w:val="single" w:sz="2" w:space="0" w:color="auto"/>
+            </w:tcBorders>
+            <w:tcMar>
+              <w:top w:w="180" w:type="dxa"/>
+              <w:left w:w="180" w:type="dxa"/>
+              <w:bottom w:w="180" w:type="dxa"/>
+              <w:right w:w="180" w:type="dxa"/>
+            </w:tcMar>
+            <w:hideMark/>
+          </w:tcPr>
+          <w:p>
+            <w:pPr>
+              <w:jc w:val="center"/>
+              <w:rPr>
+                <w:rFonts w:ascii="Arial" w:hAnsi="Arial" w:cs="Arial"/>
+                <w:lang w:val="es-ES" w:eastAsia="es-EC"/>
+              </w:rPr>
+            </w:pPr>
+            <w:proofErr w:type="spellStart"/>
+            <w:proofErr w:type="gramStart"/>
+            <w:r>
+              <w:rPr>
+                <w:rFonts w:ascii="Arial" w:hAnsi="Arial" w:cs="Arial"/>
+                <w:lang w:val="es-ES" w:eastAsia="es-EC"/>
+              </w:rPr>
+              <w:t>crearCaso</w:t>
+            </w:r>
+            <w:proofErr w:type="spellEnd"/>
+            <w:r>
+              <w:rPr>
+                <w:rFonts w:ascii="Arial" w:hAnsi="Arial" w:cs="Arial"/>
+                <w:lang w:val="es-ES" w:eastAsia="es-EC"/>
+              </w:rPr>
+              <w:t>(</w:t>
+            </w:r>
+            <w:proofErr w:type="gramEnd"/>
+            <w:r>
+              <w:rPr>
+                <w:rFonts w:ascii="Arial" w:hAnsi="Arial" w:cs="Arial"/>
+                <w:lang w:val="es-ES" w:eastAsia="es-EC"/>
+              </w:rPr>
+              <w:t xml:space="preserve">), </w:t>
+            </w:r>
+            <w:proofErr w:type="spellStart"/>
+            <w:proofErr w:type="gramStart"/>
+            <w:r>
+              <w:rPr>
+                <w:rFonts w:ascii="Arial" w:hAnsi="Arial" w:cs="Arial"/>
+                <w:lang w:val="es-ES" w:eastAsia="es-EC"/>
+              </w:rPr>
+              <w:t>asignarVoluntario</w:t>
+            </w:r>
+            <w:proofErr w:type="spellEnd"/>
+            <w:r>
+              <w:rPr>
+                <w:rFonts w:ascii="Arial" w:hAnsi="Arial" w:cs="Arial"/>
+                <w:lang w:val="es-ES" w:eastAsia="es-EC"/>
+              </w:rPr>
+              <w:t>(</w:t>
+            </w:r>
+            <w:proofErr w:type="gramEnd"/>
+            <w:r>
+              <w:rPr>
+                <w:rFonts w:ascii="Arial" w:hAnsi="Arial" w:cs="Arial"/>
+                <w:lang w:val="es-ES" w:eastAsia="es-EC"/>
+              </w:rPr>
+              <w:t xml:space="preserve">), </w:t>
+            </w:r>
+            <w:proofErr w:type="spellStart"/>
+            <w:proofErr w:type="gramStart"/>
+            <w:r>
+              <w:rPr>
+                <w:rFonts w:ascii="Arial" w:hAnsi="Arial" w:cs="Arial"/>
+                <w:lang w:val="es-ES" w:eastAsia="es-EC"/>
+              </w:rPr>
+              <w:t>cerrarCaso</w:t>
+            </w:r>
+            <w:proofErr w:type="spellEnd"/>
+            <w:r>
+              <w:rPr>
+                <w:rFonts w:ascii="Arial" w:hAnsi="Arial" w:cs="Arial"/>
+                <w:lang w:val="es-ES" w:eastAsia="es-EC"/>
+              </w:rPr>
+              <w:t>(</w:t>
+            </w:r>
+            <w:proofErr w:type="gramEnd"/>
+            <w:r>
+              <w:rPr>
+                <w:rFonts w:ascii="Arial" w:hAnsi="Arial" w:cs="Arial"/>
+                <w:lang w:val="es-ES" w:eastAsia="es-EC"/>
+              </w:rPr>
+              <w:t>)</w:t>
+            </w:r>
+          </w:p>
+        </w:tc>
+      </w:tr>
+      <w:tr>
+        <w:trPr>
+          <w:trHeight w:val="27"/>
+        </w:trPr>
+        <w:tc>
+          <w:tcPr>
+            <w:tcW w:w="0" w:type="auto"/>
+            <w:tcBorders>
+              <w:top w:val="single" w:sz="2" w:space="0" w:color="auto"/>
+              <w:left w:val="single" w:sz="2" w:space="0" w:color="auto"/>
+              <w:bottom w:val="single" w:sz="4" w:space="0" w:color="auto"/>
+              <w:right w:val="single" w:sz="2" w:space="0" w:color="auto"/>
+            </w:tcBorders>
+            <w:tcMar>
+              <w:top w:w="180" w:type="dxa"/>
+              <w:left w:w="180" w:type="dxa"/>
+              <w:bottom w:w="180" w:type="dxa"/>
+              <w:right w:w="180" w:type="dxa"/>
+            </w:tcMar>
+            <w:hideMark/>
+          </w:tcPr>
+          <w:p>
+            <w:pPr>
+              <w:jc w:val="center"/>
+              <w:rPr>
+                <w:rFonts w:ascii="Arial" w:hAnsi="Arial" w:cs="Arial"/>
+                <w:lang w:val="es-ES" w:eastAsia="es-EC"/>
+              </w:rPr>
+            </w:pPr>
+            <w:proofErr w:type="spellStart"/>
+            <w:r>
+              <w:rPr>
+                <w:rFonts w:ascii="Arial" w:hAnsi="Arial" w:cs="Arial"/>
+                <w:lang w:val="es-ES" w:eastAsia="es-EC"/>
+              </w:rPr>
+              <w:t>Notificacion</w:t>
+            </w:r>
+            <w:proofErr w:type="spellEnd"/>
+          </w:p>
+        </w:tc>
+        <w:tc>
+          <w:tcPr>
+            <w:tcW w:w="0" w:type="auto"/>
+            <w:tcBorders>
+              <w:top w:val="single" w:sz="2" w:space="0" w:color="auto"/>
+              <w:left w:val="single" w:sz="2" w:space="0" w:color="auto"/>
+              <w:bottom w:val="single" w:sz="4" w:space="0" w:color="auto"/>
+              <w:right w:val="single" w:sz="2" w:space="0" w:color="auto"/>
+            </w:tcBorders>
+            <w:tcMar>
+              <w:top w:w="180" w:type="dxa"/>
+              <w:left w:w="180" w:type="dxa"/>
+              <w:bottom w:w="180" w:type="dxa"/>
+              <w:right w:w="180" w:type="dxa"/>
+            </w:tcMar>
+            <w:hideMark/>
+          </w:tcPr>
+          <w:p>
+            <w:pPr>
+              <w:jc w:val="center"/>
+              <w:rPr>
+                <w:rFonts w:ascii="Arial" w:hAnsi="Arial" w:cs="Arial"/>
+                <w:lang w:val="es-ES" w:eastAsia="es-EC"/>
+              </w:rPr>
+            </w:pPr>
+            <w:r>
+              <w:rPr>
+                <w:rFonts w:ascii="Arial" w:hAnsi="Arial" w:cs="Arial"/>
+                <w:lang w:val="es-ES" w:eastAsia="es-EC"/>
+              </w:rPr>
+              <w:t>id, mensaje, fecha</w:t>
+            </w:r>
+          </w:p>
+        </w:tc>
+        <w:tc>
+          <w:tcPr>
+            <w:tcW w:w="0" w:type="auto"/>
+            <w:tcBorders>
+              <w:top w:val="single" w:sz="2" w:space="0" w:color="auto"/>
+              <w:left w:val="single" w:sz="2" w:space="0" w:color="auto"/>
+              <w:bottom w:val="single" w:sz="4" w:space="0" w:color="auto"/>
+              <w:right w:val="single" w:sz="2" w:space="0" w:color="auto"/>
+            </w:tcBorders>
+            <w:tcMar>
+              <w:top w:w="180" w:type="dxa"/>
+              <w:left w:w="180" w:type="dxa"/>
+              <w:bottom w:w="180" w:type="dxa"/>
+              <w:right w:w="180" w:type="dxa"/>
+            </w:tcMar>
+            <w:hideMark/>
+          </w:tcPr>
+          <w:p>
+            <w:pPr>
+              <w:jc w:val="center"/>
+              <w:rPr>
+                <w:rFonts w:ascii="Arial" w:hAnsi="Arial" w:cs="Arial"/>
+                <w:lang w:val="es-ES" w:eastAsia="es-EC"/>
+              </w:rPr>
+            </w:pPr>
+            <w:proofErr w:type="gramStart"/>
+            <w:r>
+              <w:rPr>
+                <w:rFonts w:ascii="Arial" w:hAnsi="Arial" w:cs="Arial"/>
+                <w:lang w:val="es-ES" w:eastAsia="es-EC"/>
+              </w:rPr>
+              <w:t>enviar(</w:t>
+            </w:r>
+            <w:proofErr w:type="gramEnd"/>
+            <w:r>
+              <w:rPr>
+                <w:rFonts w:ascii="Arial" w:hAnsi="Arial" w:cs="Arial"/>
+                <w:lang w:val="es-ES" w:eastAsia="es-EC"/>
+              </w:rPr>
+              <w:t>)</w:t>
+            </w:r>
+          </w:p>
+        </w:tc>
+      </w:tr>
+    </w:tbl>
+    <w:p>
+      <w:pPr>
+        <w:rPr>
+          <w:rFonts w:ascii="Arial" w:hAnsi="Arial" w:cs="Arial"/>
+          <w:b/>
+          <w:bCs/>
+          <w:lang w:val="es-ES" w:eastAsia="es-EC"/>
+        </w:rPr>
+      </w:pPr>
+    </w:p>
+    <w:p>
+      <w:pPr>
+        <w:rPr>
+          <w:rFonts w:ascii="Arial" w:hAnsi="Arial" w:cs="Arial"/>
+          <w:b/>
+          <w:bCs/>
+          <w:lang w:val="es-ES" w:eastAsia="es-EC"/>
+        </w:rPr>
+      </w:pPr>
+      <w:r>
+        <w:rPr>
+          <w:rFonts w:ascii="Arial" w:hAnsi="Arial" w:cs="Arial"/>
+          <w:b/>
+          <w:bCs/>
+          <w:lang w:val="es-ES" w:eastAsia="es-EC"/>
+        </w:rPr>
+        <w:t>Relaciones:</w:t>
+      </w:r>
+    </w:p>
+    <w:p>
+      <w:pPr>
+        <w:numPr>
+          <w:ilvl w:val="0"/>
+          <w:numId w:val="23"/>
+        </w:numPr>
+        <w:rPr>
+          <w:rFonts w:ascii="Arial" w:hAnsi="Arial" w:cs="Arial"/>
+          <w:lang w:val="es-ES" w:eastAsia="es-EC"/>
+        </w:rPr>
+      </w:pPr>
+      <w:r>
+        <w:rPr>
+          <w:rFonts w:ascii="Arial" w:hAnsi="Arial" w:cs="Arial"/>
+          <w:lang w:val="es-ES" w:eastAsia="es-EC"/>
+        </w:rPr>
+        <w:t>Un Caso está asociado a un Animal (1 a 1).</w:t>
+      </w:r>
+    </w:p>
+    <w:p>
+      <w:pPr>
+        <w:numPr>
+          <w:ilvl w:val="0"/>
+          <w:numId w:val="23"/>
+        </w:numPr>
+        <w:rPr>
+          <w:rFonts w:ascii="Arial" w:hAnsi="Arial" w:cs="Arial"/>
+          <w:lang w:val="es-ES" w:eastAsia="es-EC"/>
+        </w:rPr>
+      </w:pPr>
+      <w:r>
+        <w:rPr>
+          <w:rFonts w:ascii="Arial" w:hAnsi="Arial" w:cs="Arial"/>
+          <w:lang w:val="es-ES" w:eastAsia="es-EC"/>
+        </w:rPr>
+        <w:t>Un Administrador asigna un Voluntario a un Caso (1 a muchos).</w:t>
+      </w:r>
+    </w:p>
+    <w:p>
+      <w:pPr>
+        <w:numPr>
+          <w:ilvl w:val="0"/>
+          <w:numId w:val="23"/>
+        </w:numPr>
+        <w:rPr>
+          <w:rFonts w:ascii="Arial" w:hAnsi="Arial" w:cs="Arial"/>
+          <w:lang w:val="es-ES" w:eastAsia="es-EC"/>
+        </w:rPr>
+      </w:pPr>
+      <w:r>
+        <w:rPr>
+          <w:rFonts w:ascii="Arial" w:hAnsi="Arial" w:cs="Arial"/>
+          <w:lang w:val="es-ES" w:eastAsia="es-EC"/>
+        </w:rPr>
+        <w:t>El </w:t>
+      </w:r>
+      <w:proofErr w:type="spellStart"/>
+      <w:r>
+        <w:rPr>
+          <w:rFonts w:ascii="Arial" w:hAnsi="Arial" w:cs="Arial"/>
+          <w:lang w:val="es-ES" w:eastAsia="es-EC"/>
+        </w:rPr>
+        <w:t>Voluntar</w:t>
+      </w:r>
+      <w:r>
+        <w:rPr>
+          <w:rFonts w:ascii="Arial" w:hAnsi="Arial" w:cs="Arial"/>
+          <w:lang w:val="es-ES" w:eastAsia="es-EC"/>
+        </w:rPr>
+        <w:t>í</w:t>
+      </w:r>
+      <w:r>
+        <w:rPr>
+          <w:rFonts w:ascii="Arial" w:hAnsi="Arial" w:cs="Arial"/>
+          <w:lang w:val="es-ES" w:eastAsia="es-EC"/>
+        </w:rPr>
+        <w:t>o</w:t>
+      </w:r>
+      <w:proofErr w:type="spellEnd"/>
+      <w:r>
+        <w:rPr>
+          <w:rFonts w:ascii="Arial" w:hAnsi="Arial" w:cs="Arial"/>
+          <w:lang w:val="es-ES" w:eastAsia="es-EC"/>
+        </w:rPr>
+        <w:t> actualiza el estado del Caso (1 a muchos).</w:t>
+      </w:r>
+    </w:p>
+    <w:p>
+      <w:pPr>
+        <w:numPr>
+          <w:ilvl w:val="0"/>
+          <w:numId w:val="23"/>
+        </w:numPr>
+        <w:rPr>
+          <w:rFonts w:ascii="Arial" w:hAnsi="Arial" w:cs="Arial"/>
+          <w:lang w:val="es-ES" w:eastAsia="es-EC"/>
+        </w:rPr>
+      </w:pPr>
+      <w:r>
+        <w:rPr>
+          <w:rFonts w:ascii="Arial" w:hAnsi="Arial" w:cs="Arial"/>
+          <w:lang w:val="es-ES" w:eastAsia="es-EC"/>
+        </w:rPr>
+        <w:t>El sistema envía Notificaciones a los Voluntarios cuando se crea un nuevo caso.</w:t>
+      </w:r>
+    </w:p>
+    <w:p>
+      <w:pPr>
+        <w:numPr>
+          <w:ilvl w:val="0"/>
+          <w:numId w:val="23"/>
+        </w:numPr>
+        <w:rPr>
+          <w:rFonts w:ascii="Arial" w:hAnsi="Arial" w:cs="Arial"/>
+          <w:lang w:val="es-ES" w:eastAsia="es-EC"/>
+        </w:rPr>
+      </w:pPr>
+      <w:r>
+        <w:rPr>
+          <w:rFonts w:ascii="Arial" w:hAnsi="Arial" w:cs="Arial"/>
+          <w:lang w:val="es-ES" w:eastAsia="es-EC"/>
+        </w:rPr>
+        <w:t>Administrador, Voluntario y Ciudadano heredan de Persona.</w:t>
+      </w:r>
+    </w:p>
+    <w:p>
+      <w:pPr>
+        <w:rPr>
+          <w:rFonts w:ascii="Arial" w:hAnsi="Arial" w:cs="Arial"/>
+          <w:b/>
+          <w:bCs/>
+          <w:lang w:val="es-ES" w:eastAsia="es-EC"/>
+        </w:rPr>
+      </w:pPr>
+      <w:r>
+        <w:rPr>
+          <w:rFonts w:ascii="Arial" w:hAnsi="Arial" w:cs="Arial"/>
+          <w:b/>
+          <w:bCs/>
+          <w:lang w:val="es-ES" w:eastAsia="es-EC"/>
+        </w:rPr>
+        <w:t>Principios SOLID aplicados:</w:t>
+      </w:r>
+    </w:p>
+    <w:p>
+      <w:pPr>
+        <w:numPr>
+          <w:ilvl w:val="0"/>
+          <w:numId w:val="24"/>
+        </w:numPr>
+        <w:rPr>
+          <w:rFonts w:ascii="Arial" w:hAnsi="Arial" w:cs="Arial"/>
+          <w:lang w:val="es-ES" w:eastAsia="es-EC"/>
+        </w:rPr>
+      </w:pPr>
+      <w:r>
+        <w:rPr>
+          <w:rFonts w:ascii="Arial" w:hAnsi="Arial" w:cs="Arial"/>
+          <w:lang w:val="es-ES" w:eastAsia="es-EC"/>
+        </w:rPr>
+        <w:t>SRP (Responsabilidad Única): cada clase tiene una sola responsabilidad.</w:t>
+      </w:r>
+    </w:p>
+    <w:p>
+      <w:pPr>
+        <w:numPr>
+          <w:ilvl w:val="0"/>
+          <w:numId w:val="24"/>
+        </w:numPr>
+        <w:rPr>
+          <w:rFonts w:ascii="Arial" w:hAnsi="Arial" w:cs="Arial"/>
+          <w:lang w:val="es-ES" w:eastAsia="es-EC"/>
+        </w:rPr>
+      </w:pPr>
+      <w:r>
+        <w:rPr>
+          <w:rFonts w:ascii="Arial" w:hAnsi="Arial" w:cs="Arial"/>
+          <w:lang w:val="es-ES" w:eastAsia="es-EC"/>
+        </w:rPr>
+        <w:t>OCP (Abierto/Cerrado): se pueden agregar nuevas especies sin modificar el código existente.</w:t>
+      </w:r>
+    </w:p>
+    <w:p>
+      <w:pPr>
+        <w:numPr>
+          <w:ilvl w:val="0"/>
+          <w:numId w:val="24"/>
+        </w:numPr>
+        <w:rPr>
+          <w:rFonts w:ascii="Arial" w:hAnsi="Arial" w:cs="Arial"/>
+          <w:lang w:val="es-ES" w:eastAsia="es-EC"/>
+        </w:rPr>
+      </w:pPr>
+      <w:r>
+        <w:rPr>
+          <w:rFonts w:ascii="Arial" w:hAnsi="Arial" w:cs="Arial"/>
+          <w:lang w:val="es-ES" w:eastAsia="es-EC"/>
+        </w:rPr>
+        <w:t>LSP (Sustitución de Liskov): Administrador, Voluntario y Ciudadano pueden sustituir a Persona.</w:t>
+      </w:r>
+    </w:p>
+    <w:p>
+      <w:pPr>
+        <w:numPr>
+          <w:ilvl w:val="0"/>
+          <w:numId w:val="24"/>
+        </w:numPr>
+        <w:rPr>
+          <w:rFonts w:ascii="Arial" w:hAnsi="Arial" w:cs="Arial"/>
+          <w:lang w:val="es-ES" w:eastAsia="es-EC"/>
+        </w:rPr>
+      </w:pPr>
+      <w:r>
+        <w:rPr>
+          <w:rFonts w:ascii="Arial" w:hAnsi="Arial" w:cs="Arial"/>
+          <w:lang w:val="es-ES" w:eastAsia="es-EC"/>
+        </w:rPr>
+        <w:t>ISP (Segregación de Interfaces): cada rol tiene sus propios métodos.</w:t>
+      </w:r>
+    </w:p>
+    <w:p>
+      <w:pPr>
+        <w:numPr>
+          <w:ilvl w:val="0"/>
+          <w:numId w:val="24"/>
+        </w:numPr>
+        <w:rPr>
+          <w:rFonts w:ascii="Arial" w:hAnsi="Arial" w:cs="Arial"/>
+          <w:lang w:val="es-ES" w:eastAsia="es-EC"/>
+        </w:rPr>
+      </w:pPr>
+      <w:r>
+        <w:rPr>
+          <w:rFonts w:ascii="Arial" w:hAnsi="Arial" w:cs="Arial"/>
+          <w:lang w:val="es-ES" w:eastAsia="es-EC"/>
+        </w:rPr>
+        <w:t>DIP (Inversión de Dependencias): las clases dependen de abstracciones, no de implementaciones concretas.</w:t>
+      </w:r>
+    </w:p>
+    <w:p>
+      <w:pPr>
+        <w:rPr>
+          <w:rFonts w:ascii="Arial" w:hAnsi="Arial" w:cs="Arial"/>
+          <w:b/>
+          <w:bCs/>
           <w:lang w:eastAsia="es-EC"/>
         </w:rPr>
       </w:pPr>
@@ -2064,7 +3639,6 @@
           <w:bCs/>
           <w:lang w:eastAsia="es-EC"/>
         </w:rPr>
-        <w:lastRenderedPageBreak/>
         <w:t>Evidencias</w:t>
       </w:r>
     </w:p>
@@ -2205,7 +3779,7 @@
       </w:r>
     </w:p>
     <w:sectPr>
-      <w:headerReference w:type="first" r:id="rId15"/>
+      <w:headerReference w:type="first" r:id="rId16"/>
       <w:pgSz w:w="11906" w:h="16838"/>
       <w:pgMar w:top="1417" w:right="1701" w:bottom="1417" w:left="1701" w:header="708" w:footer="708" w:gutter="0"/>
       <w:pgNumType w:start="1"/>
@@ -3077,12 +4651,161 @@
         <v:path o:extrusionok="f" gradientshapeok="t" o:connecttype="rect"/>
         <o:lock v:ext="edit" aspectratio="t"/>
       </v:shapetype>
-      <v:shape id="_x0000_i1064" type="#_x0000_t75" style="width:11.35pt;height:11.35pt" o:bullet="t">
+      <v:shape id="_x0000_i1049" type="#_x0000_t75" style="width:11.65pt;height:11.65pt" o:bullet="t">
         <v:imagedata r:id="rId1" o:title="mso3E28"/>
       </v:shape>
     </w:pict>
   </w:numPicBullet>
   <w:abstractNum w:abstractNumId="0" w15:restartNumberingAfterBreak="0">
+    <w:nsid w:val="094E144B"/>
+    <w:multiLevelType w:val="multilevel"/>
+    <w:tmpl w:val="5B44CCAE"/>
+    <w:lvl w:ilvl="0">
+      <w:start w:val="1"/>
+      <w:numFmt w:val="bullet"/>
+      <w:lvlText w:val=""/>
+      <w:lvlJc w:val="left"/>
+      <w:pPr>
+        <w:tabs>
+          <w:tab w:val="num" w:pos="720"/>
+        </w:tabs>
+        <w:ind w:left="720" w:hanging="360"/>
+      </w:pPr>
+      <w:rPr>
+        <w:rFonts w:ascii="Symbol" w:hAnsi="Symbol" w:hint="default"/>
+        <w:sz w:val="20"/>
+      </w:rPr>
+    </w:lvl>
+    <w:lvl w:ilvl="1" w:tentative="1">
+      <w:start w:val="1"/>
+      <w:numFmt w:val="bullet"/>
+      <w:lvlText w:val=""/>
+      <w:lvlJc w:val="left"/>
+      <w:pPr>
+        <w:tabs>
+          <w:tab w:val="num" w:pos="1440"/>
+        </w:tabs>
+        <w:ind w:left="1440" w:hanging="360"/>
+      </w:pPr>
+      <w:rPr>
+        <w:rFonts w:ascii="Symbol" w:hAnsi="Symbol" w:hint="default"/>
+        <w:sz w:val="20"/>
+      </w:rPr>
+    </w:lvl>
+    <w:lvl w:ilvl="2" w:tentative="1">
+      <w:start w:val="1"/>
+      <w:numFmt w:val="bullet"/>
+      <w:lvlText w:val=""/>
+      <w:lvlJc w:val="left"/>
+      <w:pPr>
+        <w:tabs>
+          <w:tab w:val="num" w:pos="2160"/>
+        </w:tabs>
+        <w:ind w:left="2160" w:hanging="360"/>
+      </w:pPr>
+      <w:rPr>
+        <w:rFonts w:ascii="Symbol" w:hAnsi="Symbol" w:hint="default"/>
+        <w:sz w:val="20"/>
+      </w:rPr>
+    </w:lvl>
+    <w:lvl w:ilvl="3" w:tentative="1">
+      <w:start w:val="1"/>
+      <w:numFmt w:val="bullet"/>
+      <w:lvlText w:val=""/>
+      <w:lvlJc w:val="left"/>
+      <w:pPr>
+        <w:tabs>
+          <w:tab w:val="num" w:pos="2880"/>
+        </w:tabs>
+        <w:ind w:left="2880" w:hanging="360"/>
+      </w:pPr>
+      <w:rPr>
+        <w:rFonts w:ascii="Symbol" w:hAnsi="Symbol" w:hint="default"/>
+        <w:sz w:val="20"/>
+      </w:rPr>
+    </w:lvl>
+    <w:lvl w:ilvl="4" w:tentative="1">
+      <w:start w:val="1"/>
+      <w:numFmt w:val="bullet"/>
+      <w:lvlText w:val=""/>
+      <w:lvlJc w:val="left"/>
+      <w:pPr>
+        <w:tabs>
+          <w:tab w:val="num" w:pos="3600"/>
+        </w:tabs>
+        <w:ind w:left="3600" w:hanging="360"/>
+      </w:pPr>
+      <w:rPr>
+        <w:rFonts w:ascii="Symbol" w:hAnsi="Symbol" w:hint="default"/>
+        <w:sz w:val="20"/>
+      </w:rPr>
+    </w:lvl>
+    <w:lvl w:ilvl="5" w:tentative="1">
+      <w:start w:val="1"/>
+      <w:numFmt w:val="bullet"/>
+      <w:lvlText w:val=""/>
+      <w:lvlJc w:val="left"/>
+      <w:pPr>
+        <w:tabs>
+          <w:tab w:val="num" w:pos="4320"/>
+        </w:tabs>
+        <w:ind w:left="4320" w:hanging="360"/>
+      </w:pPr>
+      <w:rPr>
+        <w:rFonts w:ascii="Symbol" w:hAnsi="Symbol" w:hint="default"/>
+        <w:sz w:val="20"/>
+      </w:rPr>
+    </w:lvl>
+    <w:lvl w:ilvl="6" w:tentative="1">
+      <w:start w:val="1"/>
+      <w:numFmt w:val="bullet"/>
+      <w:lvlText w:val=""/>
+      <w:lvlJc w:val="left"/>
+      <w:pPr>
+        <w:tabs>
+          <w:tab w:val="num" w:pos="5040"/>
+        </w:tabs>
+        <w:ind w:left="5040" w:hanging="360"/>
+      </w:pPr>
+      <w:rPr>
+        <w:rFonts w:ascii="Symbol" w:hAnsi="Symbol" w:hint="default"/>
+        <w:sz w:val="20"/>
+      </w:rPr>
+    </w:lvl>
+    <w:lvl w:ilvl="7" w:tentative="1">
+      <w:start w:val="1"/>
+      <w:numFmt w:val="bullet"/>
+      <w:lvlText w:val=""/>
+      <w:lvlJc w:val="left"/>
+      <w:pPr>
+        <w:tabs>
+          <w:tab w:val="num" w:pos="5760"/>
+        </w:tabs>
+        <w:ind w:left="5760" w:hanging="360"/>
+      </w:pPr>
+      <w:rPr>
+        <w:rFonts w:ascii="Symbol" w:hAnsi="Symbol" w:hint="default"/>
+        <w:sz w:val="20"/>
+      </w:rPr>
+    </w:lvl>
+    <w:lvl w:ilvl="8" w:tentative="1">
+      <w:start w:val="1"/>
+      <w:numFmt w:val="bullet"/>
+      <w:lvlText w:val=""/>
+      <w:lvlJc w:val="left"/>
+      <w:pPr>
+        <w:tabs>
+          <w:tab w:val="num" w:pos="6480"/>
+        </w:tabs>
+        <w:ind w:left="6480" w:hanging="360"/>
+      </w:pPr>
+      <w:rPr>
+        <w:rFonts w:ascii="Symbol" w:hAnsi="Symbol" w:hint="default"/>
+        <w:sz w:val="20"/>
+      </w:rPr>
+    </w:lvl>
+  </w:abstractNum>
+  <w:abstractNum w:abstractNumId="1" w15:restartNumberingAfterBreak="0">
     <w:nsid w:val="0DEB2E8C"/>
     <w:multiLevelType w:val="hybridMultilevel"/>
     <w:tmpl w:val="D478A1FA"/>
@@ -3196,7 +4919,7 @@
       </w:rPr>
     </w:lvl>
   </w:abstractNum>
-  <w:abstractNum w:abstractNumId="1" w15:restartNumberingAfterBreak="0">
+  <w:abstractNum w:abstractNumId="2" w15:restartNumberingAfterBreak="0">
     <w:nsid w:val="0F253528"/>
     <w:multiLevelType w:val="hybridMultilevel"/>
     <w:tmpl w:val="E022366C"/>
@@ -3309,7 +5032,7 @@
       </w:rPr>
     </w:lvl>
   </w:abstractNum>
-  <w:abstractNum w:abstractNumId="2" w15:restartNumberingAfterBreak="0">
+  <w:abstractNum w:abstractNumId="3" w15:restartNumberingAfterBreak="0">
     <w:nsid w:val="19254471"/>
     <w:multiLevelType w:val="hybridMultilevel"/>
     <w:tmpl w:val="EE48CFBA"/>
@@ -3423,7 +5146,156 @@
       </w:rPr>
     </w:lvl>
   </w:abstractNum>
-  <w:abstractNum w:abstractNumId="3" w15:restartNumberingAfterBreak="0">
+  <w:abstractNum w:abstractNumId="4" w15:restartNumberingAfterBreak="0">
+    <w:nsid w:val="1B832556"/>
+    <w:multiLevelType w:val="multilevel"/>
+    <w:tmpl w:val="2E8ADAD4"/>
+    <w:lvl w:ilvl="0">
+      <w:start w:val="1"/>
+      <w:numFmt w:val="bullet"/>
+      <w:lvlText w:val=""/>
+      <w:lvlJc w:val="left"/>
+      <w:pPr>
+        <w:tabs>
+          <w:tab w:val="num" w:pos="720"/>
+        </w:tabs>
+        <w:ind w:left="720" w:hanging="360"/>
+      </w:pPr>
+      <w:rPr>
+        <w:rFonts w:ascii="Symbol" w:hAnsi="Symbol" w:hint="default"/>
+        <w:sz w:val="20"/>
+      </w:rPr>
+    </w:lvl>
+    <w:lvl w:ilvl="1" w:tentative="1">
+      <w:start w:val="1"/>
+      <w:numFmt w:val="bullet"/>
+      <w:lvlText w:val=""/>
+      <w:lvlJc w:val="left"/>
+      <w:pPr>
+        <w:tabs>
+          <w:tab w:val="num" w:pos="1440"/>
+        </w:tabs>
+        <w:ind w:left="1440" w:hanging="360"/>
+      </w:pPr>
+      <w:rPr>
+        <w:rFonts w:ascii="Symbol" w:hAnsi="Symbol" w:hint="default"/>
+        <w:sz w:val="20"/>
+      </w:rPr>
+    </w:lvl>
+    <w:lvl w:ilvl="2" w:tentative="1">
+      <w:start w:val="1"/>
+      <w:numFmt w:val="bullet"/>
+      <w:lvlText w:val=""/>
+      <w:lvlJc w:val="left"/>
+      <w:pPr>
+        <w:tabs>
+          <w:tab w:val="num" w:pos="2160"/>
+        </w:tabs>
+        <w:ind w:left="2160" w:hanging="360"/>
+      </w:pPr>
+      <w:rPr>
+        <w:rFonts w:ascii="Symbol" w:hAnsi="Symbol" w:hint="default"/>
+        <w:sz w:val="20"/>
+      </w:rPr>
+    </w:lvl>
+    <w:lvl w:ilvl="3" w:tentative="1">
+      <w:start w:val="1"/>
+      <w:numFmt w:val="bullet"/>
+      <w:lvlText w:val=""/>
+      <w:lvlJc w:val="left"/>
+      <w:pPr>
+        <w:tabs>
+          <w:tab w:val="num" w:pos="2880"/>
+        </w:tabs>
+        <w:ind w:left="2880" w:hanging="360"/>
+      </w:pPr>
+      <w:rPr>
+        <w:rFonts w:ascii="Symbol" w:hAnsi="Symbol" w:hint="default"/>
+        <w:sz w:val="20"/>
+      </w:rPr>
+    </w:lvl>
+    <w:lvl w:ilvl="4" w:tentative="1">
+      <w:start w:val="1"/>
+      <w:numFmt w:val="bullet"/>
+      <w:lvlText w:val=""/>
+      <w:lvlJc w:val="left"/>
+      <w:pPr>
+        <w:tabs>
+          <w:tab w:val="num" w:pos="3600"/>
+        </w:tabs>
+        <w:ind w:left="3600" w:hanging="360"/>
+      </w:pPr>
+      <w:rPr>
+        <w:rFonts w:ascii="Symbol" w:hAnsi="Symbol" w:hint="default"/>
+        <w:sz w:val="20"/>
+      </w:rPr>
+    </w:lvl>
+    <w:lvl w:ilvl="5" w:tentative="1">
+      <w:start w:val="1"/>
+      <w:numFmt w:val="bullet"/>
+      <w:lvlText w:val=""/>
+      <w:lvlJc w:val="left"/>
+      <w:pPr>
+        <w:tabs>
+          <w:tab w:val="num" w:pos="4320"/>
+        </w:tabs>
+        <w:ind w:left="4320" w:hanging="360"/>
+      </w:pPr>
+      <w:rPr>
+        <w:rFonts w:ascii="Symbol" w:hAnsi="Symbol" w:hint="default"/>
+        <w:sz w:val="20"/>
+      </w:rPr>
+    </w:lvl>
+    <w:lvl w:ilvl="6" w:tentative="1">
+      <w:start w:val="1"/>
+      <w:numFmt w:val="bullet"/>
+      <w:lvlText w:val=""/>
+      <w:lvlJc w:val="left"/>
+      <w:pPr>
+        <w:tabs>
+          <w:tab w:val="num" w:pos="5040"/>
+        </w:tabs>
+        <w:ind w:left="5040" w:hanging="360"/>
+      </w:pPr>
+      <w:rPr>
+        <w:rFonts w:ascii="Symbol" w:hAnsi="Symbol" w:hint="default"/>
+        <w:sz w:val="20"/>
+      </w:rPr>
+    </w:lvl>
+    <w:lvl w:ilvl="7" w:tentative="1">
+      <w:start w:val="1"/>
+      <w:numFmt w:val="bullet"/>
+      <w:lvlText w:val=""/>
+      <w:lvlJc w:val="left"/>
+      <w:pPr>
+        <w:tabs>
+          <w:tab w:val="num" w:pos="5760"/>
+        </w:tabs>
+        <w:ind w:left="5760" w:hanging="360"/>
+      </w:pPr>
+      <w:rPr>
+        <w:rFonts w:ascii="Symbol" w:hAnsi="Symbol" w:hint="default"/>
+        <w:sz w:val="20"/>
+      </w:rPr>
+    </w:lvl>
+    <w:lvl w:ilvl="8" w:tentative="1">
+      <w:start w:val="1"/>
+      <w:numFmt w:val="bullet"/>
+      <w:lvlText w:val=""/>
+      <w:lvlJc w:val="left"/>
+      <w:pPr>
+        <w:tabs>
+          <w:tab w:val="num" w:pos="6480"/>
+        </w:tabs>
+        <w:ind w:left="6480" w:hanging="360"/>
+      </w:pPr>
+      <w:rPr>
+        <w:rFonts w:ascii="Symbol" w:hAnsi="Symbol" w:hint="default"/>
+        <w:sz w:val="20"/>
+      </w:rPr>
+    </w:lvl>
+  </w:abstractNum>
+  <w:abstractNum w:abstractNumId="5" w15:restartNumberingAfterBreak="0">
     <w:nsid w:val="25D101E3"/>
     <w:multiLevelType w:val="hybridMultilevel"/>
     <w:tmpl w:val="1E9CC514"/>
@@ -3536,7 +5408,7 @@
       </w:rPr>
     </w:lvl>
   </w:abstractNum>
-  <w:abstractNum w:abstractNumId="4" w15:restartNumberingAfterBreak="0">
+  <w:abstractNum w:abstractNumId="6" w15:restartNumberingAfterBreak="0">
     <w:nsid w:val="26DE4B16"/>
     <w:multiLevelType w:val="multilevel"/>
     <w:tmpl w:val="9470283E"/>
@@ -3685,7 +5557,7 @@
       </w:rPr>
     </w:lvl>
   </w:abstractNum>
-  <w:abstractNum w:abstractNumId="5" w15:restartNumberingAfterBreak="0">
+  <w:abstractNum w:abstractNumId="7" w15:restartNumberingAfterBreak="0">
     <w:nsid w:val="2E8C7B01"/>
     <w:multiLevelType w:val="multilevel"/>
     <w:tmpl w:val="C17EACDC"/>
@@ -3806,7 +5678,7 @@
       </w:rPr>
     </w:lvl>
   </w:abstractNum>
-  <w:abstractNum w:abstractNumId="6" w15:restartNumberingAfterBreak="0">
+  <w:abstractNum w:abstractNumId="8" w15:restartNumberingAfterBreak="0">
     <w:nsid w:val="40DD1A90"/>
     <w:multiLevelType w:val="multilevel"/>
     <w:tmpl w:val="6E5C174A"/>
@@ -3919,7 +5791,7 @@
       </w:rPr>
     </w:lvl>
   </w:abstractNum>
-  <w:abstractNum w:abstractNumId="7" w15:restartNumberingAfterBreak="0">
+  <w:abstractNum w:abstractNumId="9" w15:restartNumberingAfterBreak="0">
     <w:nsid w:val="43722CF5"/>
     <w:multiLevelType w:val="hybridMultilevel"/>
     <w:tmpl w:val="7CCAC0E6"/>
@@ -4005,7 +5877,7 @@
       </w:pPr>
     </w:lvl>
   </w:abstractNum>
-  <w:abstractNum w:abstractNumId="8" w15:restartNumberingAfterBreak="0">
+  <w:abstractNum w:abstractNumId="10" w15:restartNumberingAfterBreak="0">
     <w:nsid w:val="4D4940A8"/>
     <w:multiLevelType w:val="hybridMultilevel"/>
     <w:tmpl w:val="4FEC69F0"/>
@@ -4119,7 +5991,7 @@
       </w:rPr>
     </w:lvl>
   </w:abstractNum>
-  <w:abstractNum w:abstractNumId="9" w15:restartNumberingAfterBreak="0">
+  <w:abstractNum w:abstractNumId="11" w15:restartNumberingAfterBreak="0">
     <w:nsid w:val="4F397A1C"/>
     <w:multiLevelType w:val="multilevel"/>
     <w:tmpl w:val="CCDA827E"/>
@@ -4268,7 +6140,7 @@
       </w:rPr>
     </w:lvl>
   </w:abstractNum>
-  <w:abstractNum w:abstractNumId="10" w15:restartNumberingAfterBreak="0">
+  <w:abstractNum w:abstractNumId="12" w15:restartNumberingAfterBreak="0">
     <w:nsid w:val="54174C12"/>
     <w:multiLevelType w:val="multilevel"/>
     <w:tmpl w:val="15B62650"/>
@@ -4399,7 +6271,7 @@
       </w:rPr>
     </w:lvl>
   </w:abstractNum>
-  <w:abstractNum w:abstractNumId="11" w15:restartNumberingAfterBreak="0">
+  <w:abstractNum w:abstractNumId="13" w15:restartNumberingAfterBreak="0">
     <w:nsid w:val="54517D06"/>
     <w:multiLevelType w:val="hybridMultilevel"/>
     <w:tmpl w:val="3DB0EB80"/>
@@ -4511,7 +6383,7 @@
       </w:rPr>
     </w:lvl>
   </w:abstractNum>
-  <w:abstractNum w:abstractNumId="12" w15:restartNumberingAfterBreak="0">
+  <w:abstractNum w:abstractNumId="14" w15:restartNumberingAfterBreak="0">
     <w:nsid w:val="68E15795"/>
     <w:multiLevelType w:val="hybridMultilevel"/>
     <w:tmpl w:val="8FE616A0"/>
@@ -4624,7 +6496,7 @@
       </w:rPr>
     </w:lvl>
   </w:abstractNum>
-  <w:abstractNum w:abstractNumId="13" w15:restartNumberingAfterBreak="0">
+  <w:abstractNum w:abstractNumId="15" w15:restartNumberingAfterBreak="0">
     <w:nsid w:val="6AFC07D3"/>
     <w:multiLevelType w:val="multilevel"/>
     <w:tmpl w:val="B3426C00"/>
@@ -4737,7 +6609,7 @@
       </w:rPr>
     </w:lvl>
   </w:abstractNum>
-  <w:abstractNum w:abstractNumId="14" w15:restartNumberingAfterBreak="0">
+  <w:abstractNum w:abstractNumId="16" w15:restartNumberingAfterBreak="0">
     <w:nsid w:val="6B7B1E92"/>
     <w:multiLevelType w:val="multilevel"/>
     <w:tmpl w:val="21BA233E"/>
@@ -4868,7 +6740,7 @@
       </w:rPr>
     </w:lvl>
   </w:abstractNum>
-  <w:abstractNum w:abstractNumId="15" w15:restartNumberingAfterBreak="0">
+  <w:abstractNum w:abstractNumId="17" w15:restartNumberingAfterBreak="0">
     <w:nsid w:val="6FA144D3"/>
     <w:multiLevelType w:val="multilevel"/>
     <w:tmpl w:val="98CEB7D6"/>
@@ -4989,7 +6861,7 @@
       </w:rPr>
     </w:lvl>
   </w:abstractNum>
-  <w:abstractNum w:abstractNumId="16" w15:restartNumberingAfterBreak="0">
+  <w:abstractNum w:abstractNumId="18" w15:restartNumberingAfterBreak="0">
     <w:nsid w:val="738344F2"/>
     <w:multiLevelType w:val="hybridMultilevel"/>
     <w:tmpl w:val="C4E037F2"/>
@@ -5104,7 +6976,7 @@
       </w:rPr>
     </w:lvl>
   </w:abstractNum>
-  <w:abstractNum w:abstractNumId="17" w15:restartNumberingAfterBreak="0">
+  <w:abstractNum w:abstractNumId="19" w15:restartNumberingAfterBreak="0">
     <w:nsid w:val="74B1685F"/>
     <w:multiLevelType w:val="hybridMultilevel"/>
     <w:tmpl w:val="943E89B2"/>
@@ -5217,7 +7089,7 @@
       </w:rPr>
     </w:lvl>
   </w:abstractNum>
-  <w:abstractNum w:abstractNumId="18" w15:restartNumberingAfterBreak="0">
+  <w:abstractNum w:abstractNumId="20" w15:restartNumberingAfterBreak="0">
     <w:nsid w:val="75DB1EAD"/>
     <w:multiLevelType w:val="multilevel"/>
     <w:tmpl w:val="F2B0D608"/>
@@ -5330,7 +7202,7 @@
       </w:rPr>
     </w:lvl>
   </w:abstractNum>
-  <w:abstractNum w:abstractNumId="19" w15:restartNumberingAfterBreak="0">
+  <w:abstractNum w:abstractNumId="21" w15:restartNumberingAfterBreak="0">
     <w:nsid w:val="765D269F"/>
     <w:multiLevelType w:val="multilevel"/>
     <w:tmpl w:val="B25854B2"/>
@@ -5443,7 +7315,7 @@
       </w:rPr>
     </w:lvl>
   </w:abstractNum>
-  <w:abstractNum w:abstractNumId="20" w15:restartNumberingAfterBreak="0">
+  <w:abstractNum w:abstractNumId="22" w15:restartNumberingAfterBreak="0">
     <w:nsid w:val="77694BC3"/>
     <w:multiLevelType w:val="hybridMultilevel"/>
     <w:tmpl w:val="8D0A3582"/>
@@ -5556,7 +7428,7 @@
       </w:rPr>
     </w:lvl>
   </w:abstractNum>
-  <w:abstractNum w:abstractNumId="21" w15:restartNumberingAfterBreak="0">
+  <w:abstractNum w:abstractNumId="23" w15:restartNumberingAfterBreak="0">
     <w:nsid w:val="7CE94054"/>
     <w:multiLevelType w:val="multilevel"/>
     <w:tmpl w:val="A4D4C1F2"/>
@@ -5671,70 +7543,76 @@
     </w:lvl>
   </w:abstractNum>
   <w:num w:numId="1" w16cid:durableId="1639728795">
+    <w:abstractNumId w:val="8"/>
+  </w:num>
+  <w:num w:numId="2" w16cid:durableId="1723866160">
+    <w:abstractNumId w:val="18"/>
+  </w:num>
+  <w:num w:numId="3" w16cid:durableId="1318801353">
+    <w:abstractNumId w:val="17"/>
+  </w:num>
+  <w:num w:numId="4" w16cid:durableId="1036586103">
+    <w:abstractNumId w:val="15"/>
+  </w:num>
+  <w:num w:numId="5" w16cid:durableId="21830215">
+    <w:abstractNumId w:val="23"/>
+  </w:num>
+  <w:num w:numId="6" w16cid:durableId="607932005">
+    <w:abstractNumId w:val="12"/>
+  </w:num>
+  <w:num w:numId="7" w16cid:durableId="1196039613">
+    <w:abstractNumId w:val="16"/>
+  </w:num>
+  <w:num w:numId="8" w16cid:durableId="797795467">
+    <w:abstractNumId w:val="20"/>
+  </w:num>
+  <w:num w:numId="9" w16cid:durableId="1185555067">
+    <w:abstractNumId w:val="22"/>
+  </w:num>
+  <w:num w:numId="10" w16cid:durableId="731150931">
+    <w:abstractNumId w:val="2"/>
+  </w:num>
+  <w:num w:numId="11" w16cid:durableId="97457085">
+    <w:abstractNumId w:val="5"/>
+  </w:num>
+  <w:num w:numId="12" w16cid:durableId="240261892">
+    <w:abstractNumId w:val="13"/>
+  </w:num>
+  <w:num w:numId="13" w16cid:durableId="936130915">
+    <w:abstractNumId w:val="7"/>
+  </w:num>
+  <w:num w:numId="14" w16cid:durableId="1846705042">
+    <w:abstractNumId w:val="10"/>
+  </w:num>
+  <w:num w:numId="15" w16cid:durableId="1824274691">
+    <w:abstractNumId w:val="1"/>
+  </w:num>
+  <w:num w:numId="16" w16cid:durableId="422992553">
+    <w:abstractNumId w:val="19"/>
+  </w:num>
+  <w:num w:numId="17" w16cid:durableId="533999065">
+    <w:abstractNumId w:val="14"/>
+  </w:num>
+  <w:num w:numId="18" w16cid:durableId="265382296">
+    <w:abstractNumId w:val="3"/>
+  </w:num>
+  <w:num w:numId="19" w16cid:durableId="836992758">
+    <w:abstractNumId w:val="11"/>
+  </w:num>
+  <w:num w:numId="20" w16cid:durableId="1591503562">
     <w:abstractNumId w:val="6"/>
   </w:num>
-  <w:num w:numId="2" w16cid:durableId="1723866160">
-    <w:abstractNumId w:val="16"/>
+  <w:num w:numId="21" w16cid:durableId="352726194">
+    <w:abstractNumId w:val="9"/>
   </w:num>
-  <w:num w:numId="3" w16cid:durableId="1318801353">
-    <w:abstractNumId w:val="15"/>
-  </w:num>
-  <w:num w:numId="4" w16cid:durableId="1036586103">
-    <w:abstractNumId w:val="13"/>
-  </w:num>
-  <w:num w:numId="5" w16cid:durableId="21830215">
+  <w:num w:numId="22" w16cid:durableId="1404567713">
     <w:abstractNumId w:val="21"/>
   </w:num>
-  <w:num w:numId="6" w16cid:durableId="607932005">
-    <w:abstractNumId w:val="10"/>
-  </w:num>
-  <w:num w:numId="7" w16cid:durableId="1196039613">
-    <w:abstractNumId w:val="14"/>
-  </w:num>
-  <w:num w:numId="8" w16cid:durableId="797795467">
-    <w:abstractNumId w:val="18"/>
-  </w:num>
-  <w:num w:numId="9" w16cid:durableId="1185555067">
-    <w:abstractNumId w:val="20"/>
-  </w:num>
-  <w:num w:numId="10" w16cid:durableId="731150931">
-    <w:abstractNumId w:val="1"/>
-  </w:num>
-  <w:num w:numId="11" w16cid:durableId="97457085">
-    <w:abstractNumId w:val="3"/>
-  </w:num>
-  <w:num w:numId="12" w16cid:durableId="240261892">
-    <w:abstractNumId w:val="11"/>
-  </w:num>
-  <w:num w:numId="13" w16cid:durableId="936130915">
-    <w:abstractNumId w:val="5"/>
-  </w:num>
-  <w:num w:numId="14" w16cid:durableId="1846705042">
-    <w:abstractNumId w:val="8"/>
-  </w:num>
-  <w:num w:numId="15" w16cid:durableId="1824274691">
+  <w:num w:numId="23" w16cid:durableId="1415395502">
     <w:abstractNumId w:val="0"/>
   </w:num>
-  <w:num w:numId="16" w16cid:durableId="422992553">
-    <w:abstractNumId w:val="17"/>
-  </w:num>
-  <w:num w:numId="17" w16cid:durableId="533999065">
-    <w:abstractNumId w:val="12"/>
-  </w:num>
-  <w:num w:numId="18" w16cid:durableId="265382296">
-    <w:abstractNumId w:val="2"/>
-  </w:num>
-  <w:num w:numId="19" w16cid:durableId="836992758">
-    <w:abstractNumId w:val="9"/>
-  </w:num>
-  <w:num w:numId="20" w16cid:durableId="1591503562">
+  <w:num w:numId="24" w16cid:durableId="1069420110">
     <w:abstractNumId w:val="4"/>
-  </w:num>
-  <w:num w:numId="21" w16cid:durableId="352726194">
-    <w:abstractNumId w:val="7"/>
-  </w:num>
-  <w:num w:numId="22" w16cid:durableId="1404567713">
-    <w:abstractNumId w:val="19"/>
   </w:num>
 </w:numbering>
 </file>

</xml_diff>

<commit_message>
Diagrama de arquitectura general y flujo Gitflow
</commit_message>
<xml_diff>
--- a/Actividad-1.docx
+++ b/Actividad-1.docx
@@ -1749,6 +1749,7 @@
           <w:rFonts w:ascii="Arial" w:hAnsi="Arial" w:cs="Arial"/>
           <w:b/>
           <w:bCs/>
+          <w:noProof/>
           <w:lang w:val="es-ES" w:eastAsia="es-EC"/>
         </w:rPr>
         <w:lastRenderedPageBreak/>
@@ -3396,6 +3397,603 @@
           <w:rFonts w:ascii="Arial" w:hAnsi="Arial" w:cs="Arial"/>
           <w:b/>
           <w:bCs/>
+          <w:lang w:val="es-ES" w:eastAsia="es-EC"/>
+        </w:rPr>
+      </w:pPr>
+      <w:r>
+        <w:rPr>
+          <w:rFonts w:ascii="Arial" w:hAnsi="Arial" w:cs="Arial"/>
+          <w:b/>
+          <w:bCs/>
+          <w:lang w:val="es-ES" w:eastAsia="es-EC"/>
+        </w:rPr>
+        <w:t>2.4 Arquitectura general del sistema</w:t>
+      </w:r>
+    </w:p>
+    <w:p>
+      <w:pPr>
+        <w:rPr>
+          <w:rFonts w:ascii="Arial" w:hAnsi="Arial" w:cs="Arial"/>
+          <w:lang w:val="es-ES" w:eastAsia="es-EC"/>
+        </w:rPr>
+      </w:pPr>
+      <w:r>
+        <w:rPr>
+          <w:rFonts w:ascii="Arial" w:hAnsi="Arial" w:cs="Arial"/>
+          <w:lang w:val="es-ES" w:eastAsia="es-EC"/>
+        </w:rPr>
+        <w:t>El sistema se organiza en tres capas bajo el patrón MVC, lo que separa la interfaz, la lógica de negocio y el acceso a datos:</w:t>
+      </w:r>
+    </w:p>
+    <w:tbl>
+      <w:tblPr>
+        <w:tblW w:w="10080" w:type="dxa"/>
+        <w:tblBorders>
+          <w:top w:val="single" w:sz="2" w:space="0" w:color="auto"/>
+          <w:left w:val="single" w:sz="2" w:space="0" w:color="auto"/>
+          <w:bottom w:val="single" w:sz="2" w:space="0" w:color="auto"/>
+          <w:right w:val="single" w:sz="2" w:space="0" w:color="auto"/>
+        </w:tblBorders>
+        <w:tblCellMar>
+          <w:left w:w="0" w:type="dxa"/>
+          <w:right w:w="0" w:type="dxa"/>
+        </w:tblCellMar>
+        <w:tblLook w:val="04A0" w:firstRow="1" w:lastRow="0" w:firstColumn="1" w:lastColumn="0" w:noHBand="0" w:noVBand="1"/>
+      </w:tblPr>
+      <w:tblGrid>
+        <w:gridCol w:w="3221"/>
+        <w:gridCol w:w="6859"/>
+      </w:tblGrid>
+      <w:tr>
+        <w:trPr>
+          <w:tblHeader/>
+        </w:trPr>
+        <w:tc>
+          <w:tcPr>
+            <w:tcW w:w="0" w:type="auto"/>
+            <w:tcBorders>
+              <w:top w:val="single" w:sz="2" w:space="0" w:color="auto"/>
+              <w:left w:val="single" w:sz="2" w:space="0" w:color="auto"/>
+              <w:bottom w:val="single" w:sz="4" w:space="0" w:color="auto"/>
+              <w:right w:val="single" w:sz="2" w:space="0" w:color="auto"/>
+            </w:tcBorders>
+            <w:shd w:val="clear" w:color="auto" w:fill="A3DBFF"/>
+            <w:tcMar>
+              <w:top w:w="180" w:type="dxa"/>
+              <w:left w:w="180" w:type="dxa"/>
+              <w:bottom w:w="180" w:type="dxa"/>
+              <w:right w:w="180" w:type="dxa"/>
+            </w:tcMar>
+            <w:hideMark/>
+          </w:tcPr>
+          <w:p>
+            <w:pPr>
+              <w:rPr>
+                <w:rFonts w:ascii="Arial" w:hAnsi="Arial" w:cs="Arial"/>
+                <w:b/>
+                <w:bCs/>
+                <w:lang w:val="es-ES" w:eastAsia="es-EC"/>
+              </w:rPr>
+            </w:pPr>
+            <w:r>
+              <w:rPr>
+                <w:rFonts w:ascii="Arial" w:hAnsi="Arial" w:cs="Arial"/>
+                <w:b/>
+                <w:bCs/>
+                <w:lang w:val="es-ES" w:eastAsia="es-EC"/>
+              </w:rPr>
+              <w:t>Capa</w:t>
+            </w:r>
+          </w:p>
+        </w:tc>
+        <w:tc>
+          <w:tcPr>
+            <w:tcW w:w="0" w:type="auto"/>
+            <w:tcBorders>
+              <w:top w:val="single" w:sz="2" w:space="0" w:color="auto"/>
+              <w:left w:val="single" w:sz="2" w:space="0" w:color="auto"/>
+              <w:bottom w:val="single" w:sz="4" w:space="0" w:color="auto"/>
+              <w:right w:val="single" w:sz="2" w:space="0" w:color="auto"/>
+            </w:tcBorders>
+            <w:shd w:val="clear" w:color="auto" w:fill="A3DBFF"/>
+            <w:tcMar>
+              <w:top w:w="180" w:type="dxa"/>
+              <w:left w:w="180" w:type="dxa"/>
+              <w:bottom w:w="180" w:type="dxa"/>
+              <w:right w:w="180" w:type="dxa"/>
+            </w:tcMar>
+            <w:hideMark/>
+          </w:tcPr>
+          <w:p>
+            <w:pPr>
+              <w:rPr>
+                <w:rFonts w:ascii="Arial" w:hAnsi="Arial" w:cs="Arial"/>
+                <w:b/>
+                <w:bCs/>
+                <w:lang w:val="es-ES" w:eastAsia="es-EC"/>
+              </w:rPr>
+            </w:pPr>
+            <w:r>
+              <w:rPr>
+                <w:rFonts w:ascii="Arial" w:hAnsi="Arial" w:cs="Arial"/>
+                <w:b/>
+                <w:bCs/>
+                <w:lang w:val="es-ES" w:eastAsia="es-EC"/>
+              </w:rPr>
+              <w:t>Responsabilidad</w:t>
+            </w:r>
+          </w:p>
+        </w:tc>
+      </w:tr>
+      <w:tr>
+        <w:tc>
+          <w:tcPr>
+            <w:tcW w:w="0" w:type="auto"/>
+            <w:tcBorders>
+              <w:top w:val="single" w:sz="2" w:space="0" w:color="auto"/>
+              <w:left w:val="single" w:sz="2" w:space="0" w:color="auto"/>
+              <w:bottom w:val="single" w:sz="4" w:space="0" w:color="auto"/>
+              <w:right w:val="single" w:sz="2" w:space="0" w:color="auto"/>
+            </w:tcBorders>
+            <w:tcMar>
+              <w:top w:w="180" w:type="dxa"/>
+              <w:left w:w="180" w:type="dxa"/>
+              <w:bottom w:w="180" w:type="dxa"/>
+              <w:right w:w="180" w:type="dxa"/>
+            </w:tcMar>
+            <w:hideMark/>
+          </w:tcPr>
+          <w:p>
+            <w:pPr>
+              <w:rPr>
+                <w:rFonts w:ascii="Arial" w:hAnsi="Arial" w:cs="Arial"/>
+                <w:lang w:val="es-ES" w:eastAsia="es-EC"/>
+              </w:rPr>
+            </w:pPr>
+            <w:r>
+              <w:rPr>
+                <w:rFonts w:ascii="Arial" w:hAnsi="Arial" w:cs="Arial"/>
+                <w:lang w:val="es-ES" w:eastAsia="es-EC"/>
+              </w:rPr>
+              <w:t>Presentación (Vista)</w:t>
+            </w:r>
+          </w:p>
+        </w:tc>
+        <w:tc>
+          <w:tcPr>
+            <w:tcW w:w="0" w:type="auto"/>
+            <w:tcBorders>
+              <w:top w:val="single" w:sz="2" w:space="0" w:color="auto"/>
+              <w:left w:val="single" w:sz="2" w:space="0" w:color="auto"/>
+              <w:bottom w:val="single" w:sz="4" w:space="0" w:color="auto"/>
+              <w:right w:val="single" w:sz="2" w:space="0" w:color="auto"/>
+            </w:tcBorders>
+            <w:tcMar>
+              <w:top w:w="180" w:type="dxa"/>
+              <w:left w:w="180" w:type="dxa"/>
+              <w:bottom w:w="180" w:type="dxa"/>
+              <w:right w:w="180" w:type="dxa"/>
+            </w:tcMar>
+            <w:hideMark/>
+          </w:tcPr>
+          <w:p>
+            <w:pPr>
+              <w:rPr>
+                <w:rFonts w:ascii="Arial" w:hAnsi="Arial" w:cs="Arial"/>
+                <w:lang w:val="es-ES" w:eastAsia="es-EC"/>
+              </w:rPr>
+            </w:pPr>
+            <w:r>
+              <w:rPr>
+                <w:rFonts w:ascii="Arial" w:hAnsi="Arial" w:cs="Arial"/>
+                <w:lang w:val="es-ES" w:eastAsia="es-EC"/>
+              </w:rPr>
+              <w:t>Interfaz gráfica donde los usuarios (ciudadano, voluntario, administrador) interactúan con el sistema.</w:t>
+            </w:r>
+          </w:p>
+        </w:tc>
+      </w:tr>
+      <w:tr>
+        <w:tc>
+          <w:tcPr>
+            <w:tcW w:w="0" w:type="auto"/>
+            <w:tcBorders>
+              <w:top w:val="single" w:sz="2" w:space="0" w:color="auto"/>
+              <w:left w:val="single" w:sz="2" w:space="0" w:color="auto"/>
+              <w:bottom w:val="single" w:sz="4" w:space="0" w:color="auto"/>
+              <w:right w:val="single" w:sz="2" w:space="0" w:color="auto"/>
+            </w:tcBorders>
+            <w:tcMar>
+              <w:top w:w="180" w:type="dxa"/>
+              <w:left w:w="180" w:type="dxa"/>
+              <w:bottom w:w="180" w:type="dxa"/>
+              <w:right w:w="180" w:type="dxa"/>
+            </w:tcMar>
+            <w:hideMark/>
+          </w:tcPr>
+          <w:p>
+            <w:pPr>
+              <w:rPr>
+                <w:rFonts w:ascii="Arial" w:hAnsi="Arial" w:cs="Arial"/>
+                <w:lang w:val="es-ES" w:eastAsia="es-EC"/>
+              </w:rPr>
+            </w:pPr>
+            <w:r>
+              <w:rPr>
+                <w:rFonts w:ascii="Arial" w:hAnsi="Arial" w:cs="Arial"/>
+                <w:lang w:val="es-ES" w:eastAsia="es-EC"/>
+              </w:rPr>
+              <w:t>Lógica de Negocio (Controlador y Modelo)</w:t>
+            </w:r>
+          </w:p>
+        </w:tc>
+        <w:tc>
+          <w:tcPr>
+            <w:tcW w:w="0" w:type="auto"/>
+            <w:tcBorders>
+              <w:top w:val="single" w:sz="2" w:space="0" w:color="auto"/>
+              <w:left w:val="single" w:sz="2" w:space="0" w:color="auto"/>
+              <w:bottom w:val="single" w:sz="4" w:space="0" w:color="auto"/>
+              <w:right w:val="single" w:sz="2" w:space="0" w:color="auto"/>
+            </w:tcBorders>
+            <w:tcMar>
+              <w:top w:w="180" w:type="dxa"/>
+              <w:left w:w="180" w:type="dxa"/>
+              <w:bottom w:w="180" w:type="dxa"/>
+              <w:right w:w="180" w:type="dxa"/>
+            </w:tcMar>
+            <w:hideMark/>
+          </w:tcPr>
+          <w:p>
+            <w:pPr>
+              <w:rPr>
+                <w:rFonts w:ascii="Arial" w:hAnsi="Arial" w:cs="Arial"/>
+                <w:lang w:val="es-ES" w:eastAsia="es-EC"/>
+              </w:rPr>
+            </w:pPr>
+            <w:r>
+              <w:rPr>
+                <w:rFonts w:ascii="Arial" w:hAnsi="Arial" w:cs="Arial"/>
+                <w:lang w:val="es-ES" w:eastAsia="es-EC"/>
+              </w:rPr>
+              <w:t>Gestión de casos de rescate, asignación de personal, notificaciones y aplicación de los patrones de diseño.</w:t>
+            </w:r>
+          </w:p>
+        </w:tc>
+      </w:tr>
+      <w:tr>
+        <w:tc>
+          <w:tcPr>
+            <w:tcW w:w="0" w:type="auto"/>
+            <w:tcBorders>
+              <w:top w:val="single" w:sz="2" w:space="0" w:color="auto"/>
+              <w:left w:val="single" w:sz="2" w:space="0" w:color="auto"/>
+              <w:bottom w:val="single" w:sz="4" w:space="0" w:color="auto"/>
+              <w:right w:val="single" w:sz="2" w:space="0" w:color="auto"/>
+            </w:tcBorders>
+            <w:tcMar>
+              <w:top w:w="180" w:type="dxa"/>
+              <w:left w:w="180" w:type="dxa"/>
+              <w:bottom w:w="180" w:type="dxa"/>
+              <w:right w:w="180" w:type="dxa"/>
+            </w:tcMar>
+            <w:hideMark/>
+          </w:tcPr>
+          <w:p>
+            <w:pPr>
+              <w:rPr>
+                <w:rFonts w:ascii="Arial" w:hAnsi="Arial" w:cs="Arial"/>
+                <w:lang w:val="es-ES" w:eastAsia="es-EC"/>
+              </w:rPr>
+            </w:pPr>
+            <w:r>
+              <w:rPr>
+                <w:rFonts w:ascii="Arial" w:hAnsi="Arial" w:cs="Arial"/>
+                <w:lang w:val="es-ES" w:eastAsia="es-EC"/>
+              </w:rPr>
+              <w:t>Datos (Persistencia)</w:t>
+            </w:r>
+          </w:p>
+        </w:tc>
+        <w:tc>
+          <w:tcPr>
+            <w:tcW w:w="0" w:type="auto"/>
+            <w:tcBorders>
+              <w:top w:val="single" w:sz="2" w:space="0" w:color="auto"/>
+              <w:left w:val="single" w:sz="2" w:space="0" w:color="auto"/>
+              <w:bottom w:val="single" w:sz="4" w:space="0" w:color="auto"/>
+              <w:right w:val="single" w:sz="2" w:space="0" w:color="auto"/>
+            </w:tcBorders>
+            <w:tcMar>
+              <w:top w:w="180" w:type="dxa"/>
+              <w:left w:w="180" w:type="dxa"/>
+              <w:bottom w:w="180" w:type="dxa"/>
+              <w:right w:w="180" w:type="dxa"/>
+            </w:tcMar>
+            <w:hideMark/>
+          </w:tcPr>
+          <w:p>
+            <w:pPr>
+              <w:rPr>
+                <w:rFonts w:ascii="Arial" w:hAnsi="Arial" w:cs="Arial"/>
+                <w:lang w:val="es-ES" w:eastAsia="es-EC"/>
+              </w:rPr>
+            </w:pPr>
+            <w:r>
+              <w:rPr>
+                <w:rFonts w:ascii="Arial" w:hAnsi="Arial" w:cs="Arial"/>
+                <w:lang w:val="es-ES" w:eastAsia="es-EC"/>
+              </w:rPr>
+              <w:t>Almacenamiento de información de animales, casos, usuarios y notificaciones.</w:t>
+            </w:r>
+          </w:p>
+        </w:tc>
+      </w:tr>
+    </w:tbl>
+    <w:p>
+      <w:pPr>
+        <w:rPr>
+          <w:rFonts w:ascii="Arial" w:hAnsi="Arial" w:cs="Arial"/>
+          <w:lang w:val="es-ES" w:eastAsia="es-EC"/>
+        </w:rPr>
+      </w:pPr>
+      <w:r>
+        <w:rPr>
+          <w:rFonts w:ascii="Arial" w:hAnsi="Arial" w:cs="Arial"/>
+          <w:lang w:val="es-ES" w:eastAsia="es-EC"/>
+        </w:rPr>
+        <w:t xml:space="preserve">Integración con </w:t>
+      </w:r>
+      <w:proofErr w:type="spellStart"/>
+      <w:r>
+        <w:rPr>
+          <w:rFonts w:ascii="Arial" w:hAnsi="Arial" w:cs="Arial"/>
+          <w:lang w:val="es-ES" w:eastAsia="es-EC"/>
+        </w:rPr>
+        <w:t>Gitflow</w:t>
+      </w:r>
+      <w:proofErr w:type="spellEnd"/>
+      <w:r>
+        <w:rPr>
+          <w:rFonts w:ascii="Arial" w:hAnsi="Arial" w:cs="Arial"/>
+          <w:lang w:val="es-ES" w:eastAsia="es-EC"/>
+        </w:rPr>
+        <w:t>:</w:t>
+      </w:r>
+    </w:p>
+    <w:p>
+      <w:pPr>
+        <w:numPr>
+          <w:ilvl w:val="0"/>
+          <w:numId w:val="25"/>
+        </w:numPr>
+        <w:rPr>
+          <w:rFonts w:ascii="Arial" w:hAnsi="Arial" w:cs="Arial"/>
+          <w:lang w:val="es-ES" w:eastAsia="es-EC"/>
+        </w:rPr>
+      </w:pPr>
+      <w:proofErr w:type="spellStart"/>
+      <w:r>
+        <w:rPr>
+          <w:rFonts w:ascii="Arial" w:hAnsi="Arial" w:cs="Arial"/>
+          <w:lang w:val="es-ES" w:eastAsia="es-EC"/>
+        </w:rPr>
+        <w:t>main</w:t>
+      </w:r>
+      <w:proofErr w:type="spellEnd"/>
+      <w:r>
+        <w:rPr>
+          <w:rFonts w:ascii="Arial" w:hAnsi="Arial" w:cs="Arial"/>
+          <w:lang w:val="es-ES" w:eastAsia="es-EC"/>
+        </w:rPr>
+        <w:t>: contiene la versión estable y desplegable del sistema.</w:t>
+      </w:r>
+    </w:p>
+    <w:p>
+      <w:pPr>
+        <w:numPr>
+          <w:ilvl w:val="0"/>
+          <w:numId w:val="25"/>
+        </w:numPr>
+        <w:rPr>
+          <w:rFonts w:ascii="Arial" w:hAnsi="Arial" w:cs="Arial"/>
+          <w:lang w:val="es-ES" w:eastAsia="es-EC"/>
+        </w:rPr>
+      </w:pPr>
+      <w:proofErr w:type="spellStart"/>
+      <w:r>
+        <w:rPr>
+          <w:rFonts w:ascii="Arial" w:hAnsi="Arial" w:cs="Arial"/>
+          <w:lang w:val="es-ES" w:eastAsia="es-EC"/>
+        </w:rPr>
+        <w:t>develop</w:t>
+      </w:r>
+      <w:proofErr w:type="spellEnd"/>
+      <w:r>
+        <w:rPr>
+          <w:rFonts w:ascii="Arial" w:hAnsi="Arial" w:cs="Arial"/>
+          <w:lang w:val="es-ES" w:eastAsia="es-EC"/>
+        </w:rPr>
+        <w:t>: integra los avances aprobados antes de pasar a </w:t>
+      </w:r>
+      <w:proofErr w:type="spellStart"/>
+      <w:r>
+        <w:rPr>
+          <w:rFonts w:ascii="Arial" w:hAnsi="Arial" w:cs="Arial"/>
+          <w:lang w:val="es-ES" w:eastAsia="es-EC"/>
+        </w:rPr>
+        <w:t>main</w:t>
+      </w:r>
+      <w:proofErr w:type="spellEnd"/>
+      <w:r>
+        <w:rPr>
+          <w:rFonts w:ascii="Arial" w:hAnsi="Arial" w:cs="Arial"/>
+          <w:lang w:val="es-ES" w:eastAsia="es-EC"/>
+        </w:rPr>
+        <w:t>.</w:t>
+      </w:r>
+    </w:p>
+    <w:p>
+      <w:pPr>
+        <w:numPr>
+          <w:ilvl w:val="0"/>
+          <w:numId w:val="25"/>
+        </w:numPr>
+        <w:rPr>
+          <w:rFonts w:ascii="Arial" w:hAnsi="Arial" w:cs="Arial"/>
+          <w:lang w:val="es-ES" w:eastAsia="es-EC"/>
+        </w:rPr>
+      </w:pPr>
+      <w:proofErr w:type="spellStart"/>
+      <w:r>
+        <w:rPr>
+          <w:rFonts w:ascii="Arial" w:hAnsi="Arial" w:cs="Arial"/>
+          <w:lang w:val="es-ES" w:eastAsia="es-EC"/>
+        </w:rPr>
+        <w:t>feature</w:t>
+      </w:r>
+      <w:proofErr w:type="spellEnd"/>
+      <w:r>
+        <w:rPr>
+          <w:rFonts w:ascii="Arial" w:hAnsi="Arial" w:cs="Arial"/>
+          <w:lang w:val="es-ES" w:eastAsia="es-EC"/>
+        </w:rPr>
+        <w:t>/*: ramas para desarrollar cada funcionalidad de forma aislada.</w:t>
+      </w:r>
+    </w:p>
+    <w:p>
+      <w:pPr>
+        <w:rPr>
+          <w:rFonts w:ascii="Arial" w:hAnsi="Arial" w:cs="Arial"/>
+          <w:lang w:val="es-ES" w:eastAsia="es-EC"/>
+        </w:rPr>
+      </w:pPr>
+      <w:r>
+        <w:rPr>
+          <w:rFonts w:ascii="Arial" w:hAnsi="Arial" w:cs="Arial"/>
+          <w:lang w:val="es-ES" w:eastAsia="es-EC"/>
+        </w:rPr>
+        <w:t>El flujo es: se crea una rama </w:t>
+      </w:r>
+      <w:proofErr w:type="spellStart"/>
+      <w:r>
+        <w:rPr>
+          <w:rFonts w:ascii="Arial" w:hAnsi="Arial" w:cs="Arial"/>
+          <w:lang w:val="es-ES" w:eastAsia="es-EC"/>
+        </w:rPr>
+        <w:t>feature</w:t>
+      </w:r>
+      <w:proofErr w:type="spellEnd"/>
+      <w:r>
+        <w:rPr>
+          <w:rFonts w:ascii="Arial" w:hAnsi="Arial" w:cs="Arial"/>
+          <w:lang w:val="es-ES" w:eastAsia="es-EC"/>
+        </w:rPr>
+        <w:t> desde </w:t>
+      </w:r>
+      <w:proofErr w:type="spellStart"/>
+      <w:r>
+        <w:rPr>
+          <w:rFonts w:ascii="Arial" w:hAnsi="Arial" w:cs="Arial"/>
+          <w:lang w:val="es-ES" w:eastAsia="es-EC"/>
+        </w:rPr>
+        <w:t>develop</w:t>
+      </w:r>
+      <w:proofErr w:type="spellEnd"/>
+      <w:r>
+        <w:rPr>
+          <w:rFonts w:ascii="Arial" w:hAnsi="Arial" w:cs="Arial"/>
+          <w:lang w:val="es-ES" w:eastAsia="es-EC"/>
+        </w:rPr>
+        <w:t>, se desarrolla la funcionalidad, se integra a </w:t>
+      </w:r>
+      <w:proofErr w:type="spellStart"/>
+      <w:r>
+        <w:rPr>
+          <w:rFonts w:ascii="Arial" w:hAnsi="Arial" w:cs="Arial"/>
+          <w:lang w:val="es-ES" w:eastAsia="es-EC"/>
+        </w:rPr>
+        <w:t>develop</w:t>
+      </w:r>
+      <w:proofErr w:type="spellEnd"/>
+      <w:r>
+        <w:rPr>
+          <w:rFonts w:ascii="Arial" w:hAnsi="Arial" w:cs="Arial"/>
+          <w:lang w:val="es-ES" w:eastAsia="es-EC"/>
+        </w:rPr>
+        <w:t xml:space="preserve"> mediante </w:t>
+      </w:r>
+      <w:proofErr w:type="spellStart"/>
+      <w:r>
+        <w:rPr>
+          <w:rFonts w:ascii="Arial" w:hAnsi="Arial" w:cs="Arial"/>
+          <w:lang w:val="es-ES" w:eastAsia="es-EC"/>
+        </w:rPr>
+        <w:t>pull</w:t>
+      </w:r>
+      <w:proofErr w:type="spellEnd"/>
+      <w:r>
+        <w:rPr>
+          <w:rFonts w:ascii="Arial" w:hAnsi="Arial" w:cs="Arial"/>
+          <w:lang w:val="es-ES" w:eastAsia="es-EC"/>
+        </w:rPr>
+        <w:t xml:space="preserve"> </w:t>
+      </w:r>
+      <w:proofErr w:type="spellStart"/>
+      <w:r>
+        <w:rPr>
+          <w:rFonts w:ascii="Arial" w:hAnsi="Arial" w:cs="Arial"/>
+          <w:lang w:val="es-ES" w:eastAsia="es-EC"/>
+        </w:rPr>
+        <w:t>request</w:t>
+      </w:r>
+      <w:proofErr w:type="spellEnd"/>
+      <w:r>
+        <w:rPr>
+          <w:rFonts w:ascii="Arial" w:hAnsi="Arial" w:cs="Arial"/>
+          <w:lang w:val="es-ES" w:eastAsia="es-EC"/>
+        </w:rPr>
+        <w:t>, y finalmente </w:t>
+      </w:r>
+      <w:proofErr w:type="spellStart"/>
+      <w:r>
+        <w:rPr>
+          <w:rFonts w:ascii="Arial" w:hAnsi="Arial" w:cs="Arial"/>
+          <w:lang w:val="es-ES" w:eastAsia="es-EC"/>
+        </w:rPr>
+        <w:t>develop</w:t>
+      </w:r>
+      <w:proofErr w:type="spellEnd"/>
+      <w:r>
+        <w:rPr>
+          <w:rFonts w:ascii="Arial" w:hAnsi="Arial" w:cs="Arial"/>
+          <w:lang w:val="es-ES" w:eastAsia="es-EC"/>
+        </w:rPr>
+        <w:t> se fusiona con </w:t>
+      </w:r>
+      <w:proofErr w:type="spellStart"/>
+      <w:r>
+        <w:rPr>
+          <w:rFonts w:ascii="Arial" w:hAnsi="Arial" w:cs="Arial"/>
+          <w:lang w:val="es-ES" w:eastAsia="es-EC"/>
+        </w:rPr>
+        <w:t>main</w:t>
+      </w:r>
+      <w:proofErr w:type="spellEnd"/>
+      <w:r>
+        <w:rPr>
+          <w:rFonts w:ascii="Arial" w:hAnsi="Arial" w:cs="Arial"/>
+          <w:lang w:val="es-ES" w:eastAsia="es-EC"/>
+        </w:rPr>
+        <w:t> cuando está estable.</w:t>
+      </w:r>
+    </w:p>
+    <w:p>
+      <w:pPr>
+        <w:rPr>
+          <w:rFonts w:ascii="Arial" w:hAnsi="Arial" w:cs="Arial"/>
+          <w:b/>
+          <w:bCs/>
           <w:lang w:eastAsia="es-EC"/>
         </w:rPr>
       </w:pPr>
@@ -3529,16 +4127,15 @@
           <w:lang w:eastAsia="es-EC"/>
         </w:rPr>
       </w:pPr>
-    </w:p>
-    <w:p>
-      <w:pPr>
+      <w:r>
         <w:rPr>
           <w:rFonts w:ascii="Arial" w:hAnsi="Arial" w:cs="Arial"/>
           <w:b/>
           <w:bCs/>
           <w:lang w:eastAsia="es-EC"/>
         </w:rPr>
-      </w:pPr>
+        <w:t>Diagrama 1 — Arquitectura:</w:t>
+      </w:r>
     </w:p>
     <w:p>
       <w:pPr>
@@ -3549,16 +4146,426 @@
           <w:lang w:eastAsia="es-EC"/>
         </w:rPr>
       </w:pPr>
-    </w:p>
-    <w:p>
-      <w:pPr>
+      <w:r>
         <w:rPr>
           <w:rFonts w:ascii="Arial" w:hAnsi="Arial" w:cs="Arial"/>
           <w:b/>
           <w:bCs/>
           <w:lang w:eastAsia="es-EC"/>
         </w:rPr>
-      </w:pPr>
+        <w:drawing>
+          <wp:anchor distT="0" distB="0" distL="114300" distR="114300" simplePos="0" relativeHeight="251668480" behindDoc="1" locked="0" layoutInCell="1" allowOverlap="1" wp14:anchorId="766455EC" wp14:editId="53DC99E6">
+            <wp:simplePos x="0" y="0"/>
+            <wp:positionH relativeFrom="margin">
+              <wp:align>left</wp:align>
+            </wp:positionH>
+            <wp:positionV relativeFrom="paragraph">
+              <wp:posOffset>191597</wp:posOffset>
+            </wp:positionV>
+            <wp:extent cx="5088890" cy="3897630"/>
+            <wp:effectExtent l="0" t="0" r="0" b="7620"/>
+            <wp:wrapSquare wrapText="bothSides"/>
+            <wp:docPr id="852207863" name="Imagen 1"/>
+            <wp:cNvGraphicFramePr>
+              <a:graphicFrameLocks xmlns:a="http://schemas.openxmlformats.org/drawingml/2006/main" noChangeAspect="1"/>
+            </wp:cNvGraphicFramePr>
+            <a:graphic xmlns:a="http://schemas.openxmlformats.org/drawingml/2006/main">
+              <a:graphicData uri="http://schemas.openxmlformats.org/drawingml/2006/picture">
+                <pic:pic xmlns:pic="http://schemas.openxmlformats.org/drawingml/2006/picture">
+                  <pic:nvPicPr>
+                    <pic:cNvPr id="852207863" name=""/>
+                    <pic:cNvPicPr/>
+                  </pic:nvPicPr>
+                  <pic:blipFill rotWithShape="1">
+                    <a:blip r:embed="rId16" cstate="print">
+                      <a:extLst>
+                        <a:ext uri="{28A0092B-C50C-407E-A947-70E740481C1C}">
+                          <a14:useLocalDpi xmlns:a14="http://schemas.microsoft.com/office/drawing/2010/main" val="0"/>
+                        </a:ext>
+                      </a:extLst>
+                    </a:blip>
+                    <a:srcRect l="2737" t="4118" r="3009" b="4419"/>
+                    <a:stretch>
+                      <a:fillRect/>
+                    </a:stretch>
+                  </pic:blipFill>
+                  <pic:spPr bwMode="auto">
+                    <a:xfrm>
+                      <a:off x="0" y="0"/>
+                      <a:ext cx="5088890" cy="3897630"/>
+                    </a:xfrm>
+                    <a:prstGeom prst="rect">
+                      <a:avLst/>
+                    </a:prstGeom>
+                    <a:ln>
+                      <a:noFill/>
+                    </a:ln>
+                    <a:extLst>
+                      <a:ext uri="{53640926-AAD7-44D8-BBD7-CCE9431645EC}">
+                        <a14:shadowObscured xmlns:a14="http://schemas.microsoft.com/office/drawing/2010/main"/>
+                      </a:ext>
+                    </a:extLst>
+                  </pic:spPr>
+                </pic:pic>
+              </a:graphicData>
+            </a:graphic>
+          </wp:anchor>
+        </w:drawing>
+      </w:r>
+    </w:p>
+    <w:p>
+      <w:pPr>
+        <w:rPr>
+          <w:rFonts w:ascii="Arial" w:hAnsi="Arial" w:cs="Arial"/>
+          <w:b/>
+          <w:bCs/>
+          <w:lang w:eastAsia="es-EC"/>
+        </w:rPr>
+      </w:pPr>
+    </w:p>
+    <w:p>
+      <w:pPr>
+        <w:rPr>
+          <w:rFonts w:ascii="Arial" w:hAnsi="Arial" w:cs="Arial"/>
+          <w:lang w:eastAsia="es-EC"/>
+        </w:rPr>
+      </w:pPr>
+      <w:r>
+        <w:rPr>
+          <w:rFonts w:ascii="Arial" w:hAnsi="Arial" w:cs="Arial"/>
+          <w:lang w:eastAsia="es-EC"/>
+        </w:rPr>
+        <w:t>Arquitectura general del sistema en 3 capas (MVC). La arquitectura separa la interfaz de usuario (Vista), la gestión de casos y notificaciones (Controlador) y el almacenamiento de datos (Modelo), siguiendo el patrón MVC.</w:t>
+      </w:r>
+    </w:p>
+    <w:p>
+      <w:pPr>
+        <w:rPr>
+          <w:rFonts w:ascii="Arial" w:hAnsi="Arial" w:cs="Arial"/>
+          <w:b/>
+          <w:bCs/>
+          <w:lang w:eastAsia="es-EC"/>
+        </w:rPr>
+      </w:pPr>
+    </w:p>
+    <w:p>
+      <w:pPr>
+        <w:rPr>
+          <w:rFonts w:ascii="Arial" w:hAnsi="Arial" w:cs="Arial"/>
+          <w:b/>
+          <w:bCs/>
+          <w:lang w:eastAsia="es-EC"/>
+        </w:rPr>
+      </w:pPr>
+    </w:p>
+    <w:p>
+      <w:pPr>
+        <w:rPr>
+          <w:rFonts w:ascii="Arial" w:hAnsi="Arial" w:cs="Arial"/>
+          <w:b/>
+          <w:bCs/>
+          <w:lang w:eastAsia="es-EC"/>
+        </w:rPr>
+      </w:pPr>
+    </w:p>
+    <w:p>
+      <w:pPr>
+        <w:rPr>
+          <w:rFonts w:ascii="Arial" w:hAnsi="Arial" w:cs="Arial"/>
+          <w:b/>
+          <w:bCs/>
+          <w:lang w:eastAsia="es-EC"/>
+        </w:rPr>
+      </w:pPr>
+    </w:p>
+    <w:p>
+      <w:pPr>
+        <w:rPr>
+          <w:rFonts w:ascii="Arial" w:hAnsi="Arial" w:cs="Arial"/>
+          <w:b/>
+          <w:bCs/>
+          <w:lang w:eastAsia="es-EC"/>
+        </w:rPr>
+      </w:pPr>
+    </w:p>
+    <w:p>
+      <w:pPr>
+        <w:rPr>
+          <w:rFonts w:ascii="Arial" w:hAnsi="Arial" w:cs="Arial"/>
+          <w:b/>
+          <w:bCs/>
+          <w:lang w:eastAsia="es-EC"/>
+        </w:rPr>
+      </w:pPr>
+    </w:p>
+    <w:p>
+      <w:pPr>
+        <w:rPr>
+          <w:rFonts w:ascii="Arial" w:hAnsi="Arial" w:cs="Arial"/>
+          <w:b/>
+          <w:bCs/>
+          <w:lang w:eastAsia="es-EC"/>
+        </w:rPr>
+      </w:pPr>
+    </w:p>
+    <w:p>
+      <w:pPr>
+        <w:rPr>
+          <w:rFonts w:ascii="Arial" w:hAnsi="Arial" w:cs="Arial"/>
+          <w:b/>
+          <w:bCs/>
+          <w:lang w:eastAsia="es-EC"/>
+        </w:rPr>
+      </w:pPr>
+    </w:p>
+    <w:p>
+      <w:pPr>
+        <w:rPr>
+          <w:rFonts w:ascii="Arial" w:hAnsi="Arial" w:cs="Arial"/>
+          <w:b/>
+          <w:bCs/>
+          <w:lang w:eastAsia="es-EC"/>
+        </w:rPr>
+      </w:pPr>
+    </w:p>
+    <w:p>
+      <w:pPr>
+        <w:rPr>
+          <w:rFonts w:ascii="Arial" w:hAnsi="Arial" w:cs="Arial"/>
+          <w:b/>
+          <w:bCs/>
+          <w:lang w:eastAsia="es-EC"/>
+        </w:rPr>
+      </w:pPr>
+    </w:p>
+    <w:p>
+      <w:pPr>
+        <w:rPr>
+          <w:rFonts w:ascii="Arial" w:hAnsi="Arial" w:cs="Arial"/>
+          <w:b/>
+          <w:bCs/>
+          <w:lang w:eastAsia="es-EC"/>
+        </w:rPr>
+      </w:pPr>
+    </w:p>
+    <w:p>
+      <w:pPr>
+        <w:rPr>
+          <w:rFonts w:ascii="Arial" w:hAnsi="Arial" w:cs="Arial"/>
+          <w:b/>
+          <w:bCs/>
+          <w:lang w:eastAsia="es-EC"/>
+        </w:rPr>
+      </w:pPr>
+      <w:r>
+        <w:rPr>
+          <w:rFonts w:ascii="Arial" w:hAnsi="Arial" w:cs="Arial"/>
+          <w:b/>
+          <w:bCs/>
+          <w:lang w:eastAsia="es-EC"/>
+        </w:rPr>
+        <w:lastRenderedPageBreak/>
+        <w:t xml:space="preserve">Diagrama 2 — </w:t>
+      </w:r>
+      <w:proofErr w:type="spellStart"/>
+      <w:r>
+        <w:rPr>
+          <w:rFonts w:ascii="Arial" w:hAnsi="Arial" w:cs="Arial"/>
+          <w:b/>
+          <w:bCs/>
+          <w:lang w:eastAsia="es-EC"/>
+        </w:rPr>
+        <w:t>Gitflow</w:t>
+      </w:r>
+      <w:proofErr w:type="spellEnd"/>
+      <w:r>
+        <w:rPr>
+          <w:rFonts w:ascii="Arial" w:hAnsi="Arial" w:cs="Arial"/>
+          <w:b/>
+          <w:bCs/>
+          <w:lang w:eastAsia="es-EC"/>
+        </w:rPr>
+        <w:t>:</w:t>
+      </w:r>
+    </w:p>
+    <w:p>
+      <w:pPr>
+        <w:rPr>
+          <w:rFonts w:ascii="Arial" w:hAnsi="Arial" w:cs="Arial"/>
+          <w:b/>
+          <w:bCs/>
+          <w:lang w:eastAsia="es-EC"/>
+        </w:rPr>
+      </w:pPr>
+    </w:p>
+    <w:p>
+      <w:pPr>
+        <w:rPr>
+          <w:rFonts w:ascii="Arial" w:hAnsi="Arial" w:cs="Arial"/>
+          <w:b/>
+          <w:bCs/>
+          <w:lang w:eastAsia="es-EC"/>
+        </w:rPr>
+      </w:pPr>
+      <w:r>
+        <w:rPr>
+          <w:rFonts w:ascii="Arial" w:hAnsi="Arial" w:cs="Arial"/>
+          <w:b/>
+          <w:bCs/>
+          <w:lang w:eastAsia="es-EC"/>
+        </w:rPr>
+        <w:drawing>
+          <wp:inline distT="0" distB="0" distL="0" distR="0" wp14:anchorId="09CB2043" wp14:editId="71A22BBD">
+            <wp:extent cx="4996872" cy="2299335"/>
+            <wp:effectExtent l="0" t="0" r="0" b="5715"/>
+            <wp:docPr id="615049981" name="Imagen 1"/>
+            <wp:cNvGraphicFramePr>
+              <a:graphicFrameLocks xmlns:a="http://schemas.openxmlformats.org/drawingml/2006/main" noChangeAspect="1"/>
+            </wp:cNvGraphicFramePr>
+            <a:graphic xmlns:a="http://schemas.openxmlformats.org/drawingml/2006/main">
+              <a:graphicData uri="http://schemas.openxmlformats.org/drawingml/2006/picture">
+                <pic:pic xmlns:pic="http://schemas.openxmlformats.org/drawingml/2006/picture">
+                  <pic:nvPicPr>
+                    <pic:cNvPr id="615049981" name=""/>
+                    <pic:cNvPicPr/>
+                  </pic:nvPicPr>
+                  <pic:blipFill rotWithShape="1">
+                    <a:blip r:embed="rId17"/>
+                    <a:srcRect l="2909" t="8512" r="4518" b="9954"/>
+                    <a:stretch>
+                      <a:fillRect/>
+                    </a:stretch>
+                  </pic:blipFill>
+                  <pic:spPr bwMode="auto">
+                    <a:xfrm>
+                      <a:off x="0" y="0"/>
+                      <a:ext cx="4999017" cy="2300322"/>
+                    </a:xfrm>
+                    <a:prstGeom prst="rect">
+                      <a:avLst/>
+                    </a:prstGeom>
+                    <a:ln>
+                      <a:noFill/>
+                    </a:ln>
+                    <a:extLst>
+                      <a:ext uri="{53640926-AAD7-44D8-BBD7-CCE9431645EC}">
+                        <a14:shadowObscured xmlns:a14="http://schemas.microsoft.com/office/drawing/2010/main"/>
+                      </a:ext>
+                    </a:extLst>
+                  </pic:spPr>
+                </pic:pic>
+              </a:graphicData>
+            </a:graphic>
+          </wp:inline>
+        </w:drawing>
+      </w:r>
+    </w:p>
+    <w:p>
+      <w:pPr>
+        <w:jc w:val="both"/>
+        <w:rPr>
+          <w:rFonts w:ascii="Arial" w:hAnsi="Arial" w:cs="Arial"/>
+          <w:b/>
+          <w:bCs/>
+          <w:lang w:eastAsia="es-EC"/>
+        </w:rPr>
+      </w:pPr>
+      <w:r>
+        <w:rPr>
+          <w:rFonts w:ascii="Arial" w:hAnsi="Arial" w:cs="Arial"/>
+          <w:lang w:eastAsia="es-EC"/>
+        </w:rPr>
+        <w:t>Las funcionalidades se desarrollan en ramas </w:t>
+      </w:r>
+      <w:proofErr w:type="spellStart"/>
+      <w:r>
+        <w:rPr>
+          <w:rFonts w:ascii="Arial" w:hAnsi="Arial" w:cs="Arial"/>
+          <w:lang w:eastAsia="es-EC"/>
+        </w:rPr>
+        <w:t>feature</w:t>
+      </w:r>
+      <w:proofErr w:type="spellEnd"/>
+      <w:r>
+        <w:rPr>
+          <w:rFonts w:ascii="Arial" w:hAnsi="Arial" w:cs="Arial"/>
+          <w:lang w:eastAsia="es-EC"/>
+        </w:rPr>
+        <w:t>/*, se integran a </w:t>
+      </w:r>
+      <w:proofErr w:type="spellStart"/>
+      <w:r>
+        <w:rPr>
+          <w:rFonts w:ascii="Arial" w:hAnsi="Arial" w:cs="Arial"/>
+          <w:lang w:eastAsia="es-EC"/>
+        </w:rPr>
+        <w:t>develop</w:t>
+      </w:r>
+      <w:proofErr w:type="spellEnd"/>
+      <w:r>
+        <w:rPr>
+          <w:rFonts w:ascii="Arial" w:hAnsi="Arial" w:cs="Arial"/>
+          <w:lang w:eastAsia="es-EC"/>
+        </w:rPr>
+        <w:t xml:space="preserve"> mediante </w:t>
+      </w:r>
+      <w:proofErr w:type="spellStart"/>
+      <w:r>
+        <w:rPr>
+          <w:rFonts w:ascii="Arial" w:hAnsi="Arial" w:cs="Arial"/>
+          <w:lang w:eastAsia="es-EC"/>
+        </w:rPr>
+        <w:t>pull</w:t>
+      </w:r>
+      <w:proofErr w:type="spellEnd"/>
+      <w:r>
+        <w:rPr>
+          <w:rFonts w:ascii="Arial" w:hAnsi="Arial" w:cs="Arial"/>
+          <w:lang w:eastAsia="es-EC"/>
+        </w:rPr>
+        <w:t xml:space="preserve"> </w:t>
+      </w:r>
+      <w:proofErr w:type="spellStart"/>
+      <w:r>
+        <w:rPr>
+          <w:rFonts w:ascii="Arial" w:hAnsi="Arial" w:cs="Arial"/>
+          <w:lang w:eastAsia="es-EC"/>
+        </w:rPr>
+        <w:t>request</w:t>
+      </w:r>
+      <w:proofErr w:type="spellEnd"/>
+      <w:r>
+        <w:rPr>
+          <w:rFonts w:ascii="Arial" w:hAnsi="Arial" w:cs="Arial"/>
+          <w:lang w:eastAsia="es-EC"/>
+        </w:rPr>
+        <w:t xml:space="preserve"> y, una vez estables, se fusionan con </w:t>
+      </w:r>
+      <w:proofErr w:type="spellStart"/>
+      <w:r>
+        <w:rPr>
+          <w:rFonts w:ascii="Arial" w:hAnsi="Arial" w:cs="Arial"/>
+          <w:lang w:eastAsia="es-EC"/>
+        </w:rPr>
+        <w:t>main</w:t>
+      </w:r>
+      <w:proofErr w:type="spellEnd"/>
+      <w:r>
+        <w:rPr>
+          <w:rFonts w:ascii="Arial" w:hAnsi="Arial" w:cs="Arial"/>
+          <w:lang w:eastAsia="es-EC"/>
+        </w:rPr>
+        <w:t> generando una nueva versión</w:t>
+      </w:r>
+      <w:r>
+        <w:rPr>
+          <w:rFonts w:ascii="Arial" w:hAnsi="Arial" w:cs="Arial"/>
+          <w:b/>
+          <w:bCs/>
+          <w:lang w:eastAsia="es-EC"/>
+        </w:rPr>
+        <w:t>.</w:t>
+      </w:r>
     </w:p>
     <w:p>
       <w:pPr>
@@ -3779,7 +4786,7 @@
       </w:r>
     </w:p>
     <w:sectPr>
-      <w:headerReference w:type="first" r:id="rId16"/>
+      <w:headerReference w:type="first" r:id="rId18"/>
       <w:pgSz w:w="11906" w:h="16838"/>
       <w:pgMar w:top="1417" w:right="1701" w:bottom="1417" w:left="1701" w:header="708" w:footer="708" w:gutter="0"/>
       <w:pgNumType w:start="1"/>
@@ -4651,7 +5658,7 @@
         <v:path o:extrusionok="f" gradientshapeok="t" o:connecttype="rect"/>
         <o:lock v:ext="edit" aspectratio="t"/>
       </v:shapetype>
-      <v:shape id="_x0000_i1049" type="#_x0000_t75" style="width:11.65pt;height:11.65pt" o:bullet="t">
+      <v:shape id="_x0000_i1067" type="#_x0000_t75" style="width:11.65pt;height:11.65pt" o:bullet="t">
         <v:imagedata r:id="rId1" o:title="mso3E28"/>
       </v:shape>
     </w:pict>
@@ -5033,6 +6040,155 @@
     </w:lvl>
   </w:abstractNum>
   <w:abstractNum w:abstractNumId="3" w15:restartNumberingAfterBreak="0">
+    <w:nsid w:val="12C719F0"/>
+    <w:multiLevelType w:val="multilevel"/>
+    <w:tmpl w:val="7876DD26"/>
+    <w:lvl w:ilvl="0">
+      <w:start w:val="1"/>
+      <w:numFmt w:val="bullet"/>
+      <w:lvlText w:val=""/>
+      <w:lvlJc w:val="left"/>
+      <w:pPr>
+        <w:tabs>
+          <w:tab w:val="num" w:pos="720"/>
+        </w:tabs>
+        <w:ind w:left="720" w:hanging="360"/>
+      </w:pPr>
+      <w:rPr>
+        <w:rFonts w:ascii="Symbol" w:hAnsi="Symbol" w:hint="default"/>
+        <w:sz w:val="20"/>
+      </w:rPr>
+    </w:lvl>
+    <w:lvl w:ilvl="1" w:tentative="1">
+      <w:start w:val="1"/>
+      <w:numFmt w:val="bullet"/>
+      <w:lvlText w:val=""/>
+      <w:lvlJc w:val="left"/>
+      <w:pPr>
+        <w:tabs>
+          <w:tab w:val="num" w:pos="1440"/>
+        </w:tabs>
+        <w:ind w:left="1440" w:hanging="360"/>
+      </w:pPr>
+      <w:rPr>
+        <w:rFonts w:ascii="Symbol" w:hAnsi="Symbol" w:hint="default"/>
+        <w:sz w:val="20"/>
+      </w:rPr>
+    </w:lvl>
+    <w:lvl w:ilvl="2" w:tentative="1">
+      <w:start w:val="1"/>
+      <w:numFmt w:val="bullet"/>
+      <w:lvlText w:val=""/>
+      <w:lvlJc w:val="left"/>
+      <w:pPr>
+        <w:tabs>
+          <w:tab w:val="num" w:pos="2160"/>
+        </w:tabs>
+        <w:ind w:left="2160" w:hanging="360"/>
+      </w:pPr>
+      <w:rPr>
+        <w:rFonts w:ascii="Symbol" w:hAnsi="Symbol" w:hint="default"/>
+        <w:sz w:val="20"/>
+      </w:rPr>
+    </w:lvl>
+    <w:lvl w:ilvl="3" w:tentative="1">
+      <w:start w:val="1"/>
+      <w:numFmt w:val="bullet"/>
+      <w:lvlText w:val=""/>
+      <w:lvlJc w:val="left"/>
+      <w:pPr>
+        <w:tabs>
+          <w:tab w:val="num" w:pos="2880"/>
+        </w:tabs>
+        <w:ind w:left="2880" w:hanging="360"/>
+      </w:pPr>
+      <w:rPr>
+        <w:rFonts w:ascii="Symbol" w:hAnsi="Symbol" w:hint="default"/>
+        <w:sz w:val="20"/>
+      </w:rPr>
+    </w:lvl>
+    <w:lvl w:ilvl="4" w:tentative="1">
+      <w:start w:val="1"/>
+      <w:numFmt w:val="bullet"/>
+      <w:lvlText w:val=""/>
+      <w:lvlJc w:val="left"/>
+      <w:pPr>
+        <w:tabs>
+          <w:tab w:val="num" w:pos="3600"/>
+        </w:tabs>
+        <w:ind w:left="3600" w:hanging="360"/>
+      </w:pPr>
+      <w:rPr>
+        <w:rFonts w:ascii="Symbol" w:hAnsi="Symbol" w:hint="default"/>
+        <w:sz w:val="20"/>
+      </w:rPr>
+    </w:lvl>
+    <w:lvl w:ilvl="5" w:tentative="1">
+      <w:start w:val="1"/>
+      <w:numFmt w:val="bullet"/>
+      <w:lvlText w:val=""/>
+      <w:lvlJc w:val="left"/>
+      <w:pPr>
+        <w:tabs>
+          <w:tab w:val="num" w:pos="4320"/>
+        </w:tabs>
+        <w:ind w:left="4320" w:hanging="360"/>
+      </w:pPr>
+      <w:rPr>
+        <w:rFonts w:ascii="Symbol" w:hAnsi="Symbol" w:hint="default"/>
+        <w:sz w:val="20"/>
+      </w:rPr>
+    </w:lvl>
+    <w:lvl w:ilvl="6" w:tentative="1">
+      <w:start w:val="1"/>
+      <w:numFmt w:val="bullet"/>
+      <w:lvlText w:val=""/>
+      <w:lvlJc w:val="left"/>
+      <w:pPr>
+        <w:tabs>
+          <w:tab w:val="num" w:pos="5040"/>
+        </w:tabs>
+        <w:ind w:left="5040" w:hanging="360"/>
+      </w:pPr>
+      <w:rPr>
+        <w:rFonts w:ascii="Symbol" w:hAnsi="Symbol" w:hint="default"/>
+        <w:sz w:val="20"/>
+      </w:rPr>
+    </w:lvl>
+    <w:lvl w:ilvl="7" w:tentative="1">
+      <w:start w:val="1"/>
+      <w:numFmt w:val="bullet"/>
+      <w:lvlText w:val=""/>
+      <w:lvlJc w:val="left"/>
+      <w:pPr>
+        <w:tabs>
+          <w:tab w:val="num" w:pos="5760"/>
+        </w:tabs>
+        <w:ind w:left="5760" w:hanging="360"/>
+      </w:pPr>
+      <w:rPr>
+        <w:rFonts w:ascii="Symbol" w:hAnsi="Symbol" w:hint="default"/>
+        <w:sz w:val="20"/>
+      </w:rPr>
+    </w:lvl>
+    <w:lvl w:ilvl="8" w:tentative="1">
+      <w:start w:val="1"/>
+      <w:numFmt w:val="bullet"/>
+      <w:lvlText w:val=""/>
+      <w:lvlJc w:val="left"/>
+      <w:pPr>
+        <w:tabs>
+          <w:tab w:val="num" w:pos="6480"/>
+        </w:tabs>
+        <w:ind w:left="6480" w:hanging="360"/>
+      </w:pPr>
+      <w:rPr>
+        <w:rFonts w:ascii="Symbol" w:hAnsi="Symbol" w:hint="default"/>
+        <w:sz w:val="20"/>
+      </w:rPr>
+    </w:lvl>
+  </w:abstractNum>
+  <w:abstractNum w:abstractNumId="4" w15:restartNumberingAfterBreak="0">
     <w:nsid w:val="19254471"/>
     <w:multiLevelType w:val="hybridMultilevel"/>
     <w:tmpl w:val="EE48CFBA"/>
@@ -5146,7 +6302,7 @@
       </w:rPr>
     </w:lvl>
   </w:abstractNum>
-  <w:abstractNum w:abstractNumId="4" w15:restartNumberingAfterBreak="0">
+  <w:abstractNum w:abstractNumId="5" w15:restartNumberingAfterBreak="0">
     <w:nsid w:val="1B832556"/>
     <w:multiLevelType w:val="multilevel"/>
     <w:tmpl w:val="2E8ADAD4"/>
@@ -5295,7 +6451,7 @@
       </w:rPr>
     </w:lvl>
   </w:abstractNum>
-  <w:abstractNum w:abstractNumId="5" w15:restartNumberingAfterBreak="0">
+  <w:abstractNum w:abstractNumId="6" w15:restartNumberingAfterBreak="0">
     <w:nsid w:val="25D101E3"/>
     <w:multiLevelType w:val="hybridMultilevel"/>
     <w:tmpl w:val="1E9CC514"/>
@@ -5408,7 +6564,7 @@
       </w:rPr>
     </w:lvl>
   </w:abstractNum>
-  <w:abstractNum w:abstractNumId="6" w15:restartNumberingAfterBreak="0">
+  <w:abstractNum w:abstractNumId="7" w15:restartNumberingAfterBreak="0">
     <w:nsid w:val="26DE4B16"/>
     <w:multiLevelType w:val="multilevel"/>
     <w:tmpl w:val="9470283E"/>
@@ -5557,7 +6713,7 @@
       </w:rPr>
     </w:lvl>
   </w:abstractNum>
-  <w:abstractNum w:abstractNumId="7" w15:restartNumberingAfterBreak="0">
+  <w:abstractNum w:abstractNumId="8" w15:restartNumberingAfterBreak="0">
     <w:nsid w:val="2E8C7B01"/>
     <w:multiLevelType w:val="multilevel"/>
     <w:tmpl w:val="C17EACDC"/>
@@ -5678,7 +6834,7 @@
       </w:rPr>
     </w:lvl>
   </w:abstractNum>
-  <w:abstractNum w:abstractNumId="8" w15:restartNumberingAfterBreak="0">
+  <w:abstractNum w:abstractNumId="9" w15:restartNumberingAfterBreak="0">
     <w:nsid w:val="40DD1A90"/>
     <w:multiLevelType w:val="multilevel"/>
     <w:tmpl w:val="6E5C174A"/>
@@ -5791,7 +6947,7 @@
       </w:rPr>
     </w:lvl>
   </w:abstractNum>
-  <w:abstractNum w:abstractNumId="9" w15:restartNumberingAfterBreak="0">
+  <w:abstractNum w:abstractNumId="10" w15:restartNumberingAfterBreak="0">
     <w:nsid w:val="43722CF5"/>
     <w:multiLevelType w:val="hybridMultilevel"/>
     <w:tmpl w:val="7CCAC0E6"/>
@@ -5877,7 +7033,7 @@
       </w:pPr>
     </w:lvl>
   </w:abstractNum>
-  <w:abstractNum w:abstractNumId="10" w15:restartNumberingAfterBreak="0">
+  <w:abstractNum w:abstractNumId="11" w15:restartNumberingAfterBreak="0">
     <w:nsid w:val="4D4940A8"/>
     <w:multiLevelType w:val="hybridMultilevel"/>
     <w:tmpl w:val="4FEC69F0"/>
@@ -5991,7 +7147,7 @@
       </w:rPr>
     </w:lvl>
   </w:abstractNum>
-  <w:abstractNum w:abstractNumId="11" w15:restartNumberingAfterBreak="0">
+  <w:abstractNum w:abstractNumId="12" w15:restartNumberingAfterBreak="0">
     <w:nsid w:val="4F397A1C"/>
     <w:multiLevelType w:val="multilevel"/>
     <w:tmpl w:val="CCDA827E"/>
@@ -6140,7 +7296,7 @@
       </w:rPr>
     </w:lvl>
   </w:abstractNum>
-  <w:abstractNum w:abstractNumId="12" w15:restartNumberingAfterBreak="0">
+  <w:abstractNum w:abstractNumId="13" w15:restartNumberingAfterBreak="0">
     <w:nsid w:val="54174C12"/>
     <w:multiLevelType w:val="multilevel"/>
     <w:tmpl w:val="15B62650"/>
@@ -6271,7 +7427,7 @@
       </w:rPr>
     </w:lvl>
   </w:abstractNum>
-  <w:abstractNum w:abstractNumId="13" w15:restartNumberingAfterBreak="0">
+  <w:abstractNum w:abstractNumId="14" w15:restartNumberingAfterBreak="0">
     <w:nsid w:val="54517D06"/>
     <w:multiLevelType w:val="hybridMultilevel"/>
     <w:tmpl w:val="3DB0EB80"/>
@@ -6383,7 +7539,7 @@
       </w:rPr>
     </w:lvl>
   </w:abstractNum>
-  <w:abstractNum w:abstractNumId="14" w15:restartNumberingAfterBreak="0">
+  <w:abstractNum w:abstractNumId="15" w15:restartNumberingAfterBreak="0">
     <w:nsid w:val="68E15795"/>
     <w:multiLevelType w:val="hybridMultilevel"/>
     <w:tmpl w:val="8FE616A0"/>
@@ -6496,7 +7652,7 @@
       </w:rPr>
     </w:lvl>
   </w:abstractNum>
-  <w:abstractNum w:abstractNumId="15" w15:restartNumberingAfterBreak="0">
+  <w:abstractNum w:abstractNumId="16" w15:restartNumberingAfterBreak="0">
     <w:nsid w:val="6AFC07D3"/>
     <w:multiLevelType w:val="multilevel"/>
     <w:tmpl w:val="B3426C00"/>
@@ -6609,7 +7765,7 @@
       </w:rPr>
     </w:lvl>
   </w:abstractNum>
-  <w:abstractNum w:abstractNumId="16" w15:restartNumberingAfterBreak="0">
+  <w:abstractNum w:abstractNumId="17" w15:restartNumberingAfterBreak="0">
     <w:nsid w:val="6B7B1E92"/>
     <w:multiLevelType w:val="multilevel"/>
     <w:tmpl w:val="21BA233E"/>
@@ -6740,7 +7896,7 @@
       </w:rPr>
     </w:lvl>
   </w:abstractNum>
-  <w:abstractNum w:abstractNumId="17" w15:restartNumberingAfterBreak="0">
+  <w:abstractNum w:abstractNumId="18" w15:restartNumberingAfterBreak="0">
     <w:nsid w:val="6FA144D3"/>
     <w:multiLevelType w:val="multilevel"/>
     <w:tmpl w:val="98CEB7D6"/>
@@ -6861,7 +8017,7 @@
       </w:rPr>
     </w:lvl>
   </w:abstractNum>
-  <w:abstractNum w:abstractNumId="18" w15:restartNumberingAfterBreak="0">
+  <w:abstractNum w:abstractNumId="19" w15:restartNumberingAfterBreak="0">
     <w:nsid w:val="738344F2"/>
     <w:multiLevelType w:val="hybridMultilevel"/>
     <w:tmpl w:val="C4E037F2"/>
@@ -6976,7 +8132,7 @@
       </w:rPr>
     </w:lvl>
   </w:abstractNum>
-  <w:abstractNum w:abstractNumId="19" w15:restartNumberingAfterBreak="0">
+  <w:abstractNum w:abstractNumId="20" w15:restartNumberingAfterBreak="0">
     <w:nsid w:val="74B1685F"/>
     <w:multiLevelType w:val="hybridMultilevel"/>
     <w:tmpl w:val="943E89B2"/>
@@ -7089,7 +8245,7 @@
       </w:rPr>
     </w:lvl>
   </w:abstractNum>
-  <w:abstractNum w:abstractNumId="20" w15:restartNumberingAfterBreak="0">
+  <w:abstractNum w:abstractNumId="21" w15:restartNumberingAfterBreak="0">
     <w:nsid w:val="75DB1EAD"/>
     <w:multiLevelType w:val="multilevel"/>
     <w:tmpl w:val="F2B0D608"/>
@@ -7202,7 +8358,7 @@
       </w:rPr>
     </w:lvl>
   </w:abstractNum>
-  <w:abstractNum w:abstractNumId="21" w15:restartNumberingAfterBreak="0">
+  <w:abstractNum w:abstractNumId="22" w15:restartNumberingAfterBreak="0">
     <w:nsid w:val="765D269F"/>
     <w:multiLevelType w:val="multilevel"/>
     <w:tmpl w:val="B25854B2"/>
@@ -7315,7 +8471,7 @@
       </w:rPr>
     </w:lvl>
   </w:abstractNum>
-  <w:abstractNum w:abstractNumId="22" w15:restartNumberingAfterBreak="0">
+  <w:abstractNum w:abstractNumId="23" w15:restartNumberingAfterBreak="0">
     <w:nsid w:val="77694BC3"/>
     <w:multiLevelType w:val="hybridMultilevel"/>
     <w:tmpl w:val="8D0A3582"/>
@@ -7428,7 +8584,7 @@
       </w:rPr>
     </w:lvl>
   </w:abstractNum>
-  <w:abstractNum w:abstractNumId="23" w15:restartNumberingAfterBreak="0">
+  <w:abstractNum w:abstractNumId="24" w15:restartNumberingAfterBreak="0">
     <w:nsid w:val="7CE94054"/>
     <w:multiLevelType w:val="multilevel"/>
     <w:tmpl w:val="A4D4C1F2"/>
@@ -7543,76 +8699,79 @@
     </w:lvl>
   </w:abstractNum>
   <w:num w:numId="1" w16cid:durableId="1639728795">
-    <w:abstractNumId w:val="8"/>
+    <w:abstractNumId w:val="9"/>
   </w:num>
   <w:num w:numId="2" w16cid:durableId="1723866160">
+    <w:abstractNumId w:val="19"/>
+  </w:num>
+  <w:num w:numId="3" w16cid:durableId="1318801353">
     <w:abstractNumId w:val="18"/>
   </w:num>
-  <w:num w:numId="3" w16cid:durableId="1318801353">
+  <w:num w:numId="4" w16cid:durableId="1036586103">
+    <w:abstractNumId w:val="16"/>
+  </w:num>
+  <w:num w:numId="5" w16cid:durableId="21830215">
+    <w:abstractNumId w:val="24"/>
+  </w:num>
+  <w:num w:numId="6" w16cid:durableId="607932005">
+    <w:abstractNumId w:val="13"/>
+  </w:num>
+  <w:num w:numId="7" w16cid:durableId="1196039613">
     <w:abstractNumId w:val="17"/>
   </w:num>
-  <w:num w:numId="4" w16cid:durableId="1036586103">
-    <w:abstractNumId w:val="15"/>
-  </w:num>
-  <w:num w:numId="5" w16cid:durableId="21830215">
-    <w:abstractNumId w:val="23"/>
-  </w:num>
-  <w:num w:numId="6" w16cid:durableId="607932005">
-    <w:abstractNumId w:val="12"/>
-  </w:num>
-  <w:num w:numId="7" w16cid:durableId="1196039613">
-    <w:abstractNumId w:val="16"/>
-  </w:num>
   <w:num w:numId="8" w16cid:durableId="797795467">
-    <w:abstractNumId w:val="20"/>
+    <w:abstractNumId w:val="21"/>
   </w:num>
   <w:num w:numId="9" w16cid:durableId="1185555067">
-    <w:abstractNumId w:val="22"/>
+    <w:abstractNumId w:val="23"/>
   </w:num>
   <w:num w:numId="10" w16cid:durableId="731150931">
     <w:abstractNumId w:val="2"/>
   </w:num>
   <w:num w:numId="11" w16cid:durableId="97457085">
-    <w:abstractNumId w:val="5"/>
+    <w:abstractNumId w:val="6"/>
   </w:num>
   <w:num w:numId="12" w16cid:durableId="240261892">
-    <w:abstractNumId w:val="13"/>
+    <w:abstractNumId w:val="14"/>
   </w:num>
   <w:num w:numId="13" w16cid:durableId="936130915">
-    <w:abstractNumId w:val="7"/>
+    <w:abstractNumId w:val="8"/>
   </w:num>
   <w:num w:numId="14" w16cid:durableId="1846705042">
-    <w:abstractNumId w:val="10"/>
+    <w:abstractNumId w:val="11"/>
   </w:num>
   <w:num w:numId="15" w16cid:durableId="1824274691">
     <w:abstractNumId w:val="1"/>
   </w:num>
   <w:num w:numId="16" w16cid:durableId="422992553">
-    <w:abstractNumId w:val="19"/>
+    <w:abstractNumId w:val="20"/>
   </w:num>
   <w:num w:numId="17" w16cid:durableId="533999065">
-    <w:abstractNumId w:val="14"/>
+    <w:abstractNumId w:val="15"/>
   </w:num>
   <w:num w:numId="18" w16cid:durableId="265382296">
-    <w:abstractNumId w:val="3"/>
+    <w:abstractNumId w:val="4"/>
   </w:num>
   <w:num w:numId="19" w16cid:durableId="836992758">
-    <w:abstractNumId w:val="11"/>
+    <w:abstractNumId w:val="12"/>
   </w:num>
   <w:num w:numId="20" w16cid:durableId="1591503562">
-    <w:abstractNumId w:val="6"/>
+    <w:abstractNumId w:val="7"/>
   </w:num>
   <w:num w:numId="21" w16cid:durableId="352726194">
-    <w:abstractNumId w:val="9"/>
+    <w:abstractNumId w:val="10"/>
   </w:num>
   <w:num w:numId="22" w16cid:durableId="1404567713">
-    <w:abstractNumId w:val="21"/>
+    <w:abstractNumId w:val="22"/>
   </w:num>
   <w:num w:numId="23" w16cid:durableId="1415395502">
     <w:abstractNumId w:val="0"/>
   </w:num>
   <w:num w:numId="24" w16cid:durableId="1069420110">
-    <w:abstractNumId w:val="4"/>
+    <w:abstractNumId w:val="5"/>
+  </w:num>
+  <w:num w:numId="25" w16cid:durableId="1424062955">
+    <w:abstractNumId w:val="3"/>
   </w:num>
 </w:numbering>
 </file>

</xml_diff>

<commit_message>
Justificación de patrones de diseño
</commit_message>
<xml_diff>
--- a/Actividad-1.docx
+++ b/Actividad-1.docx
@@ -1547,7 +1547,7 @@
           <w:noProof/>
         </w:rPr>
         <w:drawing>
-          <wp:anchor distT="0" distB="0" distL="114300" distR="114300" simplePos="0" relativeHeight="251666432" behindDoc="1" locked="0" layoutInCell="1" allowOverlap="1" wp14:anchorId="3F4F3521" wp14:editId="4A1E3BDD">
+          <wp:anchor distT="0" distB="0" distL="114300" distR="114300" simplePos="0" relativeHeight="251666432" behindDoc="1" locked="0" layoutInCell="1" allowOverlap="1" wp14:anchorId="3F4F3521" wp14:editId="6512CB2C">
             <wp:simplePos x="0" y="0"/>
             <wp:positionH relativeFrom="margin">
               <wp:align>center</wp:align>
@@ -1556,7 +1556,7 @@
               <wp:posOffset>22993</wp:posOffset>
             </wp:positionV>
             <wp:extent cx="3733800" cy="3115310"/>
-            <wp:effectExtent l="0" t="0" r="0" b="8890"/>
+            <wp:effectExtent l="19050" t="19050" r="19050" b="27940"/>
             <wp:wrapNone/>
             <wp:docPr id="1858095306" name="Imagen 2"/>
             <wp:cNvGraphicFramePr>
@@ -1594,7 +1594,9 @@
                     </a:prstGeom>
                     <a:noFill/>
                     <a:ln>
-                      <a:noFill/>
+                      <a:solidFill>
+                        <a:schemeClr val="tx1"/>
+                      </a:solidFill>
                     </a:ln>
                     <a:extLst>
                       <a:ext uri="{53640926-AAD7-44D8-BBD7-CCE9431645EC}">
@@ -4154,7 +4156,7 @@
           <w:lang w:eastAsia="es-EC"/>
         </w:rPr>
         <w:drawing>
-          <wp:anchor distT="0" distB="0" distL="114300" distR="114300" simplePos="0" relativeHeight="251668480" behindDoc="1" locked="0" layoutInCell="1" allowOverlap="1" wp14:anchorId="766455EC" wp14:editId="53DC99E6">
+          <wp:anchor distT="0" distB="0" distL="114300" distR="114300" simplePos="0" relativeHeight="251668480" behindDoc="1" locked="0" layoutInCell="1" allowOverlap="1" wp14:anchorId="766455EC" wp14:editId="67D79FA4">
             <wp:simplePos x="0" y="0"/>
             <wp:positionH relativeFrom="margin">
               <wp:align>left</wp:align>
@@ -4163,7 +4165,7 @@
               <wp:posOffset>191597</wp:posOffset>
             </wp:positionV>
             <wp:extent cx="5088890" cy="3897630"/>
-            <wp:effectExtent l="0" t="0" r="0" b="7620"/>
+            <wp:effectExtent l="19050" t="19050" r="16510" b="26670"/>
             <wp:wrapSquare wrapText="bothSides"/>
             <wp:docPr id="852207863" name="Imagen 1"/>
             <wp:cNvGraphicFramePr>
@@ -4198,7 +4200,9 @@
                       <a:avLst/>
                     </a:prstGeom>
                     <a:ln>
-                      <a:noFill/>
+                      <a:solidFill>
+                        <a:schemeClr val="tx1"/>
+                      </a:solidFill>
                     </a:ln>
                     <a:extLst>
                       <a:ext uri="{53640926-AAD7-44D8-BBD7-CCE9431645EC}">
@@ -4415,9 +4419,9 @@
           <w:lang w:eastAsia="es-EC"/>
         </w:rPr>
         <w:drawing>
-          <wp:inline distT="0" distB="0" distL="0" distR="0" wp14:anchorId="09CB2043" wp14:editId="71A22BBD">
+          <wp:inline distT="0" distB="0" distL="0" distR="0" wp14:anchorId="09CB2043" wp14:editId="0F7BF98B">
             <wp:extent cx="4996872" cy="2299335"/>
-            <wp:effectExtent l="0" t="0" r="0" b="5715"/>
+            <wp:effectExtent l="19050" t="19050" r="13335" b="24765"/>
             <wp:docPr id="615049981" name="Imagen 1"/>
             <wp:cNvGraphicFramePr>
               <a:graphicFrameLocks xmlns:a="http://schemas.openxmlformats.org/drawingml/2006/main" noChangeAspect="1"/>
@@ -4445,7 +4449,9 @@
                       <a:avLst/>
                     </a:prstGeom>
                     <a:ln>
-                      <a:noFill/>
+                      <a:solidFill>
+                        <a:schemeClr val="tx1"/>
+                      </a:solidFill>
                     </a:ln>
                     <a:extLst>
                       <a:ext uri="{53640926-AAD7-44D8-BBD7-CCE9431645EC}">
@@ -4573,19 +4579,284 @@
           <w:rFonts w:ascii="Arial" w:hAnsi="Arial" w:cs="Arial"/>
           <w:b/>
           <w:bCs/>
-          <w:lang w:eastAsia="es-EC"/>
-        </w:rPr>
-      </w:pPr>
-    </w:p>
-    <w:p>
-      <w:pPr>
-        <w:rPr>
-          <w:rFonts w:ascii="Arial" w:hAnsi="Arial" w:cs="Arial"/>
-          <w:b/>
-          <w:bCs/>
-          <w:lang w:eastAsia="es-EC"/>
-        </w:rPr>
-      </w:pPr>
+          <w:lang w:val="es-ES" w:eastAsia="es-EC"/>
+        </w:rPr>
+      </w:pPr>
+      <w:r>
+        <w:rPr>
+          <w:rFonts w:ascii="Arial" w:hAnsi="Arial" w:cs="Arial"/>
+          <w:b/>
+          <w:bCs/>
+          <w:lang w:val="es-ES" w:eastAsia="es-EC"/>
+        </w:rPr>
+        <w:t>3. Aplicación de Patrones de Diseño</w:t>
+      </w:r>
+    </w:p>
+    <w:p>
+      <w:pPr>
+        <w:rPr>
+          <w:rFonts w:ascii="Arial" w:hAnsi="Arial" w:cs="Arial"/>
+          <w:b/>
+          <w:bCs/>
+          <w:lang w:val="es-ES" w:eastAsia="es-EC"/>
+        </w:rPr>
+      </w:pPr>
+      <w:r>
+        <w:rPr>
+          <w:rFonts w:ascii="Arial" w:hAnsi="Arial" w:cs="Arial"/>
+          <w:b/>
+          <w:bCs/>
+          <w:lang w:val="es-ES" w:eastAsia="es-EC"/>
+        </w:rPr>
+        <w:t>3.1 Singleton</w:t>
+      </w:r>
+    </w:p>
+    <w:p>
+      <w:pPr>
+        <w:rPr>
+          <w:rFonts w:ascii="Arial" w:hAnsi="Arial" w:cs="Arial"/>
+          <w:lang w:val="es-ES" w:eastAsia="es-EC"/>
+        </w:rPr>
+      </w:pPr>
+      <w:r>
+        <w:rPr>
+          <w:rFonts w:ascii="Arial" w:hAnsi="Arial" w:cs="Arial"/>
+          <w:lang w:val="es-ES" w:eastAsia="es-EC"/>
+        </w:rPr>
+        <w:t>Propósito: Garantizar que exista una única instancia del motor de gestión de casos y de la conexión a la base de datos.</w:t>
+      </w:r>
+    </w:p>
+    <w:p>
+      <w:pPr>
+        <w:rPr>
+          <w:rFonts w:ascii="Arial" w:hAnsi="Arial" w:cs="Arial"/>
+          <w:lang w:val="es-ES" w:eastAsia="es-EC"/>
+        </w:rPr>
+      </w:pPr>
+      <w:r>
+        <w:rPr>
+          <w:rFonts w:ascii="Arial" w:hAnsi="Arial" w:cs="Arial"/>
+          <w:lang w:val="es-ES" w:eastAsia="es-EC"/>
+        </w:rPr>
+        <w:t>Problema que resuelve: En un sistema donde varios usuarios crean casos al mismo tiempo, podrían generarse múltiples conexiones o gestores duplicados, causando conflictos e inconsistencias. Singleton asegura un único punto de acceso central y controlado.</w:t>
+      </w:r>
+    </w:p>
+    <w:p>
+      <w:pPr>
+        <w:rPr>
+          <w:rFonts w:ascii="Arial" w:hAnsi="Arial" w:cs="Arial"/>
+          <w:b/>
+          <w:bCs/>
+          <w:lang w:val="es-ES" w:eastAsia="es-EC"/>
+        </w:rPr>
+      </w:pPr>
+      <w:r>
+        <w:rPr>
+          <w:rFonts w:ascii="Arial" w:hAnsi="Arial" w:cs="Arial"/>
+          <w:b/>
+          <w:bCs/>
+          <w:lang w:val="es-ES" w:eastAsia="es-EC"/>
+        </w:rPr>
+        <w:t xml:space="preserve">3.2 </w:t>
+      </w:r>
+      <w:proofErr w:type="spellStart"/>
+      <w:r>
+        <w:rPr>
+          <w:rFonts w:ascii="Arial" w:hAnsi="Arial" w:cs="Arial"/>
+          <w:b/>
+          <w:bCs/>
+          <w:lang w:val="es-ES" w:eastAsia="es-EC"/>
+        </w:rPr>
+        <w:t>Observer</w:t>
+      </w:r>
+      <w:proofErr w:type="spellEnd"/>
+    </w:p>
+    <w:p>
+      <w:pPr>
+        <w:rPr>
+          <w:rFonts w:ascii="Arial" w:hAnsi="Arial" w:cs="Arial"/>
+          <w:lang w:val="es-ES" w:eastAsia="es-EC"/>
+        </w:rPr>
+      </w:pPr>
+      <w:r>
+        <w:rPr>
+          <w:rFonts w:ascii="Arial" w:hAnsi="Arial" w:cs="Arial"/>
+          <w:lang w:val="es-ES" w:eastAsia="es-EC"/>
+        </w:rPr>
+        <w:t>Propósito: Notificar automáticamente a los voluntarios cuando se registra un nuevo rescate.</w:t>
+      </w:r>
+    </w:p>
+    <w:p>
+      <w:pPr>
+        <w:rPr>
+          <w:rFonts w:ascii="Arial" w:hAnsi="Arial" w:cs="Arial"/>
+          <w:lang w:val="es-ES" w:eastAsia="es-EC"/>
+        </w:rPr>
+      </w:pPr>
+      <w:r>
+        <w:rPr>
+          <w:rFonts w:ascii="Arial" w:hAnsi="Arial" w:cs="Arial"/>
+          <w:lang w:val="es-ES" w:eastAsia="es-EC"/>
+        </w:rPr>
+        <w:t>Problema que resuelve: Sin este patrón, el sistema tendría que consultar constantemente si hay nuevos casos (</w:t>
+      </w:r>
+      <w:proofErr w:type="spellStart"/>
+      <w:r>
+        <w:rPr>
+          <w:rFonts w:ascii="Arial" w:hAnsi="Arial" w:cs="Arial"/>
+          <w:lang w:val="es-ES" w:eastAsia="es-EC"/>
+        </w:rPr>
+        <w:t>polling</w:t>
+      </w:r>
+      <w:proofErr w:type="spellEnd"/>
+      <w:r>
+        <w:rPr>
+          <w:rFonts w:ascii="Arial" w:hAnsi="Arial" w:cs="Arial"/>
+          <w:lang w:val="es-ES" w:eastAsia="es-EC"/>
+        </w:rPr>
+        <w:t xml:space="preserve">), consumiendo recursos innecesarios. </w:t>
+      </w:r>
+      <w:proofErr w:type="spellStart"/>
+      <w:r>
+        <w:rPr>
+          <w:rFonts w:ascii="Arial" w:hAnsi="Arial" w:cs="Arial"/>
+          <w:lang w:val="es-ES" w:eastAsia="es-EC"/>
+        </w:rPr>
+        <w:t>Observer</w:t>
+      </w:r>
+      <w:proofErr w:type="spellEnd"/>
+      <w:r>
+        <w:rPr>
+          <w:rFonts w:ascii="Arial" w:hAnsi="Arial" w:cs="Arial"/>
+          <w:lang w:val="es-ES" w:eastAsia="es-EC"/>
+        </w:rPr>
+        <w:t xml:space="preserve"> permite que los voluntarios se suscriban y reciban el aviso en el momento exacto en que ocurre el evento, siendo la base de la programación reactiva.</w:t>
+      </w:r>
+    </w:p>
+    <w:p>
+      <w:pPr>
+        <w:rPr>
+          <w:rFonts w:ascii="Arial" w:hAnsi="Arial" w:cs="Arial"/>
+          <w:b/>
+          <w:bCs/>
+          <w:lang w:val="es-ES" w:eastAsia="es-EC"/>
+        </w:rPr>
+      </w:pPr>
+      <w:r>
+        <w:rPr>
+          <w:rFonts w:ascii="Arial" w:hAnsi="Arial" w:cs="Arial"/>
+          <w:b/>
+          <w:bCs/>
+          <w:lang w:val="es-ES" w:eastAsia="es-EC"/>
+        </w:rPr>
+        <w:t>3.3 Factory Method</w:t>
+      </w:r>
+    </w:p>
+    <w:p>
+      <w:pPr>
+        <w:rPr>
+          <w:rFonts w:ascii="Arial" w:hAnsi="Arial" w:cs="Arial"/>
+          <w:lang w:val="es-ES" w:eastAsia="es-EC"/>
+        </w:rPr>
+      </w:pPr>
+      <w:r>
+        <w:rPr>
+          <w:rFonts w:ascii="Arial" w:hAnsi="Arial" w:cs="Arial"/>
+          <w:lang w:val="es-ES" w:eastAsia="es-EC"/>
+        </w:rPr>
+        <w:t>Propósito: Crear diferentes tipos de expedientes según la especie del animal (Perro, Gato, Fauna Silvestre).</w:t>
+      </w:r>
+    </w:p>
+    <w:p>
+      <w:pPr>
+        <w:rPr>
+          <w:rFonts w:ascii="Arial" w:hAnsi="Arial" w:cs="Arial"/>
+          <w:lang w:val="es-ES" w:eastAsia="es-EC"/>
+        </w:rPr>
+      </w:pPr>
+      <w:r>
+        <w:rPr>
+          <w:rFonts w:ascii="Arial" w:hAnsi="Arial" w:cs="Arial"/>
+          <w:lang w:val="es-ES" w:eastAsia="es-EC"/>
+        </w:rPr>
+        <w:t>Problema que resuelve: Cada especie maneja atributos y protocolos distintos (por ejemplo, la fauna silvestre requiere permisos especiales). Factory Method encapsula la creación de cada tipo de expediente, evita condicionales complejos y facilita agregar nuevas especies en el futuro sin modificar el código existente.</w:t>
+      </w:r>
+    </w:p>
+    <w:p>
+      <w:pPr>
+        <w:rPr>
+          <w:rFonts w:ascii="Arial" w:hAnsi="Arial" w:cs="Arial"/>
+          <w:lang w:val="es-ES" w:eastAsia="es-EC"/>
+        </w:rPr>
+      </w:pPr>
+    </w:p>
+    <w:p>
+      <w:pPr>
+        <w:rPr>
+          <w:rFonts w:ascii="Arial" w:hAnsi="Arial" w:cs="Arial"/>
+          <w:b/>
+          <w:bCs/>
+          <w:lang w:val="es-ES" w:eastAsia="es-EC"/>
+        </w:rPr>
+      </w:pPr>
+      <w:r>
+        <w:rPr>
+          <w:rFonts w:ascii="Arial" w:hAnsi="Arial" w:cs="Arial"/>
+          <w:b/>
+          <w:bCs/>
+          <w:lang w:val="es-ES" w:eastAsia="es-EC"/>
+        </w:rPr>
+        <w:lastRenderedPageBreak/>
+        <w:t>3.4 MVC (Modelo-Vista-Controlador)</w:t>
+      </w:r>
+    </w:p>
+    <w:p>
+      <w:pPr>
+        <w:rPr>
+          <w:rFonts w:ascii="Arial" w:hAnsi="Arial" w:cs="Arial"/>
+          <w:lang w:val="es-ES" w:eastAsia="es-EC"/>
+        </w:rPr>
+      </w:pPr>
+      <w:r>
+        <w:rPr>
+          <w:rFonts w:ascii="Arial" w:hAnsi="Arial" w:cs="Arial"/>
+          <w:b/>
+          <w:bCs/>
+          <w:lang w:val="es-ES" w:eastAsia="es-EC"/>
+        </w:rPr>
+        <w:t>Propósito: </w:t>
+      </w:r>
+      <w:r>
+        <w:rPr>
+          <w:rFonts w:ascii="Arial" w:hAnsi="Arial" w:cs="Arial"/>
+          <w:lang w:val="es-ES" w:eastAsia="es-EC"/>
+        </w:rPr>
+        <w:t>Separar la lógica de negocio (Modelo), la interfaz de usuario (Vista) y el control del flujo (Controlador).</w:t>
+      </w:r>
+    </w:p>
+    <w:p>
+      <w:pPr>
+        <w:rPr>
+          <w:rFonts w:ascii="Arial" w:hAnsi="Arial" w:cs="Arial"/>
+          <w:lang w:val="es-ES" w:eastAsia="es-EC"/>
+        </w:rPr>
+      </w:pPr>
+      <w:r>
+        <w:rPr>
+          <w:rFonts w:ascii="Arial" w:hAnsi="Arial" w:cs="Arial"/>
+          <w:b/>
+          <w:bCs/>
+          <w:lang w:val="es-ES" w:eastAsia="es-EC"/>
+        </w:rPr>
+        <w:t>Problema que resuelve: </w:t>
+      </w:r>
+      <w:r>
+        <w:rPr>
+          <w:rFonts w:ascii="Arial" w:hAnsi="Arial" w:cs="Arial"/>
+          <w:lang w:val="es-ES" w:eastAsia="es-EC"/>
+        </w:rPr>
+        <w:t>Sin esta separación, el código sería difícil de mantener y probar. MVC permite modificar la interfaz sin afectar la lógica de negocio y viceversa, mejorando la mantenibilidad del sistema.</w:t>
+      </w:r>
     </w:p>
     <w:p>
       <w:pPr>
@@ -5658,7 +5929,7 @@
         <v:path o:extrusionok="f" gradientshapeok="t" o:connecttype="rect"/>
         <o:lock v:ext="edit" aspectratio="t"/>
       </v:shapetype>
-      <v:shape id="_x0000_i1067" type="#_x0000_t75" style="width:11.65pt;height:11.65pt" o:bullet="t">
+      <v:shape id="_x0000_i1075" type="#_x0000_t75" style="width:11.35pt;height:11.35pt" o:bullet="t">
         <v:imagedata r:id="rId1" o:title="mso3E28"/>
       </v:shape>
     </w:pict>

</xml_diff>

<commit_message>
Diagrama de secuencia agregado
</commit_message>
<xml_diff>
--- a/Actividad-1.docx
+++ b/Actividad-1.docx
@@ -4857,6 +4857,202 @@
         </w:rPr>
         <w:t>Sin esta separación, el código sería difícil de mantener y probar. MVC permite modificar la interfaz sin afectar la lógica de negocio y viceversa, mejorando la mantenibilidad del sistema.</w:t>
       </w:r>
+    </w:p>
+    <w:p>
+      <w:pPr>
+        <w:rPr>
+          <w:rFonts w:ascii="Arial" w:hAnsi="Arial" w:cs="Arial"/>
+          <w:b/>
+          <w:bCs/>
+          <w:lang w:val="es-ES" w:eastAsia="es-EC"/>
+        </w:rPr>
+      </w:pPr>
+      <w:r>
+        <w:rPr>
+          <w:rFonts w:ascii="Arial" w:hAnsi="Arial" w:cs="Arial"/>
+          <w:b/>
+          <w:bCs/>
+          <w:lang w:val="es-ES" w:eastAsia="es-EC"/>
+        </w:rPr>
+        <w:t>Qué va en el Word (sección 4):</w:t>
+      </w:r>
+    </w:p>
+    <w:p>
+      <w:pPr>
+        <w:rPr>
+          <w:rFonts w:ascii="Arial" w:hAnsi="Arial" w:cs="Arial"/>
+          <w:b/>
+          <w:bCs/>
+          <w:lang w:val="es-ES" w:eastAsia="es-EC"/>
+        </w:rPr>
+      </w:pPr>
+      <w:r>
+        <w:rPr>
+          <w:rFonts w:ascii="Arial" w:hAnsi="Arial" w:cs="Arial"/>
+          <w:b/>
+          <w:bCs/>
+          <w:lang w:val="es-ES" w:eastAsia="es-EC"/>
+        </w:rPr>
+        <w:t>4. Diagrama de secuencia</w:t>
+      </w:r>
+    </w:p>
+    <w:p>
+      <w:pPr>
+        <w:rPr>
+          <w:rFonts w:ascii="Arial" w:hAnsi="Arial" w:cs="Arial"/>
+          <w:lang w:val="es-ES" w:eastAsia="es-EC"/>
+        </w:rPr>
+      </w:pPr>
+      <w:r>
+        <w:rPr>
+          <w:rFonts w:ascii="Arial" w:hAnsi="Arial" w:cs="Arial"/>
+          <w:lang w:val="es-ES" w:eastAsia="es-EC"/>
+        </w:rPr>
+        <w:t xml:space="preserve">El siguiente diagrama muestra el escenario "Registrar un nuevo caso de rescate", donde se aplican los patrones Singleton, Factory Method y </w:t>
+      </w:r>
+      <w:proofErr w:type="spellStart"/>
+      <w:r>
+        <w:rPr>
+          <w:rFonts w:ascii="Arial" w:hAnsi="Arial" w:cs="Arial"/>
+          <w:lang w:val="es-ES" w:eastAsia="es-EC"/>
+        </w:rPr>
+        <w:t>Observer</w:t>
+      </w:r>
+      <w:proofErr w:type="spellEnd"/>
+      <w:r>
+        <w:rPr>
+          <w:rFonts w:ascii="Arial" w:hAnsi="Arial" w:cs="Arial"/>
+          <w:lang w:val="es-ES" w:eastAsia="es-EC"/>
+        </w:rPr>
+        <w:t>.</w:t>
+      </w:r>
+    </w:p>
+    <w:p>
+      <w:pPr>
+        <w:rPr>
+          <w:rFonts w:ascii="Arial" w:hAnsi="Arial" w:cs="Arial"/>
+          <w:lang w:val="es-ES" w:eastAsia="es-EC"/>
+        </w:rPr>
+      </w:pPr>
+      <w:r>
+        <w:rPr>
+          <w:rFonts w:ascii="Arial" w:hAnsi="Arial" w:cs="Arial"/>
+          <w:i/>
+          <w:iCs/>
+          <w:lang w:val="es-ES" w:eastAsia="es-EC"/>
+        </w:rPr>
+        <w:t>(Aquí irás pegar el diagrama de secuencia)</w:t>
+      </w:r>
+    </w:p>
+    <w:p>
+      <w:pPr>
+        <w:rPr>
+          <w:rFonts w:ascii="Arial" w:hAnsi="Arial" w:cs="Arial"/>
+          <w:lang w:val="es-ES" w:eastAsia="es-EC"/>
+        </w:rPr>
+      </w:pPr>
+      <w:r>
+        <w:rPr>
+          <w:rFonts w:ascii="Arial" w:hAnsi="Arial" w:cs="Arial"/>
+          <w:lang w:val="es-ES" w:eastAsia="es-EC"/>
+        </w:rPr>
+        <w:t xml:space="preserve">Explicación: El ciudadano reporta un rescate; el Controlador solicita al Gestor de Casos (Singleton) que cree el caso; el Factory Method genera el expediente según la especie; y el </w:t>
+      </w:r>
+      <w:proofErr w:type="spellStart"/>
+      <w:r>
+        <w:rPr>
+          <w:rFonts w:ascii="Arial" w:hAnsi="Arial" w:cs="Arial"/>
+          <w:lang w:val="es-ES" w:eastAsia="es-EC"/>
+        </w:rPr>
+        <w:t>Observer</w:t>
+      </w:r>
+      <w:proofErr w:type="spellEnd"/>
+      <w:r>
+        <w:rPr>
+          <w:rFonts w:ascii="Arial" w:hAnsi="Arial" w:cs="Arial"/>
+          <w:lang w:val="es-ES" w:eastAsia="es-EC"/>
+        </w:rPr>
+        <w:t xml:space="preserve"> notifica automáticamente a los voluntarios disponibles.</w:t>
+      </w:r>
+    </w:p>
+    <w:p>
+      <w:pPr>
+        <w:rPr>
+          <w:rFonts w:ascii="Arial" w:hAnsi="Arial" w:cs="Arial"/>
+          <w:b/>
+          <w:bCs/>
+          <w:lang w:eastAsia="es-EC"/>
+        </w:rPr>
+      </w:pPr>
+      <w:r>
+        <w:rPr>
+          <w:rFonts w:ascii="Arial" w:hAnsi="Arial" w:cs="Arial"/>
+          <w:b/>
+          <w:bCs/>
+          <w:lang w:eastAsia="es-EC"/>
+        </w:rPr>
+        <w:t>Diagrama de secuencia: Registrar un nuevo caso de rescate</w:t>
+      </w:r>
+    </w:p>
+    <w:p>
+      <w:pPr>
+        <w:rPr>
+          <w:rFonts w:ascii="Arial" w:hAnsi="Arial" w:cs="Arial"/>
+          <w:b/>
+          <w:bCs/>
+          <w:lang w:eastAsia="es-EC"/>
+        </w:rPr>
+      </w:pPr>
+    </w:p>
+    <w:p>
+      <w:pPr>
+        <w:rPr>
+          <w:rFonts w:ascii="Arial" w:hAnsi="Arial" w:cs="Arial"/>
+          <w:b/>
+          <w:bCs/>
+          <w:lang w:eastAsia="es-EC"/>
+        </w:rPr>
+      </w:pPr>
+    </w:p>
+    <w:p>
+      <w:pPr>
+        <w:rPr>
+          <w:rFonts w:ascii="Arial" w:hAnsi="Arial" w:cs="Arial"/>
+          <w:b/>
+          <w:bCs/>
+          <w:lang w:eastAsia="es-EC"/>
+        </w:rPr>
+      </w:pPr>
+    </w:p>
+    <w:p>
+      <w:pPr>
+        <w:rPr>
+          <w:rFonts w:ascii="Arial" w:hAnsi="Arial" w:cs="Arial"/>
+          <w:b/>
+          <w:bCs/>
+          <w:lang w:eastAsia="es-EC"/>
+        </w:rPr>
+      </w:pPr>
+    </w:p>
+    <w:p>
+      <w:pPr>
+        <w:rPr>
+          <w:rFonts w:ascii="Arial" w:hAnsi="Arial" w:cs="Arial"/>
+          <w:b/>
+          <w:bCs/>
+          <w:lang w:eastAsia="es-EC"/>
+        </w:rPr>
+      </w:pPr>
+    </w:p>
+    <w:p>
+      <w:pPr>
+        <w:rPr>
+          <w:rFonts w:ascii="Arial" w:hAnsi="Arial" w:cs="Arial"/>
+          <w:b/>
+          <w:bCs/>
+          <w:lang w:eastAsia="es-EC"/>
+        </w:rPr>
+      </w:pPr>
     </w:p>
     <w:p>
       <w:pPr>
@@ -5929,7 +6125,7 @@
         <v:path o:extrusionok="f" gradientshapeok="t" o:connecttype="rect"/>
         <o:lock v:ext="edit" aspectratio="t"/>
       </v:shapetype>
-      <v:shape id="_x0000_i1075" type="#_x0000_t75" style="width:11.35pt;height:11.35pt" o:bullet="t">
+      <v:shape id="_x0000_i1086" type="#_x0000_t75" style="width:11.35pt;height:11.35pt" o:bullet="t">
         <v:imagedata r:id="rId1" o:title="mso3E28"/>
       </v:shape>
     </w:pict>

</xml_diff>

<commit_message>
Justificación de Gitflow con capturas
</commit_message>
<xml_diff>
--- a/Actividad-1.docx
+++ b/Actividad-1.docx
@@ -4991,8 +4991,243 @@
           <w:bCs/>
           <w:lang w:eastAsia="es-EC"/>
         </w:rPr>
+        <w:drawing>
+          <wp:anchor distT="0" distB="0" distL="114300" distR="114300" simplePos="0" relativeHeight="251669504" behindDoc="0" locked="0" layoutInCell="1" allowOverlap="1" wp14:anchorId="27A4090F" wp14:editId="4709C314">
+            <wp:simplePos x="0" y="0"/>
+            <wp:positionH relativeFrom="margin">
+              <wp:align>right</wp:align>
+            </wp:positionH>
+            <wp:positionV relativeFrom="paragraph">
+              <wp:posOffset>320675</wp:posOffset>
+            </wp:positionV>
+            <wp:extent cx="5400040" cy="3387725"/>
+            <wp:effectExtent l="19050" t="19050" r="10160" b="22225"/>
+            <wp:wrapSquare wrapText="bothSides"/>
+            <wp:docPr id="266630353" name="Imagen 1"/>
+            <wp:cNvGraphicFramePr>
+              <a:graphicFrameLocks xmlns:a="http://schemas.openxmlformats.org/drawingml/2006/main" noChangeAspect="1"/>
+            </wp:cNvGraphicFramePr>
+            <a:graphic xmlns:a="http://schemas.openxmlformats.org/drawingml/2006/main">
+              <a:graphicData uri="http://schemas.openxmlformats.org/drawingml/2006/picture">
+                <pic:pic xmlns:pic="http://schemas.openxmlformats.org/drawingml/2006/picture">
+                  <pic:nvPicPr>
+                    <pic:cNvPr id="266630353" name=""/>
+                    <pic:cNvPicPr/>
+                  </pic:nvPicPr>
+                  <pic:blipFill>
+                    <a:blip r:embed="rId18" cstate="print">
+                      <a:extLst>
+                        <a:ext uri="{28A0092B-C50C-407E-A947-70E740481C1C}">
+                          <a14:useLocalDpi xmlns:a14="http://schemas.microsoft.com/office/drawing/2010/main" val="0"/>
+                        </a:ext>
+                      </a:extLst>
+                    </a:blip>
+                    <a:stretch>
+                      <a:fillRect/>
+                    </a:stretch>
+                  </pic:blipFill>
+                  <pic:spPr>
+                    <a:xfrm>
+                      <a:off x="0" y="0"/>
+                      <a:ext cx="5400040" cy="3387725"/>
+                    </a:xfrm>
+                    <a:prstGeom prst="rect">
+                      <a:avLst/>
+                    </a:prstGeom>
+                    <a:ln>
+                      <a:solidFill>
+                        <a:schemeClr val="tx1"/>
+                      </a:solidFill>
+                    </a:ln>
+                  </pic:spPr>
+                </pic:pic>
+              </a:graphicData>
+            </a:graphic>
+          </wp:anchor>
+        </w:drawing>
+      </w:r>
+      <w:r>
+        <w:rPr>
+          <w:rFonts w:ascii="Arial" w:hAnsi="Arial" w:cs="Arial"/>
+          <w:b/>
+          <w:bCs/>
+          <w:lang w:eastAsia="es-EC"/>
+        </w:rPr>
         <w:t>Diagrama de secuencia: Registrar un nuevo caso de rescate</w:t>
       </w:r>
+    </w:p>
+    <w:p>
+      <w:pPr>
+        <w:rPr>
+          <w:rFonts w:ascii="Arial" w:hAnsi="Arial" w:cs="Arial"/>
+          <w:b/>
+          <w:bCs/>
+          <w:lang w:eastAsia="es-EC"/>
+        </w:rPr>
+      </w:pPr>
+    </w:p>
+    <w:p>
+      <w:pPr>
+        <w:jc w:val="both"/>
+        <w:rPr>
+          <w:rFonts w:ascii="Arial" w:hAnsi="Arial" w:cs="Arial"/>
+          <w:lang w:eastAsia="es-EC"/>
+        </w:rPr>
+      </w:pPr>
+      <w:r>
+        <w:rPr>
+          <w:rFonts w:ascii="Arial" w:hAnsi="Arial" w:cs="Arial"/>
+          <w:lang w:eastAsia="es-EC"/>
+        </w:rPr>
+        <w:t>El diagrama muestra el flujo completo desde que el ciudadano reporta un rescate hasta que se notifica al voluntario. En el proceso se aplican tres patrones: Singleton (única instancia del Gestor de Casos), Factory Method (creación del expediente según la especie) y </w:t>
+      </w:r>
+      <w:proofErr w:type="spellStart"/>
+      <w:r>
+        <w:rPr>
+          <w:rFonts w:ascii="Arial" w:hAnsi="Arial" w:cs="Arial"/>
+          <w:lang w:eastAsia="es-EC"/>
+        </w:rPr>
+        <w:t>Observer</w:t>
+      </w:r>
+      <w:proofErr w:type="spellEnd"/>
+      <w:r>
+        <w:rPr>
+          <w:rFonts w:ascii="Arial" w:hAnsi="Arial" w:cs="Arial"/>
+          <w:lang w:eastAsia="es-EC"/>
+        </w:rPr>
+        <w:t> (notificación automática a los voluntarios suscritos).</w:t>
+      </w:r>
+    </w:p>
+    <w:p>
+      <w:pPr>
+        <w:rPr>
+          <w:rFonts w:ascii="Arial" w:hAnsi="Arial" w:cs="Arial"/>
+          <w:b/>
+          <w:bCs/>
+          <w:lang w:eastAsia="es-EC"/>
+        </w:rPr>
+      </w:pPr>
+    </w:p>
+    <w:p>
+      <w:pPr>
+        <w:rPr>
+          <w:rFonts w:ascii="Arial" w:hAnsi="Arial" w:cs="Arial"/>
+          <w:b/>
+          <w:bCs/>
+          <w:lang w:eastAsia="es-EC"/>
+        </w:rPr>
+      </w:pPr>
+      <w:r>
+        <w:rPr>
+          <w:noProof/>
+        </w:rPr>
+        <mc:AlternateContent>
+          <mc:Choice Requires="wps">
+            <w:drawing>
+              <wp:inline distT="0" distB="0" distL="0" distR="0" wp14:anchorId="2C2BFEBC" wp14:editId="5060C0E4">
+                <wp:extent cx="300990" cy="300990"/>
+                <wp:effectExtent l="0" t="0" r="0" b="0"/>
+                <wp:docPr id="2045810770" name="Rectángulo 3"/>
+                <wp:cNvGraphicFramePr>
+                  <a:graphicFrameLocks xmlns:a="http://schemas.openxmlformats.org/drawingml/2006/main" noChangeAspect="1"/>
+                </wp:cNvGraphicFramePr>
+                <a:graphic xmlns:a="http://schemas.openxmlformats.org/drawingml/2006/main">
+                  <a:graphicData uri="http://schemas.microsoft.com/office/word/2010/wordprocessingShape">
+                    <wps:wsp>
+                      <wps:cNvSpPr>
+                        <a:spLocks noChangeAspect="1" noChangeArrowheads="1"/>
+                      </wps:cNvSpPr>
+                      <wps:spPr bwMode="auto">
+                        <a:xfrm>
+                          <a:off x="0" y="0"/>
+                          <a:ext cx="300990" cy="300990"/>
+                        </a:xfrm>
+                        <a:prstGeom prst="rect">
+                          <a:avLst/>
+                        </a:prstGeom>
+                        <a:noFill/>
+                        <a:ln>
+                          <a:noFill/>
+                        </a:ln>
+                        <a:extLst>
+                          <a:ext uri="{909E8E84-426E-40DD-AFC4-6F175D3DCCD1}">
+                            <a14:hiddenFill xmlns:a14="http://schemas.microsoft.com/office/drawing/2010/main">
+                              <a:solidFill>
+                                <a:srgbClr val="FFFFFF"/>
+                              </a:solidFill>
+                            </a14:hiddenFill>
+                          </a:ext>
+                          <a:ext uri="{91240B29-F687-4F45-9708-019B960494DF}">
+                            <a14:hiddenLine xmlns:a14="http://schemas.microsoft.com/office/drawing/2010/main" w="9525">
+                              <a:solidFill>
+                                <a:srgbClr val="000000"/>
+                              </a:solidFill>
+                              <a:miter lim="800000"/>
+                              <a:headEnd/>
+                              <a:tailEnd/>
+                            </a14:hiddenLine>
+                          </a:ext>
+                        </a:extLst>
+                      </wps:spPr>
+                      <wps:bodyPr rot="0" vert="horz" wrap="square" lIns="91440" tIns="45720" rIns="91440" bIns="45720" anchor="t" anchorCtr="0" upright="1">
+                        <a:noAutofit/>
+                      </wps:bodyPr>
+                    </wps:wsp>
+                  </a:graphicData>
+                </a:graphic>
+              </wp:inline>
+            </w:drawing>
+          </mc:Choice>
+          <mc:Fallback>
+            <w:pict>
+              <v:rect w14:anchorId="34C91DA5" id="Rectángulo 3" o:spid="_x0000_s1026" style="width:23.7pt;height:23.7pt;visibility:visible;mso-wrap-style:square;mso-left-percent:-10001;mso-top-percent:-10001;mso-position-horizontal:absolute;mso-position-horizontal-relative:char;mso-position-vertical:absolute;mso-position-vertical-relative:line;mso-left-percent:-10001;mso-top-percent:-10001;v-text-anchor:top" o:gfxdata="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" filled="f" stroked="f">
+                <o:lock v:ext="edit" aspectratio="t"/>
+                <w10:anchorlock/>
+              </v:rect>
+            </w:pict>
+          </mc:Fallback>
+        </mc:AlternateContent>
+      </w:r>
+    </w:p>
+    <w:p>
+      <w:pPr>
+        <w:rPr>
+          <w:rFonts w:ascii="Arial" w:hAnsi="Arial" w:cs="Arial"/>
+          <w:b/>
+          <w:bCs/>
+          <w:lang w:eastAsia="es-EC"/>
+        </w:rPr>
+      </w:pPr>
+    </w:p>
+    <w:p>
+      <w:pPr>
+        <w:rPr>
+          <w:rFonts w:ascii="Arial" w:hAnsi="Arial" w:cs="Arial"/>
+          <w:b/>
+          <w:bCs/>
+          <w:lang w:eastAsia="es-EC"/>
+        </w:rPr>
+      </w:pPr>
+    </w:p>
+    <w:p>
+      <w:pPr>
+        <w:rPr>
+          <w:rFonts w:ascii="Arial" w:hAnsi="Arial" w:cs="Arial"/>
+          <w:b/>
+          <w:bCs/>
+          <w:lang w:eastAsia="es-EC"/>
+        </w:rPr>
+      </w:pPr>
+    </w:p>
+    <w:p>
+      <w:pPr>
+        <w:rPr>
+          <w:rFonts w:ascii="Arial" w:hAnsi="Arial" w:cs="Arial"/>
+          <w:b/>
+          <w:bCs/>
+          <w:lang w:eastAsia="es-EC"/>
+        </w:rPr>
+      </w:pPr>
     </w:p>
     <w:p>
       <w:pPr>
@@ -5253,7 +5488,7 @@
       </w:r>
     </w:p>
     <w:sectPr>
-      <w:headerReference w:type="first" r:id="rId18"/>
+      <w:headerReference w:type="first" r:id="rId19"/>
       <w:pgSz w:w="11906" w:h="16838"/>
       <w:pgMar w:top="1417" w:right="1701" w:bottom="1417" w:left="1701" w:header="708" w:footer="708" w:gutter="0"/>
       <w:pgNumType w:start="1"/>
@@ -6125,7 +6360,7 @@
         <v:path o:extrusionok="f" gradientshapeok="t" o:connecttype="rect"/>
         <o:lock v:ext="edit" aspectratio="t"/>
       </v:shapetype>
-      <v:shape id="_x0000_i1086" type="#_x0000_t75" style="width:11.35pt;height:11.35pt" o:bullet="t">
+      <v:shape id="_x0000_i1092" type="#_x0000_t75" style="width:11.35pt;height:11.35pt" o:bullet="t">
         <v:imagedata r:id="rId1" o:title="mso3E28"/>
       </v:shape>
     </w:pict>

</xml_diff>

<commit_message>
Correcciones de formato y numeración del documento
</commit_message>
<xml_diff>
--- a/Actividad-1.docx
+++ b/Actividad-1.docx
@@ -291,47 +291,16 @@
         <w:rPr>
           <w:sz w:val="28"/>
           <w:szCs w:val="28"/>
+          <w:lang w:val="es-ES"/>
         </w:rPr>
       </w:pPr>
       <w:r>
         <w:rPr>
           <w:sz w:val="28"/>
           <w:szCs w:val="28"/>
-        </w:rPr>
-        <w:t>Ing.</w:t>
-      </w:r>
-      <w:r>
-        <w:t xml:space="preserve"> </w:t>
-      </w:r>
-      <w:r>
-        <w:rPr>
-          <w:sz w:val="28"/>
-          <w:szCs w:val="28"/>
-        </w:rPr>
-        <w:t>Roly Steeven Cedeño Menéndez</w:t>
-      </w:r>
-      <w:r>
-        <w:rPr>
-          <w:sz w:val="28"/>
-          <w:szCs w:val="28"/>
-        </w:rPr>
-        <w:t xml:space="preserve">, </w:t>
-      </w:r>
-      <w:proofErr w:type="spellStart"/>
-      <w:r>
-        <w:rPr>
-          <w:sz w:val="28"/>
-          <w:szCs w:val="28"/>
-        </w:rPr>
-        <w:t>Mtr</w:t>
-      </w:r>
-      <w:proofErr w:type="spellEnd"/>
-      <w:r>
-        <w:rPr>
-          <w:sz w:val="28"/>
-          <w:szCs w:val="28"/>
-        </w:rPr>
-        <w:t>.</w:t>
+          <w:lang w:val="es-ES"/>
+        </w:rPr>
+        <w:t>Ing. Jorge Arun Zambrano Cedeño</w:t>
       </w:r>
     </w:p>
     <w:tbl>
@@ -479,7 +448,7 @@
                 <w:kern w:val="24"/>
                 <w:lang w:val="es-ES_tradnl"/>
               </w:rPr>
-              <w:t>Quinto</w:t>
+              <w:t>Sexto</w:t>
             </w:r>
           </w:p>
         </w:tc>
@@ -533,6 +502,22 @@
         </w:rPr>
         <w:t xml:space="preserve">: </w:t>
       </w:r>
+      <w:proofErr w:type="spellStart"/>
+      <w:r>
+        <w:rPr>
+          <w:b/>
+          <w:bCs/>
+        </w:rPr>
+        <w:t>Jordan</w:t>
+      </w:r>
+      <w:proofErr w:type="spellEnd"/>
+      <w:r>
+        <w:rPr>
+          <w:b/>
+          <w:bCs/>
+        </w:rPr>
+        <w:t xml:space="preserve"> Enrique Santillan Zambrano</w:t>
+      </w:r>
     </w:p>
     <w:p>
       <w:pPr>
@@ -553,6 +538,13 @@
         </w:rPr>
         <w:t>PARALELO:</w:t>
       </w:r>
+      <w:r>
+        <w:rPr>
+          <w:b/>
+          <w:bCs/>
+        </w:rPr>
+        <w:t xml:space="preserve"> A</w:t>
+      </w:r>
     </w:p>
     <w:p>
       <w:r>
@@ -576,6 +568,13 @@
         </w:rPr>
         <w:t>SEMESTRE:</w:t>
       </w:r>
+      <w:r>
+        <w:rPr>
+          <w:b/>
+          <w:bCs/>
+        </w:rPr>
+        <w:t xml:space="preserve"> 6 semestre</w:t>
+      </w:r>
     </w:p>
     <w:p>
       <w:pPr>
@@ -587,6 +586,7 @@
         <w:rPr>
           <w:b/>
           <w:bCs/>
+          <w:lang w:val="es-ES"/>
         </w:rPr>
       </w:pPr>
       <w:r>
@@ -596,6 +596,36 @@
         </w:rPr>
         <w:t>ACTIVIDAD:</w:t>
       </w:r>
+      <w:r>
+        <w:rPr>
+          <w:b/>
+          <w:bCs/>
+        </w:rPr>
+        <w:t xml:space="preserve"> 1</w:t>
+      </w:r>
+      <w:r>
+        <w:rPr>
+          <w:b/>
+          <w:bCs/>
+        </w:rPr>
+        <w:t xml:space="preserve"> </w:t>
+      </w:r>
+      <w:r>
+        <w:rPr>
+          <w:b/>
+          <w:bCs/>
+          <w:lang w:val="es-ES"/>
+        </w:rPr>
+        <w:t>Estudio de Caso - Sistema de Control de Rescate y Adopción Animal</w:t>
+      </w:r>
+    </w:p>
+    <w:p>
+      <w:pPr>
+        <w:rPr>
+          <w:b/>
+          <w:bCs/>
+        </w:rPr>
+      </w:pPr>
     </w:p>
     <w:p>
       <w:pPr>
@@ -1033,85 +1063,32 @@
           <w:bCs/>
           <w:lang w:eastAsia="es-EC"/>
         </w:rPr>
-        <w:t xml:space="preserve">Actividad # </w:t>
-      </w:r>
-      <w:r>
-        <w:rPr>
-          <w:rFonts w:ascii="Arial" w:hAnsi="Arial" w:cs="Arial"/>
-          <w:b/>
-          <w:bCs/>
-          <w:lang w:eastAsia="es-EC"/>
-        </w:rPr>
-        <w:t>________</w:t>
-      </w:r>
-    </w:p>
-    <w:p>
-      <w:pPr>
-        <w:widowControl w:val="0"/>
-        <w:pBdr>
-          <w:top w:val="nil"/>
-          <w:left w:val="nil"/>
-          <w:bottom w:val="nil"/>
-          <w:right w:val="nil"/>
-          <w:between w:val="nil"/>
-        </w:pBdr>
-        <w:spacing w:after="0" w:line="240" w:lineRule="auto"/>
-        <w:jc w:val="both"/>
-        <w:rPr>
-          <w:rFonts w:ascii="Arial" w:hAnsi="Arial" w:cs="Arial"/>
-          <w:i/>
-          <w:iCs/>
-          <w:sz w:val="20"/>
-          <w:szCs w:val="20"/>
-          <w:lang w:eastAsia="es-EC"/>
-        </w:rPr>
-      </w:pPr>
-      <w:r>
-        <w:rPr>
-          <w:rFonts w:ascii="Arial" w:hAnsi="Arial" w:cs="Arial"/>
-          <w:i/>
-          <w:iCs/>
-          <w:sz w:val="20"/>
-          <w:szCs w:val="20"/>
-          <w:lang w:eastAsia="es-EC"/>
-        </w:rPr>
-        <w:t>(Desarrollo de la actividad</w:t>
-      </w:r>
-      <w:r>
-        <w:rPr>
-          <w:rFonts w:ascii="Arial" w:hAnsi="Arial" w:cs="Arial"/>
-          <w:i/>
-          <w:iCs/>
-          <w:sz w:val="20"/>
-          <w:szCs w:val="20"/>
-          <w:lang w:eastAsia="es-EC"/>
-        </w:rPr>
-        <w:t xml:space="preserve"> propuesta</w:t>
-      </w:r>
-      <w:r>
-        <w:rPr>
-          <w:rFonts w:ascii="Arial" w:hAnsi="Arial" w:cs="Arial"/>
-          <w:i/>
-          <w:iCs/>
-          <w:sz w:val="20"/>
-          <w:szCs w:val="20"/>
-          <w:lang w:eastAsia="es-EC"/>
-        </w:rPr>
-        <w:t>)</w:t>
-      </w:r>
-    </w:p>
-    <w:p>
-      <w:pPr>
-        <w:pStyle w:val="Sinespaciado"/>
-        <w:spacing w:line="360" w:lineRule="auto"/>
-        <w:jc w:val="both"/>
-        <w:rPr>
-          <w:rFonts w:ascii="Arial" w:hAnsi="Arial" w:cs="Arial"/>
-          <w:b/>
-          <w:bCs/>
-          <w:lang w:eastAsia="es-EC"/>
-        </w:rPr>
-      </w:pPr>
+        <w:t>Actividad # 1</w:t>
+      </w:r>
+    </w:p>
+    <w:p>
+      <w:pPr>
+        <w:pStyle w:val="Prrafodelista"/>
+        <w:numPr>
+          <w:ilvl w:val="1"/>
+          <w:numId w:val="22"/>
+        </w:numPr>
+        <w:rPr>
+          <w:rFonts w:ascii="Arial" w:hAnsi="Arial" w:cs="Arial"/>
+          <w:b/>
+          <w:bCs/>
+          <w:lang w:val="es-ES"/>
+        </w:rPr>
+      </w:pPr>
+      <w:r>
+        <w:rPr>
+          <w:rFonts w:ascii="Arial" w:hAnsi="Arial" w:cs="Arial"/>
+          <w:b/>
+          <w:bCs/>
+          <w:lang w:val="es-ES"/>
+        </w:rPr>
+        <w:t>1. Análisis del problema</w:t>
+      </w:r>
     </w:p>
     <w:p>
       <w:pPr>
@@ -1503,61 +1480,1305 @@
           <w:lang w:eastAsia="es-EC"/>
         </w:rPr>
       </w:pPr>
-      <w:r>
+    </w:p>
+    <w:p>
+      <w:pPr>
+        <w:rPr>
+          <w:rFonts w:ascii="Arial" w:hAnsi="Arial" w:cs="Arial"/>
+          <w:b/>
+          <w:bCs/>
+          <w:lang w:val="es-ES" w:eastAsia="es-EC"/>
+        </w:rPr>
+      </w:pPr>
+      <w:r>
+        <w:rPr>
+          <w:rFonts w:ascii="Arial" w:hAnsi="Arial" w:cs="Arial"/>
+          <w:b/>
+          <w:bCs/>
+          <w:lang w:val="es-ES" w:eastAsia="es-EC"/>
+        </w:rPr>
+        <w:t>1.2 Requerimientos funcionales</w:t>
+      </w:r>
+    </w:p>
+    <w:tbl>
+      <w:tblPr>
+        <w:tblW w:w="10010" w:type="dxa"/>
+        <w:tblInd w:w="-772" w:type="dxa"/>
+        <w:tblBorders>
+          <w:top w:val="single" w:sz="2" w:space="0" w:color="auto"/>
+          <w:left w:val="single" w:sz="2" w:space="0" w:color="auto"/>
+          <w:bottom w:val="single" w:sz="2" w:space="0" w:color="auto"/>
+          <w:right w:val="single" w:sz="2" w:space="0" w:color="auto"/>
+        </w:tblBorders>
+        <w:tblCellMar>
+          <w:left w:w="0" w:type="dxa"/>
+          <w:right w:w="0" w:type="dxa"/>
+        </w:tblCellMar>
+        <w:tblLook w:val="04A0" w:firstRow="1" w:lastRow="0" w:firstColumn="1" w:lastColumn="0" w:noHBand="0" w:noVBand="1"/>
+      </w:tblPr>
+      <w:tblGrid>
+        <w:gridCol w:w="963"/>
+        <w:gridCol w:w="9047"/>
+      </w:tblGrid>
+      <w:tr>
+        <w:trPr>
+          <w:trHeight w:val="192"/>
+          <w:tblHeader/>
+        </w:trPr>
+        <w:tc>
+          <w:tcPr>
+            <w:tcW w:w="0" w:type="auto"/>
+            <w:tcBorders>
+              <w:top w:val="single" w:sz="2" w:space="0" w:color="auto"/>
+              <w:left w:val="single" w:sz="2" w:space="0" w:color="auto"/>
+              <w:bottom w:val="single" w:sz="4" w:space="0" w:color="auto"/>
+              <w:right w:val="single" w:sz="2" w:space="0" w:color="auto"/>
+            </w:tcBorders>
+            <w:shd w:val="clear" w:color="auto" w:fill="A3DBFF"/>
+            <w:tcMar>
+              <w:top w:w="180" w:type="dxa"/>
+              <w:left w:w="180" w:type="dxa"/>
+              <w:bottom w:w="180" w:type="dxa"/>
+              <w:right w:w="180" w:type="dxa"/>
+            </w:tcMar>
+            <w:hideMark/>
+          </w:tcPr>
+          <w:p>
+            <w:pPr>
+              <w:rPr>
+                <w:rFonts w:ascii="Arial" w:hAnsi="Arial" w:cs="Arial"/>
+                <w:b/>
+                <w:bCs/>
+                <w:lang w:val="es-ES" w:eastAsia="es-EC"/>
+              </w:rPr>
+            </w:pPr>
+            <w:r>
+              <w:rPr>
+                <w:rFonts w:ascii="Arial" w:hAnsi="Arial" w:cs="Arial"/>
+                <w:b/>
+                <w:bCs/>
+                <w:lang w:val="es-ES" w:eastAsia="es-EC"/>
+              </w:rPr>
+              <w:t>ID</w:t>
+            </w:r>
+          </w:p>
+        </w:tc>
+        <w:tc>
+          <w:tcPr>
+            <w:tcW w:w="0" w:type="auto"/>
+            <w:tcBorders>
+              <w:top w:val="single" w:sz="2" w:space="0" w:color="auto"/>
+              <w:left w:val="single" w:sz="2" w:space="0" w:color="auto"/>
+              <w:bottom w:val="single" w:sz="4" w:space="0" w:color="auto"/>
+              <w:right w:val="single" w:sz="2" w:space="0" w:color="auto"/>
+            </w:tcBorders>
+            <w:shd w:val="clear" w:color="auto" w:fill="A3DBFF"/>
+            <w:tcMar>
+              <w:top w:w="180" w:type="dxa"/>
+              <w:left w:w="180" w:type="dxa"/>
+              <w:bottom w:w="180" w:type="dxa"/>
+              <w:right w:w="180" w:type="dxa"/>
+            </w:tcMar>
+            <w:hideMark/>
+          </w:tcPr>
+          <w:p>
+            <w:pPr>
+              <w:rPr>
+                <w:rFonts w:ascii="Arial" w:hAnsi="Arial" w:cs="Arial"/>
+                <w:b/>
+                <w:bCs/>
+                <w:lang w:val="es-ES" w:eastAsia="es-EC"/>
+              </w:rPr>
+            </w:pPr>
+            <w:r>
+              <w:rPr>
+                <w:rFonts w:ascii="Arial" w:hAnsi="Arial" w:cs="Arial"/>
+                <w:b/>
+                <w:bCs/>
+                <w:lang w:val="es-ES" w:eastAsia="es-EC"/>
+              </w:rPr>
+              <w:t>Requerimiento</w:t>
+            </w:r>
+          </w:p>
+        </w:tc>
+      </w:tr>
+      <w:tr>
+        <w:trPr>
+          <w:trHeight w:val="414"/>
+        </w:trPr>
+        <w:tc>
+          <w:tcPr>
+            <w:tcW w:w="0" w:type="auto"/>
+            <w:tcBorders>
+              <w:top w:val="single" w:sz="2" w:space="0" w:color="auto"/>
+              <w:left w:val="single" w:sz="2" w:space="0" w:color="auto"/>
+              <w:bottom w:val="single" w:sz="4" w:space="0" w:color="auto"/>
+              <w:right w:val="single" w:sz="2" w:space="0" w:color="auto"/>
+            </w:tcBorders>
+            <w:shd w:val="clear" w:color="auto" w:fill="A3DBFF"/>
+            <w:tcMar>
+              <w:top w:w="180" w:type="dxa"/>
+              <w:left w:w="180" w:type="dxa"/>
+              <w:bottom w:w="180" w:type="dxa"/>
+              <w:right w:w="180" w:type="dxa"/>
+            </w:tcMar>
+            <w:hideMark/>
+          </w:tcPr>
+          <w:p>
+            <w:pPr>
+              <w:rPr>
+                <w:rFonts w:ascii="Arial" w:hAnsi="Arial" w:cs="Arial"/>
+                <w:b/>
+                <w:bCs/>
+                <w:lang w:val="es-ES" w:eastAsia="es-EC"/>
+              </w:rPr>
+            </w:pPr>
+            <w:r>
+              <w:rPr>
+                <w:rFonts w:ascii="Arial" w:hAnsi="Arial" w:cs="Arial"/>
+                <w:b/>
+                <w:bCs/>
+                <w:lang w:val="es-ES" w:eastAsia="es-EC"/>
+              </w:rPr>
+              <w:t>RF-01</w:t>
+            </w:r>
+          </w:p>
+        </w:tc>
+        <w:tc>
+          <w:tcPr>
+            <w:tcW w:w="0" w:type="auto"/>
+            <w:tcBorders>
+              <w:top w:val="single" w:sz="2" w:space="0" w:color="auto"/>
+              <w:left w:val="single" w:sz="2" w:space="0" w:color="auto"/>
+              <w:bottom w:val="single" w:sz="4" w:space="0" w:color="auto"/>
+              <w:right w:val="single" w:sz="2" w:space="0" w:color="auto"/>
+            </w:tcBorders>
+            <w:tcMar>
+              <w:top w:w="180" w:type="dxa"/>
+              <w:left w:w="180" w:type="dxa"/>
+              <w:bottom w:w="180" w:type="dxa"/>
+              <w:right w:w="180" w:type="dxa"/>
+            </w:tcMar>
+            <w:hideMark/>
+          </w:tcPr>
+          <w:p>
+            <w:pPr>
+              <w:rPr>
+                <w:rFonts w:ascii="Arial" w:hAnsi="Arial" w:cs="Arial"/>
+                <w:b/>
+                <w:bCs/>
+                <w:lang w:val="es-ES" w:eastAsia="es-EC"/>
+              </w:rPr>
+            </w:pPr>
+            <w:r>
+              <w:rPr>
+                <w:rFonts w:ascii="Arial" w:hAnsi="Arial" w:cs="Arial"/>
+                <w:b/>
+                <w:bCs/>
+                <w:lang w:val="es-ES" w:eastAsia="es-EC"/>
+              </w:rPr>
+              <w:t>Crear un caso de rescate con los datos del animal (especie, ubicación, estado).</w:t>
+            </w:r>
+          </w:p>
+        </w:tc>
+      </w:tr>
+      <w:tr>
+        <w:trPr>
+          <w:trHeight w:val="192"/>
+        </w:trPr>
+        <w:tc>
+          <w:tcPr>
+            <w:tcW w:w="0" w:type="auto"/>
+            <w:tcBorders>
+              <w:top w:val="single" w:sz="2" w:space="0" w:color="auto"/>
+              <w:left w:val="single" w:sz="2" w:space="0" w:color="auto"/>
+              <w:bottom w:val="single" w:sz="4" w:space="0" w:color="auto"/>
+              <w:right w:val="single" w:sz="2" w:space="0" w:color="auto"/>
+            </w:tcBorders>
+            <w:shd w:val="clear" w:color="auto" w:fill="A3DBFF"/>
+            <w:tcMar>
+              <w:top w:w="180" w:type="dxa"/>
+              <w:left w:w="180" w:type="dxa"/>
+              <w:bottom w:w="180" w:type="dxa"/>
+              <w:right w:w="180" w:type="dxa"/>
+            </w:tcMar>
+            <w:hideMark/>
+          </w:tcPr>
+          <w:p>
+            <w:pPr>
+              <w:rPr>
+                <w:rFonts w:ascii="Arial" w:hAnsi="Arial" w:cs="Arial"/>
+                <w:b/>
+                <w:bCs/>
+                <w:lang w:val="es-ES" w:eastAsia="es-EC"/>
+              </w:rPr>
+            </w:pPr>
+            <w:r>
+              <w:rPr>
+                <w:rFonts w:ascii="Arial" w:hAnsi="Arial" w:cs="Arial"/>
+                <w:b/>
+                <w:bCs/>
+                <w:lang w:val="es-ES" w:eastAsia="es-EC"/>
+              </w:rPr>
+              <w:t>RF-02</w:t>
+            </w:r>
+          </w:p>
+        </w:tc>
+        <w:tc>
+          <w:tcPr>
+            <w:tcW w:w="0" w:type="auto"/>
+            <w:tcBorders>
+              <w:top w:val="single" w:sz="2" w:space="0" w:color="auto"/>
+              <w:left w:val="single" w:sz="2" w:space="0" w:color="auto"/>
+              <w:bottom w:val="single" w:sz="4" w:space="0" w:color="auto"/>
+              <w:right w:val="single" w:sz="2" w:space="0" w:color="auto"/>
+            </w:tcBorders>
+            <w:tcMar>
+              <w:top w:w="180" w:type="dxa"/>
+              <w:left w:w="180" w:type="dxa"/>
+              <w:bottom w:w="180" w:type="dxa"/>
+              <w:right w:w="180" w:type="dxa"/>
+            </w:tcMar>
+            <w:hideMark/>
+          </w:tcPr>
+          <w:p>
+            <w:pPr>
+              <w:rPr>
+                <w:rFonts w:ascii="Arial" w:hAnsi="Arial" w:cs="Arial"/>
+                <w:b/>
+                <w:bCs/>
+                <w:lang w:val="es-ES" w:eastAsia="es-EC"/>
+              </w:rPr>
+            </w:pPr>
+            <w:r>
+              <w:rPr>
+                <w:rFonts w:ascii="Arial" w:hAnsi="Arial" w:cs="Arial"/>
+                <w:b/>
+                <w:bCs/>
+                <w:lang w:val="es-ES" w:eastAsia="es-EC"/>
+              </w:rPr>
+              <w:t>Categorizar la especie del animal (perro, gato, fauna silvestre).</w:t>
+            </w:r>
+          </w:p>
+        </w:tc>
+      </w:tr>
+      <w:tr>
+        <w:trPr>
+          <w:trHeight w:val="209"/>
+        </w:trPr>
+        <w:tc>
+          <w:tcPr>
+            <w:tcW w:w="0" w:type="auto"/>
+            <w:tcBorders>
+              <w:top w:val="single" w:sz="2" w:space="0" w:color="auto"/>
+              <w:left w:val="single" w:sz="2" w:space="0" w:color="auto"/>
+              <w:bottom w:val="single" w:sz="4" w:space="0" w:color="auto"/>
+              <w:right w:val="single" w:sz="2" w:space="0" w:color="auto"/>
+            </w:tcBorders>
+            <w:shd w:val="clear" w:color="auto" w:fill="A3DBFF"/>
+            <w:tcMar>
+              <w:top w:w="180" w:type="dxa"/>
+              <w:left w:w="180" w:type="dxa"/>
+              <w:bottom w:w="180" w:type="dxa"/>
+              <w:right w:w="180" w:type="dxa"/>
+            </w:tcMar>
+            <w:hideMark/>
+          </w:tcPr>
+          <w:p>
+            <w:pPr>
+              <w:rPr>
+                <w:rFonts w:ascii="Arial" w:hAnsi="Arial" w:cs="Arial"/>
+                <w:b/>
+                <w:bCs/>
+                <w:lang w:val="es-ES" w:eastAsia="es-EC"/>
+              </w:rPr>
+            </w:pPr>
+            <w:r>
+              <w:rPr>
+                <w:rFonts w:ascii="Arial" w:hAnsi="Arial" w:cs="Arial"/>
+                <w:b/>
+                <w:bCs/>
+                <w:lang w:val="es-ES" w:eastAsia="es-EC"/>
+              </w:rPr>
+              <w:t>RF-03</w:t>
+            </w:r>
+          </w:p>
+        </w:tc>
+        <w:tc>
+          <w:tcPr>
+            <w:tcW w:w="0" w:type="auto"/>
+            <w:tcBorders>
+              <w:top w:val="single" w:sz="2" w:space="0" w:color="auto"/>
+              <w:left w:val="single" w:sz="2" w:space="0" w:color="auto"/>
+              <w:bottom w:val="single" w:sz="4" w:space="0" w:color="auto"/>
+              <w:right w:val="single" w:sz="2" w:space="0" w:color="auto"/>
+            </w:tcBorders>
+            <w:tcMar>
+              <w:top w:w="180" w:type="dxa"/>
+              <w:left w:w="180" w:type="dxa"/>
+              <w:bottom w:w="180" w:type="dxa"/>
+              <w:right w:w="180" w:type="dxa"/>
+            </w:tcMar>
+            <w:hideMark/>
+          </w:tcPr>
+          <w:p>
+            <w:pPr>
+              <w:rPr>
+                <w:rFonts w:ascii="Arial" w:hAnsi="Arial" w:cs="Arial"/>
+                <w:b/>
+                <w:bCs/>
+                <w:lang w:val="es-ES" w:eastAsia="es-EC"/>
+              </w:rPr>
+            </w:pPr>
+            <w:r>
+              <w:rPr>
+                <w:rFonts w:ascii="Arial" w:hAnsi="Arial" w:cs="Arial"/>
+                <w:b/>
+                <w:bCs/>
+                <w:lang w:val="es-ES" w:eastAsia="es-EC"/>
+              </w:rPr>
+              <w:t>Asignar un voluntario o veterinario a un caso de rescate.</w:t>
+            </w:r>
+          </w:p>
+        </w:tc>
+      </w:tr>
+      <w:tr>
+        <w:trPr>
+          <w:trHeight w:val="192"/>
+        </w:trPr>
+        <w:tc>
+          <w:tcPr>
+            <w:tcW w:w="0" w:type="auto"/>
+            <w:tcBorders>
+              <w:top w:val="single" w:sz="2" w:space="0" w:color="auto"/>
+              <w:left w:val="single" w:sz="2" w:space="0" w:color="auto"/>
+              <w:bottom w:val="single" w:sz="4" w:space="0" w:color="auto"/>
+              <w:right w:val="single" w:sz="2" w:space="0" w:color="auto"/>
+            </w:tcBorders>
+            <w:shd w:val="clear" w:color="auto" w:fill="A3DBFF"/>
+            <w:tcMar>
+              <w:top w:w="180" w:type="dxa"/>
+              <w:left w:w="180" w:type="dxa"/>
+              <w:bottom w:w="180" w:type="dxa"/>
+              <w:right w:w="180" w:type="dxa"/>
+            </w:tcMar>
+            <w:hideMark/>
+          </w:tcPr>
+          <w:p>
+            <w:pPr>
+              <w:rPr>
+                <w:rFonts w:ascii="Arial" w:hAnsi="Arial" w:cs="Arial"/>
+                <w:b/>
+                <w:bCs/>
+                <w:lang w:val="es-ES" w:eastAsia="es-EC"/>
+              </w:rPr>
+            </w:pPr>
+            <w:r>
+              <w:rPr>
+                <w:rFonts w:ascii="Arial" w:hAnsi="Arial" w:cs="Arial"/>
+                <w:b/>
+                <w:bCs/>
+                <w:lang w:val="es-ES" w:eastAsia="es-EC"/>
+              </w:rPr>
+              <w:t>RF-04</w:t>
+            </w:r>
+          </w:p>
+        </w:tc>
+        <w:tc>
+          <w:tcPr>
+            <w:tcW w:w="0" w:type="auto"/>
+            <w:tcBorders>
+              <w:top w:val="single" w:sz="2" w:space="0" w:color="auto"/>
+              <w:left w:val="single" w:sz="2" w:space="0" w:color="auto"/>
+              <w:bottom w:val="single" w:sz="4" w:space="0" w:color="auto"/>
+              <w:right w:val="single" w:sz="2" w:space="0" w:color="auto"/>
+            </w:tcBorders>
+            <w:tcMar>
+              <w:top w:w="180" w:type="dxa"/>
+              <w:left w:w="180" w:type="dxa"/>
+              <w:bottom w:w="180" w:type="dxa"/>
+              <w:right w:w="180" w:type="dxa"/>
+            </w:tcMar>
+            <w:hideMark/>
+          </w:tcPr>
+          <w:p>
+            <w:pPr>
+              <w:rPr>
+                <w:rFonts w:ascii="Arial" w:hAnsi="Arial" w:cs="Arial"/>
+                <w:b/>
+                <w:bCs/>
+                <w:lang w:val="es-ES" w:eastAsia="es-EC"/>
+              </w:rPr>
+            </w:pPr>
+            <w:r>
+              <w:rPr>
+                <w:rFonts w:ascii="Arial" w:hAnsi="Arial" w:cs="Arial"/>
+                <w:b/>
+                <w:bCs/>
+                <w:lang w:val="es-ES" w:eastAsia="es-EC"/>
+              </w:rPr>
+              <w:t>Actualizar el estado del animal (Rescatado, En Tratamiento, En Adopción, Adoptado).</w:t>
+            </w:r>
+          </w:p>
+        </w:tc>
+      </w:tr>
+      <w:tr>
+        <w:trPr>
+          <w:trHeight w:val="192"/>
+        </w:trPr>
+        <w:tc>
+          <w:tcPr>
+            <w:tcW w:w="0" w:type="auto"/>
+            <w:tcBorders>
+              <w:top w:val="single" w:sz="2" w:space="0" w:color="auto"/>
+              <w:left w:val="single" w:sz="2" w:space="0" w:color="auto"/>
+              <w:bottom w:val="single" w:sz="4" w:space="0" w:color="auto"/>
+              <w:right w:val="single" w:sz="2" w:space="0" w:color="auto"/>
+            </w:tcBorders>
+            <w:shd w:val="clear" w:color="auto" w:fill="A3DBFF"/>
+            <w:tcMar>
+              <w:top w:w="180" w:type="dxa"/>
+              <w:left w:w="180" w:type="dxa"/>
+              <w:bottom w:w="180" w:type="dxa"/>
+              <w:right w:w="180" w:type="dxa"/>
+            </w:tcMar>
+            <w:hideMark/>
+          </w:tcPr>
+          <w:p>
+            <w:pPr>
+              <w:rPr>
+                <w:rFonts w:ascii="Arial" w:hAnsi="Arial" w:cs="Arial"/>
+                <w:b/>
+                <w:bCs/>
+                <w:lang w:val="es-ES" w:eastAsia="es-EC"/>
+              </w:rPr>
+            </w:pPr>
+            <w:r>
+              <w:rPr>
+                <w:rFonts w:ascii="Arial" w:hAnsi="Arial" w:cs="Arial"/>
+                <w:b/>
+                <w:bCs/>
+                <w:lang w:val="es-ES" w:eastAsia="es-EC"/>
+              </w:rPr>
+              <w:lastRenderedPageBreak/>
+              <w:t>RF-05</w:t>
+            </w:r>
+          </w:p>
+        </w:tc>
+        <w:tc>
+          <w:tcPr>
+            <w:tcW w:w="0" w:type="auto"/>
+            <w:tcBorders>
+              <w:top w:val="single" w:sz="2" w:space="0" w:color="auto"/>
+              <w:left w:val="single" w:sz="2" w:space="0" w:color="auto"/>
+              <w:bottom w:val="single" w:sz="4" w:space="0" w:color="auto"/>
+              <w:right w:val="single" w:sz="2" w:space="0" w:color="auto"/>
+            </w:tcBorders>
+            <w:tcMar>
+              <w:top w:w="180" w:type="dxa"/>
+              <w:left w:w="180" w:type="dxa"/>
+              <w:bottom w:w="180" w:type="dxa"/>
+              <w:right w:w="180" w:type="dxa"/>
+            </w:tcMar>
+            <w:hideMark/>
+          </w:tcPr>
+          <w:p>
+            <w:pPr>
+              <w:rPr>
+                <w:rFonts w:ascii="Arial" w:hAnsi="Arial" w:cs="Arial"/>
+                <w:b/>
+                <w:bCs/>
+                <w:lang w:val="es-ES" w:eastAsia="es-EC"/>
+              </w:rPr>
+            </w:pPr>
+            <w:r>
+              <w:rPr>
+                <w:rFonts w:ascii="Arial" w:hAnsi="Arial" w:cs="Arial"/>
+                <w:b/>
+                <w:bCs/>
+                <w:lang w:val="es-ES" w:eastAsia="es-EC"/>
+              </w:rPr>
+              <w:t>Notificar automáticamente a los voluntarios cuando se registra un nuevo rescate.</w:t>
+            </w:r>
+          </w:p>
+        </w:tc>
+      </w:tr>
+      <w:tr>
+        <w:trPr>
+          <w:trHeight w:val="209"/>
+        </w:trPr>
+        <w:tc>
+          <w:tcPr>
+            <w:tcW w:w="0" w:type="auto"/>
+            <w:tcBorders>
+              <w:top w:val="single" w:sz="2" w:space="0" w:color="auto"/>
+              <w:left w:val="single" w:sz="2" w:space="0" w:color="auto"/>
+              <w:bottom w:val="single" w:sz="4" w:space="0" w:color="auto"/>
+              <w:right w:val="single" w:sz="2" w:space="0" w:color="auto"/>
+            </w:tcBorders>
+            <w:shd w:val="clear" w:color="auto" w:fill="A3DBFF"/>
+            <w:tcMar>
+              <w:top w:w="180" w:type="dxa"/>
+              <w:left w:w="180" w:type="dxa"/>
+              <w:bottom w:w="180" w:type="dxa"/>
+              <w:right w:w="180" w:type="dxa"/>
+            </w:tcMar>
+            <w:hideMark/>
+          </w:tcPr>
+          <w:p>
+            <w:pPr>
+              <w:rPr>
+                <w:rFonts w:ascii="Arial" w:hAnsi="Arial" w:cs="Arial"/>
+                <w:b/>
+                <w:bCs/>
+                <w:lang w:val="es-ES" w:eastAsia="es-EC"/>
+              </w:rPr>
+            </w:pPr>
+            <w:r>
+              <w:rPr>
+                <w:rFonts w:ascii="Arial" w:hAnsi="Arial" w:cs="Arial"/>
+                <w:b/>
+                <w:bCs/>
+                <w:lang w:val="es-ES" w:eastAsia="es-EC"/>
+              </w:rPr>
+              <w:t>RF-06</w:t>
+            </w:r>
+          </w:p>
+        </w:tc>
+        <w:tc>
+          <w:tcPr>
+            <w:tcW w:w="0" w:type="auto"/>
+            <w:tcBorders>
+              <w:top w:val="single" w:sz="2" w:space="0" w:color="auto"/>
+              <w:left w:val="single" w:sz="2" w:space="0" w:color="auto"/>
+              <w:bottom w:val="single" w:sz="4" w:space="0" w:color="auto"/>
+              <w:right w:val="single" w:sz="2" w:space="0" w:color="auto"/>
+            </w:tcBorders>
+            <w:tcMar>
+              <w:top w:w="180" w:type="dxa"/>
+              <w:left w:w="180" w:type="dxa"/>
+              <w:bottom w:w="180" w:type="dxa"/>
+              <w:right w:w="180" w:type="dxa"/>
+            </w:tcMar>
+            <w:hideMark/>
+          </w:tcPr>
+          <w:p>
+            <w:pPr>
+              <w:rPr>
+                <w:rFonts w:ascii="Arial" w:hAnsi="Arial" w:cs="Arial"/>
+                <w:b/>
+                <w:bCs/>
+                <w:lang w:val="es-ES" w:eastAsia="es-EC"/>
+              </w:rPr>
+            </w:pPr>
+            <w:r>
+              <w:rPr>
+                <w:rFonts w:ascii="Arial" w:hAnsi="Arial" w:cs="Arial"/>
+                <w:b/>
+                <w:bCs/>
+                <w:lang w:val="es-ES" w:eastAsia="es-EC"/>
+              </w:rPr>
+              <w:t>Consultar el historial y el estado actual de los casos.</w:t>
+            </w:r>
+          </w:p>
+        </w:tc>
+      </w:tr>
+    </w:tbl>
+    <w:p>
+      <w:pPr>
+        <w:rPr>
+          <w:rFonts w:ascii="Arial" w:hAnsi="Arial" w:cs="Arial"/>
+          <w:b/>
+          <w:bCs/>
+          <w:lang w:val="es-ES" w:eastAsia="es-EC"/>
+        </w:rPr>
+      </w:pPr>
+    </w:p>
+    <w:p>
+      <w:pPr>
+        <w:rPr>
+          <w:rFonts w:ascii="Arial" w:hAnsi="Arial" w:cs="Arial"/>
+          <w:b/>
+          <w:bCs/>
+          <w:lang w:val="es-ES" w:eastAsia="es-EC"/>
+        </w:rPr>
+      </w:pPr>
+      <w:r>
+        <w:rPr>
+          <w:rFonts w:ascii="Arial" w:hAnsi="Arial" w:cs="Arial"/>
+          <w:b/>
+          <w:bCs/>
+          <w:lang w:val="es-ES" w:eastAsia="es-EC"/>
+        </w:rPr>
+        <w:t>1.3 Requerimientos no funcionales</w:t>
+      </w:r>
+    </w:p>
+    <w:tbl>
+      <w:tblPr>
+        <w:tblpPr w:leftFromText="141" w:rightFromText="141" w:vertAnchor="text" w:horzAnchor="margin" w:tblpXSpec="center" w:tblpY="51"/>
+        <w:tblW w:w="8120" w:type="dxa"/>
+        <w:tblBorders>
+          <w:top w:val="single" w:sz="2" w:space="0" w:color="auto"/>
+          <w:left w:val="single" w:sz="2" w:space="0" w:color="auto"/>
+          <w:bottom w:val="single" w:sz="2" w:space="0" w:color="auto"/>
+          <w:right w:val="single" w:sz="2" w:space="0" w:color="auto"/>
+        </w:tblBorders>
+        <w:tblCellMar>
+          <w:left w:w="0" w:type="dxa"/>
+          <w:right w:w="0" w:type="dxa"/>
+        </w:tblCellMar>
+        <w:tblLook w:val="04A0" w:firstRow="1" w:lastRow="0" w:firstColumn="1" w:lastColumn="0" w:noHBand="0" w:noVBand="1"/>
+      </w:tblPr>
+      <w:tblGrid>
+        <w:gridCol w:w="976"/>
+        <w:gridCol w:w="7144"/>
+      </w:tblGrid>
+      <w:tr>
+        <w:trPr>
+          <w:trHeight w:val="394"/>
+          <w:tblHeader/>
+        </w:trPr>
+        <w:tc>
+          <w:tcPr>
+            <w:tcW w:w="0" w:type="auto"/>
+            <w:tcBorders>
+              <w:top w:val="single" w:sz="2" w:space="0" w:color="auto"/>
+              <w:left w:val="single" w:sz="2" w:space="0" w:color="auto"/>
+              <w:bottom w:val="single" w:sz="4" w:space="0" w:color="auto"/>
+              <w:right w:val="single" w:sz="2" w:space="0" w:color="auto"/>
+            </w:tcBorders>
+            <w:shd w:val="clear" w:color="auto" w:fill="A3DBFF"/>
+            <w:tcMar>
+              <w:top w:w="180" w:type="dxa"/>
+              <w:left w:w="180" w:type="dxa"/>
+              <w:bottom w:w="180" w:type="dxa"/>
+              <w:right w:w="180" w:type="dxa"/>
+            </w:tcMar>
+            <w:hideMark/>
+          </w:tcPr>
+          <w:p>
+            <w:pPr>
+              <w:rPr>
+                <w:rFonts w:ascii="Arial" w:hAnsi="Arial" w:cs="Arial"/>
+                <w:b/>
+                <w:bCs/>
+                <w:lang w:val="es-ES" w:eastAsia="es-EC"/>
+              </w:rPr>
+            </w:pPr>
+            <w:r>
+              <w:rPr>
+                <w:rFonts w:ascii="Arial" w:hAnsi="Arial" w:cs="Arial"/>
+                <w:b/>
+                <w:bCs/>
+                <w:lang w:val="es-ES" w:eastAsia="es-EC"/>
+              </w:rPr>
+              <w:t>ID</w:t>
+            </w:r>
+          </w:p>
+        </w:tc>
+        <w:tc>
+          <w:tcPr>
+            <w:tcW w:w="0" w:type="auto"/>
+            <w:tcBorders>
+              <w:top w:val="single" w:sz="2" w:space="0" w:color="auto"/>
+              <w:left w:val="single" w:sz="2" w:space="0" w:color="auto"/>
+              <w:bottom w:val="single" w:sz="4" w:space="0" w:color="auto"/>
+              <w:right w:val="single" w:sz="2" w:space="0" w:color="auto"/>
+            </w:tcBorders>
+            <w:shd w:val="clear" w:color="auto" w:fill="A3DBFF"/>
+            <w:tcMar>
+              <w:top w:w="180" w:type="dxa"/>
+              <w:left w:w="180" w:type="dxa"/>
+              <w:bottom w:w="180" w:type="dxa"/>
+              <w:right w:w="180" w:type="dxa"/>
+            </w:tcMar>
+            <w:hideMark/>
+          </w:tcPr>
+          <w:p>
+            <w:pPr>
+              <w:rPr>
+                <w:rFonts w:ascii="Arial" w:hAnsi="Arial" w:cs="Arial"/>
+                <w:b/>
+                <w:bCs/>
+                <w:lang w:val="es-ES" w:eastAsia="es-EC"/>
+              </w:rPr>
+            </w:pPr>
+            <w:r>
+              <w:rPr>
+                <w:rFonts w:ascii="Arial" w:hAnsi="Arial" w:cs="Arial"/>
+                <w:b/>
+                <w:bCs/>
+                <w:lang w:val="es-ES" w:eastAsia="es-EC"/>
+              </w:rPr>
+              <w:t>Requerimiento</w:t>
+            </w:r>
+          </w:p>
+        </w:tc>
+      </w:tr>
+      <w:tr>
+        <w:trPr>
+          <w:trHeight w:val="655"/>
+        </w:trPr>
+        <w:tc>
+          <w:tcPr>
+            <w:tcW w:w="0" w:type="auto"/>
+            <w:tcBorders>
+              <w:top w:val="single" w:sz="2" w:space="0" w:color="auto"/>
+              <w:left w:val="single" w:sz="2" w:space="0" w:color="auto"/>
+              <w:bottom w:val="single" w:sz="4" w:space="0" w:color="auto"/>
+              <w:right w:val="single" w:sz="2" w:space="0" w:color="auto"/>
+            </w:tcBorders>
+            <w:shd w:val="clear" w:color="auto" w:fill="A3DBFF"/>
+            <w:tcMar>
+              <w:top w:w="180" w:type="dxa"/>
+              <w:left w:w="180" w:type="dxa"/>
+              <w:bottom w:w="180" w:type="dxa"/>
+              <w:right w:w="180" w:type="dxa"/>
+            </w:tcMar>
+            <w:hideMark/>
+          </w:tcPr>
+          <w:p>
+            <w:pPr>
+              <w:rPr>
+                <w:rFonts w:ascii="Arial" w:hAnsi="Arial" w:cs="Arial"/>
+                <w:b/>
+                <w:bCs/>
+                <w:lang w:val="es-ES" w:eastAsia="es-EC"/>
+              </w:rPr>
+            </w:pPr>
+            <w:r>
+              <w:rPr>
+                <w:rFonts w:ascii="Arial" w:hAnsi="Arial" w:cs="Arial"/>
+                <w:b/>
+                <w:bCs/>
+                <w:lang w:val="es-ES" w:eastAsia="es-EC"/>
+              </w:rPr>
+              <w:t>RNF-01</w:t>
+            </w:r>
+          </w:p>
+        </w:tc>
+        <w:tc>
+          <w:tcPr>
+            <w:tcW w:w="0" w:type="auto"/>
+            <w:tcBorders>
+              <w:top w:val="single" w:sz="2" w:space="0" w:color="auto"/>
+              <w:left w:val="single" w:sz="2" w:space="0" w:color="auto"/>
+              <w:bottom w:val="single" w:sz="4" w:space="0" w:color="auto"/>
+              <w:right w:val="single" w:sz="2" w:space="0" w:color="auto"/>
+            </w:tcBorders>
+            <w:tcMar>
+              <w:top w:w="180" w:type="dxa"/>
+              <w:left w:w="180" w:type="dxa"/>
+              <w:bottom w:w="180" w:type="dxa"/>
+              <w:right w:w="180" w:type="dxa"/>
+            </w:tcMar>
+            <w:hideMark/>
+          </w:tcPr>
+          <w:p>
+            <w:pPr>
+              <w:rPr>
+                <w:rFonts w:ascii="Arial" w:hAnsi="Arial" w:cs="Arial"/>
+                <w:b/>
+                <w:bCs/>
+                <w:lang w:val="es-ES" w:eastAsia="es-EC"/>
+              </w:rPr>
+            </w:pPr>
+            <w:r>
+              <w:rPr>
+                <w:rFonts w:ascii="Arial" w:hAnsi="Arial" w:cs="Arial"/>
+                <w:b/>
+                <w:bCs/>
+                <w:lang w:val="es-ES" w:eastAsia="es-EC"/>
+              </w:rPr>
+              <w:t>Escalabilidad: el sistema debe soportar un crecimiento en el número de casos sin degradar su rendimiento.</w:t>
+            </w:r>
+          </w:p>
+        </w:tc>
+      </w:tr>
+      <w:tr>
+        <w:trPr>
+          <w:trHeight w:val="655"/>
+        </w:trPr>
+        <w:tc>
+          <w:tcPr>
+            <w:tcW w:w="0" w:type="auto"/>
+            <w:tcBorders>
+              <w:top w:val="single" w:sz="2" w:space="0" w:color="auto"/>
+              <w:left w:val="single" w:sz="2" w:space="0" w:color="auto"/>
+              <w:bottom w:val="single" w:sz="4" w:space="0" w:color="auto"/>
+              <w:right w:val="single" w:sz="2" w:space="0" w:color="auto"/>
+            </w:tcBorders>
+            <w:shd w:val="clear" w:color="auto" w:fill="A3DBFF"/>
+            <w:tcMar>
+              <w:top w:w="180" w:type="dxa"/>
+              <w:left w:w="180" w:type="dxa"/>
+              <w:bottom w:w="180" w:type="dxa"/>
+              <w:right w:w="180" w:type="dxa"/>
+            </w:tcMar>
+            <w:hideMark/>
+          </w:tcPr>
+          <w:p>
+            <w:pPr>
+              <w:rPr>
+                <w:rFonts w:ascii="Arial" w:hAnsi="Arial" w:cs="Arial"/>
+                <w:b/>
+                <w:bCs/>
+                <w:lang w:val="es-ES" w:eastAsia="es-EC"/>
+              </w:rPr>
+            </w:pPr>
+            <w:r>
+              <w:rPr>
+                <w:rFonts w:ascii="Arial" w:hAnsi="Arial" w:cs="Arial"/>
+                <w:b/>
+                <w:bCs/>
+                <w:lang w:val="es-ES" w:eastAsia="es-EC"/>
+              </w:rPr>
+              <w:t>RNF-02</w:t>
+            </w:r>
+          </w:p>
+        </w:tc>
+        <w:tc>
+          <w:tcPr>
+            <w:tcW w:w="0" w:type="auto"/>
+            <w:tcBorders>
+              <w:top w:val="single" w:sz="2" w:space="0" w:color="auto"/>
+              <w:left w:val="single" w:sz="2" w:space="0" w:color="auto"/>
+              <w:bottom w:val="single" w:sz="4" w:space="0" w:color="auto"/>
+              <w:right w:val="single" w:sz="2" w:space="0" w:color="auto"/>
+            </w:tcBorders>
+            <w:tcMar>
+              <w:top w:w="180" w:type="dxa"/>
+              <w:left w:w="180" w:type="dxa"/>
+              <w:bottom w:w="180" w:type="dxa"/>
+              <w:right w:w="180" w:type="dxa"/>
+            </w:tcMar>
+            <w:hideMark/>
+          </w:tcPr>
+          <w:p>
+            <w:pPr>
+              <w:rPr>
+                <w:rFonts w:ascii="Arial" w:hAnsi="Arial" w:cs="Arial"/>
+                <w:b/>
+                <w:bCs/>
+                <w:lang w:val="es-ES" w:eastAsia="es-EC"/>
+              </w:rPr>
+            </w:pPr>
+            <w:r>
+              <w:rPr>
+                <w:rFonts w:ascii="Arial" w:hAnsi="Arial" w:cs="Arial"/>
+                <w:b/>
+                <w:bCs/>
+                <w:lang w:val="es-ES" w:eastAsia="es-EC"/>
+              </w:rPr>
+              <w:t>Mantenibilidad: el código debe estar organizado bajo patrones de diseño que permitan modificaciones futuras sin afectar otras partes del sistema.</w:t>
+            </w:r>
+          </w:p>
+        </w:tc>
+      </w:tr>
+      <w:tr>
+        <w:trPr>
+          <w:trHeight w:val="637"/>
+        </w:trPr>
+        <w:tc>
+          <w:tcPr>
+            <w:tcW w:w="0" w:type="auto"/>
+            <w:tcBorders>
+              <w:top w:val="single" w:sz="2" w:space="0" w:color="auto"/>
+              <w:left w:val="single" w:sz="2" w:space="0" w:color="auto"/>
+              <w:bottom w:val="single" w:sz="4" w:space="0" w:color="auto"/>
+              <w:right w:val="single" w:sz="2" w:space="0" w:color="auto"/>
+            </w:tcBorders>
+            <w:shd w:val="clear" w:color="auto" w:fill="A3DBFF"/>
+            <w:tcMar>
+              <w:top w:w="180" w:type="dxa"/>
+              <w:left w:w="180" w:type="dxa"/>
+              <w:bottom w:w="180" w:type="dxa"/>
+              <w:right w:w="180" w:type="dxa"/>
+            </w:tcMar>
+            <w:hideMark/>
+          </w:tcPr>
+          <w:p>
+            <w:pPr>
+              <w:rPr>
+                <w:rFonts w:ascii="Arial" w:hAnsi="Arial" w:cs="Arial"/>
+                <w:b/>
+                <w:bCs/>
+                <w:lang w:val="es-ES" w:eastAsia="es-EC"/>
+              </w:rPr>
+            </w:pPr>
+            <w:r>
+              <w:rPr>
+                <w:rFonts w:ascii="Arial" w:hAnsi="Arial" w:cs="Arial"/>
+                <w:b/>
+                <w:bCs/>
+                <w:lang w:val="es-ES" w:eastAsia="es-EC"/>
+              </w:rPr>
+              <w:t>RNF-03</w:t>
+            </w:r>
+          </w:p>
+        </w:tc>
+        <w:tc>
+          <w:tcPr>
+            <w:tcW w:w="0" w:type="auto"/>
+            <w:tcBorders>
+              <w:top w:val="single" w:sz="2" w:space="0" w:color="auto"/>
+              <w:left w:val="single" w:sz="2" w:space="0" w:color="auto"/>
+              <w:bottom w:val="single" w:sz="4" w:space="0" w:color="auto"/>
+              <w:right w:val="single" w:sz="2" w:space="0" w:color="auto"/>
+            </w:tcBorders>
+            <w:tcMar>
+              <w:top w:w="180" w:type="dxa"/>
+              <w:left w:w="180" w:type="dxa"/>
+              <w:bottom w:w="180" w:type="dxa"/>
+              <w:right w:w="180" w:type="dxa"/>
+            </w:tcMar>
+            <w:hideMark/>
+          </w:tcPr>
+          <w:p>
+            <w:pPr>
+              <w:rPr>
+                <w:rFonts w:ascii="Arial" w:hAnsi="Arial" w:cs="Arial"/>
+                <w:b/>
+                <w:bCs/>
+                <w:lang w:val="es-ES" w:eastAsia="es-EC"/>
+              </w:rPr>
+            </w:pPr>
+            <w:r>
+              <w:rPr>
+                <w:rFonts w:ascii="Arial" w:hAnsi="Arial" w:cs="Arial"/>
+                <w:b/>
+                <w:bCs/>
+                <w:lang w:val="es-ES" w:eastAsia="es-EC"/>
+              </w:rPr>
+              <w:t>Trazabilidad de versiones: todas las acciones y cambios deben quedar registrados mediante el control de versiones (Git/</w:t>
+            </w:r>
+            <w:proofErr w:type="spellStart"/>
+            <w:r>
+              <w:rPr>
+                <w:rFonts w:ascii="Arial" w:hAnsi="Arial" w:cs="Arial"/>
+                <w:b/>
+                <w:bCs/>
+                <w:lang w:val="es-ES" w:eastAsia="es-EC"/>
+              </w:rPr>
+              <w:t>Gitflow</w:t>
+            </w:r>
+            <w:proofErr w:type="spellEnd"/>
+            <w:r>
+              <w:rPr>
+                <w:rFonts w:ascii="Arial" w:hAnsi="Arial" w:cs="Arial"/>
+                <w:b/>
+                <w:bCs/>
+                <w:lang w:val="es-ES" w:eastAsia="es-EC"/>
+              </w:rPr>
+              <w:t>).</w:t>
+            </w:r>
+          </w:p>
+        </w:tc>
+      </w:tr>
+      <w:tr>
+        <w:trPr>
+          <w:trHeight w:val="670"/>
+        </w:trPr>
+        <w:tc>
+          <w:tcPr>
+            <w:tcW w:w="0" w:type="auto"/>
+            <w:tcBorders>
+              <w:top w:val="single" w:sz="2" w:space="0" w:color="auto"/>
+              <w:left w:val="single" w:sz="2" w:space="0" w:color="auto"/>
+              <w:bottom w:val="single" w:sz="4" w:space="0" w:color="auto"/>
+              <w:right w:val="single" w:sz="2" w:space="0" w:color="auto"/>
+            </w:tcBorders>
+            <w:shd w:val="clear" w:color="auto" w:fill="A3DBFF"/>
+            <w:tcMar>
+              <w:top w:w="180" w:type="dxa"/>
+              <w:left w:w="180" w:type="dxa"/>
+              <w:bottom w:w="180" w:type="dxa"/>
+              <w:right w:w="180" w:type="dxa"/>
+            </w:tcMar>
+            <w:hideMark/>
+          </w:tcPr>
+          <w:p>
+            <w:pPr>
+              <w:rPr>
+                <w:rFonts w:ascii="Arial" w:hAnsi="Arial" w:cs="Arial"/>
+                <w:b/>
+                <w:bCs/>
+                <w:lang w:val="es-ES" w:eastAsia="es-EC"/>
+              </w:rPr>
+            </w:pPr>
+            <w:r>
+              <w:rPr>
+                <w:rFonts w:ascii="Arial" w:hAnsi="Arial" w:cs="Arial"/>
+                <w:b/>
+                <w:bCs/>
+                <w:lang w:val="es-ES" w:eastAsia="es-EC"/>
+              </w:rPr>
+              <w:t>RNF-04</w:t>
+            </w:r>
+          </w:p>
+        </w:tc>
+        <w:tc>
+          <w:tcPr>
+            <w:tcW w:w="0" w:type="auto"/>
+            <w:tcBorders>
+              <w:top w:val="single" w:sz="2" w:space="0" w:color="auto"/>
+              <w:left w:val="single" w:sz="2" w:space="0" w:color="auto"/>
+              <w:bottom w:val="single" w:sz="4" w:space="0" w:color="auto"/>
+              <w:right w:val="single" w:sz="2" w:space="0" w:color="auto"/>
+            </w:tcBorders>
+            <w:tcMar>
+              <w:top w:w="180" w:type="dxa"/>
+              <w:left w:w="180" w:type="dxa"/>
+              <w:bottom w:w="180" w:type="dxa"/>
+              <w:right w:w="180" w:type="dxa"/>
+            </w:tcMar>
+            <w:hideMark/>
+          </w:tcPr>
+          <w:p>
+            <w:pPr>
+              <w:rPr>
+                <w:rFonts w:ascii="Arial" w:hAnsi="Arial" w:cs="Arial"/>
+                <w:b/>
+                <w:bCs/>
+                <w:lang w:val="es-ES" w:eastAsia="es-EC"/>
+              </w:rPr>
+            </w:pPr>
+            <w:r>
+              <w:rPr>
+                <w:rFonts w:ascii="Arial" w:hAnsi="Arial" w:cs="Arial"/>
+                <w:b/>
+                <w:bCs/>
+                <w:lang w:val="es-ES" w:eastAsia="es-EC"/>
+              </w:rPr>
+              <w:t>Seguridad: solo el administrador puede asignar personal o eliminar casos.</w:t>
+            </w:r>
+          </w:p>
+        </w:tc>
+      </w:tr>
+    </w:tbl>
+    <w:p>
+      <w:pPr>
+        <w:rPr>
+          <w:rFonts w:ascii="Arial" w:hAnsi="Arial" w:cs="Arial"/>
+          <w:b/>
+          <w:bCs/>
+          <w:lang w:val="es-ES" w:eastAsia="es-EC"/>
+        </w:rPr>
+      </w:pPr>
+    </w:p>
+    <w:p>
+      <w:pPr>
         <w:rPr>
           <w:rFonts w:ascii="Arial" w:hAnsi="Arial" w:cs="Arial"/>
           <w:b/>
           <w:bCs/>
           <w:lang w:eastAsia="es-EC"/>
         </w:rPr>
-        <w:t>`</w:t>
-      </w:r>
-    </w:p>
-    <w:p>
-      <w:pPr>
-        <w:jc w:val="center"/>
+      </w:pPr>
+      <w:r>
         <w:rPr>
           <w:rFonts w:ascii="Arial" w:hAnsi="Arial" w:cs="Arial"/>
           <w:b/>
           <w:bCs/>
           <w:lang w:eastAsia="es-EC"/>
         </w:rPr>
-      </w:pPr>
-      <w:r>
+        <w:t>2. Diseño del sistema</w:t>
+      </w:r>
+    </w:p>
+    <w:p>
+      <w:pPr>
         <w:rPr>
           <w:rFonts w:ascii="Arial" w:hAnsi="Arial" w:cs="Arial"/>
           <w:b/>
           <w:bCs/>
           <w:lang w:eastAsia="es-EC"/>
         </w:rPr>
-        <w:t>Diagrama de Casos de Uso – Sistema de Rescate Animal</w:t>
-      </w:r>
-    </w:p>
-    <w:p>
-      <w:pPr>
+      </w:pPr>
+      <w:r>
         <w:rPr>
           <w:rFonts w:ascii="Arial" w:hAnsi="Arial" w:cs="Arial"/>
           <w:b/>
           <w:bCs/>
           <w:lang w:eastAsia="es-EC"/>
         </w:rPr>
+        <w:t xml:space="preserve">2.1 Repositorio GitHub y </w:t>
+      </w:r>
+      <w:proofErr w:type="spellStart"/>
+      <w:r>
+        <w:rPr>
+          <w:rFonts w:ascii="Arial" w:hAnsi="Arial" w:cs="Arial"/>
+          <w:b/>
+          <w:bCs/>
+          <w:lang w:eastAsia="es-EC"/>
+        </w:rPr>
+        <w:t>Gitflow</w:t>
+      </w:r>
+      <w:proofErr w:type="spellEnd"/>
+    </w:p>
+    <w:p>
+      <w:pPr>
+        <w:rPr>
+          <w:rFonts w:ascii="Arial" w:hAnsi="Arial" w:cs="Arial"/>
+          <w:lang w:eastAsia="es-EC"/>
+        </w:rPr>
+      </w:pPr>
+      <w:r>
+        <w:rPr>
+          <w:rFonts w:ascii="Arial" w:hAnsi="Arial" w:cs="Arial"/>
+          <w:lang w:eastAsia="es-EC"/>
+        </w:rPr>
+        <w:t xml:space="preserve">El proyecto se gestiona en un repositorio público de GitHub bajo el modelo </w:t>
+      </w:r>
+      <w:proofErr w:type="spellStart"/>
+      <w:r>
+        <w:rPr>
+          <w:rFonts w:ascii="Arial" w:hAnsi="Arial" w:cs="Arial"/>
+          <w:lang w:eastAsia="es-EC"/>
+        </w:rPr>
+        <w:t>Gitflow</w:t>
+      </w:r>
+      <w:proofErr w:type="spellEnd"/>
+      <w:r>
+        <w:rPr>
+          <w:rFonts w:ascii="Arial" w:hAnsi="Arial" w:cs="Arial"/>
+          <w:lang w:eastAsia="es-EC"/>
+        </w:rPr>
+        <w:t xml:space="preserve">, con las ramas </w:t>
+      </w:r>
+      <w:proofErr w:type="spellStart"/>
+      <w:r>
+        <w:rPr>
+          <w:rFonts w:ascii="Arial" w:hAnsi="Arial" w:cs="Arial"/>
+          <w:lang w:eastAsia="es-EC"/>
+        </w:rPr>
+        <w:t>main</w:t>
+      </w:r>
+      <w:proofErr w:type="spellEnd"/>
+      <w:r>
+        <w:rPr>
+          <w:rFonts w:ascii="Arial" w:hAnsi="Arial" w:cs="Arial"/>
+          <w:lang w:eastAsia="es-EC"/>
+        </w:rPr>
+        <w:t xml:space="preserve">, </w:t>
+      </w:r>
+      <w:proofErr w:type="spellStart"/>
+      <w:r>
+        <w:rPr>
+          <w:rFonts w:ascii="Arial" w:hAnsi="Arial" w:cs="Arial"/>
+          <w:lang w:eastAsia="es-EC"/>
+        </w:rPr>
+        <w:t>develop</w:t>
+      </w:r>
+      <w:proofErr w:type="spellEnd"/>
+      <w:r>
+        <w:rPr>
+          <w:rFonts w:ascii="Arial" w:hAnsi="Arial" w:cs="Arial"/>
+          <w:lang w:eastAsia="es-EC"/>
+        </w:rPr>
+        <w:t xml:space="preserve"> y </w:t>
+      </w:r>
+      <w:proofErr w:type="spellStart"/>
+      <w:r>
+        <w:rPr>
+          <w:rFonts w:ascii="Arial" w:hAnsi="Arial" w:cs="Arial"/>
+          <w:lang w:eastAsia="es-EC"/>
+        </w:rPr>
+        <w:t>feature</w:t>
+      </w:r>
+      <w:proofErr w:type="spellEnd"/>
+      <w:r>
+        <w:rPr>
+          <w:rFonts w:ascii="Arial" w:hAnsi="Arial" w:cs="Arial"/>
+          <w:lang w:eastAsia="es-EC"/>
+        </w:rPr>
+        <w:t>/* (ver sección 5).</w:t>
+      </w:r>
+    </w:p>
+    <w:p>
+      <w:pPr>
+        <w:rPr>
+          <w:rFonts w:ascii="Arial" w:hAnsi="Arial" w:cs="Arial"/>
+          <w:b/>
+          <w:bCs/>
+          <w:lang w:eastAsia="es-EC"/>
+        </w:rPr>
+      </w:pPr>
+      <w:r>
+        <w:rPr>
+          <w:rFonts w:ascii="Arial" w:hAnsi="Arial" w:cs="Arial"/>
+          <w:b/>
+          <w:bCs/>
+          <w:lang w:eastAsia="es-EC"/>
+        </w:rPr>
+        <w:t>2.2 Diagrama de casos de uso</w:t>
+      </w:r>
+    </w:p>
+    <w:p>
+      <w:pPr>
+        <w:rPr>
+          <w:rFonts w:ascii="Arial" w:hAnsi="Arial" w:cs="Arial"/>
+          <w:b/>
+          <w:bCs/>
+          <w:lang w:eastAsia="es-EC"/>
+        </w:rPr>
+      </w:pPr>
+    </w:p>
+    <w:p>
+      <w:pPr>
+        <w:rPr>
+          <w:rFonts w:ascii="Arial" w:hAnsi="Arial" w:cs="Arial"/>
+          <w:b/>
+          <w:bCs/>
+          <w:lang w:eastAsia="es-EC"/>
+        </w:rPr>
+      </w:pPr>
+    </w:p>
+    <w:p>
+      <w:pPr>
+        <w:rPr>
+          <w:rFonts w:ascii="Arial" w:hAnsi="Arial" w:cs="Arial"/>
+          <w:b/>
+          <w:bCs/>
+          <w:lang w:eastAsia="es-EC"/>
+        </w:rPr>
+      </w:pPr>
+    </w:p>
+    <w:p>
+      <w:pPr>
+        <w:rPr>
+          <w:rFonts w:ascii="Arial" w:hAnsi="Arial" w:cs="Arial"/>
+          <w:b/>
+          <w:bCs/>
+          <w:lang w:eastAsia="es-EC"/>
+        </w:rPr>
+      </w:pPr>
+    </w:p>
+    <w:p>
+      <w:pPr>
+        <w:rPr>
+          <w:rFonts w:ascii="Arial" w:hAnsi="Arial" w:cs="Arial"/>
+          <w:b/>
+          <w:bCs/>
+          <w:lang w:eastAsia="es-EC"/>
+        </w:rPr>
       </w:pPr>
       <w:r>
         <w:rPr>
           <w:noProof/>
         </w:rPr>
+        <w:lastRenderedPageBreak/>
         <w:drawing>
-          <wp:anchor distT="0" distB="0" distL="114300" distR="114300" simplePos="0" relativeHeight="251666432" behindDoc="1" locked="0" layoutInCell="1" allowOverlap="1" wp14:anchorId="3F4F3521" wp14:editId="6512CB2C">
+          <wp:anchor distT="0" distB="0" distL="114300" distR="114300" simplePos="0" relativeHeight="251666432" behindDoc="1" locked="0" layoutInCell="1" allowOverlap="1" wp14:anchorId="3F4F3521" wp14:editId="38335B38">
             <wp:simplePos x="0" y="0"/>
             <wp:positionH relativeFrom="margin">
-              <wp:align>center</wp:align>
+              <wp:posOffset>863600</wp:posOffset>
             </wp:positionH>
             <wp:positionV relativeFrom="paragraph">
-              <wp:posOffset>22993</wp:posOffset>
+              <wp:posOffset>19050</wp:posOffset>
             </wp:positionV>
             <wp:extent cx="3733800" cy="3115310"/>
             <wp:effectExtent l="19050" t="19050" r="19050" b="27940"/>
-            <wp:wrapNone/>
+            <wp:wrapSquare wrapText="bothSides"/>
             <wp:docPr id="1858095306" name="Imagen 2"/>
             <wp:cNvGraphicFramePr>
               <a:graphicFrameLocks xmlns:a="http://schemas.openxmlformats.org/drawingml/2006/main" noChangeAspect="1"/>
@@ -1703,37 +2924,27 @@
           <w:rFonts w:ascii="Arial" w:hAnsi="Arial" w:cs="Arial"/>
           <w:b/>
           <w:bCs/>
-          <w:lang w:eastAsia="es-EC"/>
-        </w:rPr>
-      </w:pPr>
-    </w:p>
-    <w:p>
-      <w:pPr>
-        <w:rPr>
-          <w:rFonts w:ascii="Arial" w:hAnsi="Arial" w:cs="Arial"/>
-          <w:b/>
-          <w:bCs/>
-          <w:lang w:eastAsia="es-EC"/>
-        </w:rPr>
-      </w:pPr>
-    </w:p>
-    <w:p>
-      <w:pPr>
-        <w:rPr>
-          <w:rFonts w:ascii="Arial" w:hAnsi="Arial" w:cs="Arial"/>
-          <w:b/>
-          <w:bCs/>
-          <w:lang w:eastAsia="es-EC"/>
-        </w:rPr>
-      </w:pPr>
-    </w:p>
-    <w:p>
-      <w:pPr>
-        <w:rPr>
-          <w:rFonts w:ascii="Arial" w:hAnsi="Arial" w:cs="Arial"/>
-          <w:b/>
-          <w:bCs/>
-          <w:lang w:eastAsia="es-EC"/>
+          <w:lang w:val="es-ES" w:eastAsia="es-EC"/>
+        </w:rPr>
+      </w:pPr>
+    </w:p>
+    <w:p>
+      <w:pPr>
+        <w:rPr>
+          <w:rFonts w:ascii="Arial" w:hAnsi="Arial" w:cs="Arial"/>
+          <w:b/>
+          <w:bCs/>
+          <w:lang w:val="es-ES" w:eastAsia="es-EC"/>
+        </w:rPr>
+      </w:pPr>
+    </w:p>
+    <w:p>
+      <w:pPr>
+        <w:rPr>
+          <w:rFonts w:ascii="Arial" w:hAnsi="Arial" w:cs="Arial"/>
+          <w:b/>
+          <w:bCs/>
+          <w:lang w:val="es-ES" w:eastAsia="es-EC"/>
         </w:rPr>
       </w:pPr>
     </w:p>
@@ -1754,15 +2965,14 @@
           <w:noProof/>
           <w:lang w:val="es-ES" w:eastAsia="es-EC"/>
         </w:rPr>
-        <w:lastRenderedPageBreak/>
         <w:drawing>
-          <wp:anchor distT="0" distB="0" distL="114300" distR="114300" simplePos="0" relativeHeight="251667456" behindDoc="0" locked="0" layoutInCell="1" allowOverlap="1" wp14:anchorId="6D2CC429" wp14:editId="0F8DDADE">
+          <wp:anchor distT="0" distB="0" distL="114300" distR="114300" simplePos="0" relativeHeight="251667456" behindDoc="0" locked="0" layoutInCell="1" allowOverlap="1" wp14:anchorId="6D2CC429" wp14:editId="5B43D878">
             <wp:simplePos x="0" y="0"/>
             <wp:positionH relativeFrom="column">
-              <wp:posOffset>173355</wp:posOffset>
+              <wp:posOffset>54822</wp:posOffset>
             </wp:positionH>
             <wp:positionV relativeFrom="paragraph">
-              <wp:posOffset>382270</wp:posOffset>
+              <wp:posOffset>365337</wp:posOffset>
             </wp:positionV>
             <wp:extent cx="5570855" cy="4993640"/>
             <wp:effectExtent l="0" t="0" r="0" b="0"/>
@@ -1827,25 +3037,35 @@
           <w:bCs/>
           <w:lang w:val="es-ES" w:eastAsia="es-EC"/>
         </w:rPr>
-        <w:t>2.3 Diagrama de clases UM</w:t>
-      </w:r>
-    </w:p>
-    <w:p>
-      <w:pPr>
-        <w:rPr>
-          <w:rFonts w:ascii="Arial" w:hAnsi="Arial" w:cs="Arial"/>
-          <w:b/>
-          <w:bCs/>
-          <w:lang w:val="es-ES" w:eastAsia="es-EC"/>
-        </w:rPr>
-      </w:pPr>
-      <w:r>
-        <w:rPr>
-          <w:rFonts w:ascii="Arial" w:hAnsi="Arial" w:cs="Arial"/>
-          <w:b/>
-          <w:bCs/>
-          <w:lang w:val="es-ES" w:eastAsia="es-EC"/>
-        </w:rPr>
+        <w:t xml:space="preserve">2.3 </w:t>
+      </w:r>
+      <w:r>
+        <w:rPr>
+          <w:rFonts w:ascii="Arial" w:hAnsi="Arial" w:cs="Arial"/>
+          <w:b/>
+          <w:bCs/>
+          <w:lang w:val="es-ES" w:eastAsia="es-EC"/>
+        </w:rPr>
+        <w:t>Diagrama de clases UML</w:t>
+      </w:r>
+    </w:p>
+    <w:p>
+      <w:pPr>
+        <w:rPr>
+          <w:rFonts w:ascii="Arial" w:hAnsi="Arial" w:cs="Arial"/>
+          <w:b/>
+          <w:bCs/>
+          <w:lang w:val="es-ES" w:eastAsia="es-EC"/>
+        </w:rPr>
+      </w:pPr>
+      <w:r>
+        <w:rPr>
+          <w:rFonts w:ascii="Arial" w:hAnsi="Arial" w:cs="Arial"/>
+          <w:b/>
+          <w:bCs/>
+          <w:lang w:val="es-ES" w:eastAsia="es-EC"/>
+        </w:rPr>
+        <w:lastRenderedPageBreak/>
         <w:t>Descripción de clases:</w:t>
       </w:r>
     </w:p>
@@ -2086,14 +3306,24 @@
                 <w:lang w:val="es-ES" w:eastAsia="es-EC"/>
               </w:rPr>
             </w:pPr>
+            <w:proofErr w:type="gramStart"/>
             <w:r>
               <w:rPr>
                 <w:rFonts w:ascii="Arial" w:hAnsi="Arial" w:cs="Arial"/>
                 <w:lang w:val="es-ES" w:eastAsia="es-EC"/>
               </w:rPr>
-              <w:t xml:space="preserve">notificar(), </w:t>
+              <w:t>notificar(</w:t>
+            </w:r>
+            <w:proofErr w:type="gramEnd"/>
+            <w:r>
+              <w:rPr>
+                <w:rFonts w:ascii="Arial" w:hAnsi="Arial" w:cs="Arial"/>
+                <w:lang w:val="es-ES" w:eastAsia="es-EC"/>
+              </w:rPr>
+              <w:t xml:space="preserve">), </w:t>
             </w:r>
             <w:proofErr w:type="spellStart"/>
+            <w:proofErr w:type="gramStart"/>
             <w:r>
               <w:rPr>
                 <w:rFonts w:ascii="Arial" w:hAnsi="Arial" w:cs="Arial"/>
@@ -2107,7 +3337,15 @@
                 <w:rFonts w:ascii="Arial" w:hAnsi="Arial" w:cs="Arial"/>
                 <w:lang w:val="es-ES" w:eastAsia="es-EC"/>
               </w:rPr>
-              <w:t>()</w:t>
+              <w:t>(</w:t>
+            </w:r>
+            <w:proofErr w:type="gramEnd"/>
+            <w:r>
+              <w:rPr>
+                <w:rFonts w:ascii="Arial" w:hAnsi="Arial" w:cs="Arial"/>
+                <w:lang w:val="es-ES" w:eastAsia="es-EC"/>
+              </w:rPr>
+              <w:t>)</w:t>
             </w:r>
           </w:p>
         </w:tc>
@@ -2210,6 +3448,7 @@
               </w:rPr>
             </w:pPr>
             <w:proofErr w:type="spellStart"/>
+            <w:proofErr w:type="gramStart"/>
             <w:r>
               <w:rPr>
                 <w:rFonts w:ascii="Arial" w:hAnsi="Arial" w:cs="Arial"/>
@@ -2223,9 +3462,18 @@
                 <w:rFonts w:ascii="Arial" w:hAnsi="Arial" w:cs="Arial"/>
                 <w:lang w:val="es-ES" w:eastAsia="es-EC"/>
               </w:rPr>
-              <w:t xml:space="preserve">(), </w:t>
+              <w:t>(</w:t>
+            </w:r>
+            <w:proofErr w:type="gramEnd"/>
+            <w:r>
+              <w:rPr>
+                <w:rFonts w:ascii="Arial" w:hAnsi="Arial" w:cs="Arial"/>
+                <w:lang w:val="es-ES" w:eastAsia="es-EC"/>
+              </w:rPr>
+              <w:t xml:space="preserve">), </w:t>
             </w:r>
             <w:proofErr w:type="spellStart"/>
+            <w:proofErr w:type="gramStart"/>
             <w:r>
               <w:rPr>
                 <w:rFonts w:ascii="Arial" w:hAnsi="Arial" w:cs="Arial"/>
@@ -2239,7 +3487,15 @@
                 <w:rFonts w:ascii="Arial" w:hAnsi="Arial" w:cs="Arial"/>
                 <w:lang w:val="es-ES" w:eastAsia="es-EC"/>
               </w:rPr>
-              <w:t>()</w:t>
+              <w:t>(</w:t>
+            </w:r>
+            <w:proofErr w:type="gramEnd"/>
+            <w:r>
+              <w:rPr>
+                <w:rFonts w:ascii="Arial" w:hAnsi="Arial" w:cs="Arial"/>
+                <w:lang w:val="es-ES" w:eastAsia="es-EC"/>
+              </w:rPr>
+              <w:t>)</w:t>
             </w:r>
           </w:p>
         </w:tc>
@@ -2342,6 +3598,7 @@
               </w:rPr>
             </w:pPr>
             <w:proofErr w:type="spellStart"/>
+            <w:proofErr w:type="gramStart"/>
             <w:r>
               <w:rPr>
                 <w:rFonts w:ascii="Arial" w:hAnsi="Arial" w:cs="Arial"/>
@@ -2355,9 +3612,18 @@
                 <w:rFonts w:ascii="Arial" w:hAnsi="Arial" w:cs="Arial"/>
                 <w:lang w:val="es-ES" w:eastAsia="es-EC"/>
               </w:rPr>
-              <w:t xml:space="preserve">(), </w:t>
+              <w:t>(</w:t>
+            </w:r>
+            <w:proofErr w:type="gramEnd"/>
+            <w:r>
+              <w:rPr>
+                <w:rFonts w:ascii="Arial" w:hAnsi="Arial" w:cs="Arial"/>
+                <w:lang w:val="es-ES" w:eastAsia="es-EC"/>
+              </w:rPr>
+              <w:t xml:space="preserve">), </w:t>
             </w:r>
             <w:proofErr w:type="spellStart"/>
+            <w:proofErr w:type="gramStart"/>
             <w:r>
               <w:rPr>
                 <w:rFonts w:ascii="Arial" w:hAnsi="Arial" w:cs="Arial"/>
@@ -2371,7 +3637,15 @@
                 <w:rFonts w:ascii="Arial" w:hAnsi="Arial" w:cs="Arial"/>
                 <w:lang w:val="es-ES" w:eastAsia="es-EC"/>
               </w:rPr>
-              <w:t>()</w:t>
+              <w:t>(</w:t>
+            </w:r>
+            <w:proofErr w:type="gramEnd"/>
+            <w:r>
+              <w:rPr>
+                <w:rFonts w:ascii="Arial" w:hAnsi="Arial" w:cs="Arial"/>
+                <w:lang w:val="es-ES" w:eastAsia="es-EC"/>
+              </w:rPr>
+              <w:t>)</w:t>
             </w:r>
           </w:p>
         </w:tc>
@@ -2476,6 +3750,7 @@
               </w:rPr>
             </w:pPr>
             <w:proofErr w:type="spellStart"/>
+            <w:proofErr w:type="gramStart"/>
             <w:r>
               <w:rPr>
                 <w:rFonts w:ascii="Arial" w:hAnsi="Arial" w:cs="Arial"/>
@@ -2489,7 +3764,15 @@
                 <w:rFonts w:ascii="Arial" w:hAnsi="Arial" w:cs="Arial"/>
                 <w:lang w:val="es-ES" w:eastAsia="es-EC"/>
               </w:rPr>
-              <w:t>()</w:t>
+              <w:t>(</w:t>
+            </w:r>
+            <w:proofErr w:type="gramEnd"/>
+            <w:r>
+              <w:rPr>
+                <w:rFonts w:ascii="Arial" w:hAnsi="Arial" w:cs="Arial"/>
+                <w:lang w:val="es-ES" w:eastAsia="es-EC"/>
+              </w:rPr>
+              <w:t>)</w:t>
             </w:r>
           </w:p>
         </w:tc>
@@ -2528,7 +3811,6 @@
                 <w:rFonts w:ascii="Arial" w:hAnsi="Arial" w:cs="Arial"/>
                 <w:lang w:val="es-ES" w:eastAsia="es-EC"/>
               </w:rPr>
-              <w:lastRenderedPageBreak/>
               <w:t>Animal</w:t>
             </w:r>
           </w:p>
@@ -2602,6 +3884,7 @@
               </w:rPr>
             </w:pPr>
             <w:proofErr w:type="spellStart"/>
+            <w:proofErr w:type="gramStart"/>
             <w:r>
               <w:rPr>
                 <w:rFonts w:ascii="Arial" w:hAnsi="Arial" w:cs="Arial"/>
@@ -2615,9 +3898,18 @@
                 <w:rFonts w:ascii="Arial" w:hAnsi="Arial" w:cs="Arial"/>
                 <w:lang w:val="es-ES" w:eastAsia="es-EC"/>
               </w:rPr>
-              <w:t xml:space="preserve">(), </w:t>
+              <w:t>(</w:t>
+            </w:r>
+            <w:proofErr w:type="gramEnd"/>
+            <w:r>
+              <w:rPr>
+                <w:rFonts w:ascii="Arial" w:hAnsi="Arial" w:cs="Arial"/>
+                <w:lang w:val="es-ES" w:eastAsia="es-EC"/>
+              </w:rPr>
+              <w:t xml:space="preserve">), </w:t>
             </w:r>
             <w:proofErr w:type="spellStart"/>
+            <w:proofErr w:type="gramStart"/>
             <w:r>
               <w:rPr>
                 <w:rFonts w:ascii="Arial" w:hAnsi="Arial" w:cs="Arial"/>
@@ -2631,7 +3923,15 @@
                 <w:rFonts w:ascii="Arial" w:hAnsi="Arial" w:cs="Arial"/>
                 <w:lang w:val="es-ES" w:eastAsia="es-EC"/>
               </w:rPr>
-              <w:t>()</w:t>
+              <w:t>(</w:t>
+            </w:r>
+            <w:proofErr w:type="gramEnd"/>
+            <w:r>
+              <w:rPr>
+                <w:rFonts w:ascii="Arial" w:hAnsi="Arial" w:cs="Arial"/>
+                <w:lang w:val="es-ES" w:eastAsia="es-EC"/>
+              </w:rPr>
+              <w:t>)</w:t>
             </w:r>
           </w:p>
         </w:tc>
@@ -2768,6 +4068,7 @@
               </w:rPr>
             </w:pPr>
             <w:proofErr w:type="spellStart"/>
+            <w:proofErr w:type="gramStart"/>
             <w:r>
               <w:rPr>
                 <w:rFonts w:ascii="Arial" w:hAnsi="Arial" w:cs="Arial"/>
@@ -2781,9 +4082,18 @@
                 <w:rFonts w:ascii="Arial" w:hAnsi="Arial" w:cs="Arial"/>
                 <w:lang w:val="es-ES" w:eastAsia="es-EC"/>
               </w:rPr>
-              <w:t xml:space="preserve">(), </w:t>
+              <w:t>(</w:t>
+            </w:r>
+            <w:proofErr w:type="gramEnd"/>
+            <w:r>
+              <w:rPr>
+                <w:rFonts w:ascii="Arial" w:hAnsi="Arial" w:cs="Arial"/>
+                <w:lang w:val="es-ES" w:eastAsia="es-EC"/>
+              </w:rPr>
+              <w:t xml:space="preserve">), </w:t>
             </w:r>
             <w:proofErr w:type="spellStart"/>
+            <w:proofErr w:type="gramStart"/>
             <w:r>
               <w:rPr>
                 <w:rFonts w:ascii="Arial" w:hAnsi="Arial" w:cs="Arial"/>
@@ -2797,9 +4107,18 @@
                 <w:rFonts w:ascii="Arial" w:hAnsi="Arial" w:cs="Arial"/>
                 <w:lang w:val="es-ES" w:eastAsia="es-EC"/>
               </w:rPr>
-              <w:t xml:space="preserve">(), </w:t>
+              <w:t>(</w:t>
+            </w:r>
+            <w:proofErr w:type="gramEnd"/>
+            <w:r>
+              <w:rPr>
+                <w:rFonts w:ascii="Arial" w:hAnsi="Arial" w:cs="Arial"/>
+                <w:lang w:val="es-ES" w:eastAsia="es-EC"/>
+              </w:rPr>
+              <w:t xml:space="preserve">), </w:t>
             </w:r>
             <w:proofErr w:type="spellStart"/>
+            <w:proofErr w:type="gramStart"/>
             <w:r>
               <w:rPr>
                 <w:rFonts w:ascii="Arial" w:hAnsi="Arial" w:cs="Arial"/>
@@ -2813,7 +4132,15 @@
                 <w:rFonts w:ascii="Arial" w:hAnsi="Arial" w:cs="Arial"/>
                 <w:lang w:val="es-ES" w:eastAsia="es-EC"/>
               </w:rPr>
-              <w:t>()</w:t>
+              <w:t>(</w:t>
+            </w:r>
+            <w:proofErr w:type="gramEnd"/>
+            <w:r>
+              <w:rPr>
+                <w:rFonts w:ascii="Arial" w:hAnsi="Arial" w:cs="Arial"/>
+                <w:lang w:val="es-ES" w:eastAsia="es-EC"/>
+              </w:rPr>
+              <w:t>)</w:t>
             </w:r>
           </w:p>
         </w:tc>
@@ -2917,12 +4244,21 @@
                 <w:lang w:val="es-ES" w:eastAsia="es-EC"/>
               </w:rPr>
             </w:pPr>
+            <w:proofErr w:type="gramStart"/>
             <w:r>
               <w:rPr>
                 <w:rFonts w:ascii="Arial" w:hAnsi="Arial" w:cs="Arial"/>
                 <w:lang w:val="es-ES" w:eastAsia="es-EC"/>
               </w:rPr>
-              <w:t>enviar()</w:t>
+              <w:t>enviar(</w:t>
+            </w:r>
+            <w:proofErr w:type="gramEnd"/>
+            <w:r>
+              <w:rPr>
+                <w:rFonts w:ascii="Arial" w:hAnsi="Arial" w:cs="Arial"/>
+                <w:lang w:val="es-ES" w:eastAsia="es-EC"/>
+              </w:rPr>
+              <w:t>)</w:t>
             </w:r>
           </w:p>
         </w:tc>
@@ -3013,29 +4349,13 @@
         </w:rPr>
         <w:t>El </w:t>
       </w:r>
-      <w:proofErr w:type="spellStart"/>
-      <w:r>
-        <w:rPr>
-          <w:rFonts w:ascii="Arial" w:hAnsi="Arial" w:cs="Arial"/>
-          <w:lang w:val="es-ES" w:eastAsia="es-EC"/>
-        </w:rPr>
-        <w:t>Voluntar</w:t>
-      </w:r>
-      <w:r>
-        <w:rPr>
-          <w:rFonts w:ascii="Arial" w:hAnsi="Arial" w:cs="Arial"/>
-          <w:lang w:val="es-ES" w:eastAsia="es-EC"/>
-        </w:rPr>
-        <w:t>í</w:t>
-      </w:r>
-      <w:r>
-        <w:rPr>
-          <w:rFonts w:ascii="Arial" w:hAnsi="Arial" w:cs="Arial"/>
-          <w:lang w:val="es-ES" w:eastAsia="es-EC"/>
-        </w:rPr>
-        <w:t>o</w:t>
-      </w:r>
-      <w:proofErr w:type="spellEnd"/>
+      <w:r>
+        <w:rPr>
+          <w:rFonts w:ascii="Arial" w:hAnsi="Arial" w:cs="Arial"/>
+          <w:lang w:val="es-ES" w:eastAsia="es-EC"/>
+        </w:rPr>
+        <w:t>Voluntario</w:t>
+      </w:r>
       <w:r>
         <w:rPr>
           <w:rFonts w:ascii="Arial" w:hAnsi="Arial" w:cs="Arial"/>
@@ -3193,38 +4513,9 @@
           <w:rFonts w:ascii="Arial" w:hAnsi="Arial" w:cs="Arial"/>
           <w:lang w:val="es-ES" w:eastAsia="es-EC"/>
         </w:rPr>
+        <w:lastRenderedPageBreak/>
         <w:t>DIP (Inversión de Dependencias): las clases dependen de abstracciones, no de implementaciones concretas.</w:t>
       </w:r>
-    </w:p>
-    <w:p>
-      <w:pPr>
-        <w:rPr>
-          <w:rFonts w:ascii="Arial" w:hAnsi="Arial" w:cs="Arial"/>
-          <w:b/>
-          <w:bCs/>
-          <w:lang w:eastAsia="es-EC"/>
-        </w:rPr>
-      </w:pPr>
-    </w:p>
-    <w:p>
-      <w:pPr>
-        <w:rPr>
-          <w:rFonts w:ascii="Arial" w:hAnsi="Arial" w:cs="Arial"/>
-          <w:b/>
-          <w:bCs/>
-          <w:lang w:eastAsia="es-EC"/>
-        </w:rPr>
-      </w:pPr>
-    </w:p>
-    <w:p>
-      <w:pPr>
-        <w:rPr>
-          <w:rFonts w:ascii="Arial" w:hAnsi="Arial" w:cs="Arial"/>
-          <w:b/>
-          <w:bCs/>
-          <w:lang w:eastAsia="es-EC"/>
-        </w:rPr>
-      </w:pPr>
     </w:p>
     <w:p>
       <w:pPr>
@@ -3952,16 +5243,16 @@
           <w:lang w:eastAsia="es-EC"/>
         </w:rPr>
       </w:pPr>
-    </w:p>
-    <w:p>
-      <w:pPr>
+      <w:r>
         <w:rPr>
           <w:rFonts w:ascii="Arial" w:hAnsi="Arial" w:cs="Arial"/>
           <w:b/>
           <w:bCs/>
           <w:lang w:eastAsia="es-EC"/>
         </w:rPr>
-      </w:pPr>
+        <w:lastRenderedPageBreak/>
+        <w:t>Diagrama 1 — Arquitectura:</w:t>
+      </w:r>
     </w:p>
     <w:p>
       <w:pPr>
@@ -3972,74 +5263,16 @@
           <w:lang w:eastAsia="es-EC"/>
         </w:rPr>
       </w:pPr>
-    </w:p>
-    <w:p>
-      <w:pPr>
-        <w:rPr>
-          <w:rFonts w:ascii="Arial" w:hAnsi="Arial" w:cs="Arial"/>
-          <w:b/>
-          <w:bCs/>
+      <w:r>
+        <w:rPr>
+          <w:rFonts w:ascii="Arial" w:hAnsi="Arial" w:cs="Arial"/>
+          <w:b/>
+          <w:bCs/>
+          <w:noProof/>
           <w:lang w:eastAsia="es-EC"/>
         </w:rPr>
-      </w:pPr>
-    </w:p>
-    <w:p>
-      <w:pPr>
-        <w:rPr>
-          <w:rFonts w:ascii="Arial" w:hAnsi="Arial" w:cs="Arial"/>
-          <w:b/>
-          <w:bCs/>
-          <w:lang w:eastAsia="es-EC"/>
-        </w:rPr>
-      </w:pPr>
-    </w:p>
-    <w:p>
-      <w:pPr>
-        <w:rPr>
-          <w:rFonts w:ascii="Arial" w:hAnsi="Arial" w:cs="Arial"/>
-          <w:b/>
-          <w:bCs/>
-          <w:lang w:eastAsia="es-EC"/>
-        </w:rPr>
-      </w:pPr>
-    </w:p>
-    <w:p>
-      <w:pPr>
-        <w:rPr>
-          <w:rFonts w:ascii="Arial" w:hAnsi="Arial" w:cs="Arial"/>
-          <w:b/>
-          <w:bCs/>
-          <w:lang w:eastAsia="es-EC"/>
-        </w:rPr>
-      </w:pPr>
-      <w:r>
-        <w:rPr>
-          <w:rFonts w:ascii="Arial" w:hAnsi="Arial" w:cs="Arial"/>
-          <w:b/>
-          <w:bCs/>
-          <w:lang w:eastAsia="es-EC"/>
-        </w:rPr>
-        <w:t>Diagrama 1 — Arquitectura:</w:t>
-      </w:r>
-    </w:p>
-    <w:p>
-      <w:pPr>
-        <w:rPr>
-          <w:rFonts w:ascii="Arial" w:hAnsi="Arial" w:cs="Arial"/>
-          <w:b/>
-          <w:bCs/>
-          <w:lang w:eastAsia="es-EC"/>
-        </w:rPr>
-      </w:pPr>
-      <w:r>
-        <w:rPr>
-          <w:rFonts w:ascii="Arial" w:hAnsi="Arial" w:cs="Arial"/>
-          <w:b/>
-          <w:bCs/>
-          <w:lang w:eastAsia="es-EC"/>
-        </w:rPr>
         <w:drawing>
-          <wp:anchor distT="0" distB="0" distL="114300" distR="114300" simplePos="0" relativeHeight="251668480" behindDoc="1" locked="0" layoutInCell="1" allowOverlap="1" wp14:anchorId="766455EC" wp14:editId="67D79FA4">
+          <wp:anchor distT="0" distB="0" distL="114300" distR="114300" simplePos="0" relativeHeight="251668480" behindDoc="1" locked="0" layoutInCell="1" allowOverlap="1" wp14:anchorId="766455EC" wp14:editId="5ED38743">
             <wp:simplePos x="0" y="0"/>
             <wp:positionH relativeFrom="margin">
               <wp:align>left</wp:align>
@@ -4251,7 +5484,6 @@
           <w:bCs/>
           <w:lang w:eastAsia="es-EC"/>
         </w:rPr>
-        <w:lastRenderedPageBreak/>
         <w:t xml:space="preserve">Diagrama 2 — </w:t>
       </w:r>
       <w:proofErr w:type="spellStart"/>
@@ -4299,6 +5531,7 @@
           <w:rFonts w:ascii="Arial" w:hAnsi="Arial" w:cs="Arial"/>
           <w:b/>
           <w:bCs/>
+          <w:noProof/>
           <w:lang w:eastAsia="es-EC"/>
         </w:rPr>
         <w:drawing>
@@ -4689,24 +5922,24 @@
           <w:bCs/>
           <w:lang w:val="es-ES" w:eastAsia="es-EC"/>
         </w:rPr>
+        <w:t>3.4 MVC (Modelo-Vista-Controlador)</w:t>
+      </w:r>
+    </w:p>
+    <w:p>
+      <w:pPr>
+        <w:rPr>
+          <w:rFonts w:ascii="Arial" w:hAnsi="Arial" w:cs="Arial"/>
+          <w:lang w:val="es-ES" w:eastAsia="es-EC"/>
+        </w:rPr>
+      </w:pPr>
+      <w:r>
+        <w:rPr>
+          <w:rFonts w:ascii="Arial" w:hAnsi="Arial" w:cs="Arial"/>
+          <w:b/>
+          <w:bCs/>
+          <w:lang w:val="es-ES" w:eastAsia="es-EC"/>
+        </w:rPr>
         <w:lastRenderedPageBreak/>
-        <w:t>3.4 MVC (Modelo-Vista-Controlador)</w:t>
-      </w:r>
-    </w:p>
-    <w:p>
-      <w:pPr>
-        <w:rPr>
-          <w:rFonts w:ascii="Arial" w:hAnsi="Arial" w:cs="Arial"/>
-          <w:lang w:val="es-ES" w:eastAsia="es-EC"/>
-        </w:rPr>
-      </w:pPr>
-      <w:r>
-        <w:rPr>
-          <w:rFonts w:ascii="Arial" w:hAnsi="Arial" w:cs="Arial"/>
-          <w:b/>
-          <w:bCs/>
-          <w:lang w:val="es-ES" w:eastAsia="es-EC"/>
-        </w:rPr>
         <w:t>Propósito: </w:t>
       </w:r>
       <w:r>
@@ -4757,25 +5990,6 @@
           <w:bCs/>
           <w:lang w:val="es-ES" w:eastAsia="es-EC"/>
         </w:rPr>
-        <w:t>Qué va en el Word (sección 4):</w:t>
-      </w:r>
-    </w:p>
-    <w:p>
-      <w:pPr>
-        <w:rPr>
-          <w:rFonts w:ascii="Arial" w:hAnsi="Arial" w:cs="Arial"/>
-          <w:b/>
-          <w:bCs/>
-          <w:lang w:val="es-ES" w:eastAsia="es-EC"/>
-        </w:rPr>
-      </w:pPr>
-      <w:r>
-        <w:rPr>
-          <w:rFonts w:ascii="Arial" w:hAnsi="Arial" w:cs="Arial"/>
-          <w:b/>
-          <w:bCs/>
-          <w:lang w:val="es-ES" w:eastAsia="es-EC"/>
-        </w:rPr>
         <w:t>4. Diagrama de secuencia</w:t>
       </w:r>
     </w:p>
@@ -4817,15 +6031,6 @@
           <w:lang w:val="es-ES" w:eastAsia="es-EC"/>
         </w:rPr>
       </w:pPr>
-      <w:r>
-        <w:rPr>
-          <w:rFonts w:ascii="Arial" w:hAnsi="Arial" w:cs="Arial"/>
-          <w:i/>
-          <w:iCs/>
-          <w:lang w:val="es-ES" w:eastAsia="es-EC"/>
-        </w:rPr>
-        <w:t>(Aquí irás pegar el diagrama de secuencia)</w:t>
-      </w:r>
     </w:p>
     <w:p>
       <w:pPr>
@@ -4872,6 +6077,7 @@
           <w:rFonts w:ascii="Arial" w:hAnsi="Arial" w:cs="Arial"/>
           <w:b/>
           <w:bCs/>
+          <w:noProof/>
           <w:lang w:eastAsia="es-EC"/>
         </w:rPr>
         <w:drawing>
@@ -5063,7 +6269,7 @@
           </mc:Choice>
           <mc:Fallback>
             <w:pict>
-              <v:rect w14:anchorId="54327595" id="Rectángulo 3" o:spid="_x0000_s1026" style="width:23.7pt;height:23.7pt;visibility:visible;mso-wrap-style:square;mso-left-percent:-10001;mso-top-percent:-10001;mso-position-horizontal:absolute;mso-position-horizontal-relative:char;mso-position-vertical:absolute;mso-position-vertical-relative:line;mso-left-percent:-10001;mso-top-percent:-10001;v-text-anchor:top" o:gfxdata="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" filled="f" stroked="f">
+              <v:rect w14:anchorId="3DC92F3E" id="Rectángulo 3" o:spid="_x0000_s1026" style="width:23.7pt;height:23.7pt;visibility:visible;mso-wrap-style:square;mso-left-percent:-10001;mso-top-percent:-10001;mso-position-horizontal:absolute;mso-position-horizontal-relative:char;mso-position-vertical:absolute;mso-position-vertical-relative:line;mso-left-percent:-10001;mso-top-percent:-10001;v-text-anchor:top" o:gfxdata="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" filled="f" stroked="f">
                 <o:lock v:ext="edit" aspectratio="t"/>
                 <w10:anchorlock/>
               </v:rect>
@@ -5088,33 +6294,33 @@
           <w:bCs/>
           <w:lang w:val="es-ES" w:eastAsia="es-EC"/>
         </w:rPr>
+        <w:t xml:space="preserve">5. Justificación del uso de </w:t>
+      </w:r>
+      <w:proofErr w:type="spellStart"/>
+      <w:r>
+        <w:rPr>
+          <w:rFonts w:ascii="Arial" w:hAnsi="Arial" w:cs="Arial"/>
+          <w:b/>
+          <w:bCs/>
+          <w:lang w:val="es-ES" w:eastAsia="es-EC"/>
+        </w:rPr>
+        <w:t>Gitflow</w:t>
+      </w:r>
+      <w:proofErr w:type="spellEnd"/>
+    </w:p>
+    <w:p>
+      <w:pPr>
+        <w:rPr>
+          <w:rFonts w:ascii="Arial" w:hAnsi="Arial" w:cs="Arial"/>
+          <w:lang w:val="es-ES" w:eastAsia="es-EC"/>
+        </w:rPr>
+      </w:pPr>
+      <w:r>
+        <w:rPr>
+          <w:rFonts w:ascii="Arial" w:hAnsi="Arial" w:cs="Arial"/>
+          <w:lang w:val="es-ES" w:eastAsia="es-EC"/>
+        </w:rPr>
         <w:lastRenderedPageBreak/>
-        <w:t xml:space="preserve">5. Justificación del uso de </w:t>
-      </w:r>
-      <w:proofErr w:type="spellStart"/>
-      <w:r>
-        <w:rPr>
-          <w:rFonts w:ascii="Arial" w:hAnsi="Arial" w:cs="Arial"/>
-          <w:b/>
-          <w:bCs/>
-          <w:lang w:val="es-ES" w:eastAsia="es-EC"/>
-        </w:rPr>
-        <w:t>Gitflow</w:t>
-      </w:r>
-      <w:proofErr w:type="spellEnd"/>
-    </w:p>
-    <w:p>
-      <w:pPr>
-        <w:rPr>
-          <w:rFonts w:ascii="Arial" w:hAnsi="Arial" w:cs="Arial"/>
-          <w:lang w:val="es-ES" w:eastAsia="es-EC"/>
-        </w:rPr>
-      </w:pPr>
-      <w:r>
-        <w:rPr>
-          <w:rFonts w:ascii="Arial" w:hAnsi="Arial" w:cs="Arial"/>
-          <w:lang w:val="es-ES" w:eastAsia="es-EC"/>
-        </w:rPr>
         <w:t>Se utilizó el modelo </w:t>
       </w:r>
       <w:proofErr w:type="spellStart"/>
@@ -5850,7 +7056,7 @@
         </w:rPr>
         <w:lastRenderedPageBreak/>
         <w:drawing>
-          <wp:anchor distT="0" distB="0" distL="114300" distR="114300" simplePos="0" relativeHeight="251670528" behindDoc="0" locked="0" layoutInCell="1" allowOverlap="1" wp14:anchorId="31BCD5F0" wp14:editId="417A0F15">
+          <wp:anchor distT="0" distB="0" distL="114300" distR="114300" simplePos="0" relativeHeight="251670528" behindDoc="0" locked="0" layoutInCell="1" allowOverlap="1" wp14:anchorId="31BCD5F0" wp14:editId="66D39A4E">
             <wp:simplePos x="0" y="0"/>
             <wp:positionH relativeFrom="margin">
               <wp:posOffset>-207034</wp:posOffset>
@@ -5930,6 +7136,7 @@
       <w:r>
         <w:rPr>
           <w:rFonts w:ascii="Arial" w:hAnsi="Arial" w:cs="Arial"/>
+          <w:noProof/>
           <w:lang w:val="es-ES" w:eastAsia="es-EC"/>
         </w:rPr>
         <w:drawing>
@@ -6119,15 +7326,15 @@
           <w:noProof/>
         </w:rPr>
         <w:drawing>
-          <wp:anchor distT="0" distB="0" distL="114300" distR="114300" simplePos="0" relativeHeight="251672576" behindDoc="0" locked="0" layoutInCell="1" allowOverlap="1" wp14:anchorId="3BE39397" wp14:editId="0C5438E1">
+          <wp:anchor distT="0" distB="0" distL="114300" distR="114300" simplePos="0" relativeHeight="251672576" behindDoc="0" locked="0" layoutInCell="1" allowOverlap="1" wp14:anchorId="3BE39397" wp14:editId="32795E57">
             <wp:simplePos x="0" y="0"/>
             <wp:positionH relativeFrom="margin">
-              <wp:posOffset>230505</wp:posOffset>
+              <wp:align>left</wp:align>
             </wp:positionH>
             <wp:positionV relativeFrom="paragraph">
-              <wp:posOffset>247650</wp:posOffset>
+              <wp:posOffset>307853</wp:posOffset>
             </wp:positionV>
-            <wp:extent cx="5089525" cy="4439285"/>
+            <wp:extent cx="5601335" cy="4885690"/>
             <wp:effectExtent l="0" t="0" r="0" b="0"/>
             <wp:wrapSquare wrapText="bothSides"/>
             <wp:docPr id="1191636616" name="Imagen 5"/>
@@ -6159,7 +7366,7 @@
                   <pic:spPr bwMode="auto">
                     <a:xfrm>
                       <a:off x="0" y="0"/>
-                      <a:ext cx="5089525" cy="4439285"/>
+                      <a:ext cx="5601335" cy="4885690"/>
                     </a:xfrm>
                     <a:prstGeom prst="rect">
                       <a:avLst/>
@@ -6282,31 +7489,6 @@
           <w:lang w:val="es-ES" w:eastAsia="es-EC"/>
         </w:rPr>
       </w:pPr>
-    </w:p>
-    <w:p>
-      <w:pPr>
-        <w:rPr>
-          <w:rFonts w:ascii="Arial" w:hAnsi="Arial" w:cs="Arial"/>
-          <w:lang w:val="es-ES" w:eastAsia="es-EC"/>
-        </w:rPr>
-      </w:pPr>
-    </w:p>
-    <w:p>
-      <w:pPr>
-        <w:rPr>
-          <w:rFonts w:ascii="Arial" w:hAnsi="Arial" w:cs="Arial"/>
-          <w:lang w:val="es-ES" w:eastAsia="es-EC"/>
-        </w:rPr>
-      </w:pPr>
-      <w:r>
-        <w:rPr>
-          <w:rFonts w:ascii="Arial" w:hAnsi="Arial" w:cs="Arial"/>
-          <w:i/>
-          <w:iCs/>
-          <w:lang w:val="es-ES" w:eastAsia="es-EC"/>
-        </w:rPr>
-        <w:t>(Aquí va la captura del PR #1)</w:t>
-      </w:r>
     </w:p>
     <w:p>
       <w:pPr>
@@ -6534,158 +7716,6 @@
     </w:p>
     <w:p>
       <w:pPr>
-        <w:rPr>
-          <w:rFonts w:ascii="Arial" w:hAnsi="Arial" w:cs="Arial"/>
-          <w:b/>
-          <w:bCs/>
-          <w:lang w:eastAsia="es-EC"/>
-        </w:rPr>
-      </w:pPr>
-    </w:p>
-    <w:p>
-      <w:pPr>
-        <w:rPr>
-          <w:rFonts w:ascii="Arial" w:hAnsi="Arial" w:cs="Arial"/>
-          <w:b/>
-          <w:bCs/>
-          <w:lang w:eastAsia="es-EC"/>
-        </w:rPr>
-      </w:pPr>
-    </w:p>
-    <w:p>
-      <w:pPr>
-        <w:rPr>
-          <w:rFonts w:ascii="Arial" w:hAnsi="Arial" w:cs="Arial"/>
-          <w:b/>
-          <w:bCs/>
-          <w:lang w:eastAsia="es-EC"/>
-        </w:rPr>
-      </w:pPr>
-    </w:p>
-    <w:p>
-      <w:pPr>
-        <w:rPr>
-          <w:rFonts w:ascii="Arial" w:hAnsi="Arial" w:cs="Arial"/>
-          <w:b/>
-          <w:bCs/>
-          <w:lang w:eastAsia="es-EC"/>
-        </w:rPr>
-      </w:pPr>
-    </w:p>
-    <w:p>
-      <w:pPr>
-        <w:rPr>
-          <w:rFonts w:ascii="Arial" w:hAnsi="Arial" w:cs="Arial"/>
-          <w:b/>
-          <w:bCs/>
-          <w:lang w:eastAsia="es-EC"/>
-        </w:rPr>
-      </w:pPr>
-    </w:p>
-    <w:p>
-      <w:pPr>
-        <w:rPr>
-          <w:rFonts w:ascii="Arial" w:hAnsi="Arial" w:cs="Arial"/>
-          <w:b/>
-          <w:bCs/>
-          <w:lang w:eastAsia="es-EC"/>
-        </w:rPr>
-      </w:pPr>
-    </w:p>
-    <w:p>
-      <w:pPr>
-        <w:rPr>
-          <w:rFonts w:ascii="Arial" w:hAnsi="Arial" w:cs="Arial"/>
-          <w:b/>
-          <w:bCs/>
-          <w:lang w:eastAsia="es-EC"/>
-        </w:rPr>
-      </w:pPr>
-    </w:p>
-    <w:p>
-      <w:pPr>
-        <w:rPr>
-          <w:rFonts w:ascii="Arial" w:hAnsi="Arial" w:cs="Arial"/>
-          <w:b/>
-          <w:bCs/>
-          <w:lang w:eastAsia="es-EC"/>
-        </w:rPr>
-      </w:pPr>
-    </w:p>
-    <w:p>
-      <w:pPr>
-        <w:rPr>
-          <w:rFonts w:ascii="Arial" w:hAnsi="Arial" w:cs="Arial"/>
-          <w:b/>
-          <w:bCs/>
-          <w:lang w:eastAsia="es-EC"/>
-        </w:rPr>
-      </w:pPr>
-    </w:p>
-    <w:p>
-      <w:pPr>
-        <w:rPr>
-          <w:rFonts w:ascii="Arial" w:hAnsi="Arial" w:cs="Arial"/>
-          <w:b/>
-          <w:bCs/>
-          <w:lang w:eastAsia="es-EC"/>
-        </w:rPr>
-      </w:pPr>
-    </w:p>
-    <w:p>
-      <w:pPr>
-        <w:rPr>
-          <w:rFonts w:ascii="Arial" w:hAnsi="Arial" w:cs="Arial"/>
-          <w:b/>
-          <w:bCs/>
-          <w:lang w:eastAsia="es-EC"/>
-        </w:rPr>
-      </w:pPr>
-    </w:p>
-    <w:p>
-      <w:pPr>
-        <w:rPr>
-          <w:rFonts w:ascii="Arial" w:hAnsi="Arial" w:cs="Arial"/>
-          <w:b/>
-          <w:bCs/>
-          <w:lang w:eastAsia="es-EC"/>
-        </w:rPr>
-      </w:pPr>
-    </w:p>
-    <w:p>
-      <w:pPr>
-        <w:rPr>
-          <w:rFonts w:ascii="Arial" w:hAnsi="Arial" w:cs="Arial"/>
-          <w:b/>
-          <w:bCs/>
-          <w:lang w:val="es-ES" w:eastAsia="es-EC"/>
-        </w:rPr>
-      </w:pPr>
-    </w:p>
-    <w:p>
-      <w:pPr>
-        <w:pStyle w:val="Sinespaciado"/>
-        <w:spacing w:line="360" w:lineRule="auto"/>
-        <w:jc w:val="both"/>
-        <w:rPr>
-          <w:rFonts w:ascii="Arial" w:hAnsi="Arial" w:cs="Arial"/>
-          <w:b/>
-          <w:bCs/>
-          <w:lang w:eastAsia="es-EC"/>
-        </w:rPr>
-      </w:pPr>
-      <w:r>
-        <w:rPr>
-          <w:rFonts w:ascii="Arial" w:hAnsi="Arial" w:cs="Arial"/>
-          <w:b/>
-          <w:bCs/>
-          <w:lang w:eastAsia="es-EC"/>
-        </w:rPr>
-        <w:t>Evidencias</w:t>
-      </w:r>
-    </w:p>
-    <w:p>
-      <w:pPr>
         <w:widowControl w:val="0"/>
         <w:pBdr>
           <w:top w:val="nil"/>
@@ -6711,58 +7741,1123 @@
           <w:rFonts w:ascii="Arial" w:hAnsi="Arial" w:cs="Arial"/>
           <w:b/>
           <w:bCs/>
+          <w:sz w:val="24"/>
+          <w:szCs w:val="24"/>
+          <w:lang w:eastAsia="es-EC"/>
+        </w:rPr>
+        <w:br w:type="page"/>
+      </w:r>
+    </w:p>
+    <w:p>
+      <w:pPr>
+        <w:pStyle w:val="Sinespaciado"/>
+        <w:spacing w:line="360" w:lineRule="auto"/>
+        <w:jc w:val="both"/>
+        <w:rPr>
+          <w:rFonts w:ascii="Arial" w:hAnsi="Arial" w:cs="Arial"/>
+          <w:b/>
+          <w:bCs/>
+          <w:lang w:eastAsia="es-EC"/>
+        </w:rPr>
+      </w:pPr>
+      <w:r>
+        <w:rPr>
+          <w:rFonts w:ascii="Arial" w:hAnsi="Arial" w:cs="Arial"/>
+          <w:b/>
+          <w:bCs/>
+          <w:lang w:eastAsia="es-EC"/>
+        </w:rPr>
+        <w:lastRenderedPageBreak/>
+        <w:t>Bibliografía</w:t>
+      </w:r>
+    </w:p>
+    <w:p>
+      <w:pPr>
+        <w:pStyle w:val="Prrafodelista"/>
+        <w:widowControl w:val="0"/>
+        <w:numPr>
+          <w:ilvl w:val="0"/>
+          <w:numId w:val="28"/>
+        </w:numPr>
+        <w:pBdr>
+          <w:top w:val="nil"/>
+          <w:left w:val="nil"/>
+          <w:bottom w:val="nil"/>
+          <w:right w:val="nil"/>
+          <w:between w:val="nil"/>
+        </w:pBdr>
+        <w:spacing w:after="0" w:line="360" w:lineRule="auto"/>
+        <w:jc w:val="both"/>
+        <w:rPr>
+          <w:rFonts w:ascii="Arial" w:hAnsi="Arial" w:cs="Arial"/>
           <w:i/>
           <w:iCs/>
           <w:sz w:val="20"/>
           <w:szCs w:val="20"/>
-          <w:lang w:eastAsia="es-EC"/>
-        </w:rPr>
-        <w:t>(</w:t>
-      </w:r>
-      <w:r>
-        <w:rPr>
-          <w:rFonts w:ascii="Arial" w:eastAsia="Arial" w:hAnsi="Arial" w:cs="Arial"/>
+          <w:lang w:val="es-ES" w:eastAsia="es-EC"/>
+        </w:rPr>
+      </w:pPr>
+      <w:proofErr w:type="spellStart"/>
+      <w:r>
+        <w:rPr>
+          <w:rFonts w:ascii="Arial" w:hAnsi="Arial" w:cs="Arial"/>
           <w:i/>
           <w:iCs/>
-          <w:color w:val="000000"/>
           <w:sz w:val="20"/>
           <w:szCs w:val="20"/>
-        </w:rPr>
-        <w:t>Código de la ejecución de los ejercicios, enlace drive donde se encuentren los mismos y Capturas de pantalla claras y relevantes, donde evidencie el proceso realizado).</w:t>
-      </w:r>
-      <w:r>
-        <w:rPr>
-          <w:rFonts w:ascii="Arial" w:hAnsi="Arial" w:cs="Arial"/>
-          <w:b/>
-          <w:bCs/>
-          <w:sz w:val="24"/>
-          <w:szCs w:val="24"/>
-          <w:lang w:eastAsia="es-EC"/>
-        </w:rPr>
-        <w:br w:type="page"/>
-      </w:r>
-    </w:p>
-    <w:p>
-      <w:pPr>
-        <w:pStyle w:val="Sinespaciado"/>
-        <w:spacing w:line="360" w:lineRule="auto"/>
+          <w:lang w:val="es-ES" w:eastAsia="es-EC"/>
+        </w:rPr>
+        <w:t>Chacon</w:t>
+      </w:r>
+      <w:proofErr w:type="spellEnd"/>
+      <w:r>
+        <w:rPr>
+          <w:rFonts w:ascii="Arial" w:hAnsi="Arial" w:cs="Arial"/>
+          <w:i/>
+          <w:iCs/>
+          <w:sz w:val="20"/>
+          <w:szCs w:val="20"/>
+          <w:lang w:val="es-ES" w:eastAsia="es-EC"/>
+        </w:rPr>
+        <w:t xml:space="preserve">, S., &amp; Straub, B. (2014). Pro Git (2.ª ed.). </w:t>
+      </w:r>
+      <w:proofErr w:type="spellStart"/>
+      <w:r>
+        <w:rPr>
+          <w:rFonts w:ascii="Arial" w:hAnsi="Arial" w:cs="Arial"/>
+          <w:i/>
+          <w:iCs/>
+          <w:sz w:val="20"/>
+          <w:szCs w:val="20"/>
+          <w:lang w:val="es-ES" w:eastAsia="es-EC"/>
+        </w:rPr>
+        <w:t>Apress</w:t>
+      </w:r>
+      <w:proofErr w:type="spellEnd"/>
+      <w:r>
+        <w:rPr>
+          <w:rFonts w:ascii="Arial" w:hAnsi="Arial" w:cs="Arial"/>
+          <w:i/>
+          <w:iCs/>
+          <w:sz w:val="20"/>
+          <w:szCs w:val="20"/>
+          <w:lang w:val="es-ES" w:eastAsia="es-EC"/>
+        </w:rPr>
+        <w:t>. </w:t>
+      </w:r>
+      <w:hyperlink r:id="rId24" w:tgtFrame="_blank" w:history="1">
+        <w:r>
+          <w:rPr>
+            <w:rStyle w:val="Hipervnculo"/>
+            <w:rFonts w:ascii="Arial" w:hAnsi="Arial" w:cs="Arial"/>
+            <w:i/>
+            <w:iCs/>
+            <w:sz w:val="20"/>
+            <w:szCs w:val="20"/>
+            <w:lang w:val="es-ES" w:eastAsia="es-EC"/>
+          </w:rPr>
+          <w:t>https://git-scm.com/book/es/v2</w:t>
+        </w:r>
+      </w:hyperlink>
+    </w:p>
+    <w:p>
+      <w:pPr>
+        <w:pStyle w:val="Prrafodelista"/>
+        <w:widowControl w:val="0"/>
+        <w:numPr>
+          <w:ilvl w:val="0"/>
+          <w:numId w:val="28"/>
+        </w:numPr>
+        <w:pBdr>
+          <w:top w:val="nil"/>
+          <w:left w:val="nil"/>
+          <w:bottom w:val="nil"/>
+          <w:right w:val="nil"/>
+          <w:between w:val="nil"/>
+        </w:pBdr>
+        <w:spacing w:after="0" w:line="360" w:lineRule="auto"/>
         <w:jc w:val="both"/>
         <w:rPr>
           <w:rFonts w:ascii="Arial" w:hAnsi="Arial" w:cs="Arial"/>
-          <w:b/>
-          <w:bCs/>
-          <w:lang w:eastAsia="es-EC"/>
-        </w:rPr>
-      </w:pPr>
-      <w:r>
-        <w:rPr>
-          <w:rFonts w:ascii="Arial" w:hAnsi="Arial" w:cs="Arial"/>
-          <w:b/>
-          <w:bCs/>
-          <w:lang w:eastAsia="es-EC"/>
-        </w:rPr>
-        <w:lastRenderedPageBreak/>
-        <w:t>Bibliografía</w:t>
+          <w:i/>
+          <w:iCs/>
+          <w:sz w:val="20"/>
+          <w:szCs w:val="20"/>
+          <w:lang w:val="es-ES" w:eastAsia="es-EC"/>
+        </w:rPr>
+      </w:pPr>
+      <w:r>
+        <w:rPr>
+          <w:rFonts w:ascii="Arial" w:hAnsi="Arial" w:cs="Arial"/>
+          <w:i/>
+          <w:iCs/>
+          <w:sz w:val="20"/>
+          <w:szCs w:val="20"/>
+          <w:lang w:val="es-ES" w:eastAsia="es-EC"/>
+        </w:rPr>
+        <w:t xml:space="preserve">Driessen, V. (2010). A </w:t>
+      </w:r>
+      <w:proofErr w:type="spellStart"/>
+      <w:r>
+        <w:rPr>
+          <w:rFonts w:ascii="Arial" w:hAnsi="Arial" w:cs="Arial"/>
+          <w:i/>
+          <w:iCs/>
+          <w:sz w:val="20"/>
+          <w:szCs w:val="20"/>
+          <w:lang w:val="es-ES" w:eastAsia="es-EC"/>
+        </w:rPr>
+        <w:t>successful</w:t>
+      </w:r>
+      <w:proofErr w:type="spellEnd"/>
+      <w:r>
+        <w:rPr>
+          <w:rFonts w:ascii="Arial" w:hAnsi="Arial" w:cs="Arial"/>
+          <w:i/>
+          <w:iCs/>
+          <w:sz w:val="20"/>
+          <w:szCs w:val="20"/>
+          <w:lang w:val="es-ES" w:eastAsia="es-EC"/>
+        </w:rPr>
+        <w:t xml:space="preserve"> Git </w:t>
+      </w:r>
+      <w:proofErr w:type="spellStart"/>
+      <w:r>
+        <w:rPr>
+          <w:rFonts w:ascii="Arial" w:hAnsi="Arial" w:cs="Arial"/>
+          <w:i/>
+          <w:iCs/>
+          <w:sz w:val="20"/>
+          <w:szCs w:val="20"/>
+          <w:lang w:val="es-ES" w:eastAsia="es-EC"/>
+        </w:rPr>
+        <w:t>branching</w:t>
+      </w:r>
+      <w:proofErr w:type="spellEnd"/>
+      <w:r>
+        <w:rPr>
+          <w:rFonts w:ascii="Arial" w:hAnsi="Arial" w:cs="Arial"/>
+          <w:i/>
+          <w:iCs/>
+          <w:sz w:val="20"/>
+          <w:szCs w:val="20"/>
+          <w:lang w:val="es-ES" w:eastAsia="es-EC"/>
+        </w:rPr>
+        <w:t xml:space="preserve"> </w:t>
+      </w:r>
+      <w:proofErr w:type="spellStart"/>
+      <w:r>
+        <w:rPr>
+          <w:rFonts w:ascii="Arial" w:hAnsi="Arial" w:cs="Arial"/>
+          <w:i/>
+          <w:iCs/>
+          <w:sz w:val="20"/>
+          <w:szCs w:val="20"/>
+          <w:lang w:val="es-ES" w:eastAsia="es-EC"/>
+        </w:rPr>
+        <w:t>model</w:t>
+      </w:r>
+      <w:proofErr w:type="spellEnd"/>
+      <w:r>
+        <w:rPr>
+          <w:rFonts w:ascii="Arial" w:hAnsi="Arial" w:cs="Arial"/>
+          <w:i/>
+          <w:iCs/>
+          <w:sz w:val="20"/>
+          <w:szCs w:val="20"/>
+          <w:lang w:val="es-ES" w:eastAsia="es-EC"/>
+        </w:rPr>
+        <w:t>. </w:t>
+      </w:r>
+      <w:hyperlink r:id="rId25" w:tgtFrame="_blank" w:history="1">
+        <w:r>
+          <w:rPr>
+            <w:rStyle w:val="Hipervnculo"/>
+            <w:rFonts w:ascii="Arial" w:hAnsi="Arial" w:cs="Arial"/>
+            <w:i/>
+            <w:iCs/>
+            <w:sz w:val="20"/>
+            <w:szCs w:val="20"/>
+            <w:lang w:val="es-ES" w:eastAsia="es-EC"/>
+          </w:rPr>
+          <w:t>https://nvie.com/posts/a-successful-git-branching-model/</w:t>
+        </w:r>
+      </w:hyperlink>
+    </w:p>
+    <w:p>
+      <w:pPr>
+        <w:pStyle w:val="Prrafodelista"/>
+        <w:widowControl w:val="0"/>
+        <w:numPr>
+          <w:ilvl w:val="0"/>
+          <w:numId w:val="28"/>
+        </w:numPr>
+        <w:pBdr>
+          <w:top w:val="nil"/>
+          <w:left w:val="nil"/>
+          <w:bottom w:val="nil"/>
+          <w:right w:val="nil"/>
+          <w:between w:val="nil"/>
+        </w:pBdr>
+        <w:spacing w:after="0" w:line="360" w:lineRule="auto"/>
+        <w:jc w:val="both"/>
+        <w:rPr>
+          <w:rFonts w:ascii="Arial" w:hAnsi="Arial" w:cs="Arial"/>
+          <w:i/>
+          <w:iCs/>
+          <w:sz w:val="20"/>
+          <w:szCs w:val="20"/>
+          <w:lang w:val="es-ES" w:eastAsia="es-EC"/>
+        </w:rPr>
+      </w:pPr>
+      <w:r>
+        <w:rPr>
+          <w:rFonts w:ascii="Arial" w:hAnsi="Arial" w:cs="Arial"/>
+          <w:i/>
+          <w:iCs/>
+          <w:sz w:val="20"/>
+          <w:szCs w:val="20"/>
+          <w:lang w:val="es-ES" w:eastAsia="es-EC"/>
+        </w:rPr>
+        <w:t>Fowler, M. (2002). </w:t>
+      </w:r>
+      <w:proofErr w:type="spellStart"/>
+      <w:r>
+        <w:rPr>
+          <w:rFonts w:ascii="Arial" w:hAnsi="Arial" w:cs="Arial"/>
+          <w:i/>
+          <w:iCs/>
+          <w:sz w:val="20"/>
+          <w:szCs w:val="20"/>
+          <w:lang w:val="es-ES" w:eastAsia="es-EC"/>
+        </w:rPr>
+        <w:t>Patterns</w:t>
+      </w:r>
+      <w:proofErr w:type="spellEnd"/>
+      <w:r>
+        <w:rPr>
+          <w:rFonts w:ascii="Arial" w:hAnsi="Arial" w:cs="Arial"/>
+          <w:i/>
+          <w:iCs/>
+          <w:sz w:val="20"/>
+          <w:szCs w:val="20"/>
+          <w:lang w:val="es-ES" w:eastAsia="es-EC"/>
+        </w:rPr>
+        <w:t xml:space="preserve"> </w:t>
+      </w:r>
+      <w:proofErr w:type="spellStart"/>
+      <w:r>
+        <w:rPr>
+          <w:rFonts w:ascii="Arial" w:hAnsi="Arial" w:cs="Arial"/>
+          <w:i/>
+          <w:iCs/>
+          <w:sz w:val="20"/>
+          <w:szCs w:val="20"/>
+          <w:lang w:val="es-ES" w:eastAsia="es-EC"/>
+        </w:rPr>
+        <w:t>of</w:t>
+      </w:r>
+      <w:proofErr w:type="spellEnd"/>
+      <w:r>
+        <w:rPr>
+          <w:rFonts w:ascii="Arial" w:hAnsi="Arial" w:cs="Arial"/>
+          <w:i/>
+          <w:iCs/>
+          <w:sz w:val="20"/>
+          <w:szCs w:val="20"/>
+          <w:lang w:val="es-ES" w:eastAsia="es-EC"/>
+        </w:rPr>
+        <w:t xml:space="preserve"> </w:t>
+      </w:r>
+      <w:proofErr w:type="spellStart"/>
+      <w:r>
+        <w:rPr>
+          <w:rFonts w:ascii="Arial" w:hAnsi="Arial" w:cs="Arial"/>
+          <w:i/>
+          <w:iCs/>
+          <w:sz w:val="20"/>
+          <w:szCs w:val="20"/>
+          <w:lang w:val="es-ES" w:eastAsia="es-EC"/>
+        </w:rPr>
+        <w:t>enterprise</w:t>
+      </w:r>
+      <w:proofErr w:type="spellEnd"/>
+      <w:r>
+        <w:rPr>
+          <w:rFonts w:ascii="Arial" w:hAnsi="Arial" w:cs="Arial"/>
+          <w:i/>
+          <w:iCs/>
+          <w:sz w:val="20"/>
+          <w:szCs w:val="20"/>
+          <w:lang w:val="es-ES" w:eastAsia="es-EC"/>
+        </w:rPr>
+        <w:t xml:space="preserve"> </w:t>
+      </w:r>
+      <w:proofErr w:type="spellStart"/>
+      <w:r>
+        <w:rPr>
+          <w:rFonts w:ascii="Arial" w:hAnsi="Arial" w:cs="Arial"/>
+          <w:i/>
+          <w:iCs/>
+          <w:sz w:val="20"/>
+          <w:szCs w:val="20"/>
+          <w:lang w:val="es-ES" w:eastAsia="es-EC"/>
+        </w:rPr>
+        <w:t>application</w:t>
+      </w:r>
+      <w:proofErr w:type="spellEnd"/>
+      <w:r>
+        <w:rPr>
+          <w:rFonts w:ascii="Arial" w:hAnsi="Arial" w:cs="Arial"/>
+          <w:i/>
+          <w:iCs/>
+          <w:sz w:val="20"/>
+          <w:szCs w:val="20"/>
+          <w:lang w:val="es-ES" w:eastAsia="es-EC"/>
+        </w:rPr>
+        <w:t xml:space="preserve"> </w:t>
+      </w:r>
+      <w:proofErr w:type="spellStart"/>
+      <w:r>
+        <w:rPr>
+          <w:rFonts w:ascii="Arial" w:hAnsi="Arial" w:cs="Arial"/>
+          <w:i/>
+          <w:iCs/>
+          <w:sz w:val="20"/>
+          <w:szCs w:val="20"/>
+          <w:lang w:val="es-ES" w:eastAsia="es-EC"/>
+        </w:rPr>
+        <w:t>architecture</w:t>
+      </w:r>
+      <w:proofErr w:type="spellEnd"/>
+      <w:r>
+        <w:rPr>
+          <w:rFonts w:ascii="Arial" w:hAnsi="Arial" w:cs="Arial"/>
+          <w:i/>
+          <w:iCs/>
+          <w:sz w:val="20"/>
+          <w:szCs w:val="20"/>
+          <w:lang w:val="es-ES" w:eastAsia="es-EC"/>
+        </w:rPr>
+        <w:t>. Addison-Wesley.</w:t>
+      </w:r>
+    </w:p>
+    <w:p>
+      <w:pPr>
+        <w:pStyle w:val="Prrafodelista"/>
+        <w:widowControl w:val="0"/>
+        <w:numPr>
+          <w:ilvl w:val="0"/>
+          <w:numId w:val="28"/>
+        </w:numPr>
+        <w:pBdr>
+          <w:top w:val="nil"/>
+          <w:left w:val="nil"/>
+          <w:bottom w:val="nil"/>
+          <w:right w:val="nil"/>
+          <w:between w:val="nil"/>
+        </w:pBdr>
+        <w:spacing w:after="0" w:line="360" w:lineRule="auto"/>
+        <w:jc w:val="both"/>
+        <w:rPr>
+          <w:rFonts w:ascii="Arial" w:hAnsi="Arial" w:cs="Arial"/>
+          <w:i/>
+          <w:iCs/>
+          <w:sz w:val="20"/>
+          <w:szCs w:val="20"/>
+          <w:lang w:val="es-ES" w:eastAsia="es-EC"/>
+        </w:rPr>
+      </w:pPr>
+      <w:r>
+        <w:rPr>
+          <w:rFonts w:ascii="Arial" w:hAnsi="Arial" w:cs="Arial"/>
+          <w:i/>
+          <w:iCs/>
+          <w:sz w:val="20"/>
+          <w:szCs w:val="20"/>
+          <w:lang w:val="es-ES" w:eastAsia="es-EC"/>
+        </w:rPr>
+        <w:t xml:space="preserve">Gamma, E., Helm, R., Johnson, R., &amp; </w:t>
+      </w:r>
+      <w:proofErr w:type="spellStart"/>
+      <w:r>
+        <w:rPr>
+          <w:rFonts w:ascii="Arial" w:hAnsi="Arial" w:cs="Arial"/>
+          <w:i/>
+          <w:iCs/>
+          <w:sz w:val="20"/>
+          <w:szCs w:val="20"/>
+          <w:lang w:val="es-ES" w:eastAsia="es-EC"/>
+        </w:rPr>
+        <w:t>Vlissides</w:t>
+      </w:r>
+      <w:proofErr w:type="spellEnd"/>
+      <w:r>
+        <w:rPr>
+          <w:rFonts w:ascii="Arial" w:hAnsi="Arial" w:cs="Arial"/>
+          <w:i/>
+          <w:iCs/>
+          <w:sz w:val="20"/>
+          <w:szCs w:val="20"/>
+          <w:lang w:val="es-ES" w:eastAsia="es-EC"/>
+        </w:rPr>
+        <w:t>, J. (1994). </w:t>
+      </w:r>
+      <w:proofErr w:type="spellStart"/>
+      <w:r>
+        <w:rPr>
+          <w:rFonts w:ascii="Arial" w:hAnsi="Arial" w:cs="Arial"/>
+          <w:i/>
+          <w:iCs/>
+          <w:sz w:val="20"/>
+          <w:szCs w:val="20"/>
+          <w:lang w:val="es-ES" w:eastAsia="es-EC"/>
+        </w:rPr>
+        <w:t>Design</w:t>
+      </w:r>
+      <w:proofErr w:type="spellEnd"/>
+      <w:r>
+        <w:rPr>
+          <w:rFonts w:ascii="Arial" w:hAnsi="Arial" w:cs="Arial"/>
+          <w:i/>
+          <w:iCs/>
+          <w:sz w:val="20"/>
+          <w:szCs w:val="20"/>
+          <w:lang w:val="es-ES" w:eastAsia="es-EC"/>
+        </w:rPr>
+        <w:t xml:space="preserve"> </w:t>
+      </w:r>
+      <w:proofErr w:type="spellStart"/>
+      <w:r>
+        <w:rPr>
+          <w:rFonts w:ascii="Arial" w:hAnsi="Arial" w:cs="Arial"/>
+          <w:i/>
+          <w:iCs/>
+          <w:sz w:val="20"/>
+          <w:szCs w:val="20"/>
+          <w:lang w:val="es-ES" w:eastAsia="es-EC"/>
+        </w:rPr>
+        <w:t>patterns</w:t>
+      </w:r>
+      <w:proofErr w:type="spellEnd"/>
+      <w:r>
+        <w:rPr>
+          <w:rFonts w:ascii="Arial" w:hAnsi="Arial" w:cs="Arial"/>
+          <w:i/>
+          <w:iCs/>
+          <w:sz w:val="20"/>
+          <w:szCs w:val="20"/>
+          <w:lang w:val="es-ES" w:eastAsia="es-EC"/>
+        </w:rPr>
+        <w:t xml:space="preserve">: </w:t>
+      </w:r>
+      <w:proofErr w:type="spellStart"/>
+      <w:r>
+        <w:rPr>
+          <w:rFonts w:ascii="Arial" w:hAnsi="Arial" w:cs="Arial"/>
+          <w:i/>
+          <w:iCs/>
+          <w:sz w:val="20"/>
+          <w:szCs w:val="20"/>
+          <w:lang w:val="es-ES" w:eastAsia="es-EC"/>
+        </w:rPr>
+        <w:t>Elements</w:t>
+      </w:r>
+      <w:proofErr w:type="spellEnd"/>
+      <w:r>
+        <w:rPr>
+          <w:rFonts w:ascii="Arial" w:hAnsi="Arial" w:cs="Arial"/>
+          <w:i/>
+          <w:iCs/>
+          <w:sz w:val="20"/>
+          <w:szCs w:val="20"/>
+          <w:lang w:val="es-ES" w:eastAsia="es-EC"/>
+        </w:rPr>
+        <w:t xml:space="preserve"> </w:t>
+      </w:r>
+      <w:proofErr w:type="spellStart"/>
+      <w:r>
+        <w:rPr>
+          <w:rFonts w:ascii="Arial" w:hAnsi="Arial" w:cs="Arial"/>
+          <w:i/>
+          <w:iCs/>
+          <w:sz w:val="20"/>
+          <w:szCs w:val="20"/>
+          <w:lang w:val="es-ES" w:eastAsia="es-EC"/>
+        </w:rPr>
+        <w:t>of</w:t>
+      </w:r>
+      <w:proofErr w:type="spellEnd"/>
+      <w:r>
+        <w:rPr>
+          <w:rFonts w:ascii="Arial" w:hAnsi="Arial" w:cs="Arial"/>
+          <w:i/>
+          <w:iCs/>
+          <w:sz w:val="20"/>
+          <w:szCs w:val="20"/>
+          <w:lang w:val="es-ES" w:eastAsia="es-EC"/>
+        </w:rPr>
+        <w:t xml:space="preserve"> reusable </w:t>
+      </w:r>
+      <w:proofErr w:type="spellStart"/>
+      <w:r>
+        <w:rPr>
+          <w:rFonts w:ascii="Arial" w:hAnsi="Arial" w:cs="Arial"/>
+          <w:i/>
+          <w:iCs/>
+          <w:sz w:val="20"/>
+          <w:szCs w:val="20"/>
+          <w:lang w:val="es-ES" w:eastAsia="es-EC"/>
+        </w:rPr>
+        <w:t>object-oriented</w:t>
+      </w:r>
+      <w:proofErr w:type="spellEnd"/>
+      <w:r>
+        <w:rPr>
+          <w:rFonts w:ascii="Arial" w:hAnsi="Arial" w:cs="Arial"/>
+          <w:i/>
+          <w:iCs/>
+          <w:sz w:val="20"/>
+          <w:szCs w:val="20"/>
+          <w:lang w:val="es-ES" w:eastAsia="es-EC"/>
+        </w:rPr>
+        <w:t xml:space="preserve"> software. Addison-Wesley.</w:t>
+      </w:r>
+    </w:p>
+    <w:p>
+      <w:pPr>
+        <w:pStyle w:val="Prrafodelista"/>
+        <w:widowControl w:val="0"/>
+        <w:numPr>
+          <w:ilvl w:val="0"/>
+          <w:numId w:val="28"/>
+        </w:numPr>
+        <w:pBdr>
+          <w:top w:val="nil"/>
+          <w:left w:val="nil"/>
+          <w:bottom w:val="nil"/>
+          <w:right w:val="nil"/>
+          <w:between w:val="nil"/>
+        </w:pBdr>
+        <w:spacing w:after="0" w:line="360" w:lineRule="auto"/>
+        <w:jc w:val="both"/>
+        <w:rPr>
+          <w:rFonts w:ascii="Arial" w:hAnsi="Arial" w:cs="Arial"/>
+          <w:i/>
+          <w:iCs/>
+          <w:sz w:val="20"/>
+          <w:szCs w:val="20"/>
+          <w:lang w:val="es-ES" w:eastAsia="es-EC"/>
+        </w:rPr>
+      </w:pPr>
+      <w:r>
+        <w:rPr>
+          <w:rFonts w:ascii="Arial" w:hAnsi="Arial" w:cs="Arial"/>
+          <w:i/>
+          <w:iCs/>
+          <w:sz w:val="20"/>
+          <w:szCs w:val="20"/>
+          <w:lang w:val="es-ES" w:eastAsia="es-EC"/>
+        </w:rPr>
+        <w:t>Martin, R. C. (2009). </w:t>
+      </w:r>
+      <w:proofErr w:type="spellStart"/>
+      <w:r>
+        <w:rPr>
+          <w:rFonts w:ascii="Arial" w:hAnsi="Arial" w:cs="Arial"/>
+          <w:i/>
+          <w:iCs/>
+          <w:sz w:val="20"/>
+          <w:szCs w:val="20"/>
+          <w:lang w:val="es-ES" w:eastAsia="es-EC"/>
+        </w:rPr>
+        <w:t>Clean</w:t>
+      </w:r>
+      <w:proofErr w:type="spellEnd"/>
+      <w:r>
+        <w:rPr>
+          <w:rFonts w:ascii="Arial" w:hAnsi="Arial" w:cs="Arial"/>
+          <w:i/>
+          <w:iCs/>
+          <w:sz w:val="20"/>
+          <w:szCs w:val="20"/>
+          <w:lang w:val="es-ES" w:eastAsia="es-EC"/>
+        </w:rPr>
+        <w:t xml:space="preserve"> </w:t>
+      </w:r>
+      <w:proofErr w:type="spellStart"/>
+      <w:r>
+        <w:rPr>
+          <w:rFonts w:ascii="Arial" w:hAnsi="Arial" w:cs="Arial"/>
+          <w:i/>
+          <w:iCs/>
+          <w:sz w:val="20"/>
+          <w:szCs w:val="20"/>
+          <w:lang w:val="es-ES" w:eastAsia="es-EC"/>
+        </w:rPr>
+        <w:t>code</w:t>
+      </w:r>
+      <w:proofErr w:type="spellEnd"/>
+      <w:r>
+        <w:rPr>
+          <w:rFonts w:ascii="Arial" w:hAnsi="Arial" w:cs="Arial"/>
+          <w:i/>
+          <w:iCs/>
+          <w:sz w:val="20"/>
+          <w:szCs w:val="20"/>
+          <w:lang w:val="es-ES" w:eastAsia="es-EC"/>
+        </w:rPr>
+        <w:t xml:space="preserve">: A </w:t>
+      </w:r>
+      <w:proofErr w:type="spellStart"/>
+      <w:r>
+        <w:rPr>
+          <w:rFonts w:ascii="Arial" w:hAnsi="Arial" w:cs="Arial"/>
+          <w:i/>
+          <w:iCs/>
+          <w:sz w:val="20"/>
+          <w:szCs w:val="20"/>
+          <w:lang w:val="es-ES" w:eastAsia="es-EC"/>
+        </w:rPr>
+        <w:t>handbook</w:t>
+      </w:r>
+      <w:proofErr w:type="spellEnd"/>
+      <w:r>
+        <w:rPr>
+          <w:rFonts w:ascii="Arial" w:hAnsi="Arial" w:cs="Arial"/>
+          <w:i/>
+          <w:iCs/>
+          <w:sz w:val="20"/>
+          <w:szCs w:val="20"/>
+          <w:lang w:val="es-ES" w:eastAsia="es-EC"/>
+        </w:rPr>
+        <w:t xml:space="preserve"> </w:t>
+      </w:r>
+      <w:proofErr w:type="spellStart"/>
+      <w:r>
+        <w:rPr>
+          <w:rFonts w:ascii="Arial" w:hAnsi="Arial" w:cs="Arial"/>
+          <w:i/>
+          <w:iCs/>
+          <w:sz w:val="20"/>
+          <w:szCs w:val="20"/>
+          <w:lang w:val="es-ES" w:eastAsia="es-EC"/>
+        </w:rPr>
+        <w:t>of</w:t>
+      </w:r>
+      <w:proofErr w:type="spellEnd"/>
+      <w:r>
+        <w:rPr>
+          <w:rFonts w:ascii="Arial" w:hAnsi="Arial" w:cs="Arial"/>
+          <w:i/>
+          <w:iCs/>
+          <w:sz w:val="20"/>
+          <w:szCs w:val="20"/>
+          <w:lang w:val="es-ES" w:eastAsia="es-EC"/>
+        </w:rPr>
+        <w:t xml:space="preserve"> agile software </w:t>
+      </w:r>
+      <w:proofErr w:type="spellStart"/>
+      <w:r>
+        <w:rPr>
+          <w:rFonts w:ascii="Arial" w:hAnsi="Arial" w:cs="Arial"/>
+          <w:i/>
+          <w:iCs/>
+          <w:sz w:val="20"/>
+          <w:szCs w:val="20"/>
+          <w:lang w:val="es-ES" w:eastAsia="es-EC"/>
+        </w:rPr>
+        <w:t>craftsmanship</w:t>
+      </w:r>
+      <w:proofErr w:type="spellEnd"/>
+      <w:r>
+        <w:rPr>
+          <w:rFonts w:ascii="Arial" w:hAnsi="Arial" w:cs="Arial"/>
+          <w:i/>
+          <w:iCs/>
+          <w:sz w:val="20"/>
+          <w:szCs w:val="20"/>
+          <w:lang w:val="es-ES" w:eastAsia="es-EC"/>
+        </w:rPr>
+        <w:t>. Prentice Hall.</w:t>
+      </w:r>
+    </w:p>
+    <w:p>
+      <w:pPr>
+        <w:pStyle w:val="Prrafodelista"/>
+        <w:widowControl w:val="0"/>
+        <w:numPr>
+          <w:ilvl w:val="0"/>
+          <w:numId w:val="28"/>
+        </w:numPr>
+        <w:pBdr>
+          <w:top w:val="nil"/>
+          <w:left w:val="nil"/>
+          <w:bottom w:val="nil"/>
+          <w:right w:val="nil"/>
+          <w:between w:val="nil"/>
+        </w:pBdr>
+        <w:spacing w:after="0" w:line="360" w:lineRule="auto"/>
+        <w:jc w:val="both"/>
+        <w:rPr>
+          <w:rFonts w:ascii="Arial" w:hAnsi="Arial" w:cs="Arial"/>
+          <w:i/>
+          <w:iCs/>
+          <w:sz w:val="20"/>
+          <w:szCs w:val="20"/>
+          <w:lang w:val="es-ES" w:eastAsia="es-EC"/>
+        </w:rPr>
+      </w:pPr>
+      <w:r>
+        <w:rPr>
+          <w:rFonts w:ascii="Arial" w:hAnsi="Arial" w:cs="Arial"/>
+          <w:i/>
+          <w:iCs/>
+          <w:sz w:val="20"/>
+          <w:szCs w:val="20"/>
+          <w:lang w:val="es-ES" w:eastAsia="es-EC"/>
+        </w:rPr>
+        <w:t>Martin, R. C. (2017). </w:t>
+      </w:r>
+      <w:proofErr w:type="spellStart"/>
+      <w:r>
+        <w:rPr>
+          <w:rFonts w:ascii="Arial" w:hAnsi="Arial" w:cs="Arial"/>
+          <w:i/>
+          <w:iCs/>
+          <w:sz w:val="20"/>
+          <w:szCs w:val="20"/>
+          <w:lang w:val="es-ES" w:eastAsia="es-EC"/>
+        </w:rPr>
+        <w:t>Clean</w:t>
+      </w:r>
+      <w:proofErr w:type="spellEnd"/>
+      <w:r>
+        <w:rPr>
+          <w:rFonts w:ascii="Arial" w:hAnsi="Arial" w:cs="Arial"/>
+          <w:i/>
+          <w:iCs/>
+          <w:sz w:val="20"/>
+          <w:szCs w:val="20"/>
+          <w:lang w:val="es-ES" w:eastAsia="es-EC"/>
+        </w:rPr>
+        <w:t xml:space="preserve"> </w:t>
+      </w:r>
+      <w:proofErr w:type="spellStart"/>
+      <w:r>
+        <w:rPr>
+          <w:rFonts w:ascii="Arial" w:hAnsi="Arial" w:cs="Arial"/>
+          <w:i/>
+          <w:iCs/>
+          <w:sz w:val="20"/>
+          <w:szCs w:val="20"/>
+          <w:lang w:val="es-ES" w:eastAsia="es-EC"/>
+        </w:rPr>
+        <w:t>architecture</w:t>
+      </w:r>
+      <w:proofErr w:type="spellEnd"/>
+      <w:r>
+        <w:rPr>
+          <w:rFonts w:ascii="Arial" w:hAnsi="Arial" w:cs="Arial"/>
+          <w:i/>
+          <w:iCs/>
+          <w:sz w:val="20"/>
+          <w:szCs w:val="20"/>
+          <w:lang w:val="es-ES" w:eastAsia="es-EC"/>
+        </w:rPr>
+        <w:t xml:space="preserve">: A </w:t>
+      </w:r>
+      <w:proofErr w:type="spellStart"/>
+      <w:r>
+        <w:rPr>
+          <w:rFonts w:ascii="Arial" w:hAnsi="Arial" w:cs="Arial"/>
+          <w:i/>
+          <w:iCs/>
+          <w:sz w:val="20"/>
+          <w:szCs w:val="20"/>
+          <w:lang w:val="es-ES" w:eastAsia="es-EC"/>
+        </w:rPr>
+        <w:t>craftsman's</w:t>
+      </w:r>
+      <w:proofErr w:type="spellEnd"/>
+      <w:r>
+        <w:rPr>
+          <w:rFonts w:ascii="Arial" w:hAnsi="Arial" w:cs="Arial"/>
+          <w:i/>
+          <w:iCs/>
+          <w:sz w:val="20"/>
+          <w:szCs w:val="20"/>
+          <w:lang w:val="es-ES" w:eastAsia="es-EC"/>
+        </w:rPr>
+        <w:t xml:space="preserve"> guide </w:t>
+      </w:r>
+      <w:proofErr w:type="spellStart"/>
+      <w:r>
+        <w:rPr>
+          <w:rFonts w:ascii="Arial" w:hAnsi="Arial" w:cs="Arial"/>
+          <w:i/>
+          <w:iCs/>
+          <w:sz w:val="20"/>
+          <w:szCs w:val="20"/>
+          <w:lang w:val="es-ES" w:eastAsia="es-EC"/>
+        </w:rPr>
+        <w:t>to</w:t>
+      </w:r>
+      <w:proofErr w:type="spellEnd"/>
+      <w:r>
+        <w:rPr>
+          <w:rFonts w:ascii="Arial" w:hAnsi="Arial" w:cs="Arial"/>
+          <w:i/>
+          <w:iCs/>
+          <w:sz w:val="20"/>
+          <w:szCs w:val="20"/>
+          <w:lang w:val="es-ES" w:eastAsia="es-EC"/>
+        </w:rPr>
+        <w:t xml:space="preserve"> software </w:t>
+      </w:r>
+      <w:proofErr w:type="spellStart"/>
+      <w:r>
+        <w:rPr>
+          <w:rFonts w:ascii="Arial" w:hAnsi="Arial" w:cs="Arial"/>
+          <w:i/>
+          <w:iCs/>
+          <w:sz w:val="20"/>
+          <w:szCs w:val="20"/>
+          <w:lang w:val="es-ES" w:eastAsia="es-EC"/>
+        </w:rPr>
+        <w:t>structure</w:t>
+      </w:r>
+      <w:proofErr w:type="spellEnd"/>
+      <w:r>
+        <w:rPr>
+          <w:rFonts w:ascii="Arial" w:hAnsi="Arial" w:cs="Arial"/>
+          <w:i/>
+          <w:iCs/>
+          <w:sz w:val="20"/>
+          <w:szCs w:val="20"/>
+          <w:lang w:val="es-ES" w:eastAsia="es-EC"/>
+        </w:rPr>
+        <w:t xml:space="preserve"> and </w:t>
+      </w:r>
+      <w:proofErr w:type="spellStart"/>
+      <w:r>
+        <w:rPr>
+          <w:rFonts w:ascii="Arial" w:hAnsi="Arial" w:cs="Arial"/>
+          <w:i/>
+          <w:iCs/>
+          <w:sz w:val="20"/>
+          <w:szCs w:val="20"/>
+          <w:lang w:val="es-ES" w:eastAsia="es-EC"/>
+        </w:rPr>
+        <w:t>design</w:t>
+      </w:r>
+      <w:proofErr w:type="spellEnd"/>
+      <w:r>
+        <w:rPr>
+          <w:rFonts w:ascii="Arial" w:hAnsi="Arial" w:cs="Arial"/>
+          <w:i/>
+          <w:iCs/>
+          <w:sz w:val="20"/>
+          <w:szCs w:val="20"/>
+          <w:lang w:val="es-ES" w:eastAsia="es-EC"/>
+        </w:rPr>
+        <w:t>. Prentice Hall.</w:t>
+      </w:r>
+    </w:p>
+    <w:p>
+      <w:pPr>
+        <w:pStyle w:val="Prrafodelista"/>
+        <w:widowControl w:val="0"/>
+        <w:numPr>
+          <w:ilvl w:val="0"/>
+          <w:numId w:val="28"/>
+        </w:numPr>
+        <w:pBdr>
+          <w:top w:val="nil"/>
+          <w:left w:val="nil"/>
+          <w:bottom w:val="nil"/>
+          <w:right w:val="nil"/>
+          <w:between w:val="nil"/>
+        </w:pBdr>
+        <w:spacing w:after="0" w:line="360" w:lineRule="auto"/>
+        <w:jc w:val="both"/>
+        <w:rPr>
+          <w:rFonts w:ascii="Arial" w:hAnsi="Arial" w:cs="Arial"/>
+          <w:i/>
+          <w:iCs/>
+          <w:sz w:val="20"/>
+          <w:szCs w:val="20"/>
+          <w:lang w:val="es-ES" w:eastAsia="es-EC"/>
+        </w:rPr>
+      </w:pPr>
+      <w:r>
+        <w:rPr>
+          <w:rFonts w:ascii="Arial" w:hAnsi="Arial" w:cs="Arial"/>
+          <w:i/>
+          <w:iCs/>
+          <w:sz w:val="20"/>
+          <w:szCs w:val="20"/>
+          <w:lang w:val="es-ES" w:eastAsia="es-EC"/>
+        </w:rPr>
+        <w:t xml:space="preserve">Pressman, R. S., &amp; Maxim, B. R. (2015). Software </w:t>
+      </w:r>
+      <w:proofErr w:type="spellStart"/>
+      <w:r>
+        <w:rPr>
+          <w:rFonts w:ascii="Arial" w:hAnsi="Arial" w:cs="Arial"/>
+          <w:i/>
+          <w:iCs/>
+          <w:sz w:val="20"/>
+          <w:szCs w:val="20"/>
+          <w:lang w:val="es-ES" w:eastAsia="es-EC"/>
+        </w:rPr>
+        <w:t>engineering</w:t>
+      </w:r>
+      <w:proofErr w:type="spellEnd"/>
+      <w:r>
+        <w:rPr>
+          <w:rFonts w:ascii="Arial" w:hAnsi="Arial" w:cs="Arial"/>
+          <w:i/>
+          <w:iCs/>
+          <w:sz w:val="20"/>
+          <w:szCs w:val="20"/>
+          <w:lang w:val="es-ES" w:eastAsia="es-EC"/>
+        </w:rPr>
+        <w:t xml:space="preserve">: A </w:t>
+      </w:r>
+      <w:proofErr w:type="spellStart"/>
+      <w:r>
+        <w:rPr>
+          <w:rFonts w:ascii="Arial" w:hAnsi="Arial" w:cs="Arial"/>
+          <w:i/>
+          <w:iCs/>
+          <w:sz w:val="20"/>
+          <w:szCs w:val="20"/>
+          <w:lang w:val="es-ES" w:eastAsia="es-EC"/>
+        </w:rPr>
+        <w:t>practitioner's</w:t>
+      </w:r>
+      <w:proofErr w:type="spellEnd"/>
+      <w:r>
+        <w:rPr>
+          <w:rFonts w:ascii="Arial" w:hAnsi="Arial" w:cs="Arial"/>
+          <w:i/>
+          <w:iCs/>
+          <w:sz w:val="20"/>
+          <w:szCs w:val="20"/>
+          <w:lang w:val="es-ES" w:eastAsia="es-EC"/>
+        </w:rPr>
+        <w:t xml:space="preserve"> </w:t>
+      </w:r>
+      <w:proofErr w:type="spellStart"/>
+      <w:r>
+        <w:rPr>
+          <w:rFonts w:ascii="Arial" w:hAnsi="Arial" w:cs="Arial"/>
+          <w:i/>
+          <w:iCs/>
+          <w:sz w:val="20"/>
+          <w:szCs w:val="20"/>
+          <w:lang w:val="es-ES" w:eastAsia="es-EC"/>
+        </w:rPr>
+        <w:t>approach</w:t>
+      </w:r>
+      <w:proofErr w:type="spellEnd"/>
+      <w:r>
+        <w:rPr>
+          <w:rFonts w:ascii="Arial" w:hAnsi="Arial" w:cs="Arial"/>
+          <w:i/>
+          <w:iCs/>
+          <w:sz w:val="20"/>
+          <w:szCs w:val="20"/>
+          <w:lang w:val="es-ES" w:eastAsia="es-EC"/>
+        </w:rPr>
+        <w:t xml:space="preserve"> (8.ª ed.). McGraw-Hill </w:t>
+      </w:r>
+      <w:proofErr w:type="spellStart"/>
+      <w:r>
+        <w:rPr>
+          <w:rFonts w:ascii="Arial" w:hAnsi="Arial" w:cs="Arial"/>
+          <w:i/>
+          <w:iCs/>
+          <w:sz w:val="20"/>
+          <w:szCs w:val="20"/>
+          <w:lang w:val="es-ES" w:eastAsia="es-EC"/>
+        </w:rPr>
+        <w:t>Education</w:t>
+      </w:r>
+      <w:proofErr w:type="spellEnd"/>
+      <w:r>
+        <w:rPr>
+          <w:rFonts w:ascii="Arial" w:hAnsi="Arial" w:cs="Arial"/>
+          <w:i/>
+          <w:iCs/>
+          <w:sz w:val="20"/>
+          <w:szCs w:val="20"/>
+          <w:lang w:val="es-ES" w:eastAsia="es-EC"/>
+        </w:rPr>
+        <w:t>.</w:t>
+      </w:r>
+    </w:p>
+    <w:p>
+      <w:pPr>
+        <w:pStyle w:val="Prrafodelista"/>
+        <w:widowControl w:val="0"/>
+        <w:numPr>
+          <w:ilvl w:val="0"/>
+          <w:numId w:val="28"/>
+        </w:numPr>
+        <w:pBdr>
+          <w:top w:val="nil"/>
+          <w:left w:val="nil"/>
+          <w:bottom w:val="nil"/>
+          <w:right w:val="nil"/>
+          <w:between w:val="nil"/>
+        </w:pBdr>
+        <w:spacing w:after="0" w:line="360" w:lineRule="auto"/>
+        <w:jc w:val="both"/>
+        <w:rPr>
+          <w:rFonts w:ascii="Arial" w:hAnsi="Arial" w:cs="Arial"/>
+          <w:i/>
+          <w:iCs/>
+          <w:sz w:val="20"/>
+          <w:szCs w:val="20"/>
+          <w:lang w:val="es-ES" w:eastAsia="es-EC"/>
+        </w:rPr>
+      </w:pPr>
+      <w:r>
+        <w:rPr>
+          <w:rFonts w:ascii="Arial" w:hAnsi="Arial" w:cs="Arial"/>
+          <w:i/>
+          <w:iCs/>
+          <w:sz w:val="20"/>
+          <w:szCs w:val="20"/>
+          <w:lang w:val="es-ES" w:eastAsia="es-EC"/>
+        </w:rPr>
+        <w:t xml:space="preserve">Sommerville, I. (2016). Software </w:t>
+      </w:r>
+      <w:proofErr w:type="spellStart"/>
+      <w:r>
+        <w:rPr>
+          <w:rFonts w:ascii="Arial" w:hAnsi="Arial" w:cs="Arial"/>
+          <w:i/>
+          <w:iCs/>
+          <w:sz w:val="20"/>
+          <w:szCs w:val="20"/>
+          <w:lang w:val="es-ES" w:eastAsia="es-EC"/>
+        </w:rPr>
+        <w:t>engineering</w:t>
+      </w:r>
+      <w:proofErr w:type="spellEnd"/>
+      <w:r>
+        <w:rPr>
+          <w:rFonts w:ascii="Arial" w:hAnsi="Arial" w:cs="Arial"/>
+          <w:i/>
+          <w:iCs/>
+          <w:sz w:val="20"/>
+          <w:szCs w:val="20"/>
+          <w:lang w:val="es-ES" w:eastAsia="es-EC"/>
+        </w:rPr>
+        <w:t> (10.ª ed.). Pearson.</w:t>
       </w:r>
     </w:p>
     <w:p>
@@ -6786,42 +8881,9 @@
           <w:lang w:eastAsia="es-EC"/>
         </w:rPr>
       </w:pPr>
-      <w:r>
-        <w:rPr>
-          <w:rFonts w:ascii="Arial" w:hAnsi="Arial" w:cs="Arial"/>
-          <w:i/>
-          <w:iCs/>
-          <w:sz w:val="20"/>
-          <w:szCs w:val="20"/>
-          <w:lang w:eastAsia="es-EC"/>
-        </w:rPr>
-        <w:t>(</w:t>
-      </w:r>
-      <w:r>
-        <w:rPr>
-          <w:rFonts w:ascii="Arial" w:hAnsi="Arial" w:cs="Arial"/>
-          <w:i/>
-          <w:iCs/>
-          <w:sz w:val="20"/>
-          <w:szCs w:val="20"/>
-          <w:lang w:eastAsia="es-EC"/>
-        </w:rPr>
-        <w:t>Referencias bibliográficas y/o enlaces en Internet (normas APA) que se utilizaron para realizar la práctica.</w:t>
-      </w:r>
-      <w:r>
-        <w:rPr>
-          <w:rFonts w:ascii="Arial" w:hAnsi="Arial" w:cs="Arial"/>
-          <w:i/>
-          <w:iCs/>
-          <w:sz w:val="20"/>
-          <w:szCs w:val="20"/>
-          <w:lang w:eastAsia="es-EC"/>
-        </w:rPr>
-        <w:t>)</w:t>
-      </w:r>
     </w:p>
     <w:sectPr>
-      <w:headerReference w:type="first" r:id="rId24"/>
+      <w:headerReference w:type="first" r:id="rId26"/>
       <w:pgSz w:w="11906" w:h="16838"/>
       <w:pgMar w:top="1417" w:right="1701" w:bottom="1417" w:left="1701" w:header="708" w:footer="708" w:gutter="0"/>
       <w:pgNumType w:start="1"/>
@@ -7693,7 +9755,7 @@
         <v:path o:extrusionok="f" gradientshapeok="t" o:connecttype="rect"/>
         <o:lock v:ext="edit" aspectratio="t"/>
       </v:shapetype>
-      <v:shape id="_x0000_i1109" type="#_x0000_t75" style="width:11.55pt;height:11.55pt" o:bullet="t">
+      <v:shape id="_x0000_i1033" type="#_x0000_t75" style="width:12pt;height:12pt" o:bullet="t">
         <v:imagedata r:id="rId1" o:title="mso3E28"/>
       </v:shape>
     </w:pict>
@@ -7848,6 +9910,119 @@
     </w:lvl>
   </w:abstractNum>
   <w:abstractNum w:abstractNumId="1" w15:restartNumberingAfterBreak="0">
+    <w:nsid w:val="0BFB5285"/>
+    <w:multiLevelType w:val="hybridMultilevel"/>
+    <w:tmpl w:val="0798A3AE"/>
+    <w:lvl w:ilvl="0" w:tplc="0C0A0001">
+      <w:start w:val="1"/>
+      <w:numFmt w:val="bullet"/>
+      <w:lvlText w:val=""/>
+      <w:lvlJc w:val="left"/>
+      <w:pPr>
+        <w:ind w:left="720" w:hanging="360"/>
+      </w:pPr>
+      <w:rPr>
+        <w:rFonts w:ascii="Symbol" w:hAnsi="Symbol" w:hint="default"/>
+      </w:rPr>
+    </w:lvl>
+    <w:lvl w:ilvl="1" w:tplc="0C0A0003" w:tentative="1">
+      <w:start w:val="1"/>
+      <w:numFmt w:val="bullet"/>
+      <w:lvlText w:val="o"/>
+      <w:lvlJc w:val="left"/>
+      <w:pPr>
+        <w:ind w:left="1440" w:hanging="360"/>
+      </w:pPr>
+      <w:rPr>
+        <w:rFonts w:ascii="Courier New" w:hAnsi="Courier New" w:cs="Courier New" w:hint="default"/>
+      </w:rPr>
+    </w:lvl>
+    <w:lvl w:ilvl="2" w:tplc="0C0A0005" w:tentative="1">
+      <w:start w:val="1"/>
+      <w:numFmt w:val="bullet"/>
+      <w:lvlText w:val=""/>
+      <w:lvlJc w:val="left"/>
+      <w:pPr>
+        <w:ind w:left="2160" w:hanging="360"/>
+      </w:pPr>
+      <w:rPr>
+        <w:rFonts w:ascii="Wingdings" w:hAnsi="Wingdings" w:hint="default"/>
+      </w:rPr>
+    </w:lvl>
+    <w:lvl w:ilvl="3" w:tplc="0C0A0001" w:tentative="1">
+      <w:start w:val="1"/>
+      <w:numFmt w:val="bullet"/>
+      <w:lvlText w:val=""/>
+      <w:lvlJc w:val="left"/>
+      <w:pPr>
+        <w:ind w:left="2880" w:hanging="360"/>
+      </w:pPr>
+      <w:rPr>
+        <w:rFonts w:ascii="Symbol" w:hAnsi="Symbol" w:hint="default"/>
+      </w:rPr>
+    </w:lvl>
+    <w:lvl w:ilvl="4" w:tplc="0C0A0003" w:tentative="1">
+      <w:start w:val="1"/>
+      <w:numFmt w:val="bullet"/>
+      <w:lvlText w:val="o"/>
+      <w:lvlJc w:val="left"/>
+      <w:pPr>
+        <w:ind w:left="3600" w:hanging="360"/>
+      </w:pPr>
+      <w:rPr>
+        <w:rFonts w:ascii="Courier New" w:hAnsi="Courier New" w:cs="Courier New" w:hint="default"/>
+      </w:rPr>
+    </w:lvl>
+    <w:lvl w:ilvl="5" w:tplc="0C0A0005" w:tentative="1">
+      <w:start w:val="1"/>
+      <w:numFmt w:val="bullet"/>
+      <w:lvlText w:val=""/>
+      <w:lvlJc w:val="left"/>
+      <w:pPr>
+        <w:ind w:left="4320" w:hanging="360"/>
+      </w:pPr>
+      <w:rPr>
+        <w:rFonts w:ascii="Wingdings" w:hAnsi="Wingdings" w:hint="default"/>
+      </w:rPr>
+    </w:lvl>
+    <w:lvl w:ilvl="6" w:tplc="0C0A0001" w:tentative="1">
+      <w:start w:val="1"/>
+      <w:numFmt w:val="bullet"/>
+      <w:lvlText w:val=""/>
+      <w:lvlJc w:val="left"/>
+      <w:pPr>
+        <w:ind w:left="5040" w:hanging="360"/>
+      </w:pPr>
+      <w:rPr>
+        <w:rFonts w:ascii="Symbol" w:hAnsi="Symbol" w:hint="default"/>
+      </w:rPr>
+    </w:lvl>
+    <w:lvl w:ilvl="7" w:tplc="0C0A0003" w:tentative="1">
+      <w:start w:val="1"/>
+      <w:numFmt w:val="bullet"/>
+      <w:lvlText w:val="o"/>
+      <w:lvlJc w:val="left"/>
+      <w:pPr>
+        <w:ind w:left="5760" w:hanging="360"/>
+      </w:pPr>
+      <w:rPr>
+        <w:rFonts w:ascii="Courier New" w:hAnsi="Courier New" w:cs="Courier New" w:hint="default"/>
+      </w:rPr>
+    </w:lvl>
+    <w:lvl w:ilvl="8" w:tplc="0C0A0005" w:tentative="1">
+      <w:start w:val="1"/>
+      <w:numFmt w:val="bullet"/>
+      <w:lvlText w:val=""/>
+      <w:lvlJc w:val="left"/>
+      <w:pPr>
+        <w:ind w:left="6480" w:hanging="360"/>
+      </w:pPr>
+      <w:rPr>
+        <w:rFonts w:ascii="Wingdings" w:hAnsi="Wingdings" w:hint="default"/>
+      </w:rPr>
+    </w:lvl>
+  </w:abstractNum>
+  <w:abstractNum w:abstractNumId="2" w15:restartNumberingAfterBreak="0">
     <w:nsid w:val="0DEB2E8C"/>
     <w:multiLevelType w:val="hybridMultilevel"/>
     <w:tmpl w:val="D478A1FA"/>
@@ -7961,7 +10136,7 @@
       </w:rPr>
     </w:lvl>
   </w:abstractNum>
-  <w:abstractNum w:abstractNumId="2" w15:restartNumberingAfterBreak="0">
+  <w:abstractNum w:abstractNumId="3" w15:restartNumberingAfterBreak="0">
     <w:nsid w:val="0F253528"/>
     <w:multiLevelType w:val="hybridMultilevel"/>
     <w:tmpl w:val="E022366C"/>
@@ -8074,7 +10249,7 @@
       </w:rPr>
     </w:lvl>
   </w:abstractNum>
-  <w:abstractNum w:abstractNumId="3" w15:restartNumberingAfterBreak="0">
+  <w:abstractNum w:abstractNumId="4" w15:restartNumberingAfterBreak="0">
     <w:nsid w:val="12C719F0"/>
     <w:multiLevelType w:val="multilevel"/>
     <w:tmpl w:val="7876DD26"/>
@@ -8223,7 +10398,7 @@
       </w:rPr>
     </w:lvl>
   </w:abstractNum>
-  <w:abstractNum w:abstractNumId="4" w15:restartNumberingAfterBreak="0">
+  <w:abstractNum w:abstractNumId="5" w15:restartNumberingAfterBreak="0">
     <w:nsid w:val="19254471"/>
     <w:multiLevelType w:val="hybridMultilevel"/>
     <w:tmpl w:val="EE48CFBA"/>
@@ -8337,7 +10512,7 @@
       </w:rPr>
     </w:lvl>
   </w:abstractNum>
-  <w:abstractNum w:abstractNumId="5" w15:restartNumberingAfterBreak="0">
+  <w:abstractNum w:abstractNumId="6" w15:restartNumberingAfterBreak="0">
     <w:nsid w:val="1B832556"/>
     <w:multiLevelType w:val="multilevel"/>
     <w:tmpl w:val="2E8ADAD4"/>
@@ -8486,7 +10661,7 @@
       </w:rPr>
     </w:lvl>
   </w:abstractNum>
-  <w:abstractNum w:abstractNumId="6" w15:restartNumberingAfterBreak="0">
+  <w:abstractNum w:abstractNumId="7" w15:restartNumberingAfterBreak="0">
     <w:nsid w:val="25D101E3"/>
     <w:multiLevelType w:val="hybridMultilevel"/>
     <w:tmpl w:val="1E9CC514"/>
@@ -8599,7 +10774,7 @@
       </w:rPr>
     </w:lvl>
   </w:abstractNum>
-  <w:abstractNum w:abstractNumId="7" w15:restartNumberingAfterBreak="0">
+  <w:abstractNum w:abstractNumId="8" w15:restartNumberingAfterBreak="0">
     <w:nsid w:val="26DE4B16"/>
     <w:multiLevelType w:val="multilevel"/>
     <w:tmpl w:val="9470283E"/>
@@ -8748,7 +10923,7 @@
       </w:rPr>
     </w:lvl>
   </w:abstractNum>
-  <w:abstractNum w:abstractNumId="8" w15:restartNumberingAfterBreak="0">
+  <w:abstractNum w:abstractNumId="9" w15:restartNumberingAfterBreak="0">
     <w:nsid w:val="2E8C7B01"/>
     <w:multiLevelType w:val="multilevel"/>
     <w:tmpl w:val="C17EACDC"/>
@@ -8869,7 +11044,7 @@
       </w:rPr>
     </w:lvl>
   </w:abstractNum>
-  <w:abstractNum w:abstractNumId="9" w15:restartNumberingAfterBreak="0">
+  <w:abstractNum w:abstractNumId="10" w15:restartNumberingAfterBreak="0">
     <w:nsid w:val="40DD1A90"/>
     <w:multiLevelType w:val="multilevel"/>
     <w:tmpl w:val="6E5C174A"/>
@@ -8982,7 +11157,7 @@
       </w:rPr>
     </w:lvl>
   </w:abstractNum>
-  <w:abstractNum w:abstractNumId="10" w15:restartNumberingAfterBreak="0">
+  <w:abstractNum w:abstractNumId="11" w15:restartNumberingAfterBreak="0">
     <w:nsid w:val="43722CF5"/>
     <w:multiLevelType w:val="hybridMultilevel"/>
     <w:tmpl w:val="7CCAC0E6"/>
@@ -9068,7 +11243,7 @@
       </w:pPr>
     </w:lvl>
   </w:abstractNum>
-  <w:abstractNum w:abstractNumId="11" w15:restartNumberingAfterBreak="0">
+  <w:abstractNum w:abstractNumId="12" w15:restartNumberingAfterBreak="0">
     <w:nsid w:val="48076F85"/>
     <w:multiLevelType w:val="multilevel"/>
     <w:tmpl w:val="1C32EEE4"/>
@@ -9181,7 +11356,7 @@
       </w:pPr>
     </w:lvl>
   </w:abstractNum>
-  <w:abstractNum w:abstractNumId="12" w15:restartNumberingAfterBreak="0">
+  <w:abstractNum w:abstractNumId="13" w15:restartNumberingAfterBreak="0">
     <w:nsid w:val="4D4940A8"/>
     <w:multiLevelType w:val="hybridMultilevel"/>
     <w:tmpl w:val="4FEC69F0"/>
@@ -9295,7 +11470,7 @@
       </w:rPr>
     </w:lvl>
   </w:abstractNum>
-  <w:abstractNum w:abstractNumId="13" w15:restartNumberingAfterBreak="0">
+  <w:abstractNum w:abstractNumId="14" w15:restartNumberingAfterBreak="0">
     <w:nsid w:val="4F397A1C"/>
     <w:multiLevelType w:val="multilevel"/>
     <w:tmpl w:val="CCDA827E"/>
@@ -9444,7 +11619,7 @@
       </w:rPr>
     </w:lvl>
   </w:abstractNum>
-  <w:abstractNum w:abstractNumId="14" w15:restartNumberingAfterBreak="0">
+  <w:abstractNum w:abstractNumId="15" w15:restartNumberingAfterBreak="0">
     <w:nsid w:val="54174C12"/>
     <w:multiLevelType w:val="multilevel"/>
     <w:tmpl w:val="15B62650"/>
@@ -9575,7 +11750,7 @@
       </w:rPr>
     </w:lvl>
   </w:abstractNum>
-  <w:abstractNum w:abstractNumId="15" w15:restartNumberingAfterBreak="0">
+  <w:abstractNum w:abstractNumId="16" w15:restartNumberingAfterBreak="0">
     <w:nsid w:val="54517D06"/>
     <w:multiLevelType w:val="hybridMultilevel"/>
     <w:tmpl w:val="3DB0EB80"/>
@@ -9687,7 +11862,7 @@
       </w:rPr>
     </w:lvl>
   </w:abstractNum>
-  <w:abstractNum w:abstractNumId="16" w15:restartNumberingAfterBreak="0">
+  <w:abstractNum w:abstractNumId="17" w15:restartNumberingAfterBreak="0">
     <w:nsid w:val="68E15795"/>
     <w:multiLevelType w:val="hybridMultilevel"/>
     <w:tmpl w:val="8FE616A0"/>
@@ -9800,7 +11975,7 @@
       </w:rPr>
     </w:lvl>
   </w:abstractNum>
-  <w:abstractNum w:abstractNumId="17" w15:restartNumberingAfterBreak="0">
+  <w:abstractNum w:abstractNumId="18" w15:restartNumberingAfterBreak="0">
     <w:nsid w:val="6AFC07D3"/>
     <w:multiLevelType w:val="multilevel"/>
     <w:tmpl w:val="B3426C00"/>
@@ -9913,7 +12088,7 @@
       </w:rPr>
     </w:lvl>
   </w:abstractNum>
-  <w:abstractNum w:abstractNumId="18" w15:restartNumberingAfterBreak="0">
+  <w:abstractNum w:abstractNumId="19" w15:restartNumberingAfterBreak="0">
     <w:nsid w:val="6B7B1E92"/>
     <w:multiLevelType w:val="multilevel"/>
     <w:tmpl w:val="21BA233E"/>
@@ -10044,7 +12219,7 @@
       </w:rPr>
     </w:lvl>
   </w:abstractNum>
-  <w:abstractNum w:abstractNumId="19" w15:restartNumberingAfterBreak="0">
+  <w:abstractNum w:abstractNumId="20" w15:restartNumberingAfterBreak="0">
     <w:nsid w:val="6FA144D3"/>
     <w:multiLevelType w:val="multilevel"/>
     <w:tmpl w:val="98CEB7D6"/>
@@ -10165,7 +12340,7 @@
       </w:rPr>
     </w:lvl>
   </w:abstractNum>
-  <w:abstractNum w:abstractNumId="20" w15:restartNumberingAfterBreak="0">
+  <w:abstractNum w:abstractNumId="21" w15:restartNumberingAfterBreak="0">
     <w:nsid w:val="738344F2"/>
     <w:multiLevelType w:val="hybridMultilevel"/>
     <w:tmpl w:val="C4E037F2"/>
@@ -10280,7 +12455,7 @@
       </w:rPr>
     </w:lvl>
   </w:abstractNum>
-  <w:abstractNum w:abstractNumId="21" w15:restartNumberingAfterBreak="0">
+  <w:abstractNum w:abstractNumId="22" w15:restartNumberingAfterBreak="0">
     <w:nsid w:val="74B1685F"/>
     <w:multiLevelType w:val="hybridMultilevel"/>
     <w:tmpl w:val="943E89B2"/>
@@ -10393,7 +12568,7 @@
       </w:rPr>
     </w:lvl>
   </w:abstractNum>
-  <w:abstractNum w:abstractNumId="22" w15:restartNumberingAfterBreak="0">
+  <w:abstractNum w:abstractNumId="23" w15:restartNumberingAfterBreak="0">
     <w:nsid w:val="75DB1EAD"/>
     <w:multiLevelType w:val="multilevel"/>
     <w:tmpl w:val="F2B0D608"/>
@@ -10506,7 +12681,7 @@
       </w:rPr>
     </w:lvl>
   </w:abstractNum>
-  <w:abstractNum w:abstractNumId="23" w15:restartNumberingAfterBreak="0">
+  <w:abstractNum w:abstractNumId="24" w15:restartNumberingAfterBreak="0">
     <w:nsid w:val="765D269F"/>
     <w:multiLevelType w:val="multilevel"/>
     <w:tmpl w:val="B25854B2"/>
@@ -10619,7 +12794,7 @@
       </w:rPr>
     </w:lvl>
   </w:abstractNum>
-  <w:abstractNum w:abstractNumId="24" w15:restartNumberingAfterBreak="0">
+  <w:abstractNum w:abstractNumId="25" w15:restartNumberingAfterBreak="0">
     <w:nsid w:val="77694BC3"/>
     <w:multiLevelType w:val="hybridMultilevel"/>
     <w:tmpl w:val="8D0A3582"/>
@@ -10732,7 +12907,120 @@
       </w:rPr>
     </w:lvl>
   </w:abstractNum>
-  <w:abstractNum w:abstractNumId="25" w15:restartNumberingAfterBreak="0">
+  <w:abstractNum w:abstractNumId="26" w15:restartNumberingAfterBreak="0">
+    <w:nsid w:val="78897C03"/>
+    <w:multiLevelType w:val="hybridMultilevel"/>
+    <w:tmpl w:val="57888FEC"/>
+    <w:lvl w:ilvl="0" w:tplc="0C0A000F">
+      <w:start w:val="1"/>
+      <w:numFmt w:val="decimal"/>
+      <w:lvlText w:val="%1."/>
+      <w:lvlJc w:val="left"/>
+      <w:pPr>
+        <w:ind w:left="720" w:hanging="360"/>
+      </w:pPr>
+      <w:rPr>
+        <w:rFonts w:hint="default"/>
+      </w:rPr>
+    </w:lvl>
+    <w:lvl w:ilvl="1" w:tplc="FFFFFFFF" w:tentative="1">
+      <w:start w:val="1"/>
+      <w:numFmt w:val="bullet"/>
+      <w:lvlText w:val="o"/>
+      <w:lvlJc w:val="left"/>
+      <w:pPr>
+        <w:ind w:left="1440" w:hanging="360"/>
+      </w:pPr>
+      <w:rPr>
+        <w:rFonts w:ascii="Courier New" w:hAnsi="Courier New" w:cs="Courier New" w:hint="default"/>
+      </w:rPr>
+    </w:lvl>
+    <w:lvl w:ilvl="2" w:tplc="FFFFFFFF" w:tentative="1">
+      <w:start w:val="1"/>
+      <w:numFmt w:val="bullet"/>
+      <w:lvlText w:val=""/>
+      <w:lvlJc w:val="left"/>
+      <w:pPr>
+        <w:ind w:left="2160" w:hanging="360"/>
+      </w:pPr>
+      <w:rPr>
+        <w:rFonts w:ascii="Wingdings" w:hAnsi="Wingdings" w:hint="default"/>
+      </w:rPr>
+    </w:lvl>
+    <w:lvl w:ilvl="3" w:tplc="FFFFFFFF" w:tentative="1">
+      <w:start w:val="1"/>
+      <w:numFmt w:val="bullet"/>
+      <w:lvlText w:val=""/>
+      <w:lvlJc w:val="left"/>
+      <w:pPr>
+        <w:ind w:left="2880" w:hanging="360"/>
+      </w:pPr>
+      <w:rPr>
+        <w:rFonts w:ascii="Symbol" w:hAnsi="Symbol" w:hint="default"/>
+      </w:rPr>
+    </w:lvl>
+    <w:lvl w:ilvl="4" w:tplc="FFFFFFFF" w:tentative="1">
+      <w:start w:val="1"/>
+      <w:numFmt w:val="bullet"/>
+      <w:lvlText w:val="o"/>
+      <w:lvlJc w:val="left"/>
+      <w:pPr>
+        <w:ind w:left="3600" w:hanging="360"/>
+      </w:pPr>
+      <w:rPr>
+        <w:rFonts w:ascii="Courier New" w:hAnsi="Courier New" w:cs="Courier New" w:hint="default"/>
+      </w:rPr>
+    </w:lvl>
+    <w:lvl w:ilvl="5" w:tplc="FFFFFFFF" w:tentative="1">
+      <w:start w:val="1"/>
+      <w:numFmt w:val="bullet"/>
+      <w:lvlText w:val=""/>
+      <w:lvlJc w:val="left"/>
+      <w:pPr>
+        <w:ind w:left="4320" w:hanging="360"/>
+      </w:pPr>
+      <w:rPr>
+        <w:rFonts w:ascii="Wingdings" w:hAnsi="Wingdings" w:hint="default"/>
+      </w:rPr>
+    </w:lvl>
+    <w:lvl w:ilvl="6" w:tplc="FFFFFFFF" w:tentative="1">
+      <w:start w:val="1"/>
+      <w:numFmt w:val="bullet"/>
+      <w:lvlText w:val=""/>
+      <w:lvlJc w:val="left"/>
+      <w:pPr>
+        <w:ind w:left="5040" w:hanging="360"/>
+      </w:pPr>
+      <w:rPr>
+        <w:rFonts w:ascii="Symbol" w:hAnsi="Symbol" w:hint="default"/>
+      </w:rPr>
+    </w:lvl>
+    <w:lvl w:ilvl="7" w:tplc="FFFFFFFF" w:tentative="1">
+      <w:start w:val="1"/>
+      <w:numFmt w:val="bullet"/>
+      <w:lvlText w:val="o"/>
+      <w:lvlJc w:val="left"/>
+      <w:pPr>
+        <w:ind w:left="5760" w:hanging="360"/>
+      </w:pPr>
+      <w:rPr>
+        <w:rFonts w:ascii="Courier New" w:hAnsi="Courier New" w:cs="Courier New" w:hint="default"/>
+      </w:rPr>
+    </w:lvl>
+    <w:lvl w:ilvl="8" w:tplc="FFFFFFFF" w:tentative="1">
+      <w:start w:val="1"/>
+      <w:numFmt w:val="bullet"/>
+      <w:lvlText w:val=""/>
+      <w:lvlJc w:val="left"/>
+      <w:pPr>
+        <w:ind w:left="6480" w:hanging="360"/>
+      </w:pPr>
+      <w:rPr>
+        <w:rFonts w:ascii="Wingdings" w:hAnsi="Wingdings" w:hint="default"/>
+      </w:rPr>
+    </w:lvl>
+  </w:abstractNum>
+  <w:abstractNum w:abstractNumId="27" w15:restartNumberingAfterBreak="0">
     <w:nsid w:val="7CE94054"/>
     <w:multiLevelType w:val="multilevel"/>
     <w:tmpl w:val="A4D4C1F2"/>
@@ -10847,82 +13135,88 @@
     </w:lvl>
   </w:abstractNum>
   <w:num w:numId="1" w16cid:durableId="1639728795">
+    <w:abstractNumId w:val="10"/>
+  </w:num>
+  <w:num w:numId="2" w16cid:durableId="1723866160">
+    <w:abstractNumId w:val="21"/>
+  </w:num>
+  <w:num w:numId="3" w16cid:durableId="1318801353">
+    <w:abstractNumId w:val="20"/>
+  </w:num>
+  <w:num w:numId="4" w16cid:durableId="1036586103">
+    <w:abstractNumId w:val="18"/>
+  </w:num>
+  <w:num w:numId="5" w16cid:durableId="21830215">
+    <w:abstractNumId w:val="27"/>
+  </w:num>
+  <w:num w:numId="6" w16cid:durableId="607932005">
+    <w:abstractNumId w:val="15"/>
+  </w:num>
+  <w:num w:numId="7" w16cid:durableId="1196039613">
+    <w:abstractNumId w:val="19"/>
+  </w:num>
+  <w:num w:numId="8" w16cid:durableId="797795467">
+    <w:abstractNumId w:val="23"/>
+  </w:num>
+  <w:num w:numId="9" w16cid:durableId="1185555067">
+    <w:abstractNumId w:val="25"/>
+  </w:num>
+  <w:num w:numId="10" w16cid:durableId="731150931">
+    <w:abstractNumId w:val="3"/>
+  </w:num>
+  <w:num w:numId="11" w16cid:durableId="97457085">
+    <w:abstractNumId w:val="7"/>
+  </w:num>
+  <w:num w:numId="12" w16cid:durableId="240261892">
+    <w:abstractNumId w:val="16"/>
+  </w:num>
+  <w:num w:numId="13" w16cid:durableId="936130915">
     <w:abstractNumId w:val="9"/>
   </w:num>
-  <w:num w:numId="2" w16cid:durableId="1723866160">
-    <w:abstractNumId w:val="20"/>
+  <w:num w:numId="14" w16cid:durableId="1846705042">
+    <w:abstractNumId w:val="13"/>
   </w:num>
-  <w:num w:numId="3" w16cid:durableId="1318801353">
-    <w:abstractNumId w:val="19"/>
+  <w:num w:numId="15" w16cid:durableId="1824274691">
+    <w:abstractNumId w:val="2"/>
   </w:num>
-  <w:num w:numId="4" w16cid:durableId="1036586103">
+  <w:num w:numId="16" w16cid:durableId="422992553">
+    <w:abstractNumId w:val="22"/>
+  </w:num>
+  <w:num w:numId="17" w16cid:durableId="533999065">
     <w:abstractNumId w:val="17"/>
   </w:num>
-  <w:num w:numId="5" w16cid:durableId="21830215">
-    <w:abstractNumId w:val="25"/>
+  <w:num w:numId="18" w16cid:durableId="265382296">
+    <w:abstractNumId w:val="5"/>
   </w:num>
-  <w:num w:numId="6" w16cid:durableId="607932005">
+  <w:num w:numId="19" w16cid:durableId="836992758">
     <w:abstractNumId w:val="14"/>
   </w:num>
-  <w:num w:numId="7" w16cid:durableId="1196039613">
-    <w:abstractNumId w:val="18"/>
-  </w:num>
-  <w:num w:numId="8" w16cid:durableId="797795467">
-    <w:abstractNumId w:val="22"/>
-  </w:num>
-  <w:num w:numId="9" w16cid:durableId="1185555067">
-    <w:abstractNumId w:val="24"/>
-  </w:num>
-  <w:num w:numId="10" w16cid:durableId="731150931">
-    <w:abstractNumId w:val="2"/>
-  </w:num>
-  <w:num w:numId="11" w16cid:durableId="97457085">
-    <w:abstractNumId w:val="6"/>
-  </w:num>
-  <w:num w:numId="12" w16cid:durableId="240261892">
-    <w:abstractNumId w:val="15"/>
-  </w:num>
-  <w:num w:numId="13" w16cid:durableId="936130915">
+  <w:num w:numId="20" w16cid:durableId="1591503562">
     <w:abstractNumId w:val="8"/>
   </w:num>
-  <w:num w:numId="14" w16cid:durableId="1846705042">
-    <w:abstractNumId w:val="12"/>
-  </w:num>
-  <w:num w:numId="15" w16cid:durableId="1824274691">
-    <w:abstractNumId w:val="1"/>
-  </w:num>
-  <w:num w:numId="16" w16cid:durableId="422992553">
-    <w:abstractNumId w:val="21"/>
-  </w:num>
-  <w:num w:numId="17" w16cid:durableId="533999065">
-    <w:abstractNumId w:val="16"/>
-  </w:num>
-  <w:num w:numId="18" w16cid:durableId="265382296">
-    <w:abstractNumId w:val="4"/>
-  </w:num>
-  <w:num w:numId="19" w16cid:durableId="836992758">
-    <w:abstractNumId w:val="13"/>
-  </w:num>
-  <w:num w:numId="20" w16cid:durableId="1591503562">
-    <w:abstractNumId w:val="7"/>
-  </w:num>
   <w:num w:numId="21" w16cid:durableId="352726194">
-    <w:abstractNumId w:val="10"/>
+    <w:abstractNumId w:val="11"/>
   </w:num>
   <w:num w:numId="22" w16cid:durableId="1404567713">
-    <w:abstractNumId w:val="23"/>
+    <w:abstractNumId w:val="24"/>
   </w:num>
   <w:num w:numId="23" w16cid:durableId="1415395502">
     <w:abstractNumId w:val="0"/>
   </w:num>
   <w:num w:numId="24" w16cid:durableId="1069420110">
-    <w:abstractNumId w:val="5"/>
+    <w:abstractNumId w:val="6"/>
   </w:num>
   <w:num w:numId="25" w16cid:durableId="1424062955">
-    <w:abstractNumId w:val="3"/>
+    <w:abstractNumId w:val="4"/>
   </w:num>
   <w:num w:numId="26" w16cid:durableId="387651672">
-    <w:abstractNumId w:val="11"/>
+    <w:abstractNumId w:val="12"/>
+  </w:num>
+  <w:num w:numId="27" w16cid:durableId="1301110860">
+    <w:abstractNumId w:val="1"/>
+  </w:num>
+  <w:num w:numId="28" w16cid:durableId="1437404248">
+    <w:abstractNumId w:val="26"/>
   </w:num>
 </w:numbering>
 </file>
@@ -11906,6 +14200,18 @@
       <w:shd w:val="clear" w:color="auto" w:fill="E1DFDD"/>
     </w:rPr>
   </w:style>
+  <w:style w:type="character" w:styleId="Hipervnculovisitado">
+    <w:name w:val="FollowedHyperlink"/>
+    <w:basedOn w:val="Fuentedeprrafopredeter"/>
+    <w:uiPriority w:val="99"/>
+    <w:semiHidden/>
+    <w:unhideWhenUsed/>
+    <w:rsid w:val="00CE34D4"/>
+    <w:rPr>
+      <w:color w:val="954F72" w:themeColor="followedHyperlink"/>
+      <w:u w:val="single"/>
+    </w:rPr>
+  </w:style>
 </w:styles>
 </file>
 

</xml_diff>

<commit_message>
Completa numeracion, Unidad 1 y periodo en portada
</commit_message>
<xml_diff>
--- a/Actividad-1.docx
+++ b/Actividad-1.docx
@@ -502,21 +502,12 @@
         </w:rPr>
         <w:t xml:space="preserve">: </w:t>
       </w:r>
-      <w:proofErr w:type="spellStart"/>
-      <w:r>
-        <w:rPr>
-          <w:b/>
-          <w:bCs/>
-        </w:rPr>
-        <w:t>Jordan</w:t>
-      </w:r>
-      <w:proofErr w:type="spellEnd"/>
-      <w:r>
-        <w:rPr>
-          <w:b/>
-          <w:bCs/>
-        </w:rPr>
-        <w:t xml:space="preserve"> Enrique Santillan Zambrano</w:t>
+      <w:r>
+        <w:rPr>
+          <w:b/>
+          <w:bCs/>
+        </w:rPr>
+        <w:t>Jordan Enrique Santillan Zambrano</w:t>
       </w:r>
     </w:p>
     <w:p>
@@ -835,61 +826,7 @@
           <w:kern w:val="24"/>
           <w:lang w:val="es-ES_tradnl"/>
         </w:rPr>
-        <w:t>SEPTIEMBRE</w:t>
-      </w:r>
-      <w:r>
-        <w:rPr>
-          <w:rFonts w:ascii="Arial" w:hAnsi="Arial" w:cs="Arial"/>
-          <w:b/>
-          <w:kern w:val="24"/>
-          <w:lang w:val="es-ES_tradnl"/>
-        </w:rPr>
-        <w:t xml:space="preserve"> </w:t>
-      </w:r>
-      <w:r>
-        <w:rPr>
-          <w:rFonts w:ascii="Arial" w:hAnsi="Arial" w:cs="Arial"/>
-          <w:b/>
-          <w:kern w:val="24"/>
-          <w:lang w:val="es-ES_tradnl"/>
-        </w:rPr>
-        <w:t xml:space="preserve">2025 </w:t>
-      </w:r>
-      <w:r>
-        <w:rPr>
-          <w:rFonts w:ascii="Arial" w:hAnsi="Arial" w:cs="Arial"/>
-          <w:b/>
-          <w:kern w:val="24"/>
-          <w:lang w:val="es-ES_tradnl"/>
-        </w:rPr>
-        <w:t>-</w:t>
-      </w:r>
-      <w:r>
-        <w:rPr>
-          <w:rFonts w:ascii="Arial" w:hAnsi="Arial" w:cs="Arial"/>
-          <w:b/>
-          <w:kern w:val="24"/>
-          <w:lang w:val="es-ES_tradnl"/>
-        </w:rPr>
-        <w:t xml:space="preserve"> ENERO</w:t>
-      </w:r>
-      <w:r>
-        <w:rPr>
-          <w:rFonts w:ascii="Arial" w:hAnsi="Arial" w:cs="Arial"/>
-          <w:b/>
-          <w:kern w:val="24"/>
-          <w:lang w:val="es-ES_tradnl"/>
-        </w:rPr>
-        <w:t xml:space="preserve"> 202</w:t>
-      </w:r>
-      <w:r>
-        <w:rPr>
-          <w:rFonts w:ascii="Arial" w:hAnsi="Arial" w:cs="Arial"/>
-          <w:b/>
-          <w:kern w:val="24"/>
-          <w:lang w:val="es-ES_tradnl"/>
-        </w:rPr>
-        <w:t>6</w:t>
+        <w:t>SEPTIEMBRE 2026 - ENERO 2027</w:t>
       </w:r>
     </w:p>
     <w:p>
@@ -1017,31 +954,7 @@
           <w:b/>
           <w:sz w:val="28"/>
         </w:rPr>
-        <w:t>U</w:t>
-      </w:r>
-      <w:r>
-        <w:rPr>
-          <w:rFonts w:ascii="Arial" w:hAnsi="Arial" w:cs="Arial"/>
-          <w:b/>
-          <w:sz w:val="28"/>
-        </w:rPr>
-        <w:t>nidad</w:t>
-      </w:r>
-      <w:r>
-        <w:rPr>
-          <w:rFonts w:ascii="Arial" w:hAnsi="Arial" w:cs="Arial"/>
-          <w:b/>
-          <w:sz w:val="28"/>
-        </w:rPr>
-        <w:t xml:space="preserve"> </w:t>
-      </w:r>
-      <w:r>
-        <w:rPr>
-          <w:rFonts w:ascii="Arial" w:hAnsi="Arial" w:cs="Arial"/>
-          <w:b/>
-          <w:sz w:val="28"/>
-        </w:rPr>
-        <w:t>____</w:t>
+        <w:t>Unidad 1</w:t>
       </w:r>
     </w:p>
     <w:p>
@@ -1276,17 +1189,8 @@
                 <w:rFonts w:ascii="Arial" w:hAnsi="Arial" w:cs="Arial"/>
                 <w:lang w:val="es-ES"/>
               </w:rPr>
-              <w:t>Ciudadano/</w:t>
+              <w:t>Ciudadano/Reportante</w:t>
             </w:r>
-            <w:proofErr w:type="spellStart"/>
-            <w:r>
-              <w:rPr>
-                <w:rFonts w:ascii="Arial" w:hAnsi="Arial" w:cs="Arial"/>
-                <w:lang w:val="es-ES"/>
-              </w:rPr>
-              <w:t>Reportante</w:t>
-            </w:r>
-            <w:proofErr w:type="spellEnd"/>
           </w:p>
         </w:tc>
         <w:tc>
@@ -2450,27 +2354,7 @@
                 <w:bCs/>
                 <w:lang w:val="es-ES" w:eastAsia="es-EC"/>
               </w:rPr>
-              <w:t>Trazabilidad de versiones: todas las acciones y cambios deben quedar registrados mediante el control de versiones (Git/</w:t>
-            </w:r>
-            <w:proofErr w:type="spellStart"/>
-            <w:r>
-              <w:rPr>
-                <w:rFonts w:ascii="Arial" w:hAnsi="Arial" w:cs="Arial"/>
-                <w:b/>
-                <w:bCs/>
-                <w:lang w:val="es-ES" w:eastAsia="es-EC"/>
-              </w:rPr>
-              <w:t>Gitflow</w:t>
-            </w:r>
-            <w:proofErr w:type="spellEnd"/>
-            <w:r>
-              <w:rPr>
-                <w:rFonts w:ascii="Arial" w:hAnsi="Arial" w:cs="Arial"/>
-                <w:b/>
-                <w:bCs/>
-                <w:lang w:val="es-ES" w:eastAsia="es-EC"/>
-              </w:rPr>
-              <w:t>).</w:t>
+              <w:t>Trazabilidad de versiones: todas las acciones y cambios deben quedar registrados mediante el control de versiones (Git/Gitflow).</w:t>
             </w:r>
           </w:p>
         </w:tc>
@@ -2601,172 +2485,96 @@
           <w:bCs/>
           <w:lang w:eastAsia="es-EC"/>
         </w:rPr>
-        <w:t xml:space="preserve">2.1 Repositorio GitHub y </w:t>
-      </w:r>
-      <w:proofErr w:type="spellStart"/>
-      <w:r>
-        <w:rPr>
-          <w:rFonts w:ascii="Arial" w:hAnsi="Arial" w:cs="Arial"/>
-          <w:b/>
-          <w:bCs/>
+        <w:t>2.1 Repositorio GitHub y Gitflow</w:t>
+      </w:r>
+    </w:p>
+    <w:p>
+      <w:pPr>
+        <w:rPr>
+          <w:rFonts w:ascii="Arial" w:hAnsi="Arial" w:cs="Arial"/>
           <w:lang w:eastAsia="es-EC"/>
         </w:rPr>
-        <w:t>Gitflow</w:t>
-      </w:r>
-      <w:proofErr w:type="spellEnd"/>
-    </w:p>
-    <w:p>
-      <w:pPr>
+      </w:pPr>
+      <w:r>
         <w:rPr>
           <w:rFonts w:ascii="Arial" w:hAnsi="Arial" w:cs="Arial"/>
           <w:lang w:eastAsia="es-EC"/>
         </w:rPr>
-      </w:pPr>
-      <w:r>
-        <w:rPr>
-          <w:rFonts w:ascii="Arial" w:hAnsi="Arial" w:cs="Arial"/>
+        <w:t>El proyecto se gestiona en un repositorio público de GitHub bajo el modelo Gitflow, con las ramas main, develop y feature/* (ver sección 5).</w:t>
+      </w:r>
+    </w:p>
+    <w:p>
+      <w:pPr>
+        <w:rPr>
+          <w:rFonts w:ascii="Arial" w:hAnsi="Arial" w:cs="Arial"/>
+          <w:b/>
+          <w:bCs/>
           <w:lang w:eastAsia="es-EC"/>
         </w:rPr>
-        <w:t xml:space="preserve">El proyecto se gestiona en un repositorio público de GitHub bajo el modelo </w:t>
-      </w:r>
-      <w:proofErr w:type="spellStart"/>
-      <w:r>
-        <w:rPr>
-          <w:rFonts w:ascii="Arial" w:hAnsi="Arial" w:cs="Arial"/>
+      </w:pPr>
+      <w:r>
+        <w:rPr>
+          <w:rFonts w:ascii="Arial" w:hAnsi="Arial" w:cs="Arial"/>
+          <w:b/>
+          <w:bCs/>
           <w:lang w:eastAsia="es-EC"/>
         </w:rPr>
-        <w:t>Gitflow</w:t>
-      </w:r>
-      <w:proofErr w:type="spellEnd"/>
-      <w:r>
-        <w:rPr>
-          <w:rFonts w:ascii="Arial" w:hAnsi="Arial" w:cs="Arial"/>
+        <w:t>2.2 Diagrama de casos de uso</w:t>
+      </w:r>
+    </w:p>
+    <w:p>
+      <w:pPr>
+        <w:rPr>
+          <w:rFonts w:ascii="Arial" w:hAnsi="Arial" w:cs="Arial"/>
+          <w:b/>
+          <w:bCs/>
           <w:lang w:eastAsia="es-EC"/>
         </w:rPr>
-        <w:t xml:space="preserve">, con las ramas </w:t>
-      </w:r>
-      <w:proofErr w:type="spellStart"/>
-      <w:r>
-        <w:rPr>
-          <w:rFonts w:ascii="Arial" w:hAnsi="Arial" w:cs="Arial"/>
+      </w:pPr>
+    </w:p>
+    <w:p>
+      <w:pPr>
+        <w:rPr>
+          <w:rFonts w:ascii="Arial" w:hAnsi="Arial" w:cs="Arial"/>
+          <w:b/>
+          <w:bCs/>
           <w:lang w:eastAsia="es-EC"/>
         </w:rPr>
-        <w:t>main</w:t>
-      </w:r>
-      <w:proofErr w:type="spellEnd"/>
-      <w:r>
-        <w:rPr>
-          <w:rFonts w:ascii="Arial" w:hAnsi="Arial" w:cs="Arial"/>
+      </w:pPr>
+    </w:p>
+    <w:p>
+      <w:pPr>
+        <w:rPr>
+          <w:rFonts w:ascii="Arial" w:hAnsi="Arial" w:cs="Arial"/>
+          <w:b/>
+          <w:bCs/>
           <w:lang w:eastAsia="es-EC"/>
         </w:rPr>
-        <w:t xml:space="preserve">, </w:t>
-      </w:r>
-      <w:proofErr w:type="spellStart"/>
-      <w:r>
-        <w:rPr>
-          <w:rFonts w:ascii="Arial" w:hAnsi="Arial" w:cs="Arial"/>
+      </w:pPr>
+    </w:p>
+    <w:p>
+      <w:pPr>
+        <w:rPr>
+          <w:rFonts w:ascii="Arial" w:hAnsi="Arial" w:cs="Arial"/>
+          <w:b/>
+          <w:bCs/>
           <w:lang w:eastAsia="es-EC"/>
         </w:rPr>
-        <w:t>develop</w:t>
-      </w:r>
-      <w:proofErr w:type="spellEnd"/>
-      <w:r>
-        <w:rPr>
-          <w:rFonts w:ascii="Arial" w:hAnsi="Arial" w:cs="Arial"/>
+      </w:pPr>
+    </w:p>
+    <w:p>
+      <w:pPr>
+        <w:rPr>
+          <w:rFonts w:ascii="Arial" w:hAnsi="Arial" w:cs="Arial"/>
+          <w:b/>
+          <w:bCs/>
           <w:lang w:eastAsia="es-EC"/>
         </w:rPr>
-        <w:t xml:space="preserve"> y </w:t>
-      </w:r>
-      <w:proofErr w:type="spellStart"/>
-      <w:r>
-        <w:rPr>
-          <w:rFonts w:ascii="Arial" w:hAnsi="Arial" w:cs="Arial"/>
-          <w:lang w:eastAsia="es-EC"/>
-        </w:rPr>
-        <w:t>feature</w:t>
-      </w:r>
-      <w:proofErr w:type="spellEnd"/>
-      <w:r>
-        <w:rPr>
-          <w:rFonts w:ascii="Arial" w:hAnsi="Arial" w:cs="Arial"/>
-          <w:lang w:eastAsia="es-EC"/>
-        </w:rPr>
-        <w:t>/* (ver sección 5).</w:t>
-      </w:r>
-    </w:p>
-    <w:p>
-      <w:pPr>
-        <w:rPr>
-          <w:rFonts w:ascii="Arial" w:hAnsi="Arial" w:cs="Arial"/>
-          <w:b/>
-          <w:bCs/>
-          <w:lang w:eastAsia="es-EC"/>
-        </w:rPr>
-      </w:pPr>
-      <w:r>
-        <w:rPr>
-          <w:rFonts w:ascii="Arial" w:hAnsi="Arial" w:cs="Arial"/>
-          <w:b/>
-          <w:bCs/>
-          <w:lang w:eastAsia="es-EC"/>
-        </w:rPr>
-        <w:t>2.2 Diagrama de casos de uso</w:t>
-      </w:r>
-    </w:p>
-    <w:p>
-      <w:pPr>
-        <w:rPr>
-          <w:rFonts w:ascii="Arial" w:hAnsi="Arial" w:cs="Arial"/>
-          <w:b/>
-          <w:bCs/>
-          <w:lang w:eastAsia="es-EC"/>
-        </w:rPr>
-      </w:pPr>
-    </w:p>
-    <w:p>
-      <w:pPr>
-        <w:rPr>
-          <w:rFonts w:ascii="Arial" w:hAnsi="Arial" w:cs="Arial"/>
-          <w:b/>
-          <w:bCs/>
-          <w:lang w:eastAsia="es-EC"/>
-        </w:rPr>
-      </w:pPr>
-    </w:p>
-    <w:p>
-      <w:pPr>
-        <w:rPr>
-          <w:rFonts w:ascii="Arial" w:hAnsi="Arial" w:cs="Arial"/>
-          <w:b/>
-          <w:bCs/>
-          <w:lang w:eastAsia="es-EC"/>
-        </w:rPr>
-      </w:pPr>
-    </w:p>
-    <w:p>
-      <w:pPr>
-        <w:rPr>
-          <w:rFonts w:ascii="Arial" w:hAnsi="Arial" w:cs="Arial"/>
-          <w:b/>
-          <w:bCs/>
-          <w:lang w:eastAsia="es-EC"/>
-        </w:rPr>
-      </w:pPr>
-    </w:p>
-    <w:p>
-      <w:pPr>
-        <w:rPr>
-          <w:rFonts w:ascii="Arial" w:hAnsi="Arial" w:cs="Arial"/>
-          <w:b/>
-          <w:bCs/>
-          <w:lang w:eastAsia="es-EC"/>
-        </w:rPr>
       </w:pPr>
       <w:r>
         <w:rPr>
           <w:noProof/>
         </w:rPr>
-        <w:lastRenderedPageBreak/>
         <w:drawing>
           <wp:anchor distT="0" distB="0" distL="114300" distR="114300" simplePos="0" relativeHeight="251666432" behindDoc="1" locked="0" layoutInCell="1" allowOverlap="1" wp14:anchorId="3F4F3521" wp14:editId="38335B38">
             <wp:simplePos x="0" y="0"/>
@@ -3065,7 +2873,6 @@
           <w:bCs/>
           <w:lang w:val="es-ES" w:eastAsia="es-EC"/>
         </w:rPr>
-        <w:lastRenderedPageBreak/>
         <w:t>Descripción de clases:</w:t>
       </w:r>
     </w:p>
@@ -3306,46 +3113,12 @@
                 <w:lang w:val="es-ES" w:eastAsia="es-EC"/>
               </w:rPr>
             </w:pPr>
-            <w:proofErr w:type="gramStart"/>
             <w:r>
               <w:rPr>
                 <w:rFonts w:ascii="Arial" w:hAnsi="Arial" w:cs="Arial"/>
                 <w:lang w:val="es-ES" w:eastAsia="es-EC"/>
               </w:rPr>
-              <w:t>notificar(</w:t>
-            </w:r>
-            <w:proofErr w:type="gramEnd"/>
-            <w:r>
-              <w:rPr>
-                <w:rFonts w:ascii="Arial" w:hAnsi="Arial" w:cs="Arial"/>
-                <w:lang w:val="es-ES" w:eastAsia="es-EC"/>
-              </w:rPr>
-              <w:t xml:space="preserve">), </w:t>
-            </w:r>
-            <w:proofErr w:type="spellStart"/>
-            <w:proofErr w:type="gramStart"/>
-            <w:r>
-              <w:rPr>
-                <w:rFonts w:ascii="Arial" w:hAnsi="Arial" w:cs="Arial"/>
-                <w:lang w:val="es-ES" w:eastAsia="es-EC"/>
-              </w:rPr>
-              <w:t>consultarCasos</w:t>
-            </w:r>
-            <w:proofErr w:type="spellEnd"/>
-            <w:r>
-              <w:rPr>
-                <w:rFonts w:ascii="Arial" w:hAnsi="Arial" w:cs="Arial"/>
-                <w:lang w:val="es-ES" w:eastAsia="es-EC"/>
-              </w:rPr>
-              <w:t>(</w:t>
-            </w:r>
-            <w:proofErr w:type="gramEnd"/>
-            <w:r>
-              <w:rPr>
-                <w:rFonts w:ascii="Arial" w:hAnsi="Arial" w:cs="Arial"/>
-                <w:lang w:val="es-ES" w:eastAsia="es-EC"/>
-              </w:rPr>
-              <w:t>)</w:t>
+              <w:t>notificar(), consultarCasos()</w:t>
             </w:r>
           </w:p>
         </w:tc>
@@ -3447,55 +3220,12 @@
                 <w:lang w:val="es-ES" w:eastAsia="es-EC"/>
               </w:rPr>
             </w:pPr>
-            <w:proofErr w:type="spellStart"/>
-            <w:proofErr w:type="gramStart"/>
             <w:r>
               <w:rPr>
                 <w:rFonts w:ascii="Arial" w:hAnsi="Arial" w:cs="Arial"/>
                 <w:lang w:val="es-ES" w:eastAsia="es-EC"/>
               </w:rPr>
-              <w:t>asignarPersonal</w:t>
-            </w:r>
-            <w:proofErr w:type="spellEnd"/>
-            <w:r>
-              <w:rPr>
-                <w:rFonts w:ascii="Arial" w:hAnsi="Arial" w:cs="Arial"/>
-                <w:lang w:val="es-ES" w:eastAsia="es-EC"/>
-              </w:rPr>
-              <w:t>(</w:t>
-            </w:r>
-            <w:proofErr w:type="gramEnd"/>
-            <w:r>
-              <w:rPr>
-                <w:rFonts w:ascii="Arial" w:hAnsi="Arial" w:cs="Arial"/>
-                <w:lang w:val="es-ES" w:eastAsia="es-EC"/>
-              </w:rPr>
-              <w:t xml:space="preserve">), </w:t>
-            </w:r>
-            <w:proofErr w:type="spellStart"/>
-            <w:proofErr w:type="gramStart"/>
-            <w:r>
-              <w:rPr>
-                <w:rFonts w:ascii="Arial" w:hAnsi="Arial" w:cs="Arial"/>
-                <w:lang w:val="es-ES" w:eastAsia="es-EC"/>
-              </w:rPr>
-              <w:t>supervisarCasos</w:t>
-            </w:r>
-            <w:proofErr w:type="spellEnd"/>
-            <w:r>
-              <w:rPr>
-                <w:rFonts w:ascii="Arial" w:hAnsi="Arial" w:cs="Arial"/>
-                <w:lang w:val="es-ES" w:eastAsia="es-EC"/>
-              </w:rPr>
-              <w:t>(</w:t>
-            </w:r>
-            <w:proofErr w:type="gramEnd"/>
-            <w:r>
-              <w:rPr>
-                <w:rFonts w:ascii="Arial" w:hAnsi="Arial" w:cs="Arial"/>
-                <w:lang w:val="es-ES" w:eastAsia="es-EC"/>
-              </w:rPr>
-              <w:t>)</w:t>
+              <w:t>asignarPersonal(), supervisarCasos()</w:t>
             </w:r>
           </w:p>
         </w:tc>
@@ -3597,55 +3327,12 @@
                 <w:lang w:val="es-ES" w:eastAsia="es-EC"/>
               </w:rPr>
             </w:pPr>
-            <w:proofErr w:type="spellStart"/>
-            <w:proofErr w:type="gramStart"/>
             <w:r>
               <w:rPr>
                 <w:rFonts w:ascii="Arial" w:hAnsi="Arial" w:cs="Arial"/>
                 <w:lang w:val="es-ES" w:eastAsia="es-EC"/>
               </w:rPr>
-              <w:t>atenderCaso</w:t>
-            </w:r>
-            <w:proofErr w:type="spellEnd"/>
-            <w:r>
-              <w:rPr>
-                <w:rFonts w:ascii="Arial" w:hAnsi="Arial" w:cs="Arial"/>
-                <w:lang w:val="es-ES" w:eastAsia="es-EC"/>
-              </w:rPr>
-              <w:t>(</w:t>
-            </w:r>
-            <w:proofErr w:type="gramEnd"/>
-            <w:r>
-              <w:rPr>
-                <w:rFonts w:ascii="Arial" w:hAnsi="Arial" w:cs="Arial"/>
-                <w:lang w:val="es-ES" w:eastAsia="es-EC"/>
-              </w:rPr>
-              <w:t xml:space="preserve">), </w:t>
-            </w:r>
-            <w:proofErr w:type="spellStart"/>
-            <w:proofErr w:type="gramStart"/>
-            <w:r>
-              <w:rPr>
-                <w:rFonts w:ascii="Arial" w:hAnsi="Arial" w:cs="Arial"/>
-                <w:lang w:val="es-ES" w:eastAsia="es-EC"/>
-              </w:rPr>
-              <w:t>registrarAtencion</w:t>
-            </w:r>
-            <w:proofErr w:type="spellEnd"/>
-            <w:r>
-              <w:rPr>
-                <w:rFonts w:ascii="Arial" w:hAnsi="Arial" w:cs="Arial"/>
-                <w:lang w:val="es-ES" w:eastAsia="es-EC"/>
-              </w:rPr>
-              <w:t>(</w:t>
-            </w:r>
-            <w:proofErr w:type="gramEnd"/>
-            <w:r>
-              <w:rPr>
-                <w:rFonts w:ascii="Arial" w:hAnsi="Arial" w:cs="Arial"/>
-                <w:lang w:val="es-ES" w:eastAsia="es-EC"/>
-              </w:rPr>
-              <w:t>)</w:t>
+              <w:t>atenderCaso(), registrarAtencion()</w:t>
             </w:r>
           </w:p>
         </w:tc>
@@ -3713,7 +3400,6 @@
                 <w:lang w:val="es-ES" w:eastAsia="es-EC"/>
               </w:rPr>
             </w:pPr>
-            <w:proofErr w:type="spellStart"/>
             <w:r>
               <w:rPr>
                 <w:rFonts w:ascii="Arial" w:hAnsi="Arial" w:cs="Arial"/>
@@ -3721,7 +3407,6 @@
               </w:rPr>
               <w:t>direccion</w:t>
             </w:r>
-            <w:proofErr w:type="spellEnd"/>
           </w:p>
         </w:tc>
         <w:tc>
@@ -3749,30 +3434,12 @@
                 <w:lang w:val="es-ES" w:eastAsia="es-EC"/>
               </w:rPr>
             </w:pPr>
-            <w:proofErr w:type="spellStart"/>
-            <w:proofErr w:type="gramStart"/>
             <w:r>
               <w:rPr>
                 <w:rFonts w:ascii="Arial" w:hAnsi="Arial" w:cs="Arial"/>
                 <w:lang w:val="es-ES" w:eastAsia="es-EC"/>
               </w:rPr>
-              <w:t>reportarRescate</w:t>
-            </w:r>
-            <w:proofErr w:type="spellEnd"/>
-            <w:r>
-              <w:rPr>
-                <w:rFonts w:ascii="Arial" w:hAnsi="Arial" w:cs="Arial"/>
-                <w:lang w:val="es-ES" w:eastAsia="es-EC"/>
-              </w:rPr>
-              <w:t>(</w:t>
-            </w:r>
-            <w:proofErr w:type="gramEnd"/>
-            <w:r>
-              <w:rPr>
-                <w:rFonts w:ascii="Arial" w:hAnsi="Arial" w:cs="Arial"/>
-                <w:lang w:val="es-ES" w:eastAsia="es-EC"/>
-              </w:rPr>
-              <w:t>)</w:t>
+              <w:t>reportarRescate()</w:t>
             </w:r>
           </w:p>
         </w:tc>
@@ -3845,17 +3512,8 @@
                 <w:rFonts w:ascii="Arial" w:hAnsi="Arial" w:cs="Arial"/>
                 <w:lang w:val="es-ES" w:eastAsia="es-EC"/>
               </w:rPr>
-              <w:t xml:space="preserve">id, nombre, especie, estado, </w:t>
+              <w:t>id, nombre, especie, estado, fechaIngreso</w:t>
             </w:r>
-            <w:proofErr w:type="spellStart"/>
-            <w:r>
-              <w:rPr>
-                <w:rFonts w:ascii="Arial" w:hAnsi="Arial" w:cs="Arial"/>
-                <w:lang w:val="es-ES" w:eastAsia="es-EC"/>
-              </w:rPr>
-              <w:t>fechaIngreso</w:t>
-            </w:r>
-            <w:proofErr w:type="spellEnd"/>
           </w:p>
         </w:tc>
         <w:tc>
@@ -3883,55 +3541,12 @@
                 <w:lang w:val="es-ES" w:eastAsia="es-EC"/>
               </w:rPr>
             </w:pPr>
-            <w:proofErr w:type="spellStart"/>
-            <w:proofErr w:type="gramStart"/>
             <w:r>
               <w:rPr>
                 <w:rFonts w:ascii="Arial" w:hAnsi="Arial" w:cs="Arial"/>
                 <w:lang w:val="es-ES" w:eastAsia="es-EC"/>
               </w:rPr>
-              <w:t>actualizarEstado</w:t>
-            </w:r>
-            <w:proofErr w:type="spellEnd"/>
-            <w:r>
-              <w:rPr>
-                <w:rFonts w:ascii="Arial" w:hAnsi="Arial" w:cs="Arial"/>
-                <w:lang w:val="es-ES" w:eastAsia="es-EC"/>
-              </w:rPr>
-              <w:t>(</w:t>
-            </w:r>
-            <w:proofErr w:type="gramEnd"/>
-            <w:r>
-              <w:rPr>
-                <w:rFonts w:ascii="Arial" w:hAnsi="Arial" w:cs="Arial"/>
-                <w:lang w:val="es-ES" w:eastAsia="es-EC"/>
-              </w:rPr>
-              <w:t xml:space="preserve">), </w:t>
-            </w:r>
-            <w:proofErr w:type="spellStart"/>
-            <w:proofErr w:type="gramStart"/>
-            <w:r>
-              <w:rPr>
-                <w:rFonts w:ascii="Arial" w:hAnsi="Arial" w:cs="Arial"/>
-                <w:lang w:val="es-ES" w:eastAsia="es-EC"/>
-              </w:rPr>
-              <w:t>obtenerEspecie</w:t>
-            </w:r>
-            <w:proofErr w:type="spellEnd"/>
-            <w:r>
-              <w:rPr>
-                <w:rFonts w:ascii="Arial" w:hAnsi="Arial" w:cs="Arial"/>
-                <w:lang w:val="es-ES" w:eastAsia="es-EC"/>
-              </w:rPr>
-              <w:t>(</w:t>
-            </w:r>
-            <w:proofErr w:type="gramEnd"/>
-            <w:r>
-              <w:rPr>
-                <w:rFonts w:ascii="Arial" w:hAnsi="Arial" w:cs="Arial"/>
-                <w:lang w:val="es-ES" w:eastAsia="es-EC"/>
-              </w:rPr>
-              <w:t>)</w:t>
+              <w:t>actualizarEstado(), obtenerEspecie()</w:t>
             </w:r>
           </w:p>
         </w:tc>
@@ -3999,47 +3614,13 @@
                 <w:lang w:val="es-ES" w:eastAsia="es-EC"/>
               </w:rPr>
             </w:pPr>
-            <w:proofErr w:type="spellStart"/>
             <w:r>
               <w:rPr>
                 <w:rFonts w:ascii="Arial" w:hAnsi="Arial" w:cs="Arial"/>
                 <w:lang w:val="es-ES" w:eastAsia="es-EC"/>
               </w:rPr>
-              <w:t>idCaso</w:t>
+              <w:t>idCaso, descripcion, fechaCreacion</w:t>
             </w:r>
-            <w:proofErr w:type="spellEnd"/>
-            <w:r>
-              <w:rPr>
-                <w:rFonts w:ascii="Arial" w:hAnsi="Arial" w:cs="Arial"/>
-                <w:lang w:val="es-ES" w:eastAsia="es-EC"/>
-              </w:rPr>
-              <w:t xml:space="preserve">, </w:t>
-            </w:r>
-            <w:proofErr w:type="spellStart"/>
-            <w:r>
-              <w:rPr>
-                <w:rFonts w:ascii="Arial" w:hAnsi="Arial" w:cs="Arial"/>
-                <w:lang w:val="es-ES" w:eastAsia="es-EC"/>
-              </w:rPr>
-              <w:t>descripcion</w:t>
-            </w:r>
-            <w:proofErr w:type="spellEnd"/>
-            <w:r>
-              <w:rPr>
-                <w:rFonts w:ascii="Arial" w:hAnsi="Arial" w:cs="Arial"/>
-                <w:lang w:val="es-ES" w:eastAsia="es-EC"/>
-              </w:rPr>
-              <w:t xml:space="preserve">, </w:t>
-            </w:r>
-            <w:proofErr w:type="spellStart"/>
-            <w:r>
-              <w:rPr>
-                <w:rFonts w:ascii="Arial" w:hAnsi="Arial" w:cs="Arial"/>
-                <w:lang w:val="es-ES" w:eastAsia="es-EC"/>
-              </w:rPr>
-              <w:t>fechaCreacion</w:t>
-            </w:r>
-            <w:proofErr w:type="spellEnd"/>
           </w:p>
         </w:tc>
         <w:tc>
@@ -4067,80 +3648,12 @@
                 <w:lang w:val="es-ES" w:eastAsia="es-EC"/>
               </w:rPr>
             </w:pPr>
-            <w:proofErr w:type="spellStart"/>
-            <w:proofErr w:type="gramStart"/>
             <w:r>
               <w:rPr>
                 <w:rFonts w:ascii="Arial" w:hAnsi="Arial" w:cs="Arial"/>
                 <w:lang w:val="es-ES" w:eastAsia="es-EC"/>
               </w:rPr>
-              <w:t>crearCaso</w:t>
-            </w:r>
-            <w:proofErr w:type="spellEnd"/>
-            <w:r>
-              <w:rPr>
-                <w:rFonts w:ascii="Arial" w:hAnsi="Arial" w:cs="Arial"/>
-                <w:lang w:val="es-ES" w:eastAsia="es-EC"/>
-              </w:rPr>
-              <w:t>(</w:t>
-            </w:r>
-            <w:proofErr w:type="gramEnd"/>
-            <w:r>
-              <w:rPr>
-                <w:rFonts w:ascii="Arial" w:hAnsi="Arial" w:cs="Arial"/>
-                <w:lang w:val="es-ES" w:eastAsia="es-EC"/>
-              </w:rPr>
-              <w:t xml:space="preserve">), </w:t>
-            </w:r>
-            <w:proofErr w:type="spellStart"/>
-            <w:proofErr w:type="gramStart"/>
-            <w:r>
-              <w:rPr>
-                <w:rFonts w:ascii="Arial" w:hAnsi="Arial" w:cs="Arial"/>
-                <w:lang w:val="es-ES" w:eastAsia="es-EC"/>
-              </w:rPr>
-              <w:t>asignarVoluntario</w:t>
-            </w:r>
-            <w:proofErr w:type="spellEnd"/>
-            <w:r>
-              <w:rPr>
-                <w:rFonts w:ascii="Arial" w:hAnsi="Arial" w:cs="Arial"/>
-                <w:lang w:val="es-ES" w:eastAsia="es-EC"/>
-              </w:rPr>
-              <w:t>(</w:t>
-            </w:r>
-            <w:proofErr w:type="gramEnd"/>
-            <w:r>
-              <w:rPr>
-                <w:rFonts w:ascii="Arial" w:hAnsi="Arial" w:cs="Arial"/>
-                <w:lang w:val="es-ES" w:eastAsia="es-EC"/>
-              </w:rPr>
-              <w:t xml:space="preserve">), </w:t>
-            </w:r>
-            <w:proofErr w:type="spellStart"/>
-            <w:proofErr w:type="gramStart"/>
-            <w:r>
-              <w:rPr>
-                <w:rFonts w:ascii="Arial" w:hAnsi="Arial" w:cs="Arial"/>
-                <w:lang w:val="es-ES" w:eastAsia="es-EC"/>
-              </w:rPr>
-              <w:t>cerrarCaso</w:t>
-            </w:r>
-            <w:proofErr w:type="spellEnd"/>
-            <w:r>
-              <w:rPr>
-                <w:rFonts w:ascii="Arial" w:hAnsi="Arial" w:cs="Arial"/>
-                <w:lang w:val="es-ES" w:eastAsia="es-EC"/>
-              </w:rPr>
-              <w:t>(</w:t>
-            </w:r>
-            <w:proofErr w:type="gramEnd"/>
-            <w:r>
-              <w:rPr>
-                <w:rFonts w:ascii="Arial" w:hAnsi="Arial" w:cs="Arial"/>
-                <w:lang w:val="es-ES" w:eastAsia="es-EC"/>
-              </w:rPr>
-              <w:t>)</w:t>
+              <w:t>crearCaso(), asignarVoluntario(), cerrarCaso()</w:t>
             </w:r>
           </w:p>
         </w:tc>
@@ -4174,7 +3687,6 @@
                 <w:lang w:val="es-ES" w:eastAsia="es-EC"/>
               </w:rPr>
             </w:pPr>
-            <w:proofErr w:type="spellStart"/>
             <w:r>
               <w:rPr>
                 <w:rFonts w:ascii="Arial" w:hAnsi="Arial" w:cs="Arial"/>
@@ -4182,7 +3694,6 @@
               </w:rPr>
               <w:t>Notificacion</w:t>
             </w:r>
-            <w:proofErr w:type="spellEnd"/>
           </w:p>
         </w:tc>
         <w:tc>
@@ -4244,21 +3755,12 @@
                 <w:lang w:val="es-ES" w:eastAsia="es-EC"/>
               </w:rPr>
             </w:pPr>
-            <w:proofErr w:type="gramStart"/>
             <w:r>
               <w:rPr>
                 <w:rFonts w:ascii="Arial" w:hAnsi="Arial" w:cs="Arial"/>
                 <w:lang w:val="es-ES" w:eastAsia="es-EC"/>
               </w:rPr>
-              <w:t>enviar(</w:t>
-            </w:r>
-            <w:proofErr w:type="gramEnd"/>
-            <w:r>
-              <w:rPr>
-                <w:rFonts w:ascii="Arial" w:hAnsi="Arial" w:cs="Arial"/>
-                <w:lang w:val="es-ES" w:eastAsia="es-EC"/>
-              </w:rPr>
-              <w:t>)</w:t>
+              <w:t>enviar()</w:t>
             </w:r>
           </w:p>
         </w:tc>
@@ -4513,7 +4015,6 @@
           <w:rFonts w:ascii="Arial" w:hAnsi="Arial" w:cs="Arial"/>
           <w:lang w:val="es-ES" w:eastAsia="es-EC"/>
         </w:rPr>
-        <w:lastRenderedPageBreak/>
         <w:t>DIP (Inversión de Dependencias): las clases dependen de abstracciones, no de implementaciones concretas.</w:t>
       </w:r>
     </w:p>
@@ -4918,23 +4419,7 @@
           <w:rFonts w:ascii="Arial" w:hAnsi="Arial" w:cs="Arial"/>
           <w:lang w:val="es-ES" w:eastAsia="es-EC"/>
         </w:rPr>
-        <w:t xml:space="preserve">Integración con </w:t>
-      </w:r>
-      <w:proofErr w:type="spellStart"/>
-      <w:r>
-        <w:rPr>
-          <w:rFonts w:ascii="Arial" w:hAnsi="Arial" w:cs="Arial"/>
-          <w:lang w:val="es-ES" w:eastAsia="es-EC"/>
-        </w:rPr>
-        <w:t>Gitflow</w:t>
-      </w:r>
-      <w:proofErr w:type="spellEnd"/>
-      <w:r>
-        <w:rPr>
-          <w:rFonts w:ascii="Arial" w:hAnsi="Arial" w:cs="Arial"/>
-          <w:lang w:val="es-ES" w:eastAsia="es-EC"/>
-        </w:rPr>
-        <w:t>:</w:t>
+        <w:t>Integración con Gitflow:</w:t>
       </w:r>
     </w:p>
     <w:p>
@@ -4948,21 +4433,12 @@
           <w:lang w:val="es-ES" w:eastAsia="es-EC"/>
         </w:rPr>
       </w:pPr>
-      <w:proofErr w:type="spellStart"/>
-      <w:r>
-        <w:rPr>
-          <w:rFonts w:ascii="Arial" w:hAnsi="Arial" w:cs="Arial"/>
-          <w:lang w:val="es-ES" w:eastAsia="es-EC"/>
-        </w:rPr>
-        <w:t>main</w:t>
-      </w:r>
-      <w:proofErr w:type="spellEnd"/>
-      <w:r>
-        <w:rPr>
-          <w:rFonts w:ascii="Arial" w:hAnsi="Arial" w:cs="Arial"/>
-          <w:lang w:val="es-ES" w:eastAsia="es-EC"/>
-        </w:rPr>
-        <w:t>: contiene la versión estable y desplegable del sistema.</w:t>
+      <w:r>
+        <w:rPr>
+          <w:rFonts w:ascii="Arial" w:hAnsi="Arial" w:cs="Arial"/>
+          <w:lang w:val="es-ES" w:eastAsia="es-EC"/>
+        </w:rPr>
+        <w:t>main: contiene la versión estable y desplegable del sistema.</w:t>
       </w:r>
     </w:p>
     <w:p>
@@ -4976,37 +4452,12 @@
           <w:lang w:val="es-ES" w:eastAsia="es-EC"/>
         </w:rPr>
       </w:pPr>
-      <w:proofErr w:type="spellStart"/>
-      <w:r>
-        <w:rPr>
-          <w:rFonts w:ascii="Arial" w:hAnsi="Arial" w:cs="Arial"/>
-          <w:lang w:val="es-ES" w:eastAsia="es-EC"/>
-        </w:rPr>
-        <w:t>develop</w:t>
-      </w:r>
-      <w:proofErr w:type="spellEnd"/>
-      <w:r>
-        <w:rPr>
-          <w:rFonts w:ascii="Arial" w:hAnsi="Arial" w:cs="Arial"/>
-          <w:lang w:val="es-ES" w:eastAsia="es-EC"/>
-        </w:rPr>
-        <w:t>: integra los avances aprobados antes de pasar a </w:t>
-      </w:r>
-      <w:proofErr w:type="spellStart"/>
-      <w:r>
-        <w:rPr>
-          <w:rFonts w:ascii="Arial" w:hAnsi="Arial" w:cs="Arial"/>
-          <w:lang w:val="es-ES" w:eastAsia="es-EC"/>
-        </w:rPr>
-        <w:t>main</w:t>
-      </w:r>
-      <w:proofErr w:type="spellEnd"/>
-      <w:r>
-        <w:rPr>
-          <w:rFonts w:ascii="Arial" w:hAnsi="Arial" w:cs="Arial"/>
-          <w:lang w:val="es-ES" w:eastAsia="es-EC"/>
-        </w:rPr>
-        <w:t>.</w:t>
+      <w:r>
+        <w:rPr>
+          <w:rFonts w:ascii="Arial" w:hAnsi="Arial" w:cs="Arial"/>
+          <w:lang w:val="es-ES" w:eastAsia="es-EC"/>
+        </w:rPr>
+        <w:t>develop: integra los avances aprobados antes de pasar a main.</w:t>
       </w:r>
     </w:p>
     <w:p>
@@ -5020,148 +4471,27 @@
           <w:lang w:val="es-ES" w:eastAsia="es-EC"/>
         </w:rPr>
       </w:pPr>
-      <w:proofErr w:type="spellStart"/>
-      <w:r>
-        <w:rPr>
-          <w:rFonts w:ascii="Arial" w:hAnsi="Arial" w:cs="Arial"/>
-          <w:lang w:val="es-ES" w:eastAsia="es-EC"/>
-        </w:rPr>
-        <w:t>feature</w:t>
-      </w:r>
-      <w:proofErr w:type="spellEnd"/>
-      <w:r>
-        <w:rPr>
-          <w:rFonts w:ascii="Arial" w:hAnsi="Arial" w:cs="Arial"/>
-          <w:lang w:val="es-ES" w:eastAsia="es-EC"/>
-        </w:rPr>
-        <w:t>/*: ramas para desarrollar cada funcionalidad de forma aislada.</w:t>
-      </w:r>
-    </w:p>
-    <w:p>
-      <w:pPr>
-        <w:rPr>
-          <w:rFonts w:ascii="Arial" w:hAnsi="Arial" w:cs="Arial"/>
-          <w:lang w:val="es-ES" w:eastAsia="es-EC"/>
-        </w:rPr>
-      </w:pPr>
-      <w:r>
-        <w:rPr>
-          <w:rFonts w:ascii="Arial" w:hAnsi="Arial" w:cs="Arial"/>
-          <w:lang w:val="es-ES" w:eastAsia="es-EC"/>
-        </w:rPr>
-        <w:t>El flujo es: se crea una rama </w:t>
-      </w:r>
-      <w:proofErr w:type="spellStart"/>
-      <w:r>
-        <w:rPr>
-          <w:rFonts w:ascii="Arial" w:hAnsi="Arial" w:cs="Arial"/>
-          <w:lang w:val="es-ES" w:eastAsia="es-EC"/>
-        </w:rPr>
-        <w:t>feature</w:t>
-      </w:r>
-      <w:proofErr w:type="spellEnd"/>
-      <w:r>
-        <w:rPr>
-          <w:rFonts w:ascii="Arial" w:hAnsi="Arial" w:cs="Arial"/>
-          <w:lang w:val="es-ES" w:eastAsia="es-EC"/>
-        </w:rPr>
-        <w:t> desde </w:t>
-      </w:r>
-      <w:proofErr w:type="spellStart"/>
-      <w:r>
-        <w:rPr>
-          <w:rFonts w:ascii="Arial" w:hAnsi="Arial" w:cs="Arial"/>
-          <w:lang w:val="es-ES" w:eastAsia="es-EC"/>
-        </w:rPr>
-        <w:t>develop</w:t>
-      </w:r>
-      <w:proofErr w:type="spellEnd"/>
-      <w:r>
-        <w:rPr>
-          <w:rFonts w:ascii="Arial" w:hAnsi="Arial" w:cs="Arial"/>
-          <w:lang w:val="es-ES" w:eastAsia="es-EC"/>
-        </w:rPr>
-        <w:t>, se desarrolla la funcionalidad, se integra a </w:t>
-      </w:r>
-      <w:proofErr w:type="spellStart"/>
-      <w:r>
-        <w:rPr>
-          <w:rFonts w:ascii="Arial" w:hAnsi="Arial" w:cs="Arial"/>
-          <w:lang w:val="es-ES" w:eastAsia="es-EC"/>
-        </w:rPr>
-        <w:t>develop</w:t>
-      </w:r>
-      <w:proofErr w:type="spellEnd"/>
-      <w:r>
-        <w:rPr>
-          <w:rFonts w:ascii="Arial" w:hAnsi="Arial" w:cs="Arial"/>
-          <w:lang w:val="es-ES" w:eastAsia="es-EC"/>
-        </w:rPr>
-        <w:t xml:space="preserve"> mediante </w:t>
-      </w:r>
-      <w:proofErr w:type="spellStart"/>
-      <w:r>
-        <w:rPr>
-          <w:rFonts w:ascii="Arial" w:hAnsi="Arial" w:cs="Arial"/>
-          <w:lang w:val="es-ES" w:eastAsia="es-EC"/>
-        </w:rPr>
-        <w:t>pull</w:t>
-      </w:r>
-      <w:proofErr w:type="spellEnd"/>
-      <w:r>
-        <w:rPr>
-          <w:rFonts w:ascii="Arial" w:hAnsi="Arial" w:cs="Arial"/>
-          <w:lang w:val="es-ES" w:eastAsia="es-EC"/>
-        </w:rPr>
-        <w:t xml:space="preserve"> </w:t>
-      </w:r>
-      <w:proofErr w:type="spellStart"/>
-      <w:r>
-        <w:rPr>
-          <w:rFonts w:ascii="Arial" w:hAnsi="Arial" w:cs="Arial"/>
-          <w:lang w:val="es-ES" w:eastAsia="es-EC"/>
-        </w:rPr>
-        <w:t>request</w:t>
-      </w:r>
-      <w:proofErr w:type="spellEnd"/>
-      <w:r>
-        <w:rPr>
-          <w:rFonts w:ascii="Arial" w:hAnsi="Arial" w:cs="Arial"/>
-          <w:lang w:val="es-ES" w:eastAsia="es-EC"/>
-        </w:rPr>
-        <w:t>, y finalmente </w:t>
-      </w:r>
-      <w:proofErr w:type="spellStart"/>
-      <w:r>
-        <w:rPr>
-          <w:rFonts w:ascii="Arial" w:hAnsi="Arial" w:cs="Arial"/>
-          <w:lang w:val="es-ES" w:eastAsia="es-EC"/>
-        </w:rPr>
-        <w:t>develop</w:t>
-      </w:r>
-      <w:proofErr w:type="spellEnd"/>
-      <w:r>
-        <w:rPr>
-          <w:rFonts w:ascii="Arial" w:hAnsi="Arial" w:cs="Arial"/>
-          <w:lang w:val="es-ES" w:eastAsia="es-EC"/>
-        </w:rPr>
-        <w:t> se fusiona con </w:t>
-      </w:r>
-      <w:proofErr w:type="spellStart"/>
-      <w:r>
-        <w:rPr>
-          <w:rFonts w:ascii="Arial" w:hAnsi="Arial" w:cs="Arial"/>
-          <w:lang w:val="es-ES" w:eastAsia="es-EC"/>
-        </w:rPr>
-        <w:t>main</w:t>
-      </w:r>
-      <w:proofErr w:type="spellEnd"/>
-      <w:r>
-        <w:rPr>
-          <w:rFonts w:ascii="Arial" w:hAnsi="Arial" w:cs="Arial"/>
-          <w:lang w:val="es-ES" w:eastAsia="es-EC"/>
-        </w:rPr>
-        <w:t> cuando está estable.</w:t>
+      <w:r>
+        <w:rPr>
+          <w:rFonts w:ascii="Arial" w:hAnsi="Arial" w:cs="Arial"/>
+          <w:lang w:val="es-ES" w:eastAsia="es-EC"/>
+        </w:rPr>
+        <w:t>feature/*: ramas para desarrollar cada funcionalidad de forma aislada.</w:t>
+      </w:r>
+    </w:p>
+    <w:p>
+      <w:pPr>
+        <w:rPr>
+          <w:rFonts w:ascii="Arial" w:hAnsi="Arial" w:cs="Arial"/>
+          <w:lang w:val="es-ES" w:eastAsia="es-EC"/>
+        </w:rPr>
+      </w:pPr>
+      <w:r>
+        <w:rPr>
+          <w:rFonts w:ascii="Arial" w:hAnsi="Arial" w:cs="Arial"/>
+          <w:lang w:val="es-ES" w:eastAsia="es-EC"/>
+        </w:rPr>
+        <w:t>El flujo es: se crea una rama feature desde develop, se desarrolla la funcionalidad, se integra a develop mediante pull request, y finalmente develop se fusiona con main cuando está estable.</w:t>
       </w:r>
     </w:p>
     <w:p>
@@ -5250,7 +4580,6 @@
           <w:bCs/>
           <w:lang w:eastAsia="es-EC"/>
         </w:rPr>
-        <w:lastRenderedPageBreak/>
         <w:t>Diagrama 1 — Arquitectura:</w:t>
       </w:r>
     </w:p>
@@ -5272,7 +4601,7 @@
           <w:lang w:eastAsia="es-EC"/>
         </w:rPr>
         <w:drawing>
-          <wp:anchor distT="0" distB="0" distL="114300" distR="114300" simplePos="0" relativeHeight="251668480" behindDoc="1" locked="0" layoutInCell="1" allowOverlap="1" wp14:anchorId="766455EC" wp14:editId="5ED38743">
+          <wp:anchor distT="0" distB="0" distL="114300" distR="114300" simplePos="0" relativeHeight="251668480" behindDoc="1" locked="0" layoutInCell="1" allowOverlap="1" wp14:anchorId="766455EC" wp14:editId="52AF3423">
             <wp:simplePos x="0" y="0"/>
             <wp:positionH relativeFrom="margin">
               <wp:align>left</wp:align>
@@ -5484,27 +4813,7 @@
           <w:bCs/>
           <w:lang w:eastAsia="es-EC"/>
         </w:rPr>
-        <w:t xml:space="preserve">Diagrama 2 — </w:t>
-      </w:r>
-      <w:proofErr w:type="spellStart"/>
-      <w:r>
-        <w:rPr>
-          <w:rFonts w:ascii="Arial" w:hAnsi="Arial" w:cs="Arial"/>
-          <w:b/>
-          <w:bCs/>
-          <w:lang w:eastAsia="es-EC"/>
-        </w:rPr>
-        <w:t>Gitflow</w:t>
-      </w:r>
-      <w:proofErr w:type="spellEnd"/>
-      <w:r>
-        <w:rPr>
-          <w:rFonts w:ascii="Arial" w:hAnsi="Arial" w:cs="Arial"/>
-          <w:b/>
-          <w:bCs/>
-          <w:lang w:eastAsia="es-EC"/>
-        </w:rPr>
-        <w:t>:</w:t>
+        <w:t>Diagrama 2 — Gitflow:</w:t>
       </w:r>
     </w:p>
     <w:p>
@@ -5597,95 +4906,15 @@
           <w:rFonts w:ascii="Arial" w:hAnsi="Arial" w:cs="Arial"/>
           <w:lang w:eastAsia="es-EC"/>
         </w:rPr>
-        <w:t>Las funcionalidades se desarrollan en ramas </w:t>
-      </w:r>
-      <w:proofErr w:type="spellStart"/>
-      <w:r>
-        <w:rPr>
-          <w:rFonts w:ascii="Arial" w:hAnsi="Arial" w:cs="Arial"/>
+        <w:t>Las funcionalidades se desarrollan en ramas feature/*, se integran a develop mediante pull request y, una vez estables, se fusionan con main generando una nueva versión</w:t>
+      </w:r>
+      <w:r>
+        <w:rPr>
+          <w:rFonts w:ascii="Arial" w:hAnsi="Arial" w:cs="Arial"/>
+          <w:b/>
+          <w:bCs/>
           <w:lang w:eastAsia="es-EC"/>
         </w:rPr>
-        <w:t>feature</w:t>
-      </w:r>
-      <w:proofErr w:type="spellEnd"/>
-      <w:r>
-        <w:rPr>
-          <w:rFonts w:ascii="Arial" w:hAnsi="Arial" w:cs="Arial"/>
-          <w:lang w:eastAsia="es-EC"/>
-        </w:rPr>
-        <w:t>/*, se integran a </w:t>
-      </w:r>
-      <w:proofErr w:type="spellStart"/>
-      <w:r>
-        <w:rPr>
-          <w:rFonts w:ascii="Arial" w:hAnsi="Arial" w:cs="Arial"/>
-          <w:lang w:eastAsia="es-EC"/>
-        </w:rPr>
-        <w:t>develop</w:t>
-      </w:r>
-      <w:proofErr w:type="spellEnd"/>
-      <w:r>
-        <w:rPr>
-          <w:rFonts w:ascii="Arial" w:hAnsi="Arial" w:cs="Arial"/>
-          <w:lang w:eastAsia="es-EC"/>
-        </w:rPr>
-        <w:t xml:space="preserve"> mediante </w:t>
-      </w:r>
-      <w:proofErr w:type="spellStart"/>
-      <w:r>
-        <w:rPr>
-          <w:rFonts w:ascii="Arial" w:hAnsi="Arial" w:cs="Arial"/>
-          <w:lang w:eastAsia="es-EC"/>
-        </w:rPr>
-        <w:t>pull</w:t>
-      </w:r>
-      <w:proofErr w:type="spellEnd"/>
-      <w:r>
-        <w:rPr>
-          <w:rFonts w:ascii="Arial" w:hAnsi="Arial" w:cs="Arial"/>
-          <w:lang w:eastAsia="es-EC"/>
-        </w:rPr>
-        <w:t xml:space="preserve"> </w:t>
-      </w:r>
-      <w:proofErr w:type="spellStart"/>
-      <w:r>
-        <w:rPr>
-          <w:rFonts w:ascii="Arial" w:hAnsi="Arial" w:cs="Arial"/>
-          <w:lang w:eastAsia="es-EC"/>
-        </w:rPr>
-        <w:t>request</w:t>
-      </w:r>
-      <w:proofErr w:type="spellEnd"/>
-      <w:r>
-        <w:rPr>
-          <w:rFonts w:ascii="Arial" w:hAnsi="Arial" w:cs="Arial"/>
-          <w:lang w:eastAsia="es-EC"/>
-        </w:rPr>
-        <w:t xml:space="preserve"> y, una vez estables, se fusionan con </w:t>
-      </w:r>
-      <w:proofErr w:type="spellStart"/>
-      <w:r>
-        <w:rPr>
-          <w:rFonts w:ascii="Arial" w:hAnsi="Arial" w:cs="Arial"/>
-          <w:lang w:eastAsia="es-EC"/>
-        </w:rPr>
-        <w:t>main</w:t>
-      </w:r>
-      <w:proofErr w:type="spellEnd"/>
-      <w:r>
-        <w:rPr>
-          <w:rFonts w:ascii="Arial" w:hAnsi="Arial" w:cs="Arial"/>
-          <w:lang w:eastAsia="es-EC"/>
-        </w:rPr>
-        <w:t> generando una nueva versión</w:t>
-      </w:r>
-      <w:r>
-        <w:rPr>
-          <w:rFonts w:ascii="Arial" w:hAnsi="Arial" w:cs="Arial"/>
-          <w:b/>
-          <w:bCs/>
-          <w:lang w:eastAsia="es-EC"/>
-        </w:rPr>
         <w:t>.</w:t>
       </w:r>
     </w:p>
@@ -5773,19 +5002,8 @@
           <w:bCs/>
           <w:lang w:val="es-ES" w:eastAsia="es-EC"/>
         </w:rPr>
-        <w:t xml:space="preserve">3.2 </w:t>
-      </w:r>
-      <w:proofErr w:type="spellStart"/>
-      <w:r>
-        <w:rPr>
-          <w:rFonts w:ascii="Arial" w:hAnsi="Arial" w:cs="Arial"/>
-          <w:b/>
-          <w:bCs/>
-          <w:lang w:val="es-ES" w:eastAsia="es-EC"/>
-        </w:rPr>
-        <w:t>Observer</w:t>
-      </w:r>
-      <w:proofErr w:type="spellEnd"/>
+        <w:t>3.2 Observer</w:t>
+      </w:r>
     </w:p>
     <w:p>
       <w:pPr>
@@ -5814,39 +5032,7 @@
           <w:rFonts w:ascii="Arial" w:hAnsi="Arial" w:cs="Arial"/>
           <w:lang w:val="es-ES" w:eastAsia="es-EC"/>
         </w:rPr>
-        <w:t>Problema que resuelve: Sin este patrón, el sistema tendría que consultar constantemente si hay nuevos casos (</w:t>
-      </w:r>
-      <w:proofErr w:type="spellStart"/>
-      <w:r>
-        <w:rPr>
-          <w:rFonts w:ascii="Arial" w:hAnsi="Arial" w:cs="Arial"/>
-          <w:lang w:val="es-ES" w:eastAsia="es-EC"/>
-        </w:rPr>
-        <w:t>polling</w:t>
-      </w:r>
-      <w:proofErr w:type="spellEnd"/>
-      <w:r>
-        <w:rPr>
-          <w:rFonts w:ascii="Arial" w:hAnsi="Arial" w:cs="Arial"/>
-          <w:lang w:val="es-ES" w:eastAsia="es-EC"/>
-        </w:rPr>
-        <w:t xml:space="preserve">), consumiendo recursos innecesarios. </w:t>
-      </w:r>
-      <w:proofErr w:type="spellStart"/>
-      <w:r>
-        <w:rPr>
-          <w:rFonts w:ascii="Arial" w:hAnsi="Arial" w:cs="Arial"/>
-          <w:lang w:val="es-ES" w:eastAsia="es-EC"/>
-        </w:rPr>
-        <w:t>Observer</w:t>
-      </w:r>
-      <w:proofErr w:type="spellEnd"/>
-      <w:r>
-        <w:rPr>
-          <w:rFonts w:ascii="Arial" w:hAnsi="Arial" w:cs="Arial"/>
-          <w:lang w:val="es-ES" w:eastAsia="es-EC"/>
-        </w:rPr>
-        <w:t xml:space="preserve"> permite que los voluntarios se suscriban y reciban el aviso en el momento exacto en que ocurre el evento, siendo la base de la programación reactiva.</w:t>
+        <w:t>Problema que resuelve: Sin este patrón, el sistema tendría que consultar constantemente si hay nuevos casos (polling), consumiendo recursos innecesarios. Observer permite que los voluntarios se suscriban y reciban el aviso en el momento exacto en que ocurre el evento, siendo la base de la programación reactiva.</w:t>
       </w:r>
     </w:p>
     <w:p>
@@ -5939,7 +5125,6 @@
           <w:bCs/>
           <w:lang w:val="es-ES" w:eastAsia="es-EC"/>
         </w:rPr>
-        <w:lastRenderedPageBreak/>
         <w:t>Propósito: </w:t>
       </w:r>
       <w:r>
@@ -6005,62 +5190,30 @@
           <w:rFonts w:ascii="Arial" w:hAnsi="Arial" w:cs="Arial"/>
           <w:lang w:val="es-ES" w:eastAsia="es-EC"/>
         </w:rPr>
-        <w:t xml:space="preserve">El siguiente diagrama muestra el escenario "Registrar un nuevo caso de rescate", donde se aplican los patrones Singleton, Factory Method y </w:t>
-      </w:r>
-      <w:proofErr w:type="spellStart"/>
-      <w:r>
-        <w:rPr>
-          <w:rFonts w:ascii="Arial" w:hAnsi="Arial" w:cs="Arial"/>
-          <w:lang w:val="es-ES" w:eastAsia="es-EC"/>
-        </w:rPr>
-        <w:t>Observer</w:t>
-      </w:r>
-      <w:proofErr w:type="spellEnd"/>
-      <w:r>
-        <w:rPr>
-          <w:rFonts w:ascii="Arial" w:hAnsi="Arial" w:cs="Arial"/>
-          <w:lang w:val="es-ES" w:eastAsia="es-EC"/>
-        </w:rPr>
-        <w:t>.</w:t>
-      </w:r>
-    </w:p>
-    <w:p>
-      <w:pPr>
-        <w:rPr>
-          <w:rFonts w:ascii="Arial" w:hAnsi="Arial" w:cs="Arial"/>
-          <w:lang w:val="es-ES" w:eastAsia="es-EC"/>
-        </w:rPr>
-      </w:pPr>
-    </w:p>
-    <w:p>
-      <w:pPr>
-        <w:rPr>
-          <w:rFonts w:ascii="Arial" w:hAnsi="Arial" w:cs="Arial"/>
-          <w:lang w:val="es-ES" w:eastAsia="es-EC"/>
-        </w:rPr>
-      </w:pPr>
-      <w:r>
-        <w:rPr>
-          <w:rFonts w:ascii="Arial" w:hAnsi="Arial" w:cs="Arial"/>
-          <w:lang w:val="es-ES" w:eastAsia="es-EC"/>
-        </w:rPr>
-        <w:t xml:space="preserve">Explicación: El ciudadano reporta un rescate; el Controlador solicita al Gestor de Casos (Singleton) que cree el caso; el Factory Method genera el expediente según la especie; y el </w:t>
-      </w:r>
-      <w:proofErr w:type="spellStart"/>
-      <w:r>
-        <w:rPr>
-          <w:rFonts w:ascii="Arial" w:hAnsi="Arial" w:cs="Arial"/>
-          <w:lang w:val="es-ES" w:eastAsia="es-EC"/>
-        </w:rPr>
-        <w:t>Observer</w:t>
-      </w:r>
-      <w:proofErr w:type="spellEnd"/>
-      <w:r>
-        <w:rPr>
-          <w:rFonts w:ascii="Arial" w:hAnsi="Arial" w:cs="Arial"/>
-          <w:lang w:val="es-ES" w:eastAsia="es-EC"/>
-        </w:rPr>
-        <w:t xml:space="preserve"> notifica automáticamente a los voluntarios disponibles.</w:t>
+        <w:t>El siguiente diagrama muestra el escenario "Registrar un nuevo caso de rescate", donde se aplican los patrones Singleton, Factory Method y Observer.</w:t>
+      </w:r>
+    </w:p>
+    <w:p>
+      <w:pPr>
+        <w:rPr>
+          <w:rFonts w:ascii="Arial" w:hAnsi="Arial" w:cs="Arial"/>
+          <w:lang w:val="es-ES" w:eastAsia="es-EC"/>
+        </w:rPr>
+      </w:pPr>
+    </w:p>
+    <w:p>
+      <w:pPr>
+        <w:rPr>
+          <w:rFonts w:ascii="Arial" w:hAnsi="Arial" w:cs="Arial"/>
+          <w:lang w:val="es-ES" w:eastAsia="es-EC"/>
+        </w:rPr>
+      </w:pPr>
+      <w:r>
+        <w:rPr>
+          <w:rFonts w:ascii="Arial" w:hAnsi="Arial" w:cs="Arial"/>
+          <w:lang w:val="es-ES" w:eastAsia="es-EC"/>
+        </w:rPr>
+        <w:t>Explicación: El ciudadano reporta un rescate; el Controlador solicita al Gestor de Casos (Singleton) que cree el caso; el Factory Method genera el expediente según la especie; y el Observer notifica automáticamente a los voluntarios disponibles.</w:t>
       </w:r>
     </w:p>
     <w:p>
@@ -6168,23 +5321,7 @@
           <w:rFonts w:ascii="Arial" w:hAnsi="Arial" w:cs="Arial"/>
           <w:lang w:eastAsia="es-EC"/>
         </w:rPr>
-        <w:t>El diagrama muestra el flujo completo desde que el ciudadano reporta un rescate hasta que se notifica al voluntario. En el proceso se aplican tres patrones: Singleton (única instancia del Gestor de Casos), Factory Method (creación del expediente según la especie) y </w:t>
-      </w:r>
-      <w:proofErr w:type="spellStart"/>
-      <w:r>
-        <w:rPr>
-          <w:rFonts w:ascii="Arial" w:hAnsi="Arial" w:cs="Arial"/>
-          <w:lang w:eastAsia="es-EC"/>
-        </w:rPr>
-        <w:t>Observer</w:t>
-      </w:r>
-      <w:proofErr w:type="spellEnd"/>
-      <w:r>
-        <w:rPr>
-          <w:rFonts w:ascii="Arial" w:hAnsi="Arial" w:cs="Arial"/>
-          <w:lang w:eastAsia="es-EC"/>
-        </w:rPr>
-        <w:t> (notificación automática a los voluntarios suscritos).</w:t>
+        <w:t>El diagrama muestra el flujo completo desde que el ciudadano reporta un rescate hasta que se notifica al voluntario. En el proceso se aplican tres patrones: Singleton (única instancia del Gestor de Casos), Factory Method (creación del expediente según la especie) y Observer (notificación automática a los voluntarios suscritos).</w:t>
       </w:r>
     </w:p>
     <w:p>
@@ -6294,50 +5431,22 @@
           <w:bCs/>
           <w:lang w:val="es-ES" w:eastAsia="es-EC"/>
         </w:rPr>
-        <w:t xml:space="preserve">5. Justificación del uso de </w:t>
-      </w:r>
-      <w:proofErr w:type="spellStart"/>
-      <w:r>
-        <w:rPr>
-          <w:rFonts w:ascii="Arial" w:hAnsi="Arial" w:cs="Arial"/>
-          <w:b/>
-          <w:bCs/>
-          <w:lang w:val="es-ES" w:eastAsia="es-EC"/>
-        </w:rPr>
-        <w:t>Gitflow</w:t>
-      </w:r>
-      <w:proofErr w:type="spellEnd"/>
-    </w:p>
-    <w:p>
-      <w:pPr>
-        <w:rPr>
-          <w:rFonts w:ascii="Arial" w:hAnsi="Arial" w:cs="Arial"/>
-          <w:lang w:val="es-ES" w:eastAsia="es-EC"/>
-        </w:rPr>
-      </w:pPr>
-      <w:r>
-        <w:rPr>
-          <w:rFonts w:ascii="Arial" w:hAnsi="Arial" w:cs="Arial"/>
-          <w:lang w:val="es-ES" w:eastAsia="es-EC"/>
-        </w:rPr>
-        <w:lastRenderedPageBreak/>
-        <w:t>Se utilizó el modelo </w:t>
-      </w:r>
-      <w:proofErr w:type="spellStart"/>
-      <w:r>
-        <w:rPr>
-          <w:rFonts w:ascii="Arial" w:hAnsi="Arial" w:cs="Arial"/>
-          <w:lang w:val="es-ES" w:eastAsia="es-EC"/>
-        </w:rPr>
-        <w:t>Gitflow</w:t>
-      </w:r>
-      <w:proofErr w:type="spellEnd"/>
-      <w:r>
-        <w:rPr>
-          <w:rFonts w:ascii="Arial" w:hAnsi="Arial" w:cs="Arial"/>
-          <w:lang w:val="es-ES" w:eastAsia="es-EC"/>
-        </w:rPr>
-        <w:t> para organizar el desarrollo del sistema de forma profesional y ordenada. Su uso permite mantener una versión estable mientras se desarrollan nuevas funcionalidades de manera aislada.</w:t>
+        <w:t>5. Justificación del uso de Gitflow</w:t>
+      </w:r>
+    </w:p>
+    <w:p>
+      <w:pPr>
+        <w:rPr>
+          <w:rFonts w:ascii="Arial" w:hAnsi="Arial" w:cs="Arial"/>
+          <w:lang w:val="es-ES" w:eastAsia="es-EC"/>
+        </w:rPr>
+      </w:pPr>
+      <w:r>
+        <w:rPr>
+          <w:rFonts w:ascii="Arial" w:hAnsi="Arial" w:cs="Arial"/>
+          <w:lang w:val="es-ES" w:eastAsia="es-EC"/>
+        </w:rPr>
+        <w:t>Se utilizó el modelo Gitflow para organizar el desarrollo del sistema de forma profesional y ordenada. Su uso permite mantener una versión estable mientras se desarrollan nuevas funcionalidades de manera aislada.</w:t>
       </w:r>
     </w:p>
     <w:p>
@@ -6489,7 +5598,6 @@
                 <w:lang w:val="es-ES" w:eastAsia="es-EC"/>
               </w:rPr>
             </w:pPr>
-            <w:proofErr w:type="spellStart"/>
             <w:r>
               <w:rPr>
                 <w:rFonts w:ascii="Arial" w:hAnsi="Arial" w:cs="Arial"/>
@@ -6497,7 +5605,6 @@
               </w:rPr>
               <w:t>main</w:t>
             </w:r>
-            <w:proofErr w:type="spellEnd"/>
           </w:p>
         </w:tc>
         <w:tc>
@@ -6562,7 +5669,6 @@
                 <w:lang w:val="es-ES" w:eastAsia="es-EC"/>
               </w:rPr>
             </w:pPr>
-            <w:proofErr w:type="spellStart"/>
             <w:r>
               <w:rPr>
                 <w:rFonts w:ascii="Arial" w:hAnsi="Arial" w:cs="Arial"/>
@@ -6570,7 +5676,6 @@
               </w:rPr>
               <w:t>develop</w:t>
             </w:r>
-            <w:proofErr w:type="spellEnd"/>
           </w:p>
         </w:tc>
         <w:tc>
@@ -6635,21 +5740,12 @@
                 <w:lang w:val="es-ES" w:eastAsia="es-EC"/>
               </w:rPr>
             </w:pPr>
-            <w:proofErr w:type="spellStart"/>
             <w:r>
               <w:rPr>
                 <w:rFonts w:ascii="Arial" w:hAnsi="Arial" w:cs="Arial"/>
                 <w:lang w:val="es-ES" w:eastAsia="es-EC"/>
               </w:rPr>
-              <w:t>feature</w:t>
-            </w:r>
-            <w:proofErr w:type="spellEnd"/>
-            <w:r>
-              <w:rPr>
-                <w:rFonts w:ascii="Arial" w:hAnsi="Arial" w:cs="Arial"/>
-                <w:lang w:val="es-ES" w:eastAsia="es-EC"/>
-              </w:rPr>
-              <w:t>/*</w:t>
+              <w:t>feature/*</w:t>
             </w:r>
           </w:p>
         </w:tc>
@@ -6733,55 +5829,7 @@
           <w:rFonts w:ascii="Arial" w:hAnsi="Arial" w:cs="Arial"/>
           <w:lang w:val="es-ES" w:eastAsia="es-EC"/>
         </w:rPr>
-        <w:t>Se creó la rama </w:t>
-      </w:r>
-      <w:proofErr w:type="spellStart"/>
-      <w:r>
-        <w:rPr>
-          <w:rFonts w:ascii="Arial" w:hAnsi="Arial" w:cs="Arial"/>
-          <w:lang w:val="es-ES" w:eastAsia="es-EC"/>
-        </w:rPr>
-        <w:t>feature</w:t>
-      </w:r>
-      <w:proofErr w:type="spellEnd"/>
-      <w:r>
-        <w:rPr>
-          <w:rFonts w:ascii="Arial" w:hAnsi="Arial" w:cs="Arial"/>
-          <w:lang w:val="es-ES" w:eastAsia="es-EC"/>
-        </w:rPr>
-        <w:t>/</w:t>
-      </w:r>
-      <w:proofErr w:type="spellStart"/>
-      <w:r>
-        <w:rPr>
-          <w:rFonts w:ascii="Arial" w:hAnsi="Arial" w:cs="Arial"/>
-          <w:lang w:val="es-ES" w:eastAsia="es-EC"/>
-        </w:rPr>
-        <w:t>analisis</w:t>
-      </w:r>
-      <w:proofErr w:type="spellEnd"/>
-      <w:r>
-        <w:rPr>
-          <w:rFonts w:ascii="Arial" w:hAnsi="Arial" w:cs="Arial"/>
-          <w:lang w:val="es-ES" w:eastAsia="es-EC"/>
-        </w:rPr>
-        <w:t>-requerimientos desde </w:t>
-      </w:r>
-      <w:proofErr w:type="spellStart"/>
-      <w:r>
-        <w:rPr>
-          <w:rFonts w:ascii="Arial" w:hAnsi="Arial" w:cs="Arial"/>
-          <w:lang w:val="es-ES" w:eastAsia="es-EC"/>
-        </w:rPr>
-        <w:t>develop</w:t>
-      </w:r>
-      <w:proofErr w:type="spellEnd"/>
-      <w:r>
-        <w:rPr>
-          <w:rFonts w:ascii="Arial" w:hAnsi="Arial" w:cs="Arial"/>
-          <w:lang w:val="es-ES" w:eastAsia="es-EC"/>
-        </w:rPr>
-        <w:t>.</w:t>
+        <w:t>Se creó la rama feature/analisis-requerimientos desde develop.</w:t>
       </w:r>
     </w:p>
     <w:p>
@@ -6819,39 +5867,7 @@
           <w:rFonts w:ascii="Arial" w:hAnsi="Arial" w:cs="Arial"/>
           <w:lang w:val="es-ES" w:eastAsia="es-EC"/>
         </w:rPr>
-        <w:t>Se integró a </w:t>
-      </w:r>
-      <w:proofErr w:type="spellStart"/>
-      <w:r>
-        <w:rPr>
-          <w:rFonts w:ascii="Arial" w:hAnsi="Arial" w:cs="Arial"/>
-          <w:lang w:val="es-ES" w:eastAsia="es-EC"/>
-        </w:rPr>
-        <w:t>develop</w:t>
-      </w:r>
-      <w:proofErr w:type="spellEnd"/>
-      <w:r>
-        <w:rPr>
-          <w:rFonts w:ascii="Arial" w:hAnsi="Arial" w:cs="Arial"/>
-          <w:lang w:val="es-ES" w:eastAsia="es-EC"/>
-        </w:rPr>
-        <w:t xml:space="preserve"> mediante un Pull </w:t>
-      </w:r>
-      <w:proofErr w:type="spellStart"/>
-      <w:r>
-        <w:rPr>
-          <w:rFonts w:ascii="Arial" w:hAnsi="Arial" w:cs="Arial"/>
-          <w:lang w:val="es-ES" w:eastAsia="es-EC"/>
-        </w:rPr>
-        <w:t>Request</w:t>
-      </w:r>
-      <w:proofErr w:type="spellEnd"/>
-      <w:r>
-        <w:rPr>
-          <w:rFonts w:ascii="Arial" w:hAnsi="Arial" w:cs="Arial"/>
-          <w:lang w:val="es-ES" w:eastAsia="es-EC"/>
-        </w:rPr>
-        <w:t xml:space="preserve"> #1.</w:t>
+        <w:t>Se integró a develop mediante un Pull Request #1.</w:t>
       </w:r>
     </w:p>
     <w:p>
@@ -6870,55 +5886,7 @@
           <w:rFonts w:ascii="Arial" w:hAnsi="Arial" w:cs="Arial"/>
           <w:lang w:val="es-ES" w:eastAsia="es-EC"/>
         </w:rPr>
-        <w:t>Finalmente se fusionó </w:t>
-      </w:r>
-      <w:proofErr w:type="spellStart"/>
-      <w:r>
-        <w:rPr>
-          <w:rFonts w:ascii="Arial" w:hAnsi="Arial" w:cs="Arial"/>
-          <w:lang w:val="es-ES" w:eastAsia="es-EC"/>
-        </w:rPr>
-        <w:t>develop</w:t>
-      </w:r>
-      <w:proofErr w:type="spellEnd"/>
-      <w:r>
-        <w:rPr>
-          <w:rFonts w:ascii="Arial" w:hAnsi="Arial" w:cs="Arial"/>
-          <w:lang w:val="es-ES" w:eastAsia="es-EC"/>
-        </w:rPr>
-        <w:t> con </w:t>
-      </w:r>
-      <w:proofErr w:type="spellStart"/>
-      <w:r>
-        <w:rPr>
-          <w:rFonts w:ascii="Arial" w:hAnsi="Arial" w:cs="Arial"/>
-          <w:lang w:val="es-ES" w:eastAsia="es-EC"/>
-        </w:rPr>
-        <w:t>main</w:t>
-      </w:r>
-      <w:proofErr w:type="spellEnd"/>
-      <w:r>
-        <w:rPr>
-          <w:rFonts w:ascii="Arial" w:hAnsi="Arial" w:cs="Arial"/>
-          <w:lang w:val="es-ES" w:eastAsia="es-EC"/>
-        </w:rPr>
-        <w:t xml:space="preserve"> mediante el Pull </w:t>
-      </w:r>
-      <w:proofErr w:type="spellStart"/>
-      <w:r>
-        <w:rPr>
-          <w:rFonts w:ascii="Arial" w:hAnsi="Arial" w:cs="Arial"/>
-          <w:lang w:val="es-ES" w:eastAsia="es-EC"/>
-        </w:rPr>
-        <w:t>Request</w:t>
-      </w:r>
-      <w:proofErr w:type="spellEnd"/>
-      <w:r>
-        <w:rPr>
-          <w:rFonts w:ascii="Arial" w:hAnsi="Arial" w:cs="Arial"/>
-          <w:lang w:val="es-ES" w:eastAsia="es-EC"/>
-        </w:rPr>
-        <w:t xml:space="preserve"> #2, generando la primera versión estable.</w:t>
+        <w:t>Finalmente se fusionó develop con main mediante el Pull Request #2, generando la primera versión estable.</w:t>
       </w:r>
     </w:p>
     <w:p>
@@ -6992,23 +5960,7 @@
           <w:rFonts w:ascii="Arial" w:hAnsi="Arial" w:cs="Arial"/>
           <w:lang w:val="es-ES" w:eastAsia="es-EC"/>
         </w:rPr>
-        <w:t xml:space="preserve"> Estructura de ramas en GitHub. Muestra las ramas main, develop y feature/analisis-requerimientos configuradas bajo el modelo </w:t>
-      </w:r>
-      <w:proofErr w:type="spellStart"/>
-      <w:r>
-        <w:rPr>
-          <w:rFonts w:ascii="Arial" w:hAnsi="Arial" w:cs="Arial"/>
-          <w:lang w:val="es-ES" w:eastAsia="es-EC"/>
-        </w:rPr>
-        <w:t>Gitflow</w:t>
-      </w:r>
-      <w:proofErr w:type="spellEnd"/>
-      <w:r>
-        <w:rPr>
-          <w:rFonts w:ascii="Arial" w:hAnsi="Arial" w:cs="Arial"/>
-          <w:lang w:val="es-ES" w:eastAsia="es-EC"/>
-        </w:rPr>
-        <w:t>.</w:t>
+        <w:t xml:space="preserve"> Estructura de ramas en GitHub. Muestra las ramas main, develop y feature/analisis-requerimientos configuradas bajo el modelo Gitflow.</w:t>
       </w:r>
     </w:p>
     <w:p>
@@ -7054,9 +6006,8 @@
         <w:rPr>
           <w:noProof/>
         </w:rPr>
-        <w:lastRenderedPageBreak/>
         <w:drawing>
-          <wp:anchor distT="0" distB="0" distL="114300" distR="114300" simplePos="0" relativeHeight="251670528" behindDoc="0" locked="0" layoutInCell="1" allowOverlap="1" wp14:anchorId="31BCD5F0" wp14:editId="66D39A4E">
+          <wp:anchor distT="0" distB="0" distL="114300" distR="114300" simplePos="0" relativeHeight="251670528" behindDoc="0" locked="0" layoutInCell="1" allowOverlap="1" wp14:anchorId="31BCD5F0" wp14:editId="0E2C4066">
             <wp:simplePos x="0" y="0"/>
             <wp:positionH relativeFrom="margin">
               <wp:posOffset>-207034</wp:posOffset>
@@ -7199,23 +6150,7 @@
           <w:rFonts w:ascii="Arial" w:hAnsi="Arial" w:cs="Arial"/>
           <w:lang w:val="es-ES" w:eastAsia="es-EC"/>
         </w:rPr>
-        <w:t xml:space="preserve">Figura 5. Historial de </w:t>
-      </w:r>
-      <w:proofErr w:type="spellStart"/>
-      <w:r>
-        <w:rPr>
-          <w:rFonts w:ascii="Arial" w:hAnsi="Arial" w:cs="Arial"/>
-          <w:lang w:val="es-ES" w:eastAsia="es-EC"/>
-        </w:rPr>
-        <w:t>commits</w:t>
-      </w:r>
-      <w:proofErr w:type="spellEnd"/>
-      <w:r>
-        <w:rPr>
-          <w:rFonts w:ascii="Arial" w:hAnsi="Arial" w:cs="Arial"/>
-          <w:lang w:val="es-ES" w:eastAsia="es-EC"/>
-        </w:rPr>
-        <w:t>. Evidencia la secuencia de avances realizados en el proyecto.</w:t>
+        <w:t>Figura 5. Historial de commits. Evidencia la secuencia de avances realizados en el proyecto.</w:t>
       </w:r>
     </w:p>
     <w:p>
@@ -7263,55 +6198,7 @@
           <w:rFonts w:ascii="Arial" w:hAnsi="Arial" w:cs="Arial"/>
           <w:lang w:val="es-ES" w:eastAsia="es-EC"/>
         </w:rPr>
-        <w:t xml:space="preserve"> Pull </w:t>
-      </w:r>
-      <w:proofErr w:type="spellStart"/>
-      <w:r>
-        <w:rPr>
-          <w:rFonts w:ascii="Arial" w:hAnsi="Arial" w:cs="Arial"/>
-          <w:lang w:val="es-ES" w:eastAsia="es-EC"/>
-        </w:rPr>
-        <w:t>Request</w:t>
-      </w:r>
-      <w:proofErr w:type="spellEnd"/>
-      <w:r>
-        <w:rPr>
-          <w:rFonts w:ascii="Arial" w:hAnsi="Arial" w:cs="Arial"/>
-          <w:lang w:val="es-ES" w:eastAsia="es-EC"/>
-        </w:rPr>
-        <w:t xml:space="preserve"> #1 (</w:t>
-      </w:r>
-      <w:proofErr w:type="spellStart"/>
-      <w:r>
-        <w:rPr>
-          <w:rFonts w:ascii="Arial" w:hAnsi="Arial" w:cs="Arial"/>
-          <w:lang w:val="es-ES" w:eastAsia="es-EC"/>
-        </w:rPr>
-        <w:t>feature</w:t>
-      </w:r>
-      <w:proofErr w:type="spellEnd"/>
-      <w:r>
-        <w:rPr>
-          <w:rFonts w:ascii="Arial" w:hAnsi="Arial" w:cs="Arial"/>
-          <w:lang w:val="es-ES" w:eastAsia="es-EC"/>
-        </w:rPr>
-        <w:t xml:space="preserve"> → </w:t>
-      </w:r>
-      <w:proofErr w:type="spellStart"/>
-      <w:r>
-        <w:rPr>
-          <w:rFonts w:ascii="Arial" w:hAnsi="Arial" w:cs="Arial"/>
-          <w:lang w:val="es-ES" w:eastAsia="es-EC"/>
-        </w:rPr>
-        <w:t>develop</w:t>
-      </w:r>
-      <w:proofErr w:type="spellEnd"/>
-      <w:r>
-        <w:rPr>
-          <w:rFonts w:ascii="Arial" w:hAnsi="Arial" w:cs="Arial"/>
-          <w:lang w:val="es-ES" w:eastAsia="es-EC"/>
-        </w:rPr>
-        <w:t>). Integración de la rama de funcionalidad a la rama de desarrollo.</w:t>
+        <w:t xml:space="preserve"> Pull Request #1 (feature → develop). Integración de la rama de funcionalidad a la rama de desarrollo.</w:t>
       </w:r>
     </w:p>
     <w:p>
@@ -7565,55 +6452,7 @@
           <w:rFonts w:ascii="Arial" w:hAnsi="Arial" w:cs="Arial"/>
           <w:lang w:val="es-ES" w:eastAsia="es-EC"/>
         </w:rPr>
-        <w:t xml:space="preserve">Figura 7. Pull </w:t>
-      </w:r>
-      <w:proofErr w:type="spellStart"/>
-      <w:r>
-        <w:rPr>
-          <w:rFonts w:ascii="Arial" w:hAnsi="Arial" w:cs="Arial"/>
-          <w:lang w:val="es-ES" w:eastAsia="es-EC"/>
-        </w:rPr>
-        <w:t>Request</w:t>
-      </w:r>
-      <w:proofErr w:type="spellEnd"/>
-      <w:r>
-        <w:rPr>
-          <w:rFonts w:ascii="Arial" w:hAnsi="Arial" w:cs="Arial"/>
-          <w:lang w:val="es-ES" w:eastAsia="es-EC"/>
-        </w:rPr>
-        <w:t xml:space="preserve"> #2 (</w:t>
-      </w:r>
-      <w:proofErr w:type="spellStart"/>
-      <w:r>
-        <w:rPr>
-          <w:rFonts w:ascii="Arial" w:hAnsi="Arial" w:cs="Arial"/>
-          <w:lang w:val="es-ES" w:eastAsia="es-EC"/>
-        </w:rPr>
-        <w:t>develop</w:t>
-      </w:r>
-      <w:proofErr w:type="spellEnd"/>
-      <w:r>
-        <w:rPr>
-          <w:rFonts w:ascii="Arial" w:hAnsi="Arial" w:cs="Arial"/>
-          <w:lang w:val="es-ES" w:eastAsia="es-EC"/>
-        </w:rPr>
-        <w:t xml:space="preserve"> → </w:t>
-      </w:r>
-      <w:proofErr w:type="spellStart"/>
-      <w:r>
-        <w:rPr>
-          <w:rFonts w:ascii="Arial" w:hAnsi="Arial" w:cs="Arial"/>
-          <w:lang w:val="es-ES" w:eastAsia="es-EC"/>
-        </w:rPr>
-        <w:t>main</w:t>
-      </w:r>
-      <w:proofErr w:type="spellEnd"/>
-      <w:r>
-        <w:rPr>
-          <w:rFonts w:ascii="Arial" w:hAnsi="Arial" w:cs="Arial"/>
-          <w:lang w:val="es-ES" w:eastAsia="es-EC"/>
-        </w:rPr>
-        <w:t>). Fusión de la versión estable a producción.</w:t>
+        <w:t>Figura 7. Pull Request #2 (develop → main). Fusión de la versión estable a producción.</w:t>
       </w:r>
     </w:p>
     <w:p>
@@ -7767,7 +6606,6 @@
           <w:bCs/>
           <w:lang w:eastAsia="es-EC"/>
         </w:rPr>
-        <w:lastRenderedPageBreak/>
         <w:t>Bibliografía</w:t>
       </w:r>
     </w:p>
@@ -7797,7 +6635,6 @@
           <w:lang w:val="es-ES" w:eastAsia="es-EC"/>
         </w:rPr>
       </w:pPr>
-      <w:proofErr w:type="spellStart"/>
       <w:r>
         <w:rPr>
           <w:rFonts w:ascii="Arial" w:hAnsi="Arial" w:cs="Arial"/>
@@ -7807,43 +6644,7 @@
           <w:szCs w:val="20"/>
           <w:lang w:val="es-ES" w:eastAsia="es-EC"/>
         </w:rPr>
-        <w:t>Chacon</w:t>
-      </w:r>
-      <w:proofErr w:type="spellEnd"/>
-      <w:r>
-        <w:rPr>
-          <w:rFonts w:ascii="Arial" w:hAnsi="Arial" w:cs="Arial"/>
-          <w:i/>
-          <w:iCs/>
-          <w:sz w:val="20"/>
-          <w:szCs w:val="20"/>
-          <w:lang w:val="es-ES" w:eastAsia="es-EC"/>
-        </w:rPr>
-        <w:t xml:space="preserve">, S., &amp; Straub, B. (2014). Pro Git (2.ª ed.). </w:t>
-      </w:r>
-      <w:proofErr w:type="spellStart"/>
-      <w:r>
-        <w:rPr>
-          <w:rFonts w:ascii="Arial" w:hAnsi="Arial" w:cs="Arial"/>
-          <w:i/>
-          <w:iCs/>
-          <w:sz w:val="20"/>
-          <w:szCs w:val="20"/>
-          <w:lang w:val="es-ES" w:eastAsia="es-EC"/>
-        </w:rPr>
-        <w:t>Apress</w:t>
-      </w:r>
-      <w:proofErr w:type="spellEnd"/>
-      <w:r>
-        <w:rPr>
-          <w:rFonts w:ascii="Arial" w:hAnsi="Arial" w:cs="Arial"/>
-          <w:i/>
-          <w:iCs/>
-          <w:sz w:val="20"/>
-          <w:szCs w:val="20"/>
-          <w:lang w:val="es-ES" w:eastAsia="es-EC"/>
-        </w:rPr>
-        <w:t>. </w:t>
+        <w:t>Chacon, S., &amp; Straub, B. (2014). Pro Git (2.ª ed.). Apress. </w:t>
       </w:r>
       <w:hyperlink r:id="rId24" w:tgtFrame="_blank" w:history="1">
         <w:r>
@@ -7895,79 +6696,7 @@
           <w:szCs w:val="20"/>
           <w:lang w:val="es-ES" w:eastAsia="es-EC"/>
         </w:rPr>
-        <w:t xml:space="preserve">Driessen, V. (2010). A </w:t>
-      </w:r>
-      <w:proofErr w:type="spellStart"/>
-      <w:r>
-        <w:rPr>
-          <w:rFonts w:ascii="Arial" w:hAnsi="Arial" w:cs="Arial"/>
-          <w:i/>
-          <w:iCs/>
-          <w:sz w:val="20"/>
-          <w:szCs w:val="20"/>
-          <w:lang w:val="es-ES" w:eastAsia="es-EC"/>
-        </w:rPr>
-        <w:t>successful</w:t>
-      </w:r>
-      <w:proofErr w:type="spellEnd"/>
-      <w:r>
-        <w:rPr>
-          <w:rFonts w:ascii="Arial" w:hAnsi="Arial" w:cs="Arial"/>
-          <w:i/>
-          <w:iCs/>
-          <w:sz w:val="20"/>
-          <w:szCs w:val="20"/>
-          <w:lang w:val="es-ES" w:eastAsia="es-EC"/>
-        </w:rPr>
-        <w:t xml:space="preserve"> Git </w:t>
-      </w:r>
-      <w:proofErr w:type="spellStart"/>
-      <w:r>
-        <w:rPr>
-          <w:rFonts w:ascii="Arial" w:hAnsi="Arial" w:cs="Arial"/>
-          <w:i/>
-          <w:iCs/>
-          <w:sz w:val="20"/>
-          <w:szCs w:val="20"/>
-          <w:lang w:val="es-ES" w:eastAsia="es-EC"/>
-        </w:rPr>
-        <w:t>branching</w:t>
-      </w:r>
-      <w:proofErr w:type="spellEnd"/>
-      <w:r>
-        <w:rPr>
-          <w:rFonts w:ascii="Arial" w:hAnsi="Arial" w:cs="Arial"/>
-          <w:i/>
-          <w:iCs/>
-          <w:sz w:val="20"/>
-          <w:szCs w:val="20"/>
-          <w:lang w:val="es-ES" w:eastAsia="es-EC"/>
-        </w:rPr>
-        <w:t xml:space="preserve"> </w:t>
-      </w:r>
-      <w:proofErr w:type="spellStart"/>
-      <w:r>
-        <w:rPr>
-          <w:rFonts w:ascii="Arial" w:hAnsi="Arial" w:cs="Arial"/>
-          <w:i/>
-          <w:iCs/>
-          <w:sz w:val="20"/>
-          <w:szCs w:val="20"/>
-          <w:lang w:val="es-ES" w:eastAsia="es-EC"/>
-        </w:rPr>
-        <w:t>model</w:t>
-      </w:r>
-      <w:proofErr w:type="spellEnd"/>
-      <w:r>
-        <w:rPr>
-          <w:rFonts w:ascii="Arial" w:hAnsi="Arial" w:cs="Arial"/>
-          <w:i/>
-          <w:iCs/>
-          <w:sz w:val="20"/>
-          <w:szCs w:val="20"/>
-          <w:lang w:val="es-ES" w:eastAsia="es-EC"/>
-        </w:rPr>
-        <w:t>. </w:t>
+        <w:t>Driessen, V. (2010). A successful Git branching model. </w:t>
       </w:r>
       <w:hyperlink r:id="rId25" w:tgtFrame="_blank" w:history="1">
         <w:r>
@@ -8019,127 +6748,7 @@
           <w:szCs w:val="20"/>
           <w:lang w:val="es-ES" w:eastAsia="es-EC"/>
         </w:rPr>
-        <w:t>Fowler, M. (2002). </w:t>
-      </w:r>
-      <w:proofErr w:type="spellStart"/>
-      <w:r>
-        <w:rPr>
-          <w:rFonts w:ascii="Arial" w:hAnsi="Arial" w:cs="Arial"/>
-          <w:i/>
-          <w:iCs/>
-          <w:sz w:val="20"/>
-          <w:szCs w:val="20"/>
-          <w:lang w:val="es-ES" w:eastAsia="es-EC"/>
-        </w:rPr>
-        <w:t>Patterns</w:t>
-      </w:r>
-      <w:proofErr w:type="spellEnd"/>
-      <w:r>
-        <w:rPr>
-          <w:rFonts w:ascii="Arial" w:hAnsi="Arial" w:cs="Arial"/>
-          <w:i/>
-          <w:iCs/>
-          <w:sz w:val="20"/>
-          <w:szCs w:val="20"/>
-          <w:lang w:val="es-ES" w:eastAsia="es-EC"/>
-        </w:rPr>
-        <w:t xml:space="preserve"> </w:t>
-      </w:r>
-      <w:proofErr w:type="spellStart"/>
-      <w:r>
-        <w:rPr>
-          <w:rFonts w:ascii="Arial" w:hAnsi="Arial" w:cs="Arial"/>
-          <w:i/>
-          <w:iCs/>
-          <w:sz w:val="20"/>
-          <w:szCs w:val="20"/>
-          <w:lang w:val="es-ES" w:eastAsia="es-EC"/>
-        </w:rPr>
-        <w:t>of</w:t>
-      </w:r>
-      <w:proofErr w:type="spellEnd"/>
-      <w:r>
-        <w:rPr>
-          <w:rFonts w:ascii="Arial" w:hAnsi="Arial" w:cs="Arial"/>
-          <w:i/>
-          <w:iCs/>
-          <w:sz w:val="20"/>
-          <w:szCs w:val="20"/>
-          <w:lang w:val="es-ES" w:eastAsia="es-EC"/>
-        </w:rPr>
-        <w:t xml:space="preserve"> </w:t>
-      </w:r>
-      <w:proofErr w:type="spellStart"/>
-      <w:r>
-        <w:rPr>
-          <w:rFonts w:ascii="Arial" w:hAnsi="Arial" w:cs="Arial"/>
-          <w:i/>
-          <w:iCs/>
-          <w:sz w:val="20"/>
-          <w:szCs w:val="20"/>
-          <w:lang w:val="es-ES" w:eastAsia="es-EC"/>
-        </w:rPr>
-        <w:t>enterprise</w:t>
-      </w:r>
-      <w:proofErr w:type="spellEnd"/>
-      <w:r>
-        <w:rPr>
-          <w:rFonts w:ascii="Arial" w:hAnsi="Arial" w:cs="Arial"/>
-          <w:i/>
-          <w:iCs/>
-          <w:sz w:val="20"/>
-          <w:szCs w:val="20"/>
-          <w:lang w:val="es-ES" w:eastAsia="es-EC"/>
-        </w:rPr>
-        <w:t xml:space="preserve"> </w:t>
-      </w:r>
-      <w:proofErr w:type="spellStart"/>
-      <w:r>
-        <w:rPr>
-          <w:rFonts w:ascii="Arial" w:hAnsi="Arial" w:cs="Arial"/>
-          <w:i/>
-          <w:iCs/>
-          <w:sz w:val="20"/>
-          <w:szCs w:val="20"/>
-          <w:lang w:val="es-ES" w:eastAsia="es-EC"/>
-        </w:rPr>
-        <w:t>application</w:t>
-      </w:r>
-      <w:proofErr w:type="spellEnd"/>
-      <w:r>
-        <w:rPr>
-          <w:rFonts w:ascii="Arial" w:hAnsi="Arial" w:cs="Arial"/>
-          <w:i/>
-          <w:iCs/>
-          <w:sz w:val="20"/>
-          <w:szCs w:val="20"/>
-          <w:lang w:val="es-ES" w:eastAsia="es-EC"/>
-        </w:rPr>
-        <w:t xml:space="preserve"> </w:t>
-      </w:r>
-      <w:proofErr w:type="spellStart"/>
-      <w:r>
-        <w:rPr>
-          <w:rFonts w:ascii="Arial" w:hAnsi="Arial" w:cs="Arial"/>
-          <w:i/>
-          <w:iCs/>
-          <w:sz w:val="20"/>
-          <w:szCs w:val="20"/>
-          <w:lang w:val="es-ES" w:eastAsia="es-EC"/>
-        </w:rPr>
-        <w:t>architecture</w:t>
-      </w:r>
-      <w:proofErr w:type="spellEnd"/>
-      <w:r>
-        <w:rPr>
-          <w:rFonts w:ascii="Arial" w:hAnsi="Arial" w:cs="Arial"/>
-          <w:i/>
-          <w:iCs/>
-          <w:sz w:val="20"/>
-          <w:szCs w:val="20"/>
-          <w:lang w:val="es-ES" w:eastAsia="es-EC"/>
-        </w:rPr>
-        <w:t>. Addison-Wesley.</w:t>
+        <w:t>Fowler, M. (2002). Patterns of enterprise application architecture. Addison-Wesley.</w:t>
       </w:r>
     </w:p>
     <w:p>
@@ -8177,151 +6786,7 @@
           <w:szCs w:val="20"/>
           <w:lang w:val="es-ES" w:eastAsia="es-EC"/>
         </w:rPr>
-        <w:t xml:space="preserve">Gamma, E., Helm, R., Johnson, R., &amp; </w:t>
-      </w:r>
-      <w:proofErr w:type="spellStart"/>
-      <w:r>
-        <w:rPr>
-          <w:rFonts w:ascii="Arial" w:hAnsi="Arial" w:cs="Arial"/>
-          <w:i/>
-          <w:iCs/>
-          <w:sz w:val="20"/>
-          <w:szCs w:val="20"/>
-          <w:lang w:val="es-ES" w:eastAsia="es-EC"/>
-        </w:rPr>
-        <w:t>Vlissides</w:t>
-      </w:r>
-      <w:proofErr w:type="spellEnd"/>
-      <w:r>
-        <w:rPr>
-          <w:rFonts w:ascii="Arial" w:hAnsi="Arial" w:cs="Arial"/>
-          <w:i/>
-          <w:iCs/>
-          <w:sz w:val="20"/>
-          <w:szCs w:val="20"/>
-          <w:lang w:val="es-ES" w:eastAsia="es-EC"/>
-        </w:rPr>
-        <w:t>, J. (1994). </w:t>
-      </w:r>
-      <w:proofErr w:type="spellStart"/>
-      <w:r>
-        <w:rPr>
-          <w:rFonts w:ascii="Arial" w:hAnsi="Arial" w:cs="Arial"/>
-          <w:i/>
-          <w:iCs/>
-          <w:sz w:val="20"/>
-          <w:szCs w:val="20"/>
-          <w:lang w:val="es-ES" w:eastAsia="es-EC"/>
-        </w:rPr>
-        <w:t>Design</w:t>
-      </w:r>
-      <w:proofErr w:type="spellEnd"/>
-      <w:r>
-        <w:rPr>
-          <w:rFonts w:ascii="Arial" w:hAnsi="Arial" w:cs="Arial"/>
-          <w:i/>
-          <w:iCs/>
-          <w:sz w:val="20"/>
-          <w:szCs w:val="20"/>
-          <w:lang w:val="es-ES" w:eastAsia="es-EC"/>
-        </w:rPr>
-        <w:t xml:space="preserve"> </w:t>
-      </w:r>
-      <w:proofErr w:type="spellStart"/>
-      <w:r>
-        <w:rPr>
-          <w:rFonts w:ascii="Arial" w:hAnsi="Arial" w:cs="Arial"/>
-          <w:i/>
-          <w:iCs/>
-          <w:sz w:val="20"/>
-          <w:szCs w:val="20"/>
-          <w:lang w:val="es-ES" w:eastAsia="es-EC"/>
-        </w:rPr>
-        <w:t>patterns</w:t>
-      </w:r>
-      <w:proofErr w:type="spellEnd"/>
-      <w:r>
-        <w:rPr>
-          <w:rFonts w:ascii="Arial" w:hAnsi="Arial" w:cs="Arial"/>
-          <w:i/>
-          <w:iCs/>
-          <w:sz w:val="20"/>
-          <w:szCs w:val="20"/>
-          <w:lang w:val="es-ES" w:eastAsia="es-EC"/>
-        </w:rPr>
-        <w:t xml:space="preserve">: </w:t>
-      </w:r>
-      <w:proofErr w:type="spellStart"/>
-      <w:r>
-        <w:rPr>
-          <w:rFonts w:ascii="Arial" w:hAnsi="Arial" w:cs="Arial"/>
-          <w:i/>
-          <w:iCs/>
-          <w:sz w:val="20"/>
-          <w:szCs w:val="20"/>
-          <w:lang w:val="es-ES" w:eastAsia="es-EC"/>
-        </w:rPr>
-        <w:t>Elements</w:t>
-      </w:r>
-      <w:proofErr w:type="spellEnd"/>
-      <w:r>
-        <w:rPr>
-          <w:rFonts w:ascii="Arial" w:hAnsi="Arial" w:cs="Arial"/>
-          <w:i/>
-          <w:iCs/>
-          <w:sz w:val="20"/>
-          <w:szCs w:val="20"/>
-          <w:lang w:val="es-ES" w:eastAsia="es-EC"/>
-        </w:rPr>
-        <w:t xml:space="preserve"> </w:t>
-      </w:r>
-      <w:proofErr w:type="spellStart"/>
-      <w:r>
-        <w:rPr>
-          <w:rFonts w:ascii="Arial" w:hAnsi="Arial" w:cs="Arial"/>
-          <w:i/>
-          <w:iCs/>
-          <w:sz w:val="20"/>
-          <w:szCs w:val="20"/>
-          <w:lang w:val="es-ES" w:eastAsia="es-EC"/>
-        </w:rPr>
-        <w:t>of</w:t>
-      </w:r>
-      <w:proofErr w:type="spellEnd"/>
-      <w:r>
-        <w:rPr>
-          <w:rFonts w:ascii="Arial" w:hAnsi="Arial" w:cs="Arial"/>
-          <w:i/>
-          <w:iCs/>
-          <w:sz w:val="20"/>
-          <w:szCs w:val="20"/>
-          <w:lang w:val="es-ES" w:eastAsia="es-EC"/>
-        </w:rPr>
-        <w:t xml:space="preserve"> reusable </w:t>
-      </w:r>
-      <w:proofErr w:type="spellStart"/>
-      <w:r>
-        <w:rPr>
-          <w:rFonts w:ascii="Arial" w:hAnsi="Arial" w:cs="Arial"/>
-          <w:i/>
-          <w:iCs/>
-          <w:sz w:val="20"/>
-          <w:szCs w:val="20"/>
-          <w:lang w:val="es-ES" w:eastAsia="es-EC"/>
-        </w:rPr>
-        <w:t>object-oriented</w:t>
-      </w:r>
-      <w:proofErr w:type="spellEnd"/>
-      <w:r>
-        <w:rPr>
-          <w:rFonts w:ascii="Arial" w:hAnsi="Arial" w:cs="Arial"/>
-          <w:i/>
-          <w:iCs/>
-          <w:sz w:val="20"/>
-          <w:szCs w:val="20"/>
-          <w:lang w:val="es-ES" w:eastAsia="es-EC"/>
-        </w:rPr>
-        <w:t xml:space="preserve"> software. Addison-Wesley.</w:t>
+        <w:t>Gamma, E., Helm, R., Johnson, R., &amp; Vlissides, J. (1994). Design patterns: Elements of reusable object-oriented software. Addison-Wesley.</w:t>
       </w:r>
     </w:p>
     <w:p>
@@ -8359,127 +6824,7 @@
           <w:szCs w:val="20"/>
           <w:lang w:val="es-ES" w:eastAsia="es-EC"/>
         </w:rPr>
-        <w:t>Martin, R. C. (2009). </w:t>
-      </w:r>
-      <w:proofErr w:type="spellStart"/>
-      <w:r>
-        <w:rPr>
-          <w:rFonts w:ascii="Arial" w:hAnsi="Arial" w:cs="Arial"/>
-          <w:i/>
-          <w:iCs/>
-          <w:sz w:val="20"/>
-          <w:szCs w:val="20"/>
-          <w:lang w:val="es-ES" w:eastAsia="es-EC"/>
-        </w:rPr>
-        <w:t>Clean</w:t>
-      </w:r>
-      <w:proofErr w:type="spellEnd"/>
-      <w:r>
-        <w:rPr>
-          <w:rFonts w:ascii="Arial" w:hAnsi="Arial" w:cs="Arial"/>
-          <w:i/>
-          <w:iCs/>
-          <w:sz w:val="20"/>
-          <w:szCs w:val="20"/>
-          <w:lang w:val="es-ES" w:eastAsia="es-EC"/>
-        </w:rPr>
-        <w:t xml:space="preserve"> </w:t>
-      </w:r>
-      <w:proofErr w:type="spellStart"/>
-      <w:r>
-        <w:rPr>
-          <w:rFonts w:ascii="Arial" w:hAnsi="Arial" w:cs="Arial"/>
-          <w:i/>
-          <w:iCs/>
-          <w:sz w:val="20"/>
-          <w:szCs w:val="20"/>
-          <w:lang w:val="es-ES" w:eastAsia="es-EC"/>
-        </w:rPr>
-        <w:t>code</w:t>
-      </w:r>
-      <w:proofErr w:type="spellEnd"/>
-      <w:r>
-        <w:rPr>
-          <w:rFonts w:ascii="Arial" w:hAnsi="Arial" w:cs="Arial"/>
-          <w:i/>
-          <w:iCs/>
-          <w:sz w:val="20"/>
-          <w:szCs w:val="20"/>
-          <w:lang w:val="es-ES" w:eastAsia="es-EC"/>
-        </w:rPr>
-        <w:t xml:space="preserve">: A </w:t>
-      </w:r>
-      <w:proofErr w:type="spellStart"/>
-      <w:r>
-        <w:rPr>
-          <w:rFonts w:ascii="Arial" w:hAnsi="Arial" w:cs="Arial"/>
-          <w:i/>
-          <w:iCs/>
-          <w:sz w:val="20"/>
-          <w:szCs w:val="20"/>
-          <w:lang w:val="es-ES" w:eastAsia="es-EC"/>
-        </w:rPr>
-        <w:t>handbook</w:t>
-      </w:r>
-      <w:proofErr w:type="spellEnd"/>
-      <w:r>
-        <w:rPr>
-          <w:rFonts w:ascii="Arial" w:hAnsi="Arial" w:cs="Arial"/>
-          <w:i/>
-          <w:iCs/>
-          <w:sz w:val="20"/>
-          <w:szCs w:val="20"/>
-          <w:lang w:val="es-ES" w:eastAsia="es-EC"/>
-        </w:rPr>
-        <w:t xml:space="preserve"> </w:t>
-      </w:r>
-      <w:proofErr w:type="spellStart"/>
-      <w:r>
-        <w:rPr>
-          <w:rFonts w:ascii="Arial" w:hAnsi="Arial" w:cs="Arial"/>
-          <w:i/>
-          <w:iCs/>
-          <w:sz w:val="20"/>
-          <w:szCs w:val="20"/>
-          <w:lang w:val="es-ES" w:eastAsia="es-EC"/>
-        </w:rPr>
-        <w:t>of</w:t>
-      </w:r>
-      <w:proofErr w:type="spellEnd"/>
-      <w:r>
-        <w:rPr>
-          <w:rFonts w:ascii="Arial" w:hAnsi="Arial" w:cs="Arial"/>
-          <w:i/>
-          <w:iCs/>
-          <w:sz w:val="20"/>
-          <w:szCs w:val="20"/>
-          <w:lang w:val="es-ES" w:eastAsia="es-EC"/>
-        </w:rPr>
-        <w:t xml:space="preserve"> agile software </w:t>
-      </w:r>
-      <w:proofErr w:type="spellStart"/>
-      <w:r>
-        <w:rPr>
-          <w:rFonts w:ascii="Arial" w:hAnsi="Arial" w:cs="Arial"/>
-          <w:i/>
-          <w:iCs/>
-          <w:sz w:val="20"/>
-          <w:szCs w:val="20"/>
-          <w:lang w:val="es-ES" w:eastAsia="es-EC"/>
-        </w:rPr>
-        <w:t>craftsmanship</w:t>
-      </w:r>
-      <w:proofErr w:type="spellEnd"/>
-      <w:r>
-        <w:rPr>
-          <w:rFonts w:ascii="Arial" w:hAnsi="Arial" w:cs="Arial"/>
-          <w:i/>
-          <w:iCs/>
-          <w:sz w:val="20"/>
-          <w:szCs w:val="20"/>
-          <w:lang w:val="es-ES" w:eastAsia="es-EC"/>
-        </w:rPr>
-        <w:t>. Prentice Hall.</w:t>
+        <w:t>Martin, R. C. (2009). Clean code: A handbook of agile software craftsmanship. Prentice Hall.</w:t>
       </w:r>
     </w:p>
     <w:p>
@@ -8517,151 +6862,7 @@
           <w:szCs w:val="20"/>
           <w:lang w:val="es-ES" w:eastAsia="es-EC"/>
         </w:rPr>
-        <w:t>Martin, R. C. (2017). </w:t>
-      </w:r>
-      <w:proofErr w:type="spellStart"/>
-      <w:r>
-        <w:rPr>
-          <w:rFonts w:ascii="Arial" w:hAnsi="Arial" w:cs="Arial"/>
-          <w:i/>
-          <w:iCs/>
-          <w:sz w:val="20"/>
-          <w:szCs w:val="20"/>
-          <w:lang w:val="es-ES" w:eastAsia="es-EC"/>
-        </w:rPr>
-        <w:t>Clean</w:t>
-      </w:r>
-      <w:proofErr w:type="spellEnd"/>
-      <w:r>
-        <w:rPr>
-          <w:rFonts w:ascii="Arial" w:hAnsi="Arial" w:cs="Arial"/>
-          <w:i/>
-          <w:iCs/>
-          <w:sz w:val="20"/>
-          <w:szCs w:val="20"/>
-          <w:lang w:val="es-ES" w:eastAsia="es-EC"/>
-        </w:rPr>
-        <w:t xml:space="preserve"> </w:t>
-      </w:r>
-      <w:proofErr w:type="spellStart"/>
-      <w:r>
-        <w:rPr>
-          <w:rFonts w:ascii="Arial" w:hAnsi="Arial" w:cs="Arial"/>
-          <w:i/>
-          <w:iCs/>
-          <w:sz w:val="20"/>
-          <w:szCs w:val="20"/>
-          <w:lang w:val="es-ES" w:eastAsia="es-EC"/>
-        </w:rPr>
-        <w:t>architecture</w:t>
-      </w:r>
-      <w:proofErr w:type="spellEnd"/>
-      <w:r>
-        <w:rPr>
-          <w:rFonts w:ascii="Arial" w:hAnsi="Arial" w:cs="Arial"/>
-          <w:i/>
-          <w:iCs/>
-          <w:sz w:val="20"/>
-          <w:szCs w:val="20"/>
-          <w:lang w:val="es-ES" w:eastAsia="es-EC"/>
-        </w:rPr>
-        <w:t xml:space="preserve">: A </w:t>
-      </w:r>
-      <w:proofErr w:type="spellStart"/>
-      <w:r>
-        <w:rPr>
-          <w:rFonts w:ascii="Arial" w:hAnsi="Arial" w:cs="Arial"/>
-          <w:i/>
-          <w:iCs/>
-          <w:sz w:val="20"/>
-          <w:szCs w:val="20"/>
-          <w:lang w:val="es-ES" w:eastAsia="es-EC"/>
-        </w:rPr>
-        <w:t>craftsman's</w:t>
-      </w:r>
-      <w:proofErr w:type="spellEnd"/>
-      <w:r>
-        <w:rPr>
-          <w:rFonts w:ascii="Arial" w:hAnsi="Arial" w:cs="Arial"/>
-          <w:i/>
-          <w:iCs/>
-          <w:sz w:val="20"/>
-          <w:szCs w:val="20"/>
-          <w:lang w:val="es-ES" w:eastAsia="es-EC"/>
-        </w:rPr>
-        <w:t xml:space="preserve"> guide </w:t>
-      </w:r>
-      <w:proofErr w:type="spellStart"/>
-      <w:r>
-        <w:rPr>
-          <w:rFonts w:ascii="Arial" w:hAnsi="Arial" w:cs="Arial"/>
-          <w:i/>
-          <w:iCs/>
-          <w:sz w:val="20"/>
-          <w:szCs w:val="20"/>
-          <w:lang w:val="es-ES" w:eastAsia="es-EC"/>
-        </w:rPr>
-        <w:t>to</w:t>
-      </w:r>
-      <w:proofErr w:type="spellEnd"/>
-      <w:r>
-        <w:rPr>
-          <w:rFonts w:ascii="Arial" w:hAnsi="Arial" w:cs="Arial"/>
-          <w:i/>
-          <w:iCs/>
-          <w:sz w:val="20"/>
-          <w:szCs w:val="20"/>
-          <w:lang w:val="es-ES" w:eastAsia="es-EC"/>
-        </w:rPr>
-        <w:t xml:space="preserve"> software </w:t>
-      </w:r>
-      <w:proofErr w:type="spellStart"/>
-      <w:r>
-        <w:rPr>
-          <w:rFonts w:ascii="Arial" w:hAnsi="Arial" w:cs="Arial"/>
-          <w:i/>
-          <w:iCs/>
-          <w:sz w:val="20"/>
-          <w:szCs w:val="20"/>
-          <w:lang w:val="es-ES" w:eastAsia="es-EC"/>
-        </w:rPr>
-        <w:t>structure</w:t>
-      </w:r>
-      <w:proofErr w:type="spellEnd"/>
-      <w:r>
-        <w:rPr>
-          <w:rFonts w:ascii="Arial" w:hAnsi="Arial" w:cs="Arial"/>
-          <w:i/>
-          <w:iCs/>
-          <w:sz w:val="20"/>
-          <w:szCs w:val="20"/>
-          <w:lang w:val="es-ES" w:eastAsia="es-EC"/>
-        </w:rPr>
-        <w:t xml:space="preserve"> and </w:t>
-      </w:r>
-      <w:proofErr w:type="spellStart"/>
-      <w:r>
-        <w:rPr>
-          <w:rFonts w:ascii="Arial" w:hAnsi="Arial" w:cs="Arial"/>
-          <w:i/>
-          <w:iCs/>
-          <w:sz w:val="20"/>
-          <w:szCs w:val="20"/>
-          <w:lang w:val="es-ES" w:eastAsia="es-EC"/>
-        </w:rPr>
-        <w:t>design</w:t>
-      </w:r>
-      <w:proofErr w:type="spellEnd"/>
-      <w:r>
-        <w:rPr>
-          <w:rFonts w:ascii="Arial" w:hAnsi="Arial" w:cs="Arial"/>
-          <w:i/>
-          <w:iCs/>
-          <w:sz w:val="20"/>
-          <w:szCs w:val="20"/>
-          <w:lang w:val="es-ES" w:eastAsia="es-EC"/>
-        </w:rPr>
-        <w:t>. Prentice Hall.</w:t>
+        <w:t>Martin, R. C. (2017). Clean architecture: A craftsman's guide to software structure and design. Prentice Hall.</w:t>
       </w:r>
     </w:p>
     <w:p>
@@ -8699,103 +6900,7 @@
           <w:szCs w:val="20"/>
           <w:lang w:val="es-ES" w:eastAsia="es-EC"/>
         </w:rPr>
-        <w:t xml:space="preserve">Pressman, R. S., &amp; Maxim, B. R. (2015). Software </w:t>
-      </w:r>
-      <w:proofErr w:type="spellStart"/>
-      <w:r>
-        <w:rPr>
-          <w:rFonts w:ascii="Arial" w:hAnsi="Arial" w:cs="Arial"/>
-          <w:i/>
-          <w:iCs/>
-          <w:sz w:val="20"/>
-          <w:szCs w:val="20"/>
-          <w:lang w:val="es-ES" w:eastAsia="es-EC"/>
-        </w:rPr>
-        <w:t>engineering</w:t>
-      </w:r>
-      <w:proofErr w:type="spellEnd"/>
-      <w:r>
-        <w:rPr>
-          <w:rFonts w:ascii="Arial" w:hAnsi="Arial" w:cs="Arial"/>
-          <w:i/>
-          <w:iCs/>
-          <w:sz w:val="20"/>
-          <w:szCs w:val="20"/>
-          <w:lang w:val="es-ES" w:eastAsia="es-EC"/>
-        </w:rPr>
-        <w:t xml:space="preserve">: A </w:t>
-      </w:r>
-      <w:proofErr w:type="spellStart"/>
-      <w:r>
-        <w:rPr>
-          <w:rFonts w:ascii="Arial" w:hAnsi="Arial" w:cs="Arial"/>
-          <w:i/>
-          <w:iCs/>
-          <w:sz w:val="20"/>
-          <w:szCs w:val="20"/>
-          <w:lang w:val="es-ES" w:eastAsia="es-EC"/>
-        </w:rPr>
-        <w:t>practitioner's</w:t>
-      </w:r>
-      <w:proofErr w:type="spellEnd"/>
-      <w:r>
-        <w:rPr>
-          <w:rFonts w:ascii="Arial" w:hAnsi="Arial" w:cs="Arial"/>
-          <w:i/>
-          <w:iCs/>
-          <w:sz w:val="20"/>
-          <w:szCs w:val="20"/>
-          <w:lang w:val="es-ES" w:eastAsia="es-EC"/>
-        </w:rPr>
-        <w:t xml:space="preserve"> </w:t>
-      </w:r>
-      <w:proofErr w:type="spellStart"/>
-      <w:r>
-        <w:rPr>
-          <w:rFonts w:ascii="Arial" w:hAnsi="Arial" w:cs="Arial"/>
-          <w:i/>
-          <w:iCs/>
-          <w:sz w:val="20"/>
-          <w:szCs w:val="20"/>
-          <w:lang w:val="es-ES" w:eastAsia="es-EC"/>
-        </w:rPr>
-        <w:t>approach</w:t>
-      </w:r>
-      <w:proofErr w:type="spellEnd"/>
-      <w:r>
-        <w:rPr>
-          <w:rFonts w:ascii="Arial" w:hAnsi="Arial" w:cs="Arial"/>
-          <w:i/>
-          <w:iCs/>
-          <w:sz w:val="20"/>
-          <w:szCs w:val="20"/>
-          <w:lang w:val="es-ES" w:eastAsia="es-EC"/>
-        </w:rPr>
-        <w:t xml:space="preserve"> (8.ª ed.). McGraw-Hill </w:t>
-      </w:r>
-      <w:proofErr w:type="spellStart"/>
-      <w:r>
-        <w:rPr>
-          <w:rFonts w:ascii="Arial" w:hAnsi="Arial" w:cs="Arial"/>
-          <w:i/>
-          <w:iCs/>
-          <w:sz w:val="20"/>
-          <w:szCs w:val="20"/>
-          <w:lang w:val="es-ES" w:eastAsia="es-EC"/>
-        </w:rPr>
-        <w:t>Education</w:t>
-      </w:r>
-      <w:proofErr w:type="spellEnd"/>
-      <w:r>
-        <w:rPr>
-          <w:rFonts w:ascii="Arial" w:hAnsi="Arial" w:cs="Arial"/>
-          <w:i/>
-          <w:iCs/>
-          <w:sz w:val="20"/>
-          <w:szCs w:val="20"/>
-          <w:lang w:val="es-ES" w:eastAsia="es-EC"/>
-        </w:rPr>
-        <w:t>.</w:t>
+        <w:t>Pressman, R. S., &amp; Maxim, B. R. (2015). Software engineering: A practitioner's approach (8.ª ed.). McGraw-Hill Education.</w:t>
       </w:r>
     </w:p>
     <w:p>
@@ -8833,31 +6938,7 @@
           <w:szCs w:val="20"/>
           <w:lang w:val="es-ES" w:eastAsia="es-EC"/>
         </w:rPr>
-        <w:t xml:space="preserve">Sommerville, I. (2016). Software </w:t>
-      </w:r>
-      <w:proofErr w:type="spellStart"/>
-      <w:r>
-        <w:rPr>
-          <w:rFonts w:ascii="Arial" w:hAnsi="Arial" w:cs="Arial"/>
-          <w:i/>
-          <w:iCs/>
-          <w:sz w:val="20"/>
-          <w:szCs w:val="20"/>
-          <w:lang w:val="es-ES" w:eastAsia="es-EC"/>
-        </w:rPr>
-        <w:t>engineering</w:t>
-      </w:r>
-      <w:proofErr w:type="spellEnd"/>
-      <w:r>
-        <w:rPr>
-          <w:rFonts w:ascii="Arial" w:hAnsi="Arial" w:cs="Arial"/>
-          <w:i/>
-          <w:iCs/>
-          <w:sz w:val="20"/>
-          <w:szCs w:val="20"/>
-          <w:lang w:val="es-ES" w:eastAsia="es-EC"/>
-        </w:rPr>
-        <w:t> (10.ª ed.). Pearson.</w:t>
+        <w:t>Sommerville, I. (2016). Software engineering (10.ª ed.). Pearson.</w:t>
       </w:r>
     </w:p>
     <w:p>
@@ -9755,7 +7836,7 @@
         <v:path o:extrusionok="f" gradientshapeok="t" o:connecttype="rect"/>
         <o:lock v:ext="edit" aspectratio="t"/>
       </v:shapetype>
-      <v:shape id="_x0000_i1033" type="#_x0000_t75" style="width:12pt;height:12pt" o:bullet="t">
+      <v:shape id="_x0000_i1026" type="#_x0000_t75" style="width:12pt;height:12pt" o:bullet="t">
         <v:imagedata r:id="rId1" o:title="mso3E28"/>
       </v:shape>
     </w:pict>
@@ -13710,6 +11791,7 @@
   <w:style w:type="character" w:default="1" w:styleId="Fuentedeprrafopredeter">
     <w:name w:val="Default Paragraph Font"/>
     <w:uiPriority w:val="1"/>
+    <w:semiHidden/>
     <w:unhideWhenUsed/>
   </w:style>
   <w:style w:type="table" w:default="1" w:styleId="Tablanormal">

</xml_diff>

<commit_message>
Se agregan capturas de evidencia de Git en el documento
</commit_message>
<xml_diff>
--- a/Actividad-1.docx
+++ b/Actividad-1.docx
@@ -448,7 +448,7 @@
                 <w:kern w:val="24"/>
                 <w:lang w:val="es-ES_tradnl"/>
               </w:rPr>
-              <w:t>Sexto</w:t>
+              <w:t>Quinto</w:t>
             </w:r>
           </w:p>
         </w:tc>
@@ -502,12 +502,21 @@
         </w:rPr>
         <w:t xml:space="preserve">: </w:t>
       </w:r>
-      <w:r>
-        <w:rPr>
-          <w:b/>
-          <w:bCs/>
-        </w:rPr>
-        <w:t>Jordan Enrique Santillan Zambrano</w:t>
+      <w:proofErr w:type="spellStart"/>
+      <w:r>
+        <w:rPr>
+          <w:b/>
+          <w:bCs/>
+        </w:rPr>
+        <w:t>Jordan</w:t>
+      </w:r>
+      <w:proofErr w:type="spellEnd"/>
+      <w:r>
+        <w:rPr>
+          <w:b/>
+          <w:bCs/>
+        </w:rPr>
+        <w:t xml:space="preserve"> Enrique Santillan Zambrano</w:t>
       </w:r>
     </w:p>
     <w:p>
@@ -564,7 +573,21 @@
           <w:b/>
           <w:bCs/>
         </w:rPr>
-        <w:t xml:space="preserve"> 6 semestre</w:t>
+        <w:t xml:space="preserve"> </w:t>
+      </w:r>
+      <w:r>
+        <w:rPr>
+          <w:b/>
+          <w:bCs/>
+        </w:rPr>
+        <w:t>5</w:t>
+      </w:r>
+      <w:r>
+        <w:rPr>
+          <w:b/>
+          <w:bCs/>
+        </w:rPr>
+        <w:t xml:space="preserve"> semestre</w:t>
       </w:r>
     </w:p>
     <w:p>
@@ -1189,8 +1212,17 @@
                 <w:rFonts w:ascii="Arial" w:hAnsi="Arial" w:cs="Arial"/>
                 <w:lang w:val="es-ES"/>
               </w:rPr>
-              <w:t>Ciudadano/Reportante</w:t>
+              <w:t>Ciudadano/</w:t>
             </w:r>
+            <w:proofErr w:type="spellStart"/>
+            <w:r>
+              <w:rPr>
+                <w:rFonts w:ascii="Arial" w:hAnsi="Arial" w:cs="Arial"/>
+                <w:lang w:val="es-ES"/>
+              </w:rPr>
+              <w:t>Reportante</w:t>
+            </w:r>
+            <w:proofErr w:type="spellEnd"/>
           </w:p>
         </w:tc>
         <w:tc>
@@ -2354,7 +2386,27 @@
                 <w:bCs/>
                 <w:lang w:val="es-ES" w:eastAsia="es-EC"/>
               </w:rPr>
-              <w:t>Trazabilidad de versiones: todas las acciones y cambios deben quedar registrados mediante el control de versiones (Git/Gitflow).</w:t>
+              <w:t>Trazabilidad de versiones: todas las acciones y cambios deben quedar registrados mediante el control de versiones (Git/</w:t>
+            </w:r>
+            <w:proofErr w:type="spellStart"/>
+            <w:r>
+              <w:rPr>
+                <w:rFonts w:ascii="Arial" w:hAnsi="Arial" w:cs="Arial"/>
+                <w:b/>
+                <w:bCs/>
+                <w:lang w:val="es-ES" w:eastAsia="es-EC"/>
+              </w:rPr>
+              <w:t>Gitflow</w:t>
+            </w:r>
+            <w:proofErr w:type="spellEnd"/>
+            <w:r>
+              <w:rPr>
+                <w:rFonts w:ascii="Arial" w:hAnsi="Arial" w:cs="Arial"/>
+                <w:b/>
+                <w:bCs/>
+                <w:lang w:val="es-ES" w:eastAsia="es-EC"/>
+              </w:rPr>
+              <w:t>).</w:t>
             </w:r>
           </w:p>
         </w:tc>
@@ -2485,22 +2537,97 @@
           <w:bCs/>
           <w:lang w:eastAsia="es-EC"/>
         </w:rPr>
-        <w:t>2.1 Repositorio GitHub y Gitflow</w:t>
-      </w:r>
-    </w:p>
-    <w:p>
-      <w:pPr>
-        <w:rPr>
-          <w:rFonts w:ascii="Arial" w:hAnsi="Arial" w:cs="Arial"/>
-          <w:lang w:eastAsia="es-EC"/>
-        </w:rPr>
-      </w:pPr>
-      <w:r>
-        <w:rPr>
-          <w:rFonts w:ascii="Arial" w:hAnsi="Arial" w:cs="Arial"/>
-          <w:lang w:eastAsia="es-EC"/>
-        </w:rPr>
-        <w:t>El proyecto se gestiona en un repositorio público de GitHub bajo el modelo Gitflow, con las ramas main, develop y feature/* (ver sección 5).</w:t>
+        <w:t xml:space="preserve">2.1 Repositorio GitHub y </w:t>
+      </w:r>
+      <w:proofErr w:type="spellStart"/>
+      <w:r>
+        <w:rPr>
+          <w:rFonts w:ascii="Arial" w:hAnsi="Arial" w:cs="Arial"/>
+          <w:b/>
+          <w:bCs/>
+          <w:lang w:eastAsia="es-EC"/>
+        </w:rPr>
+        <w:t>Gitflow</w:t>
+      </w:r>
+      <w:proofErr w:type="spellEnd"/>
+    </w:p>
+    <w:p>
+      <w:pPr>
+        <w:rPr>
+          <w:rFonts w:ascii="Arial" w:hAnsi="Arial" w:cs="Arial"/>
+          <w:lang w:eastAsia="es-EC"/>
+        </w:rPr>
+      </w:pPr>
+      <w:r>
+        <w:rPr>
+          <w:rFonts w:ascii="Arial" w:hAnsi="Arial" w:cs="Arial"/>
+          <w:lang w:eastAsia="es-EC"/>
+        </w:rPr>
+        <w:t xml:space="preserve">El proyecto se gestiona en un repositorio público de GitHub bajo el modelo </w:t>
+      </w:r>
+      <w:proofErr w:type="spellStart"/>
+      <w:r>
+        <w:rPr>
+          <w:rFonts w:ascii="Arial" w:hAnsi="Arial" w:cs="Arial"/>
+          <w:lang w:eastAsia="es-EC"/>
+        </w:rPr>
+        <w:t>Gitflow</w:t>
+      </w:r>
+      <w:proofErr w:type="spellEnd"/>
+      <w:r>
+        <w:rPr>
+          <w:rFonts w:ascii="Arial" w:hAnsi="Arial" w:cs="Arial"/>
+          <w:lang w:eastAsia="es-EC"/>
+        </w:rPr>
+        <w:t xml:space="preserve">, con las ramas </w:t>
+      </w:r>
+      <w:proofErr w:type="spellStart"/>
+      <w:r>
+        <w:rPr>
+          <w:rFonts w:ascii="Arial" w:hAnsi="Arial" w:cs="Arial"/>
+          <w:lang w:eastAsia="es-EC"/>
+        </w:rPr>
+        <w:t>main</w:t>
+      </w:r>
+      <w:proofErr w:type="spellEnd"/>
+      <w:r>
+        <w:rPr>
+          <w:rFonts w:ascii="Arial" w:hAnsi="Arial" w:cs="Arial"/>
+          <w:lang w:eastAsia="es-EC"/>
+        </w:rPr>
+        <w:t xml:space="preserve">, </w:t>
+      </w:r>
+      <w:proofErr w:type="spellStart"/>
+      <w:r>
+        <w:rPr>
+          <w:rFonts w:ascii="Arial" w:hAnsi="Arial" w:cs="Arial"/>
+          <w:lang w:eastAsia="es-EC"/>
+        </w:rPr>
+        <w:t>develop</w:t>
+      </w:r>
+      <w:proofErr w:type="spellEnd"/>
+      <w:r>
+        <w:rPr>
+          <w:rFonts w:ascii="Arial" w:hAnsi="Arial" w:cs="Arial"/>
+          <w:lang w:eastAsia="es-EC"/>
+        </w:rPr>
+        <w:t xml:space="preserve"> y </w:t>
+      </w:r>
+      <w:proofErr w:type="spellStart"/>
+      <w:r>
+        <w:rPr>
+          <w:rFonts w:ascii="Arial" w:hAnsi="Arial" w:cs="Arial"/>
+          <w:lang w:eastAsia="es-EC"/>
+        </w:rPr>
+        <w:t>feature</w:t>
+      </w:r>
+      <w:proofErr w:type="spellEnd"/>
+      <w:r>
+        <w:rPr>
+          <w:rFonts w:ascii="Arial" w:hAnsi="Arial" w:cs="Arial"/>
+          <w:lang w:eastAsia="es-EC"/>
+        </w:rPr>
+        <w:t>/* (ver sección 5).</w:t>
       </w:r>
     </w:p>
     <w:p>
@@ -2575,6 +2702,7 @@
         <w:rPr>
           <w:noProof/>
         </w:rPr>
+        <w:lastRenderedPageBreak/>
         <w:drawing>
           <wp:anchor distT="0" distB="0" distL="114300" distR="114300" simplePos="0" relativeHeight="251666432" behindDoc="1" locked="0" layoutInCell="1" allowOverlap="1" wp14:anchorId="3F4F3521" wp14:editId="38335B38">
             <wp:simplePos x="0" y="0"/>
@@ -2873,6 +3001,7 @@
           <w:bCs/>
           <w:lang w:val="es-ES" w:eastAsia="es-EC"/>
         </w:rPr>
+        <w:lastRenderedPageBreak/>
         <w:t>Descripción de clases:</w:t>
       </w:r>
     </w:p>
@@ -3113,12 +3242,46 @@
                 <w:lang w:val="es-ES" w:eastAsia="es-EC"/>
               </w:rPr>
             </w:pPr>
+            <w:proofErr w:type="gramStart"/>
             <w:r>
               <w:rPr>
                 <w:rFonts w:ascii="Arial" w:hAnsi="Arial" w:cs="Arial"/>
                 <w:lang w:val="es-ES" w:eastAsia="es-EC"/>
               </w:rPr>
-              <w:t>notificar(), consultarCasos()</w:t>
+              <w:t>notificar(</w:t>
+            </w:r>
+            <w:proofErr w:type="gramEnd"/>
+            <w:r>
+              <w:rPr>
+                <w:rFonts w:ascii="Arial" w:hAnsi="Arial" w:cs="Arial"/>
+                <w:lang w:val="es-ES" w:eastAsia="es-EC"/>
+              </w:rPr>
+              <w:t xml:space="preserve">), </w:t>
+            </w:r>
+            <w:proofErr w:type="spellStart"/>
+            <w:proofErr w:type="gramStart"/>
+            <w:r>
+              <w:rPr>
+                <w:rFonts w:ascii="Arial" w:hAnsi="Arial" w:cs="Arial"/>
+                <w:lang w:val="es-ES" w:eastAsia="es-EC"/>
+              </w:rPr>
+              <w:t>consultarCasos</w:t>
+            </w:r>
+            <w:proofErr w:type="spellEnd"/>
+            <w:r>
+              <w:rPr>
+                <w:rFonts w:ascii="Arial" w:hAnsi="Arial" w:cs="Arial"/>
+                <w:lang w:val="es-ES" w:eastAsia="es-EC"/>
+              </w:rPr>
+              <w:t>(</w:t>
+            </w:r>
+            <w:proofErr w:type="gramEnd"/>
+            <w:r>
+              <w:rPr>
+                <w:rFonts w:ascii="Arial" w:hAnsi="Arial" w:cs="Arial"/>
+                <w:lang w:val="es-ES" w:eastAsia="es-EC"/>
+              </w:rPr>
+              <w:t>)</w:t>
             </w:r>
           </w:p>
         </w:tc>
@@ -3220,12 +3383,55 @@
                 <w:lang w:val="es-ES" w:eastAsia="es-EC"/>
               </w:rPr>
             </w:pPr>
+            <w:proofErr w:type="spellStart"/>
+            <w:proofErr w:type="gramStart"/>
             <w:r>
               <w:rPr>
                 <w:rFonts w:ascii="Arial" w:hAnsi="Arial" w:cs="Arial"/>
                 <w:lang w:val="es-ES" w:eastAsia="es-EC"/>
               </w:rPr>
-              <w:t>asignarPersonal(), supervisarCasos()</w:t>
+              <w:t>asignarPersonal</w:t>
+            </w:r>
+            <w:proofErr w:type="spellEnd"/>
+            <w:r>
+              <w:rPr>
+                <w:rFonts w:ascii="Arial" w:hAnsi="Arial" w:cs="Arial"/>
+                <w:lang w:val="es-ES" w:eastAsia="es-EC"/>
+              </w:rPr>
+              <w:t>(</w:t>
+            </w:r>
+            <w:proofErr w:type="gramEnd"/>
+            <w:r>
+              <w:rPr>
+                <w:rFonts w:ascii="Arial" w:hAnsi="Arial" w:cs="Arial"/>
+                <w:lang w:val="es-ES" w:eastAsia="es-EC"/>
+              </w:rPr>
+              <w:t xml:space="preserve">), </w:t>
+            </w:r>
+            <w:proofErr w:type="spellStart"/>
+            <w:proofErr w:type="gramStart"/>
+            <w:r>
+              <w:rPr>
+                <w:rFonts w:ascii="Arial" w:hAnsi="Arial" w:cs="Arial"/>
+                <w:lang w:val="es-ES" w:eastAsia="es-EC"/>
+              </w:rPr>
+              <w:t>supervisarCasos</w:t>
+            </w:r>
+            <w:proofErr w:type="spellEnd"/>
+            <w:r>
+              <w:rPr>
+                <w:rFonts w:ascii="Arial" w:hAnsi="Arial" w:cs="Arial"/>
+                <w:lang w:val="es-ES" w:eastAsia="es-EC"/>
+              </w:rPr>
+              <w:t>(</w:t>
+            </w:r>
+            <w:proofErr w:type="gramEnd"/>
+            <w:r>
+              <w:rPr>
+                <w:rFonts w:ascii="Arial" w:hAnsi="Arial" w:cs="Arial"/>
+                <w:lang w:val="es-ES" w:eastAsia="es-EC"/>
+              </w:rPr>
+              <w:t>)</w:t>
             </w:r>
           </w:p>
         </w:tc>
@@ -3327,12 +3533,55 @@
                 <w:lang w:val="es-ES" w:eastAsia="es-EC"/>
               </w:rPr>
             </w:pPr>
+            <w:proofErr w:type="spellStart"/>
+            <w:proofErr w:type="gramStart"/>
             <w:r>
               <w:rPr>
                 <w:rFonts w:ascii="Arial" w:hAnsi="Arial" w:cs="Arial"/>
                 <w:lang w:val="es-ES" w:eastAsia="es-EC"/>
               </w:rPr>
-              <w:t>atenderCaso(), registrarAtencion()</w:t>
+              <w:t>atenderCaso</w:t>
+            </w:r>
+            <w:proofErr w:type="spellEnd"/>
+            <w:r>
+              <w:rPr>
+                <w:rFonts w:ascii="Arial" w:hAnsi="Arial" w:cs="Arial"/>
+                <w:lang w:val="es-ES" w:eastAsia="es-EC"/>
+              </w:rPr>
+              <w:t>(</w:t>
+            </w:r>
+            <w:proofErr w:type="gramEnd"/>
+            <w:r>
+              <w:rPr>
+                <w:rFonts w:ascii="Arial" w:hAnsi="Arial" w:cs="Arial"/>
+                <w:lang w:val="es-ES" w:eastAsia="es-EC"/>
+              </w:rPr>
+              <w:t xml:space="preserve">), </w:t>
+            </w:r>
+            <w:proofErr w:type="spellStart"/>
+            <w:proofErr w:type="gramStart"/>
+            <w:r>
+              <w:rPr>
+                <w:rFonts w:ascii="Arial" w:hAnsi="Arial" w:cs="Arial"/>
+                <w:lang w:val="es-ES" w:eastAsia="es-EC"/>
+              </w:rPr>
+              <w:t>registrarAtencion</w:t>
+            </w:r>
+            <w:proofErr w:type="spellEnd"/>
+            <w:r>
+              <w:rPr>
+                <w:rFonts w:ascii="Arial" w:hAnsi="Arial" w:cs="Arial"/>
+                <w:lang w:val="es-ES" w:eastAsia="es-EC"/>
+              </w:rPr>
+              <w:t>(</w:t>
+            </w:r>
+            <w:proofErr w:type="gramEnd"/>
+            <w:r>
+              <w:rPr>
+                <w:rFonts w:ascii="Arial" w:hAnsi="Arial" w:cs="Arial"/>
+                <w:lang w:val="es-ES" w:eastAsia="es-EC"/>
+              </w:rPr>
+              <w:t>)</w:t>
             </w:r>
           </w:p>
         </w:tc>
@@ -3400,6 +3649,7 @@
                 <w:lang w:val="es-ES" w:eastAsia="es-EC"/>
               </w:rPr>
             </w:pPr>
+            <w:proofErr w:type="spellStart"/>
             <w:r>
               <w:rPr>
                 <w:rFonts w:ascii="Arial" w:hAnsi="Arial" w:cs="Arial"/>
@@ -3407,6 +3657,7 @@
               </w:rPr>
               <w:t>direccion</w:t>
             </w:r>
+            <w:proofErr w:type="spellEnd"/>
           </w:p>
         </w:tc>
         <w:tc>
@@ -3434,12 +3685,30 @@
                 <w:lang w:val="es-ES" w:eastAsia="es-EC"/>
               </w:rPr>
             </w:pPr>
+            <w:proofErr w:type="spellStart"/>
+            <w:proofErr w:type="gramStart"/>
             <w:r>
               <w:rPr>
                 <w:rFonts w:ascii="Arial" w:hAnsi="Arial" w:cs="Arial"/>
                 <w:lang w:val="es-ES" w:eastAsia="es-EC"/>
               </w:rPr>
-              <w:t>reportarRescate()</w:t>
+              <w:t>reportarRescate</w:t>
+            </w:r>
+            <w:proofErr w:type="spellEnd"/>
+            <w:r>
+              <w:rPr>
+                <w:rFonts w:ascii="Arial" w:hAnsi="Arial" w:cs="Arial"/>
+                <w:lang w:val="es-ES" w:eastAsia="es-EC"/>
+              </w:rPr>
+              <w:t>(</w:t>
+            </w:r>
+            <w:proofErr w:type="gramEnd"/>
+            <w:r>
+              <w:rPr>
+                <w:rFonts w:ascii="Arial" w:hAnsi="Arial" w:cs="Arial"/>
+                <w:lang w:val="es-ES" w:eastAsia="es-EC"/>
+              </w:rPr>
+              <w:t>)</w:t>
             </w:r>
           </w:p>
         </w:tc>
@@ -3512,8 +3781,17 @@
                 <w:rFonts w:ascii="Arial" w:hAnsi="Arial" w:cs="Arial"/>
                 <w:lang w:val="es-ES" w:eastAsia="es-EC"/>
               </w:rPr>
-              <w:t>id, nombre, especie, estado, fechaIngreso</w:t>
+              <w:t xml:space="preserve">id, nombre, especie, estado, </w:t>
             </w:r>
+            <w:proofErr w:type="spellStart"/>
+            <w:r>
+              <w:rPr>
+                <w:rFonts w:ascii="Arial" w:hAnsi="Arial" w:cs="Arial"/>
+                <w:lang w:val="es-ES" w:eastAsia="es-EC"/>
+              </w:rPr>
+              <w:t>fechaIngreso</w:t>
+            </w:r>
+            <w:proofErr w:type="spellEnd"/>
           </w:p>
         </w:tc>
         <w:tc>
@@ -3541,12 +3819,55 @@
                 <w:lang w:val="es-ES" w:eastAsia="es-EC"/>
               </w:rPr>
             </w:pPr>
+            <w:proofErr w:type="spellStart"/>
+            <w:proofErr w:type="gramStart"/>
             <w:r>
               <w:rPr>
                 <w:rFonts w:ascii="Arial" w:hAnsi="Arial" w:cs="Arial"/>
                 <w:lang w:val="es-ES" w:eastAsia="es-EC"/>
               </w:rPr>
-              <w:t>actualizarEstado(), obtenerEspecie()</w:t>
+              <w:t>actualizarEstado</w:t>
+            </w:r>
+            <w:proofErr w:type="spellEnd"/>
+            <w:r>
+              <w:rPr>
+                <w:rFonts w:ascii="Arial" w:hAnsi="Arial" w:cs="Arial"/>
+                <w:lang w:val="es-ES" w:eastAsia="es-EC"/>
+              </w:rPr>
+              <w:t>(</w:t>
+            </w:r>
+            <w:proofErr w:type="gramEnd"/>
+            <w:r>
+              <w:rPr>
+                <w:rFonts w:ascii="Arial" w:hAnsi="Arial" w:cs="Arial"/>
+                <w:lang w:val="es-ES" w:eastAsia="es-EC"/>
+              </w:rPr>
+              <w:t xml:space="preserve">), </w:t>
+            </w:r>
+            <w:proofErr w:type="spellStart"/>
+            <w:proofErr w:type="gramStart"/>
+            <w:r>
+              <w:rPr>
+                <w:rFonts w:ascii="Arial" w:hAnsi="Arial" w:cs="Arial"/>
+                <w:lang w:val="es-ES" w:eastAsia="es-EC"/>
+              </w:rPr>
+              <w:t>obtenerEspecie</w:t>
+            </w:r>
+            <w:proofErr w:type="spellEnd"/>
+            <w:r>
+              <w:rPr>
+                <w:rFonts w:ascii="Arial" w:hAnsi="Arial" w:cs="Arial"/>
+                <w:lang w:val="es-ES" w:eastAsia="es-EC"/>
+              </w:rPr>
+              <w:t>(</w:t>
+            </w:r>
+            <w:proofErr w:type="gramEnd"/>
+            <w:r>
+              <w:rPr>
+                <w:rFonts w:ascii="Arial" w:hAnsi="Arial" w:cs="Arial"/>
+                <w:lang w:val="es-ES" w:eastAsia="es-EC"/>
+              </w:rPr>
+              <w:t>)</w:t>
             </w:r>
           </w:p>
         </w:tc>
@@ -3614,13 +3935,47 @@
                 <w:lang w:val="es-ES" w:eastAsia="es-EC"/>
               </w:rPr>
             </w:pPr>
+            <w:proofErr w:type="spellStart"/>
             <w:r>
               <w:rPr>
                 <w:rFonts w:ascii="Arial" w:hAnsi="Arial" w:cs="Arial"/>
                 <w:lang w:val="es-ES" w:eastAsia="es-EC"/>
               </w:rPr>
-              <w:t>idCaso, descripcion, fechaCreacion</w:t>
+              <w:t>idCaso</w:t>
             </w:r>
+            <w:proofErr w:type="spellEnd"/>
+            <w:r>
+              <w:rPr>
+                <w:rFonts w:ascii="Arial" w:hAnsi="Arial" w:cs="Arial"/>
+                <w:lang w:val="es-ES" w:eastAsia="es-EC"/>
+              </w:rPr>
+              <w:t xml:space="preserve">, </w:t>
+            </w:r>
+            <w:proofErr w:type="spellStart"/>
+            <w:r>
+              <w:rPr>
+                <w:rFonts w:ascii="Arial" w:hAnsi="Arial" w:cs="Arial"/>
+                <w:lang w:val="es-ES" w:eastAsia="es-EC"/>
+              </w:rPr>
+              <w:t>descripcion</w:t>
+            </w:r>
+            <w:proofErr w:type="spellEnd"/>
+            <w:r>
+              <w:rPr>
+                <w:rFonts w:ascii="Arial" w:hAnsi="Arial" w:cs="Arial"/>
+                <w:lang w:val="es-ES" w:eastAsia="es-EC"/>
+              </w:rPr>
+              <w:t xml:space="preserve">, </w:t>
+            </w:r>
+            <w:proofErr w:type="spellStart"/>
+            <w:r>
+              <w:rPr>
+                <w:rFonts w:ascii="Arial" w:hAnsi="Arial" w:cs="Arial"/>
+                <w:lang w:val="es-ES" w:eastAsia="es-EC"/>
+              </w:rPr>
+              <w:t>fechaCreacion</w:t>
+            </w:r>
+            <w:proofErr w:type="spellEnd"/>
           </w:p>
         </w:tc>
         <w:tc>
@@ -3648,12 +4003,80 @@
                 <w:lang w:val="es-ES" w:eastAsia="es-EC"/>
               </w:rPr>
             </w:pPr>
+            <w:proofErr w:type="spellStart"/>
+            <w:proofErr w:type="gramStart"/>
             <w:r>
               <w:rPr>
                 <w:rFonts w:ascii="Arial" w:hAnsi="Arial" w:cs="Arial"/>
                 <w:lang w:val="es-ES" w:eastAsia="es-EC"/>
               </w:rPr>
-              <w:t>crearCaso(), asignarVoluntario(), cerrarCaso()</w:t>
+              <w:t>crearCaso</w:t>
+            </w:r>
+            <w:proofErr w:type="spellEnd"/>
+            <w:r>
+              <w:rPr>
+                <w:rFonts w:ascii="Arial" w:hAnsi="Arial" w:cs="Arial"/>
+                <w:lang w:val="es-ES" w:eastAsia="es-EC"/>
+              </w:rPr>
+              <w:t>(</w:t>
+            </w:r>
+            <w:proofErr w:type="gramEnd"/>
+            <w:r>
+              <w:rPr>
+                <w:rFonts w:ascii="Arial" w:hAnsi="Arial" w:cs="Arial"/>
+                <w:lang w:val="es-ES" w:eastAsia="es-EC"/>
+              </w:rPr>
+              <w:t xml:space="preserve">), </w:t>
+            </w:r>
+            <w:proofErr w:type="spellStart"/>
+            <w:proofErr w:type="gramStart"/>
+            <w:r>
+              <w:rPr>
+                <w:rFonts w:ascii="Arial" w:hAnsi="Arial" w:cs="Arial"/>
+                <w:lang w:val="es-ES" w:eastAsia="es-EC"/>
+              </w:rPr>
+              <w:t>asignarVoluntario</w:t>
+            </w:r>
+            <w:proofErr w:type="spellEnd"/>
+            <w:r>
+              <w:rPr>
+                <w:rFonts w:ascii="Arial" w:hAnsi="Arial" w:cs="Arial"/>
+                <w:lang w:val="es-ES" w:eastAsia="es-EC"/>
+              </w:rPr>
+              <w:t>(</w:t>
+            </w:r>
+            <w:proofErr w:type="gramEnd"/>
+            <w:r>
+              <w:rPr>
+                <w:rFonts w:ascii="Arial" w:hAnsi="Arial" w:cs="Arial"/>
+                <w:lang w:val="es-ES" w:eastAsia="es-EC"/>
+              </w:rPr>
+              <w:t xml:space="preserve">), </w:t>
+            </w:r>
+            <w:proofErr w:type="spellStart"/>
+            <w:proofErr w:type="gramStart"/>
+            <w:r>
+              <w:rPr>
+                <w:rFonts w:ascii="Arial" w:hAnsi="Arial" w:cs="Arial"/>
+                <w:lang w:val="es-ES" w:eastAsia="es-EC"/>
+              </w:rPr>
+              <w:t>cerrarCaso</w:t>
+            </w:r>
+            <w:proofErr w:type="spellEnd"/>
+            <w:r>
+              <w:rPr>
+                <w:rFonts w:ascii="Arial" w:hAnsi="Arial" w:cs="Arial"/>
+                <w:lang w:val="es-ES" w:eastAsia="es-EC"/>
+              </w:rPr>
+              <w:t>(</w:t>
+            </w:r>
+            <w:proofErr w:type="gramEnd"/>
+            <w:r>
+              <w:rPr>
+                <w:rFonts w:ascii="Arial" w:hAnsi="Arial" w:cs="Arial"/>
+                <w:lang w:val="es-ES" w:eastAsia="es-EC"/>
+              </w:rPr>
+              <w:t>)</w:t>
             </w:r>
           </w:p>
         </w:tc>
@@ -3687,6 +4110,7 @@
                 <w:lang w:val="es-ES" w:eastAsia="es-EC"/>
               </w:rPr>
             </w:pPr>
+            <w:proofErr w:type="spellStart"/>
             <w:r>
               <w:rPr>
                 <w:rFonts w:ascii="Arial" w:hAnsi="Arial" w:cs="Arial"/>
@@ -3694,6 +4118,7 @@
               </w:rPr>
               <w:t>Notificacion</w:t>
             </w:r>
+            <w:proofErr w:type="spellEnd"/>
           </w:p>
         </w:tc>
         <w:tc>
@@ -3755,12 +4180,21 @@
                 <w:lang w:val="es-ES" w:eastAsia="es-EC"/>
               </w:rPr>
             </w:pPr>
+            <w:proofErr w:type="gramStart"/>
             <w:r>
               <w:rPr>
                 <w:rFonts w:ascii="Arial" w:hAnsi="Arial" w:cs="Arial"/>
                 <w:lang w:val="es-ES" w:eastAsia="es-EC"/>
               </w:rPr>
-              <w:t>enviar()</w:t>
+              <w:t>enviar(</w:t>
+            </w:r>
+            <w:proofErr w:type="gramEnd"/>
+            <w:r>
+              <w:rPr>
+                <w:rFonts w:ascii="Arial" w:hAnsi="Arial" w:cs="Arial"/>
+                <w:lang w:val="es-ES" w:eastAsia="es-EC"/>
+              </w:rPr>
+              <w:t>)</w:t>
             </w:r>
           </w:p>
         </w:tc>
@@ -4015,6 +4449,7 @@
           <w:rFonts w:ascii="Arial" w:hAnsi="Arial" w:cs="Arial"/>
           <w:lang w:val="es-ES" w:eastAsia="es-EC"/>
         </w:rPr>
+        <w:lastRenderedPageBreak/>
         <w:t>DIP (Inversión de Dependencias): las clases dependen de abstracciones, no de implementaciones concretas.</w:t>
       </w:r>
     </w:p>
@@ -4419,7 +4854,23 @@
           <w:rFonts w:ascii="Arial" w:hAnsi="Arial" w:cs="Arial"/>
           <w:lang w:val="es-ES" w:eastAsia="es-EC"/>
         </w:rPr>
-        <w:t>Integración con Gitflow:</w:t>
+        <w:t xml:space="preserve">Integración con </w:t>
+      </w:r>
+      <w:proofErr w:type="spellStart"/>
+      <w:r>
+        <w:rPr>
+          <w:rFonts w:ascii="Arial" w:hAnsi="Arial" w:cs="Arial"/>
+          <w:lang w:val="es-ES" w:eastAsia="es-EC"/>
+        </w:rPr>
+        <w:t>Gitflow</w:t>
+      </w:r>
+      <w:proofErr w:type="spellEnd"/>
+      <w:r>
+        <w:rPr>
+          <w:rFonts w:ascii="Arial" w:hAnsi="Arial" w:cs="Arial"/>
+          <w:lang w:val="es-ES" w:eastAsia="es-EC"/>
+        </w:rPr>
+        <w:t>:</w:t>
       </w:r>
     </w:p>
     <w:p>
@@ -4433,12 +4884,21 @@
           <w:lang w:val="es-ES" w:eastAsia="es-EC"/>
         </w:rPr>
       </w:pPr>
-      <w:r>
-        <w:rPr>
-          <w:rFonts w:ascii="Arial" w:hAnsi="Arial" w:cs="Arial"/>
-          <w:lang w:val="es-ES" w:eastAsia="es-EC"/>
-        </w:rPr>
-        <w:t>main: contiene la versión estable y desplegable del sistema.</w:t>
+      <w:proofErr w:type="spellStart"/>
+      <w:r>
+        <w:rPr>
+          <w:rFonts w:ascii="Arial" w:hAnsi="Arial" w:cs="Arial"/>
+          <w:lang w:val="es-ES" w:eastAsia="es-EC"/>
+        </w:rPr>
+        <w:t>main</w:t>
+      </w:r>
+      <w:proofErr w:type="spellEnd"/>
+      <w:r>
+        <w:rPr>
+          <w:rFonts w:ascii="Arial" w:hAnsi="Arial" w:cs="Arial"/>
+          <w:lang w:val="es-ES" w:eastAsia="es-EC"/>
+        </w:rPr>
+        <w:t>: contiene la versión estable y desplegable del sistema.</w:t>
       </w:r>
     </w:p>
     <w:p>
@@ -4452,12 +4912,37 @@
           <w:lang w:val="es-ES" w:eastAsia="es-EC"/>
         </w:rPr>
       </w:pPr>
-      <w:r>
-        <w:rPr>
-          <w:rFonts w:ascii="Arial" w:hAnsi="Arial" w:cs="Arial"/>
-          <w:lang w:val="es-ES" w:eastAsia="es-EC"/>
-        </w:rPr>
-        <w:t>develop: integra los avances aprobados antes de pasar a main.</w:t>
+      <w:proofErr w:type="spellStart"/>
+      <w:r>
+        <w:rPr>
+          <w:rFonts w:ascii="Arial" w:hAnsi="Arial" w:cs="Arial"/>
+          <w:lang w:val="es-ES" w:eastAsia="es-EC"/>
+        </w:rPr>
+        <w:t>develop</w:t>
+      </w:r>
+      <w:proofErr w:type="spellEnd"/>
+      <w:r>
+        <w:rPr>
+          <w:rFonts w:ascii="Arial" w:hAnsi="Arial" w:cs="Arial"/>
+          <w:lang w:val="es-ES" w:eastAsia="es-EC"/>
+        </w:rPr>
+        <w:t>: integra los avances aprobados antes de pasar a </w:t>
+      </w:r>
+      <w:proofErr w:type="spellStart"/>
+      <w:r>
+        <w:rPr>
+          <w:rFonts w:ascii="Arial" w:hAnsi="Arial" w:cs="Arial"/>
+          <w:lang w:val="es-ES" w:eastAsia="es-EC"/>
+        </w:rPr>
+        <w:t>main</w:t>
+      </w:r>
+      <w:proofErr w:type="spellEnd"/>
+      <w:r>
+        <w:rPr>
+          <w:rFonts w:ascii="Arial" w:hAnsi="Arial" w:cs="Arial"/>
+          <w:lang w:val="es-ES" w:eastAsia="es-EC"/>
+        </w:rPr>
+        <w:t>.</w:t>
       </w:r>
     </w:p>
     <w:p>
@@ -4471,115 +4956,237 @@
           <w:lang w:val="es-ES" w:eastAsia="es-EC"/>
         </w:rPr>
       </w:pPr>
-      <w:r>
-        <w:rPr>
-          <w:rFonts w:ascii="Arial" w:hAnsi="Arial" w:cs="Arial"/>
-          <w:lang w:val="es-ES" w:eastAsia="es-EC"/>
-        </w:rPr>
-        <w:t>feature/*: ramas para desarrollar cada funcionalidad de forma aislada.</w:t>
-      </w:r>
-    </w:p>
-    <w:p>
-      <w:pPr>
-        <w:rPr>
-          <w:rFonts w:ascii="Arial" w:hAnsi="Arial" w:cs="Arial"/>
-          <w:lang w:val="es-ES" w:eastAsia="es-EC"/>
-        </w:rPr>
-      </w:pPr>
-      <w:r>
-        <w:rPr>
-          <w:rFonts w:ascii="Arial" w:hAnsi="Arial" w:cs="Arial"/>
-          <w:lang w:val="es-ES" w:eastAsia="es-EC"/>
-        </w:rPr>
-        <w:t>El flujo es: se crea una rama feature desde develop, se desarrolla la funcionalidad, se integra a develop mediante pull request, y finalmente develop se fusiona con main cuando está estable.</w:t>
-      </w:r>
-    </w:p>
-    <w:p>
-      <w:pPr>
-        <w:rPr>
-          <w:rFonts w:ascii="Arial" w:hAnsi="Arial" w:cs="Arial"/>
-          <w:b/>
-          <w:bCs/>
-          <w:lang w:eastAsia="es-EC"/>
-        </w:rPr>
-      </w:pPr>
-    </w:p>
-    <w:p>
-      <w:pPr>
-        <w:rPr>
-          <w:rFonts w:ascii="Arial" w:hAnsi="Arial" w:cs="Arial"/>
-          <w:b/>
-          <w:bCs/>
-          <w:lang w:eastAsia="es-EC"/>
-        </w:rPr>
-      </w:pPr>
-    </w:p>
-    <w:p>
-      <w:pPr>
-        <w:rPr>
-          <w:rFonts w:ascii="Arial" w:hAnsi="Arial" w:cs="Arial"/>
-          <w:b/>
-          <w:bCs/>
-          <w:lang w:eastAsia="es-EC"/>
-        </w:rPr>
-      </w:pPr>
-    </w:p>
-    <w:p>
-      <w:pPr>
-        <w:rPr>
-          <w:rFonts w:ascii="Arial" w:hAnsi="Arial" w:cs="Arial"/>
-          <w:b/>
-          <w:bCs/>
-          <w:lang w:eastAsia="es-EC"/>
-        </w:rPr>
-      </w:pPr>
-    </w:p>
-    <w:p>
-      <w:pPr>
-        <w:rPr>
-          <w:rFonts w:ascii="Arial" w:hAnsi="Arial" w:cs="Arial"/>
-          <w:b/>
-          <w:bCs/>
-          <w:lang w:eastAsia="es-EC"/>
-        </w:rPr>
-      </w:pPr>
-    </w:p>
-    <w:p>
-      <w:pPr>
-        <w:rPr>
-          <w:rFonts w:ascii="Arial" w:hAnsi="Arial" w:cs="Arial"/>
-          <w:b/>
-          <w:bCs/>
-          <w:lang w:eastAsia="es-EC"/>
-        </w:rPr>
-      </w:pPr>
-    </w:p>
-    <w:p>
-      <w:pPr>
-        <w:rPr>
-          <w:rFonts w:ascii="Arial" w:hAnsi="Arial" w:cs="Arial"/>
-          <w:b/>
-          <w:bCs/>
-          <w:lang w:eastAsia="es-EC"/>
-        </w:rPr>
-      </w:pPr>
-    </w:p>
-    <w:p>
-      <w:pPr>
-        <w:rPr>
-          <w:rFonts w:ascii="Arial" w:hAnsi="Arial" w:cs="Arial"/>
-          <w:b/>
-          <w:bCs/>
-          <w:lang w:eastAsia="es-EC"/>
-        </w:rPr>
-      </w:pPr>
-      <w:r>
-        <w:rPr>
-          <w:rFonts w:ascii="Arial" w:hAnsi="Arial" w:cs="Arial"/>
-          <w:b/>
-          <w:bCs/>
-          <w:lang w:eastAsia="es-EC"/>
-        </w:rPr>
+      <w:proofErr w:type="spellStart"/>
+      <w:r>
+        <w:rPr>
+          <w:rFonts w:ascii="Arial" w:hAnsi="Arial" w:cs="Arial"/>
+          <w:lang w:val="es-ES" w:eastAsia="es-EC"/>
+        </w:rPr>
+        <w:t>feature</w:t>
+      </w:r>
+      <w:proofErr w:type="spellEnd"/>
+      <w:r>
+        <w:rPr>
+          <w:rFonts w:ascii="Arial" w:hAnsi="Arial" w:cs="Arial"/>
+          <w:lang w:val="es-ES" w:eastAsia="es-EC"/>
+        </w:rPr>
+        <w:t>/*: ramas para desarrollar cada funcionalidad de forma aislada.</w:t>
+      </w:r>
+    </w:p>
+    <w:p>
+      <w:pPr>
+        <w:rPr>
+          <w:rFonts w:ascii="Arial" w:hAnsi="Arial" w:cs="Arial"/>
+          <w:lang w:val="es-ES" w:eastAsia="es-EC"/>
+        </w:rPr>
+      </w:pPr>
+      <w:r>
+        <w:rPr>
+          <w:rFonts w:ascii="Arial" w:hAnsi="Arial" w:cs="Arial"/>
+          <w:lang w:val="es-ES" w:eastAsia="es-EC"/>
+        </w:rPr>
+        <w:t>El flujo es: se crea una rama </w:t>
+      </w:r>
+      <w:proofErr w:type="spellStart"/>
+      <w:r>
+        <w:rPr>
+          <w:rFonts w:ascii="Arial" w:hAnsi="Arial" w:cs="Arial"/>
+          <w:lang w:val="es-ES" w:eastAsia="es-EC"/>
+        </w:rPr>
+        <w:t>feature</w:t>
+      </w:r>
+      <w:proofErr w:type="spellEnd"/>
+      <w:r>
+        <w:rPr>
+          <w:rFonts w:ascii="Arial" w:hAnsi="Arial" w:cs="Arial"/>
+          <w:lang w:val="es-ES" w:eastAsia="es-EC"/>
+        </w:rPr>
+        <w:t> desde </w:t>
+      </w:r>
+      <w:proofErr w:type="spellStart"/>
+      <w:r>
+        <w:rPr>
+          <w:rFonts w:ascii="Arial" w:hAnsi="Arial" w:cs="Arial"/>
+          <w:lang w:val="es-ES" w:eastAsia="es-EC"/>
+        </w:rPr>
+        <w:t>develop</w:t>
+      </w:r>
+      <w:proofErr w:type="spellEnd"/>
+      <w:r>
+        <w:rPr>
+          <w:rFonts w:ascii="Arial" w:hAnsi="Arial" w:cs="Arial"/>
+          <w:lang w:val="es-ES" w:eastAsia="es-EC"/>
+        </w:rPr>
+        <w:t>, se desarrolla la funcionalidad, se integra a </w:t>
+      </w:r>
+      <w:proofErr w:type="spellStart"/>
+      <w:r>
+        <w:rPr>
+          <w:rFonts w:ascii="Arial" w:hAnsi="Arial" w:cs="Arial"/>
+          <w:lang w:val="es-ES" w:eastAsia="es-EC"/>
+        </w:rPr>
+        <w:t>develop</w:t>
+      </w:r>
+      <w:proofErr w:type="spellEnd"/>
+      <w:r>
+        <w:rPr>
+          <w:rFonts w:ascii="Arial" w:hAnsi="Arial" w:cs="Arial"/>
+          <w:lang w:val="es-ES" w:eastAsia="es-EC"/>
+        </w:rPr>
+        <w:t xml:space="preserve"> mediante </w:t>
+      </w:r>
+      <w:proofErr w:type="spellStart"/>
+      <w:r>
+        <w:rPr>
+          <w:rFonts w:ascii="Arial" w:hAnsi="Arial" w:cs="Arial"/>
+          <w:lang w:val="es-ES" w:eastAsia="es-EC"/>
+        </w:rPr>
+        <w:t>pull</w:t>
+      </w:r>
+      <w:proofErr w:type="spellEnd"/>
+      <w:r>
+        <w:rPr>
+          <w:rFonts w:ascii="Arial" w:hAnsi="Arial" w:cs="Arial"/>
+          <w:lang w:val="es-ES" w:eastAsia="es-EC"/>
+        </w:rPr>
+        <w:t xml:space="preserve"> </w:t>
+      </w:r>
+      <w:proofErr w:type="spellStart"/>
+      <w:r>
+        <w:rPr>
+          <w:rFonts w:ascii="Arial" w:hAnsi="Arial" w:cs="Arial"/>
+          <w:lang w:val="es-ES" w:eastAsia="es-EC"/>
+        </w:rPr>
+        <w:t>request</w:t>
+      </w:r>
+      <w:proofErr w:type="spellEnd"/>
+      <w:r>
+        <w:rPr>
+          <w:rFonts w:ascii="Arial" w:hAnsi="Arial" w:cs="Arial"/>
+          <w:lang w:val="es-ES" w:eastAsia="es-EC"/>
+        </w:rPr>
+        <w:t>, y finalmente </w:t>
+      </w:r>
+      <w:proofErr w:type="spellStart"/>
+      <w:r>
+        <w:rPr>
+          <w:rFonts w:ascii="Arial" w:hAnsi="Arial" w:cs="Arial"/>
+          <w:lang w:val="es-ES" w:eastAsia="es-EC"/>
+        </w:rPr>
+        <w:t>develop</w:t>
+      </w:r>
+      <w:proofErr w:type="spellEnd"/>
+      <w:r>
+        <w:rPr>
+          <w:rFonts w:ascii="Arial" w:hAnsi="Arial" w:cs="Arial"/>
+          <w:lang w:val="es-ES" w:eastAsia="es-EC"/>
+        </w:rPr>
+        <w:t> se fusiona con </w:t>
+      </w:r>
+      <w:proofErr w:type="spellStart"/>
+      <w:r>
+        <w:rPr>
+          <w:rFonts w:ascii="Arial" w:hAnsi="Arial" w:cs="Arial"/>
+          <w:lang w:val="es-ES" w:eastAsia="es-EC"/>
+        </w:rPr>
+        <w:t>main</w:t>
+      </w:r>
+      <w:proofErr w:type="spellEnd"/>
+      <w:r>
+        <w:rPr>
+          <w:rFonts w:ascii="Arial" w:hAnsi="Arial" w:cs="Arial"/>
+          <w:lang w:val="es-ES" w:eastAsia="es-EC"/>
+        </w:rPr>
+        <w:t> cuando está estable.</w:t>
+      </w:r>
+    </w:p>
+    <w:p>
+      <w:pPr>
+        <w:rPr>
+          <w:rFonts w:ascii="Arial" w:hAnsi="Arial" w:cs="Arial"/>
+          <w:b/>
+          <w:bCs/>
+          <w:lang w:eastAsia="es-EC"/>
+        </w:rPr>
+      </w:pPr>
+    </w:p>
+    <w:p>
+      <w:pPr>
+        <w:rPr>
+          <w:rFonts w:ascii="Arial" w:hAnsi="Arial" w:cs="Arial"/>
+          <w:b/>
+          <w:bCs/>
+          <w:lang w:eastAsia="es-EC"/>
+        </w:rPr>
+      </w:pPr>
+    </w:p>
+    <w:p>
+      <w:pPr>
+        <w:rPr>
+          <w:rFonts w:ascii="Arial" w:hAnsi="Arial" w:cs="Arial"/>
+          <w:b/>
+          <w:bCs/>
+          <w:lang w:eastAsia="es-EC"/>
+        </w:rPr>
+      </w:pPr>
+    </w:p>
+    <w:p>
+      <w:pPr>
+        <w:rPr>
+          <w:rFonts w:ascii="Arial" w:hAnsi="Arial" w:cs="Arial"/>
+          <w:b/>
+          <w:bCs/>
+          <w:lang w:eastAsia="es-EC"/>
+        </w:rPr>
+      </w:pPr>
+    </w:p>
+    <w:p>
+      <w:pPr>
+        <w:rPr>
+          <w:rFonts w:ascii="Arial" w:hAnsi="Arial" w:cs="Arial"/>
+          <w:b/>
+          <w:bCs/>
+          <w:lang w:eastAsia="es-EC"/>
+        </w:rPr>
+      </w:pPr>
+    </w:p>
+    <w:p>
+      <w:pPr>
+        <w:rPr>
+          <w:rFonts w:ascii="Arial" w:hAnsi="Arial" w:cs="Arial"/>
+          <w:b/>
+          <w:bCs/>
+          <w:lang w:eastAsia="es-EC"/>
+        </w:rPr>
+      </w:pPr>
+    </w:p>
+    <w:p>
+      <w:pPr>
+        <w:rPr>
+          <w:rFonts w:ascii="Arial" w:hAnsi="Arial" w:cs="Arial"/>
+          <w:b/>
+          <w:bCs/>
+          <w:lang w:eastAsia="es-EC"/>
+        </w:rPr>
+      </w:pPr>
+    </w:p>
+    <w:p>
+      <w:pPr>
+        <w:rPr>
+          <w:rFonts w:ascii="Arial" w:hAnsi="Arial" w:cs="Arial"/>
+          <w:b/>
+          <w:bCs/>
+          <w:lang w:eastAsia="es-EC"/>
+        </w:rPr>
+      </w:pPr>
+      <w:r>
+        <w:rPr>
+          <w:rFonts w:ascii="Arial" w:hAnsi="Arial" w:cs="Arial"/>
+          <w:b/>
+          <w:bCs/>
+          <w:lang w:eastAsia="es-EC"/>
+        </w:rPr>
+        <w:lastRenderedPageBreak/>
         <w:t>Diagrama 1 — Arquitectura:</w:t>
       </w:r>
     </w:p>
@@ -4601,7 +5208,7 @@
           <w:lang w:eastAsia="es-EC"/>
         </w:rPr>
         <w:drawing>
-          <wp:anchor distT="0" distB="0" distL="114300" distR="114300" simplePos="0" relativeHeight="251668480" behindDoc="1" locked="0" layoutInCell="1" allowOverlap="1" wp14:anchorId="766455EC" wp14:editId="52AF3423">
+          <wp:anchor distT="0" distB="0" distL="114300" distR="114300" simplePos="0" relativeHeight="251668480" behindDoc="1" locked="0" layoutInCell="1" allowOverlap="1" wp14:anchorId="766455EC" wp14:editId="66DDAAFB">
             <wp:simplePos x="0" y="0"/>
             <wp:positionH relativeFrom="margin">
               <wp:align>left</wp:align>
@@ -4813,7 +5420,27 @@
           <w:bCs/>
           <w:lang w:eastAsia="es-EC"/>
         </w:rPr>
-        <w:t>Diagrama 2 — Gitflow:</w:t>
+        <w:t xml:space="preserve">Diagrama 2 — </w:t>
+      </w:r>
+      <w:proofErr w:type="spellStart"/>
+      <w:r>
+        <w:rPr>
+          <w:rFonts w:ascii="Arial" w:hAnsi="Arial" w:cs="Arial"/>
+          <w:b/>
+          <w:bCs/>
+          <w:lang w:eastAsia="es-EC"/>
+        </w:rPr>
+        <w:t>Gitflow</w:t>
+      </w:r>
+      <w:proofErr w:type="spellEnd"/>
+      <w:r>
+        <w:rPr>
+          <w:rFonts w:ascii="Arial" w:hAnsi="Arial" w:cs="Arial"/>
+          <w:b/>
+          <w:bCs/>
+          <w:lang w:eastAsia="es-EC"/>
+        </w:rPr>
+        <w:t>:</w:t>
       </w:r>
     </w:p>
     <w:p>
@@ -4906,7 +5533,87 @@
           <w:rFonts w:ascii="Arial" w:hAnsi="Arial" w:cs="Arial"/>
           <w:lang w:eastAsia="es-EC"/>
         </w:rPr>
-        <w:t>Las funcionalidades se desarrollan en ramas feature/*, se integran a develop mediante pull request y, una vez estables, se fusionan con main generando una nueva versión</w:t>
+        <w:t>Las funcionalidades se desarrollan en ramas </w:t>
+      </w:r>
+      <w:proofErr w:type="spellStart"/>
+      <w:r>
+        <w:rPr>
+          <w:rFonts w:ascii="Arial" w:hAnsi="Arial" w:cs="Arial"/>
+          <w:lang w:eastAsia="es-EC"/>
+        </w:rPr>
+        <w:t>feature</w:t>
+      </w:r>
+      <w:proofErr w:type="spellEnd"/>
+      <w:r>
+        <w:rPr>
+          <w:rFonts w:ascii="Arial" w:hAnsi="Arial" w:cs="Arial"/>
+          <w:lang w:eastAsia="es-EC"/>
+        </w:rPr>
+        <w:t>/*, se integran a </w:t>
+      </w:r>
+      <w:proofErr w:type="spellStart"/>
+      <w:r>
+        <w:rPr>
+          <w:rFonts w:ascii="Arial" w:hAnsi="Arial" w:cs="Arial"/>
+          <w:lang w:eastAsia="es-EC"/>
+        </w:rPr>
+        <w:t>develop</w:t>
+      </w:r>
+      <w:proofErr w:type="spellEnd"/>
+      <w:r>
+        <w:rPr>
+          <w:rFonts w:ascii="Arial" w:hAnsi="Arial" w:cs="Arial"/>
+          <w:lang w:eastAsia="es-EC"/>
+        </w:rPr>
+        <w:t xml:space="preserve"> mediante </w:t>
+      </w:r>
+      <w:proofErr w:type="spellStart"/>
+      <w:r>
+        <w:rPr>
+          <w:rFonts w:ascii="Arial" w:hAnsi="Arial" w:cs="Arial"/>
+          <w:lang w:eastAsia="es-EC"/>
+        </w:rPr>
+        <w:t>pull</w:t>
+      </w:r>
+      <w:proofErr w:type="spellEnd"/>
+      <w:r>
+        <w:rPr>
+          <w:rFonts w:ascii="Arial" w:hAnsi="Arial" w:cs="Arial"/>
+          <w:lang w:eastAsia="es-EC"/>
+        </w:rPr>
+        <w:t xml:space="preserve"> </w:t>
+      </w:r>
+      <w:proofErr w:type="spellStart"/>
+      <w:r>
+        <w:rPr>
+          <w:rFonts w:ascii="Arial" w:hAnsi="Arial" w:cs="Arial"/>
+          <w:lang w:eastAsia="es-EC"/>
+        </w:rPr>
+        <w:t>request</w:t>
+      </w:r>
+      <w:proofErr w:type="spellEnd"/>
+      <w:r>
+        <w:rPr>
+          <w:rFonts w:ascii="Arial" w:hAnsi="Arial" w:cs="Arial"/>
+          <w:lang w:eastAsia="es-EC"/>
+        </w:rPr>
+        <w:t xml:space="preserve"> y, una vez estables, se fusionan con </w:t>
+      </w:r>
+      <w:proofErr w:type="spellStart"/>
+      <w:r>
+        <w:rPr>
+          <w:rFonts w:ascii="Arial" w:hAnsi="Arial" w:cs="Arial"/>
+          <w:lang w:eastAsia="es-EC"/>
+        </w:rPr>
+        <w:t>main</w:t>
+      </w:r>
+      <w:proofErr w:type="spellEnd"/>
+      <w:r>
+        <w:rPr>
+          <w:rFonts w:ascii="Arial" w:hAnsi="Arial" w:cs="Arial"/>
+          <w:lang w:eastAsia="es-EC"/>
+        </w:rPr>
+        <w:t> generando una nueva versión</w:t>
       </w:r>
       <w:r>
         <w:rPr>
@@ -5002,8 +5709,19 @@
           <w:bCs/>
           <w:lang w:val="es-ES" w:eastAsia="es-EC"/>
         </w:rPr>
-        <w:t>3.2 Observer</w:t>
-      </w:r>
+        <w:t xml:space="preserve">3.2 </w:t>
+      </w:r>
+      <w:proofErr w:type="spellStart"/>
+      <w:r>
+        <w:rPr>
+          <w:rFonts w:ascii="Arial" w:hAnsi="Arial" w:cs="Arial"/>
+          <w:b/>
+          <w:bCs/>
+          <w:lang w:val="es-ES" w:eastAsia="es-EC"/>
+        </w:rPr>
+        <w:t>Observer</w:t>
+      </w:r>
+      <w:proofErr w:type="spellEnd"/>
     </w:p>
     <w:p>
       <w:pPr>
@@ -5032,7 +5750,39 @@
           <w:rFonts w:ascii="Arial" w:hAnsi="Arial" w:cs="Arial"/>
           <w:lang w:val="es-ES" w:eastAsia="es-EC"/>
         </w:rPr>
-        <w:t>Problema que resuelve: Sin este patrón, el sistema tendría que consultar constantemente si hay nuevos casos (polling), consumiendo recursos innecesarios. Observer permite que los voluntarios se suscriban y reciban el aviso en el momento exacto en que ocurre el evento, siendo la base de la programación reactiva.</w:t>
+        <w:t>Problema que resuelve: Sin este patrón, el sistema tendría que consultar constantemente si hay nuevos casos (</w:t>
+      </w:r>
+      <w:proofErr w:type="spellStart"/>
+      <w:r>
+        <w:rPr>
+          <w:rFonts w:ascii="Arial" w:hAnsi="Arial" w:cs="Arial"/>
+          <w:lang w:val="es-ES" w:eastAsia="es-EC"/>
+        </w:rPr>
+        <w:t>polling</w:t>
+      </w:r>
+      <w:proofErr w:type="spellEnd"/>
+      <w:r>
+        <w:rPr>
+          <w:rFonts w:ascii="Arial" w:hAnsi="Arial" w:cs="Arial"/>
+          <w:lang w:val="es-ES" w:eastAsia="es-EC"/>
+        </w:rPr>
+        <w:t xml:space="preserve">), consumiendo recursos innecesarios. </w:t>
+      </w:r>
+      <w:proofErr w:type="spellStart"/>
+      <w:r>
+        <w:rPr>
+          <w:rFonts w:ascii="Arial" w:hAnsi="Arial" w:cs="Arial"/>
+          <w:lang w:val="es-ES" w:eastAsia="es-EC"/>
+        </w:rPr>
+        <w:t>Observer</w:t>
+      </w:r>
+      <w:proofErr w:type="spellEnd"/>
+      <w:r>
+        <w:rPr>
+          <w:rFonts w:ascii="Arial" w:hAnsi="Arial" w:cs="Arial"/>
+          <w:lang w:val="es-ES" w:eastAsia="es-EC"/>
+        </w:rPr>
+        <w:t xml:space="preserve"> permite que los voluntarios se suscriban y reciban el aviso en el momento exacto en que ocurre el evento, siendo la base de la programación reactiva.</w:t>
       </w:r>
     </w:p>
     <w:p>
@@ -5125,6 +5875,7 @@
           <w:bCs/>
           <w:lang w:val="es-ES" w:eastAsia="es-EC"/>
         </w:rPr>
+        <w:lastRenderedPageBreak/>
         <w:t>Propósito: </w:t>
       </w:r>
       <w:r>
@@ -5190,30 +5941,62 @@
           <w:rFonts w:ascii="Arial" w:hAnsi="Arial" w:cs="Arial"/>
           <w:lang w:val="es-ES" w:eastAsia="es-EC"/>
         </w:rPr>
-        <w:t>El siguiente diagrama muestra el escenario "Registrar un nuevo caso de rescate", donde se aplican los patrones Singleton, Factory Method y Observer.</w:t>
-      </w:r>
-    </w:p>
-    <w:p>
-      <w:pPr>
-        <w:rPr>
-          <w:rFonts w:ascii="Arial" w:hAnsi="Arial" w:cs="Arial"/>
-          <w:lang w:val="es-ES" w:eastAsia="es-EC"/>
-        </w:rPr>
-      </w:pPr>
-    </w:p>
-    <w:p>
-      <w:pPr>
-        <w:rPr>
-          <w:rFonts w:ascii="Arial" w:hAnsi="Arial" w:cs="Arial"/>
-          <w:lang w:val="es-ES" w:eastAsia="es-EC"/>
-        </w:rPr>
-      </w:pPr>
-      <w:r>
-        <w:rPr>
-          <w:rFonts w:ascii="Arial" w:hAnsi="Arial" w:cs="Arial"/>
-          <w:lang w:val="es-ES" w:eastAsia="es-EC"/>
-        </w:rPr>
-        <w:t>Explicación: El ciudadano reporta un rescate; el Controlador solicita al Gestor de Casos (Singleton) que cree el caso; el Factory Method genera el expediente según la especie; y el Observer notifica automáticamente a los voluntarios disponibles.</w:t>
+        <w:t xml:space="preserve">El siguiente diagrama muestra el escenario "Registrar un nuevo caso de rescate", donde se aplican los patrones Singleton, Factory Method y </w:t>
+      </w:r>
+      <w:proofErr w:type="spellStart"/>
+      <w:r>
+        <w:rPr>
+          <w:rFonts w:ascii="Arial" w:hAnsi="Arial" w:cs="Arial"/>
+          <w:lang w:val="es-ES" w:eastAsia="es-EC"/>
+        </w:rPr>
+        <w:t>Observer</w:t>
+      </w:r>
+      <w:proofErr w:type="spellEnd"/>
+      <w:r>
+        <w:rPr>
+          <w:rFonts w:ascii="Arial" w:hAnsi="Arial" w:cs="Arial"/>
+          <w:lang w:val="es-ES" w:eastAsia="es-EC"/>
+        </w:rPr>
+        <w:t>.</w:t>
+      </w:r>
+    </w:p>
+    <w:p>
+      <w:pPr>
+        <w:rPr>
+          <w:rFonts w:ascii="Arial" w:hAnsi="Arial" w:cs="Arial"/>
+          <w:lang w:val="es-ES" w:eastAsia="es-EC"/>
+        </w:rPr>
+      </w:pPr>
+    </w:p>
+    <w:p>
+      <w:pPr>
+        <w:rPr>
+          <w:rFonts w:ascii="Arial" w:hAnsi="Arial" w:cs="Arial"/>
+          <w:lang w:val="es-ES" w:eastAsia="es-EC"/>
+        </w:rPr>
+      </w:pPr>
+      <w:r>
+        <w:rPr>
+          <w:rFonts w:ascii="Arial" w:hAnsi="Arial" w:cs="Arial"/>
+          <w:lang w:val="es-ES" w:eastAsia="es-EC"/>
+        </w:rPr>
+        <w:t xml:space="preserve">Explicación: El ciudadano reporta un rescate; el Controlador solicita al Gestor de Casos (Singleton) que cree el caso; el Factory Method genera el expediente según la especie; y el </w:t>
+      </w:r>
+      <w:proofErr w:type="spellStart"/>
+      <w:r>
+        <w:rPr>
+          <w:rFonts w:ascii="Arial" w:hAnsi="Arial" w:cs="Arial"/>
+          <w:lang w:val="es-ES" w:eastAsia="es-EC"/>
+        </w:rPr>
+        <w:t>Observer</w:t>
+      </w:r>
+      <w:proofErr w:type="spellEnd"/>
+      <w:r>
+        <w:rPr>
+          <w:rFonts w:ascii="Arial" w:hAnsi="Arial" w:cs="Arial"/>
+          <w:lang w:val="es-ES" w:eastAsia="es-EC"/>
+        </w:rPr>
+        <w:t xml:space="preserve"> notifica automáticamente a los voluntarios disponibles.</w:t>
       </w:r>
     </w:p>
     <w:p>
@@ -5321,7 +6104,23 @@
           <w:rFonts w:ascii="Arial" w:hAnsi="Arial" w:cs="Arial"/>
           <w:lang w:eastAsia="es-EC"/>
         </w:rPr>
-        <w:t>El diagrama muestra el flujo completo desde que el ciudadano reporta un rescate hasta que se notifica al voluntario. En el proceso se aplican tres patrones: Singleton (única instancia del Gestor de Casos), Factory Method (creación del expediente según la especie) y Observer (notificación automática a los voluntarios suscritos).</w:t>
+        <w:t>El diagrama muestra el flujo completo desde que el ciudadano reporta un rescate hasta que se notifica al voluntario. En el proceso se aplican tres patrones: Singleton (única instancia del Gestor de Casos), Factory Method (creación del expediente según la especie) y </w:t>
+      </w:r>
+      <w:proofErr w:type="spellStart"/>
+      <w:r>
+        <w:rPr>
+          <w:rFonts w:ascii="Arial" w:hAnsi="Arial" w:cs="Arial"/>
+          <w:lang w:eastAsia="es-EC"/>
+        </w:rPr>
+        <w:t>Observer</w:t>
+      </w:r>
+      <w:proofErr w:type="spellEnd"/>
+      <w:r>
+        <w:rPr>
+          <w:rFonts w:ascii="Arial" w:hAnsi="Arial" w:cs="Arial"/>
+          <w:lang w:eastAsia="es-EC"/>
+        </w:rPr>
+        <w:t> (notificación automática a los voluntarios suscritos).</w:t>
       </w:r>
     </w:p>
     <w:p>
@@ -5431,22 +6230,50 @@
           <w:bCs/>
           <w:lang w:val="es-ES" w:eastAsia="es-EC"/>
         </w:rPr>
-        <w:t>5. Justificación del uso de Gitflow</w:t>
-      </w:r>
-    </w:p>
-    <w:p>
-      <w:pPr>
-        <w:rPr>
-          <w:rFonts w:ascii="Arial" w:hAnsi="Arial" w:cs="Arial"/>
-          <w:lang w:val="es-ES" w:eastAsia="es-EC"/>
-        </w:rPr>
-      </w:pPr>
-      <w:r>
-        <w:rPr>
-          <w:rFonts w:ascii="Arial" w:hAnsi="Arial" w:cs="Arial"/>
-          <w:lang w:val="es-ES" w:eastAsia="es-EC"/>
-        </w:rPr>
-        <w:t>Se utilizó el modelo Gitflow para organizar el desarrollo del sistema de forma profesional y ordenada. Su uso permite mantener una versión estable mientras se desarrollan nuevas funcionalidades de manera aislada.</w:t>
+        <w:t xml:space="preserve">5. Justificación del uso de </w:t>
+      </w:r>
+      <w:proofErr w:type="spellStart"/>
+      <w:r>
+        <w:rPr>
+          <w:rFonts w:ascii="Arial" w:hAnsi="Arial" w:cs="Arial"/>
+          <w:b/>
+          <w:bCs/>
+          <w:lang w:val="es-ES" w:eastAsia="es-EC"/>
+        </w:rPr>
+        <w:t>Gitflow</w:t>
+      </w:r>
+      <w:proofErr w:type="spellEnd"/>
+    </w:p>
+    <w:p>
+      <w:pPr>
+        <w:rPr>
+          <w:rFonts w:ascii="Arial" w:hAnsi="Arial" w:cs="Arial"/>
+          <w:lang w:val="es-ES" w:eastAsia="es-EC"/>
+        </w:rPr>
+      </w:pPr>
+      <w:r>
+        <w:rPr>
+          <w:rFonts w:ascii="Arial" w:hAnsi="Arial" w:cs="Arial"/>
+          <w:lang w:val="es-ES" w:eastAsia="es-EC"/>
+        </w:rPr>
+        <w:lastRenderedPageBreak/>
+        <w:t>Se utilizó el modelo </w:t>
+      </w:r>
+      <w:proofErr w:type="spellStart"/>
+      <w:r>
+        <w:rPr>
+          <w:rFonts w:ascii="Arial" w:hAnsi="Arial" w:cs="Arial"/>
+          <w:lang w:val="es-ES" w:eastAsia="es-EC"/>
+        </w:rPr>
+        <w:t>Gitflow</w:t>
+      </w:r>
+      <w:proofErr w:type="spellEnd"/>
+      <w:r>
+        <w:rPr>
+          <w:rFonts w:ascii="Arial" w:hAnsi="Arial" w:cs="Arial"/>
+          <w:lang w:val="es-ES" w:eastAsia="es-EC"/>
+        </w:rPr>
+        <w:t> para organizar el desarrollo del sistema de forma profesional y ordenada. Su uso permite mantener una versión estable mientras se desarrollan nuevas funcionalidades de manera aislada.</w:t>
       </w:r>
     </w:p>
     <w:p>
@@ -5598,6 +6425,7 @@
                 <w:lang w:val="es-ES" w:eastAsia="es-EC"/>
               </w:rPr>
             </w:pPr>
+            <w:proofErr w:type="spellStart"/>
             <w:r>
               <w:rPr>
                 <w:rFonts w:ascii="Arial" w:hAnsi="Arial" w:cs="Arial"/>
@@ -5605,6 +6433,7 @@
               </w:rPr>
               <w:t>main</w:t>
             </w:r>
+            <w:proofErr w:type="spellEnd"/>
           </w:p>
         </w:tc>
         <w:tc>
@@ -5669,6 +6498,7 @@
                 <w:lang w:val="es-ES" w:eastAsia="es-EC"/>
               </w:rPr>
             </w:pPr>
+            <w:proofErr w:type="spellStart"/>
             <w:r>
               <w:rPr>
                 <w:rFonts w:ascii="Arial" w:hAnsi="Arial" w:cs="Arial"/>
@@ -5676,6 +6506,7 @@
               </w:rPr>
               <w:t>develop</w:t>
             </w:r>
+            <w:proofErr w:type="spellEnd"/>
           </w:p>
         </w:tc>
         <w:tc>
@@ -5740,12 +6571,21 @@
                 <w:lang w:val="es-ES" w:eastAsia="es-EC"/>
               </w:rPr>
             </w:pPr>
+            <w:proofErr w:type="spellStart"/>
             <w:r>
               <w:rPr>
                 <w:rFonts w:ascii="Arial" w:hAnsi="Arial" w:cs="Arial"/>
                 <w:lang w:val="es-ES" w:eastAsia="es-EC"/>
               </w:rPr>
-              <w:t>feature/*</w:t>
+              <w:t>feature</w:t>
+            </w:r>
+            <w:proofErr w:type="spellEnd"/>
+            <w:r>
+              <w:rPr>
+                <w:rFonts w:ascii="Arial" w:hAnsi="Arial" w:cs="Arial"/>
+                <w:lang w:val="es-ES" w:eastAsia="es-EC"/>
+              </w:rPr>
+              <w:t>/*</w:t>
             </w:r>
           </w:p>
         </w:tc>
@@ -5829,7 +6669,55 @@
           <w:rFonts w:ascii="Arial" w:hAnsi="Arial" w:cs="Arial"/>
           <w:lang w:val="es-ES" w:eastAsia="es-EC"/>
         </w:rPr>
-        <w:t>Se creó la rama feature/analisis-requerimientos desde develop.</w:t>
+        <w:t>Se creó la rama </w:t>
+      </w:r>
+      <w:proofErr w:type="spellStart"/>
+      <w:r>
+        <w:rPr>
+          <w:rFonts w:ascii="Arial" w:hAnsi="Arial" w:cs="Arial"/>
+          <w:lang w:val="es-ES" w:eastAsia="es-EC"/>
+        </w:rPr>
+        <w:t>feature</w:t>
+      </w:r>
+      <w:proofErr w:type="spellEnd"/>
+      <w:r>
+        <w:rPr>
+          <w:rFonts w:ascii="Arial" w:hAnsi="Arial" w:cs="Arial"/>
+          <w:lang w:val="es-ES" w:eastAsia="es-EC"/>
+        </w:rPr>
+        <w:t>/</w:t>
+      </w:r>
+      <w:proofErr w:type="spellStart"/>
+      <w:r>
+        <w:rPr>
+          <w:rFonts w:ascii="Arial" w:hAnsi="Arial" w:cs="Arial"/>
+          <w:lang w:val="es-ES" w:eastAsia="es-EC"/>
+        </w:rPr>
+        <w:t>analisis</w:t>
+      </w:r>
+      <w:proofErr w:type="spellEnd"/>
+      <w:r>
+        <w:rPr>
+          <w:rFonts w:ascii="Arial" w:hAnsi="Arial" w:cs="Arial"/>
+          <w:lang w:val="es-ES" w:eastAsia="es-EC"/>
+        </w:rPr>
+        <w:t>-requerimientos desde </w:t>
+      </w:r>
+      <w:proofErr w:type="spellStart"/>
+      <w:r>
+        <w:rPr>
+          <w:rFonts w:ascii="Arial" w:hAnsi="Arial" w:cs="Arial"/>
+          <w:lang w:val="es-ES" w:eastAsia="es-EC"/>
+        </w:rPr>
+        <w:t>develop</w:t>
+      </w:r>
+      <w:proofErr w:type="spellEnd"/>
+      <w:r>
+        <w:rPr>
+          <w:rFonts w:ascii="Arial" w:hAnsi="Arial" w:cs="Arial"/>
+          <w:lang w:val="es-ES" w:eastAsia="es-EC"/>
+        </w:rPr>
+        <w:t>.</w:t>
       </w:r>
     </w:p>
     <w:p>
@@ -5867,7 +6755,39 @@
           <w:rFonts w:ascii="Arial" w:hAnsi="Arial" w:cs="Arial"/>
           <w:lang w:val="es-ES" w:eastAsia="es-EC"/>
         </w:rPr>
-        <w:t>Se integró a develop mediante un Pull Request #1.</w:t>
+        <w:t>Se integró a </w:t>
+      </w:r>
+      <w:proofErr w:type="spellStart"/>
+      <w:r>
+        <w:rPr>
+          <w:rFonts w:ascii="Arial" w:hAnsi="Arial" w:cs="Arial"/>
+          <w:lang w:val="es-ES" w:eastAsia="es-EC"/>
+        </w:rPr>
+        <w:t>develop</w:t>
+      </w:r>
+      <w:proofErr w:type="spellEnd"/>
+      <w:r>
+        <w:rPr>
+          <w:rFonts w:ascii="Arial" w:hAnsi="Arial" w:cs="Arial"/>
+          <w:lang w:val="es-ES" w:eastAsia="es-EC"/>
+        </w:rPr>
+        <w:t xml:space="preserve"> mediante un Pull </w:t>
+      </w:r>
+      <w:proofErr w:type="spellStart"/>
+      <w:r>
+        <w:rPr>
+          <w:rFonts w:ascii="Arial" w:hAnsi="Arial" w:cs="Arial"/>
+          <w:lang w:val="es-ES" w:eastAsia="es-EC"/>
+        </w:rPr>
+        <w:t>Request</w:t>
+      </w:r>
+      <w:proofErr w:type="spellEnd"/>
+      <w:r>
+        <w:rPr>
+          <w:rFonts w:ascii="Arial" w:hAnsi="Arial" w:cs="Arial"/>
+          <w:lang w:val="es-ES" w:eastAsia="es-EC"/>
+        </w:rPr>
+        <w:t xml:space="preserve"> #1.</w:t>
       </w:r>
     </w:p>
     <w:p>
@@ -5886,7 +6806,55 @@
           <w:rFonts w:ascii="Arial" w:hAnsi="Arial" w:cs="Arial"/>
           <w:lang w:val="es-ES" w:eastAsia="es-EC"/>
         </w:rPr>
-        <w:t>Finalmente se fusionó develop con main mediante el Pull Request #2, generando la primera versión estable.</w:t>
+        <w:t>Finalmente se fusionó </w:t>
+      </w:r>
+      <w:proofErr w:type="spellStart"/>
+      <w:r>
+        <w:rPr>
+          <w:rFonts w:ascii="Arial" w:hAnsi="Arial" w:cs="Arial"/>
+          <w:lang w:val="es-ES" w:eastAsia="es-EC"/>
+        </w:rPr>
+        <w:t>develop</w:t>
+      </w:r>
+      <w:proofErr w:type="spellEnd"/>
+      <w:r>
+        <w:rPr>
+          <w:rFonts w:ascii="Arial" w:hAnsi="Arial" w:cs="Arial"/>
+          <w:lang w:val="es-ES" w:eastAsia="es-EC"/>
+        </w:rPr>
+        <w:t> con </w:t>
+      </w:r>
+      <w:proofErr w:type="spellStart"/>
+      <w:r>
+        <w:rPr>
+          <w:rFonts w:ascii="Arial" w:hAnsi="Arial" w:cs="Arial"/>
+          <w:lang w:val="es-ES" w:eastAsia="es-EC"/>
+        </w:rPr>
+        <w:t>main</w:t>
+      </w:r>
+      <w:proofErr w:type="spellEnd"/>
+      <w:r>
+        <w:rPr>
+          <w:rFonts w:ascii="Arial" w:hAnsi="Arial" w:cs="Arial"/>
+          <w:lang w:val="es-ES" w:eastAsia="es-EC"/>
+        </w:rPr>
+        <w:t xml:space="preserve"> mediante el Pull </w:t>
+      </w:r>
+      <w:proofErr w:type="spellStart"/>
+      <w:r>
+        <w:rPr>
+          <w:rFonts w:ascii="Arial" w:hAnsi="Arial" w:cs="Arial"/>
+          <w:lang w:val="es-ES" w:eastAsia="es-EC"/>
+        </w:rPr>
+        <w:t>Request</w:t>
+      </w:r>
+      <w:proofErr w:type="spellEnd"/>
+      <w:r>
+        <w:rPr>
+          <w:rFonts w:ascii="Arial" w:hAnsi="Arial" w:cs="Arial"/>
+          <w:lang w:val="es-ES" w:eastAsia="es-EC"/>
+        </w:rPr>
+        <w:t xml:space="preserve"> #2, generando la primera versión estable.</w:t>
       </w:r>
     </w:p>
     <w:p>
@@ -5960,7 +6928,23 @@
           <w:rFonts w:ascii="Arial" w:hAnsi="Arial" w:cs="Arial"/>
           <w:lang w:val="es-ES" w:eastAsia="es-EC"/>
         </w:rPr>
-        <w:t xml:space="preserve"> Estructura de ramas en GitHub. Muestra las ramas main, develop y feature/analisis-requerimientos configuradas bajo el modelo Gitflow.</w:t>
+        <w:t xml:space="preserve"> Estructura de ramas en GitHub. Muestra las ramas main, develop y feature/analisis-requerimientos configuradas bajo el modelo </w:t>
+      </w:r>
+      <w:proofErr w:type="spellStart"/>
+      <w:r>
+        <w:rPr>
+          <w:rFonts w:ascii="Arial" w:hAnsi="Arial" w:cs="Arial"/>
+          <w:lang w:val="es-ES" w:eastAsia="es-EC"/>
+        </w:rPr>
+        <w:t>Gitflow</w:t>
+      </w:r>
+      <w:proofErr w:type="spellEnd"/>
+      <w:r>
+        <w:rPr>
+          <w:rFonts w:ascii="Arial" w:hAnsi="Arial" w:cs="Arial"/>
+          <w:lang w:val="es-ES" w:eastAsia="es-EC"/>
+        </w:rPr>
+        <w:t>.</w:t>
       </w:r>
     </w:p>
     <w:p>
@@ -6006,8 +6990,9 @@
         <w:rPr>
           <w:noProof/>
         </w:rPr>
+        <w:lastRenderedPageBreak/>
         <w:drawing>
-          <wp:anchor distT="0" distB="0" distL="114300" distR="114300" simplePos="0" relativeHeight="251670528" behindDoc="0" locked="0" layoutInCell="1" allowOverlap="1" wp14:anchorId="31BCD5F0" wp14:editId="0E2C4066">
+          <wp:anchor distT="0" distB="0" distL="114300" distR="114300" simplePos="0" relativeHeight="251670528" behindDoc="0" locked="0" layoutInCell="1" allowOverlap="1" wp14:anchorId="31BCD5F0" wp14:editId="511D29E9">
             <wp:simplePos x="0" y="0"/>
             <wp:positionH relativeFrom="margin">
               <wp:posOffset>-207034</wp:posOffset>
@@ -6087,6 +7072,8 @@
       <w:r>
         <w:rPr>
           <w:rFonts w:ascii="Arial" w:hAnsi="Arial" w:cs="Arial"/>
+          <w:b/>
+          <w:bCs/>
           <w:noProof/>
           <w:lang w:val="es-ES" w:eastAsia="es-EC"/>
         </w:rPr>
@@ -6148,9 +7135,34 @@
       <w:r>
         <w:rPr>
           <w:rFonts w:ascii="Arial" w:hAnsi="Arial" w:cs="Arial"/>
-          <w:lang w:val="es-ES" w:eastAsia="es-EC"/>
-        </w:rPr>
-        <w:t>Figura 5. Historial de commits. Evidencia la secuencia de avances realizados en el proyecto.</w:t>
+          <w:b/>
+          <w:bCs/>
+          <w:lang w:val="es-ES" w:eastAsia="es-EC"/>
+        </w:rPr>
+        <w:t>Figura 5.</w:t>
+      </w:r>
+      <w:r>
+        <w:rPr>
+          <w:rFonts w:ascii="Arial" w:hAnsi="Arial" w:cs="Arial"/>
+          <w:lang w:val="es-ES" w:eastAsia="es-EC"/>
+        </w:rPr>
+        <w:t xml:space="preserve"> Historial de </w:t>
+      </w:r>
+      <w:proofErr w:type="spellStart"/>
+      <w:r>
+        <w:rPr>
+          <w:rFonts w:ascii="Arial" w:hAnsi="Arial" w:cs="Arial"/>
+          <w:lang w:val="es-ES" w:eastAsia="es-EC"/>
+        </w:rPr>
+        <w:t>commits</w:t>
+      </w:r>
+      <w:proofErr w:type="spellEnd"/>
+      <w:r>
+        <w:rPr>
+          <w:rFonts w:ascii="Arial" w:hAnsi="Arial" w:cs="Arial"/>
+          <w:lang w:val="es-ES" w:eastAsia="es-EC"/>
+        </w:rPr>
+        <w:t>. Evidencia la secuencia de avances realizados en el proyecto.</w:t>
       </w:r>
     </w:p>
     <w:p>
@@ -6198,7 +7210,55 @@
           <w:rFonts w:ascii="Arial" w:hAnsi="Arial" w:cs="Arial"/>
           <w:lang w:val="es-ES" w:eastAsia="es-EC"/>
         </w:rPr>
-        <w:t xml:space="preserve"> Pull Request #1 (feature → develop). Integración de la rama de funcionalidad a la rama de desarrollo.</w:t>
+        <w:t xml:space="preserve"> Pull </w:t>
+      </w:r>
+      <w:proofErr w:type="spellStart"/>
+      <w:r>
+        <w:rPr>
+          <w:rFonts w:ascii="Arial" w:hAnsi="Arial" w:cs="Arial"/>
+          <w:lang w:val="es-ES" w:eastAsia="es-EC"/>
+        </w:rPr>
+        <w:t>Request</w:t>
+      </w:r>
+      <w:proofErr w:type="spellEnd"/>
+      <w:r>
+        <w:rPr>
+          <w:rFonts w:ascii="Arial" w:hAnsi="Arial" w:cs="Arial"/>
+          <w:lang w:val="es-ES" w:eastAsia="es-EC"/>
+        </w:rPr>
+        <w:t xml:space="preserve"> #1 (</w:t>
+      </w:r>
+      <w:proofErr w:type="spellStart"/>
+      <w:r>
+        <w:rPr>
+          <w:rFonts w:ascii="Arial" w:hAnsi="Arial" w:cs="Arial"/>
+          <w:lang w:val="es-ES" w:eastAsia="es-EC"/>
+        </w:rPr>
+        <w:t>feature</w:t>
+      </w:r>
+      <w:proofErr w:type="spellEnd"/>
+      <w:r>
+        <w:rPr>
+          <w:rFonts w:ascii="Arial" w:hAnsi="Arial" w:cs="Arial"/>
+          <w:lang w:val="es-ES" w:eastAsia="es-EC"/>
+        </w:rPr>
+        <w:t xml:space="preserve"> → </w:t>
+      </w:r>
+      <w:proofErr w:type="spellStart"/>
+      <w:r>
+        <w:rPr>
+          <w:rFonts w:ascii="Arial" w:hAnsi="Arial" w:cs="Arial"/>
+          <w:lang w:val="es-ES" w:eastAsia="es-EC"/>
+        </w:rPr>
+        <w:t>develop</w:t>
+      </w:r>
+      <w:proofErr w:type="spellEnd"/>
+      <w:r>
+        <w:rPr>
+          <w:rFonts w:ascii="Arial" w:hAnsi="Arial" w:cs="Arial"/>
+          <w:lang w:val="es-ES" w:eastAsia="es-EC"/>
+        </w:rPr>
+        <w:t>). Integración de la rama de funcionalidad a la rama de desarrollo.</w:t>
       </w:r>
     </w:p>
     <w:p>
@@ -6386,6 +7446,8 @@
       </w:pPr>
       <w:r>
         <w:rPr>
+          <w:b/>
+          <w:bCs/>
           <w:noProof/>
         </w:rPr>
         <w:drawing>
@@ -6450,106 +7512,305 @@
       <w:r>
         <w:rPr>
           <w:rFonts w:ascii="Arial" w:hAnsi="Arial" w:cs="Arial"/>
-          <w:lang w:val="es-ES" w:eastAsia="es-EC"/>
-        </w:rPr>
-        <w:t>Figura 7. Pull Request #2 (develop → main). Fusión de la versión estable a producción.</w:t>
-      </w:r>
-    </w:p>
-    <w:p>
-      <w:pPr>
-        <w:rPr>
-          <w:rFonts w:ascii="Arial" w:hAnsi="Arial" w:cs="Arial"/>
-          <w:lang w:val="es-ES" w:eastAsia="es-EC"/>
-        </w:rPr>
-      </w:pPr>
-    </w:p>
-    <w:p>
-      <w:pPr>
-        <w:rPr>
-          <w:rFonts w:ascii="Arial" w:hAnsi="Arial" w:cs="Arial"/>
-          <w:lang w:val="es-ES" w:eastAsia="es-EC"/>
-        </w:rPr>
-      </w:pPr>
-    </w:p>
-    <w:p>
-      <w:pPr>
-        <w:rPr>
-          <w:rFonts w:ascii="Arial" w:hAnsi="Arial" w:cs="Arial"/>
-          <w:lang w:val="es-ES" w:eastAsia="es-EC"/>
-        </w:rPr>
-      </w:pPr>
-    </w:p>
-    <w:p>
-      <w:pPr>
-        <w:rPr>
-          <w:rFonts w:ascii="Arial" w:hAnsi="Arial" w:cs="Arial"/>
-          <w:lang w:val="es-ES" w:eastAsia="es-EC"/>
-        </w:rPr>
-      </w:pPr>
-    </w:p>
-    <w:p>
-      <w:pPr>
-        <w:rPr>
-          <w:rFonts w:ascii="Arial" w:hAnsi="Arial" w:cs="Arial"/>
-          <w:lang w:val="es-ES" w:eastAsia="es-EC"/>
-        </w:rPr>
-      </w:pPr>
-    </w:p>
-    <w:p>
-      <w:pPr>
-        <w:rPr>
-          <w:rFonts w:ascii="Arial" w:hAnsi="Arial" w:cs="Arial"/>
-          <w:lang w:val="es-ES" w:eastAsia="es-EC"/>
-        </w:rPr>
-      </w:pPr>
-    </w:p>
-    <w:p>
-      <w:pPr>
-        <w:rPr>
-          <w:rFonts w:ascii="Arial" w:hAnsi="Arial" w:cs="Arial"/>
-          <w:lang w:val="es-ES" w:eastAsia="es-EC"/>
-        </w:rPr>
-      </w:pPr>
-    </w:p>
-    <w:p>
-      <w:pPr>
-        <w:rPr>
-          <w:rFonts w:ascii="Arial" w:hAnsi="Arial" w:cs="Arial"/>
-          <w:lang w:val="es-ES" w:eastAsia="es-EC"/>
-        </w:rPr>
-      </w:pPr>
-    </w:p>
-    <w:p>
-      <w:pPr>
-        <w:rPr>
-          <w:rFonts w:ascii="Arial" w:hAnsi="Arial" w:cs="Arial"/>
-          <w:lang w:val="es-ES" w:eastAsia="es-EC"/>
-        </w:rPr>
-      </w:pPr>
-    </w:p>
-    <w:p>
-      <w:pPr>
-        <w:rPr>
-          <w:rFonts w:ascii="Arial" w:hAnsi="Arial" w:cs="Arial"/>
-          <w:lang w:val="es-ES" w:eastAsia="es-EC"/>
-        </w:rPr>
-      </w:pPr>
-    </w:p>
-    <w:p>
-      <w:pPr>
-        <w:rPr>
-          <w:rFonts w:ascii="Arial" w:hAnsi="Arial" w:cs="Arial"/>
-          <w:lang w:val="es-ES" w:eastAsia="es-EC"/>
-        </w:rPr>
-      </w:pPr>
-    </w:p>
-    <w:p>
-      <w:pPr>
-        <w:rPr>
-          <w:rFonts w:ascii="Arial" w:hAnsi="Arial" w:cs="Arial"/>
-          <w:b/>
-          <w:bCs/>
-          <w:lang w:eastAsia="es-EC"/>
+          <w:b/>
+          <w:bCs/>
+          <w:lang w:val="es-ES" w:eastAsia="es-EC"/>
+        </w:rPr>
+        <w:t>Figura 7.</w:t>
+      </w:r>
+      <w:r>
+        <w:rPr>
+          <w:rFonts w:ascii="Arial" w:hAnsi="Arial" w:cs="Arial"/>
+          <w:lang w:val="es-ES" w:eastAsia="es-EC"/>
+        </w:rPr>
+        <w:t xml:space="preserve"> Pull </w:t>
+      </w:r>
+      <w:proofErr w:type="spellStart"/>
+      <w:r>
+        <w:rPr>
+          <w:rFonts w:ascii="Arial" w:hAnsi="Arial" w:cs="Arial"/>
+          <w:lang w:val="es-ES" w:eastAsia="es-EC"/>
+        </w:rPr>
+        <w:t>Request</w:t>
+      </w:r>
+      <w:proofErr w:type="spellEnd"/>
+      <w:r>
+        <w:rPr>
+          <w:rFonts w:ascii="Arial" w:hAnsi="Arial" w:cs="Arial"/>
+          <w:lang w:val="es-ES" w:eastAsia="es-EC"/>
+        </w:rPr>
+        <w:t xml:space="preserve"> #2 (</w:t>
+      </w:r>
+      <w:proofErr w:type="spellStart"/>
+      <w:r>
+        <w:rPr>
+          <w:rFonts w:ascii="Arial" w:hAnsi="Arial" w:cs="Arial"/>
+          <w:lang w:val="es-ES" w:eastAsia="es-EC"/>
+        </w:rPr>
+        <w:t>develop</w:t>
+      </w:r>
+      <w:proofErr w:type="spellEnd"/>
+      <w:r>
+        <w:rPr>
+          <w:rFonts w:ascii="Arial" w:hAnsi="Arial" w:cs="Arial"/>
+          <w:lang w:val="es-ES" w:eastAsia="es-EC"/>
+        </w:rPr>
+        <w:t xml:space="preserve"> → </w:t>
+      </w:r>
+      <w:proofErr w:type="spellStart"/>
+      <w:r>
+        <w:rPr>
+          <w:rFonts w:ascii="Arial" w:hAnsi="Arial" w:cs="Arial"/>
+          <w:lang w:val="es-ES" w:eastAsia="es-EC"/>
+        </w:rPr>
+        <w:t>main</w:t>
+      </w:r>
+      <w:proofErr w:type="spellEnd"/>
+      <w:r>
+        <w:rPr>
+          <w:rFonts w:ascii="Arial" w:hAnsi="Arial" w:cs="Arial"/>
+          <w:lang w:val="es-ES" w:eastAsia="es-EC"/>
+        </w:rPr>
+        <w:t>). Fusión de la versión estable a producción.</w:t>
+      </w:r>
+    </w:p>
+    <w:p>
+      <w:pPr>
+        <w:rPr>
+          <w:rFonts w:ascii="Arial" w:hAnsi="Arial" w:cs="Arial"/>
+          <w:lang w:val="es-ES" w:eastAsia="es-EC"/>
+        </w:rPr>
+      </w:pPr>
+    </w:p>
+    <w:p>
+      <w:pPr>
+        <w:rPr>
+          <w:rFonts w:ascii="Arial" w:hAnsi="Arial" w:cs="Arial"/>
+          <w:lang w:val="es-ES" w:eastAsia="es-EC"/>
+        </w:rPr>
+      </w:pPr>
+      <w:r>
+        <w:rPr>
+          <w:rFonts w:ascii="Arial" w:hAnsi="Arial" w:cs="Arial"/>
+          <w:sz w:val="24"/>
+          <w:szCs w:val="24"/>
+          <w:lang w:eastAsia="es-EC"/>
+        </w:rPr>
+        <w:drawing>
+          <wp:anchor distT="0" distB="0" distL="114300" distR="114300" simplePos="0" relativeHeight="251674624" behindDoc="0" locked="0" layoutInCell="1" allowOverlap="1" wp14:anchorId="422689CE" wp14:editId="649CDCA6">
+            <wp:simplePos x="0" y="0"/>
+            <wp:positionH relativeFrom="margin">
+              <wp:align>left</wp:align>
+            </wp:positionH>
+            <wp:positionV relativeFrom="paragraph">
+              <wp:posOffset>412750</wp:posOffset>
+            </wp:positionV>
+            <wp:extent cx="5097780" cy="2732405"/>
+            <wp:effectExtent l="19050" t="19050" r="26670" b="10795"/>
+            <wp:wrapSquare wrapText="bothSides"/>
+            <wp:docPr id="201096752" name="Imagen 1"/>
+            <wp:cNvGraphicFramePr>
+              <a:graphicFrameLocks xmlns:a="http://schemas.openxmlformats.org/drawingml/2006/main" noChangeAspect="1"/>
+            </wp:cNvGraphicFramePr>
+            <a:graphic xmlns:a="http://schemas.openxmlformats.org/drawingml/2006/main">
+              <a:graphicData uri="http://schemas.openxmlformats.org/drawingml/2006/picture">
+                <pic:pic xmlns:pic="http://schemas.openxmlformats.org/drawingml/2006/picture">
+                  <pic:nvPicPr>
+                    <pic:cNvPr id="201096752" name=""/>
+                    <pic:cNvPicPr/>
+                  </pic:nvPicPr>
+                  <pic:blipFill rotWithShape="1">
+                    <a:blip r:embed="rId24">
+                      <a:extLst>
+                        <a:ext uri="{28A0092B-C50C-407E-A947-70E740481C1C}">
+                          <a14:useLocalDpi xmlns:a14="http://schemas.microsoft.com/office/drawing/2010/main" val="0"/>
+                        </a:ext>
+                      </a:extLst>
+                    </a:blip>
+                    <a:srcRect l="14676" r="14628"/>
+                    <a:stretch>
+                      <a:fillRect/>
+                    </a:stretch>
+                  </pic:blipFill>
+                  <pic:spPr bwMode="auto">
+                    <a:xfrm>
+                      <a:off x="0" y="0"/>
+                      <a:ext cx="5097780" cy="2732405"/>
+                    </a:xfrm>
+                    <a:prstGeom prst="rect">
+                      <a:avLst/>
+                    </a:prstGeom>
+                    <a:ln>
+                      <a:solidFill>
+                        <a:schemeClr val="tx1"/>
+                      </a:solidFill>
+                    </a:ln>
+                    <a:extLst>
+                      <a:ext uri="{53640926-AAD7-44D8-BBD7-CCE9431645EC}">
+                        <a14:shadowObscured xmlns:a14="http://schemas.microsoft.com/office/drawing/2010/main"/>
+                      </a:ext>
+                    </a:extLst>
+                  </pic:spPr>
+                </pic:pic>
+              </a:graphicData>
+            </a:graphic>
+            <wp14:sizeRelH relativeFrom="margin">
+              <wp14:pctWidth>0</wp14:pctWidth>
+            </wp14:sizeRelH>
+            <wp14:sizeRelV relativeFrom="margin">
+              <wp14:pctHeight>0</wp14:pctHeight>
+            </wp14:sizeRelV>
+          </wp:anchor>
+        </w:drawing>
+      </w:r>
+      <w:r>
+        <w:rPr>
+          <w:rFonts w:ascii="Arial" w:hAnsi="Arial" w:cs="Arial"/>
+          <w:b/>
+          <w:bCs/>
+          <w:lang w:eastAsia="es-EC"/>
+        </w:rPr>
+        <w:t>Figura 8.</w:t>
+      </w:r>
+      <w:r>
+        <w:rPr>
+          <w:rFonts w:ascii="Arial" w:hAnsi="Arial" w:cs="Arial"/>
+          <w:lang w:eastAsia="es-EC"/>
+        </w:rPr>
+        <w:t xml:space="preserve"> Gráfico de red (Network). Visualización del flujo </w:t>
+      </w:r>
+      <w:proofErr w:type="spellStart"/>
+      <w:r>
+        <w:rPr>
+          <w:rFonts w:ascii="Arial" w:hAnsi="Arial" w:cs="Arial"/>
+          <w:lang w:eastAsia="es-EC"/>
+        </w:rPr>
+        <w:t>Gitflow</w:t>
+      </w:r>
+      <w:proofErr w:type="spellEnd"/>
+      <w:r>
+        <w:rPr>
+          <w:rFonts w:ascii="Arial" w:hAnsi="Arial" w:cs="Arial"/>
+          <w:lang w:eastAsia="es-EC"/>
+        </w:rPr>
+        <w:t xml:space="preserve"> con la creación y fusión de ramas.</w:t>
+      </w:r>
+    </w:p>
+    <w:p>
+      <w:pPr>
+        <w:rPr>
+          <w:rFonts w:ascii="Arial" w:hAnsi="Arial" w:cs="Arial"/>
+          <w:lang w:val="es-ES" w:eastAsia="es-EC"/>
+        </w:rPr>
+      </w:pPr>
+      <w:r>
+        <w:rPr>
+          <w:rFonts w:ascii="Arial" w:hAnsi="Arial" w:cs="Arial"/>
+          <w:lang w:val="es-ES" w:eastAsia="es-EC"/>
+        </w:rPr>
+        <w:lastRenderedPageBreak/>
+        <w:drawing>
+          <wp:anchor distT="0" distB="0" distL="114300" distR="114300" simplePos="0" relativeHeight="251675648" behindDoc="0" locked="0" layoutInCell="1" allowOverlap="1" wp14:anchorId="6B85A1E6" wp14:editId="03F6F274">
+            <wp:simplePos x="0" y="0"/>
+            <wp:positionH relativeFrom="margin">
+              <wp:align>right</wp:align>
+            </wp:positionH>
+            <wp:positionV relativeFrom="paragraph">
+              <wp:posOffset>358775</wp:posOffset>
+            </wp:positionV>
+            <wp:extent cx="5400040" cy="2611120"/>
+            <wp:effectExtent l="19050" t="19050" r="10160" b="17780"/>
+            <wp:wrapSquare wrapText="bothSides"/>
+            <wp:docPr id="1113131250" name="Imagen 1"/>
+            <wp:cNvGraphicFramePr>
+              <a:graphicFrameLocks xmlns:a="http://schemas.openxmlformats.org/drawingml/2006/main" noChangeAspect="1"/>
+            </wp:cNvGraphicFramePr>
+            <a:graphic xmlns:a="http://schemas.openxmlformats.org/drawingml/2006/main">
+              <a:graphicData uri="http://schemas.openxmlformats.org/drawingml/2006/picture">
+                <pic:pic xmlns:pic="http://schemas.openxmlformats.org/drawingml/2006/picture">
+                  <pic:nvPicPr>
+                    <pic:cNvPr id="1113131250" name=""/>
+                    <pic:cNvPicPr/>
+                  </pic:nvPicPr>
+                  <pic:blipFill>
+                    <a:blip r:embed="rId25">
+                      <a:extLst>
+                        <a:ext uri="{28A0092B-C50C-407E-A947-70E740481C1C}">
+                          <a14:useLocalDpi xmlns:a14="http://schemas.microsoft.com/office/drawing/2010/main" val="0"/>
+                        </a:ext>
+                      </a:extLst>
+                    </a:blip>
+                    <a:stretch>
+                      <a:fillRect/>
+                    </a:stretch>
+                  </pic:blipFill>
+                  <pic:spPr>
+                    <a:xfrm>
+                      <a:off x="0" y="0"/>
+                      <a:ext cx="5400040" cy="2611120"/>
+                    </a:xfrm>
+                    <a:prstGeom prst="rect">
+                      <a:avLst/>
+                    </a:prstGeom>
+                    <a:ln>
+                      <a:solidFill>
+                        <a:schemeClr val="tx1"/>
+                      </a:solidFill>
+                    </a:ln>
+                  </pic:spPr>
+                </pic:pic>
+              </a:graphicData>
+            </a:graphic>
+          </wp:anchor>
+        </w:drawing>
+      </w:r>
+      <w:r>
+        <w:rPr>
+          <w:rFonts w:ascii="Arial" w:hAnsi="Arial" w:cs="Arial"/>
+          <w:b/>
+          <w:bCs/>
+          <w:lang w:eastAsia="es-EC"/>
+        </w:rPr>
+        <w:t>Figura 9.</w:t>
+      </w:r>
+      <w:r>
+        <w:rPr>
+          <w:rFonts w:ascii="Arial" w:hAnsi="Arial" w:cs="Arial"/>
+          <w:lang w:eastAsia="es-EC"/>
+        </w:rPr>
+        <w:t xml:space="preserve"> Repositorio en GitHub. Archivos del proyecto (Actividad-1.docx </w:t>
+      </w:r>
+      <w:proofErr w:type="gramStart"/>
+      <w:r>
+        <w:rPr>
+          <w:rFonts w:ascii="Arial" w:hAnsi="Arial" w:cs="Arial"/>
+          <w:lang w:eastAsia="es-EC"/>
+        </w:rPr>
+        <w:t>y .</w:t>
+      </w:r>
+      <w:proofErr w:type="spellStart"/>
+      <w:r>
+        <w:rPr>
+          <w:rFonts w:ascii="Arial" w:hAnsi="Arial" w:cs="Arial"/>
+          <w:lang w:eastAsia="es-EC"/>
+        </w:rPr>
+        <w:t>gitignore</w:t>
+      </w:r>
+      <w:proofErr w:type="spellEnd"/>
+      <w:proofErr w:type="gramEnd"/>
+      <w:r>
+        <w:rPr>
+          <w:rFonts w:ascii="Arial" w:hAnsi="Arial" w:cs="Arial"/>
+          <w:lang w:eastAsia="es-EC"/>
+        </w:rPr>
+        <w:t>)</w:t>
+      </w:r>
+    </w:p>
+    <w:p>
+      <w:pPr>
+        <w:rPr>
+          <w:rFonts w:ascii="Arial" w:hAnsi="Arial" w:cs="Arial"/>
+          <w:lang w:val="es-ES" w:eastAsia="es-EC"/>
         </w:rPr>
       </w:pPr>
     </w:p>
@@ -6566,6 +7827,1278 @@
         <w:spacing w:after="0" w:line="240" w:lineRule="auto"/>
         <w:jc w:val="both"/>
         <w:rPr>
+          <w:rFonts w:ascii="Arial" w:hAnsi="Arial" w:cs="Arial"/>
+          <w:sz w:val="24"/>
+          <w:szCs w:val="24"/>
+          <w:lang w:eastAsia="es-EC"/>
+        </w:rPr>
+      </w:pPr>
+      <w:r>
+        <w:rPr>
+          <w:rFonts w:ascii="Arial" w:hAnsi="Arial" w:cs="Arial"/>
+          <w:b/>
+          <w:bCs/>
+          <w:sz w:val="24"/>
+          <w:szCs w:val="24"/>
+          <w:lang w:eastAsia="es-EC"/>
+        </w:rPr>
+        <w:t>Figura 10.</w:t>
+      </w:r>
+      <w:r>
+        <w:rPr>
+          <w:rFonts w:ascii="Arial" w:hAnsi="Arial" w:cs="Arial"/>
+          <w:sz w:val="24"/>
+          <w:szCs w:val="24"/>
+          <w:lang w:eastAsia="es-EC"/>
+        </w:rPr>
+        <w:t xml:space="preserve"> Historial de </w:t>
+      </w:r>
+      <w:proofErr w:type="spellStart"/>
+      <w:r>
+        <w:rPr>
+          <w:rFonts w:ascii="Arial" w:hAnsi="Arial" w:cs="Arial"/>
+          <w:sz w:val="24"/>
+          <w:szCs w:val="24"/>
+          <w:lang w:eastAsia="es-EC"/>
+        </w:rPr>
+        <w:t>commits</w:t>
+      </w:r>
+      <w:proofErr w:type="spellEnd"/>
+      <w:r>
+        <w:rPr>
+          <w:rFonts w:ascii="Arial" w:hAnsi="Arial" w:cs="Arial"/>
+          <w:sz w:val="24"/>
+          <w:szCs w:val="24"/>
+          <w:lang w:eastAsia="es-EC"/>
+        </w:rPr>
+        <w:t xml:space="preserve"> de la rama </w:t>
+      </w:r>
+      <w:proofErr w:type="spellStart"/>
+      <w:r>
+        <w:rPr>
+          <w:rFonts w:ascii="Arial" w:hAnsi="Arial" w:cs="Arial"/>
+          <w:sz w:val="24"/>
+          <w:szCs w:val="24"/>
+          <w:lang w:eastAsia="es-EC"/>
+        </w:rPr>
+        <w:t>develop</w:t>
+      </w:r>
+      <w:proofErr w:type="spellEnd"/>
+      <w:r>
+        <w:rPr>
+          <w:rFonts w:ascii="Arial" w:hAnsi="Arial" w:cs="Arial"/>
+          <w:sz w:val="24"/>
+          <w:szCs w:val="24"/>
+          <w:lang w:eastAsia="es-EC"/>
+        </w:rPr>
+        <w:t>.</w:t>
+      </w:r>
+    </w:p>
+    <w:p>
+      <w:pPr>
+        <w:widowControl w:val="0"/>
+        <w:pBdr>
+          <w:top w:val="nil"/>
+          <w:left w:val="nil"/>
+          <w:bottom w:val="nil"/>
+          <w:right w:val="nil"/>
+          <w:between w:val="nil"/>
+        </w:pBdr>
+        <w:spacing w:after="0" w:line="240" w:lineRule="auto"/>
+        <w:jc w:val="both"/>
+        <w:rPr>
+          <w:rFonts w:ascii="Arial" w:hAnsi="Arial" w:cs="Arial"/>
+          <w:sz w:val="24"/>
+          <w:szCs w:val="24"/>
+          <w:lang w:eastAsia="es-EC"/>
+        </w:rPr>
+      </w:pPr>
+    </w:p>
+    <w:p>
+      <w:pPr>
+        <w:widowControl w:val="0"/>
+        <w:pBdr>
+          <w:top w:val="nil"/>
+          <w:left w:val="nil"/>
+          <w:bottom w:val="nil"/>
+          <w:right w:val="nil"/>
+          <w:between w:val="nil"/>
+        </w:pBdr>
+        <w:spacing w:after="0" w:line="240" w:lineRule="auto"/>
+        <w:jc w:val="both"/>
+        <w:rPr>
+          <w:rFonts w:ascii="Arial" w:hAnsi="Arial" w:cs="Arial"/>
+          <w:sz w:val="24"/>
+          <w:szCs w:val="24"/>
+          <w:lang w:eastAsia="es-EC"/>
+        </w:rPr>
+      </w:pPr>
+      <w:r>
+        <w:rPr>
+          <w:rFonts w:ascii="Arial" w:hAnsi="Arial" w:cs="Arial"/>
+          <w:sz w:val="24"/>
+          <w:szCs w:val="24"/>
+          <w:lang w:eastAsia="es-EC"/>
+        </w:rPr>
+        <w:drawing>
+          <wp:anchor distT="0" distB="0" distL="114300" distR="114300" simplePos="0" relativeHeight="251676672" behindDoc="0" locked="0" layoutInCell="1" allowOverlap="1" wp14:anchorId="41069CD8" wp14:editId="284FD5AC">
+            <wp:simplePos x="0" y="0"/>
+            <wp:positionH relativeFrom="margin">
+              <wp:align>center</wp:align>
+            </wp:positionH>
+            <wp:positionV relativeFrom="paragraph">
+              <wp:posOffset>55017</wp:posOffset>
+            </wp:positionV>
+            <wp:extent cx="4411345" cy="4612640"/>
+            <wp:effectExtent l="19050" t="19050" r="27305" b="16510"/>
+            <wp:wrapSquare wrapText="bothSides"/>
+            <wp:docPr id="643016994" name="Imagen 1"/>
+            <wp:cNvGraphicFramePr>
+              <a:graphicFrameLocks xmlns:a="http://schemas.openxmlformats.org/drawingml/2006/main" noChangeAspect="1"/>
+            </wp:cNvGraphicFramePr>
+            <a:graphic xmlns:a="http://schemas.openxmlformats.org/drawingml/2006/main">
+              <a:graphicData uri="http://schemas.openxmlformats.org/drawingml/2006/picture">
+                <pic:pic xmlns:pic="http://schemas.openxmlformats.org/drawingml/2006/picture">
+                  <pic:nvPicPr>
+                    <pic:cNvPr id="643016994" name=""/>
+                    <pic:cNvPicPr/>
+                  </pic:nvPicPr>
+                  <pic:blipFill>
+                    <a:blip r:embed="rId26">
+                      <a:extLst>
+                        <a:ext uri="{28A0092B-C50C-407E-A947-70E740481C1C}">
+                          <a14:useLocalDpi xmlns:a14="http://schemas.microsoft.com/office/drawing/2010/main" val="0"/>
+                        </a:ext>
+                      </a:extLst>
+                    </a:blip>
+                    <a:stretch>
+                      <a:fillRect/>
+                    </a:stretch>
+                  </pic:blipFill>
+                  <pic:spPr>
+                    <a:xfrm>
+                      <a:off x="0" y="0"/>
+                      <a:ext cx="4411345" cy="4612640"/>
+                    </a:xfrm>
+                    <a:prstGeom prst="rect">
+                      <a:avLst/>
+                    </a:prstGeom>
+                    <a:ln>
+                      <a:solidFill>
+                        <a:schemeClr val="tx1"/>
+                      </a:solidFill>
+                    </a:ln>
+                  </pic:spPr>
+                </pic:pic>
+              </a:graphicData>
+            </a:graphic>
+            <wp14:sizeRelH relativeFrom="margin">
+              <wp14:pctWidth>0</wp14:pctWidth>
+            </wp14:sizeRelH>
+            <wp14:sizeRelV relativeFrom="margin">
+              <wp14:pctHeight>0</wp14:pctHeight>
+            </wp14:sizeRelV>
+          </wp:anchor>
+        </w:drawing>
+      </w:r>
+    </w:p>
+    <w:p>
+      <w:pPr>
+        <w:widowControl w:val="0"/>
+        <w:pBdr>
+          <w:top w:val="nil"/>
+          <w:left w:val="nil"/>
+          <w:bottom w:val="nil"/>
+          <w:right w:val="nil"/>
+          <w:between w:val="nil"/>
+        </w:pBdr>
+        <w:spacing w:after="0" w:line="240" w:lineRule="auto"/>
+        <w:jc w:val="both"/>
+        <w:rPr>
+          <w:rFonts w:ascii="Arial" w:hAnsi="Arial" w:cs="Arial"/>
+          <w:sz w:val="24"/>
+          <w:szCs w:val="24"/>
+          <w:lang w:eastAsia="es-EC"/>
+        </w:rPr>
+      </w:pPr>
+    </w:p>
+    <w:p>
+      <w:pPr>
+        <w:widowControl w:val="0"/>
+        <w:pBdr>
+          <w:top w:val="nil"/>
+          <w:left w:val="nil"/>
+          <w:bottom w:val="nil"/>
+          <w:right w:val="nil"/>
+          <w:between w:val="nil"/>
+        </w:pBdr>
+        <w:spacing w:after="0" w:line="240" w:lineRule="auto"/>
+        <w:jc w:val="both"/>
+        <w:rPr>
+          <w:rFonts w:ascii="Arial" w:hAnsi="Arial" w:cs="Arial"/>
+          <w:sz w:val="24"/>
+          <w:szCs w:val="24"/>
+          <w:lang w:eastAsia="es-EC"/>
+        </w:rPr>
+      </w:pPr>
+    </w:p>
+    <w:p>
+      <w:pPr>
+        <w:widowControl w:val="0"/>
+        <w:pBdr>
+          <w:top w:val="nil"/>
+          <w:left w:val="nil"/>
+          <w:bottom w:val="nil"/>
+          <w:right w:val="nil"/>
+          <w:between w:val="nil"/>
+        </w:pBdr>
+        <w:spacing w:after="0" w:line="240" w:lineRule="auto"/>
+        <w:jc w:val="both"/>
+        <w:rPr>
+          <w:rFonts w:ascii="Arial" w:hAnsi="Arial" w:cs="Arial"/>
+          <w:sz w:val="24"/>
+          <w:szCs w:val="24"/>
+          <w:lang w:eastAsia="es-EC"/>
+        </w:rPr>
+      </w:pPr>
+    </w:p>
+    <w:p>
+      <w:pPr>
+        <w:widowControl w:val="0"/>
+        <w:pBdr>
+          <w:top w:val="nil"/>
+          <w:left w:val="nil"/>
+          <w:bottom w:val="nil"/>
+          <w:right w:val="nil"/>
+          <w:between w:val="nil"/>
+        </w:pBdr>
+        <w:spacing w:after="0" w:line="240" w:lineRule="auto"/>
+        <w:jc w:val="both"/>
+        <w:rPr>
+          <w:rFonts w:ascii="Arial" w:hAnsi="Arial" w:cs="Arial"/>
+          <w:sz w:val="24"/>
+          <w:szCs w:val="24"/>
+          <w:lang w:eastAsia="es-EC"/>
+        </w:rPr>
+      </w:pPr>
+    </w:p>
+    <w:p>
+      <w:pPr>
+        <w:widowControl w:val="0"/>
+        <w:pBdr>
+          <w:top w:val="nil"/>
+          <w:left w:val="nil"/>
+          <w:bottom w:val="nil"/>
+          <w:right w:val="nil"/>
+          <w:between w:val="nil"/>
+        </w:pBdr>
+        <w:spacing w:after="0" w:line="240" w:lineRule="auto"/>
+        <w:jc w:val="both"/>
+        <w:rPr>
+          <w:rFonts w:ascii="Arial" w:hAnsi="Arial" w:cs="Arial"/>
+          <w:sz w:val="24"/>
+          <w:szCs w:val="24"/>
+          <w:lang w:eastAsia="es-EC"/>
+        </w:rPr>
+      </w:pPr>
+    </w:p>
+    <w:p>
+      <w:pPr>
+        <w:widowControl w:val="0"/>
+        <w:pBdr>
+          <w:top w:val="nil"/>
+          <w:left w:val="nil"/>
+          <w:bottom w:val="nil"/>
+          <w:right w:val="nil"/>
+          <w:between w:val="nil"/>
+        </w:pBdr>
+        <w:spacing w:after="0" w:line="240" w:lineRule="auto"/>
+        <w:jc w:val="both"/>
+        <w:rPr>
+          <w:rFonts w:ascii="Arial" w:hAnsi="Arial" w:cs="Arial"/>
+          <w:sz w:val="24"/>
+          <w:szCs w:val="24"/>
+          <w:lang w:eastAsia="es-EC"/>
+        </w:rPr>
+      </w:pPr>
+    </w:p>
+    <w:p>
+      <w:pPr>
+        <w:widowControl w:val="0"/>
+        <w:pBdr>
+          <w:top w:val="nil"/>
+          <w:left w:val="nil"/>
+          <w:bottom w:val="nil"/>
+          <w:right w:val="nil"/>
+          <w:between w:val="nil"/>
+        </w:pBdr>
+        <w:spacing w:after="0" w:line="240" w:lineRule="auto"/>
+        <w:jc w:val="both"/>
+        <w:rPr>
+          <w:rFonts w:ascii="Arial" w:hAnsi="Arial" w:cs="Arial"/>
+          <w:sz w:val="24"/>
+          <w:szCs w:val="24"/>
+          <w:lang w:eastAsia="es-EC"/>
+        </w:rPr>
+      </w:pPr>
+    </w:p>
+    <w:p>
+      <w:pPr>
+        <w:widowControl w:val="0"/>
+        <w:pBdr>
+          <w:top w:val="nil"/>
+          <w:left w:val="nil"/>
+          <w:bottom w:val="nil"/>
+          <w:right w:val="nil"/>
+          <w:between w:val="nil"/>
+        </w:pBdr>
+        <w:spacing w:after="0" w:line="240" w:lineRule="auto"/>
+        <w:jc w:val="both"/>
+        <w:rPr>
+          <w:rFonts w:ascii="Arial" w:hAnsi="Arial" w:cs="Arial"/>
+          <w:sz w:val="24"/>
+          <w:szCs w:val="24"/>
+          <w:lang w:eastAsia="es-EC"/>
+        </w:rPr>
+      </w:pPr>
+    </w:p>
+    <w:p>
+      <w:pPr>
+        <w:widowControl w:val="0"/>
+        <w:pBdr>
+          <w:top w:val="nil"/>
+          <w:left w:val="nil"/>
+          <w:bottom w:val="nil"/>
+          <w:right w:val="nil"/>
+          <w:between w:val="nil"/>
+        </w:pBdr>
+        <w:spacing w:after="0" w:line="240" w:lineRule="auto"/>
+        <w:jc w:val="both"/>
+        <w:rPr>
+          <w:rFonts w:ascii="Arial" w:hAnsi="Arial" w:cs="Arial"/>
+          <w:sz w:val="24"/>
+          <w:szCs w:val="24"/>
+          <w:lang w:eastAsia="es-EC"/>
+        </w:rPr>
+      </w:pPr>
+    </w:p>
+    <w:p>
+      <w:pPr>
+        <w:widowControl w:val="0"/>
+        <w:pBdr>
+          <w:top w:val="nil"/>
+          <w:left w:val="nil"/>
+          <w:bottom w:val="nil"/>
+          <w:right w:val="nil"/>
+          <w:between w:val="nil"/>
+        </w:pBdr>
+        <w:spacing w:after="0" w:line="240" w:lineRule="auto"/>
+        <w:jc w:val="both"/>
+        <w:rPr>
+          <w:rFonts w:ascii="Arial" w:hAnsi="Arial" w:cs="Arial"/>
+          <w:sz w:val="24"/>
+          <w:szCs w:val="24"/>
+          <w:lang w:eastAsia="es-EC"/>
+        </w:rPr>
+      </w:pPr>
+    </w:p>
+    <w:p>
+      <w:pPr>
+        <w:widowControl w:val="0"/>
+        <w:pBdr>
+          <w:top w:val="nil"/>
+          <w:left w:val="nil"/>
+          <w:bottom w:val="nil"/>
+          <w:right w:val="nil"/>
+          <w:between w:val="nil"/>
+        </w:pBdr>
+        <w:spacing w:after="0" w:line="240" w:lineRule="auto"/>
+        <w:jc w:val="both"/>
+        <w:rPr>
+          <w:rFonts w:ascii="Arial" w:hAnsi="Arial" w:cs="Arial"/>
+          <w:sz w:val="24"/>
+          <w:szCs w:val="24"/>
+          <w:lang w:eastAsia="es-EC"/>
+        </w:rPr>
+      </w:pPr>
+    </w:p>
+    <w:p>
+      <w:pPr>
+        <w:widowControl w:val="0"/>
+        <w:pBdr>
+          <w:top w:val="nil"/>
+          <w:left w:val="nil"/>
+          <w:bottom w:val="nil"/>
+          <w:right w:val="nil"/>
+          <w:between w:val="nil"/>
+        </w:pBdr>
+        <w:spacing w:after="0" w:line="240" w:lineRule="auto"/>
+        <w:jc w:val="both"/>
+        <w:rPr>
+          <w:rFonts w:ascii="Arial" w:hAnsi="Arial" w:cs="Arial"/>
+          <w:sz w:val="24"/>
+          <w:szCs w:val="24"/>
+          <w:lang w:eastAsia="es-EC"/>
+        </w:rPr>
+      </w:pPr>
+    </w:p>
+    <w:p>
+      <w:pPr>
+        <w:widowControl w:val="0"/>
+        <w:pBdr>
+          <w:top w:val="nil"/>
+          <w:left w:val="nil"/>
+          <w:bottom w:val="nil"/>
+          <w:right w:val="nil"/>
+          <w:between w:val="nil"/>
+        </w:pBdr>
+        <w:spacing w:after="0" w:line="240" w:lineRule="auto"/>
+        <w:jc w:val="both"/>
+        <w:rPr>
+          <w:rFonts w:ascii="Arial" w:hAnsi="Arial" w:cs="Arial"/>
+          <w:sz w:val="24"/>
+          <w:szCs w:val="24"/>
+          <w:lang w:eastAsia="es-EC"/>
+        </w:rPr>
+      </w:pPr>
+    </w:p>
+    <w:p>
+      <w:pPr>
+        <w:widowControl w:val="0"/>
+        <w:pBdr>
+          <w:top w:val="nil"/>
+          <w:left w:val="nil"/>
+          <w:bottom w:val="nil"/>
+          <w:right w:val="nil"/>
+          <w:between w:val="nil"/>
+        </w:pBdr>
+        <w:spacing w:after="0" w:line="240" w:lineRule="auto"/>
+        <w:jc w:val="both"/>
+        <w:rPr>
+          <w:rFonts w:ascii="Arial" w:hAnsi="Arial" w:cs="Arial"/>
+          <w:sz w:val="24"/>
+          <w:szCs w:val="24"/>
+          <w:lang w:eastAsia="es-EC"/>
+        </w:rPr>
+      </w:pPr>
+    </w:p>
+    <w:p>
+      <w:pPr>
+        <w:widowControl w:val="0"/>
+        <w:pBdr>
+          <w:top w:val="nil"/>
+          <w:left w:val="nil"/>
+          <w:bottom w:val="nil"/>
+          <w:right w:val="nil"/>
+          <w:between w:val="nil"/>
+        </w:pBdr>
+        <w:spacing w:after="0" w:line="240" w:lineRule="auto"/>
+        <w:jc w:val="both"/>
+        <w:rPr>
+          <w:rFonts w:ascii="Arial" w:hAnsi="Arial" w:cs="Arial"/>
+          <w:sz w:val="24"/>
+          <w:szCs w:val="24"/>
+          <w:lang w:eastAsia="es-EC"/>
+        </w:rPr>
+      </w:pPr>
+    </w:p>
+    <w:p>
+      <w:pPr>
+        <w:widowControl w:val="0"/>
+        <w:pBdr>
+          <w:top w:val="nil"/>
+          <w:left w:val="nil"/>
+          <w:bottom w:val="nil"/>
+          <w:right w:val="nil"/>
+          <w:between w:val="nil"/>
+        </w:pBdr>
+        <w:spacing w:after="0" w:line="240" w:lineRule="auto"/>
+        <w:jc w:val="both"/>
+        <w:rPr>
+          <w:rFonts w:ascii="Arial" w:hAnsi="Arial" w:cs="Arial"/>
+          <w:sz w:val="24"/>
+          <w:szCs w:val="24"/>
+          <w:lang w:eastAsia="es-EC"/>
+        </w:rPr>
+      </w:pPr>
+    </w:p>
+    <w:p>
+      <w:pPr>
+        <w:widowControl w:val="0"/>
+        <w:pBdr>
+          <w:top w:val="nil"/>
+          <w:left w:val="nil"/>
+          <w:bottom w:val="nil"/>
+          <w:right w:val="nil"/>
+          <w:between w:val="nil"/>
+        </w:pBdr>
+        <w:spacing w:after="0" w:line="240" w:lineRule="auto"/>
+        <w:jc w:val="both"/>
+        <w:rPr>
+          <w:rFonts w:ascii="Arial" w:hAnsi="Arial" w:cs="Arial"/>
+          <w:sz w:val="24"/>
+          <w:szCs w:val="24"/>
+          <w:lang w:eastAsia="es-EC"/>
+        </w:rPr>
+      </w:pPr>
+    </w:p>
+    <w:p>
+      <w:pPr>
+        <w:widowControl w:val="0"/>
+        <w:pBdr>
+          <w:top w:val="nil"/>
+          <w:left w:val="nil"/>
+          <w:bottom w:val="nil"/>
+          <w:right w:val="nil"/>
+          <w:between w:val="nil"/>
+        </w:pBdr>
+        <w:spacing w:after="0" w:line="240" w:lineRule="auto"/>
+        <w:jc w:val="both"/>
+        <w:rPr>
+          <w:rFonts w:ascii="Arial" w:hAnsi="Arial" w:cs="Arial"/>
+          <w:sz w:val="24"/>
+          <w:szCs w:val="24"/>
+          <w:lang w:eastAsia="es-EC"/>
+        </w:rPr>
+      </w:pPr>
+    </w:p>
+    <w:p>
+      <w:pPr>
+        <w:widowControl w:val="0"/>
+        <w:pBdr>
+          <w:top w:val="nil"/>
+          <w:left w:val="nil"/>
+          <w:bottom w:val="nil"/>
+          <w:right w:val="nil"/>
+          <w:between w:val="nil"/>
+        </w:pBdr>
+        <w:spacing w:after="0" w:line="240" w:lineRule="auto"/>
+        <w:jc w:val="both"/>
+        <w:rPr>
+          <w:rFonts w:ascii="Arial" w:hAnsi="Arial" w:cs="Arial"/>
+          <w:sz w:val="24"/>
+          <w:szCs w:val="24"/>
+          <w:lang w:eastAsia="es-EC"/>
+        </w:rPr>
+      </w:pPr>
+    </w:p>
+    <w:p>
+      <w:pPr>
+        <w:widowControl w:val="0"/>
+        <w:pBdr>
+          <w:top w:val="nil"/>
+          <w:left w:val="nil"/>
+          <w:bottom w:val="nil"/>
+          <w:right w:val="nil"/>
+          <w:between w:val="nil"/>
+        </w:pBdr>
+        <w:spacing w:after="0" w:line="240" w:lineRule="auto"/>
+        <w:jc w:val="both"/>
+        <w:rPr>
+          <w:rFonts w:ascii="Arial" w:hAnsi="Arial" w:cs="Arial"/>
+          <w:sz w:val="24"/>
+          <w:szCs w:val="24"/>
+          <w:lang w:eastAsia="es-EC"/>
+        </w:rPr>
+      </w:pPr>
+    </w:p>
+    <w:p>
+      <w:pPr>
+        <w:widowControl w:val="0"/>
+        <w:pBdr>
+          <w:top w:val="nil"/>
+          <w:left w:val="nil"/>
+          <w:bottom w:val="nil"/>
+          <w:right w:val="nil"/>
+          <w:between w:val="nil"/>
+        </w:pBdr>
+        <w:spacing w:after="0" w:line="240" w:lineRule="auto"/>
+        <w:jc w:val="both"/>
+        <w:rPr>
+          <w:rFonts w:ascii="Arial" w:hAnsi="Arial" w:cs="Arial"/>
+          <w:sz w:val="24"/>
+          <w:szCs w:val="24"/>
+          <w:lang w:eastAsia="es-EC"/>
+        </w:rPr>
+      </w:pPr>
+    </w:p>
+    <w:p>
+      <w:pPr>
+        <w:widowControl w:val="0"/>
+        <w:pBdr>
+          <w:top w:val="nil"/>
+          <w:left w:val="nil"/>
+          <w:bottom w:val="nil"/>
+          <w:right w:val="nil"/>
+          <w:between w:val="nil"/>
+        </w:pBdr>
+        <w:spacing w:after="0" w:line="240" w:lineRule="auto"/>
+        <w:jc w:val="both"/>
+        <w:rPr>
+          <w:rFonts w:ascii="Arial" w:hAnsi="Arial" w:cs="Arial"/>
+          <w:sz w:val="24"/>
+          <w:szCs w:val="24"/>
+          <w:lang w:eastAsia="es-EC"/>
+        </w:rPr>
+      </w:pPr>
+    </w:p>
+    <w:p>
+      <w:pPr>
+        <w:widowControl w:val="0"/>
+        <w:pBdr>
+          <w:top w:val="nil"/>
+          <w:left w:val="nil"/>
+          <w:bottom w:val="nil"/>
+          <w:right w:val="nil"/>
+          <w:between w:val="nil"/>
+        </w:pBdr>
+        <w:spacing w:after="0" w:line="240" w:lineRule="auto"/>
+        <w:jc w:val="both"/>
+        <w:rPr>
+          <w:rFonts w:ascii="Arial" w:hAnsi="Arial" w:cs="Arial"/>
+          <w:sz w:val="24"/>
+          <w:szCs w:val="24"/>
+          <w:lang w:eastAsia="es-EC"/>
+        </w:rPr>
+      </w:pPr>
+    </w:p>
+    <w:p>
+      <w:pPr>
+        <w:widowControl w:val="0"/>
+        <w:pBdr>
+          <w:top w:val="nil"/>
+          <w:left w:val="nil"/>
+          <w:bottom w:val="nil"/>
+          <w:right w:val="nil"/>
+          <w:between w:val="nil"/>
+        </w:pBdr>
+        <w:spacing w:after="0" w:line="240" w:lineRule="auto"/>
+        <w:jc w:val="both"/>
+        <w:rPr>
+          <w:rFonts w:ascii="Arial" w:hAnsi="Arial" w:cs="Arial"/>
+          <w:sz w:val="24"/>
+          <w:szCs w:val="24"/>
+          <w:lang w:eastAsia="es-EC"/>
+        </w:rPr>
+      </w:pPr>
+    </w:p>
+    <w:p>
+      <w:pPr>
+        <w:widowControl w:val="0"/>
+        <w:pBdr>
+          <w:top w:val="nil"/>
+          <w:left w:val="nil"/>
+          <w:bottom w:val="nil"/>
+          <w:right w:val="nil"/>
+          <w:between w:val="nil"/>
+        </w:pBdr>
+        <w:spacing w:after="0" w:line="240" w:lineRule="auto"/>
+        <w:jc w:val="both"/>
+        <w:rPr>
+          <w:rFonts w:ascii="Arial" w:hAnsi="Arial" w:cs="Arial"/>
+          <w:sz w:val="24"/>
+          <w:szCs w:val="24"/>
+          <w:lang w:eastAsia="es-EC"/>
+        </w:rPr>
+      </w:pPr>
+    </w:p>
+    <w:p>
+      <w:pPr>
+        <w:widowControl w:val="0"/>
+        <w:pBdr>
+          <w:top w:val="nil"/>
+          <w:left w:val="nil"/>
+          <w:bottom w:val="nil"/>
+          <w:right w:val="nil"/>
+          <w:between w:val="nil"/>
+        </w:pBdr>
+        <w:spacing w:after="0" w:line="240" w:lineRule="auto"/>
+        <w:jc w:val="both"/>
+        <w:rPr>
+          <w:rFonts w:ascii="Arial" w:hAnsi="Arial" w:cs="Arial"/>
+          <w:sz w:val="24"/>
+          <w:szCs w:val="24"/>
+          <w:lang w:eastAsia="es-EC"/>
+        </w:rPr>
+      </w:pPr>
+    </w:p>
+    <w:p>
+      <w:pPr>
+        <w:widowControl w:val="0"/>
+        <w:pBdr>
+          <w:top w:val="nil"/>
+          <w:left w:val="nil"/>
+          <w:bottom w:val="nil"/>
+          <w:right w:val="nil"/>
+          <w:between w:val="nil"/>
+        </w:pBdr>
+        <w:spacing w:after="0" w:line="240" w:lineRule="auto"/>
+        <w:jc w:val="both"/>
+        <w:rPr>
+          <w:rFonts w:ascii="Arial" w:hAnsi="Arial" w:cs="Arial"/>
+          <w:sz w:val="24"/>
+          <w:szCs w:val="24"/>
+          <w:lang w:eastAsia="es-EC"/>
+        </w:rPr>
+      </w:pPr>
+    </w:p>
+    <w:p>
+      <w:pPr>
+        <w:widowControl w:val="0"/>
+        <w:pBdr>
+          <w:top w:val="nil"/>
+          <w:left w:val="nil"/>
+          <w:bottom w:val="nil"/>
+          <w:right w:val="nil"/>
+          <w:between w:val="nil"/>
+        </w:pBdr>
+        <w:spacing w:after="0" w:line="240" w:lineRule="auto"/>
+        <w:jc w:val="both"/>
+        <w:rPr>
+          <w:rFonts w:ascii="Arial" w:hAnsi="Arial" w:cs="Arial"/>
+          <w:sz w:val="24"/>
+          <w:szCs w:val="24"/>
+          <w:lang w:eastAsia="es-EC"/>
+        </w:rPr>
+      </w:pPr>
+      <w:r>
+        <w:rPr>
+          <w:rFonts w:ascii="Arial" w:hAnsi="Arial" w:cs="Arial"/>
+          <w:b/>
+          <w:bCs/>
+          <w:sz w:val="24"/>
+          <w:szCs w:val="24"/>
+          <w:lang w:eastAsia="es-EC"/>
+        </w:rPr>
+        <w:lastRenderedPageBreak/>
+        <w:drawing>
+          <wp:anchor distT="0" distB="0" distL="114300" distR="114300" simplePos="0" relativeHeight="251677696" behindDoc="0" locked="0" layoutInCell="1" allowOverlap="1" wp14:anchorId="4E2E75BD" wp14:editId="0E86145E">
+            <wp:simplePos x="0" y="0"/>
+            <wp:positionH relativeFrom="column">
+              <wp:posOffset>-29200</wp:posOffset>
+            </wp:positionH>
+            <wp:positionV relativeFrom="paragraph">
+              <wp:posOffset>447628</wp:posOffset>
+            </wp:positionV>
+            <wp:extent cx="5400040" cy="1368425"/>
+            <wp:effectExtent l="19050" t="19050" r="10160" b="22225"/>
+            <wp:wrapSquare wrapText="bothSides"/>
+            <wp:docPr id="1706633217" name="Imagen 1"/>
+            <wp:cNvGraphicFramePr>
+              <a:graphicFrameLocks xmlns:a="http://schemas.openxmlformats.org/drawingml/2006/main" noChangeAspect="1"/>
+            </wp:cNvGraphicFramePr>
+            <a:graphic xmlns:a="http://schemas.openxmlformats.org/drawingml/2006/main">
+              <a:graphicData uri="http://schemas.openxmlformats.org/drawingml/2006/picture">
+                <pic:pic xmlns:pic="http://schemas.openxmlformats.org/drawingml/2006/picture">
+                  <pic:nvPicPr>
+                    <pic:cNvPr id="1706633217" name=""/>
+                    <pic:cNvPicPr/>
+                  </pic:nvPicPr>
+                  <pic:blipFill>
+                    <a:blip r:embed="rId27">
+                      <a:extLst>
+                        <a:ext uri="{28A0092B-C50C-407E-A947-70E740481C1C}">
+                          <a14:useLocalDpi xmlns:a14="http://schemas.microsoft.com/office/drawing/2010/main" val="0"/>
+                        </a:ext>
+                      </a:extLst>
+                    </a:blip>
+                    <a:stretch>
+                      <a:fillRect/>
+                    </a:stretch>
+                  </pic:blipFill>
+                  <pic:spPr>
+                    <a:xfrm>
+                      <a:off x="0" y="0"/>
+                      <a:ext cx="5400040" cy="1368425"/>
+                    </a:xfrm>
+                    <a:prstGeom prst="rect">
+                      <a:avLst/>
+                    </a:prstGeom>
+                    <a:ln>
+                      <a:solidFill>
+                        <a:schemeClr val="tx1"/>
+                      </a:solidFill>
+                    </a:ln>
+                  </pic:spPr>
+                </pic:pic>
+              </a:graphicData>
+            </a:graphic>
+          </wp:anchor>
+        </w:drawing>
+      </w:r>
+      <w:r>
+        <w:rPr>
+          <w:rFonts w:ascii="Arial" w:hAnsi="Arial" w:cs="Arial"/>
+          <w:b/>
+          <w:bCs/>
+          <w:sz w:val="24"/>
+          <w:szCs w:val="24"/>
+          <w:lang w:eastAsia="es-EC"/>
+        </w:rPr>
+        <w:t>F</w:t>
+      </w:r>
+      <w:r>
+        <w:rPr>
+          <w:rFonts w:ascii="Arial" w:hAnsi="Arial" w:cs="Arial"/>
+          <w:b/>
+          <w:bCs/>
+          <w:sz w:val="24"/>
+          <w:szCs w:val="24"/>
+          <w:lang w:eastAsia="es-EC"/>
+        </w:rPr>
+        <w:t xml:space="preserve">igura 11. </w:t>
+      </w:r>
+      <w:r>
+        <w:rPr>
+          <w:rFonts w:ascii="Arial" w:hAnsi="Arial" w:cs="Arial"/>
+          <w:sz w:val="24"/>
+          <w:szCs w:val="24"/>
+          <w:lang w:eastAsia="es-EC"/>
+        </w:rPr>
+        <w:t xml:space="preserve">Pull </w:t>
+      </w:r>
+      <w:proofErr w:type="spellStart"/>
+      <w:r>
+        <w:rPr>
+          <w:rFonts w:ascii="Arial" w:hAnsi="Arial" w:cs="Arial"/>
+          <w:sz w:val="24"/>
+          <w:szCs w:val="24"/>
+          <w:lang w:eastAsia="es-EC"/>
+        </w:rPr>
+        <w:t>Requests</w:t>
+      </w:r>
+      <w:proofErr w:type="spellEnd"/>
+      <w:r>
+        <w:rPr>
+          <w:rFonts w:ascii="Arial" w:hAnsi="Arial" w:cs="Arial"/>
+          <w:sz w:val="24"/>
+          <w:szCs w:val="24"/>
+          <w:lang w:eastAsia="es-EC"/>
+        </w:rPr>
+        <w:t xml:space="preserve"> cerrados. Integraciones #1 (</w:t>
+      </w:r>
+      <w:proofErr w:type="spellStart"/>
+      <w:r>
+        <w:rPr>
+          <w:rFonts w:ascii="Arial" w:hAnsi="Arial" w:cs="Arial"/>
+          <w:sz w:val="24"/>
+          <w:szCs w:val="24"/>
+          <w:lang w:eastAsia="es-EC"/>
+        </w:rPr>
+        <w:t>feature→develop</w:t>
+      </w:r>
+      <w:proofErr w:type="spellEnd"/>
+      <w:r>
+        <w:rPr>
+          <w:rFonts w:ascii="Arial" w:hAnsi="Arial" w:cs="Arial"/>
+          <w:sz w:val="24"/>
+          <w:szCs w:val="24"/>
+          <w:lang w:eastAsia="es-EC"/>
+        </w:rPr>
+        <w:t>) y #2 (</w:t>
+      </w:r>
+      <w:proofErr w:type="spellStart"/>
+      <w:r>
+        <w:rPr>
+          <w:rFonts w:ascii="Arial" w:hAnsi="Arial" w:cs="Arial"/>
+          <w:sz w:val="24"/>
+          <w:szCs w:val="24"/>
+          <w:lang w:eastAsia="es-EC"/>
+        </w:rPr>
+        <w:t>develop→main</w:t>
+      </w:r>
+      <w:proofErr w:type="spellEnd"/>
+      <w:r>
+        <w:rPr>
+          <w:rFonts w:ascii="Arial" w:hAnsi="Arial" w:cs="Arial"/>
+          <w:sz w:val="24"/>
+          <w:szCs w:val="24"/>
+          <w:lang w:eastAsia="es-EC"/>
+        </w:rPr>
+        <w:t>)</w:t>
+      </w:r>
+    </w:p>
+    <w:p>
+      <w:pPr>
+        <w:widowControl w:val="0"/>
+        <w:pBdr>
+          <w:top w:val="nil"/>
+          <w:left w:val="nil"/>
+          <w:bottom w:val="nil"/>
+          <w:right w:val="nil"/>
+          <w:between w:val="nil"/>
+        </w:pBdr>
+        <w:spacing w:after="0" w:line="240" w:lineRule="auto"/>
+        <w:jc w:val="both"/>
+        <w:rPr>
+          <w:rFonts w:ascii="Arial" w:hAnsi="Arial" w:cs="Arial"/>
+          <w:b/>
+          <w:bCs/>
+          <w:sz w:val="24"/>
+          <w:szCs w:val="24"/>
+          <w:lang w:eastAsia="es-EC"/>
+        </w:rPr>
+      </w:pPr>
+    </w:p>
+    <w:p>
+      <w:pPr>
+        <w:widowControl w:val="0"/>
+        <w:pBdr>
+          <w:top w:val="nil"/>
+          <w:left w:val="nil"/>
+          <w:bottom w:val="nil"/>
+          <w:right w:val="nil"/>
+          <w:between w:val="nil"/>
+        </w:pBdr>
+        <w:spacing w:after="0" w:line="240" w:lineRule="auto"/>
+        <w:jc w:val="both"/>
+        <w:rPr>
+          <w:rFonts w:ascii="Arial" w:hAnsi="Arial" w:cs="Arial"/>
+          <w:b/>
+          <w:bCs/>
+          <w:sz w:val="24"/>
+          <w:szCs w:val="24"/>
+          <w:lang w:eastAsia="es-EC"/>
+        </w:rPr>
+      </w:pPr>
+      <w:r>
+        <w:rPr>
+          <w:rFonts w:ascii="Arial" w:hAnsi="Arial" w:cs="Arial"/>
+          <w:b/>
+          <w:bCs/>
+          <w:sz w:val="24"/>
+          <w:szCs w:val="24"/>
+          <w:lang w:eastAsia="es-EC"/>
+        </w:rPr>
+        <w:t xml:space="preserve">Figura 12. </w:t>
+      </w:r>
+      <w:r>
+        <w:rPr>
+          <w:rFonts w:ascii="Arial" w:hAnsi="Arial" w:cs="Arial"/>
+          <w:sz w:val="24"/>
+          <w:szCs w:val="24"/>
+          <w:lang w:eastAsia="es-EC"/>
+        </w:rPr>
+        <w:t xml:space="preserve">Confirmación de fusión del Pull </w:t>
+      </w:r>
+      <w:proofErr w:type="spellStart"/>
+      <w:r>
+        <w:rPr>
+          <w:rFonts w:ascii="Arial" w:hAnsi="Arial" w:cs="Arial"/>
+          <w:sz w:val="24"/>
+          <w:szCs w:val="24"/>
+          <w:lang w:eastAsia="es-EC"/>
+        </w:rPr>
+        <w:t>Request</w:t>
+      </w:r>
+      <w:proofErr w:type="spellEnd"/>
+      <w:r>
+        <w:rPr>
+          <w:rFonts w:ascii="Arial" w:hAnsi="Arial" w:cs="Arial"/>
+          <w:sz w:val="24"/>
+          <w:szCs w:val="24"/>
+          <w:lang w:eastAsia="es-EC"/>
+        </w:rPr>
+        <w:t xml:space="preserve"> #2.</w:t>
+      </w:r>
+    </w:p>
+    <w:p>
+      <w:pPr>
+        <w:widowControl w:val="0"/>
+        <w:pBdr>
+          <w:top w:val="nil"/>
+          <w:left w:val="nil"/>
+          <w:bottom w:val="nil"/>
+          <w:right w:val="nil"/>
+          <w:between w:val="nil"/>
+        </w:pBdr>
+        <w:spacing w:after="0" w:line="240" w:lineRule="auto"/>
+        <w:jc w:val="both"/>
+        <w:rPr>
+          <w:rFonts w:ascii="Arial" w:hAnsi="Arial" w:cs="Arial"/>
+          <w:b/>
+          <w:bCs/>
+          <w:sz w:val="24"/>
+          <w:szCs w:val="24"/>
+          <w:lang w:eastAsia="es-EC"/>
+        </w:rPr>
+      </w:pPr>
+      <w:r>
+        <w:rPr>
+          <w:rFonts w:ascii="Arial" w:hAnsi="Arial" w:cs="Arial"/>
+          <w:b/>
+          <w:bCs/>
+          <w:sz w:val="24"/>
+          <w:szCs w:val="24"/>
+          <w:lang w:eastAsia="es-EC"/>
+        </w:rPr>
+        <w:drawing>
+          <wp:anchor distT="0" distB="0" distL="114300" distR="114300" simplePos="0" relativeHeight="251678720" behindDoc="0" locked="0" layoutInCell="1" allowOverlap="1" wp14:anchorId="01465B29" wp14:editId="77B6EB1F">
+            <wp:simplePos x="0" y="0"/>
+            <wp:positionH relativeFrom="margin">
+              <wp:align>right</wp:align>
+            </wp:positionH>
+            <wp:positionV relativeFrom="paragraph">
+              <wp:posOffset>252095</wp:posOffset>
+            </wp:positionV>
+            <wp:extent cx="5400040" cy="4336415"/>
+            <wp:effectExtent l="19050" t="19050" r="10160" b="26035"/>
+            <wp:wrapSquare wrapText="bothSides"/>
+            <wp:docPr id="413393062" name="Imagen 1"/>
+            <wp:cNvGraphicFramePr>
+              <a:graphicFrameLocks xmlns:a="http://schemas.openxmlformats.org/drawingml/2006/main" noChangeAspect="1"/>
+            </wp:cNvGraphicFramePr>
+            <a:graphic xmlns:a="http://schemas.openxmlformats.org/drawingml/2006/main">
+              <a:graphicData uri="http://schemas.openxmlformats.org/drawingml/2006/picture">
+                <pic:pic xmlns:pic="http://schemas.openxmlformats.org/drawingml/2006/picture">
+                  <pic:nvPicPr>
+                    <pic:cNvPr id="413393062" name=""/>
+                    <pic:cNvPicPr/>
+                  </pic:nvPicPr>
+                  <pic:blipFill>
+                    <a:blip r:embed="rId28">
+                      <a:extLst>
+                        <a:ext uri="{28A0092B-C50C-407E-A947-70E740481C1C}">
+                          <a14:useLocalDpi xmlns:a14="http://schemas.microsoft.com/office/drawing/2010/main" val="0"/>
+                        </a:ext>
+                      </a:extLst>
+                    </a:blip>
+                    <a:stretch>
+                      <a:fillRect/>
+                    </a:stretch>
+                  </pic:blipFill>
+                  <pic:spPr>
+                    <a:xfrm>
+                      <a:off x="0" y="0"/>
+                      <a:ext cx="5400040" cy="4336415"/>
+                    </a:xfrm>
+                    <a:prstGeom prst="rect">
+                      <a:avLst/>
+                    </a:prstGeom>
+                    <a:ln>
+                      <a:solidFill>
+                        <a:schemeClr val="tx1"/>
+                      </a:solidFill>
+                    </a:ln>
+                  </pic:spPr>
+                </pic:pic>
+              </a:graphicData>
+            </a:graphic>
+          </wp:anchor>
+        </w:drawing>
+      </w:r>
+    </w:p>
+    <w:p>
+      <w:pPr>
+        <w:widowControl w:val="0"/>
+        <w:pBdr>
+          <w:top w:val="nil"/>
+          <w:left w:val="nil"/>
+          <w:bottom w:val="nil"/>
+          <w:right w:val="nil"/>
+          <w:between w:val="nil"/>
+        </w:pBdr>
+        <w:spacing w:after="0" w:line="240" w:lineRule="auto"/>
+        <w:jc w:val="both"/>
+        <w:rPr>
+          <w:rFonts w:ascii="Arial" w:hAnsi="Arial" w:cs="Arial"/>
+          <w:b/>
+          <w:bCs/>
+          <w:sz w:val="24"/>
+          <w:szCs w:val="24"/>
+          <w:lang w:eastAsia="es-EC"/>
+        </w:rPr>
+      </w:pPr>
+    </w:p>
+    <w:p>
+      <w:pPr>
+        <w:widowControl w:val="0"/>
+        <w:pBdr>
+          <w:top w:val="nil"/>
+          <w:left w:val="nil"/>
+          <w:bottom w:val="nil"/>
+          <w:right w:val="nil"/>
+          <w:between w:val="nil"/>
+        </w:pBdr>
+        <w:spacing w:after="0" w:line="240" w:lineRule="auto"/>
+        <w:jc w:val="both"/>
+        <w:rPr>
+          <w:rFonts w:ascii="Arial" w:hAnsi="Arial" w:cs="Arial"/>
+          <w:b/>
+          <w:bCs/>
+          <w:sz w:val="24"/>
+          <w:szCs w:val="24"/>
+          <w:lang w:eastAsia="es-EC"/>
+        </w:rPr>
+      </w:pPr>
+    </w:p>
+    <w:p>
+      <w:pPr>
+        <w:widowControl w:val="0"/>
+        <w:pBdr>
+          <w:top w:val="nil"/>
+          <w:left w:val="nil"/>
+          <w:bottom w:val="nil"/>
+          <w:right w:val="nil"/>
+          <w:between w:val="nil"/>
+        </w:pBdr>
+        <w:spacing w:after="0" w:line="240" w:lineRule="auto"/>
+        <w:jc w:val="both"/>
+        <w:rPr>
+          <w:rFonts w:ascii="Arial" w:hAnsi="Arial" w:cs="Arial"/>
+          <w:b/>
+          <w:bCs/>
+          <w:sz w:val="24"/>
+          <w:szCs w:val="24"/>
+          <w:lang w:eastAsia="es-EC"/>
+        </w:rPr>
+      </w:pPr>
+    </w:p>
+    <w:p>
+      <w:pPr>
+        <w:widowControl w:val="0"/>
+        <w:pBdr>
+          <w:top w:val="nil"/>
+          <w:left w:val="nil"/>
+          <w:bottom w:val="nil"/>
+          <w:right w:val="nil"/>
+          <w:between w:val="nil"/>
+        </w:pBdr>
+        <w:spacing w:after="0" w:line="240" w:lineRule="auto"/>
+        <w:jc w:val="both"/>
+        <w:rPr>
+          <w:rFonts w:ascii="Arial" w:hAnsi="Arial" w:cs="Arial"/>
+          <w:b/>
+          <w:bCs/>
+          <w:sz w:val="24"/>
+          <w:szCs w:val="24"/>
+          <w:lang w:eastAsia="es-EC"/>
+        </w:rPr>
+      </w:pPr>
+    </w:p>
+    <w:p>
+      <w:pPr>
+        <w:widowControl w:val="0"/>
+        <w:pBdr>
+          <w:top w:val="nil"/>
+          <w:left w:val="nil"/>
+          <w:bottom w:val="nil"/>
+          <w:right w:val="nil"/>
+          <w:between w:val="nil"/>
+        </w:pBdr>
+        <w:spacing w:after="0" w:line="240" w:lineRule="auto"/>
+        <w:jc w:val="both"/>
+        <w:rPr>
+          <w:rFonts w:ascii="Arial" w:hAnsi="Arial" w:cs="Arial"/>
+          <w:b/>
+          <w:bCs/>
+          <w:sz w:val="24"/>
+          <w:szCs w:val="24"/>
+          <w:lang w:eastAsia="es-EC"/>
+        </w:rPr>
+      </w:pPr>
+    </w:p>
+    <w:p>
+      <w:pPr>
+        <w:widowControl w:val="0"/>
+        <w:pBdr>
+          <w:top w:val="nil"/>
+          <w:left w:val="nil"/>
+          <w:bottom w:val="nil"/>
+          <w:right w:val="nil"/>
+          <w:between w:val="nil"/>
+        </w:pBdr>
+        <w:spacing w:after="0" w:line="240" w:lineRule="auto"/>
+        <w:jc w:val="both"/>
+        <w:rPr>
+          <w:rFonts w:ascii="Arial" w:hAnsi="Arial" w:cs="Arial"/>
+          <w:b/>
+          <w:bCs/>
+          <w:sz w:val="24"/>
+          <w:szCs w:val="24"/>
+          <w:lang w:eastAsia="es-EC"/>
+        </w:rPr>
+      </w:pPr>
+    </w:p>
+    <w:p>
+      <w:pPr>
+        <w:widowControl w:val="0"/>
+        <w:pBdr>
+          <w:top w:val="nil"/>
+          <w:left w:val="nil"/>
+          <w:bottom w:val="nil"/>
+          <w:right w:val="nil"/>
+          <w:between w:val="nil"/>
+        </w:pBdr>
+        <w:spacing w:after="0" w:line="240" w:lineRule="auto"/>
+        <w:jc w:val="both"/>
+        <w:rPr>
+          <w:rFonts w:ascii="Arial" w:hAnsi="Arial" w:cs="Arial"/>
+          <w:b/>
+          <w:bCs/>
+          <w:sz w:val="24"/>
+          <w:szCs w:val="24"/>
+          <w:lang w:eastAsia="es-EC"/>
+        </w:rPr>
+      </w:pPr>
+    </w:p>
+    <w:p>
+      <w:pPr>
+        <w:widowControl w:val="0"/>
+        <w:pBdr>
+          <w:top w:val="nil"/>
+          <w:left w:val="nil"/>
+          <w:bottom w:val="nil"/>
+          <w:right w:val="nil"/>
+          <w:between w:val="nil"/>
+        </w:pBdr>
+        <w:spacing w:after="0" w:line="240" w:lineRule="auto"/>
+        <w:jc w:val="both"/>
+        <w:rPr>
+          <w:rFonts w:ascii="Arial" w:hAnsi="Arial" w:cs="Arial"/>
+          <w:b/>
+          <w:bCs/>
+          <w:sz w:val="24"/>
+          <w:szCs w:val="24"/>
+          <w:lang w:eastAsia="es-EC"/>
+        </w:rPr>
+      </w:pPr>
+    </w:p>
+    <w:p>
+      <w:pPr>
+        <w:widowControl w:val="0"/>
+        <w:pBdr>
+          <w:top w:val="nil"/>
+          <w:left w:val="nil"/>
+          <w:bottom w:val="nil"/>
+          <w:right w:val="nil"/>
+          <w:between w:val="nil"/>
+        </w:pBdr>
+        <w:spacing w:after="0" w:line="240" w:lineRule="auto"/>
+        <w:jc w:val="both"/>
+        <w:rPr>
+          <w:rFonts w:ascii="Arial" w:hAnsi="Arial" w:cs="Arial"/>
+          <w:b/>
+          <w:bCs/>
+          <w:sz w:val="24"/>
+          <w:szCs w:val="24"/>
+          <w:lang w:eastAsia="es-EC"/>
+        </w:rPr>
+      </w:pPr>
+    </w:p>
+    <w:p>
+      <w:pPr>
+        <w:widowControl w:val="0"/>
+        <w:pBdr>
+          <w:top w:val="nil"/>
+          <w:left w:val="nil"/>
+          <w:bottom w:val="nil"/>
+          <w:right w:val="nil"/>
+          <w:between w:val="nil"/>
+        </w:pBdr>
+        <w:spacing w:after="0" w:line="240" w:lineRule="auto"/>
+        <w:jc w:val="both"/>
+        <w:rPr>
           <w:rFonts w:ascii="Arial" w:eastAsiaTheme="majorEastAsia" w:hAnsi="Arial" w:cs="Arial"/>
           <w:b/>
           <w:bCs/>
@@ -6584,6 +9117,39 @@
           <w:szCs w:val="24"/>
           <w:lang w:eastAsia="es-EC"/>
         </w:rPr>
+        <w:tab/>
+      </w:r>
+      <w:r>
+        <w:rPr>
+          <w:rFonts w:ascii="Arial" w:hAnsi="Arial" w:cs="Arial"/>
+          <w:b/>
+          <w:bCs/>
+          <w:sz w:val="24"/>
+          <w:szCs w:val="24"/>
+          <w:lang w:eastAsia="es-EC"/>
+        </w:rPr>
+        <w:tab/>
+      </w:r>
+      <w:r>
+        <w:rPr>
+          <w:rFonts w:ascii="Arial" w:hAnsi="Arial" w:cs="Arial"/>
+          <w:b/>
+          <w:bCs/>
+          <w:sz w:val="24"/>
+          <w:szCs w:val="24"/>
+          <w:lang w:eastAsia="es-EC"/>
+        </w:rPr>
+        <w:tab/>
+      </w:r>
+      <w:r>
+        <w:rPr>
+          <w:rFonts w:ascii="Arial" w:hAnsi="Arial" w:cs="Arial"/>
+          <w:b/>
+          <w:bCs/>
+          <w:sz w:val="24"/>
+          <w:szCs w:val="24"/>
+          <w:lang w:eastAsia="es-EC"/>
+        </w:rPr>
         <w:br w:type="page"/>
       </w:r>
     </w:p>
@@ -6606,6 +9172,7 @@
           <w:bCs/>
           <w:lang w:eastAsia="es-EC"/>
         </w:rPr>
+        <w:lastRenderedPageBreak/>
         <w:t>Bibliografía</w:t>
       </w:r>
     </w:p>
@@ -6635,6 +9202,7 @@
           <w:lang w:val="es-ES" w:eastAsia="es-EC"/>
         </w:rPr>
       </w:pPr>
+      <w:proofErr w:type="spellStart"/>
       <w:r>
         <w:rPr>
           <w:rFonts w:ascii="Arial" w:hAnsi="Arial" w:cs="Arial"/>
@@ -6644,9 +9212,45 @@
           <w:szCs w:val="20"/>
           <w:lang w:val="es-ES" w:eastAsia="es-EC"/>
         </w:rPr>
-        <w:t>Chacon, S., &amp; Straub, B. (2014). Pro Git (2.ª ed.). Apress. </w:t>
-      </w:r>
-      <w:hyperlink r:id="rId24" w:tgtFrame="_blank" w:history="1">
+        <w:t>Chacon</w:t>
+      </w:r>
+      <w:proofErr w:type="spellEnd"/>
+      <w:r>
+        <w:rPr>
+          <w:rFonts w:ascii="Arial" w:hAnsi="Arial" w:cs="Arial"/>
+          <w:i/>
+          <w:iCs/>
+          <w:sz w:val="20"/>
+          <w:szCs w:val="20"/>
+          <w:lang w:val="es-ES" w:eastAsia="es-EC"/>
+        </w:rPr>
+        <w:t xml:space="preserve">, S., &amp; Straub, B. (2014). Pro Git (2.ª ed.). </w:t>
+      </w:r>
+      <w:proofErr w:type="spellStart"/>
+      <w:r>
+        <w:rPr>
+          <w:rFonts w:ascii="Arial" w:hAnsi="Arial" w:cs="Arial"/>
+          <w:i/>
+          <w:iCs/>
+          <w:sz w:val="20"/>
+          <w:szCs w:val="20"/>
+          <w:lang w:val="es-ES" w:eastAsia="es-EC"/>
+        </w:rPr>
+        <w:t>Apress</w:t>
+      </w:r>
+      <w:proofErr w:type="spellEnd"/>
+      <w:r>
+        <w:rPr>
+          <w:rFonts w:ascii="Arial" w:hAnsi="Arial" w:cs="Arial"/>
+          <w:i/>
+          <w:iCs/>
+          <w:sz w:val="20"/>
+          <w:szCs w:val="20"/>
+          <w:lang w:val="es-ES" w:eastAsia="es-EC"/>
+        </w:rPr>
+        <w:t>. </w:t>
+      </w:r>
+      <w:hyperlink r:id="rId29" w:tgtFrame="_blank" w:history="1">
         <w:r>
           <w:rPr>
             <w:rStyle w:val="Hipervnculo"/>
@@ -6696,9 +9300,81 @@
           <w:szCs w:val="20"/>
           <w:lang w:val="es-ES" w:eastAsia="es-EC"/>
         </w:rPr>
-        <w:t>Driessen, V. (2010). A successful Git branching model. </w:t>
-      </w:r>
-      <w:hyperlink r:id="rId25" w:tgtFrame="_blank" w:history="1">
+        <w:t xml:space="preserve">Driessen, V. (2010). A </w:t>
+      </w:r>
+      <w:proofErr w:type="spellStart"/>
+      <w:r>
+        <w:rPr>
+          <w:rFonts w:ascii="Arial" w:hAnsi="Arial" w:cs="Arial"/>
+          <w:i/>
+          <w:iCs/>
+          <w:sz w:val="20"/>
+          <w:szCs w:val="20"/>
+          <w:lang w:val="es-ES" w:eastAsia="es-EC"/>
+        </w:rPr>
+        <w:t>successful</w:t>
+      </w:r>
+      <w:proofErr w:type="spellEnd"/>
+      <w:r>
+        <w:rPr>
+          <w:rFonts w:ascii="Arial" w:hAnsi="Arial" w:cs="Arial"/>
+          <w:i/>
+          <w:iCs/>
+          <w:sz w:val="20"/>
+          <w:szCs w:val="20"/>
+          <w:lang w:val="es-ES" w:eastAsia="es-EC"/>
+        </w:rPr>
+        <w:t xml:space="preserve"> Git </w:t>
+      </w:r>
+      <w:proofErr w:type="spellStart"/>
+      <w:r>
+        <w:rPr>
+          <w:rFonts w:ascii="Arial" w:hAnsi="Arial" w:cs="Arial"/>
+          <w:i/>
+          <w:iCs/>
+          <w:sz w:val="20"/>
+          <w:szCs w:val="20"/>
+          <w:lang w:val="es-ES" w:eastAsia="es-EC"/>
+        </w:rPr>
+        <w:t>branching</w:t>
+      </w:r>
+      <w:proofErr w:type="spellEnd"/>
+      <w:r>
+        <w:rPr>
+          <w:rFonts w:ascii="Arial" w:hAnsi="Arial" w:cs="Arial"/>
+          <w:i/>
+          <w:iCs/>
+          <w:sz w:val="20"/>
+          <w:szCs w:val="20"/>
+          <w:lang w:val="es-ES" w:eastAsia="es-EC"/>
+        </w:rPr>
+        <w:t xml:space="preserve"> </w:t>
+      </w:r>
+      <w:proofErr w:type="spellStart"/>
+      <w:r>
+        <w:rPr>
+          <w:rFonts w:ascii="Arial" w:hAnsi="Arial" w:cs="Arial"/>
+          <w:i/>
+          <w:iCs/>
+          <w:sz w:val="20"/>
+          <w:szCs w:val="20"/>
+          <w:lang w:val="es-ES" w:eastAsia="es-EC"/>
+        </w:rPr>
+        <w:t>model</w:t>
+      </w:r>
+      <w:proofErr w:type="spellEnd"/>
+      <w:r>
+        <w:rPr>
+          <w:rFonts w:ascii="Arial" w:hAnsi="Arial" w:cs="Arial"/>
+          <w:i/>
+          <w:iCs/>
+          <w:sz w:val="20"/>
+          <w:szCs w:val="20"/>
+          <w:lang w:val="es-ES" w:eastAsia="es-EC"/>
+        </w:rPr>
+        <w:t>. </w:t>
+      </w:r>
+      <w:hyperlink r:id="rId30" w:tgtFrame="_blank" w:history="1">
         <w:r>
           <w:rPr>
             <w:rStyle w:val="Hipervnculo"/>
@@ -6748,7 +9424,127 @@
           <w:szCs w:val="20"/>
           <w:lang w:val="es-ES" w:eastAsia="es-EC"/>
         </w:rPr>
-        <w:t>Fowler, M. (2002). Patterns of enterprise application architecture. Addison-Wesley.</w:t>
+        <w:t>Fowler, M. (2002). </w:t>
+      </w:r>
+      <w:proofErr w:type="spellStart"/>
+      <w:r>
+        <w:rPr>
+          <w:rFonts w:ascii="Arial" w:hAnsi="Arial" w:cs="Arial"/>
+          <w:i/>
+          <w:iCs/>
+          <w:sz w:val="20"/>
+          <w:szCs w:val="20"/>
+          <w:lang w:val="es-ES" w:eastAsia="es-EC"/>
+        </w:rPr>
+        <w:t>Patterns</w:t>
+      </w:r>
+      <w:proofErr w:type="spellEnd"/>
+      <w:r>
+        <w:rPr>
+          <w:rFonts w:ascii="Arial" w:hAnsi="Arial" w:cs="Arial"/>
+          <w:i/>
+          <w:iCs/>
+          <w:sz w:val="20"/>
+          <w:szCs w:val="20"/>
+          <w:lang w:val="es-ES" w:eastAsia="es-EC"/>
+        </w:rPr>
+        <w:t xml:space="preserve"> </w:t>
+      </w:r>
+      <w:proofErr w:type="spellStart"/>
+      <w:r>
+        <w:rPr>
+          <w:rFonts w:ascii="Arial" w:hAnsi="Arial" w:cs="Arial"/>
+          <w:i/>
+          <w:iCs/>
+          <w:sz w:val="20"/>
+          <w:szCs w:val="20"/>
+          <w:lang w:val="es-ES" w:eastAsia="es-EC"/>
+        </w:rPr>
+        <w:t>of</w:t>
+      </w:r>
+      <w:proofErr w:type="spellEnd"/>
+      <w:r>
+        <w:rPr>
+          <w:rFonts w:ascii="Arial" w:hAnsi="Arial" w:cs="Arial"/>
+          <w:i/>
+          <w:iCs/>
+          <w:sz w:val="20"/>
+          <w:szCs w:val="20"/>
+          <w:lang w:val="es-ES" w:eastAsia="es-EC"/>
+        </w:rPr>
+        <w:t xml:space="preserve"> </w:t>
+      </w:r>
+      <w:proofErr w:type="spellStart"/>
+      <w:r>
+        <w:rPr>
+          <w:rFonts w:ascii="Arial" w:hAnsi="Arial" w:cs="Arial"/>
+          <w:i/>
+          <w:iCs/>
+          <w:sz w:val="20"/>
+          <w:szCs w:val="20"/>
+          <w:lang w:val="es-ES" w:eastAsia="es-EC"/>
+        </w:rPr>
+        <w:t>enterprise</w:t>
+      </w:r>
+      <w:proofErr w:type="spellEnd"/>
+      <w:r>
+        <w:rPr>
+          <w:rFonts w:ascii="Arial" w:hAnsi="Arial" w:cs="Arial"/>
+          <w:i/>
+          <w:iCs/>
+          <w:sz w:val="20"/>
+          <w:szCs w:val="20"/>
+          <w:lang w:val="es-ES" w:eastAsia="es-EC"/>
+        </w:rPr>
+        <w:t xml:space="preserve"> </w:t>
+      </w:r>
+      <w:proofErr w:type="spellStart"/>
+      <w:r>
+        <w:rPr>
+          <w:rFonts w:ascii="Arial" w:hAnsi="Arial" w:cs="Arial"/>
+          <w:i/>
+          <w:iCs/>
+          <w:sz w:val="20"/>
+          <w:szCs w:val="20"/>
+          <w:lang w:val="es-ES" w:eastAsia="es-EC"/>
+        </w:rPr>
+        <w:t>application</w:t>
+      </w:r>
+      <w:proofErr w:type="spellEnd"/>
+      <w:r>
+        <w:rPr>
+          <w:rFonts w:ascii="Arial" w:hAnsi="Arial" w:cs="Arial"/>
+          <w:i/>
+          <w:iCs/>
+          <w:sz w:val="20"/>
+          <w:szCs w:val="20"/>
+          <w:lang w:val="es-ES" w:eastAsia="es-EC"/>
+        </w:rPr>
+        <w:t xml:space="preserve"> </w:t>
+      </w:r>
+      <w:proofErr w:type="spellStart"/>
+      <w:r>
+        <w:rPr>
+          <w:rFonts w:ascii="Arial" w:hAnsi="Arial" w:cs="Arial"/>
+          <w:i/>
+          <w:iCs/>
+          <w:sz w:val="20"/>
+          <w:szCs w:val="20"/>
+          <w:lang w:val="es-ES" w:eastAsia="es-EC"/>
+        </w:rPr>
+        <w:t>architecture</w:t>
+      </w:r>
+      <w:proofErr w:type="spellEnd"/>
+      <w:r>
+        <w:rPr>
+          <w:rFonts w:ascii="Arial" w:hAnsi="Arial" w:cs="Arial"/>
+          <w:i/>
+          <w:iCs/>
+          <w:sz w:val="20"/>
+          <w:szCs w:val="20"/>
+          <w:lang w:val="es-ES" w:eastAsia="es-EC"/>
+        </w:rPr>
+        <w:t>. Addison-Wesley.</w:t>
       </w:r>
     </w:p>
     <w:p>
@@ -6786,7 +9582,151 @@
           <w:szCs w:val="20"/>
           <w:lang w:val="es-ES" w:eastAsia="es-EC"/>
         </w:rPr>
-        <w:t>Gamma, E., Helm, R., Johnson, R., &amp; Vlissides, J. (1994). Design patterns: Elements of reusable object-oriented software. Addison-Wesley.</w:t>
+        <w:t xml:space="preserve">Gamma, E., Helm, R., Johnson, R., &amp; </w:t>
+      </w:r>
+      <w:proofErr w:type="spellStart"/>
+      <w:r>
+        <w:rPr>
+          <w:rFonts w:ascii="Arial" w:hAnsi="Arial" w:cs="Arial"/>
+          <w:i/>
+          <w:iCs/>
+          <w:sz w:val="20"/>
+          <w:szCs w:val="20"/>
+          <w:lang w:val="es-ES" w:eastAsia="es-EC"/>
+        </w:rPr>
+        <w:t>Vlissides</w:t>
+      </w:r>
+      <w:proofErr w:type="spellEnd"/>
+      <w:r>
+        <w:rPr>
+          <w:rFonts w:ascii="Arial" w:hAnsi="Arial" w:cs="Arial"/>
+          <w:i/>
+          <w:iCs/>
+          <w:sz w:val="20"/>
+          <w:szCs w:val="20"/>
+          <w:lang w:val="es-ES" w:eastAsia="es-EC"/>
+        </w:rPr>
+        <w:t>, J. (1994). </w:t>
+      </w:r>
+      <w:proofErr w:type="spellStart"/>
+      <w:r>
+        <w:rPr>
+          <w:rFonts w:ascii="Arial" w:hAnsi="Arial" w:cs="Arial"/>
+          <w:i/>
+          <w:iCs/>
+          <w:sz w:val="20"/>
+          <w:szCs w:val="20"/>
+          <w:lang w:val="es-ES" w:eastAsia="es-EC"/>
+        </w:rPr>
+        <w:t>Design</w:t>
+      </w:r>
+      <w:proofErr w:type="spellEnd"/>
+      <w:r>
+        <w:rPr>
+          <w:rFonts w:ascii="Arial" w:hAnsi="Arial" w:cs="Arial"/>
+          <w:i/>
+          <w:iCs/>
+          <w:sz w:val="20"/>
+          <w:szCs w:val="20"/>
+          <w:lang w:val="es-ES" w:eastAsia="es-EC"/>
+        </w:rPr>
+        <w:t xml:space="preserve"> </w:t>
+      </w:r>
+      <w:proofErr w:type="spellStart"/>
+      <w:r>
+        <w:rPr>
+          <w:rFonts w:ascii="Arial" w:hAnsi="Arial" w:cs="Arial"/>
+          <w:i/>
+          <w:iCs/>
+          <w:sz w:val="20"/>
+          <w:szCs w:val="20"/>
+          <w:lang w:val="es-ES" w:eastAsia="es-EC"/>
+        </w:rPr>
+        <w:t>patterns</w:t>
+      </w:r>
+      <w:proofErr w:type="spellEnd"/>
+      <w:r>
+        <w:rPr>
+          <w:rFonts w:ascii="Arial" w:hAnsi="Arial" w:cs="Arial"/>
+          <w:i/>
+          <w:iCs/>
+          <w:sz w:val="20"/>
+          <w:szCs w:val="20"/>
+          <w:lang w:val="es-ES" w:eastAsia="es-EC"/>
+        </w:rPr>
+        <w:t xml:space="preserve">: </w:t>
+      </w:r>
+      <w:proofErr w:type="spellStart"/>
+      <w:r>
+        <w:rPr>
+          <w:rFonts w:ascii="Arial" w:hAnsi="Arial" w:cs="Arial"/>
+          <w:i/>
+          <w:iCs/>
+          <w:sz w:val="20"/>
+          <w:szCs w:val="20"/>
+          <w:lang w:val="es-ES" w:eastAsia="es-EC"/>
+        </w:rPr>
+        <w:t>Elements</w:t>
+      </w:r>
+      <w:proofErr w:type="spellEnd"/>
+      <w:r>
+        <w:rPr>
+          <w:rFonts w:ascii="Arial" w:hAnsi="Arial" w:cs="Arial"/>
+          <w:i/>
+          <w:iCs/>
+          <w:sz w:val="20"/>
+          <w:szCs w:val="20"/>
+          <w:lang w:val="es-ES" w:eastAsia="es-EC"/>
+        </w:rPr>
+        <w:t xml:space="preserve"> </w:t>
+      </w:r>
+      <w:proofErr w:type="spellStart"/>
+      <w:r>
+        <w:rPr>
+          <w:rFonts w:ascii="Arial" w:hAnsi="Arial" w:cs="Arial"/>
+          <w:i/>
+          <w:iCs/>
+          <w:sz w:val="20"/>
+          <w:szCs w:val="20"/>
+          <w:lang w:val="es-ES" w:eastAsia="es-EC"/>
+        </w:rPr>
+        <w:t>of</w:t>
+      </w:r>
+      <w:proofErr w:type="spellEnd"/>
+      <w:r>
+        <w:rPr>
+          <w:rFonts w:ascii="Arial" w:hAnsi="Arial" w:cs="Arial"/>
+          <w:i/>
+          <w:iCs/>
+          <w:sz w:val="20"/>
+          <w:szCs w:val="20"/>
+          <w:lang w:val="es-ES" w:eastAsia="es-EC"/>
+        </w:rPr>
+        <w:t xml:space="preserve"> reusable </w:t>
+      </w:r>
+      <w:proofErr w:type="spellStart"/>
+      <w:r>
+        <w:rPr>
+          <w:rFonts w:ascii="Arial" w:hAnsi="Arial" w:cs="Arial"/>
+          <w:i/>
+          <w:iCs/>
+          <w:sz w:val="20"/>
+          <w:szCs w:val="20"/>
+          <w:lang w:val="es-ES" w:eastAsia="es-EC"/>
+        </w:rPr>
+        <w:t>object-oriented</w:t>
+      </w:r>
+      <w:proofErr w:type="spellEnd"/>
+      <w:r>
+        <w:rPr>
+          <w:rFonts w:ascii="Arial" w:hAnsi="Arial" w:cs="Arial"/>
+          <w:i/>
+          <w:iCs/>
+          <w:sz w:val="20"/>
+          <w:szCs w:val="20"/>
+          <w:lang w:val="es-ES" w:eastAsia="es-EC"/>
+        </w:rPr>
+        <w:t xml:space="preserve"> software. Addison-Wesley.</w:t>
       </w:r>
     </w:p>
     <w:p>
@@ -6824,7 +9764,127 @@
           <w:szCs w:val="20"/>
           <w:lang w:val="es-ES" w:eastAsia="es-EC"/>
         </w:rPr>
-        <w:t>Martin, R. C. (2009). Clean code: A handbook of agile software craftsmanship. Prentice Hall.</w:t>
+        <w:t>Martin, R. C. (2009). </w:t>
+      </w:r>
+      <w:proofErr w:type="spellStart"/>
+      <w:r>
+        <w:rPr>
+          <w:rFonts w:ascii="Arial" w:hAnsi="Arial" w:cs="Arial"/>
+          <w:i/>
+          <w:iCs/>
+          <w:sz w:val="20"/>
+          <w:szCs w:val="20"/>
+          <w:lang w:val="es-ES" w:eastAsia="es-EC"/>
+        </w:rPr>
+        <w:t>Clean</w:t>
+      </w:r>
+      <w:proofErr w:type="spellEnd"/>
+      <w:r>
+        <w:rPr>
+          <w:rFonts w:ascii="Arial" w:hAnsi="Arial" w:cs="Arial"/>
+          <w:i/>
+          <w:iCs/>
+          <w:sz w:val="20"/>
+          <w:szCs w:val="20"/>
+          <w:lang w:val="es-ES" w:eastAsia="es-EC"/>
+        </w:rPr>
+        <w:t xml:space="preserve"> </w:t>
+      </w:r>
+      <w:proofErr w:type="spellStart"/>
+      <w:r>
+        <w:rPr>
+          <w:rFonts w:ascii="Arial" w:hAnsi="Arial" w:cs="Arial"/>
+          <w:i/>
+          <w:iCs/>
+          <w:sz w:val="20"/>
+          <w:szCs w:val="20"/>
+          <w:lang w:val="es-ES" w:eastAsia="es-EC"/>
+        </w:rPr>
+        <w:t>code</w:t>
+      </w:r>
+      <w:proofErr w:type="spellEnd"/>
+      <w:r>
+        <w:rPr>
+          <w:rFonts w:ascii="Arial" w:hAnsi="Arial" w:cs="Arial"/>
+          <w:i/>
+          <w:iCs/>
+          <w:sz w:val="20"/>
+          <w:szCs w:val="20"/>
+          <w:lang w:val="es-ES" w:eastAsia="es-EC"/>
+        </w:rPr>
+        <w:t xml:space="preserve">: A </w:t>
+      </w:r>
+      <w:proofErr w:type="spellStart"/>
+      <w:r>
+        <w:rPr>
+          <w:rFonts w:ascii="Arial" w:hAnsi="Arial" w:cs="Arial"/>
+          <w:i/>
+          <w:iCs/>
+          <w:sz w:val="20"/>
+          <w:szCs w:val="20"/>
+          <w:lang w:val="es-ES" w:eastAsia="es-EC"/>
+        </w:rPr>
+        <w:t>handbook</w:t>
+      </w:r>
+      <w:proofErr w:type="spellEnd"/>
+      <w:r>
+        <w:rPr>
+          <w:rFonts w:ascii="Arial" w:hAnsi="Arial" w:cs="Arial"/>
+          <w:i/>
+          <w:iCs/>
+          <w:sz w:val="20"/>
+          <w:szCs w:val="20"/>
+          <w:lang w:val="es-ES" w:eastAsia="es-EC"/>
+        </w:rPr>
+        <w:t xml:space="preserve"> </w:t>
+      </w:r>
+      <w:proofErr w:type="spellStart"/>
+      <w:r>
+        <w:rPr>
+          <w:rFonts w:ascii="Arial" w:hAnsi="Arial" w:cs="Arial"/>
+          <w:i/>
+          <w:iCs/>
+          <w:sz w:val="20"/>
+          <w:szCs w:val="20"/>
+          <w:lang w:val="es-ES" w:eastAsia="es-EC"/>
+        </w:rPr>
+        <w:t>of</w:t>
+      </w:r>
+      <w:proofErr w:type="spellEnd"/>
+      <w:r>
+        <w:rPr>
+          <w:rFonts w:ascii="Arial" w:hAnsi="Arial" w:cs="Arial"/>
+          <w:i/>
+          <w:iCs/>
+          <w:sz w:val="20"/>
+          <w:szCs w:val="20"/>
+          <w:lang w:val="es-ES" w:eastAsia="es-EC"/>
+        </w:rPr>
+        <w:t xml:space="preserve"> agile software </w:t>
+      </w:r>
+      <w:proofErr w:type="spellStart"/>
+      <w:r>
+        <w:rPr>
+          <w:rFonts w:ascii="Arial" w:hAnsi="Arial" w:cs="Arial"/>
+          <w:i/>
+          <w:iCs/>
+          <w:sz w:val="20"/>
+          <w:szCs w:val="20"/>
+          <w:lang w:val="es-ES" w:eastAsia="es-EC"/>
+        </w:rPr>
+        <w:t>craftsmanship</w:t>
+      </w:r>
+      <w:proofErr w:type="spellEnd"/>
+      <w:r>
+        <w:rPr>
+          <w:rFonts w:ascii="Arial" w:hAnsi="Arial" w:cs="Arial"/>
+          <w:i/>
+          <w:iCs/>
+          <w:sz w:val="20"/>
+          <w:szCs w:val="20"/>
+          <w:lang w:val="es-ES" w:eastAsia="es-EC"/>
+        </w:rPr>
+        <w:t>. Prentice Hall.</w:t>
       </w:r>
     </w:p>
     <w:p>
@@ -6862,7 +9922,151 @@
           <w:szCs w:val="20"/>
           <w:lang w:val="es-ES" w:eastAsia="es-EC"/>
         </w:rPr>
-        <w:t>Martin, R. C. (2017). Clean architecture: A craftsman's guide to software structure and design. Prentice Hall.</w:t>
+        <w:t>Martin, R. C. (2017). </w:t>
+      </w:r>
+      <w:proofErr w:type="spellStart"/>
+      <w:r>
+        <w:rPr>
+          <w:rFonts w:ascii="Arial" w:hAnsi="Arial" w:cs="Arial"/>
+          <w:i/>
+          <w:iCs/>
+          <w:sz w:val="20"/>
+          <w:szCs w:val="20"/>
+          <w:lang w:val="es-ES" w:eastAsia="es-EC"/>
+        </w:rPr>
+        <w:t>Clean</w:t>
+      </w:r>
+      <w:proofErr w:type="spellEnd"/>
+      <w:r>
+        <w:rPr>
+          <w:rFonts w:ascii="Arial" w:hAnsi="Arial" w:cs="Arial"/>
+          <w:i/>
+          <w:iCs/>
+          <w:sz w:val="20"/>
+          <w:szCs w:val="20"/>
+          <w:lang w:val="es-ES" w:eastAsia="es-EC"/>
+        </w:rPr>
+        <w:t xml:space="preserve"> </w:t>
+      </w:r>
+      <w:proofErr w:type="spellStart"/>
+      <w:r>
+        <w:rPr>
+          <w:rFonts w:ascii="Arial" w:hAnsi="Arial" w:cs="Arial"/>
+          <w:i/>
+          <w:iCs/>
+          <w:sz w:val="20"/>
+          <w:szCs w:val="20"/>
+          <w:lang w:val="es-ES" w:eastAsia="es-EC"/>
+        </w:rPr>
+        <w:t>architecture</w:t>
+      </w:r>
+      <w:proofErr w:type="spellEnd"/>
+      <w:r>
+        <w:rPr>
+          <w:rFonts w:ascii="Arial" w:hAnsi="Arial" w:cs="Arial"/>
+          <w:i/>
+          <w:iCs/>
+          <w:sz w:val="20"/>
+          <w:szCs w:val="20"/>
+          <w:lang w:val="es-ES" w:eastAsia="es-EC"/>
+        </w:rPr>
+        <w:t xml:space="preserve">: A </w:t>
+      </w:r>
+      <w:proofErr w:type="spellStart"/>
+      <w:r>
+        <w:rPr>
+          <w:rFonts w:ascii="Arial" w:hAnsi="Arial" w:cs="Arial"/>
+          <w:i/>
+          <w:iCs/>
+          <w:sz w:val="20"/>
+          <w:szCs w:val="20"/>
+          <w:lang w:val="es-ES" w:eastAsia="es-EC"/>
+        </w:rPr>
+        <w:t>craftsman's</w:t>
+      </w:r>
+      <w:proofErr w:type="spellEnd"/>
+      <w:r>
+        <w:rPr>
+          <w:rFonts w:ascii="Arial" w:hAnsi="Arial" w:cs="Arial"/>
+          <w:i/>
+          <w:iCs/>
+          <w:sz w:val="20"/>
+          <w:szCs w:val="20"/>
+          <w:lang w:val="es-ES" w:eastAsia="es-EC"/>
+        </w:rPr>
+        <w:t xml:space="preserve"> guide </w:t>
+      </w:r>
+      <w:proofErr w:type="spellStart"/>
+      <w:r>
+        <w:rPr>
+          <w:rFonts w:ascii="Arial" w:hAnsi="Arial" w:cs="Arial"/>
+          <w:i/>
+          <w:iCs/>
+          <w:sz w:val="20"/>
+          <w:szCs w:val="20"/>
+          <w:lang w:val="es-ES" w:eastAsia="es-EC"/>
+        </w:rPr>
+        <w:t>to</w:t>
+      </w:r>
+      <w:proofErr w:type="spellEnd"/>
+      <w:r>
+        <w:rPr>
+          <w:rFonts w:ascii="Arial" w:hAnsi="Arial" w:cs="Arial"/>
+          <w:i/>
+          <w:iCs/>
+          <w:sz w:val="20"/>
+          <w:szCs w:val="20"/>
+          <w:lang w:val="es-ES" w:eastAsia="es-EC"/>
+        </w:rPr>
+        <w:t xml:space="preserve"> software </w:t>
+      </w:r>
+      <w:proofErr w:type="spellStart"/>
+      <w:r>
+        <w:rPr>
+          <w:rFonts w:ascii="Arial" w:hAnsi="Arial" w:cs="Arial"/>
+          <w:i/>
+          <w:iCs/>
+          <w:sz w:val="20"/>
+          <w:szCs w:val="20"/>
+          <w:lang w:val="es-ES" w:eastAsia="es-EC"/>
+        </w:rPr>
+        <w:t>structure</w:t>
+      </w:r>
+      <w:proofErr w:type="spellEnd"/>
+      <w:r>
+        <w:rPr>
+          <w:rFonts w:ascii="Arial" w:hAnsi="Arial" w:cs="Arial"/>
+          <w:i/>
+          <w:iCs/>
+          <w:sz w:val="20"/>
+          <w:szCs w:val="20"/>
+          <w:lang w:val="es-ES" w:eastAsia="es-EC"/>
+        </w:rPr>
+        <w:t xml:space="preserve"> and </w:t>
+      </w:r>
+      <w:proofErr w:type="spellStart"/>
+      <w:r>
+        <w:rPr>
+          <w:rFonts w:ascii="Arial" w:hAnsi="Arial" w:cs="Arial"/>
+          <w:i/>
+          <w:iCs/>
+          <w:sz w:val="20"/>
+          <w:szCs w:val="20"/>
+          <w:lang w:val="es-ES" w:eastAsia="es-EC"/>
+        </w:rPr>
+        <w:t>design</w:t>
+      </w:r>
+      <w:proofErr w:type="spellEnd"/>
+      <w:r>
+        <w:rPr>
+          <w:rFonts w:ascii="Arial" w:hAnsi="Arial" w:cs="Arial"/>
+          <w:i/>
+          <w:iCs/>
+          <w:sz w:val="20"/>
+          <w:szCs w:val="20"/>
+          <w:lang w:val="es-ES" w:eastAsia="es-EC"/>
+        </w:rPr>
+        <w:t>. Prentice Hall.</w:t>
       </w:r>
     </w:p>
     <w:p>
@@ -6900,7 +10104,103 @@
           <w:szCs w:val="20"/>
           <w:lang w:val="es-ES" w:eastAsia="es-EC"/>
         </w:rPr>
-        <w:t>Pressman, R. S., &amp; Maxim, B. R. (2015). Software engineering: A practitioner's approach (8.ª ed.). McGraw-Hill Education.</w:t>
+        <w:t xml:space="preserve">Pressman, R. S., &amp; Maxim, B. R. (2015). Software </w:t>
+      </w:r>
+      <w:proofErr w:type="spellStart"/>
+      <w:r>
+        <w:rPr>
+          <w:rFonts w:ascii="Arial" w:hAnsi="Arial" w:cs="Arial"/>
+          <w:i/>
+          <w:iCs/>
+          <w:sz w:val="20"/>
+          <w:szCs w:val="20"/>
+          <w:lang w:val="es-ES" w:eastAsia="es-EC"/>
+        </w:rPr>
+        <w:t>engineering</w:t>
+      </w:r>
+      <w:proofErr w:type="spellEnd"/>
+      <w:r>
+        <w:rPr>
+          <w:rFonts w:ascii="Arial" w:hAnsi="Arial" w:cs="Arial"/>
+          <w:i/>
+          <w:iCs/>
+          <w:sz w:val="20"/>
+          <w:szCs w:val="20"/>
+          <w:lang w:val="es-ES" w:eastAsia="es-EC"/>
+        </w:rPr>
+        <w:t xml:space="preserve">: A </w:t>
+      </w:r>
+      <w:proofErr w:type="spellStart"/>
+      <w:r>
+        <w:rPr>
+          <w:rFonts w:ascii="Arial" w:hAnsi="Arial" w:cs="Arial"/>
+          <w:i/>
+          <w:iCs/>
+          <w:sz w:val="20"/>
+          <w:szCs w:val="20"/>
+          <w:lang w:val="es-ES" w:eastAsia="es-EC"/>
+        </w:rPr>
+        <w:t>practitioner's</w:t>
+      </w:r>
+      <w:proofErr w:type="spellEnd"/>
+      <w:r>
+        <w:rPr>
+          <w:rFonts w:ascii="Arial" w:hAnsi="Arial" w:cs="Arial"/>
+          <w:i/>
+          <w:iCs/>
+          <w:sz w:val="20"/>
+          <w:szCs w:val="20"/>
+          <w:lang w:val="es-ES" w:eastAsia="es-EC"/>
+        </w:rPr>
+        <w:t xml:space="preserve"> </w:t>
+      </w:r>
+      <w:proofErr w:type="spellStart"/>
+      <w:r>
+        <w:rPr>
+          <w:rFonts w:ascii="Arial" w:hAnsi="Arial" w:cs="Arial"/>
+          <w:i/>
+          <w:iCs/>
+          <w:sz w:val="20"/>
+          <w:szCs w:val="20"/>
+          <w:lang w:val="es-ES" w:eastAsia="es-EC"/>
+        </w:rPr>
+        <w:t>approach</w:t>
+      </w:r>
+      <w:proofErr w:type="spellEnd"/>
+      <w:r>
+        <w:rPr>
+          <w:rFonts w:ascii="Arial" w:hAnsi="Arial" w:cs="Arial"/>
+          <w:i/>
+          <w:iCs/>
+          <w:sz w:val="20"/>
+          <w:szCs w:val="20"/>
+          <w:lang w:val="es-ES" w:eastAsia="es-EC"/>
+        </w:rPr>
+        <w:t xml:space="preserve"> (8.ª ed.). McGraw-Hill </w:t>
+      </w:r>
+      <w:proofErr w:type="spellStart"/>
+      <w:r>
+        <w:rPr>
+          <w:rFonts w:ascii="Arial" w:hAnsi="Arial" w:cs="Arial"/>
+          <w:i/>
+          <w:iCs/>
+          <w:sz w:val="20"/>
+          <w:szCs w:val="20"/>
+          <w:lang w:val="es-ES" w:eastAsia="es-EC"/>
+        </w:rPr>
+        <w:t>Education</w:t>
+      </w:r>
+      <w:proofErr w:type="spellEnd"/>
+      <w:r>
+        <w:rPr>
+          <w:rFonts w:ascii="Arial" w:hAnsi="Arial" w:cs="Arial"/>
+          <w:i/>
+          <w:iCs/>
+          <w:sz w:val="20"/>
+          <w:szCs w:val="20"/>
+          <w:lang w:val="es-ES" w:eastAsia="es-EC"/>
+        </w:rPr>
+        <w:t>.</w:t>
       </w:r>
     </w:p>
     <w:p>
@@ -6938,7 +10238,31 @@
           <w:szCs w:val="20"/>
           <w:lang w:val="es-ES" w:eastAsia="es-EC"/>
         </w:rPr>
-        <w:t>Sommerville, I. (2016). Software engineering (10.ª ed.). Pearson.</w:t>
+        <w:t xml:space="preserve">Sommerville, I. (2016). Software </w:t>
+      </w:r>
+      <w:proofErr w:type="spellStart"/>
+      <w:r>
+        <w:rPr>
+          <w:rFonts w:ascii="Arial" w:hAnsi="Arial" w:cs="Arial"/>
+          <w:i/>
+          <w:iCs/>
+          <w:sz w:val="20"/>
+          <w:szCs w:val="20"/>
+          <w:lang w:val="es-ES" w:eastAsia="es-EC"/>
+        </w:rPr>
+        <w:t>engineering</w:t>
+      </w:r>
+      <w:proofErr w:type="spellEnd"/>
+      <w:r>
+        <w:rPr>
+          <w:rFonts w:ascii="Arial" w:hAnsi="Arial" w:cs="Arial"/>
+          <w:i/>
+          <w:iCs/>
+          <w:sz w:val="20"/>
+          <w:szCs w:val="20"/>
+          <w:lang w:val="es-ES" w:eastAsia="es-EC"/>
+        </w:rPr>
+        <w:t> (10.ª ed.). Pearson.</w:t>
       </w:r>
     </w:p>
     <w:p>
@@ -6964,7 +10288,7 @@
       </w:pPr>
     </w:p>
     <w:sectPr>
-      <w:headerReference w:type="first" r:id="rId26"/>
+      <w:headerReference w:type="first" r:id="rId31"/>
       <w:pgSz w:w="11906" w:h="16838"/>
       <w:pgMar w:top="1417" w:right="1701" w:bottom="1417" w:left="1701" w:header="708" w:footer="708" w:gutter="0"/>
       <w:pgNumType w:start="1"/>
@@ -7836,7 +11160,7 @@
         <v:path o:extrusionok="f" gradientshapeok="t" o:connecttype="rect"/>
         <o:lock v:ext="edit" aspectratio="t"/>
       </v:shapetype>
-      <v:shape id="_x0000_i1026" type="#_x0000_t75" style="width:12pt;height:12pt" o:bullet="t">
+      <v:shape id="_x0000_i1059" type="#_x0000_t75" style="width:11.8pt;height:11.8pt" o:bullet="t">
         <v:imagedata r:id="rId1" o:title="mso3E28"/>
       </v:shape>
     </w:pict>
@@ -11791,7 +15115,6 @@
   <w:style w:type="character" w:default="1" w:styleId="Fuentedeprrafopredeter">
     <w:name w:val="Default Paragraph Font"/>
     <w:uiPriority w:val="1"/>
-    <w:semiHidden/>
     <w:unhideWhenUsed/>
   </w:style>
   <w:style w:type="table" w:default="1" w:styleId="Tablanormal">

</xml_diff>

<commit_message>
Actualizacion final del documento
</commit_message>
<xml_diff>
--- a/Actividad-1.docx
+++ b/Actividad-1.docx
@@ -666,6 +666,37 @@
         </w:rPr>
         <w:tab/>
       </w:r>
+    </w:p>
+    <w:p>
+      <w:pPr>
+        <w:rPr>
+          <w:rFonts w:ascii="Arial" w:hAnsi="Arial" w:cs="Arial"/>
+          <w:b/>
+          <w:bCs/>
+          <w:lang w:val="es-ES" w:eastAsia="es-EC"/>
+        </w:rPr>
+      </w:pPr>
+      <w:r>
+        <w:rPr>
+          <w:rFonts w:ascii="Arial" w:hAnsi="Arial" w:cs="Arial"/>
+          <w:b/>
+          <w:bCs/>
+          <w:lang w:val="es-ES" w:eastAsia="es-EC"/>
+        </w:rPr>
+        <w:t>Enlace del repositorio: </w:t>
+      </w:r>
+      <w:hyperlink r:id="rId9" w:tgtFrame="_blank" w:history="1">
+        <w:r>
+          <w:rPr>
+            <w:rStyle w:val="Hipervnculo"/>
+            <w:rFonts w:ascii="Arial" w:hAnsi="Arial" w:cs="Arial"/>
+            <w:b/>
+            <w:bCs/>
+            <w:lang w:val="es-ES" w:eastAsia="es-EC"/>
+          </w:rPr>
+          <w:t>https://github.com/jordansantillan/Actividad-1</w:t>
+        </w:r>
+      </w:hyperlink>
     </w:p>
     <w:p>
       <w:pPr>
@@ -871,10 +902,10 @@
           <w:rFonts w:ascii="Arial" w:hAnsi="Arial" w:cs="Arial"/>
         </w:rPr>
         <w:sectPr>
-          <w:headerReference w:type="default" r:id="rId9"/>
-          <w:footerReference w:type="default" r:id="rId10"/>
-          <w:headerReference w:type="first" r:id="rId11"/>
-          <w:footerReference w:type="first" r:id="rId12"/>
+          <w:headerReference w:type="default" r:id="rId10"/>
+          <w:footerReference w:type="default" r:id="rId11"/>
+          <w:headerReference w:type="first" r:id="rId12"/>
+          <w:footerReference w:type="first" r:id="rId13"/>
           <w:pgSz w:w="11906" w:h="16838"/>
           <w:pgMar w:top="1417" w:right="1701" w:bottom="1417" w:left="1701" w:header="708" w:footer="708" w:gutter="0"/>
           <w:cols w:space="708"/>
@@ -926,7 +957,7 @@
                     </pic:cNvPicPr>
                   </pic:nvPicPr>
                   <pic:blipFill>
-                    <a:blip r:embed="rId13">
+                    <a:blip r:embed="rId14">
                       <a:extLst>
                         <a:ext uri="{28A0092B-C50C-407E-A947-70E740481C1C}">
                           <a14:useLocalDpi xmlns:a14="http://schemas.microsoft.com/office/drawing/2010/main" val="0"/>
@@ -2729,7 +2760,7 @@
                     </pic:cNvPicPr>
                   </pic:nvPicPr>
                   <pic:blipFill rotWithShape="1">
-                    <a:blip r:embed="rId14">
+                    <a:blip r:embed="rId15">
                       <a:extLst>
                         <a:ext uri="{28A0092B-C50C-407E-A947-70E740481C1C}">
                           <a14:useLocalDpi xmlns:a14="http://schemas.microsoft.com/office/drawing/2010/main" val="0"/>
@@ -2925,7 +2956,7 @@
                     <pic:cNvPicPr/>
                   </pic:nvPicPr>
                   <pic:blipFill rotWithShape="1">
-                    <a:blip r:embed="rId15">
+                    <a:blip r:embed="rId16">
                       <a:extLst>
                         <a:ext uri="{28A0092B-C50C-407E-A947-70E740481C1C}">
                           <a14:useLocalDpi xmlns:a14="http://schemas.microsoft.com/office/drawing/2010/main" val="0"/>
@@ -3242,24 +3273,14 @@
                 <w:lang w:val="es-ES" w:eastAsia="es-EC"/>
               </w:rPr>
             </w:pPr>
-            <w:proofErr w:type="gramStart"/>
             <w:r>
               <w:rPr>
                 <w:rFonts w:ascii="Arial" w:hAnsi="Arial" w:cs="Arial"/>
                 <w:lang w:val="es-ES" w:eastAsia="es-EC"/>
               </w:rPr>
-              <w:t>notificar(</w:t>
-            </w:r>
-            <w:proofErr w:type="gramEnd"/>
-            <w:r>
-              <w:rPr>
-                <w:rFonts w:ascii="Arial" w:hAnsi="Arial" w:cs="Arial"/>
-                <w:lang w:val="es-ES" w:eastAsia="es-EC"/>
-              </w:rPr>
-              <w:t xml:space="preserve">), </w:t>
+              <w:t xml:space="preserve">notificar(), </w:t>
             </w:r>
             <w:proofErr w:type="spellStart"/>
-            <w:proofErr w:type="gramStart"/>
             <w:r>
               <w:rPr>
                 <w:rFonts w:ascii="Arial" w:hAnsi="Arial" w:cs="Arial"/>
@@ -3273,15 +3294,7 @@
                 <w:rFonts w:ascii="Arial" w:hAnsi="Arial" w:cs="Arial"/>
                 <w:lang w:val="es-ES" w:eastAsia="es-EC"/>
               </w:rPr>
-              <w:t>(</w:t>
-            </w:r>
-            <w:proofErr w:type="gramEnd"/>
-            <w:r>
-              <w:rPr>
-                <w:rFonts w:ascii="Arial" w:hAnsi="Arial" w:cs="Arial"/>
-                <w:lang w:val="es-ES" w:eastAsia="es-EC"/>
-              </w:rPr>
-              <w:t>)</w:t>
+              <w:t>()</w:t>
             </w:r>
           </w:p>
         </w:tc>
@@ -3384,7 +3397,6 @@
               </w:rPr>
             </w:pPr>
             <w:proofErr w:type="spellStart"/>
-            <w:proofErr w:type="gramStart"/>
             <w:r>
               <w:rPr>
                 <w:rFonts w:ascii="Arial" w:hAnsi="Arial" w:cs="Arial"/>
@@ -3398,18 +3410,9 @@
                 <w:rFonts w:ascii="Arial" w:hAnsi="Arial" w:cs="Arial"/>
                 <w:lang w:val="es-ES" w:eastAsia="es-EC"/>
               </w:rPr>
-              <w:t>(</w:t>
-            </w:r>
-            <w:proofErr w:type="gramEnd"/>
-            <w:r>
-              <w:rPr>
-                <w:rFonts w:ascii="Arial" w:hAnsi="Arial" w:cs="Arial"/>
-                <w:lang w:val="es-ES" w:eastAsia="es-EC"/>
-              </w:rPr>
-              <w:t xml:space="preserve">), </w:t>
+              <w:t xml:space="preserve">(), </w:t>
             </w:r>
             <w:proofErr w:type="spellStart"/>
-            <w:proofErr w:type="gramStart"/>
             <w:r>
               <w:rPr>
                 <w:rFonts w:ascii="Arial" w:hAnsi="Arial" w:cs="Arial"/>
@@ -3423,15 +3426,7 @@
                 <w:rFonts w:ascii="Arial" w:hAnsi="Arial" w:cs="Arial"/>
                 <w:lang w:val="es-ES" w:eastAsia="es-EC"/>
               </w:rPr>
-              <w:t>(</w:t>
-            </w:r>
-            <w:proofErr w:type="gramEnd"/>
-            <w:r>
-              <w:rPr>
-                <w:rFonts w:ascii="Arial" w:hAnsi="Arial" w:cs="Arial"/>
-                <w:lang w:val="es-ES" w:eastAsia="es-EC"/>
-              </w:rPr>
-              <w:t>)</w:t>
+              <w:t>()</w:t>
             </w:r>
           </w:p>
         </w:tc>
@@ -3534,7 +3529,6 @@
               </w:rPr>
             </w:pPr>
             <w:proofErr w:type="spellStart"/>
-            <w:proofErr w:type="gramStart"/>
             <w:r>
               <w:rPr>
                 <w:rFonts w:ascii="Arial" w:hAnsi="Arial" w:cs="Arial"/>
@@ -3548,18 +3542,9 @@
                 <w:rFonts w:ascii="Arial" w:hAnsi="Arial" w:cs="Arial"/>
                 <w:lang w:val="es-ES" w:eastAsia="es-EC"/>
               </w:rPr>
-              <w:t>(</w:t>
-            </w:r>
-            <w:proofErr w:type="gramEnd"/>
-            <w:r>
-              <w:rPr>
-                <w:rFonts w:ascii="Arial" w:hAnsi="Arial" w:cs="Arial"/>
-                <w:lang w:val="es-ES" w:eastAsia="es-EC"/>
-              </w:rPr>
-              <w:t xml:space="preserve">), </w:t>
+              <w:t xml:space="preserve">(), </w:t>
             </w:r>
             <w:proofErr w:type="spellStart"/>
-            <w:proofErr w:type="gramStart"/>
             <w:r>
               <w:rPr>
                 <w:rFonts w:ascii="Arial" w:hAnsi="Arial" w:cs="Arial"/>
@@ -3573,15 +3558,7 @@
                 <w:rFonts w:ascii="Arial" w:hAnsi="Arial" w:cs="Arial"/>
                 <w:lang w:val="es-ES" w:eastAsia="es-EC"/>
               </w:rPr>
-              <w:t>(</w:t>
-            </w:r>
-            <w:proofErr w:type="gramEnd"/>
-            <w:r>
-              <w:rPr>
-                <w:rFonts w:ascii="Arial" w:hAnsi="Arial" w:cs="Arial"/>
-                <w:lang w:val="es-ES" w:eastAsia="es-EC"/>
-              </w:rPr>
-              <w:t>)</w:t>
+              <w:t>()</w:t>
             </w:r>
           </w:p>
         </w:tc>
@@ -3686,7 +3663,6 @@
               </w:rPr>
             </w:pPr>
             <w:proofErr w:type="spellStart"/>
-            <w:proofErr w:type="gramStart"/>
             <w:r>
               <w:rPr>
                 <w:rFonts w:ascii="Arial" w:hAnsi="Arial" w:cs="Arial"/>
@@ -3700,15 +3676,7 @@
                 <w:rFonts w:ascii="Arial" w:hAnsi="Arial" w:cs="Arial"/>
                 <w:lang w:val="es-ES" w:eastAsia="es-EC"/>
               </w:rPr>
-              <w:t>(</w:t>
-            </w:r>
-            <w:proofErr w:type="gramEnd"/>
-            <w:r>
-              <w:rPr>
-                <w:rFonts w:ascii="Arial" w:hAnsi="Arial" w:cs="Arial"/>
-                <w:lang w:val="es-ES" w:eastAsia="es-EC"/>
-              </w:rPr>
-              <w:t>)</w:t>
+              <w:t>()</w:t>
             </w:r>
           </w:p>
         </w:tc>
@@ -3820,7 +3788,6 @@
               </w:rPr>
             </w:pPr>
             <w:proofErr w:type="spellStart"/>
-            <w:proofErr w:type="gramStart"/>
             <w:r>
               <w:rPr>
                 <w:rFonts w:ascii="Arial" w:hAnsi="Arial" w:cs="Arial"/>
@@ -3834,18 +3801,9 @@
                 <w:rFonts w:ascii="Arial" w:hAnsi="Arial" w:cs="Arial"/>
                 <w:lang w:val="es-ES" w:eastAsia="es-EC"/>
               </w:rPr>
-              <w:t>(</w:t>
-            </w:r>
-            <w:proofErr w:type="gramEnd"/>
-            <w:r>
-              <w:rPr>
-                <w:rFonts w:ascii="Arial" w:hAnsi="Arial" w:cs="Arial"/>
-                <w:lang w:val="es-ES" w:eastAsia="es-EC"/>
-              </w:rPr>
-              <w:t xml:space="preserve">), </w:t>
+              <w:t xml:space="preserve">(), </w:t>
             </w:r>
             <w:proofErr w:type="spellStart"/>
-            <w:proofErr w:type="gramStart"/>
             <w:r>
               <w:rPr>
                 <w:rFonts w:ascii="Arial" w:hAnsi="Arial" w:cs="Arial"/>
@@ -3859,15 +3817,7 @@
                 <w:rFonts w:ascii="Arial" w:hAnsi="Arial" w:cs="Arial"/>
                 <w:lang w:val="es-ES" w:eastAsia="es-EC"/>
               </w:rPr>
-              <w:t>(</w:t>
-            </w:r>
-            <w:proofErr w:type="gramEnd"/>
-            <w:r>
-              <w:rPr>
-                <w:rFonts w:ascii="Arial" w:hAnsi="Arial" w:cs="Arial"/>
-                <w:lang w:val="es-ES" w:eastAsia="es-EC"/>
-              </w:rPr>
-              <w:t>)</w:t>
+              <w:t>()</w:t>
             </w:r>
           </w:p>
         </w:tc>
@@ -4004,7 +3954,6 @@
               </w:rPr>
             </w:pPr>
             <w:proofErr w:type="spellStart"/>
-            <w:proofErr w:type="gramStart"/>
             <w:r>
               <w:rPr>
                 <w:rFonts w:ascii="Arial" w:hAnsi="Arial" w:cs="Arial"/>
@@ -4018,18 +3967,9 @@
                 <w:rFonts w:ascii="Arial" w:hAnsi="Arial" w:cs="Arial"/>
                 <w:lang w:val="es-ES" w:eastAsia="es-EC"/>
               </w:rPr>
-              <w:t>(</w:t>
-            </w:r>
-            <w:proofErr w:type="gramEnd"/>
-            <w:r>
-              <w:rPr>
-                <w:rFonts w:ascii="Arial" w:hAnsi="Arial" w:cs="Arial"/>
-                <w:lang w:val="es-ES" w:eastAsia="es-EC"/>
-              </w:rPr>
-              <w:t xml:space="preserve">), </w:t>
+              <w:t xml:space="preserve">(), </w:t>
             </w:r>
             <w:proofErr w:type="spellStart"/>
-            <w:proofErr w:type="gramStart"/>
             <w:r>
               <w:rPr>
                 <w:rFonts w:ascii="Arial" w:hAnsi="Arial" w:cs="Arial"/>
@@ -4043,18 +3983,9 @@
                 <w:rFonts w:ascii="Arial" w:hAnsi="Arial" w:cs="Arial"/>
                 <w:lang w:val="es-ES" w:eastAsia="es-EC"/>
               </w:rPr>
-              <w:t>(</w:t>
-            </w:r>
-            <w:proofErr w:type="gramEnd"/>
-            <w:r>
-              <w:rPr>
-                <w:rFonts w:ascii="Arial" w:hAnsi="Arial" w:cs="Arial"/>
-                <w:lang w:val="es-ES" w:eastAsia="es-EC"/>
-              </w:rPr>
-              <w:t xml:space="preserve">), </w:t>
+              <w:t xml:space="preserve">(), </w:t>
             </w:r>
             <w:proofErr w:type="spellStart"/>
-            <w:proofErr w:type="gramStart"/>
             <w:r>
               <w:rPr>
                 <w:rFonts w:ascii="Arial" w:hAnsi="Arial" w:cs="Arial"/>
@@ -4068,15 +3999,7 @@
                 <w:rFonts w:ascii="Arial" w:hAnsi="Arial" w:cs="Arial"/>
                 <w:lang w:val="es-ES" w:eastAsia="es-EC"/>
               </w:rPr>
-              <w:t>(</w:t>
-            </w:r>
-            <w:proofErr w:type="gramEnd"/>
-            <w:r>
-              <w:rPr>
-                <w:rFonts w:ascii="Arial" w:hAnsi="Arial" w:cs="Arial"/>
-                <w:lang w:val="es-ES" w:eastAsia="es-EC"/>
-              </w:rPr>
-              <w:t>)</w:t>
+              <w:t>()</w:t>
             </w:r>
           </w:p>
         </w:tc>
@@ -4180,21 +4103,12 @@
                 <w:lang w:val="es-ES" w:eastAsia="es-EC"/>
               </w:rPr>
             </w:pPr>
-            <w:proofErr w:type="gramStart"/>
             <w:r>
               <w:rPr>
                 <w:rFonts w:ascii="Arial" w:hAnsi="Arial" w:cs="Arial"/>
                 <w:lang w:val="es-ES" w:eastAsia="es-EC"/>
               </w:rPr>
-              <w:t>enviar(</w:t>
-            </w:r>
-            <w:proofErr w:type="gramEnd"/>
-            <w:r>
-              <w:rPr>
-                <w:rFonts w:ascii="Arial" w:hAnsi="Arial" w:cs="Arial"/>
-                <w:lang w:val="es-ES" w:eastAsia="es-EC"/>
-              </w:rPr>
-              <w:t>)</w:t>
+              <w:t>enviar()</w:t>
             </w:r>
           </w:p>
         </w:tc>
@@ -5208,7 +5122,7 @@
           <w:lang w:eastAsia="es-EC"/>
         </w:rPr>
         <w:drawing>
-          <wp:anchor distT="0" distB="0" distL="114300" distR="114300" simplePos="0" relativeHeight="251668480" behindDoc="1" locked="0" layoutInCell="1" allowOverlap="1" wp14:anchorId="766455EC" wp14:editId="66DDAAFB">
+          <wp:anchor distT="0" distB="0" distL="114300" distR="114300" simplePos="0" relativeHeight="251668480" behindDoc="1" locked="0" layoutInCell="1" allowOverlap="1" wp14:anchorId="766455EC" wp14:editId="40D251D0">
             <wp:simplePos x="0" y="0"/>
             <wp:positionH relativeFrom="margin">
               <wp:align>left</wp:align>
@@ -5231,7 +5145,7 @@
                     <pic:cNvPicPr/>
                   </pic:nvPicPr>
                   <pic:blipFill rotWithShape="1">
-                    <a:blip r:embed="rId16" cstate="print">
+                    <a:blip r:embed="rId17" cstate="print">
                       <a:extLst>
                         <a:ext uri="{28A0092B-C50C-407E-A947-70E740481C1C}">
                           <a14:useLocalDpi xmlns:a14="http://schemas.microsoft.com/office/drawing/2010/main" val="0"/>
@@ -5486,7 +5400,7 @@
                     <pic:cNvPicPr/>
                   </pic:nvPicPr>
                   <pic:blipFill rotWithShape="1">
-                    <a:blip r:embed="rId17"/>
+                    <a:blip r:embed="rId18"/>
                     <a:srcRect l="2909" t="8512" r="4518" b="9954"/>
                     <a:stretch>
                       <a:fillRect/>
@@ -6040,7 +5954,7 @@
                     <pic:cNvPicPr/>
                   </pic:nvPicPr>
                   <pic:blipFill>
-                    <a:blip r:embed="rId18" cstate="print">
+                    <a:blip r:embed="rId19" cstate="print">
                       <a:extLst>
                         <a:ext uri="{28A0092B-C50C-407E-A947-70E740481C1C}">
                           <a14:useLocalDpi xmlns:a14="http://schemas.microsoft.com/office/drawing/2010/main" val="0"/>
@@ -6875,7 +6789,7 @@
         </w:rPr>
         <w:t>Enlace del repositorio: </w:t>
       </w:r>
-      <w:hyperlink r:id="rId19" w:tgtFrame="_blank" w:history="1">
+      <w:hyperlink r:id="rId20" w:tgtFrame="_blank" w:history="1">
         <w:r>
           <w:rPr>
             <w:rStyle w:val="Hipervnculo"/>
@@ -6992,7 +6906,7 @@
         </w:rPr>
         <w:lastRenderedPageBreak/>
         <w:drawing>
-          <wp:anchor distT="0" distB="0" distL="114300" distR="114300" simplePos="0" relativeHeight="251670528" behindDoc="0" locked="0" layoutInCell="1" allowOverlap="1" wp14:anchorId="31BCD5F0" wp14:editId="511D29E9">
+          <wp:anchor distT="0" distB="0" distL="114300" distR="114300" simplePos="0" relativeHeight="251670528" behindDoc="0" locked="0" layoutInCell="1" allowOverlap="1" wp14:anchorId="31BCD5F0" wp14:editId="13445DE2">
             <wp:simplePos x="0" y="0"/>
             <wp:positionH relativeFrom="margin">
               <wp:posOffset>-207034</wp:posOffset>
@@ -7017,7 +6931,7 @@
                     </pic:cNvPicPr>
                   </pic:nvPicPr>
                   <pic:blipFill rotWithShape="1">
-                    <a:blip r:embed="rId20" cstate="print">
+                    <a:blip r:embed="rId21" cstate="print">
                       <a:extLst>
                         <a:ext uri="{28A0092B-C50C-407E-A947-70E740481C1C}">
                           <a14:useLocalDpi xmlns:a14="http://schemas.microsoft.com/office/drawing/2010/main" val="0"/>
@@ -7101,7 +7015,7 @@
                     <pic:cNvPicPr/>
                   </pic:nvPicPr>
                   <pic:blipFill>
-                    <a:blip r:embed="rId21">
+                    <a:blip r:embed="rId22">
                       <a:extLst>
                         <a:ext uri="{28A0092B-C50C-407E-A947-70E740481C1C}">
                           <a14:useLocalDpi xmlns:a14="http://schemas.microsoft.com/office/drawing/2010/main" val="0"/>
@@ -7298,7 +7212,7 @@
                     </pic:cNvPicPr>
                   </pic:nvPicPr>
                   <pic:blipFill rotWithShape="1">
-                    <a:blip r:embed="rId22">
+                    <a:blip r:embed="rId23">
                       <a:extLst>
                         <a:ext uri="{28A0092B-C50C-407E-A947-70E740481C1C}">
                           <a14:useLocalDpi xmlns:a14="http://schemas.microsoft.com/office/drawing/2010/main" val="0"/>
@@ -7476,7 +7390,7 @@
                     </pic:cNvPicPr>
                   </pic:nvPicPr>
                   <pic:blipFill>
-                    <a:blip r:embed="rId23">
+                    <a:blip r:embed="rId24">
                       <a:extLst>
                         <a:ext uri="{28A0092B-C50C-407E-A947-70E740481C1C}">
                           <a14:useLocalDpi xmlns:a14="http://schemas.microsoft.com/office/drawing/2010/main" val="0"/>
@@ -7592,6 +7506,7 @@
       <w:r>
         <w:rPr>
           <w:rFonts w:ascii="Arial" w:hAnsi="Arial" w:cs="Arial"/>
+          <w:noProof/>
           <w:sz w:val="24"/>
           <w:szCs w:val="24"/>
           <w:lang w:eastAsia="es-EC"/>
@@ -7620,7 +7535,7 @@
                     <pic:cNvPicPr/>
                   </pic:nvPicPr>
                   <pic:blipFill rotWithShape="1">
-                    <a:blip r:embed="rId24">
+                    <a:blip r:embed="rId25">
                       <a:extLst>
                         <a:ext uri="{28A0092B-C50C-407E-A947-70E740481C1C}">
                           <a14:useLocalDpi xmlns:a14="http://schemas.microsoft.com/office/drawing/2010/main" val="0"/>
@@ -7706,6 +7621,7 @@
       <w:r>
         <w:rPr>
           <w:rFonts w:ascii="Arial" w:hAnsi="Arial" w:cs="Arial"/>
+          <w:noProof/>
           <w:lang w:val="es-ES" w:eastAsia="es-EC"/>
         </w:rPr>
         <w:lastRenderedPageBreak/>
@@ -7733,7 +7649,7 @@
                     <pic:cNvPicPr/>
                   </pic:nvPicPr>
                   <pic:blipFill>
-                    <a:blip r:embed="rId25">
+                    <a:blip r:embed="rId26">
                       <a:extLst>
                         <a:ext uri="{28A0092B-C50C-407E-A947-70E740481C1C}">
                           <a14:useLocalDpi xmlns:a14="http://schemas.microsoft.com/office/drawing/2010/main" val="0"/>
@@ -7778,15 +7694,7 @@
           <w:rFonts w:ascii="Arial" w:hAnsi="Arial" w:cs="Arial"/>
           <w:lang w:eastAsia="es-EC"/>
         </w:rPr>
-        <w:t xml:space="preserve"> Repositorio en GitHub. Archivos del proyecto (Actividad-1.docx </w:t>
-      </w:r>
-      <w:proofErr w:type="gramStart"/>
-      <w:r>
-        <w:rPr>
-          <w:rFonts w:ascii="Arial" w:hAnsi="Arial" w:cs="Arial"/>
-          <w:lang w:eastAsia="es-EC"/>
-        </w:rPr>
-        <w:t>y .</w:t>
+        <w:t xml:space="preserve"> Repositorio en GitHub. Archivos del proyecto (Actividad-1.docx y .</w:t>
       </w:r>
       <w:proofErr w:type="spellStart"/>
       <w:r>
@@ -7797,7 +7705,6 @@
         <w:t>gitignore</w:t>
       </w:r>
       <w:proofErr w:type="spellEnd"/>
-      <w:proofErr w:type="gramEnd"/>
       <w:r>
         <w:rPr>
           <w:rFonts w:ascii="Arial" w:hAnsi="Arial" w:cs="Arial"/>
@@ -7936,6 +7843,7 @@
       <w:r>
         <w:rPr>
           <w:rFonts w:ascii="Arial" w:hAnsi="Arial" w:cs="Arial"/>
+          <w:noProof/>
           <w:sz w:val="24"/>
           <w:szCs w:val="24"/>
           <w:lang w:eastAsia="es-EC"/>
@@ -7964,7 +7872,7 @@
                     <pic:cNvPicPr/>
                   </pic:nvPicPr>
                   <pic:blipFill>
-                    <a:blip r:embed="rId26">
+                    <a:blip r:embed="rId27">
                       <a:extLst>
                         <a:ext uri="{28A0092B-C50C-407E-A947-70E740481C1C}">
                           <a14:useLocalDpi xmlns:a14="http://schemas.microsoft.com/office/drawing/2010/main" val="0"/>
@@ -8566,6 +8474,7 @@
           <w:rFonts w:ascii="Arial" w:hAnsi="Arial" w:cs="Arial"/>
           <w:b/>
           <w:bCs/>
+          <w:noProof/>
           <w:sz w:val="24"/>
           <w:szCs w:val="24"/>
           <w:lang w:eastAsia="es-EC"/>
@@ -8595,7 +8504,7 @@
                     <pic:cNvPicPr/>
                   </pic:nvPicPr>
                   <pic:blipFill>
-                    <a:blip r:embed="rId27">
+                    <a:blip r:embed="rId28">
                       <a:extLst>
                         <a:ext uri="{28A0092B-C50C-407E-A947-70E740481C1C}">
                           <a14:useLocalDpi xmlns:a14="http://schemas.microsoft.com/office/drawing/2010/main" val="0"/>
@@ -8828,6 +8737,7 @@
           <w:rFonts w:ascii="Arial" w:hAnsi="Arial" w:cs="Arial"/>
           <w:b/>
           <w:bCs/>
+          <w:noProof/>
           <w:sz w:val="24"/>
           <w:szCs w:val="24"/>
           <w:lang w:eastAsia="es-EC"/>
@@ -8856,7 +8766,7 @@
                     <pic:cNvPicPr/>
                   </pic:nvPicPr>
                   <pic:blipFill>
-                    <a:blip r:embed="rId28">
+                    <a:blip r:embed="rId29">
                       <a:extLst>
                         <a:ext uri="{28A0092B-C50C-407E-A947-70E740481C1C}">
                           <a14:useLocalDpi xmlns:a14="http://schemas.microsoft.com/office/drawing/2010/main" val="0"/>
@@ -9250,7 +9160,7 @@
         </w:rPr>
         <w:t>. </w:t>
       </w:r>
-      <w:hyperlink r:id="rId29" w:tgtFrame="_blank" w:history="1">
+      <w:hyperlink r:id="rId30" w:tgtFrame="_blank" w:history="1">
         <w:r>
           <w:rPr>
             <w:rStyle w:val="Hipervnculo"/>
@@ -9374,7 +9284,7 @@
         </w:rPr>
         <w:t>. </w:t>
       </w:r>
-      <w:hyperlink r:id="rId30" w:tgtFrame="_blank" w:history="1">
+      <w:hyperlink r:id="rId31" w:tgtFrame="_blank" w:history="1">
         <w:r>
           <w:rPr>
             <w:rStyle w:val="Hipervnculo"/>
@@ -10288,7 +10198,7 @@
       </w:pPr>
     </w:p>
     <w:sectPr>
-      <w:headerReference w:type="first" r:id="rId31"/>
+      <w:headerReference w:type="first" r:id="rId32"/>
       <w:pgSz w:w="11906" w:h="16838"/>
       <w:pgMar w:top="1417" w:right="1701" w:bottom="1417" w:left="1701" w:header="708" w:footer="708" w:gutter="0"/>
       <w:pgNumType w:start="1"/>
@@ -11160,7 +11070,7 @@
         <v:path o:extrusionok="f" gradientshapeok="t" o:connecttype="rect"/>
         <o:lock v:ext="edit" aspectratio="t"/>
       </v:shapetype>
-      <v:shape id="_x0000_i1059" type="#_x0000_t75" style="width:11.8pt;height:11.8pt" o:bullet="t">
+      <v:shape id="_x0000_i1029" type="#_x0000_t75" style="width:11.8pt;height:11.8pt" o:bullet="t">
         <v:imagedata r:id="rId1" o:title="mso3E28"/>
       </v:shape>
     </w:pict>
@@ -15115,6 +15025,7 @@
   <w:style w:type="character" w:default="1" w:styleId="Fuentedeprrafopredeter">
     <w:name w:val="Default Paragraph Font"/>
     <w:uiPriority w:val="1"/>
+    <w:semiHidden/>
     <w:unhideWhenUsed/>
   </w:style>
   <w:style w:type="table" w:default="1" w:styleId="Tablanormal">

</xml_diff>